<commit_message>
Add kiosk category selector and admin category management
Kiosk shop:
- Add a sticky category pill bar (All + one pill per category) so members
  can filter, with "All" showing every product grouped and scrollable.

Admin products:
- New Categories section: add categories inline, view per-category product
  counts, and delete empty categories (deletion blocked while products exist).
- New API: POST/GET /api/admin/categories, PATCH/DELETE /api/admin/categories/[id].

Docs:
- Document category management in the admin guide; regenerate the Word doc.

Co-Authored-By: Claude Opus 4.8 <noreply@anthropic.com>
</commit_message>
<xml_diff>
--- a/docs/SSS-Documentation.docx
+++ b/docs/SSS-Documentation.docx
@@ -15324,6 +15324,91 @@
       </w:pPr>
       <w:r>
         <w:t xml:space="preserve">Products</w:t>
+      </w:r>
+    </w:p>
+    <w:p>
+      <w:pPr>
+        <w:pStyle w:val="Compact"/>
+        <w:numPr>
+          <w:ilvl w:val="0"/>
+          <w:numId w:val="1028"/>
+        </w:numPr>
+      </w:pPr>
+      <w:r>
+        <w:rPr>
+          <w:b/>
+          <w:bCs/>
+        </w:rPr>
+        <w:t xml:space="preserve">Categories</w:t>
+      </w:r>
+      <w:r>
+        <w:t xml:space="preserve"> </w:t>
+      </w:r>
+      <w:r>
+        <w:t xml:space="preserve">— at the top of the page, add a new category by typing a name and</w:t>
+      </w:r>
+      <w:r>
+        <w:t xml:space="preserve"> </w:t>
+      </w:r>
+      <w:r>
+        <w:t xml:space="preserve">pressing</w:t>
+      </w:r>
+      <w:r>
+        <w:t xml:space="preserve"> </w:t>
+      </w:r>
+      <w:r>
+        <w:rPr>
+          <w:b/>
+          <w:bCs/>
+        </w:rPr>
+        <w:t xml:space="preserve">Add category</w:t>
+      </w:r>
+      <w:r>
+        <w:t xml:space="preserve">. Each chip shows how many products it holds; the</w:t>
+      </w:r>
+      <w:r>
+        <w:t xml:space="preserve"> </w:t>
+      </w:r>
+      <w:r>
+        <w:rPr>
+          <w:b/>
+          <w:bCs/>
+        </w:rPr>
+        <w:t xml:space="preserve">×</w:t>
+      </w:r>
+      <w:r>
+        <w:t xml:space="preserve"> </w:t>
+      </w:r>
+      <w:r>
+        <w:t xml:space="preserve">deletes a category, but only once it's</w:t>
+      </w:r>
+      <w:r>
+        <w:t xml:space="preserve"> </w:t>
+      </w:r>
+      <w:r>
+        <w:rPr>
+          <w:b/>
+          <w:bCs/>
+        </w:rPr>
+        <w:t xml:space="preserve">empty</w:t>
+      </w:r>
+      <w:r>
+        <w:t xml:space="preserve"> </w:t>
+      </w:r>
+      <w:r>
+        <w:t xml:space="preserve">(move or archive its products</w:t>
+      </w:r>
+      <w:r>
+        <w:t xml:space="preserve"> </w:t>
+      </w:r>
+      <w:r>
+        <w:t xml:space="preserve">first). Categories appear as the section headers and the filter pills in the</w:t>
+      </w:r>
+      <w:r>
+        <w:t xml:space="preserve"> </w:t>
+      </w:r>
+      <w:r>
+        <w:t xml:space="preserve">kiosk shop.</w:t>
       </w:r>
     </w:p>
     <w:p>

</xml_diff>

<commit_message>
Add top spenders and active users to the dashboard
Stats API (/api/admin/stats):
- Aggregate spend per member over the timeframe and return the top 10
  spenders (name, total spent, order count).
- Return activeUsers: the count of distinct members with a purchase in range.

Dashboard:
- New "Active users" KPI card.
- New "Top spenders" section ranking the top 10 members by spend with bars.

Docs: document both on the admin guide; regenerate the Word doc.

Co-Authored-By: Claude Opus 4.8 <noreply@anthropic.com>
</commit_message>
<xml_diff>
--- a/docs/SSS-Documentation.docx
+++ b/docs/SSS-Documentation.docx
@@ -15093,7 +15093,37 @@
         <w:t xml:space="preserve"> </w:t>
       </w:r>
       <w:r>
-        <w:t xml:space="preserve">Revenue, Orders, Items sold, Average order.</w:t>
+        <w:t xml:space="preserve">Revenue, Active users, Orders, Items sold, Average order.</w:t>
+      </w:r>
+      <w:r>
+        <w:t xml:space="preserve"> </w:t>
+      </w:r>
+      <w:r>
+        <w:rPr>
+          <w:i/>
+          <w:iCs/>
+        </w:rPr>
+        <w:t xml:space="preserve">Active</w:t>
+      </w:r>
+      <w:r>
+        <w:rPr>
+          <w:i/>
+          <w:iCs/>
+        </w:rPr>
+        <w:t xml:space="preserve"> </w:t>
+      </w:r>
+      <w:r>
+        <w:rPr>
+          <w:i/>
+          <w:iCs/>
+        </w:rPr>
+        <w:t xml:space="preserve">users</w:t>
+      </w:r>
+      <w:r>
+        <w:t xml:space="preserve"> </w:t>
+      </w:r>
+      <w:r>
+        <w:t xml:space="preserve">counts the distinct members who made at least one purchase in the period.</w:t>
       </w:r>
     </w:p>
     <w:p>
@@ -15138,6 +15168,34 @@
       </w:r>
       <w:r>
         <w:t xml:space="preserve">ranked by quantity, with revenue per item.</w:t>
+      </w:r>
+    </w:p>
+    <w:p>
+      <w:pPr>
+        <w:pStyle w:val="Compact"/>
+        <w:numPr>
+          <w:ilvl w:val="0"/>
+          <w:numId w:val="1026"/>
+        </w:numPr>
+      </w:pPr>
+      <w:r>
+        <w:rPr>
+          <w:b/>
+          <w:bCs/>
+        </w:rPr>
+        <w:t xml:space="preserve">Top spenders:</w:t>
+      </w:r>
+      <w:r>
+        <w:t xml:space="preserve"> </w:t>
+      </w:r>
+      <w:r>
+        <w:t xml:space="preserve">the 10 members who spent the most in the period, with their</w:t>
+      </w:r>
+      <w:r>
+        <w:t xml:space="preserve"> </w:t>
+      </w:r>
+      <w:r>
+        <w:t xml:space="preserve">total spend and order count.</w:t>
       </w:r>
     </w:p>
     <w:p>

</xml_diff>

<commit_message>
Allow changing a product's category after creation
- Add a category dropdown to each product row in the admin panel; selecting a
  different category PATCHes categoryId and re-groups the list immediately.
- Category is SSS-only, so the change does not sync to Congressus (only name
  and price do).

Docs: note category editing in the admin guide; regenerate the Word doc.

Co-Authored-By: Claude Opus 4.8 <noreply@anthropic.com>
</commit_message>
<xml_diff>
--- a/docs/SSS-Documentation.docx
+++ b/docs/SSS-Documentation.docx
@@ -15555,6 +15555,34 @@
       </w:r>
       <w:r>
         <w:t xml:space="preserve">Price changes sync to Congressus.</w:t>
+      </w:r>
+    </w:p>
+    <w:p>
+      <w:pPr>
+        <w:pStyle w:val="Compact"/>
+        <w:numPr>
+          <w:ilvl w:val="0"/>
+          <w:numId w:val="1028"/>
+        </w:numPr>
+      </w:pPr>
+      <w:r>
+        <w:rPr>
+          <w:b/>
+          <w:bCs/>
+        </w:rPr>
+        <w:t xml:space="preserve">Change category</w:t>
+      </w:r>
+      <w:r>
+        <w:t xml:space="preserve"> </w:t>
+      </w:r>
+      <w:r>
+        <w:t xml:space="preserve">— pick a different category from the dropdown on the product</w:t>
+      </w:r>
+      <w:r>
+        <w:t xml:space="preserve"> </w:t>
+      </w:r>
+      <w:r>
+        <w:t xml:space="preserve">row; it moves immediately. Category is SSS-only (it doesn't affect Congressus).</w:t>
       </w:r>
     </w:p>
     <w:p>

</xml_diff>

<commit_message>
Add product expiry dates with automatic 50% end-of-life discount
- Add Product.expiresAt (best-before date) + migration.
- New src/lib/pricing.ts: a product is 50% off from 7 days before its
  best-before date onward (and stays discounted after the date passes).
- Cart snapshots the discounted price into the invoice line, so members are
  charged — and Congressus is billed — the sale price.
- Public /api/products returns onSale + salePrice (best-before date is not
  leaked to the public payload).
- Kiosk: -50% badge and struck-through original price on discounted tiles.
- Admin products: per-row best-before date picker, -50% badge, and the
  discounted price shown alongside the original.

Docs: document the expiry discount in the admin guide; regenerate the Word doc.

Co-Authored-By: Claude Opus 4.8 <noreply@anthropic.com>
</commit_message>
<xml_diff>
--- a/docs/SSS-Documentation.docx
+++ b/docs/SSS-Documentation.docx
@@ -15605,6 +15605,124 @@
       </w:r>
       <w:r>
         <w:t xml:space="preserve">row; it moves immediately. Category is SSS-only (it doesn't affect Congressus).</w:t>
+      </w:r>
+    </w:p>
+    <w:p>
+      <w:pPr>
+        <w:pStyle w:val="Compact"/>
+        <w:numPr>
+          <w:ilvl w:val="0"/>
+          <w:numId w:val="1028"/>
+        </w:numPr>
+      </w:pPr>
+      <w:r>
+        <w:rPr>
+          <w:b/>
+          <w:bCs/>
+        </w:rPr>
+        <w:t xml:space="preserve">Best before (expiry discount)</w:t>
+      </w:r>
+      <w:r>
+        <w:t xml:space="preserve"> </w:t>
+      </w:r>
+      <w:r>
+        <w:t xml:space="preserve">— set a best-before date on the product row.</w:t>
+      </w:r>
+      <w:r>
+        <w:t xml:space="preserve"> </w:t>
+      </w:r>
+      <w:r>
+        <w:t xml:space="preserve">From</w:t>
+      </w:r>
+      <w:r>
+        <w:t xml:space="preserve"> </w:t>
+      </w:r>
+      <w:r>
+        <w:rPr>
+          <w:b/>
+          <w:bCs/>
+        </w:rPr>
+        <w:t xml:space="preserve">7 days before</w:t>
+      </w:r>
+      <w:r>
+        <w:t xml:space="preserve"> </w:t>
+      </w:r>
+      <w:r>
+        <w:t xml:space="preserve">that date onward — and after it — the product is sold at</w:t>
+      </w:r>
+      <w:r>
+        <w:t xml:space="preserve"> </w:t>
+      </w:r>
+      <w:r>
+        <w:rPr>
+          <w:b/>
+          <w:bCs/>
+        </w:rPr>
+        <w:t xml:space="preserve">50% off</w:t>
+      </w:r>
+      <w:r>
+        <w:t xml:space="preserve"> </w:t>
+      </w:r>
+      <w:r>
+        <w:t xml:space="preserve">automatically. The kiosk shows a</w:t>
+      </w:r>
+      <w:r>
+        <w:t xml:space="preserve"> </w:t>
+      </w:r>
+      <w:r>
+        <w:rPr>
+          <w:b/>
+          <w:bCs/>
+        </w:rPr>
+        <w:t xml:space="preserve">-50%</w:t>
+      </w:r>
+      <w:r>
+        <w:t xml:space="preserve"> </w:t>
+      </w:r>
+      <w:r>
+        <w:t xml:space="preserve">badge with the original</w:t>
+      </w:r>
+      <w:r>
+        <w:t xml:space="preserve"> </w:t>
+      </w:r>
+      <w:r>
+        <w:t xml:space="preserve">price struck through, and members are charged (and billed in Congressus) the</w:t>
+      </w:r>
+      <w:r>
+        <w:t xml:space="preserve"> </w:t>
+      </w:r>
+      <w:r>
+        <w:t xml:space="preserve">discounted price. Clear the date to remove the discount. Update the date when a</w:t>
+      </w:r>
+      <w:r>
+        <w:t xml:space="preserve"> </w:t>
+      </w:r>
+      <w:r>
+        <w:t xml:space="preserve">new batch arrives.</w:t>
+      </w:r>
+      <w:r>
+        <w:t xml:space="preserve"> </w:t>
+      </w:r>
+      <w:r>
+        <w:rPr>
+          <w:i/>
+          <w:iCs/>
+        </w:rPr>
+        <w:t xml:space="preserve">Note: products stay on sale after the date — they are not</w:t>
+      </w:r>
+      <w:r>
+        <w:rPr>
+          <w:i/>
+          <w:iCs/>
+        </w:rPr>
+        <w:t xml:space="preserve"> </w:t>
+      </w:r>
+      <w:r>
+        <w:rPr>
+          <w:i/>
+          <w:iCs/>
+        </w:rPr>
+        <w:t xml:space="preserve">auto-hidden — so archive anything you no longer want sold.</w:t>
       </w:r>
     </w:p>
     <w:p>

</xml_diff>

<commit_message>
Make products free once past their best-before date
- pricing.ts now has two discount tiers: 50% off in the final 7 days (through
  the best-before date), then free once the date has passed. Adds discountStage()
  ("HALF" | "FREE" | null); effectivePriceCents returns 0 when free.
- Public /api/products returns discount stage so the kiosk shows FREE vs -50%.
- Kiosk + admin show a FREE badge and "Free" price for past-date products.
- Cart already snapshots the effective price, so free items bill at €0.00.

Docs: update the admin guide for the free tier; regenerate the Word doc.

Co-Authored-By: Claude Opus 4.8 <noreply@anthropic.com>
</commit_message>
<xml_diff>
--- a/docs/SSS-Documentation.docx
+++ b/docs/SSS-Documentation.docx
@@ -15386,7 +15386,6 @@
     </w:p>
     <w:p>
       <w:pPr>
-        <w:pStyle w:val="Compact"/>
         <w:numPr>
           <w:ilvl w:val="0"/>
           <w:numId w:val="1028"/>
@@ -15493,7 +15492,6 @@
     </w:p>
     <w:p>
       <w:pPr>
-        <w:pStyle w:val="Compact"/>
         <w:numPr>
           <w:ilvl w:val="0"/>
           <w:numId w:val="1028"/>
@@ -15540,7 +15538,6 @@
     </w:p>
     <w:p>
       <w:pPr>
-        <w:pStyle w:val="Compact"/>
         <w:numPr>
           <w:ilvl w:val="0"/>
           <w:numId w:val="1028"/>
@@ -15581,7 +15578,6 @@
     </w:p>
     <w:p>
       <w:pPr>
-        <w:pStyle w:val="Compact"/>
         <w:numPr>
           <w:ilvl w:val="0"/>
           <w:numId w:val="1028"/>
@@ -15609,7 +15605,6 @@
     </w:p>
     <w:p>
       <w:pPr>
-        <w:pStyle w:val="Compact"/>
         <w:numPr>
           <w:ilvl w:val="0"/>
           <w:numId w:val="1028"/>
@@ -15632,23 +15627,29 @@
         <w:t xml:space="preserve"> </w:t>
       </w:r>
       <w:r>
-        <w:t xml:space="preserve">From</w:t>
-      </w:r>
-      <w:r>
-        <w:t xml:space="preserve"> </w:t>
-      </w:r>
+        <w:t xml:space="preserve">The price then drops automatically as it ages:</w:t>
+      </w:r>
+    </w:p>
+    <w:p>
+      <w:pPr>
+        <w:pStyle w:val="Compact"/>
+        <w:numPr>
+          <w:ilvl w:val="1"/>
+          <w:numId w:val="1029"/>
+        </w:numPr>
+      </w:pPr>
       <w:r>
         <w:rPr>
           <w:b/>
           <w:bCs/>
         </w:rPr>
-        <w:t xml:space="preserve">7 days before</w:t>
-      </w:r>
-      <w:r>
-        <w:t xml:space="preserve"> </w:t>
-      </w:r>
-      <w:r>
-        <w:t xml:space="preserve">that date onward — and after it — the product is sold at</w:t>
+        <w:t xml:space="preserve">final 7 days</w:t>
+      </w:r>
+      <w:r>
+        <w:t xml:space="preserve"> </w:t>
+      </w:r>
+      <w:r>
+        <w:t xml:space="preserve">(up to and including the best-before date) →</w:t>
       </w:r>
       <w:r>
         <w:t xml:space="preserve"> </w:t>
@@ -15664,7 +15665,7 @@
         <w:t xml:space="preserve"> </w:t>
       </w:r>
       <w:r>
-        <w:t xml:space="preserve">automatically. The kiosk shows a</w:t>
+        <w:t xml:space="preserve">(kiosk shows a</w:t>
       </w:r>
       <w:r>
         <w:t xml:space="preserve"> </w:t>
@@ -15680,25 +15681,84 @@
         <w:t xml:space="preserve"> </w:t>
       </w:r>
       <w:r>
-        <w:t xml:space="preserve">badge with the original</w:t>
-      </w:r>
-      <w:r>
-        <w:t xml:space="preserve"> </w:t>
-      </w:r>
-      <w:r>
-        <w:t xml:space="preserve">price struck through, and members are charged (and billed in Congressus) the</w:t>
-      </w:r>
-      <w:r>
-        <w:t xml:space="preserve"> </w:t>
-      </w:r>
-      <w:r>
-        <w:t xml:space="preserve">discounted price. Clear the date to remove the discount. Update the date when a</w:t>
-      </w:r>
-      <w:r>
-        <w:t xml:space="preserve"> </w:t>
-      </w:r>
-      <w:r>
-        <w:t xml:space="preserve">new batch arrives.</w:t>
+        <w:t xml:space="preserve">badge),</w:t>
+      </w:r>
+    </w:p>
+    <w:p>
+      <w:pPr>
+        <w:pStyle w:val="Compact"/>
+        <w:numPr>
+          <w:ilvl w:val="1"/>
+          <w:numId w:val="1029"/>
+        </w:numPr>
+      </w:pPr>
+      <w:r>
+        <w:rPr>
+          <w:b/>
+          <w:bCs/>
+        </w:rPr>
+        <w:t xml:space="preserve">after the best-before date</w:t>
+      </w:r>
+      <w:r>
+        <w:t xml:space="preserve"> </w:t>
+      </w:r>
+      <w:r>
+        <w:t xml:space="preserve">→</w:t>
+      </w:r>
+      <w:r>
+        <w:t xml:space="preserve"> </w:t>
+      </w:r>
+      <w:r>
+        <w:rPr>
+          <w:b/>
+          <w:bCs/>
+        </w:rPr>
+        <w:t xml:space="preserve">free</w:t>
+      </w:r>
+      <w:r>
+        <w:t xml:space="preserve"> </w:t>
+      </w:r>
+      <w:r>
+        <w:t xml:space="preserve">(kiosk shows a</w:t>
+      </w:r>
+      <w:r>
+        <w:t xml:space="preserve"> </w:t>
+      </w:r>
+      <w:r>
+        <w:rPr>
+          <w:b/>
+          <w:bCs/>
+        </w:rPr>
+        <w:t xml:space="preserve">FREE</w:t>
+      </w:r>
+      <w:r>
+        <w:t xml:space="preserve"> </w:t>
+      </w:r>
+      <w:r>
+        <w:t xml:space="preserve">badge).</w:t>
+      </w:r>
+    </w:p>
+    <w:p>
+      <w:pPr>
+        <w:numPr>
+          <w:ilvl w:val="0"/>
+          <w:numId w:val="1000"/>
+        </w:numPr>
+      </w:pPr>
+      <w:r>
+        <w:t xml:space="preserve">The original price is struck through, and members are charged (and billed in</w:t>
+      </w:r>
+      <w:r>
+        <w:t xml:space="preserve"> </w:t>
+      </w:r>
+      <w:r>
+        <w:t xml:space="preserve">Congressus) the discounted/zero price. Clear the date to remove the discount,</w:t>
+      </w:r>
+      <w:r>
+        <w:t xml:space="preserve"> </w:t>
+      </w:r>
+      <w:r>
+        <w:t xml:space="preserve">and update it when a new batch arrives.</w:t>
       </w:r>
       <w:r>
         <w:t xml:space="preserve"> </w:t>
@@ -15708,7 +15768,7 @@
           <w:i/>
           <w:iCs/>
         </w:rPr>
-        <w:t xml:space="preserve">Note: products stay on sale after the date — they are not</w:t>
+        <w:t xml:space="preserve">Note: products are not auto-hidden —</w:t>
       </w:r>
       <w:r>
         <w:rPr>
@@ -15722,12 +15782,25 @@
           <w:i/>
           <w:iCs/>
         </w:rPr>
-        <w:t xml:space="preserve">auto-hidden — so archive anything you no longer want sold.</w:t>
-      </w:r>
-    </w:p>
-    <w:p>
-      <w:pPr>
-        <w:pStyle w:val="Compact"/>
+        <w:t xml:space="preserve">an out-of-date product keeps being offered for free until you archive it or set</w:t>
+      </w:r>
+      <w:r>
+        <w:rPr>
+          <w:i/>
+          <w:iCs/>
+        </w:rPr>
+        <w:t xml:space="preserve"> </w:t>
+      </w:r>
+      <w:r>
+        <w:rPr>
+          <w:i/>
+          <w:iCs/>
+        </w:rPr>
+        <w:t xml:space="preserve">a new date, so archive anything you no longer want given away.</w:t>
+      </w:r>
+    </w:p>
+    <w:p>
+      <w:pPr>
         <w:numPr>
           <w:ilvl w:val="0"/>
           <w:numId w:val="1028"/>
@@ -15749,7 +15822,6 @@
     </w:p>
     <w:p>
       <w:pPr>
-        <w:pStyle w:val="Compact"/>
         <w:numPr>
           <w:ilvl w:val="0"/>
           <w:numId w:val="1028"/>
@@ -15787,7 +15859,6 @@
     </w:p>
     <w:p>
       <w:pPr>
-        <w:pStyle w:val="Compact"/>
         <w:numPr>
           <w:ilvl w:val="0"/>
           <w:numId w:val="1028"/>
@@ -15855,199 +15926,6 @@
       </w:r>
       <w:r>
         <w:t xml:space="preserve">(already sent to Congressus).</w:t>
-      </w:r>
-    </w:p>
-    <w:p>
-      <w:pPr>
-        <w:pStyle w:val="Compact"/>
-        <w:numPr>
-          <w:ilvl w:val="0"/>
-          <w:numId w:val="1029"/>
-        </w:numPr>
-      </w:pPr>
-      <w:r>
-        <w:rPr>
-          <w:b/>
-          <w:bCs/>
-        </w:rPr>
-        <w:t xml:space="preserve">Edit</w:t>
-      </w:r>
-      <w:r>
-        <w:t xml:space="preserve"> </w:t>
-      </w:r>
-      <w:r>
-        <w:t xml:space="preserve">(pending only) — adjust line quantities with</w:t>
-      </w:r>
-      <w:r>
-        <w:t xml:space="preserve"> </w:t>
-      </w:r>
-      <w:r>
-        <w:rPr>
-          <w:rStyle w:val="VerbatimChar"/>
-        </w:rPr>
-        <w:t xml:space="preserve">−/+</w:t>
-      </w:r>
-      <w:r>
-        <w:t xml:space="preserve">, or set a line to 0</w:t>
-      </w:r>
-      <w:r>
-        <w:t xml:space="preserve"> </w:t>
-      </w:r>
-      <w:r>
-        <w:t xml:space="preserve">to remove it; the total recalculates live. Use this when a member was charged</w:t>
-      </w:r>
-      <w:r>
-        <w:t xml:space="preserve"> </w:t>
-      </w:r>
-      <w:r>
-        <w:t xml:space="preserve">for something by mistake or that wasn't actually in stock.</w:t>
-      </w:r>
-      <w:r>
-        <w:t xml:space="preserve"> </w:t>
-      </w:r>
-      <w:r>
-        <w:rPr>
-          <w:b/>
-          <w:bCs/>
-        </w:rPr>
-        <w:t xml:space="preserve">Save changes</w:t>
-      </w:r>
-      <w:r>
-        <w:t xml:space="preserve">.</w:t>
-      </w:r>
-    </w:p>
-    <w:p>
-      <w:pPr>
-        <w:pStyle w:val="Compact"/>
-        <w:numPr>
-          <w:ilvl w:val="0"/>
-          <w:numId w:val="1029"/>
-        </w:numPr>
-      </w:pPr>
-      <w:r>
-        <w:rPr>
-          <w:b/>
-          <w:bCs/>
-        </w:rPr>
-        <w:t xml:space="preserve">Delete invoice</w:t>
-      </w:r>
-      <w:r>
-        <w:t xml:space="preserve"> </w:t>
-      </w:r>
-      <w:r>
-        <w:t xml:space="preserve">(pending only) — remove a whole invoice.</w:t>
-      </w:r>
-    </w:p>
-    <w:p>
-      <w:pPr>
-        <w:pStyle w:val="Compact"/>
-        <w:numPr>
-          <w:ilvl w:val="0"/>
-          <w:numId w:val="1029"/>
-        </w:numPr>
-      </w:pPr>
-      <w:r>
-        <w:rPr>
-          <w:b/>
-          <w:bCs/>
-        </w:rPr>
-        <w:t xml:space="preserve">Export to Congressus</w:t>
-      </w:r>
-      <w:r>
-        <w:t xml:space="preserve"> </w:t>
-      </w:r>
-      <w:r>
-        <w:t xml:space="preserve">— bills all pending invoices. They are grouped into</w:t>
-      </w:r>
-      <w:r>
-        <w:t xml:space="preserve"> </w:t>
-      </w:r>
-      <w:r>
-        <w:rPr>
-          <w:b/>
-          <w:bCs/>
-        </w:rPr>
-        <w:t xml:space="preserve">one Congressus invoice per member per month</w:t>
-      </w:r>
-      <w:r>
-        <w:t xml:space="preserve"> </w:t>
-      </w:r>
-      <w:r>
-        <w:t xml:space="preserve">and then move to the Exported</w:t>
-      </w:r>
-      <w:r>
-        <w:t xml:space="preserve"> </w:t>
-      </w:r>
-      <w:r>
-        <w:t xml:space="preserve">tab. Run this once per billing cycle (e.g. monthly).</w:t>
-      </w:r>
-    </w:p>
-    <w:p>
-      <w:pPr>
-        <w:pStyle w:val="Compact"/>
-        <w:numPr>
-          <w:ilvl w:val="0"/>
-          <w:numId w:val="1029"/>
-        </w:numPr>
-      </w:pPr>
-      <w:r>
-        <w:rPr>
-          <w:b/>
-          <w:bCs/>
-        </w:rPr>
-        <w:t xml:space="preserve">Clear all … (test data)</w:t>
-      </w:r>
-      <w:r>
-        <w:t xml:space="preserve"> </w:t>
-      </w:r>
-      <w:r>
-        <w:t xml:space="preserve">— bulk-deletes every invoice in the current tab,</w:t>
-      </w:r>
-      <w:r>
-        <w:t xml:space="preserve"> </w:t>
-      </w:r>
-      <w:r>
-        <w:t xml:space="preserve">with a double confirmation. Use this to wipe test data so the dashboard counts</w:t>
-      </w:r>
-      <w:r>
-        <w:t xml:space="preserve"> </w:t>
-      </w:r>
-      <w:r>
-        <w:t xml:space="preserve">fresh.</w:t>
-      </w:r>
-      <w:r>
-        <w:t xml:space="preserve"> </w:t>
-      </w:r>
-      <w:r>
-        <w:rPr>
-          <w:b/>
-          <w:bCs/>
-        </w:rPr>
-        <w:t xml:space="preserve">Irreversible.</w:t>
-      </w:r>
-    </w:p>
-    <w:p>
-      <w:pPr>
-        <w:pStyle w:val="BlockText"/>
-      </w:pPr>
-      <w:r>
-        <w:t xml:space="preserve">Exported invoices are read-only here. They've been sent to Congressus, so</w:t>
-      </w:r>
-      <w:r>
-        <w:t xml:space="preserve"> </w:t>
-      </w:r>
-      <w:r>
-        <w:t xml:space="preserve">corrections after export must be made in Congressus directly.</w:t>
-      </w:r>
-    </w:p>
-    <w:bookmarkEnd w:id="119"/>
-    <w:bookmarkStart w:id="120" w:name="typical-monthly-routine"/>
-    <w:p>
-      <w:pPr>
-        <w:pStyle w:val="Heading2"/>
-      </w:pPr>
-      <w:r>
-        <w:t xml:space="preserve">Typical monthly routine</w:t>
       </w:r>
     </w:p>
     <w:p>
@@ -16063,13 +15941,50 @@
           <w:b/>
           <w:bCs/>
         </w:rPr>
-        <w:t xml:space="preserve">Members → Sync from Congressus</w:t>
-      </w:r>
-      <w:r>
-        <w:t xml:space="preserve"> </w:t>
-      </w:r>
-      <w:r>
-        <w:t xml:space="preserve">(catch new/changed members).</w:t>
+        <w:t xml:space="preserve">Edit</w:t>
+      </w:r>
+      <w:r>
+        <w:t xml:space="preserve"> </w:t>
+      </w:r>
+      <w:r>
+        <w:t xml:space="preserve">(pending only) — adjust line quantities with</w:t>
+      </w:r>
+      <w:r>
+        <w:t xml:space="preserve"> </w:t>
+      </w:r>
+      <w:r>
+        <w:rPr>
+          <w:rStyle w:val="VerbatimChar"/>
+        </w:rPr>
+        <w:t xml:space="preserve">−/+</w:t>
+      </w:r>
+      <w:r>
+        <w:t xml:space="preserve">, or set a line to 0</w:t>
+      </w:r>
+      <w:r>
+        <w:t xml:space="preserve"> </w:t>
+      </w:r>
+      <w:r>
+        <w:t xml:space="preserve">to remove it; the total recalculates live. Use this when a member was charged</w:t>
+      </w:r>
+      <w:r>
+        <w:t xml:space="preserve"> </w:t>
+      </w:r>
+      <w:r>
+        <w:t xml:space="preserve">for something by mistake or that wasn't actually in stock.</w:t>
+      </w:r>
+      <w:r>
+        <w:t xml:space="preserve"> </w:t>
+      </w:r>
+      <w:r>
+        <w:rPr>
+          <w:b/>
+          <w:bCs/>
+        </w:rPr>
+        <w:t xml:space="preserve">Save changes</w:t>
+      </w:r>
+      <w:r>
+        <w:t xml:space="preserve">.</w:t>
       </w:r>
     </w:p>
     <w:p>
@@ -16081,23 +15996,17 @@
         </w:numPr>
       </w:pPr>
       <w:r>
-        <w:t xml:space="preserve">Check the</w:t>
-      </w:r>
-      <w:r>
-        <w:t xml:space="preserve"> </w:t>
-      </w:r>
-      <w:r>
         <w:rPr>
           <w:b/>
           <w:bCs/>
         </w:rPr>
-        <w:t xml:space="preserve">Dashboard</w:t>
-      </w:r>
-      <w:r>
-        <w:t xml:space="preserve"> </w:t>
-      </w:r>
-      <w:r>
-        <w:t xml:space="preserve">for the month.</w:t>
+        <w:t xml:space="preserve">Delete invoice</w:t>
+      </w:r>
+      <w:r>
+        <w:t xml:space="preserve"> </w:t>
+      </w:r>
+      <w:r>
+        <w:t xml:space="preserve">(pending only) — remove a whole invoice.</w:t>
       </w:r>
     </w:p>
     <w:p>
@@ -16113,13 +16022,35 @@
           <w:b/>
           <w:bCs/>
         </w:rPr>
-        <w:t xml:space="preserve">Invoices → Export to Congressus</w:t>
-      </w:r>
-      <w:r>
-        <w:t xml:space="preserve"> </w:t>
-      </w:r>
-      <w:r>
-        <w:t xml:space="preserve">to bill the month's purchases.</w:t>
+        <w:t xml:space="preserve">Export to Congressus</w:t>
+      </w:r>
+      <w:r>
+        <w:t xml:space="preserve"> </w:t>
+      </w:r>
+      <w:r>
+        <w:t xml:space="preserve">— bills all pending invoices. They are grouped into</w:t>
+      </w:r>
+      <w:r>
+        <w:t xml:space="preserve"> </w:t>
+      </w:r>
+      <w:r>
+        <w:rPr>
+          <w:b/>
+          <w:bCs/>
+        </w:rPr>
+        <w:t xml:space="preserve">one Congressus invoice per member per month</w:t>
+      </w:r>
+      <w:r>
+        <w:t xml:space="preserve"> </w:t>
+      </w:r>
+      <w:r>
+        <w:t xml:space="preserve">and then move to the Exported</w:t>
+      </w:r>
+      <w:r>
+        <w:t xml:space="preserve"> </w:t>
+      </w:r>
+      <w:r>
+        <w:t xml:space="preserve">tab. Run this once per billing cycle (e.g. monthly).</w:t>
       </w:r>
     </w:p>
     <w:p>
@@ -16131,17 +16062,63 @@
         </w:numPr>
       </w:pPr>
       <w:r>
-        <w:t xml:space="preserve">Verify the new invoices in Congressus.</w:t>
-      </w:r>
-    </w:p>
-    <w:bookmarkEnd w:id="120"/>
-    <w:bookmarkStart w:id="121" w:name="Xdfdd6fef4644c16841a13fbca3b793942ebb4aa"/>
+        <w:rPr>
+          <w:b/>
+          <w:bCs/>
+        </w:rPr>
+        <w:t xml:space="preserve">Clear all … (test data)</w:t>
+      </w:r>
+      <w:r>
+        <w:t xml:space="preserve"> </w:t>
+      </w:r>
+      <w:r>
+        <w:t xml:space="preserve">— bulk-deletes every invoice in the current tab,</w:t>
+      </w:r>
+      <w:r>
+        <w:t xml:space="preserve"> </w:t>
+      </w:r>
+      <w:r>
+        <w:t xml:space="preserve">with a double confirmation. Use this to wipe test data so the dashboard counts</w:t>
+      </w:r>
+      <w:r>
+        <w:t xml:space="preserve"> </w:t>
+      </w:r>
+      <w:r>
+        <w:t xml:space="preserve">fresh.</w:t>
+      </w:r>
+      <w:r>
+        <w:t xml:space="preserve"> </w:t>
+      </w:r>
+      <w:r>
+        <w:rPr>
+          <w:b/>
+          <w:bCs/>
+        </w:rPr>
+        <w:t xml:space="preserve">Irreversible.</w:t>
+      </w:r>
+    </w:p>
+    <w:p>
+      <w:pPr>
+        <w:pStyle w:val="BlockText"/>
+      </w:pPr>
+      <w:r>
+        <w:t xml:space="preserve">Exported invoices are read-only here. They've been sent to Congressus, so</w:t>
+      </w:r>
+      <w:r>
+        <w:t xml:space="preserve"> </w:t>
+      </w:r>
+      <w:r>
+        <w:t xml:space="preserve">corrections after export must be made in Congressus directly.</w:t>
+      </w:r>
+    </w:p>
+    <w:bookmarkEnd w:id="119"/>
+    <w:bookmarkStart w:id="120" w:name="typical-monthly-routine"/>
     <w:p>
       <w:pPr>
         <w:pStyle w:val="Heading2"/>
       </w:pPr>
       <w:r>
-        <w:t xml:space="preserve">Member-facing flows (what members experience)</w:t>
+        <w:t xml:space="preserve">Typical monthly routine</w:t>
       </w:r>
     </w:p>
     <w:p>
@@ -16157,19 +16134,13 @@
           <w:b/>
           <w:bCs/>
         </w:rPr>
-        <w:t xml:space="preserve">Tap a registered card</w:t>
-      </w:r>
-      <w:r>
-        <w:t xml:space="preserve"> </w:t>
-      </w:r>
-      <w:r>
-        <w:t xml:space="preserve">→ the shop opens, greets them by name, they pick</w:t>
-      </w:r>
-      <w:r>
-        <w:t xml:space="preserve"> </w:t>
-      </w:r>
-      <w:r>
-        <w:t xml:space="preserve">snacks and confirm. It auto-returns to the tap screen after ~1 minute idle.</w:t>
+        <w:t xml:space="preserve">Members → Sync from Congressus</w:t>
+      </w:r>
+      <w:r>
+        <w:t xml:space="preserve"> </w:t>
+      </w:r>
+      <w:r>
+        <w:t xml:space="preserve">(catch new/changed members).</w:t>
       </w:r>
     </w:p>
     <w:p>
@@ -16181,61 +16152,23 @@
         </w:numPr>
       </w:pPr>
       <w:r>
+        <w:t xml:space="preserve">Check the</w:t>
+      </w:r>
+      <w:r>
+        <w:t xml:space="preserve"> </w:t>
+      </w:r>
+      <w:r>
         <w:rPr>
           <w:b/>
           <w:bCs/>
         </w:rPr>
-        <w:t xml:space="preserve">Tap an unregistered card</w:t>
-      </w:r>
-      <w:r>
-        <w:t xml:space="preserve"> </w:t>
-      </w:r>
-      <w:r>
-        <w:t xml:space="preserve">→ they enter their</w:t>
-      </w:r>
-      <w:r>
-        <w:t xml:space="preserve"> </w:t>
-      </w:r>
-      <w:r>
-        <w:rPr>
-          <w:b/>
-          <w:bCs/>
-        </w:rPr>
-        <w:t xml:space="preserve">Stress website email</w:t>
-      </w:r>
-      <w:r>
-        <w:t xml:space="preserve"> </w:t>
-      </w:r>
-      <w:r>
-        <w:t xml:space="preserve">→ they</w:t>
-      </w:r>
-      <w:r>
-        <w:t xml:space="preserve"> </w:t>
-      </w:r>
-      <w:r>
-        <w:t xml:space="preserve">get a verification email → they click</w:t>
-      </w:r>
-      <w:r>
-        <w:t xml:space="preserve"> </w:t>
-      </w:r>
-      <w:r>
-        <w:rPr>
-          <w:b/>
-          <w:bCs/>
-        </w:rPr>
-        <w:t xml:space="preserve">Yes, link my card</w:t>
-      </w:r>
-      <w:r>
-        <w:t xml:space="preserve"> </w:t>
-      </w:r>
-      <w:r>
-        <w:t xml:space="preserve">on their phone →</w:t>
-      </w:r>
-      <w:r>
-        <w:t xml:space="preserve"> </w:t>
-      </w:r>
-      <w:r>
-        <w:t xml:space="preserve">the card is linked. They then tap again at the kiosk to shop.</w:t>
+        <w:t xml:space="preserve">Dashboard</w:t>
+      </w:r>
+      <w:r>
+        <w:t xml:space="preserve"> </w:t>
+      </w:r>
+      <w:r>
+        <w:t xml:space="preserve">for the month.</w:t>
       </w:r>
     </w:p>
     <w:p>
@@ -16251,97 +16184,35 @@
           <w:b/>
           <w:bCs/>
         </w:rPr>
-        <w:t xml:space="preserve">"Email not found"</w:t>
-      </w:r>
-      <w:r>
-        <w:t xml:space="preserve"> </w:t>
-      </w:r>
-      <w:r>
-        <w:t xml:space="preserve">→ they typed an email that isn't a member's. They should</w:t>
-      </w:r>
-      <w:r>
-        <w:t xml:space="preserve"> </w:t>
-      </w:r>
-      <w:r>
-        <w:t xml:space="preserve">use the email they log into the Stress website with. Persisting issues → board.</w:t>
-      </w:r>
-    </w:p>
-    <w:p>
-      <w:r>
-        <w:br w:type="page"/>
-      </w:r>
-    </w:p>
-    <w:bookmarkEnd w:id="121"/>
-    <w:bookmarkEnd w:id="122"/>
-    <w:bookmarkStart w:id="136" w:name="security-model"/>
-    <w:p>
-      <w:pPr>
-        <w:pStyle w:val="Heading1"/>
-      </w:pPr>
-      <w:r>
-        <w:t xml:space="preserve">Security Model</w:t>
-      </w:r>
-    </w:p>
-    <w:p>
-      <w:pPr>
-        <w:pStyle w:val="FirstParagraph"/>
-      </w:pPr>
-      <w:r>
-        <w:t xml:space="preserve">The guiding rule:</w:t>
-      </w:r>
-      <w:r>
-        <w:t xml:space="preserve"> </w:t>
-      </w:r>
-      <w:r>
-        <w:rPr>
-          <w:b/>
-          <w:bCs/>
-        </w:rPr>
-        <w:t xml:space="preserve">no member or internal data is reachable without a valid</w:t>
-      </w:r>
-      <w:r>
-        <w:rPr>
-          <w:b/>
-          <w:bCs/>
-        </w:rPr>
-        <w:t xml:space="preserve"> </w:t>
-      </w:r>
-      <w:r>
-        <w:rPr>
-          <w:b/>
-          <w:bCs/>
-        </w:rPr>
-        <w:t xml:space="preserve">session.</w:t>
-      </w:r>
-      <w:r>
-        <w:t xml:space="preserve"> </w:t>
-      </w:r>
-      <w:r>
-        <w:t xml:space="preserve">This document explains how that's enforced and the deliberate</w:t>
-      </w:r>
-      <w:r>
-        <w:t xml:space="preserve"> </w:t>
-      </w:r>
-      <w:r>
-        <w:t xml:space="preserve">trade-offs made for a shared, physical kiosk.</w:t>
-      </w:r>
-    </w:p>
-    <w:bookmarkStart w:id="126" w:name="authentication--authorisation"/>
+        <w:t xml:space="preserve">Invoices → Export to Congressus</w:t>
+      </w:r>
+      <w:r>
+        <w:t xml:space="preserve"> </w:t>
+      </w:r>
+      <w:r>
+        <w:t xml:space="preserve">to bill the month's purchases.</w:t>
+      </w:r>
+    </w:p>
+    <w:p>
+      <w:pPr>
+        <w:pStyle w:val="Compact"/>
+        <w:numPr>
+          <w:ilvl w:val="0"/>
+          <w:numId w:val="1031"/>
+        </w:numPr>
+      </w:pPr>
+      <w:r>
+        <w:t xml:space="preserve">Verify the new invoices in Congressus.</w:t>
+      </w:r>
+    </w:p>
+    <w:bookmarkEnd w:id="120"/>
+    <w:bookmarkStart w:id="121" w:name="Xdfdd6fef4644c16841a13fbca3b793942ebb4aa"/>
     <w:p>
       <w:pPr>
         <w:pStyle w:val="Heading2"/>
       </w:pPr>
       <w:r>
-        <w:t xml:space="preserve">Authentication &amp; authorisation</w:t>
-      </w:r>
-    </w:p>
-    <w:bookmarkStart w:id="123" w:name="admin"/>
-    <w:p>
-      <w:pPr>
-        <w:pStyle w:val="Heading3"/>
-      </w:pPr>
-      <w:r>
-        <w:t xml:space="preserve">Admin</w:t>
+        <w:t xml:space="preserve">Member-facing flows (what members experience)</w:t>
       </w:r>
     </w:p>
     <w:p>
@@ -16353,56 +16224,23 @@
         </w:numPr>
       </w:pPr>
       <w:r>
-        <w:t xml:space="preserve">Login (</w:t>
-      </w:r>
-      <w:r>
-        <w:rPr>
-          <w:rStyle w:val="VerbatimChar"/>
-        </w:rPr>
-        <w:t xml:space="preserve">POST /api/auth/login</w:t>
-      </w:r>
-      <w:r>
-        <w:t xml:space="preserve">) verifies a bcrypt password and sets an</w:t>
-      </w:r>
-      <w:r>
-        <w:t xml:space="preserve"> </w:t>
-      </w:r>
-      <w:r>
         <w:rPr>
           <w:b/>
           <w:bCs/>
         </w:rPr>
-        <w:t xml:space="preserve">httpOnly</w:t>
-      </w:r>
-      <w:r>
-        <w:t xml:space="preserve"> </w:t>
-      </w:r>
-      <w:r>
-        <w:rPr>
-          <w:rStyle w:val="VerbatimChar"/>
-        </w:rPr>
-        <w:t xml:space="preserve">session</w:t>
-      </w:r>
-      <w:r>
-        <w:t xml:space="preserve"> </w:t>
-      </w:r>
-      <w:r>
-        <w:t xml:space="preserve">cookie (7-day</w:t>
-      </w:r>
-      <w:r>
-        <w:t xml:space="preserve"> </w:t>
-      </w:r>
-      <w:r>
-        <w:rPr>
-          <w:rStyle w:val="VerbatimChar"/>
-        </w:rPr>
-        <w:t xml:space="preserve">Session</w:t>
-      </w:r>
-      <w:r>
-        <w:t xml:space="preserve"> </w:t>
-      </w:r>
-      <w:r>
-        <w:t xml:space="preserve">row).</w:t>
+        <w:t xml:space="preserve">Tap a registered card</w:t>
+      </w:r>
+      <w:r>
+        <w:t xml:space="preserve"> </w:t>
+      </w:r>
+      <w:r>
+        <w:t xml:space="preserve">→ the shop opens, greets them by name, they pick</w:t>
+      </w:r>
+      <w:r>
+        <w:t xml:space="preserve"> </w:t>
+      </w:r>
+      <w:r>
+        <w:t xml:space="preserve">snacks and confirm. It auto-returns to the tap screen after ~1 minute idle.</w:t>
       </w:r>
     </w:p>
     <w:p>
@@ -16415,67 +16253,60 @@
       </w:pPr>
       <w:r>
         <w:rPr>
-          <w:rStyle w:val="VerbatimChar"/>
-        </w:rPr>
-        <w:t xml:space="preserve">requireAdmin()</w:t>
-      </w:r>
-      <w:r>
-        <w:t xml:space="preserve"> </w:t>
-      </w:r>
-      <w:r>
-        <w:t xml:space="preserve">(</w:t>
-      </w:r>
-      <w:r>
-        <w:rPr>
-          <w:rStyle w:val="VerbatimChar"/>
-        </w:rPr>
-        <w:t xml:space="preserve">src/lib/auth.ts</w:t>
-      </w:r>
-      <w:r>
-        <w:t xml:space="preserve">) loads the session, checks it isn't expired,</w:t>
-      </w:r>
-      <w:r>
-        <w:t xml:space="preserve"> </w:t>
-      </w:r>
-      <w:r>
-        <w:t xml:space="preserve">and checks</w:t>
-      </w:r>
-      <w:r>
-        <w:t xml:space="preserve"> </w:t>
-      </w:r>
-      <w:r>
-        <w:rPr>
-          <w:rStyle w:val="VerbatimChar"/>
-        </w:rPr>
-        <w:t xml:space="preserve">role === "ADMIN"</w:t>
-      </w:r>
-      <w:r>
-        <w:t xml:space="preserve">.</w:t>
-      </w:r>
-      <w:r>
-        <w:t xml:space="preserve"> </w:t>
-      </w:r>
-      <w:r>
-        <w:rPr>
           <w:b/>
           <w:bCs/>
         </w:rPr>
-        <w:t xml:space="preserve">Every</w:t>
-      </w:r>
-      <w:r>
-        <w:t xml:space="preserve"> </w:t>
-      </w:r>
-      <w:r>
-        <w:rPr>
-          <w:rStyle w:val="VerbatimChar"/>
-        </w:rPr>
-        <w:t xml:space="preserve">/api/admin/*</w:t>
-      </w:r>
-      <w:r>
-        <w:t xml:space="preserve"> </w:t>
-      </w:r>
-      <w:r>
-        <w:t xml:space="preserve">handler calls it.</w:t>
+        <w:t xml:space="preserve">Tap an unregistered card</w:t>
+      </w:r>
+      <w:r>
+        <w:t xml:space="preserve"> </w:t>
+      </w:r>
+      <w:r>
+        <w:t xml:space="preserve">→ they enter their</w:t>
+      </w:r>
+      <w:r>
+        <w:t xml:space="preserve"> </w:t>
+      </w:r>
+      <w:r>
+        <w:rPr>
+          <w:b/>
+          <w:bCs/>
+        </w:rPr>
+        <w:t xml:space="preserve">Stress website email</w:t>
+      </w:r>
+      <w:r>
+        <w:t xml:space="preserve"> </w:t>
+      </w:r>
+      <w:r>
+        <w:t xml:space="preserve">→ they</w:t>
+      </w:r>
+      <w:r>
+        <w:t xml:space="preserve"> </w:t>
+      </w:r>
+      <w:r>
+        <w:t xml:space="preserve">get a verification email → they click</w:t>
+      </w:r>
+      <w:r>
+        <w:t xml:space="preserve"> </w:t>
+      </w:r>
+      <w:r>
+        <w:rPr>
+          <w:b/>
+          <w:bCs/>
+        </w:rPr>
+        <w:t xml:space="preserve">Yes, link my card</w:t>
+      </w:r>
+      <w:r>
+        <w:t xml:space="preserve"> </w:t>
+      </w:r>
+      <w:r>
+        <w:t xml:space="preserve">on their phone →</w:t>
+      </w:r>
+      <w:r>
+        <w:t xml:space="preserve"> </w:t>
+      </w:r>
+      <w:r>
+        <w:t xml:space="preserve">the card is linked. They then tap again at the kiosk to shop.</w:t>
       </w:r>
     </w:p>
     <w:p>
@@ -16487,144 +16318,101 @@
         </w:numPr>
       </w:pPr>
       <w:r>
-        <w:t xml:space="preserve">The admin pages are gated by a</w:t>
-      </w:r>
-      <w:r>
-        <w:t xml:space="preserve"> </w:t>
-      </w:r>
-      <w:r>
         <w:rPr>
           <w:b/>
           <w:bCs/>
         </w:rPr>
-        <w:t xml:space="preserve">server-side layout</w:t>
-      </w:r>
-      <w:r>
-        <w:t xml:space="preserve"> </w:t>
-      </w:r>
-      <w:r>
-        <w:t xml:space="preserve">(</w:t>
-      </w:r>
-      <w:r>
-        <w:rPr>
-          <w:rStyle w:val="VerbatimChar"/>
-        </w:rPr>
-        <w:t xml:space="preserve">requireAdmin()</w:t>
-      </w:r>
-      <w:r>
-        <w:t xml:space="preserve"> </w:t>
-      </w:r>
-      <w:r>
-        <w:t xml:space="preserve">→</w:t>
-      </w:r>
-      <w:r>
-        <w:t xml:space="preserve"> </w:t>
-      </w:r>
-      <w:r>
-        <w:rPr>
-          <w:rStyle w:val="VerbatimChar"/>
-        </w:rPr>
-        <w:t xml:space="preserve">redirect("/admin/login")</w:t>
-      </w:r>
-      <w:r>
-        <w:t xml:space="preserve">), so unauthenticated users never receive page HTML</w:t>
-      </w:r>
-      <w:r>
-        <w:t xml:space="preserve"> </w:t>
-      </w:r>
-      <w:r>
-        <w:t xml:space="preserve">or data — only a redirect.</w:t>
-      </w:r>
-    </w:p>
-    <w:p>
-      <w:pPr>
-        <w:pStyle w:val="Compact"/>
-        <w:numPr>
-          <w:ilvl w:val="0"/>
-          <w:numId w:val="1032"/>
-        </w:numPr>
-      </w:pPr>
-      <w:r>
-        <w:t xml:space="preserve">Middleware (</w:t>
-      </w:r>
-      <w:r>
-        <w:rPr>
-          <w:rStyle w:val="VerbatimChar"/>
-        </w:rPr>
-        <w:t xml:space="preserve">src/middleware.ts</w:t>
-      </w:r>
-      <w:r>
-        <w:t xml:space="preserve">) additionally requires the cookie to be present</w:t>
-      </w:r>
-      <w:r>
-        <w:t xml:space="preserve"> </w:t>
-      </w:r>
-      <w:r>
-        <w:t xml:space="preserve">on</w:t>
-      </w:r>
-      <w:r>
-        <w:t xml:space="preserve"> </w:t>
-      </w:r>
-      <w:r>
-        <w:rPr>
-          <w:rStyle w:val="VerbatimChar"/>
-        </w:rPr>
-        <w:t xml:space="preserve">/admin/*</w:t>
-      </w:r>
-      <w:r>
-        <w:t xml:space="preserve"> </w:t>
-      </w:r>
-      <w:r>
-        <w:t xml:space="preserve">and</w:t>
-      </w:r>
-      <w:r>
-        <w:t xml:space="preserve"> </w:t>
-      </w:r>
-      <w:r>
-        <w:rPr>
-          <w:rStyle w:val="VerbatimChar"/>
-        </w:rPr>
-        <w:t xml:space="preserve">/api/admin/*</w:t>
-      </w:r>
-      <w:r>
-        <w:t xml:space="preserve">. This is a fast pre-check; the real validation</w:t>
-      </w:r>
-      <w:r>
-        <w:t xml:space="preserve"> </w:t>
-      </w:r>
-      <w:r>
-        <w:t xml:space="preserve">is</w:t>
-      </w:r>
-      <w:r>
-        <w:t xml:space="preserve"> </w:t>
-      </w:r>
-      <w:r>
-        <w:rPr>
-          <w:rStyle w:val="VerbatimChar"/>
-        </w:rPr>
-        <w:t xml:space="preserve">requireAdmin()</w:t>
-      </w:r>
-      <w:r>
-        <w:t xml:space="preserve"> </w:t>
-      </w:r>
-      <w:r>
-        <w:t xml:space="preserve">(a forged/expired cookie passes middleware but is rejected</w:t>
-      </w:r>
-      <w:r>
-        <w:t xml:space="preserve"> </w:t>
-      </w:r>
-      <w:r>
-        <w:t xml:space="preserve">by the handler).</w:t>
-      </w:r>
-    </w:p>
-    <w:bookmarkEnd w:id="123"/>
-    <w:bookmarkStart w:id="124" w:name="shop-members"/>
+        <w:t xml:space="preserve">"Email not found"</w:t>
+      </w:r>
+      <w:r>
+        <w:t xml:space="preserve"> </w:t>
+      </w:r>
+      <w:r>
+        <w:t xml:space="preserve">→ they typed an email that isn't a member's. They should</w:t>
+      </w:r>
+      <w:r>
+        <w:t xml:space="preserve"> </w:t>
+      </w:r>
+      <w:r>
+        <w:t xml:space="preserve">use the email they log into the Stress website with. Persisting issues → board.</w:t>
+      </w:r>
+    </w:p>
+    <w:p>
+      <w:r>
+        <w:br w:type="page"/>
+      </w:r>
+    </w:p>
+    <w:bookmarkEnd w:id="121"/>
+    <w:bookmarkEnd w:id="122"/>
+    <w:bookmarkStart w:id="136" w:name="security-model"/>
+    <w:p>
+      <w:pPr>
+        <w:pStyle w:val="Heading1"/>
+      </w:pPr>
+      <w:r>
+        <w:t xml:space="preserve">Security Model</w:t>
+      </w:r>
+    </w:p>
+    <w:p>
+      <w:pPr>
+        <w:pStyle w:val="FirstParagraph"/>
+      </w:pPr>
+      <w:r>
+        <w:t xml:space="preserve">The guiding rule:</w:t>
+      </w:r>
+      <w:r>
+        <w:t xml:space="preserve"> </w:t>
+      </w:r>
+      <w:r>
+        <w:rPr>
+          <w:b/>
+          <w:bCs/>
+        </w:rPr>
+        <w:t xml:space="preserve">no member or internal data is reachable without a valid</w:t>
+      </w:r>
+      <w:r>
+        <w:rPr>
+          <w:b/>
+          <w:bCs/>
+        </w:rPr>
+        <w:t xml:space="preserve"> </w:t>
+      </w:r>
+      <w:r>
+        <w:rPr>
+          <w:b/>
+          <w:bCs/>
+        </w:rPr>
+        <w:t xml:space="preserve">session.</w:t>
+      </w:r>
+      <w:r>
+        <w:t xml:space="preserve"> </w:t>
+      </w:r>
+      <w:r>
+        <w:t xml:space="preserve">This document explains how that's enforced and the deliberate</w:t>
+      </w:r>
+      <w:r>
+        <w:t xml:space="preserve"> </w:t>
+      </w:r>
+      <w:r>
+        <w:t xml:space="preserve">trade-offs made for a shared, physical kiosk.</w:t>
+      </w:r>
+    </w:p>
+    <w:bookmarkStart w:id="126" w:name="authentication--authorisation"/>
+    <w:p>
+      <w:pPr>
+        <w:pStyle w:val="Heading2"/>
+      </w:pPr>
+      <w:r>
+        <w:t xml:space="preserve">Authentication &amp; authorisation</w:t>
+      </w:r>
+    </w:p>
+    <w:bookmarkStart w:id="123" w:name="admin"/>
     <w:p>
       <w:pPr>
         <w:pStyle w:val="Heading3"/>
       </w:pPr>
       <w:r>
-        <w:t xml:space="preserve">Shop (members)</w:t>
+        <w:t xml:space="preserve">Admin</w:t>
       </w:r>
     </w:p>
     <w:p>
@@ -16636,22 +16424,16 @@
         </w:numPr>
       </w:pPr>
       <w:r>
-        <w:t xml:space="preserve">A</w:t>
-      </w:r>
-      <w:r>
-        <w:t xml:space="preserve"> </w:t>
-      </w:r>
-      <w:r>
-        <w:rPr>
-          <w:rStyle w:val="VerbatimChar"/>
-        </w:rPr>
-        <w:t xml:space="preserve">ShopSession</w:t>
-      </w:r>
-      <w:r>
-        <w:t xml:space="preserve"> </w:t>
-      </w:r>
-      <w:r>
-        <w:t xml:space="preserve">token (random cuid) is created only by a</w:t>
+        <w:t xml:space="preserve">Login (</w:t>
+      </w:r>
+      <w:r>
+        <w:rPr>
+          <w:rStyle w:val="VerbatimChar"/>
+        </w:rPr>
+        <w:t xml:space="preserve">POST /api/auth/login</w:t>
+      </w:r>
+      <w:r>
+        <w:t xml:space="preserve">) verifies a bcrypt password and sets an</w:t>
       </w:r>
       <w:r>
         <w:t xml:space="preserve"> </w:t>
@@ -16661,41 +16443,37 @@
           <w:b/>
           <w:bCs/>
         </w:rPr>
-        <w:t xml:space="preserve">physical card tap</w:t>
-      </w:r>
-      <w:r>
-        <w:t xml:space="preserve"> </w:t>
-      </w:r>
-      <w:r>
-        <w:t xml:space="preserve">or an admin's</w:t>
-      </w:r>
-      <w:r>
-        <w:t xml:space="preserve"> </w:t>
-      </w:r>
-      <w:r>
-        <w:rPr>
-          <w:b/>
-          <w:bCs/>
-        </w:rPr>
-        <w:t xml:space="preserve">Enter store</w:t>
-      </w:r>
-      <w:r>
-        <w:t xml:space="preserve">. It lives in the</w:t>
-      </w:r>
-      <w:r>
-        <w:t xml:space="preserve"> </w:t>
-      </w:r>
-      <w:r>
-        <w:rPr>
-          <w:rStyle w:val="VerbatimChar"/>
-        </w:rPr>
-        <w:t xml:space="preserve">/shop/&lt;token&gt;</w:t>
-      </w:r>
-      <w:r>
-        <w:t xml:space="preserve"> </w:t>
-      </w:r>
-      <w:r>
-        <w:t xml:space="preserve">URL.</w:t>
+        <w:t xml:space="preserve">httpOnly</w:t>
+      </w:r>
+      <w:r>
+        <w:t xml:space="preserve"> </w:t>
+      </w:r>
+      <w:r>
+        <w:rPr>
+          <w:rStyle w:val="VerbatimChar"/>
+        </w:rPr>
+        <w:t xml:space="preserve">session</w:t>
+      </w:r>
+      <w:r>
+        <w:t xml:space="preserve"> </w:t>
+      </w:r>
+      <w:r>
+        <w:t xml:space="preserve">cookie (7-day</w:t>
+      </w:r>
+      <w:r>
+        <w:t xml:space="preserve"> </w:t>
+      </w:r>
+      <w:r>
+        <w:rPr>
+          <w:rStyle w:val="VerbatimChar"/>
+        </w:rPr>
+        <w:t xml:space="preserve">Session</w:t>
+      </w:r>
+      <w:r>
+        <w:t xml:space="preserve"> </w:t>
+      </w:r>
+      <w:r>
+        <w:t xml:space="preserve">row).</w:t>
       </w:r>
     </w:p>
     <w:p>
@@ -16710,28 +16488,65 @@
         <w:rPr>
           <w:rStyle w:val="VerbatimChar"/>
         </w:rPr>
-        <w:t xml:space="preserve">/api/cart</w:t>
-      </w:r>
-      <w:r>
-        <w:t xml:space="preserve"> </w:t>
-      </w:r>
-      <w:r>
-        <w:t xml:space="preserve">and</w:t>
-      </w:r>
-      <w:r>
-        <w:t xml:space="preserve"> </w:t>
-      </w:r>
-      <w:r>
-        <w:rPr>
-          <w:rStyle w:val="VerbatimChar"/>
-        </w:rPr>
-        <w:t xml:space="preserve">/api/orders/confirm</w:t>
-      </w:r>
-      <w:r>
-        <w:t xml:space="preserve"> </w:t>
-      </w:r>
-      <w:r>
-        <w:t xml:space="preserve">require a valid, unexpired token.</w:t>
+        <w:t xml:space="preserve">requireAdmin()</w:t>
+      </w:r>
+      <w:r>
+        <w:t xml:space="preserve"> </w:t>
+      </w:r>
+      <w:r>
+        <w:t xml:space="preserve">(</w:t>
+      </w:r>
+      <w:r>
+        <w:rPr>
+          <w:rStyle w:val="VerbatimChar"/>
+        </w:rPr>
+        <w:t xml:space="preserve">src/lib/auth.ts</w:t>
+      </w:r>
+      <w:r>
+        <w:t xml:space="preserve">) loads the session, checks it isn't expired,</w:t>
+      </w:r>
+      <w:r>
+        <w:t xml:space="preserve"> </w:t>
+      </w:r>
+      <w:r>
+        <w:t xml:space="preserve">and checks</w:t>
+      </w:r>
+      <w:r>
+        <w:t xml:space="preserve"> </w:t>
+      </w:r>
+      <w:r>
+        <w:rPr>
+          <w:rStyle w:val="VerbatimChar"/>
+        </w:rPr>
+        <w:t xml:space="preserve">role === "ADMIN"</w:t>
+      </w:r>
+      <w:r>
+        <w:t xml:space="preserve">.</w:t>
+      </w:r>
+      <w:r>
+        <w:t xml:space="preserve"> </w:t>
+      </w:r>
+      <w:r>
+        <w:rPr>
+          <w:b/>
+          <w:bCs/>
+        </w:rPr>
+        <w:t xml:space="preserve">Every</w:t>
+      </w:r>
+      <w:r>
+        <w:t xml:space="preserve"> </w:t>
+      </w:r>
+      <w:r>
+        <w:rPr>
+          <w:rStyle w:val="VerbatimChar"/>
+        </w:rPr>
+        <w:t xml:space="preserve">/api/admin/*</w:t>
+      </w:r>
+      <w:r>
+        <w:t xml:space="preserve"> </w:t>
+      </w:r>
+      <w:r>
+        <w:t xml:space="preserve">handler calls it.</w:t>
       </w:r>
     </w:p>
     <w:p>
@@ -16743,7 +16558,7 @@
         </w:numPr>
       </w:pPr>
       <w:r>
-        <w:t xml:space="preserve">The member's first name is returned</w:t>
+        <w:t xml:space="preserve">The admin pages are gated by a</w:t>
       </w:r>
       <w:r>
         <w:t xml:space="preserve"> </w:t>
@@ -16753,19 +16568,43 @@
           <w:b/>
           <w:bCs/>
         </w:rPr>
-        <w:t xml:space="preserve">only</w:t>
-      </w:r>
-      <w:r>
-        <w:t xml:space="preserve"> </w:t>
-      </w:r>
-      <w:r>
-        <w:t xml:space="preserve">by the token-scoped cart endpoint —</w:t>
-      </w:r>
-      <w:r>
-        <w:t xml:space="preserve"> </w:t>
-      </w:r>
-      <w:r>
-        <w:t xml:space="preserve">never by the public scan endpoint.</w:t>
+        <w:t xml:space="preserve">server-side layout</w:t>
+      </w:r>
+      <w:r>
+        <w:t xml:space="preserve"> </w:t>
+      </w:r>
+      <w:r>
+        <w:t xml:space="preserve">(</w:t>
+      </w:r>
+      <w:r>
+        <w:rPr>
+          <w:rStyle w:val="VerbatimChar"/>
+        </w:rPr>
+        <w:t xml:space="preserve">requireAdmin()</w:t>
+      </w:r>
+      <w:r>
+        <w:t xml:space="preserve"> </w:t>
+      </w:r>
+      <w:r>
+        <w:t xml:space="preserve">→</w:t>
+      </w:r>
+      <w:r>
+        <w:t xml:space="preserve"> </w:t>
+      </w:r>
+      <w:r>
+        <w:rPr>
+          <w:rStyle w:val="VerbatimChar"/>
+        </w:rPr>
+        <w:t xml:space="preserve">redirect("/admin/login")</w:t>
+      </w:r>
+      <w:r>
+        <w:t xml:space="preserve">), so unauthenticated users never receive page HTML</w:t>
+      </w:r>
+      <w:r>
+        <w:t xml:space="preserve"> </w:t>
+      </w:r>
+      <w:r>
+        <w:t xml:space="preserve">or data — only a redirect.</w:t>
       </w:r>
     </w:p>
     <w:p>
@@ -16777,39 +16616,86 @@
         </w:numPr>
       </w:pPr>
       <w:r>
-        <w:rPr>
-          <w:b/>
-          <w:bCs/>
-        </w:rPr>
-        <w:t xml:space="preserve">Idle auto-reset:</w:t>
-      </w:r>
-      <w:r>
-        <w:t xml:space="preserve"> </w:t>
-      </w:r>
-      <w:r>
-        <w:t xml:space="preserve">the shop page deletes the session and returns to the tap</w:t>
-      </w:r>
-      <w:r>
-        <w:t xml:space="preserve"> </w:t>
-      </w:r>
-      <w:r>
-        <w:t xml:space="preserve">screen after ~60 s of inactivity (with a 15 s warning), so a member who walks</w:t>
-      </w:r>
-      <w:r>
-        <w:t xml:space="preserve"> </w:t>
-      </w:r>
-      <w:r>
-        <w:t xml:space="preserve">away can't leave their account open for the next person.</w:t>
-      </w:r>
-    </w:p>
-    <w:bookmarkEnd w:id="124"/>
-    <w:bookmarkStart w:id="125" w:name="card-verification"/>
+        <w:t xml:space="preserve">Middleware (</w:t>
+      </w:r>
+      <w:r>
+        <w:rPr>
+          <w:rStyle w:val="VerbatimChar"/>
+        </w:rPr>
+        <w:t xml:space="preserve">src/middleware.ts</w:t>
+      </w:r>
+      <w:r>
+        <w:t xml:space="preserve">) additionally requires the cookie to be present</w:t>
+      </w:r>
+      <w:r>
+        <w:t xml:space="preserve"> </w:t>
+      </w:r>
+      <w:r>
+        <w:t xml:space="preserve">on</w:t>
+      </w:r>
+      <w:r>
+        <w:t xml:space="preserve"> </w:t>
+      </w:r>
+      <w:r>
+        <w:rPr>
+          <w:rStyle w:val="VerbatimChar"/>
+        </w:rPr>
+        <w:t xml:space="preserve">/admin/*</w:t>
+      </w:r>
+      <w:r>
+        <w:t xml:space="preserve"> </w:t>
+      </w:r>
+      <w:r>
+        <w:t xml:space="preserve">and</w:t>
+      </w:r>
+      <w:r>
+        <w:t xml:space="preserve"> </w:t>
+      </w:r>
+      <w:r>
+        <w:rPr>
+          <w:rStyle w:val="VerbatimChar"/>
+        </w:rPr>
+        <w:t xml:space="preserve">/api/admin/*</w:t>
+      </w:r>
+      <w:r>
+        <w:t xml:space="preserve">. This is a fast pre-check; the real validation</w:t>
+      </w:r>
+      <w:r>
+        <w:t xml:space="preserve"> </w:t>
+      </w:r>
+      <w:r>
+        <w:t xml:space="preserve">is</w:t>
+      </w:r>
+      <w:r>
+        <w:t xml:space="preserve"> </w:t>
+      </w:r>
+      <w:r>
+        <w:rPr>
+          <w:rStyle w:val="VerbatimChar"/>
+        </w:rPr>
+        <w:t xml:space="preserve">requireAdmin()</w:t>
+      </w:r>
+      <w:r>
+        <w:t xml:space="preserve"> </w:t>
+      </w:r>
+      <w:r>
+        <w:t xml:space="preserve">(a forged/expired cookie passes middleware but is rejected</w:t>
+      </w:r>
+      <w:r>
+        <w:t xml:space="preserve"> </w:t>
+      </w:r>
+      <w:r>
+        <w:t xml:space="preserve">by the handler).</w:t>
+      </w:r>
+    </w:p>
+    <w:bookmarkEnd w:id="123"/>
+    <w:bookmarkStart w:id="124" w:name="shop-members"/>
     <w:p>
       <w:pPr>
         <w:pStyle w:val="Heading3"/>
       </w:pPr>
       <w:r>
-        <w:t xml:space="preserve">Card verification</w:t>
+        <w:t xml:space="preserve">Shop (members)</w:t>
       </w:r>
     </w:p>
     <w:p>
@@ -16821,16 +16707,66 @@
         </w:numPr>
       </w:pPr>
       <w:r>
-        <w:rPr>
-          <w:rStyle w:val="VerbatimChar"/>
-        </w:rPr>
-        <w:t xml:space="preserve">CardRegistration</w:t>
-      </w:r>
-      <w:r>
-        <w:t xml:space="preserve"> </w:t>
-      </w:r>
-      <w:r>
-        <w:t xml:space="preserve">tokens are single-use and expire in 15 minutes.</w:t>
+        <w:t xml:space="preserve">A</w:t>
+      </w:r>
+      <w:r>
+        <w:t xml:space="preserve"> </w:t>
+      </w:r>
+      <w:r>
+        <w:rPr>
+          <w:rStyle w:val="VerbatimChar"/>
+        </w:rPr>
+        <w:t xml:space="preserve">ShopSession</w:t>
+      </w:r>
+      <w:r>
+        <w:t xml:space="preserve"> </w:t>
+      </w:r>
+      <w:r>
+        <w:t xml:space="preserve">token (random cuid) is created only by a</w:t>
+      </w:r>
+      <w:r>
+        <w:t xml:space="preserve"> </w:t>
+      </w:r>
+      <w:r>
+        <w:rPr>
+          <w:b/>
+          <w:bCs/>
+        </w:rPr>
+        <w:t xml:space="preserve">physical card tap</w:t>
+      </w:r>
+      <w:r>
+        <w:t xml:space="preserve"> </w:t>
+      </w:r>
+      <w:r>
+        <w:t xml:space="preserve">or an admin's</w:t>
+      </w:r>
+      <w:r>
+        <w:t xml:space="preserve"> </w:t>
+      </w:r>
+      <w:r>
+        <w:rPr>
+          <w:b/>
+          <w:bCs/>
+        </w:rPr>
+        <w:t xml:space="preserve">Enter store</w:t>
+      </w:r>
+      <w:r>
+        <w:t xml:space="preserve">. It lives in the</w:t>
+      </w:r>
+      <w:r>
+        <w:t xml:space="preserve"> </w:t>
+      </w:r>
+      <w:r>
+        <w:rPr>
+          <w:rStyle w:val="VerbatimChar"/>
+        </w:rPr>
+        <w:t xml:space="preserve">/shop/&lt;token&gt;</w:t>
+      </w:r>
+      <w:r>
+        <w:t xml:space="preserve"> </w:t>
+      </w:r>
+      <w:r>
+        <w:t xml:space="preserve">URL.</w:t>
       </w:r>
     </w:p>
     <w:p>
@@ -16839,6 +16775,141 @@
         <w:numPr>
           <w:ilvl w:val="0"/>
           <w:numId w:val="1034"/>
+        </w:numPr>
+      </w:pPr>
+      <w:r>
+        <w:rPr>
+          <w:rStyle w:val="VerbatimChar"/>
+        </w:rPr>
+        <w:t xml:space="preserve">/api/cart</w:t>
+      </w:r>
+      <w:r>
+        <w:t xml:space="preserve"> </w:t>
+      </w:r>
+      <w:r>
+        <w:t xml:space="preserve">and</w:t>
+      </w:r>
+      <w:r>
+        <w:t xml:space="preserve"> </w:t>
+      </w:r>
+      <w:r>
+        <w:rPr>
+          <w:rStyle w:val="VerbatimChar"/>
+        </w:rPr>
+        <w:t xml:space="preserve">/api/orders/confirm</w:t>
+      </w:r>
+      <w:r>
+        <w:t xml:space="preserve"> </w:t>
+      </w:r>
+      <w:r>
+        <w:t xml:space="preserve">require a valid, unexpired token.</w:t>
+      </w:r>
+    </w:p>
+    <w:p>
+      <w:pPr>
+        <w:pStyle w:val="Compact"/>
+        <w:numPr>
+          <w:ilvl w:val="0"/>
+          <w:numId w:val="1034"/>
+        </w:numPr>
+      </w:pPr>
+      <w:r>
+        <w:t xml:space="preserve">The member's first name is returned</w:t>
+      </w:r>
+      <w:r>
+        <w:t xml:space="preserve"> </w:t>
+      </w:r>
+      <w:r>
+        <w:rPr>
+          <w:b/>
+          <w:bCs/>
+        </w:rPr>
+        <w:t xml:space="preserve">only</w:t>
+      </w:r>
+      <w:r>
+        <w:t xml:space="preserve"> </w:t>
+      </w:r>
+      <w:r>
+        <w:t xml:space="preserve">by the token-scoped cart endpoint —</w:t>
+      </w:r>
+      <w:r>
+        <w:t xml:space="preserve"> </w:t>
+      </w:r>
+      <w:r>
+        <w:t xml:space="preserve">never by the public scan endpoint.</w:t>
+      </w:r>
+    </w:p>
+    <w:p>
+      <w:pPr>
+        <w:pStyle w:val="Compact"/>
+        <w:numPr>
+          <w:ilvl w:val="0"/>
+          <w:numId w:val="1034"/>
+        </w:numPr>
+      </w:pPr>
+      <w:r>
+        <w:rPr>
+          <w:b/>
+          <w:bCs/>
+        </w:rPr>
+        <w:t xml:space="preserve">Idle auto-reset:</w:t>
+      </w:r>
+      <w:r>
+        <w:t xml:space="preserve"> </w:t>
+      </w:r>
+      <w:r>
+        <w:t xml:space="preserve">the shop page deletes the session and returns to the tap</w:t>
+      </w:r>
+      <w:r>
+        <w:t xml:space="preserve"> </w:t>
+      </w:r>
+      <w:r>
+        <w:t xml:space="preserve">screen after ~60 s of inactivity (with a 15 s warning), so a member who walks</w:t>
+      </w:r>
+      <w:r>
+        <w:t xml:space="preserve"> </w:t>
+      </w:r>
+      <w:r>
+        <w:t xml:space="preserve">away can't leave their account open for the next person.</w:t>
+      </w:r>
+    </w:p>
+    <w:bookmarkEnd w:id="124"/>
+    <w:bookmarkStart w:id="125" w:name="card-verification"/>
+    <w:p>
+      <w:pPr>
+        <w:pStyle w:val="Heading3"/>
+      </w:pPr>
+      <w:r>
+        <w:t xml:space="preserve">Card verification</w:t>
+      </w:r>
+    </w:p>
+    <w:p>
+      <w:pPr>
+        <w:pStyle w:val="Compact"/>
+        <w:numPr>
+          <w:ilvl w:val="0"/>
+          <w:numId w:val="1035"/>
+        </w:numPr>
+      </w:pPr>
+      <w:r>
+        <w:rPr>
+          <w:rStyle w:val="VerbatimChar"/>
+        </w:rPr>
+        <w:t xml:space="preserve">CardRegistration</w:t>
+      </w:r>
+      <w:r>
+        <w:t xml:space="preserve"> </w:t>
+      </w:r>
+      <w:r>
+        <w:t xml:space="preserve">tokens are single-use and expire in 15 minutes.</w:t>
+      </w:r>
+    </w:p>
+    <w:p>
+      <w:pPr>
+        <w:pStyle w:val="Compact"/>
+        <w:numPr>
+          <w:ilvl w:val="0"/>
+          <w:numId w:val="1035"/>
         </w:numPr>
       </w:pPr>
       <w:r>
@@ -17216,315 +17287,11 @@
         <w:pStyle w:val="Compact"/>
         <w:numPr>
           <w:ilvl w:val="0"/>
-          <w:numId w:val="1035"/>
+          <w:numId w:val="1036"/>
         </w:numPr>
       </w:pPr>
       <w:r>
         <w:t xml:space="preserve">React escapes all interpolated values in the kiosk/shop/admin pages.</w:t>
-      </w:r>
-    </w:p>
-    <w:p>
-      <w:pPr>
-        <w:pStyle w:val="Compact"/>
-        <w:numPr>
-          <w:ilvl w:val="0"/>
-          <w:numId w:val="1035"/>
-        </w:numPr>
-      </w:pPr>
-      <w:r>
-        <w:t xml:space="preserve">The card-verify pages are</w:t>
-      </w:r>
-      <w:r>
-        <w:t xml:space="preserve"> </w:t>
-      </w:r>
-      <w:r>
-        <w:rPr>
-          <w:b/>
-          <w:bCs/>
-        </w:rPr>
-        <w:t xml:space="preserve">hand-built HTML</w:t>
-      </w:r>
-      <w:r>
-        <w:t xml:space="preserve">, so member names and tokens are</w:t>
-      </w:r>
-      <w:r>
-        <w:t xml:space="preserve"> </w:t>
-      </w:r>
-      <w:r>
-        <w:t xml:space="preserve">passed through</w:t>
-      </w:r>
-      <w:r>
-        <w:t xml:space="preserve"> </w:t>
-      </w:r>
-      <w:r>
-        <w:rPr>
-          <w:rStyle w:val="VerbatimChar"/>
-        </w:rPr>
-        <w:t xml:space="preserve">escapeHtml()</w:t>
-      </w:r>
-      <w:r>
-        <w:t xml:space="preserve"> </w:t>
-      </w:r>
-      <w:r>
-        <w:t xml:space="preserve">before interpolation (prevents stored XSS from a</w:t>
-      </w:r>
-      <w:r>
-        <w:t xml:space="preserve"> </w:t>
-      </w:r>
-      <w:r>
-        <w:t xml:space="preserve">name synced out of Congressus).</w:t>
-      </w:r>
-    </w:p>
-    <w:p>
-      <w:pPr>
-        <w:pStyle w:val="Compact"/>
-        <w:numPr>
-          <w:ilvl w:val="0"/>
-          <w:numId w:val="1035"/>
-        </w:numPr>
-      </w:pPr>
-      <w:r>
-        <w:t xml:space="preserve">Those pages declare</w:t>
-      </w:r>
-      <w:r>
-        <w:t xml:space="preserve"> </w:t>
-      </w:r>
-      <w:r>
-        <w:rPr>
-          <w:rStyle w:val="VerbatimChar"/>
-        </w:rPr>
-        <w:t xml:space="preserve">charset=utf-8</w:t>
-      </w:r>
-      <w:r>
-        <w:t xml:space="preserve"> </w:t>
-      </w:r>
-      <w:r>
-        <w:t xml:space="preserve">(header + meta) so emoji/diacritics render</w:t>
-      </w:r>
-      <w:r>
-        <w:t xml:space="preserve"> </w:t>
-      </w:r>
-      <w:r>
-        <w:t xml:space="preserve">correctly.</w:t>
-      </w:r>
-    </w:p>
-    <w:bookmarkEnd w:id="129"/>
-    <w:bookmarkStart w:id="133" w:name="deliberate-trade-offs"/>
-    <w:p>
-      <w:pPr>
-        <w:pStyle w:val="Heading2"/>
-      </w:pPr>
-      <w:r>
-        <w:t xml:space="preserve">Deliberate trade-offs</w:t>
-      </w:r>
-    </w:p>
-    <w:bookmarkStart w:id="130" w:name="card-uids-arent-secret"/>
-    <w:p>
-      <w:pPr>
-        <w:pStyle w:val="Heading3"/>
-      </w:pPr>
-      <w:r>
-        <w:t xml:space="preserve">Card UIDs aren't secret</w:t>
-      </w:r>
-    </w:p>
-    <w:p>
-      <w:pPr>
-        <w:pStyle w:val="FirstParagraph"/>
-      </w:pPr>
-      <w:r>
-        <w:t xml:space="preserve">Any NFC reader can read a card UID, and the scan endpoint is necessarily</w:t>
-      </w:r>
-      <w:r>
-        <w:t xml:space="preserve"> </w:t>
-      </w:r>
-      <w:r>
-        <w:t xml:space="preserve">unauthenticated (the kiosk is a public web page). Mitigations: the scan endpoint</w:t>
-      </w:r>
-      <w:r>
-        <w:t xml:space="preserve"> </w:t>
-      </w:r>
-      <w:r>
-        <w:t xml:space="preserve">returns no member data and is rate-limited. For stronger protection, restrict</w:t>
-      </w:r>
-      <w:r>
-        <w:t xml:space="preserve"> </w:t>
-      </w:r>
-      <w:r>
-        <w:rPr>
-          <w:rStyle w:val="VerbatimChar"/>
-        </w:rPr>
-        <w:t xml:space="preserve">/api/card/scan</w:t>
-      </w:r>
-      <w:r>
-        <w:t xml:space="preserve"> </w:t>
-      </w:r>
-      <w:r>
-        <w:t xml:space="preserve">to the kiosk's IP at the network layer.</w:t>
-      </w:r>
-    </w:p>
-    <w:bookmarkEnd w:id="130"/>
-    <w:bookmarkStart w:id="131" w:name="email-not-found-vs-enumeration"/>
-    <w:p>
-      <w:pPr>
-        <w:pStyle w:val="Heading3"/>
-      </w:pPr>
-      <w:r>
-        <w:t xml:space="preserve">"Email not found" vs enumeration</w:t>
-      </w:r>
-    </w:p>
-    <w:p>
-      <w:pPr>
-        <w:pStyle w:val="FirstParagraph"/>
-      </w:pPr>
-      <w:r>
-        <w:t xml:space="preserve">The card-registration flow tells a user when their email matches no member</w:t>
-      </w:r>
-      <w:r>
-        <w:t xml:space="preserve"> </w:t>
-      </w:r>
-      <w:r>
-        <w:t xml:space="preserve">("Email not found"). This</w:t>
-      </w:r>
-      <w:r>
-        <w:t xml:space="preserve"> </w:t>
-      </w:r>
-      <w:r>
-        <w:rPr>
-          <w:b/>
-          <w:bCs/>
-        </w:rPr>
-        <w:t xml:space="preserve">re-introduces some email-enumeration ability</w:t>
-      </w:r>
-      <w:r>
-        <w:t xml:space="preserve"> </w:t>
-      </w:r>
-      <w:r>
-        <w:t xml:space="preserve">that a</w:t>
-      </w:r>
-      <w:r>
-        <w:t xml:space="preserve"> </w:t>
-      </w:r>
-      <w:r>
-        <w:t xml:space="preserve">uniform response would prevent. It was a conscious product choice: confused</w:t>
-      </w:r>
-      <w:r>
-        <w:t xml:space="preserve"> </w:t>
-      </w:r>
-      <w:r>
-        <w:t xml:space="preserve">members not knowing why nothing happened is a real problem at a kiosk, the kiosk</w:t>
-      </w:r>
-      <w:r>
-        <w:t xml:space="preserve"> </w:t>
-      </w:r>
-      <w:r>
-        <w:t xml:space="preserve">is physical, and the endpoint is rate-limited. If enumeration resistance becomes</w:t>
-      </w:r>
-      <w:r>
-        <w:t xml:space="preserve"> </w:t>
-      </w:r>
-      <w:r>
-        <w:t xml:space="preserve">more important than this UX, revert</w:t>
-      </w:r>
-      <w:r>
-        <w:t xml:space="preserve"> </w:t>
-      </w:r>
-      <w:r>
-        <w:rPr>
-          <w:rStyle w:val="VerbatimChar"/>
-        </w:rPr>
-        <w:t xml:space="preserve">card/register</w:t>
-      </w:r>
-      <w:r>
-        <w:t xml:space="preserve"> </w:t>
-      </w:r>
-      <w:r>
-        <w:t xml:space="preserve">to a uniform</w:t>
-      </w:r>
-      <w:r>
-        <w:t xml:space="preserve"> </w:t>
-      </w:r>
-      <w:r>
-        <w:rPr>
-          <w:rStyle w:val="VerbatimChar"/>
-        </w:rPr>
-        <w:t xml:space="preserve">{ ok: true }</w:t>
-      </w:r>
-      <w:r>
-        <w:t xml:space="preserve">.</w:t>
-      </w:r>
-    </w:p>
-    <w:bookmarkEnd w:id="131"/>
-    <w:bookmarkStart w:id="132" w:name="shop-token-is-a-bearer-token-in-the-url"/>
-    <w:p>
-      <w:pPr>
-        <w:pStyle w:val="Heading3"/>
-      </w:pPr>
-      <w:r>
-        <w:t xml:space="preserve">Shop token is a bearer token in the URL</w:t>
-      </w:r>
-    </w:p>
-    <w:p>
-      <w:pPr>
-        <w:pStyle w:val="FirstParagraph"/>
-      </w:pPr>
-      <w:r>
-        <w:t xml:space="preserve">Anyone holding a live</w:t>
-      </w:r>
-      <w:r>
-        <w:t xml:space="preserve"> </w:t>
-      </w:r>
-      <w:r>
-        <w:rPr>
-          <w:rStyle w:val="VerbatimChar"/>
-        </w:rPr>
-        <w:t xml:space="preserve">/shop/&lt;token&gt;</w:t>
-      </w:r>
-      <w:r>
-        <w:t xml:space="preserve"> </w:t>
-      </w:r>
-      <w:r>
-        <w:t xml:space="preserve">URL can act as that member until it expires</w:t>
-      </w:r>
-      <w:r>
-        <w:t xml:space="preserve"> </w:t>
-      </w:r>
-      <w:r>
-        <w:t xml:space="preserve">(10 min) or the order is confirmed. Tokens are random and per-tap (a new one each</w:t>
-      </w:r>
-      <w:r>
-        <w:t xml:space="preserve"> </w:t>
-      </w:r>
-      <w:r>
-        <w:t xml:space="preserve">scan), so they can't be guessed or reused. The idle auto-reset and short lifetime</w:t>
-      </w:r>
-      <w:r>
-        <w:t xml:space="preserve"> </w:t>
-      </w:r>
-      <w:r>
-        <w:t xml:space="preserve">bound the exposure. Stronger options (not currently implemented): move the token</w:t>
-      </w:r>
-      <w:r>
-        <w:t xml:space="preserve"> </w:t>
-      </w:r>
-      <w:r>
-        <w:t xml:space="preserve">into an httpOnly cookie so it can't be shared via URL, or use a crypto-random</w:t>
-      </w:r>
-      <w:r>
-        <w:t xml:space="preserve"> </w:t>
-      </w:r>
-      <w:r>
-        <w:t xml:space="preserve">token instead of a cuid.</w:t>
-      </w:r>
-    </w:p>
-    <w:bookmarkEnd w:id="132"/>
-    <w:bookmarkEnd w:id="133"/>
-    <w:bookmarkStart w:id="134" w:name="prohibited--careful-operations"/>
-    <w:p>
-      <w:pPr>
-        <w:pStyle w:val="Heading2"/>
-      </w:pPr>
-      <w:r>
-        <w:t xml:space="preserve">Prohibited / careful operations</w:t>
       </w:r>
     </w:p>
     <w:p>
@@ -17536,17 +17303,47 @@
         </w:numPr>
       </w:pPr>
       <w:r>
+        <w:t xml:space="preserve">The card-verify pages are</w:t>
+      </w:r>
+      <w:r>
+        <w:t xml:space="preserve"> </w:t>
+      </w:r>
+      <w:r>
         <w:rPr>
           <w:b/>
           <w:bCs/>
         </w:rPr>
-        <w:t xml:space="preserve">Member deletion</w:t>
-      </w:r>
-      <w:r>
-        <w:t xml:space="preserve"> </w:t>
-      </w:r>
-      <w:r>
-        <w:t xml:space="preserve">is blocked while invoices exist.</w:t>
+        <w:t xml:space="preserve">hand-built HTML</w:t>
+      </w:r>
+      <w:r>
+        <w:t xml:space="preserve">, so member names and tokens are</w:t>
+      </w:r>
+      <w:r>
+        <w:t xml:space="preserve"> </w:t>
+      </w:r>
+      <w:r>
+        <w:t xml:space="preserve">passed through</w:t>
+      </w:r>
+      <w:r>
+        <w:t xml:space="preserve"> </w:t>
+      </w:r>
+      <w:r>
+        <w:rPr>
+          <w:rStyle w:val="VerbatimChar"/>
+        </w:rPr>
+        <w:t xml:space="preserve">escapeHtml()</w:t>
+      </w:r>
+      <w:r>
+        <w:t xml:space="preserve"> </w:t>
+      </w:r>
+      <w:r>
+        <w:t xml:space="preserve">before interpolation (prevents stored XSS from a</w:t>
+      </w:r>
+      <w:r>
+        <w:t xml:space="preserve"> </w:t>
+      </w:r>
+      <w:r>
+        <w:t xml:space="preserve">name synced out of Congressus).</w:t>
       </w:r>
     </w:p>
     <w:p>
@@ -17558,110 +17355,358 @@
         </w:numPr>
       </w:pPr>
       <w:r>
+        <w:t xml:space="preserve">Those pages declare</w:t>
+      </w:r>
+      <w:r>
+        <w:t xml:space="preserve"> </w:t>
+      </w:r>
+      <w:r>
+        <w:rPr>
+          <w:rStyle w:val="VerbatimChar"/>
+        </w:rPr>
+        <w:t xml:space="preserve">charset=utf-8</w:t>
+      </w:r>
+      <w:r>
+        <w:t xml:space="preserve"> </w:t>
+      </w:r>
+      <w:r>
+        <w:t xml:space="preserve">(header + meta) so emoji/diacritics render</w:t>
+      </w:r>
+      <w:r>
+        <w:t xml:space="preserve"> </w:t>
+      </w:r>
+      <w:r>
+        <w:t xml:space="preserve">correctly.</w:t>
+      </w:r>
+    </w:p>
+    <w:bookmarkEnd w:id="129"/>
+    <w:bookmarkStart w:id="133" w:name="deliberate-trade-offs"/>
+    <w:p>
+      <w:pPr>
+        <w:pStyle w:val="Heading2"/>
+      </w:pPr>
+      <w:r>
+        <w:t xml:space="preserve">Deliberate trade-offs</w:t>
+      </w:r>
+    </w:p>
+    <w:bookmarkStart w:id="130" w:name="card-uids-arent-secret"/>
+    <w:p>
+      <w:pPr>
+        <w:pStyle w:val="Heading3"/>
+      </w:pPr>
+      <w:r>
+        <w:t xml:space="preserve">Card UIDs aren't secret</w:t>
+      </w:r>
+    </w:p>
+    <w:p>
+      <w:pPr>
+        <w:pStyle w:val="FirstParagraph"/>
+      </w:pPr>
+      <w:r>
+        <w:t xml:space="preserve">Any NFC reader can read a card UID, and the scan endpoint is necessarily</w:t>
+      </w:r>
+      <w:r>
+        <w:t xml:space="preserve"> </w:t>
+      </w:r>
+      <w:r>
+        <w:t xml:space="preserve">unauthenticated (the kiosk is a public web page). Mitigations: the scan endpoint</w:t>
+      </w:r>
+      <w:r>
+        <w:t xml:space="preserve"> </w:t>
+      </w:r>
+      <w:r>
+        <w:t xml:space="preserve">returns no member data and is rate-limited. For stronger protection, restrict</w:t>
+      </w:r>
+      <w:r>
+        <w:t xml:space="preserve"> </w:t>
+      </w:r>
+      <w:r>
+        <w:rPr>
+          <w:rStyle w:val="VerbatimChar"/>
+        </w:rPr>
+        <w:t xml:space="preserve">/api/card/scan</w:t>
+      </w:r>
+      <w:r>
+        <w:t xml:space="preserve"> </w:t>
+      </w:r>
+      <w:r>
+        <w:t xml:space="preserve">to the kiosk's IP at the network layer.</w:t>
+      </w:r>
+    </w:p>
+    <w:bookmarkEnd w:id="130"/>
+    <w:bookmarkStart w:id="131" w:name="email-not-found-vs-enumeration"/>
+    <w:p>
+      <w:pPr>
+        <w:pStyle w:val="Heading3"/>
+      </w:pPr>
+      <w:r>
+        <w:t xml:space="preserve">"Email not found" vs enumeration</w:t>
+      </w:r>
+    </w:p>
+    <w:p>
+      <w:pPr>
+        <w:pStyle w:val="FirstParagraph"/>
+      </w:pPr>
+      <w:r>
+        <w:t xml:space="preserve">The card-registration flow tells a user when their email matches no member</w:t>
+      </w:r>
+      <w:r>
+        <w:t xml:space="preserve"> </w:t>
+      </w:r>
+      <w:r>
+        <w:t xml:space="preserve">("Email not found"). This</w:t>
+      </w:r>
+      <w:r>
+        <w:t xml:space="preserve"> </w:t>
+      </w:r>
+      <w:r>
         <w:rPr>
           <w:b/>
           <w:bCs/>
         </w:rPr>
-        <w:t xml:space="preserve">Invoice edit/delete</w:t>
-      </w:r>
-      <w:r>
-        <w:t xml:space="preserve"> </w:t>
-      </w:r>
-      <w:r>
-        <w:t xml:space="preserve">is blocked once an invoice is</w:t>
-      </w:r>
-      <w:r>
-        <w:t xml:space="preserve"> </w:t>
-      </w:r>
-      <w:r>
-        <w:rPr>
-          <w:rStyle w:val="VerbatimChar"/>
-        </w:rPr>
-        <w:t xml:space="preserve">EXPORTED</w:t>
-      </w:r>
-      <w:r>
-        <w:t xml:space="preserve"> </w:t>
-      </w:r>
-      <w:r>
-        <w:t xml:space="preserve">(already billed</w:t>
-      </w:r>
-      <w:r>
-        <w:t xml:space="preserve"> </w:t>
-      </w:r>
-      <w:r>
-        <w:t xml:space="preserve">in Congressus).</w:t>
+        <w:t xml:space="preserve">re-introduces some email-enumeration ability</w:t>
+      </w:r>
+      <w:r>
+        <w:t xml:space="preserve"> </w:t>
+      </w:r>
+      <w:r>
+        <w:t xml:space="preserve">that a</w:t>
+      </w:r>
+      <w:r>
+        <w:t xml:space="preserve"> </w:t>
+      </w:r>
+      <w:r>
+        <w:t xml:space="preserve">uniform response would prevent. It was a conscious product choice: confused</w:t>
+      </w:r>
+      <w:r>
+        <w:t xml:space="preserve"> </w:t>
+      </w:r>
+      <w:r>
+        <w:t xml:space="preserve">members not knowing why nothing happened is a real problem at a kiosk, the kiosk</w:t>
+      </w:r>
+      <w:r>
+        <w:t xml:space="preserve"> </w:t>
+      </w:r>
+      <w:r>
+        <w:t xml:space="preserve">is physical, and the endpoint is rate-limited. If enumeration resistance becomes</w:t>
+      </w:r>
+      <w:r>
+        <w:t xml:space="preserve"> </w:t>
+      </w:r>
+      <w:r>
+        <w:t xml:space="preserve">more important than this UX, revert</w:t>
+      </w:r>
+      <w:r>
+        <w:t xml:space="preserve"> </w:t>
+      </w:r>
+      <w:r>
+        <w:rPr>
+          <w:rStyle w:val="VerbatimChar"/>
+        </w:rPr>
+        <w:t xml:space="preserve">card/register</w:t>
+      </w:r>
+      <w:r>
+        <w:t xml:space="preserve"> </w:t>
+      </w:r>
+      <w:r>
+        <w:t xml:space="preserve">to a uniform</w:t>
+      </w:r>
+      <w:r>
+        <w:t xml:space="preserve"> </w:t>
+      </w:r>
+      <w:r>
+        <w:rPr>
+          <w:rStyle w:val="VerbatimChar"/>
+        </w:rPr>
+        <w:t xml:space="preserve">{ ok: true }</w:t>
+      </w:r>
+      <w:r>
+        <w:t xml:space="preserve">.</w:t>
+      </w:r>
+    </w:p>
+    <w:bookmarkEnd w:id="131"/>
+    <w:bookmarkStart w:id="132" w:name="shop-token-is-a-bearer-token-in-the-url"/>
+    <w:p>
+      <w:pPr>
+        <w:pStyle w:val="Heading3"/>
+      </w:pPr>
+      <w:r>
+        <w:t xml:space="preserve">Shop token is a bearer token in the URL</w:t>
+      </w:r>
+    </w:p>
+    <w:p>
+      <w:pPr>
+        <w:pStyle w:val="FirstParagraph"/>
+      </w:pPr>
+      <w:r>
+        <w:t xml:space="preserve">Anyone holding a live</w:t>
+      </w:r>
+      <w:r>
+        <w:t xml:space="preserve"> </w:t>
+      </w:r>
+      <w:r>
+        <w:rPr>
+          <w:rStyle w:val="VerbatimChar"/>
+        </w:rPr>
+        <w:t xml:space="preserve">/shop/&lt;token&gt;</w:t>
+      </w:r>
+      <w:r>
+        <w:t xml:space="preserve"> </w:t>
+      </w:r>
+      <w:r>
+        <w:t xml:space="preserve">URL can act as that member until it expires</w:t>
+      </w:r>
+      <w:r>
+        <w:t xml:space="preserve"> </w:t>
+      </w:r>
+      <w:r>
+        <w:t xml:space="preserve">(10 min) or the order is confirmed. Tokens are random and per-tap (a new one each</w:t>
+      </w:r>
+      <w:r>
+        <w:t xml:space="preserve"> </w:t>
+      </w:r>
+      <w:r>
+        <w:t xml:space="preserve">scan), so they can't be guessed or reused. The idle auto-reset and short lifetime</w:t>
+      </w:r>
+      <w:r>
+        <w:t xml:space="preserve"> </w:t>
+      </w:r>
+      <w:r>
+        <w:t xml:space="preserve">bound the exposure. Stronger options (not currently implemented): move the token</w:t>
+      </w:r>
+      <w:r>
+        <w:t xml:space="preserve"> </w:t>
+      </w:r>
+      <w:r>
+        <w:t xml:space="preserve">into an httpOnly cookie so it can't be shared via URL, or use a crypto-random</w:t>
+      </w:r>
+      <w:r>
+        <w:t xml:space="preserve"> </w:t>
+      </w:r>
+      <w:r>
+        <w:t xml:space="preserve">token instead of a cuid.</w:t>
+      </w:r>
+    </w:p>
+    <w:bookmarkEnd w:id="132"/>
+    <w:bookmarkEnd w:id="133"/>
+    <w:bookmarkStart w:id="134" w:name="prohibited--careful-operations"/>
+    <w:p>
+      <w:pPr>
+        <w:pStyle w:val="Heading2"/>
+      </w:pPr>
+      <w:r>
+        <w:t xml:space="preserve">Prohibited / careful operations</w:t>
       </w:r>
     </w:p>
     <w:p>
       <w:pPr>
         <w:pStyle w:val="Compact"/>
-        <w:numPr>
-          <w:ilvl w:val="0"/>
-          <w:numId w:val="1036"/>
-        </w:numPr>
-      </w:pPr>
-      <w:r>
-        <w:rPr>
-          <w:b/>
-          <w:bCs/>
-        </w:rPr>
-        <w:t xml:space="preserve">Bulk invoice clearing</w:t>
-      </w:r>
-      <w:r>
-        <w:t xml:space="preserve"> </w:t>
-      </w:r>
-      <w:r>
-        <w:t xml:space="preserve">requires a double confirmation in the UI and is</w:t>
-      </w:r>
-      <w:r>
-        <w:t xml:space="preserve"> </w:t>
-      </w:r>
-      <w:r>
-        <w:t xml:space="preserve">intended for test-data cleanup only.</w:t>
-      </w:r>
-    </w:p>
-    <w:bookmarkEnd w:id="134"/>
-    <w:bookmarkStart w:id="135" w:name="audit-checklist"/>
-    <w:p>
-      <w:pPr>
-        <w:pStyle w:val="Heading2"/>
-      </w:pPr>
-      <w:r>
-        <w:t xml:space="preserve">Audit checklist</w:t>
-      </w:r>
-    </w:p>
-    <w:p>
-      <w:pPr>
-        <w:pStyle w:val="FirstParagraph"/>
-      </w:pPr>
-      <w:r>
-        <w:t xml:space="preserve">When adding a new endpoint:</w:t>
-      </w:r>
-    </w:p>
-    <w:p>
-      <w:pPr>
         <w:numPr>
           <w:ilvl w:val="0"/>
           <w:numId w:val="1037"/>
         </w:numPr>
       </w:pPr>
       <w:r>
-        <w:t xml:space="preserve">Does it touch member/admin data? → call</w:t>
-      </w:r>
-      <w:r>
-        <w:t xml:space="preserve"> </w:t>
-      </w:r>
-      <w:r>
-        <w:rPr>
-          <w:rStyle w:val="VerbatimChar"/>
-        </w:rPr>
-        <w:t xml:space="preserve">requireAdmin()</w:t>
-      </w:r>
-      <w:r>
-        <w:t xml:space="preserve"> </w:t>
-      </w:r>
-      <w:r>
-        <w:t xml:space="preserve">(admin) or validate a token (shop/registration).</w:t>
+        <w:rPr>
+          <w:b/>
+          <w:bCs/>
+        </w:rPr>
+        <w:t xml:space="preserve">Member deletion</w:t>
+      </w:r>
+      <w:r>
+        <w:t xml:space="preserve"> </w:t>
+      </w:r>
+      <w:r>
+        <w:t xml:space="preserve">is blocked while invoices exist.</w:t>
+      </w:r>
+    </w:p>
+    <w:p>
+      <w:pPr>
+        <w:pStyle w:val="Compact"/>
+        <w:numPr>
+          <w:ilvl w:val="0"/>
+          <w:numId w:val="1037"/>
+        </w:numPr>
+      </w:pPr>
+      <w:r>
+        <w:rPr>
+          <w:b/>
+          <w:bCs/>
+        </w:rPr>
+        <w:t xml:space="preserve">Invoice edit/delete</w:t>
+      </w:r>
+      <w:r>
+        <w:t xml:space="preserve"> </w:t>
+      </w:r>
+      <w:r>
+        <w:t xml:space="preserve">is blocked once an invoice is</w:t>
+      </w:r>
+      <w:r>
+        <w:t xml:space="preserve"> </w:t>
+      </w:r>
+      <w:r>
+        <w:rPr>
+          <w:rStyle w:val="VerbatimChar"/>
+        </w:rPr>
+        <w:t xml:space="preserve">EXPORTED</w:t>
+      </w:r>
+      <w:r>
+        <w:t xml:space="preserve"> </w:t>
+      </w:r>
+      <w:r>
+        <w:t xml:space="preserve">(already billed</w:t>
+      </w:r>
+      <w:r>
+        <w:t xml:space="preserve"> </w:t>
+      </w:r>
+      <w:r>
+        <w:t xml:space="preserve">in Congressus).</w:t>
+      </w:r>
+    </w:p>
+    <w:p>
+      <w:pPr>
+        <w:pStyle w:val="Compact"/>
+        <w:numPr>
+          <w:ilvl w:val="0"/>
+          <w:numId w:val="1037"/>
+        </w:numPr>
+      </w:pPr>
+      <w:r>
+        <w:rPr>
+          <w:b/>
+          <w:bCs/>
+        </w:rPr>
+        <w:t xml:space="preserve">Bulk invoice clearing</w:t>
+      </w:r>
+      <w:r>
+        <w:t xml:space="preserve"> </w:t>
+      </w:r>
+      <w:r>
+        <w:t xml:space="preserve">requires a double confirmation in the UI and is</w:t>
+      </w:r>
+      <w:r>
+        <w:t xml:space="preserve"> </w:t>
+      </w:r>
+      <w:r>
+        <w:t xml:space="preserve">intended for test-data cleanup only.</w:t>
+      </w:r>
+    </w:p>
+    <w:bookmarkEnd w:id="134"/>
+    <w:bookmarkStart w:id="135" w:name="audit-checklist"/>
+    <w:p>
+      <w:pPr>
+        <w:pStyle w:val="Heading2"/>
+      </w:pPr>
+      <w:r>
+        <w:t xml:space="preserve">Audit checklist</w:t>
+      </w:r>
+    </w:p>
+    <w:p>
+      <w:pPr>
+        <w:pStyle w:val="FirstParagraph"/>
+      </w:pPr>
+      <w:r>
+        <w:t xml:space="preserve">When adding a new endpoint:</w:t>
       </w:r>
     </w:p>
     <w:p>
@@ -17672,22 +17717,22 @@
         </w:numPr>
       </w:pPr>
       <w:r>
-        <w:t xml:space="preserve">Does it return more fields than the caller needs? →</w:t>
-      </w:r>
-      <w:r>
-        <w:t xml:space="preserve"> </w:t>
-      </w:r>
-      <w:r>
-        <w:rPr>
-          <w:rStyle w:val="VerbatimChar"/>
-        </w:rPr>
-        <w:t xml:space="preserve">select</w:t>
-      </w:r>
-      <w:r>
-        <w:t xml:space="preserve"> </w:t>
-      </w:r>
-      <w:r>
-        <w:t xml:space="preserve">only what's required.</w:t>
+        <w:t xml:space="preserve">Does it touch member/admin data? → call</w:t>
+      </w:r>
+      <w:r>
+        <w:t xml:space="preserve"> </w:t>
+      </w:r>
+      <w:r>
+        <w:rPr>
+          <w:rStyle w:val="VerbatimChar"/>
+        </w:rPr>
+        <w:t xml:space="preserve">requireAdmin()</w:t>
+      </w:r>
+      <w:r>
+        <w:t xml:space="preserve"> </w:t>
+      </w:r>
+      <w:r>
+        <w:t xml:space="preserve">(admin) or validate a token (shop/registration).</w:t>
       </w:r>
     </w:p>
     <w:p>
@@ -17698,7 +17743,22 @@
         </w:numPr>
       </w:pPr>
       <w:r>
-        <w:t xml:space="preserve">Is it public and write-capable or enumeration-prone? → add rate limiting.</w:t>
+        <w:t xml:space="preserve">Does it return more fields than the caller needs? →</w:t>
+      </w:r>
+      <w:r>
+        <w:t xml:space="preserve"> </w:t>
+      </w:r>
+      <w:r>
+        <w:rPr>
+          <w:rStyle w:val="VerbatimChar"/>
+        </w:rPr>
+        <w:t xml:space="preserve">select</w:t>
+      </w:r>
+      <w:r>
+        <w:t xml:space="preserve"> </w:t>
+      </w:r>
+      <w:r>
+        <w:t xml:space="preserve">only what's required.</w:t>
       </w:r>
     </w:p>
     <w:p>
@@ -17709,7 +17769,7 @@
         </w:numPr>
       </w:pPr>
       <w:r>
-        <w:t xml:space="preserve">Does it render raw HTML with external data? → escape it.</w:t>
+        <w:t xml:space="preserve">Is it public and write-capable or enumeration-prone? → add rate limiting.</w:t>
       </w:r>
     </w:p>
     <w:p>
@@ -17717,6 +17777,17 @@
         <w:numPr>
           <w:ilvl w:val="0"/>
           <w:numId w:val="1041"/>
+        </w:numPr>
+      </w:pPr>
+      <w:r>
+        <w:t xml:space="preserve">Does it render raw HTML with external data? → escape it.</w:t>
+      </w:r>
+    </w:p>
+    <w:p>
+      <w:pPr>
+        <w:numPr>
+          <w:ilvl w:val="0"/>
+          <w:numId w:val="1042"/>
         </w:numPr>
       </w:pPr>
       <w:r>
@@ -18395,6 +18466,9 @@
     <w:abstractNumId w:val="991"/>
   </w:num>
   <w:num w:numId="1030">
+    <w:abstractNumId w:val="991"/>
+  </w:num>
+  <w:num w:numId="1031">
     <w:abstractNumId w:val="99411"/>
     <w:lvlOverride w:ilvl="0">
       <w:startOverride w:val="1"/>
@@ -18424,9 +18498,6 @@
       <w:startOverride w:val="1"/>
     </w:lvlOverride>
   </w:num>
-  <w:num w:numId="1031">
-    <w:abstractNumId w:val="991"/>
-  </w:num>
   <w:num w:numId="1032">
     <w:abstractNumId w:val="991"/>
   </w:num>
@@ -18443,7 +18514,7 @@
     <w:abstractNumId w:val="991"/>
   </w:num>
   <w:num w:numId="1037">
-    <w:abstractNumId w:val="992"/>
+    <w:abstractNumId w:val="991"/>
   </w:num>
   <w:num w:numId="1038">
     <w:abstractNumId w:val="992"/>
@@ -18455,6 +18526,9 @@
     <w:abstractNumId w:val="992"/>
   </w:num>
   <w:num w:numId="1041">
+    <w:abstractNumId w:val="992"/>
+  </w:num>
+  <w:num w:numId="1042">
     <w:abstractNumId w:val="992"/>
   </w:num>
 </w:numbering>

</xml_diff>

<commit_message>
Add a recent-purchases feed to the dashboard
- Stats API returns recentPurchases: the latest 12 orders in the range, each
  with member name, items (name × qty), total, and timestamp.
- Dashboard: new "Recent purchases" box (member, items summary, total, and a
  relative time-ago), completing a 2x2 layout.

Docs: document the feed in the admin guide and bring the API stats example up
to date (activeUsers, topSpenders, recentPurchases); regenerate the Word doc.

Co-Authored-By: Claude Opus 4.8 <noreply@anthropic.com>
</commit_message>
<xml_diff>
--- a/docs/SSS-Documentation.docx
+++ b/docs/SSS-Documentation.docx
@@ -8975,6 +8975,21 @@
       <w:r>
         <w:t xml:space="preserve">invoices).</w:t>
       </w:r>
+      <w:r>
+        <w:t xml:space="preserve"> </w:t>
+      </w:r>
+      <w:r>
+        <w:rPr>
+          <w:rStyle w:val="VerbatimChar"/>
+        </w:rPr>
+        <w:t xml:space="preserve">activeUsers</w:t>
+      </w:r>
+      <w:r>
+        <w:t xml:space="preserve"> </w:t>
+      </w:r>
+      <w:r>
+        <w:t xml:space="preserve">is the count of distinct members who purchased in the period.</w:t>
+      </w:r>
     </w:p>
     <w:p>
       <w:pPr>
@@ -9170,6 +9185,42 @@
         <w:t xml:space="preserve">,</w:t>
       </w:r>
       <w:r>
+        <w:rPr>
+          <w:rStyle w:val="NormalTok"/>
+        </w:rPr>
+        <w:t xml:space="preserve"> </w:t>
+      </w:r>
+      <w:r>
+        <w:rPr>
+          <w:rStyle w:val="DataTypeTok"/>
+        </w:rPr>
+        <w:t xml:space="preserve">"activeUsers"</w:t>
+      </w:r>
+      <w:r>
+        <w:rPr>
+          <w:rStyle w:val="FunctionTok"/>
+        </w:rPr>
+        <w:t xml:space="preserve">:</w:t>
+      </w:r>
+      <w:r>
+        <w:rPr>
+          <w:rStyle w:val="NormalTok"/>
+        </w:rPr>
+        <w:t xml:space="preserve"> </w:t>
+      </w:r>
+      <w:r>
+        <w:rPr>
+          <w:rStyle w:val="DecValTok"/>
+        </w:rPr>
+        <w:t xml:space="preserve">4</w:t>
+      </w:r>
+      <w:r>
+        <w:rPr>
+          <w:rStyle w:val="FunctionTok"/>
+        </w:rPr>
+        <w:t xml:space="preserve">,</w:t>
+      </w:r>
+      <w:r>
         <w:br/>
       </w:r>
       <w:r>
@@ -9351,6 +9402,573 @@
           <w:rStyle w:val="DecValTok"/>
         </w:rPr>
         <w:t xml:space="preserve">900</w:t>
+      </w:r>
+      <w:r>
+        <w:rPr>
+          <w:rStyle w:val="NormalTok"/>
+        </w:rPr>
+        <w:t xml:space="preserve"> </w:t>
+      </w:r>
+      <w:r>
+        <w:rPr>
+          <w:rStyle w:val="FunctionTok"/>
+        </w:rPr>
+        <w:t xml:space="preserve">}</w:t>
+      </w:r>
+      <w:r>
+        <w:rPr>
+          <w:rStyle w:val="NormalTok"/>
+        </w:rPr>
+        <w:t xml:space="preserve"> </w:t>
+      </w:r>
+      <w:r>
+        <w:rPr>
+          <w:rStyle w:val="OtherTok"/>
+        </w:rPr>
+        <w:t xml:space="preserve">]</w:t>
+      </w:r>
+      <w:r>
+        <w:rPr>
+          <w:rStyle w:val="FunctionTok"/>
+        </w:rPr>
+        <w:t xml:space="preserve">,</w:t>
+      </w:r>
+      <w:r>
+        <w:br/>
+      </w:r>
+      <w:r>
+        <w:rPr>
+          <w:rStyle w:val="NormalTok"/>
+        </w:rPr>
+        <w:t xml:space="preserve">  </w:t>
+      </w:r>
+      <w:r>
+        <w:rPr>
+          <w:rStyle w:val="DataTypeTok"/>
+        </w:rPr>
+        <w:t xml:space="preserve">"topSpenders"</w:t>
+      </w:r>
+      <w:r>
+        <w:rPr>
+          <w:rStyle w:val="FunctionTok"/>
+        </w:rPr>
+        <w:t xml:space="preserve">:</w:t>
+      </w:r>
+      <w:r>
+        <w:rPr>
+          <w:rStyle w:val="NormalTok"/>
+        </w:rPr>
+        <w:t xml:space="preserve"> </w:t>
+      </w:r>
+      <w:r>
+        <w:rPr>
+          <w:rStyle w:val="OtherTok"/>
+        </w:rPr>
+        <w:t xml:space="preserve">[</w:t>
+      </w:r>
+      <w:r>
+        <w:rPr>
+          <w:rStyle w:val="NormalTok"/>
+        </w:rPr>
+        <w:t xml:space="preserve"> </w:t>
+      </w:r>
+      <w:r>
+        <w:rPr>
+          <w:rStyle w:val="FunctionTok"/>
+        </w:rPr>
+        <w:t xml:space="preserve">{</w:t>
+      </w:r>
+      <w:r>
+        <w:rPr>
+          <w:rStyle w:val="NormalTok"/>
+        </w:rPr>
+        <w:t xml:space="preserve"> </w:t>
+      </w:r>
+      <w:r>
+        <w:rPr>
+          <w:rStyle w:val="DataTypeTok"/>
+        </w:rPr>
+        <w:t xml:space="preserve">"id"</w:t>
+      </w:r>
+      <w:r>
+        <w:rPr>
+          <w:rStyle w:val="FunctionTok"/>
+        </w:rPr>
+        <w:t xml:space="preserve">:</w:t>
+      </w:r>
+      <w:r>
+        <w:rPr>
+          <w:rStyle w:val="NormalTok"/>
+        </w:rPr>
+        <w:t xml:space="preserve"> </w:t>
+      </w:r>
+      <w:r>
+        <w:rPr>
+          <w:rStyle w:val="StringTok"/>
+        </w:rPr>
+        <w:t xml:space="preserve">"…"</w:t>
+      </w:r>
+      <w:r>
+        <w:rPr>
+          <w:rStyle w:val="FunctionTok"/>
+        </w:rPr>
+        <w:t xml:space="preserve">,</w:t>
+      </w:r>
+      <w:r>
+        <w:rPr>
+          <w:rStyle w:val="NormalTok"/>
+        </w:rPr>
+        <w:t xml:space="preserve"> </w:t>
+      </w:r>
+      <w:r>
+        <w:rPr>
+          <w:rStyle w:val="DataTypeTok"/>
+        </w:rPr>
+        <w:t xml:space="preserve">"name"</w:t>
+      </w:r>
+      <w:r>
+        <w:rPr>
+          <w:rStyle w:val="FunctionTok"/>
+        </w:rPr>
+        <w:t xml:space="preserve">:</w:t>
+      </w:r>
+      <w:r>
+        <w:rPr>
+          <w:rStyle w:val="NormalTok"/>
+        </w:rPr>
+        <w:t xml:space="preserve"> </w:t>
+      </w:r>
+      <w:r>
+        <w:rPr>
+          <w:rStyle w:val="StringTok"/>
+        </w:rPr>
+        <w:t xml:space="preserve">"Jane Doe"</w:t>
+      </w:r>
+      <w:r>
+        <w:rPr>
+          <w:rStyle w:val="FunctionTok"/>
+        </w:rPr>
+        <w:t xml:space="preserve">,</w:t>
+      </w:r>
+      <w:r>
+        <w:rPr>
+          <w:rStyle w:val="NormalTok"/>
+        </w:rPr>
+        <w:t xml:space="preserve"> </w:t>
+      </w:r>
+      <w:r>
+        <w:rPr>
+          <w:rStyle w:val="DataTypeTok"/>
+        </w:rPr>
+        <w:t xml:space="preserve">"spentCents"</w:t>
+      </w:r>
+      <w:r>
+        <w:rPr>
+          <w:rStyle w:val="FunctionTok"/>
+        </w:rPr>
+        <w:t xml:space="preserve">:</w:t>
+      </w:r>
+      <w:r>
+        <w:rPr>
+          <w:rStyle w:val="NormalTok"/>
+        </w:rPr>
+        <w:t xml:space="preserve"> </w:t>
+      </w:r>
+      <w:r>
+        <w:rPr>
+          <w:rStyle w:val="DecValTok"/>
+        </w:rPr>
+        <w:t xml:space="preserve">1270</w:t>
+      </w:r>
+      <w:r>
+        <w:rPr>
+          <w:rStyle w:val="FunctionTok"/>
+        </w:rPr>
+        <w:t xml:space="preserve">,</w:t>
+      </w:r>
+      <w:r>
+        <w:rPr>
+          <w:rStyle w:val="NormalTok"/>
+        </w:rPr>
+        <w:t xml:space="preserve"> </w:t>
+      </w:r>
+      <w:r>
+        <w:rPr>
+          <w:rStyle w:val="DataTypeTok"/>
+        </w:rPr>
+        <w:t xml:space="preserve">"orderCount"</w:t>
+      </w:r>
+      <w:r>
+        <w:rPr>
+          <w:rStyle w:val="FunctionTok"/>
+        </w:rPr>
+        <w:t xml:space="preserve">:</w:t>
+      </w:r>
+      <w:r>
+        <w:rPr>
+          <w:rStyle w:val="NormalTok"/>
+        </w:rPr>
+        <w:t xml:space="preserve"> </w:t>
+      </w:r>
+      <w:r>
+        <w:rPr>
+          <w:rStyle w:val="DecValTok"/>
+        </w:rPr>
+        <w:t xml:space="preserve">3</w:t>
+      </w:r>
+      <w:r>
+        <w:rPr>
+          <w:rStyle w:val="NormalTok"/>
+        </w:rPr>
+        <w:t xml:space="preserve"> </w:t>
+      </w:r>
+      <w:r>
+        <w:rPr>
+          <w:rStyle w:val="FunctionTok"/>
+        </w:rPr>
+        <w:t xml:space="preserve">}</w:t>
+      </w:r>
+      <w:r>
+        <w:rPr>
+          <w:rStyle w:val="NormalTok"/>
+        </w:rPr>
+        <w:t xml:space="preserve"> </w:t>
+      </w:r>
+      <w:r>
+        <w:rPr>
+          <w:rStyle w:val="OtherTok"/>
+        </w:rPr>
+        <w:t xml:space="preserve">]</w:t>
+      </w:r>
+      <w:r>
+        <w:rPr>
+          <w:rStyle w:val="FunctionTok"/>
+        </w:rPr>
+        <w:t xml:space="preserve">,</w:t>
+      </w:r>
+      <w:r>
+        <w:br/>
+      </w:r>
+      <w:r>
+        <w:rPr>
+          <w:rStyle w:val="NormalTok"/>
+        </w:rPr>
+        <w:t xml:space="preserve">  </w:t>
+      </w:r>
+      <w:r>
+        <w:rPr>
+          <w:rStyle w:val="DataTypeTok"/>
+        </w:rPr>
+        <w:t xml:space="preserve">"recentPurchases"</w:t>
+      </w:r>
+      <w:r>
+        <w:rPr>
+          <w:rStyle w:val="FunctionTok"/>
+        </w:rPr>
+        <w:t xml:space="preserve">:</w:t>
+      </w:r>
+      <w:r>
+        <w:rPr>
+          <w:rStyle w:val="NormalTok"/>
+        </w:rPr>
+        <w:t xml:space="preserve"> </w:t>
+      </w:r>
+      <w:r>
+        <w:rPr>
+          <w:rStyle w:val="OtherTok"/>
+        </w:rPr>
+        <w:t xml:space="preserve">[</w:t>
+      </w:r>
+      <w:r>
+        <w:rPr>
+          <w:rStyle w:val="NormalTok"/>
+        </w:rPr>
+        <w:t xml:space="preserve"> </w:t>
+      </w:r>
+      <w:r>
+        <w:rPr>
+          <w:rStyle w:val="FunctionTok"/>
+        </w:rPr>
+        <w:t xml:space="preserve">{</w:t>
+      </w:r>
+      <w:r>
+        <w:rPr>
+          <w:rStyle w:val="NormalTok"/>
+        </w:rPr>
+        <w:t xml:space="preserve"> </w:t>
+      </w:r>
+      <w:r>
+        <w:rPr>
+          <w:rStyle w:val="DataTypeTok"/>
+        </w:rPr>
+        <w:t xml:space="preserve">"id"</w:t>
+      </w:r>
+      <w:r>
+        <w:rPr>
+          <w:rStyle w:val="FunctionTok"/>
+        </w:rPr>
+        <w:t xml:space="preserve">:</w:t>
+      </w:r>
+      <w:r>
+        <w:rPr>
+          <w:rStyle w:val="NormalTok"/>
+        </w:rPr>
+        <w:t xml:space="preserve"> </w:t>
+      </w:r>
+      <w:r>
+        <w:rPr>
+          <w:rStyle w:val="StringTok"/>
+        </w:rPr>
+        <w:t xml:space="preserve">"…"</w:t>
+      </w:r>
+      <w:r>
+        <w:rPr>
+          <w:rStyle w:val="FunctionTok"/>
+        </w:rPr>
+        <w:t xml:space="preserve">,</w:t>
+      </w:r>
+      <w:r>
+        <w:rPr>
+          <w:rStyle w:val="NormalTok"/>
+        </w:rPr>
+        <w:t xml:space="preserve"> </w:t>
+      </w:r>
+      <w:r>
+        <w:rPr>
+          <w:rStyle w:val="DataTypeTok"/>
+        </w:rPr>
+        <w:t xml:space="preserve">"memberName"</w:t>
+      </w:r>
+      <w:r>
+        <w:rPr>
+          <w:rStyle w:val="FunctionTok"/>
+        </w:rPr>
+        <w:t xml:space="preserve">:</w:t>
+      </w:r>
+      <w:r>
+        <w:rPr>
+          <w:rStyle w:val="NormalTok"/>
+        </w:rPr>
+        <w:t xml:space="preserve"> </w:t>
+      </w:r>
+      <w:r>
+        <w:rPr>
+          <w:rStyle w:val="StringTok"/>
+        </w:rPr>
+        <w:t xml:space="preserve">"Jane Doe"</w:t>
+      </w:r>
+      <w:r>
+        <w:rPr>
+          <w:rStyle w:val="FunctionTok"/>
+        </w:rPr>
+        <w:t xml:space="preserve">,</w:t>
+      </w:r>
+      <w:r>
+        <w:rPr>
+          <w:rStyle w:val="NormalTok"/>
+        </w:rPr>
+        <w:t xml:space="preserve"> </w:t>
+      </w:r>
+      <w:r>
+        <w:rPr>
+          <w:rStyle w:val="DataTypeTok"/>
+        </w:rPr>
+        <w:t xml:space="preserve">"at"</w:t>
+      </w:r>
+      <w:r>
+        <w:rPr>
+          <w:rStyle w:val="FunctionTok"/>
+        </w:rPr>
+        <w:t xml:space="preserve">:</w:t>
+      </w:r>
+      <w:r>
+        <w:rPr>
+          <w:rStyle w:val="NormalTok"/>
+        </w:rPr>
+        <w:t xml:space="preserve"> </w:t>
+      </w:r>
+      <w:r>
+        <w:rPr>
+          <w:rStyle w:val="StringTok"/>
+        </w:rPr>
+        <w:t xml:space="preserve">"2026-06-04T14:23:39Z"</w:t>
+      </w:r>
+      <w:r>
+        <w:rPr>
+          <w:rStyle w:val="FunctionTok"/>
+        </w:rPr>
+        <w:t xml:space="preserve">,</w:t>
+      </w:r>
+      <w:r>
+        <w:br/>
+      </w:r>
+      <w:r>
+        <w:rPr>
+          <w:rStyle w:val="NormalTok"/>
+        </w:rPr>
+        <w:t xml:space="preserve">    </w:t>
+      </w:r>
+      <w:r>
+        <w:rPr>
+          <w:rStyle w:val="DataTypeTok"/>
+        </w:rPr>
+        <w:t xml:space="preserve">"totalCents"</w:t>
+      </w:r>
+      <w:r>
+        <w:rPr>
+          <w:rStyle w:val="FunctionTok"/>
+        </w:rPr>
+        <w:t xml:space="preserve">:</w:t>
+      </w:r>
+      <w:r>
+        <w:rPr>
+          <w:rStyle w:val="NormalTok"/>
+        </w:rPr>
+        <w:t xml:space="preserve"> </w:t>
+      </w:r>
+      <w:r>
+        <w:rPr>
+          <w:rStyle w:val="DecValTok"/>
+        </w:rPr>
+        <w:t xml:space="preserve">175</w:t>
+      </w:r>
+      <w:r>
+        <w:rPr>
+          <w:rStyle w:val="FunctionTok"/>
+        </w:rPr>
+        <w:t xml:space="preserve">,</w:t>
+      </w:r>
+      <w:r>
+        <w:rPr>
+          <w:rStyle w:val="NormalTok"/>
+        </w:rPr>
+        <w:t xml:space="preserve"> </w:t>
+      </w:r>
+      <w:r>
+        <w:rPr>
+          <w:rStyle w:val="DataTypeTok"/>
+        </w:rPr>
+        <w:t xml:space="preserve">"items"</w:t>
+      </w:r>
+      <w:r>
+        <w:rPr>
+          <w:rStyle w:val="FunctionTok"/>
+        </w:rPr>
+        <w:t xml:space="preserve">:</w:t>
+      </w:r>
+      <w:r>
+        <w:rPr>
+          <w:rStyle w:val="NormalTok"/>
+        </w:rPr>
+        <w:t xml:space="preserve"> </w:t>
+      </w:r>
+      <w:r>
+        <w:rPr>
+          <w:rStyle w:val="OtherTok"/>
+        </w:rPr>
+        <w:t xml:space="preserve">[</w:t>
+      </w:r>
+      <w:r>
+        <w:rPr>
+          <w:rStyle w:val="NormalTok"/>
+        </w:rPr>
+        <w:t xml:space="preserve"> </w:t>
+      </w:r>
+      <w:r>
+        <w:rPr>
+          <w:rStyle w:val="FunctionTok"/>
+        </w:rPr>
+        <w:t xml:space="preserve">{</w:t>
+      </w:r>
+      <w:r>
+        <w:rPr>
+          <w:rStyle w:val="NormalTok"/>
+        </w:rPr>
+        <w:t xml:space="preserve"> </w:t>
+      </w:r>
+      <w:r>
+        <w:rPr>
+          <w:rStyle w:val="DataTypeTok"/>
+        </w:rPr>
+        <w:t xml:space="preserve">"name"</w:t>
+      </w:r>
+      <w:r>
+        <w:rPr>
+          <w:rStyle w:val="FunctionTok"/>
+        </w:rPr>
+        <w:t xml:space="preserve">:</w:t>
+      </w:r>
+      <w:r>
+        <w:rPr>
+          <w:rStyle w:val="NormalTok"/>
+        </w:rPr>
+        <w:t xml:space="preserve"> </w:t>
+      </w:r>
+      <w:r>
+        <w:rPr>
+          <w:rStyle w:val="StringTok"/>
+        </w:rPr>
+        <w:t xml:space="preserve">"Cola"</w:t>
+      </w:r>
+      <w:r>
+        <w:rPr>
+          <w:rStyle w:val="FunctionTok"/>
+        </w:rPr>
+        <w:t xml:space="preserve">,</w:t>
+      </w:r>
+      <w:r>
+        <w:rPr>
+          <w:rStyle w:val="NormalTok"/>
+        </w:rPr>
+        <w:t xml:space="preserve"> </w:t>
+      </w:r>
+      <w:r>
+        <w:rPr>
+          <w:rStyle w:val="DataTypeTok"/>
+        </w:rPr>
+        <w:t xml:space="preserve">"quantity"</w:t>
+      </w:r>
+      <w:r>
+        <w:rPr>
+          <w:rStyle w:val="FunctionTok"/>
+        </w:rPr>
+        <w:t xml:space="preserve">:</w:t>
+      </w:r>
+      <w:r>
+        <w:rPr>
+          <w:rStyle w:val="NormalTok"/>
+        </w:rPr>
+        <w:t xml:space="preserve"> </w:t>
+      </w:r>
+      <w:r>
+        <w:rPr>
+          <w:rStyle w:val="DecValTok"/>
+        </w:rPr>
+        <w:t xml:space="preserve">1</w:t>
+      </w:r>
+      <w:r>
+        <w:rPr>
+          <w:rStyle w:val="NormalTok"/>
+        </w:rPr>
+        <w:t xml:space="preserve"> </w:t>
+      </w:r>
+      <w:r>
+        <w:rPr>
+          <w:rStyle w:val="FunctionTok"/>
+        </w:rPr>
+        <w:t xml:space="preserve">}</w:t>
+      </w:r>
+      <w:r>
+        <w:rPr>
+          <w:rStyle w:val="NormalTok"/>
+        </w:rPr>
+        <w:t xml:space="preserve"> </w:t>
+      </w:r>
+      <w:r>
+        <w:rPr>
+          <w:rStyle w:val="OtherTok"/>
+        </w:rPr>
+        <w:t xml:space="preserve">]</w:t>
       </w:r>
       <w:r>
         <w:rPr>
@@ -15196,6 +15814,34 @@
       </w:r>
       <w:r>
         <w:t xml:space="preserve">total spend and order count.</w:t>
+      </w:r>
+    </w:p>
+    <w:p>
+      <w:pPr>
+        <w:pStyle w:val="Compact"/>
+        <w:numPr>
+          <w:ilvl w:val="0"/>
+          <w:numId w:val="1026"/>
+        </w:numPr>
+      </w:pPr>
+      <w:r>
+        <w:rPr>
+          <w:b/>
+          <w:bCs/>
+        </w:rPr>
+        <w:t xml:space="preserve">Recent purchases:</w:t>
+      </w:r>
+      <w:r>
+        <w:t xml:space="preserve"> </w:t>
+      </w:r>
+      <w:r>
+        <w:t xml:space="preserve">a live feed of the latest orders in the period — which</w:t>
+      </w:r>
+      <w:r>
+        <w:t xml:space="preserve"> </w:t>
+      </w:r>
+      <w:r>
+        <w:t xml:space="preserve">member bought which items, the order total, and how long ago.</w:t>
       </w:r>
     </w:p>
     <w:p>

</xml_diff>

<commit_message>
Make stock editable and show out-of-stock in the kiosk
- Admin products: click the stock line under a product name to edit the count
  inline (blank = unlimited). Shows "Out of stock" in red when 0.
- Kiosk: products with stock <= 0 are greyed out (grayscale image, dimmed) with
  an "Out of stock" overlay — but remain fully purchasable, since the count is a
  guide and may be wrong.
- Stock is not auto-decremented; it's a manually managed count.

Docs: document stock editing / out-of-stock behavior in the admin guide;
regenerate the Word doc.

Co-Authored-By: Claude Opus 4.8 <noreply@anthropic.com>
</commit_message>
<xml_diff>
--- a/docs/SSS-Documentation.docx
+++ b/docs/SSS-Documentation.docx
@@ -16220,6 +16220,93 @@
       </w:r>
       <w:r>
         <w:t xml:space="preserve">Price changes sync to Congressus.</w:t>
+      </w:r>
+    </w:p>
+    <w:p>
+      <w:pPr>
+        <w:numPr>
+          <w:ilvl w:val="0"/>
+          <w:numId w:val="1028"/>
+        </w:numPr>
+      </w:pPr>
+      <w:r>
+        <w:rPr>
+          <w:b/>
+          <w:bCs/>
+        </w:rPr>
+        <w:t xml:space="preserve">Edit stock</w:t>
+      </w:r>
+      <w:r>
+        <w:t xml:space="preserve"> </w:t>
+      </w:r>
+      <w:r>
+        <w:t xml:space="preserve">— click the stock line under the product name to set a count</w:t>
+      </w:r>
+      <w:r>
+        <w:t xml:space="preserve"> </w:t>
+      </w:r>
+      <w:r>
+        <w:t xml:space="preserve">(blank = unlimited). When stock reaches</w:t>
+      </w:r>
+      <w:r>
+        <w:t xml:space="preserve"> </w:t>
+      </w:r>
+      <w:r>
+        <w:rPr>
+          <w:b/>
+          <w:bCs/>
+        </w:rPr>
+        <w:t xml:space="preserve">0</w:t>
+      </w:r>
+      <w:r>
+        <w:t xml:space="preserve"> </w:t>
+      </w:r>
+      <w:r>
+        <w:t xml:space="preserve">the product is shown greyed-out</w:t>
+      </w:r>
+      <w:r>
+        <w:t xml:space="preserve"> </w:t>
+      </w:r>
+      <w:r>
+        <w:t xml:space="preserve">with an</w:t>
+      </w:r>
+      <w:r>
+        <w:t xml:space="preserve"> </w:t>
+      </w:r>
+      <w:r>
+        <w:rPr>
+          <w:b/>
+          <w:bCs/>
+        </w:rPr>
+        <w:t xml:space="preserve">Out of stock</w:t>
+      </w:r>
+      <w:r>
+        <w:t xml:space="preserve"> </w:t>
+      </w:r>
+      <w:r>
+        <w:t xml:space="preserve">label in the kiosk — but members can</w:t>
+      </w:r>
+      <w:r>
+        <w:t xml:space="preserve"> </w:t>
+      </w:r>
+      <w:r>
+        <w:rPr>
+          <w:b/>
+          <w:bCs/>
+        </w:rPr>
+        <w:t xml:space="preserve">still buy it</w:t>
+      </w:r>
+      <w:r>
+        <w:t xml:space="preserve"> </w:t>
+      </w:r>
+      <w:r>
+        <w:t xml:space="preserve">(the count is a guide, not a hard block, in case it's wrong). Stock is not</w:t>
+      </w:r>
+      <w:r>
+        <w:t xml:space="preserve"> </w:t>
+      </w:r>
+      <w:r>
+        <w:t xml:space="preserve">decremented automatically; update it when you restock or sell out.</w:t>
       </w:r>
     </w:p>
     <w:p>

</xml_diff>

<commit_message>
Decrement stock when an order is confirmed
- orders/confirm now decrements each purchased product's stock by its line
  quantity, in the same transaction that marks the invoice CONFIRMED.
- Uses GREATEST(stock - q, 0) so tracked stock clamps at 0 (never negative);
  the "stock IS NOT NULL" guard leaves unlimited products untouched.

Docs: note auto-decrement in the admin guide; regenerate the Word doc.

Co-Authored-By: Claude Opus 4.8 <noreply@anthropic.com>
</commit_message>
<xml_diff>
--- a/docs/SSS-Documentation.docx
+++ b/docs/SSS-Documentation.docx
@@ -74,7 +74,7 @@
         <w:pStyle w:val="FirstParagraph"/>
       </w:pPr>
       <w:r>
-        <w:t xml:space="preserve">A self-service snack kiosk for the Stress student association. Members tap their</w:t>
+        <w:t xml:space="preserve">A self-service snack kiosk for the Stress Study association. Members tap their</w:t>
       </w:r>
       <w:r>
         <w:t xml:space="preserve"> </w:t>
@@ -16300,13 +16300,49 @@
         <w:t xml:space="preserve"> </w:t>
       </w:r>
       <w:r>
-        <w:t xml:space="preserve">(the count is a guide, not a hard block, in case it's wrong). Stock is not</w:t>
-      </w:r>
-      <w:r>
-        <w:t xml:space="preserve"> </w:t>
-      </w:r>
-      <w:r>
-        <w:t xml:space="preserve">decremented automatically; update it when you restock or sell out.</w:t>
+        <w:t xml:space="preserve">(the count is a guide, not a hard block, in case it's wrong).</w:t>
+      </w:r>
+      <w:r>
+        <w:t xml:space="preserve"> </w:t>
+      </w:r>
+      <w:r>
+        <w:rPr>
+          <w:b/>
+          <w:bCs/>
+        </w:rPr>
+        <w:t xml:space="preserve">Stock decreases</w:t>
+      </w:r>
+      <w:r>
+        <w:rPr>
+          <w:b/>
+          <w:bCs/>
+        </w:rPr>
+        <w:t xml:space="preserve"> </w:t>
+      </w:r>
+      <w:r>
+        <w:rPr>
+          <w:b/>
+          <w:bCs/>
+        </w:rPr>
+        <w:t xml:space="preserve">automatically</w:t>
+      </w:r>
+      <w:r>
+        <w:t xml:space="preserve"> </w:t>
+      </w:r>
+      <w:r>
+        <w:t xml:space="preserve">as products are bought (by the quantity in each confirmed</w:t>
+      </w:r>
+      <w:r>
+        <w:t xml:space="preserve"> </w:t>
+      </w:r>
+      <w:r>
+        <w:t xml:space="preserve">order); it clamps at 0 and never goes negative, and unlimited products are</w:t>
+      </w:r>
+      <w:r>
+        <w:t xml:space="preserve"> </w:t>
+      </w:r>
+      <w:r>
+        <w:t xml:space="preserve">unaffected. Set the count again when you restock.</w:t>
       </w:r>
     </w:p>
     <w:p>

</xml_diff>

<commit_message>
Docs: bartender free drinks, card linking, role-cost split; regenerate Word doc
Co-Authored-By: Claude Opus 4.8 <noreply@anthropic.com>
</commit_message>
<xml_diff>
--- a/docs/SSS-Documentation.docx
+++ b/docs/SSS-Documentation.docx
@@ -21879,7 +21879,7 @@
     </w:p>
     <w:bookmarkEnd w:id="133"/>
     <w:bookmarkEnd w:id="134"/>
-    <w:bookmarkStart w:id="153" w:name="ppp--bar-pos-drinks-at-activities"/>
+    <w:bookmarkStart w:id="154" w:name="ppp--bar-pos-drinks-at-activities"/>
     <w:p>
       <w:pPr>
         <w:pStyle w:val="Heading1"/>
@@ -23134,6 +23134,140 @@
         <w:pStyle w:val="FirstParagraph"/>
       </w:pPr>
       <w:r>
+        <w:rPr>
+          <w:b/>
+          <w:bCs/>
+        </w:rPr>
+        <w:t xml:space="preserve">Linking an unrecognised card.</w:t>
+      </w:r>
+      <w:r>
+        <w:t xml:space="preserve"> </w:t>
+      </w:r>
+      <w:r>
+        <w:t xml:space="preserve">If a scanned card isn't linked to a member yet,</w:t>
+      </w:r>
+      <w:r>
+        <w:t xml:space="preserve"> </w:t>
+      </w:r>
+      <w:r>
+        <w:t xml:space="preserve">the scan returns</w:t>
+      </w:r>
+      <w:r>
+        <w:t xml:space="preserve"> </w:t>
+      </w:r>
+      <w:r>
+        <w:rPr>
+          <w:rStyle w:val="VerbatimChar"/>
+        </w:rPr>
+        <w:t xml:space="preserve">{ unlinked: true, uid }</w:t>
+      </w:r>
+      <w:r>
+        <w:t xml:space="preserve"> </w:t>
+      </w:r>
+      <w:r>
+        <w:t xml:space="preserve">(not an error) and the cart shows a</w:t>
+      </w:r>
+      <w:r>
+        <w:t xml:space="preserve"> </w:t>
+      </w:r>
+      <w:r>
+        <w:rPr>
+          <w:b/>
+          <w:bCs/>
+        </w:rPr>
+        <w:t xml:space="preserve">"Card not linked yet"</w:t>
+      </w:r>
+      <w:r>
+        <w:t xml:space="preserve"> </w:t>
+      </w:r>
+      <w:r>
+        <w:t xml:space="preserve">prompt: the bartender searches the member by name</w:t>
+      </w:r>
+      <w:r>
+        <w:t xml:space="preserve"> </w:t>
+      </w:r>
+      <w:r>
+        <w:t xml:space="preserve">(</w:t>
+      </w:r>
+      <w:r>
+        <w:rPr>
+          <w:rStyle w:val="VerbatimChar"/>
+        </w:rPr>
+        <w:t xml:space="preserve">GET /api/ppp/members/search</w:t>
+      </w:r>
+      <w:r>
+        <w:t xml:space="preserve">) and taps</w:t>
+      </w:r>
+      <w:r>
+        <w:t xml:space="preserve"> </w:t>
+      </w:r>
+      <w:r>
+        <w:rPr>
+          <w:b/>
+          <w:bCs/>
+        </w:rPr>
+        <w:t xml:space="preserve">Link →</w:t>
+      </w:r>
+      <w:r>
+        <w:t xml:space="preserve">, which creates the shared</w:t>
+      </w:r>
+      <w:r>
+        <w:t xml:space="preserve"> </w:t>
+      </w:r>
+      <w:r>
+        <w:rPr>
+          <w:rStyle w:val="VerbatimChar"/>
+        </w:rPr>
+        <w:t xml:space="preserve">Card</w:t>
+      </w:r>
+      <w:r>
+        <w:t xml:space="preserve"> </w:t>
+      </w:r>
+      <w:r>
+        <w:t xml:space="preserve">(</w:t>
+      </w:r>
+      <w:r>
+        <w:rPr>
+          <w:rStyle w:val="VerbatimChar"/>
+        </w:rPr>
+        <w:t xml:space="preserve">POST /api/ppp/card/link</w:t>
+      </w:r>
+      <w:r>
+        <w:t xml:space="preserve">) and immediately sets that member as the charge</w:t>
+      </w:r>
+      <w:r>
+        <w:t xml:space="preserve"> </w:t>
+      </w:r>
+      <w:r>
+        <w:t xml:space="preserve">target. The card then works everywhere — bar and snack kiosk — exactly like one</w:t>
+      </w:r>
+      <w:r>
+        <w:t xml:space="preserve"> </w:t>
+      </w:r>
+      <w:r>
+        <w:t xml:space="preserve">linked via the kiosk's email flow; PPP keeps no card tables of its own. Linking a</w:t>
+      </w:r>
+      <w:r>
+        <w:t xml:space="preserve"> </w:t>
+      </w:r>
+      <w:r>
+        <w:t xml:space="preserve">card that's already linked is refused (</w:t>
+      </w:r>
+      <w:r>
+        <w:rPr>
+          <w:rStyle w:val="VerbatimChar"/>
+        </w:rPr>
+        <w:t xml:space="preserve">409</w:t>
+      </w:r>
+      <w:r>
+        <w:t xml:space="preserve">).</w:t>
+      </w:r>
+    </w:p>
+    <w:p>
+      <w:pPr>
+        <w:pStyle w:val="BodyText"/>
+      </w:pPr>
+      <w:r>
         <w:t xml:space="preserve">Card reader: uses the shared</w:t>
       </w:r>
       <w:r>
@@ -23953,7 +24087,7 @@
     </w:p>
     <w:bookmarkEnd w:id="137"/>
     <w:bookmarkEnd w:id="138"/>
-    <w:bookmarkStart w:id="144" w:name="pricing--discounts"/>
+    <w:bookmarkStart w:id="145" w:name="pricing--discounts"/>
     <w:p>
       <w:pPr>
         <w:pStyle w:val="Heading2"/>
@@ -24537,14 +24671,22 @@
       </w:r>
     </w:p>
     <w:bookmarkEnd w:id="143"/>
-    <w:bookmarkEnd w:id="144"/>
-    <w:bookmarkStart w:id="145" w:name="bartender-accounts"/>
-    <w:p>
-      <w:pPr>
-        <w:pStyle w:val="Heading2"/>
-      </w:pPr>
-      <w:r>
-        <w:t xml:space="preserve">Bartender accounts</w:t>
+    <w:bookmarkStart w:id="144" w:name="Xf0315f0e6993867b2a2e5e20e7c16d85903a818"/>
+    <w:p>
+      <w:pPr>
+        <w:pStyle w:val="Heading3"/>
+      </w:pPr>
+      <w:r>
+        <w:t xml:space="preserve">Bartender free drinks (</w:t>
+      </w:r>
+      <w:r>
+        <w:rPr>
+          <w:rStyle w:val="VerbatimChar"/>
+        </w:rPr>
+        <w:t xml:space="preserve">PppProductCategory.bartenderFree</w:t>
+      </w:r>
+      <w:r>
+        <w:t xml:space="preserve">)</w:t>
       </w:r>
     </w:p>
     <w:p>
@@ -24552,20 +24694,83 @@
         <w:pStyle w:val="FirstParagraph"/>
       </w:pPr>
       <w:r>
-        <w:t xml:space="preserve">Managed under</w:t>
-      </w:r>
-      <w:r>
-        <w:t xml:space="preserve"> </w:t>
-      </w:r>
-      <w:r>
-        <w:rPr>
-          <w:b/>
-          <w:bCs/>
-        </w:rPr>
-        <w:t xml:space="preserve">Admin → PPP → Bartenders</w:t>
-      </w:r>
-      <w:r>
-        <w:t xml:space="preserve">.</w:t>
+        <w:t xml:space="preserve">The bartender operating the POS drinks free from</w:t>
+      </w:r>
+      <w:r>
+        <w:t xml:space="preserve"> </w:t>
+      </w:r>
+      <w:r>
+        <w:rPr>
+          <w:b/>
+          <w:bCs/>
+        </w:rPr>
+        <w:t xml:space="preserve">bartender-free categories</w:t>
+      </w:r>
+      <w:r>
+        <w:t xml:space="preserve"> </w:t>
+      </w:r>
+      <w:r>
+        <w:t xml:space="preserve">when</w:t>
+      </w:r>
+      <w:r>
+        <w:t xml:space="preserve"> </w:t>
+      </w:r>
+      <w:r>
+        <w:t xml:space="preserve">they charge</w:t>
+      </w:r>
+      <w:r>
+        <w:t xml:space="preserve"> </w:t>
+      </w:r>
+      <w:r>
+        <w:rPr>
+          <w:b/>
+          <w:bCs/>
+        </w:rPr>
+        <w:t xml:space="preserve">their own card</w:t>
+      </w:r>
+      <w:r>
+        <w:t xml:space="preserve"> </w:t>
+      </w:r>
+      <w:r>
+        <w:t xml:space="preserve">— e.g. soft drinks &amp; 0.0% for the on-shift bartender.</w:t>
+      </w:r>
+      <w:r>
+        <w:t xml:space="preserve"> </w:t>
+      </w:r>
+      <w:r>
+        <w:t xml:space="preserve">Toggle a category free with the</w:t>
+      </w:r>
+      <w:r>
+        <w:t xml:space="preserve"> </w:t>
+      </w:r>
+      <w:r>
+        <w:rPr>
+          <w:b/>
+          <w:bCs/>
+        </w:rPr>
+        <w:t xml:space="preserve">🍺</w:t>
+      </w:r>
+      <w:r>
+        <w:t xml:space="preserve"> </w:t>
+      </w:r>
+      <w:r>
+        <w:t xml:space="preserve">button on</w:t>
+      </w:r>
+      <w:r>
+        <w:t xml:space="preserve"> </w:t>
+      </w:r>
+      <w:r>
+        <w:rPr>
+          <w:b/>
+          <w:bCs/>
+        </w:rPr>
+        <w:t xml:space="preserve">Admin → PPP → Drinks</w:t>
+      </w:r>
+      <w:r>
+        <w:t xml:space="preserve"> </w:t>
+      </w:r>
+      <w:r>
+        <w:t xml:space="preserve">(Categories).</w:t>
       </w:r>
     </w:p>
     <w:p>
@@ -24577,143 +24782,38 @@
         </w:numPr>
       </w:pPr>
       <w:r>
-        <w:rPr>
-          <w:b/>
-          <w:bCs/>
-        </w:rPr>
-        <w:t xml:space="preserve">Create by email</w:t>
-      </w:r>
-      <w:r>
-        <w:t xml:space="preserve"> </w:t>
-      </w:r>
-      <w:r>
-        <w:t xml:space="preserve">—</w:t>
-      </w:r>
-      <w:r>
-        <w:t xml:space="preserve"> </w:t>
-      </w:r>
-      <w:r>
-        <w:rPr>
-          <w:rStyle w:val="VerbatimChar"/>
-        </w:rPr>
-        <w:t xml:space="preserve">POST /api/admin/ppp/bartenders</w:t>
-      </w:r>
-      <w:r>
-        <w:t xml:space="preserve"> </w:t>
-      </w:r>
-      <w:r>
-        <w:t xml:space="preserve">makes a</w:t>
-      </w:r>
-      <w:r>
-        <w:t xml:space="preserve"> </w:t>
-      </w:r>
-      <w:r>
-        <w:rPr>
-          <w:rStyle w:val="VerbatimChar"/>
-        </w:rPr>
-        <w:t xml:space="preserve">BARTENDER</w:t>
-      </w:r>
-      <w:r>
-        <w:t xml:space="preserve"> </w:t>
-      </w:r>
-      <w:r>
-        <w:rPr>
-          <w:rStyle w:val="VerbatimChar"/>
-        </w:rPr>
-        <w:t xml:space="preserve">User</w:t>
-      </w:r>
-      <w:r>
-        <w:t xml:space="preserve"> </w:t>
-      </w:r>
-      <w:r>
-        <w:t xml:space="preserve">with an unusable random password and emails a</w:t>
-      </w:r>
-      <w:r>
-        <w:t xml:space="preserve"> </w:t>
-      </w:r>
-      <w:r>
-        <w:rPr>
-          <w:b/>
-          <w:bCs/>
-        </w:rPr>
-        <w:t xml:space="preserve">set-password link</w:t>
-      </w:r>
-      <w:r>
-        <w:t xml:space="preserve">. The</w:t>
-      </w:r>
-      <w:r>
-        <w:t xml:space="preserve"> </w:t>
-      </w:r>
-      <w:r>
-        <w:t xml:space="preserve">link is a</w:t>
-      </w:r>
-      <w:r>
-        <w:t xml:space="preserve"> </w:t>
-      </w:r>
-      <w:r>
-        <w:rPr>
-          <w:rStyle w:val="VerbatimChar"/>
-        </w:rPr>
-        <w:t xml:space="preserve">PasswordSetupToken</w:t>
-      </w:r>
-      <w:r>
-        <w:t xml:space="preserve"> </w:t>
-      </w:r>
-      <w:r>
-        <w:t xml:space="preserve">that</w:t>
-      </w:r>
-      <w:r>
-        <w:t xml:space="preserve"> </w:t>
-      </w:r>
-      <w:r>
-        <w:rPr>
-          <w:b/>
-          <w:bCs/>
-        </w:rPr>
-        <w:t xml:space="preserve">never expires</w:t>
-      </w:r>
-      <w:r>
-        <w:t xml:space="preserve"> </w:t>
-      </w:r>
-      <w:r>
-        <w:t xml:space="preserve">and is</w:t>
-      </w:r>
-      <w:r>
-        <w:t xml:space="preserve"> </w:t>
-      </w:r>
-      <w:r>
-        <w:rPr>
-          <w:b/>
-          <w:bCs/>
-        </w:rPr>
-        <w:t xml:space="preserve">single-use</w:t>
-      </w:r>
-      <w:r>
-        <w:t xml:space="preserve"> </w:t>
-      </w:r>
-      <w:r>
-        <w:t xml:space="preserve">(consumed on completion).</w:t>
-      </w:r>
-      <w:r>
-        <w:t xml:space="preserve"> </w:t>
-      </w:r>
-      <w:r>
-        <w:rPr>
-          <w:rStyle w:val="VerbatimChar"/>
-        </w:rPr>
-        <w:t xml:space="preserve">/set-password</w:t>
-      </w:r>
-      <w:r>
-        <w:t xml:space="preserve"> </w:t>
-      </w:r>
-      <w:r>
-        <w:t xml:space="preserve">lets them choose a password and signs</w:t>
-      </w:r>
-      <w:r>
-        <w:t xml:space="preserve"> </w:t>
-      </w:r>
-      <w:r>
-        <w:t xml:space="preserve">them in; "Reset/Resend link" re-issues a fresh token.</w:t>
+        <w:t xml:space="preserve">Keyed off the</w:t>
+      </w:r>
+      <w:r>
+        <w:t xml:space="preserve"> </w:t>
+      </w:r>
+      <w:r>
+        <w:rPr>
+          <w:b/>
+          <w:bCs/>
+        </w:rPr>
+        <w:t xml:space="preserve">logged-in user's linked member</w:t>
+      </w:r>
+      <w:r>
+        <w:t xml:space="preserve"> </w:t>
+      </w:r>
+      <w:r>
+        <w:t xml:space="preserve">(</w:t>
+      </w:r>
+      <w:r>
+        <w:rPr>
+          <w:rStyle w:val="VerbatimChar"/>
+        </w:rPr>
+        <w:t xml:space="preserve">GET /api/ppp/me</w:t>
+      </w:r>
+      <w:r>
+        <w:t xml:space="preserve">) vs the charge</w:t>
+      </w:r>
+      <w:r>
+        <w:t xml:space="preserve"> </w:t>
+      </w:r>
+      <w:r>
+        <w:t xml:space="preserve">target, so it can't be spoofed and only applies to the bartender's own card.</w:t>
       </w:r>
     </w:p>
     <w:p>
@@ -24725,6 +24825,297 @@
         </w:numPr>
       </w:pPr>
       <w:r>
+        <w:t xml:space="preserve">Priced authoritatively in the invoice route: a matching line is comped to</w:t>
+      </w:r>
+      <w:r>
+        <w:t xml:space="preserve"> </w:t>
+      </w:r>
+      <w:r>
+        <w:rPr>
+          <w:b/>
+          <w:bCs/>
+        </w:rPr>
+        <w:t xml:space="preserve">€0</w:t>
+      </w:r>
+      <w:r>
+        <w:t xml:space="preserve"> </w:t>
+      </w:r>
+      <w:r>
+        <w:t xml:space="preserve">and flagged</w:t>
+      </w:r>
+      <w:r>
+        <w:t xml:space="preserve"> </w:t>
+      </w:r>
+      <w:r>
+        <w:rPr>
+          <w:rStyle w:val="VerbatimChar"/>
+        </w:rPr>
+        <w:t xml:space="preserve">PppInvoiceLine.bartenderFree</w:t>
+      </w:r>
+      <w:r>
+        <w:t xml:space="preserve">, snapshotting</w:t>
+      </w:r>
+      <w:r>
+        <w:t xml:space="preserve"> </w:t>
+      </w:r>
+      <w:r>
+        <w:rPr>
+          <w:rStyle w:val="VerbatimChar"/>
+        </w:rPr>
+        <w:t xml:space="preserve">listCents</w:t>
+      </w:r>
+      <w:r>
+        <w:t xml:space="preserve">.</w:t>
+      </w:r>
+    </w:p>
+    <w:p>
+      <w:pPr>
+        <w:pStyle w:val="Compact"/>
+        <w:numPr>
+          <w:ilvl w:val="0"/>
+          <w:numId w:val="1047"/>
+        </w:numPr>
+      </w:pPr>
+      <w:r>
+        <w:t xml:space="preserve">The association covers these; the</w:t>
+      </w:r>
+      <w:r>
+        <w:t xml:space="preserve"> </w:t>
+      </w:r>
+      <w:r>
+        <w:rPr>
+          <w:b/>
+          <w:bCs/>
+        </w:rPr>
+        <w:t xml:space="preserve">PPP dashboard</w:t>
+      </w:r>
+      <w:r>
+        <w:t xml:space="preserve"> </w:t>
+      </w:r>
+      <w:r>
+        <w:t xml:space="preserve">shows a</w:t>
+      </w:r>
+      <w:r>
+        <w:t xml:space="preserve"> </w:t>
+      </w:r>
+      <w:r>
+        <w:rPr>
+          <w:b/>
+          <w:bCs/>
+        </w:rPr>
+        <w:t xml:space="preserve">"Bartender drinks"</w:t>
+      </w:r>
+      <w:r>
+        <w:t xml:space="preserve"> </w:t>
+      </w:r>
+      <w:r>
+        <w:t xml:space="preserve">KPI = Σ</w:t>
+      </w:r>
+      <w:r>
+        <w:t xml:space="preserve"> </w:t>
+      </w:r>
+      <w:r>
+        <w:rPr>
+          <w:rStyle w:val="VerbatimChar"/>
+        </w:rPr>
+        <w:t xml:space="preserve">listCents</w:t>
+      </w:r>
+      <w:r>
+        <w:t xml:space="preserve"> </w:t>
+      </w:r>
+      <w:r>
+        <w:t xml:space="preserve">of bartender-free lines (with the free-drink count).</w:t>
+      </w:r>
+    </w:p>
+    <w:bookmarkEnd w:id="144"/>
+    <w:bookmarkEnd w:id="145"/>
+    <w:bookmarkStart w:id="146" w:name="bartender-accounts"/>
+    <w:p>
+      <w:pPr>
+        <w:pStyle w:val="Heading2"/>
+      </w:pPr>
+      <w:r>
+        <w:t xml:space="preserve">Bartender accounts</w:t>
+      </w:r>
+    </w:p>
+    <w:p>
+      <w:pPr>
+        <w:pStyle w:val="FirstParagraph"/>
+      </w:pPr>
+      <w:r>
+        <w:t xml:space="preserve">Managed under</w:t>
+      </w:r>
+      <w:r>
+        <w:t xml:space="preserve"> </w:t>
+      </w:r>
+      <w:r>
+        <w:rPr>
+          <w:b/>
+          <w:bCs/>
+        </w:rPr>
+        <w:t xml:space="preserve">Admin → PPP → Bartenders</w:t>
+      </w:r>
+      <w:r>
+        <w:t xml:space="preserve">.</w:t>
+      </w:r>
+    </w:p>
+    <w:p>
+      <w:pPr>
+        <w:pStyle w:val="Compact"/>
+        <w:numPr>
+          <w:ilvl w:val="0"/>
+          <w:numId w:val="1048"/>
+        </w:numPr>
+      </w:pPr>
+      <w:r>
+        <w:rPr>
+          <w:b/>
+          <w:bCs/>
+        </w:rPr>
+        <w:t xml:space="preserve">Create by email</w:t>
+      </w:r>
+      <w:r>
+        <w:t xml:space="preserve"> </w:t>
+      </w:r>
+      <w:r>
+        <w:t xml:space="preserve">—</w:t>
+      </w:r>
+      <w:r>
+        <w:t xml:space="preserve"> </w:t>
+      </w:r>
+      <w:r>
+        <w:rPr>
+          <w:rStyle w:val="VerbatimChar"/>
+        </w:rPr>
+        <w:t xml:space="preserve">POST /api/admin/ppp/bartenders</w:t>
+      </w:r>
+      <w:r>
+        <w:t xml:space="preserve"> </w:t>
+      </w:r>
+      <w:r>
+        <w:t xml:space="preserve">makes a</w:t>
+      </w:r>
+      <w:r>
+        <w:t xml:space="preserve"> </w:t>
+      </w:r>
+      <w:r>
+        <w:rPr>
+          <w:rStyle w:val="VerbatimChar"/>
+        </w:rPr>
+        <w:t xml:space="preserve">BARTENDER</w:t>
+      </w:r>
+      <w:r>
+        <w:t xml:space="preserve"> </w:t>
+      </w:r>
+      <w:r>
+        <w:rPr>
+          <w:rStyle w:val="VerbatimChar"/>
+        </w:rPr>
+        <w:t xml:space="preserve">User</w:t>
+      </w:r>
+      <w:r>
+        <w:t xml:space="preserve"> </w:t>
+      </w:r>
+      <w:r>
+        <w:t xml:space="preserve">with an unusable random password and emails a</w:t>
+      </w:r>
+      <w:r>
+        <w:t xml:space="preserve"> </w:t>
+      </w:r>
+      <w:r>
+        <w:rPr>
+          <w:b/>
+          <w:bCs/>
+        </w:rPr>
+        <w:t xml:space="preserve">set-password link</w:t>
+      </w:r>
+      <w:r>
+        <w:t xml:space="preserve">. The</w:t>
+      </w:r>
+      <w:r>
+        <w:t xml:space="preserve"> </w:t>
+      </w:r>
+      <w:r>
+        <w:t xml:space="preserve">link is a</w:t>
+      </w:r>
+      <w:r>
+        <w:t xml:space="preserve"> </w:t>
+      </w:r>
+      <w:r>
+        <w:rPr>
+          <w:rStyle w:val="VerbatimChar"/>
+        </w:rPr>
+        <w:t xml:space="preserve">PasswordSetupToken</w:t>
+      </w:r>
+      <w:r>
+        <w:t xml:space="preserve"> </w:t>
+      </w:r>
+      <w:r>
+        <w:t xml:space="preserve">that</w:t>
+      </w:r>
+      <w:r>
+        <w:t xml:space="preserve"> </w:t>
+      </w:r>
+      <w:r>
+        <w:rPr>
+          <w:b/>
+          <w:bCs/>
+        </w:rPr>
+        <w:t xml:space="preserve">never expires</w:t>
+      </w:r>
+      <w:r>
+        <w:t xml:space="preserve"> </w:t>
+      </w:r>
+      <w:r>
+        <w:t xml:space="preserve">and is</w:t>
+      </w:r>
+      <w:r>
+        <w:t xml:space="preserve"> </w:t>
+      </w:r>
+      <w:r>
+        <w:rPr>
+          <w:b/>
+          <w:bCs/>
+        </w:rPr>
+        <w:t xml:space="preserve">single-use</w:t>
+      </w:r>
+      <w:r>
+        <w:t xml:space="preserve"> </w:t>
+      </w:r>
+      <w:r>
+        <w:t xml:space="preserve">(consumed on completion).</w:t>
+      </w:r>
+      <w:r>
+        <w:t xml:space="preserve"> </w:t>
+      </w:r>
+      <w:r>
+        <w:rPr>
+          <w:rStyle w:val="VerbatimChar"/>
+        </w:rPr>
+        <w:t xml:space="preserve">/set-password</w:t>
+      </w:r>
+      <w:r>
+        <w:t xml:space="preserve"> </w:t>
+      </w:r>
+      <w:r>
+        <w:t xml:space="preserve">lets them choose a password and signs</w:t>
+      </w:r>
+      <w:r>
+        <w:t xml:space="preserve"> </w:t>
+      </w:r>
+      <w:r>
+        <w:t xml:space="preserve">them in; "Reset/Resend link" re-issues a fresh token.</w:t>
+      </w:r>
+    </w:p>
+    <w:p>
+      <w:pPr>
+        <w:pStyle w:val="Compact"/>
+        <w:numPr>
+          <w:ilvl w:val="0"/>
+          <w:numId w:val="1048"/>
+        </w:numPr>
+      </w:pPr>
+      <w:r>
         <w:rPr>
           <w:b/>
           <w:bCs/>
@@ -24823,8 +25214,8 @@
         <w:t xml:space="preserve">rate-limited (it's a convenience, weaker than the password).</w:t>
       </w:r>
     </w:p>
-    <w:bookmarkEnd w:id="145"/>
-    <w:bookmarkStart w:id="146" w:name="admin-pages-adminppp"/>
+    <w:bookmarkEnd w:id="146"/>
+    <w:bookmarkStart w:id="147" w:name="admin-pages-adminppp"/>
     <w:p>
       <w:pPr>
         <w:pStyle w:val="Heading2"/>
@@ -24902,7 +25293,23 @@
               <w:pStyle w:val="Compact"/>
             </w:pPr>
             <w:r>
-              <w:t xml:space="preserve">Financials (revenue, drinks sold, orders, borrels, drinkers, avg) + rankings:</w:t>
+              <w:t xml:space="preserve">Financials (revenue, drinks sold, orders, borrels, drinkers, avg,</w:t>
+            </w:r>
+            <w:r>
+              <w:t xml:space="preserve"> </w:t>
+            </w:r>
+            <w:r>
+              <w:rPr>
+                <w:b/>
+                <w:bCs/>
+              </w:rPr>
+              <w:t xml:space="preserve">Bartender drinks</w:t>
+            </w:r>
+            <w:r>
+              <w:t xml:space="preserve"> </w:t>
+            </w:r>
+            <w:r>
+              <w:t xml:space="preserve">= association cost of comped bartender-free drinks) + rankings:</w:t>
             </w:r>
             <w:r>
               <w:t xml:space="preserve"> </w:t>
@@ -24934,7 +25341,23 @@
               <w:t xml:space="preserve"> </w:t>
             </w:r>
             <w:r>
-              <w:t xml:space="preserve">by drinks, most popular drinks. Range selector includes</w:t>
+              <w:t xml:space="preserve">by drinks, most popular drinks, and</w:t>
+            </w:r>
+            <w:r>
+              <w:t xml:space="preserve"> </w:t>
+            </w:r>
+            <w:r>
+              <w:rPr>
+                <w:b/>
+                <w:bCs/>
+              </w:rPr>
+              <w:t xml:space="preserve">Free drinks by role</w:t>
+            </w:r>
+            <w:r>
+              <w:t xml:space="preserve"> </w:t>
+            </w:r>
+            <w:r>
+              <w:t xml:space="preserve">— the association's cost of role-based free/discounted drinks split per role (e.g. Board = free drinks at list value, PilsCie = their discount); each line's discount is attributed to the role that granted it. Range selector includes</w:t>
             </w:r>
             <w:r>
               <w:t xml:space="preserve"> </w:t>
@@ -25336,15 +25759,15 @@
         <w:pStyle w:val="Compact"/>
         <w:numPr>
           <w:ilvl w:val="0"/>
-          <w:numId w:val="1048"/>
+          <w:numId w:val="1049"/>
         </w:numPr>
       </w:pPr>
       <w:r>
         <w:t xml:space="preserve">a toggle picker per member).</w:t>
       </w:r>
     </w:p>
-    <w:bookmarkEnd w:id="146"/>
-    <w:bookmarkStart w:id="147" w:name="congressus"/>
+    <w:bookmarkEnd w:id="147"/>
+    <w:bookmarkStart w:id="148" w:name="congressus"/>
     <w:p>
       <w:pPr>
         <w:pStyle w:val="Heading2"/>
@@ -25383,7 +25806,7 @@
         <w:pStyle w:val="Compact"/>
         <w:numPr>
           <w:ilvl w:val="0"/>
-          <w:numId w:val="1049"/>
+          <w:numId w:val="1050"/>
         </w:numPr>
       </w:pPr>
       <w:r>
@@ -25455,319 +25878,6 @@
           <w:rStyle w:val="VerbatimChar"/>
         </w:rPr>
         <w:t xml:space="preserve">congressusProductOfferId</w:t>
-      </w:r>
-      <w:r>
-        <w:t xml:space="preserve">.</w:t>
-      </w:r>
-    </w:p>
-    <w:p>
-      <w:pPr>
-        <w:pStyle w:val="Compact"/>
-        <w:numPr>
-          <w:ilvl w:val="0"/>
-          <w:numId w:val="1049"/>
-        </w:numPr>
-      </w:pPr>
-      <w:r>
-        <w:rPr>
-          <w:b/>
-          <w:bCs/>
-        </w:rPr>
-        <w:t xml:space="preserve">VAT cannot be set via the API</w:t>
-      </w:r>
-      <w:r>
-        <w:t xml:space="preserve"> </w:t>
-      </w:r>
-      <w:r>
-        <w:t xml:space="preserve">— every shape (</w:t>
-      </w:r>
-      <w:r>
-        <w:rPr>
-          <w:rStyle w:val="VerbatimChar"/>
-        </w:rPr>
-        <w:t xml:space="preserve">vat_category {…}</w:t>
-      </w:r>
-      <w:r>
-        <w:t xml:space="preserve">,</w:t>
-      </w:r>
-      <w:r>
-        <w:t xml:space="preserve"> </w:t>
-      </w:r>
-      <w:r>
-        <w:rPr>
-          <w:rStyle w:val="VerbatimChar"/>
-        </w:rPr>
-        <w:t xml:space="preserve">vat_percentage</w:t>
-      </w:r>
-      <w:r>
-        <w:t xml:space="preserve">, …) returns HTTP 500 server-side, so PPP products sync</w:t>
-      </w:r>
-      <w:r>
-        <w:t xml:space="preserve"> </w:t>
-      </w:r>
-      <w:r>
-        <w:rPr>
-          <w:b/>
-          <w:bCs/>
-        </w:rPr>
-        <w:t xml:space="preserve">without</w:t>
-      </w:r>
-      <w:r>
-        <w:rPr>
-          <w:b/>
-          <w:bCs/>
-        </w:rPr>
-        <w:t xml:space="preserve"> </w:t>
-      </w:r>
-      <w:r>
-        <w:rPr>
-          <w:b/>
-          <w:bCs/>
-        </w:rPr>
-        <w:t xml:space="preserve">VAT</w:t>
-      </w:r>
-      <w:r>
-        <w:t xml:space="preserve"> </w:t>
-      </w:r>
-      <w:r>
-        <w:t xml:space="preserve">(like SSS products, which are all unset). VAT is kept locally on</w:t>
-      </w:r>
-      <w:r>
-        <w:t xml:space="preserve"> </w:t>
-      </w:r>
-      <w:r>
-        <w:rPr>
-          <w:rStyle w:val="VerbatimChar"/>
-        </w:rPr>
-        <w:t xml:space="preserve">PppProduct.vatCategory</w:t>
-      </w:r>
-      <w:r>
-        <w:t xml:space="preserve">; set it in the Congressus UI if needed.</w:t>
-      </w:r>
-    </w:p>
-    <w:p>
-      <w:pPr>
-        <w:pStyle w:val="Compact"/>
-        <w:numPr>
-          <w:ilvl w:val="0"/>
-          <w:numId w:val="1049"/>
-        </w:numPr>
-      </w:pPr>
-      <w:r>
-        <w:rPr>
-          <w:b/>
-          <w:bCs/>
-        </w:rPr>
-        <w:t xml:space="preserve">Two-invoice export</w:t>
-      </w:r>
-      <w:r>
-        <w:t xml:space="preserve"> </w:t>
-      </w:r>
-      <w:r>
-        <w:t xml:space="preserve">—</w:t>
-      </w:r>
-      <w:r>
-        <w:t xml:space="preserve"> </w:t>
-      </w:r>
-      <w:r>
-        <w:rPr>
-          <w:rStyle w:val="VerbatimChar"/>
-        </w:rPr>
-        <w:t xml:space="preserve">POST /api/admin/invoices/export { scope }</w:t>
-      </w:r>
-      <w:r>
-        <w:t xml:space="preserve"> </w:t>
-      </w:r>
-      <w:r>
-        <w:t xml:space="preserve">(</w:t>
-      </w:r>
-      <w:r>
-        <w:rPr>
-          <w:rStyle w:val="VerbatimChar"/>
-        </w:rPr>
-        <w:t xml:space="preserve">sss</w:t>
-      </w:r>
-      <w:r>
-        <w:t xml:space="preserve"> </w:t>
-      </w:r>
-      <w:r>
-        <w:t xml:space="preserve">|</w:t>
-      </w:r>
-      <w:r>
-        <w:t xml:space="preserve"> </w:t>
-      </w:r>
-      <w:r>
-        <w:rPr>
-          <w:rStyle w:val="VerbatimChar"/>
-        </w:rPr>
-        <w:t xml:space="preserve">ppp</w:t>
-      </w:r>
-      <w:r>
-        <w:t xml:space="preserve"> </w:t>
-      </w:r>
-      <w:r>
-        <w:t xml:space="preserve">|</w:t>
-      </w:r>
-      <w:r>
-        <w:t xml:space="preserve"> </w:t>
-      </w:r>
-      <w:r>
-        <w:rPr>
-          <w:rStyle w:val="VerbatimChar"/>
-        </w:rPr>
-        <w:t xml:space="preserve">all</w:t>
-      </w:r>
-      <w:r>
-        <w:t xml:space="preserve">) creates</w:t>
-      </w:r>
-      <w:r>
-        <w:t xml:space="preserve"> </w:t>
-      </w:r>
-      <w:r>
-        <w:rPr>
-          <w:b/>
-          <w:bCs/>
-        </w:rPr>
-        <w:t xml:space="preserve">separate</w:t>
-      </w:r>
-      <w:r>
-        <w:t xml:space="preserve"> </w:t>
-      </w:r>
-      <w:r>
-        <w:t xml:space="preserve">Congressus invoices per member per month: an</w:t>
-      </w:r>
-      <w:r>
-        <w:t xml:space="preserve"> </w:t>
-      </w:r>
-      <w:r>
-        <w:rPr>
-          <w:rStyle w:val="VerbatimChar"/>
-        </w:rPr>
-        <w:t xml:space="preserve">"SSS &lt;month&gt;"</w:t>
-      </w:r>
-      <w:r>
-        <w:t xml:space="preserve"> </w:t>
-      </w:r>
-      <w:r>
-        <w:t xml:space="preserve">invoice and a</w:t>
-      </w:r>
-      <w:r>
-        <w:t xml:space="preserve"> </w:t>
-      </w:r>
-      <w:r>
-        <w:rPr>
-          <w:rStyle w:val="VerbatimChar"/>
-        </w:rPr>
-        <w:t xml:space="preserve">"PPP &lt;month&gt;"</w:t>
-      </w:r>
-      <w:r>
-        <w:t xml:space="preserve"> </w:t>
-      </w:r>
-      <w:r>
-        <w:t xml:space="preserve">invoice. PPP line descriptions</w:t>
-      </w:r>
-      <w:r>
-        <w:t xml:space="preserve"> </w:t>
-      </w:r>
-      <w:r>
-        <w:t xml:space="preserve">include the activity name (</w:t>
-      </w:r>
-      <w:r>
-        <w:rPr>
-          <w:rStyle w:val="VerbatimChar"/>
-        </w:rPr>
-        <w:t xml:space="preserve">"Pils – Borrel 28 jun"</w:t>
-      </w:r>
-      <w:r>
-        <w:t xml:space="preserve">); same product at different</w:t>
-      </w:r>
-      <w:r>
-        <w:t xml:space="preserve"> </w:t>
-      </w:r>
-      <w:r>
-        <w:t xml:space="preserve">activities/prices stays on separate lines. Both reuse</w:t>
-      </w:r>
-      <w:r>
-        <w:t xml:space="preserve"> </w:t>
-      </w:r>
-      <w:r>
-        <w:rPr>
-          <w:rStyle w:val="VerbatimChar"/>
-        </w:rPr>
-        <w:t xml:space="preserve">createSaleInvoice()</w:t>
-      </w:r>
-      <w:r>
-        <w:t xml:space="preserve"> </w:t>
-      </w:r>
-      <w:r>
-        <w:t xml:space="preserve">and</w:t>
-      </w:r>
-      <w:r>
-        <w:t xml:space="preserve"> </w:t>
-      </w:r>
-      <w:r>
-        <w:t xml:space="preserve">the Mendix fallback for lines without an offer id.</w:t>
-      </w:r>
-    </w:p>
-    <w:bookmarkEnd w:id="147"/>
-    <w:bookmarkStart w:id="148" w:name="alexia-integration-scheduled-borrels"/>
-    <w:p>
-      <w:pPr>
-        <w:pStyle w:val="Heading2"/>
-      </w:pPr>
-      <w:r>
-        <w:t xml:space="preserve">Alexia integration (scheduled borrels)</w:t>
-      </w:r>
-    </w:p>
-    <w:p>
-      <w:pPr>
-        <w:pStyle w:val="FirstParagraph"/>
-      </w:pPr>
-      <w:r>
-        <w:t xml:space="preserve">The drinks committee schedules borrels in</w:t>
-      </w:r>
-      <w:r>
-        <w:t xml:space="preserve"> </w:t>
-      </w:r>
-      <w:r>
-        <w:rPr>
-          <w:b/>
-          <w:bCs/>
-        </w:rPr>
-        <w:t xml:space="preserve">Alexia</w:t>
-      </w:r>
-      <w:r>
-        <w:t xml:space="preserve"> </w:t>
-      </w:r>
-      <w:r>
-        <w:t xml:space="preserve">(Inter-Actief's system,</w:t>
-      </w:r>
-      <w:r>
-        <w:t xml:space="preserve"> </w:t>
-      </w:r>
-      <w:r>
-        <w:rPr>
-          <w:rStyle w:val="VerbatimChar"/>
-        </w:rPr>
-        <w:t xml:space="preserve">alex.ia.utwente.nl</w:t>
-      </w:r>
-      <w:r>
-        <w:t xml:space="preserve">). PPP imports them so bartenders don't retype names and admins</w:t>
-      </w:r>
-      <w:r>
-        <w:t xml:space="preserve"> </w:t>
-      </w:r>
-      <w:r>
-        <w:t xml:space="preserve">can prepare specials in advance. Logic in</w:t>
-      </w:r>
-      <w:r>
-        <w:t xml:space="preserve"> </w:t>
-      </w:r>
-      <w:r>
-        <w:rPr>
-          <w:rStyle w:val="VerbatimChar"/>
-        </w:rPr>
-        <w:t xml:space="preserve">src/lib/alexia.ts</w:t>
       </w:r>
       <w:r>
         <w:t xml:space="preserve">.</w:t>
@@ -25786,70 +25896,19 @@
           <w:b/>
           <w:bCs/>
         </w:rPr>
-        <w:t xml:space="preserve">Public, no auth</w:t>
-      </w:r>
-      <w:r>
-        <w:t xml:space="preserve"> </w:t>
-      </w:r>
-      <w:r>
-        <w:t xml:space="preserve">— Alexia's</w:t>
-      </w:r>
-      <w:r>
-        <w:t xml:space="preserve"> </w:t>
-      </w:r>
-      <w:r>
-        <w:rPr>
-          <w:rStyle w:val="VerbatimChar"/>
-        </w:rPr>
-        <w:t xml:space="preserve">event.upcoming_list</w:t>
-      </w:r>
-      <w:r>
-        <w:t xml:space="preserve"> </w:t>
-      </w:r>
-      <w:r>
-        <w:t xml:space="preserve">JSON-RPC method is public:</w:t>
-      </w:r>
-      <w:r>
-        <w:t xml:space="preserve"> </w:t>
-      </w:r>
-      <w:r>
-        <w:rPr>
-          <w:rStyle w:val="VerbatimChar"/>
-        </w:rPr>
-        <w:t xml:space="preserve">POST https://alex.ia.utwente.nl/api/1/</w:t>
-      </w:r>
-      <w:r>
-        <w:t xml:space="preserve"> </w:t>
-      </w:r>
-      <w:r>
-        <w:t xml:space="preserve">with</w:t>
-      </w:r>
-      <w:r>
-        <w:t xml:space="preserve"> </w:t>
-      </w:r>
-      <w:r>
-        <w:rPr>
-          <w:rStyle w:val="VerbatimChar"/>
-        </w:rPr>
-        <w:t xml:space="preserve">{"jsonrpc":"2.0","method":"event.upcoming_list","params":[true],"id":1}</w:t>
-      </w:r>
-      <w:r>
-        <w:t xml:space="preserve">. Events</w:t>
-      </w:r>
-      <w:r>
-        <w:t xml:space="preserve"> </w:t>
-      </w:r>
-      <w:r>
-        <w:t xml:space="preserve">carry</w:t>
-      </w:r>
-      <w:r>
-        <w:t xml:space="preserve"> </w:t>
-      </w:r>
-      <w:r>
-        <w:rPr>
-          <w:rStyle w:val="VerbatimChar"/>
-        </w:rPr>
-        <w:t xml:space="preserve">name</w:t>
+        <w:t xml:space="preserve">VAT cannot be set via the API</w:t>
+      </w:r>
+      <w:r>
+        <w:t xml:space="preserve"> </w:t>
+      </w:r>
+      <w:r>
+        <w:t xml:space="preserve">— every shape (</w:t>
+      </w:r>
+      <w:r>
+        <w:rPr>
+          <w:rStyle w:val="VerbatimChar"/>
+        </w:rPr>
+        <w:t xml:space="preserve">vat_category {…}</w:t>
       </w:r>
       <w:r>
         <w:t xml:space="preserve">,</w:t>
@@ -25861,62 +25920,52 @@
         <w:rPr>
           <w:rStyle w:val="VerbatimChar"/>
         </w:rPr>
-        <w:t xml:space="preserve">organizer</w:t>
-      </w:r>
-      <w:r>
-        <w:t xml:space="preserve">,</w:t>
-      </w:r>
-      <w:r>
-        <w:t xml:space="preserve"> </w:t>
-      </w:r>
-      <w:r>
-        <w:rPr>
-          <w:rStyle w:val="VerbatimChar"/>
-        </w:rPr>
-        <w:t xml:space="preserve">locations</w:t>
-      </w:r>
-      <w:r>
-        <w:t xml:space="preserve">,</w:t>
-      </w:r>
-      <w:r>
-        <w:t xml:space="preserve"> </w:t>
-      </w:r>
-      <w:r>
-        <w:rPr>
-          <w:rStyle w:val="VerbatimChar"/>
-        </w:rPr>
-        <w:t xml:space="preserve">starts_at</w:t>
-      </w:r>
-      <w:r>
-        <w:t xml:space="preserve">,</w:t>
-      </w:r>
-      <w:r>
-        <w:t xml:space="preserve"> </w:t>
-      </w:r>
-      <w:r>
-        <w:rPr>
-          <w:rStyle w:val="VerbatimChar"/>
-        </w:rPr>
-        <w:t xml:space="preserve">ends_at</w:t>
-      </w:r>
-      <w:r>
-        <w:t xml:space="preserve"> </w:t>
-      </w:r>
-      <w:r>
-        <w:t xml:space="preserve">— but</w:t>
-      </w:r>
-      <w:r>
-        <w:t xml:space="preserve"> </w:t>
-      </w:r>
-      <w:r>
-        <w:rPr>
-          <w:b/>
-          <w:bCs/>
-        </w:rPr>
-        <w:t xml:space="preserve">no id</w:t>
-      </w:r>
-      <w:r>
-        <w:t xml:space="preserve">.</w:t>
+        <w:t xml:space="preserve">vat_percentage</w:t>
+      </w:r>
+      <w:r>
+        <w:t xml:space="preserve">, …) returns HTTP 500 server-side, so PPP products sync</w:t>
+      </w:r>
+      <w:r>
+        <w:t xml:space="preserve"> </w:t>
+      </w:r>
+      <w:r>
+        <w:rPr>
+          <w:b/>
+          <w:bCs/>
+        </w:rPr>
+        <w:t xml:space="preserve">without</w:t>
+      </w:r>
+      <w:r>
+        <w:rPr>
+          <w:b/>
+          <w:bCs/>
+        </w:rPr>
+        <w:t xml:space="preserve"> </w:t>
+      </w:r>
+      <w:r>
+        <w:rPr>
+          <w:b/>
+          <w:bCs/>
+        </w:rPr>
+        <w:t xml:space="preserve">VAT</w:t>
+      </w:r>
+      <w:r>
+        <w:t xml:space="preserve"> </w:t>
+      </w:r>
+      <w:r>
+        <w:t xml:space="preserve">(like SSS products, which are all unset). VAT is kept locally on</w:t>
+      </w:r>
+      <w:r>
+        <w:t xml:space="preserve"> </w:t>
+      </w:r>
+      <w:r>
+        <w:rPr>
+          <w:rStyle w:val="VerbatimChar"/>
+        </w:rPr>
+        <w:t xml:space="preserve">PppProduct.vatCategory</w:t>
+      </w:r>
+      <w:r>
+        <w:t xml:space="preserve">; set it in the Congressus UI if needed.</w:t>
       </w:r>
     </w:p>
     <w:p>
@@ -25932,7 +25981,7 @@
           <w:b/>
           <w:bCs/>
         </w:rPr>
-        <w:t xml:space="preserve">Auto-sync</w:t>
+        <w:t xml:space="preserve">Two-invoice export</w:t>
       </w:r>
       <w:r>
         <w:t xml:space="preserve"> </w:t>
@@ -25947,22 +25996,128 @@
         <w:rPr>
           <w:rStyle w:val="VerbatimChar"/>
         </w:rPr>
-        <w:t xml:space="preserve">POST /api/ppp/alexia/sync</w:t>
-      </w:r>
-      <w:r>
-        <w:t xml:space="preserve"> </w:t>
-      </w:r>
-      <w:r>
-        <w:t xml:space="preserve">keeps only</w:t>
-      </w:r>
-      <w:r>
-        <w:t xml:space="preserve"> </w:t>
-      </w:r>
-      <w:r>
-        <w:rPr>
-          <w:rStyle w:val="VerbatimChar"/>
-        </w:rPr>
-        <w:t xml:space="preserve">organizer === "Stress"</w:t>
+        <w:t xml:space="preserve">POST /api/admin/invoices/export { scope }</w:t>
+      </w:r>
+      <w:r>
+        <w:t xml:space="preserve"> </w:t>
+      </w:r>
+      <w:r>
+        <w:t xml:space="preserve">(</w:t>
+      </w:r>
+      <w:r>
+        <w:rPr>
+          <w:rStyle w:val="VerbatimChar"/>
+        </w:rPr>
+        <w:t xml:space="preserve">sss</w:t>
+      </w:r>
+      <w:r>
+        <w:t xml:space="preserve"> </w:t>
+      </w:r>
+      <w:r>
+        <w:t xml:space="preserve">|</w:t>
+      </w:r>
+      <w:r>
+        <w:t xml:space="preserve"> </w:t>
+      </w:r>
+      <w:r>
+        <w:rPr>
+          <w:rStyle w:val="VerbatimChar"/>
+        </w:rPr>
+        <w:t xml:space="preserve">ppp</w:t>
+      </w:r>
+      <w:r>
+        <w:t xml:space="preserve"> </w:t>
+      </w:r>
+      <w:r>
+        <w:t xml:space="preserve">|</w:t>
+      </w:r>
+      <w:r>
+        <w:t xml:space="preserve"> </w:t>
+      </w:r>
+      <w:r>
+        <w:rPr>
+          <w:rStyle w:val="VerbatimChar"/>
+        </w:rPr>
+        <w:t xml:space="preserve">all</w:t>
+      </w:r>
+      <w:r>
+        <w:t xml:space="preserve">) creates</w:t>
+      </w:r>
+      <w:r>
+        <w:t xml:space="preserve"> </w:t>
+      </w:r>
+      <w:r>
+        <w:rPr>
+          <w:b/>
+          <w:bCs/>
+        </w:rPr>
+        <w:t xml:space="preserve">separate</w:t>
+      </w:r>
+      <w:r>
+        <w:t xml:space="preserve"> </w:t>
+      </w:r>
+      <w:r>
+        <w:t xml:space="preserve">Congressus invoices per member per month: an</w:t>
+      </w:r>
+      <w:r>
+        <w:t xml:space="preserve"> </w:t>
+      </w:r>
+      <w:r>
+        <w:rPr>
+          <w:rStyle w:val="VerbatimChar"/>
+        </w:rPr>
+        <w:t xml:space="preserve">"SSS &lt;month&gt;"</w:t>
+      </w:r>
+      <w:r>
+        <w:t xml:space="preserve"> </w:t>
+      </w:r>
+      <w:r>
+        <w:t xml:space="preserve">invoice and a</w:t>
+      </w:r>
+      <w:r>
+        <w:t xml:space="preserve"> </w:t>
+      </w:r>
+      <w:r>
+        <w:rPr>
+          <w:rStyle w:val="VerbatimChar"/>
+        </w:rPr>
+        <w:t xml:space="preserve">"PPP &lt;month&gt;"</w:t>
+      </w:r>
+      <w:r>
+        <w:t xml:space="preserve"> </w:t>
+      </w:r>
+      <w:r>
+        <w:t xml:space="preserve">invoice. PPP line descriptions</w:t>
+      </w:r>
+      <w:r>
+        <w:t xml:space="preserve"> </w:t>
+      </w:r>
+      <w:r>
+        <w:t xml:space="preserve">include the activity name (</w:t>
+      </w:r>
+      <w:r>
+        <w:rPr>
+          <w:rStyle w:val="VerbatimChar"/>
+        </w:rPr>
+        <w:t xml:space="preserve">"Pils – Borrel 28 jun"</w:t>
+      </w:r>
+      <w:r>
+        <w:t xml:space="preserve">); same product at different</w:t>
+      </w:r>
+      <w:r>
+        <w:t xml:space="preserve"> </w:t>
+      </w:r>
+      <w:r>
+        <w:t xml:space="preserve">activities/prices stays on separate lines. Both reuse</w:t>
+      </w:r>
+      <w:r>
+        <w:t xml:space="preserve"> </w:t>
+      </w:r>
+      <w:r>
+        <w:rPr>
+          <w:rStyle w:val="VerbatimChar"/>
+        </w:rPr>
+        <w:t xml:space="preserve">createSaleInvoice()</w:t>
       </w:r>
       <w:r>
         <w:t xml:space="preserve"> </w:t>
@@ -25974,104 +26129,71 @@
         <w:t xml:space="preserve"> </w:t>
       </w:r>
       <w:r>
-        <w:rPr>
-          <w:b/>
-          <w:bCs/>
-        </w:rPr>
-        <w:t xml:space="preserve">find-or-creates</w:t>
-      </w:r>
-      <w:r>
-        <w:t xml:space="preserve"> </w:t>
-      </w:r>
-      <w:r>
-        <w:t xml:space="preserve">a</w:t>
-      </w:r>
-      <w:r>
-        <w:t xml:space="preserve"> </w:t>
-      </w:r>
-      <w:r>
-        <w:rPr>
-          <w:rStyle w:val="VerbatimChar"/>
-        </w:rPr>
-        <w:t xml:space="preserve">PppActivity</w:t>
-      </w:r>
-      <w:r>
-        <w:t xml:space="preserve"> </w:t>
-      </w:r>
-      <w:r>
-        <w:t xml:space="preserve">for each (date =</w:t>
-      </w:r>
-      <w:r>
-        <w:t xml:space="preserve"> </w:t>
-      </w:r>
-      <w:r>
-        <w:rPr>
-          <w:rStyle w:val="VerbatimChar"/>
-        </w:rPr>
-        <w:t xml:space="preserve">starts_at</w:t>
-      </w:r>
-      <w:r>
-        <w:t xml:space="preserve">), matched by</w:t>
-      </w:r>
-      <w:r>
-        <w:t xml:space="preserve"> </w:t>
-      </w:r>
-      <w:r>
-        <w:rPr>
-          <w:b/>
-          <w:bCs/>
-        </w:rPr>
-        <w:t xml:space="preserve">name + calendar day</w:t>
-      </w:r>
-      <w:r>
-        <w:t xml:space="preserve"> </w:t>
-      </w:r>
-      <w:r>
-        <w:t xml:space="preserve">(no id exists). It runs when a bartender lands on</w:t>
-      </w:r>
-      <w:r>
-        <w:t xml:space="preserve"> </w:t>
-      </w:r>
-      <w:r>
-        <w:rPr>
-          <w:rStyle w:val="VerbatimChar"/>
-        </w:rPr>
-        <w:t xml:space="preserve">/ppp</w:t>
-      </w:r>
-      <w:r>
-        <w:t xml:space="preserve"> </w:t>
-      </w:r>
-      <w:r>
-        <w:rPr>
-          <w:b/>
-          <w:bCs/>
-        </w:rPr>
-        <w:t xml:space="preserve">and</w:t>
-      </w:r>
-      <w:r>
-        <w:t xml:space="preserve"> </w:t>
-      </w:r>
-      <w:r>
-        <w:t xml:space="preserve">when an admin opens</w:t>
-      </w:r>
-      <w:r>
-        <w:t xml:space="preserve"> </w:t>
-      </w:r>
-      <w:r>
-        <w:rPr>
-          <w:b/>
-          <w:bCs/>
-        </w:rPr>
-        <w:t xml:space="preserve">Admin → PPP → Activities</w:t>
-      </w:r>
-      <w:r>
-        <w:t xml:space="preserve">, so new borrels appear</w:t>
-      </w:r>
-      <w:r>
-        <w:t xml:space="preserve"> </w:t>
-      </w:r>
-      <w:r>
-        <w:t xml:space="preserve">automatically and the admin can pre-set specials on future ones.</w:t>
+        <w:t xml:space="preserve">the Mendix fallback for lines without an offer id.</w:t>
+      </w:r>
+    </w:p>
+    <w:bookmarkEnd w:id="148"/>
+    <w:bookmarkStart w:id="149" w:name="alexia-integration-scheduled-borrels"/>
+    <w:p>
+      <w:pPr>
+        <w:pStyle w:val="Heading2"/>
+      </w:pPr>
+      <w:r>
+        <w:t xml:space="preserve">Alexia integration (scheduled borrels)</w:t>
+      </w:r>
+    </w:p>
+    <w:p>
+      <w:pPr>
+        <w:pStyle w:val="FirstParagraph"/>
+      </w:pPr>
+      <w:r>
+        <w:t xml:space="preserve">The drinks committee schedules borrels in</w:t>
+      </w:r>
+      <w:r>
+        <w:t xml:space="preserve"> </w:t>
+      </w:r>
+      <w:r>
+        <w:rPr>
+          <w:b/>
+          <w:bCs/>
+        </w:rPr>
+        <w:t xml:space="preserve">Alexia</w:t>
+      </w:r>
+      <w:r>
+        <w:t xml:space="preserve"> </w:t>
+      </w:r>
+      <w:r>
+        <w:t xml:space="preserve">(Inter-Actief's system,</w:t>
+      </w:r>
+      <w:r>
+        <w:t xml:space="preserve"> </w:t>
+      </w:r>
+      <w:r>
+        <w:rPr>
+          <w:rStyle w:val="VerbatimChar"/>
+        </w:rPr>
+        <w:t xml:space="preserve">alex.ia.utwente.nl</w:t>
+      </w:r>
+      <w:r>
+        <w:t xml:space="preserve">). PPP imports them so bartenders don't retype names and admins</w:t>
+      </w:r>
+      <w:r>
+        <w:t xml:space="preserve"> </w:t>
+      </w:r>
+      <w:r>
+        <w:t xml:space="preserve">can prepare specials in advance. Logic in</w:t>
+      </w:r>
+      <w:r>
+        <w:t xml:space="preserve"> </w:t>
+      </w:r>
+      <w:r>
+        <w:rPr>
+          <w:rStyle w:val="VerbatimChar"/>
+        </w:rPr>
+        <w:t xml:space="preserve">src/lib/alexia.ts</w:t>
+      </w:r>
+      <w:r>
+        <w:t xml:space="preserve">.</w:t>
       </w:r>
     </w:p>
     <w:p>
@@ -26079,7 +26201,7 @@
         <w:pStyle w:val="Compact"/>
         <w:numPr>
           <w:ilvl w:val="0"/>
-          <w:numId w:val="1050"/>
+          <w:numId w:val="1051"/>
         </w:numPr>
       </w:pPr>
       <w:r>
@@ -26087,19 +26209,137 @@
           <w:b/>
           <w:bCs/>
         </w:rPr>
-        <w:t xml:space="preserve">Idempotent + fail-soft</w:t>
-      </w:r>
-      <w:r>
-        <w:t xml:space="preserve"> </w:t>
-      </w:r>
-      <w:r>
-        <w:t xml:space="preserve">— re-syncing creates nothing new; any Alexia</w:t>
-      </w:r>
-      <w:r>
-        <w:t xml:space="preserve"> </w:t>
-      </w:r>
-      <w:r>
-        <w:t xml:space="preserve">error/timeout just yields no import and PPP keeps working.</w:t>
+        <w:t xml:space="preserve">Public, no auth</w:t>
+      </w:r>
+      <w:r>
+        <w:t xml:space="preserve"> </w:t>
+      </w:r>
+      <w:r>
+        <w:t xml:space="preserve">— Alexia's</w:t>
+      </w:r>
+      <w:r>
+        <w:t xml:space="preserve"> </w:t>
+      </w:r>
+      <w:r>
+        <w:rPr>
+          <w:rStyle w:val="VerbatimChar"/>
+        </w:rPr>
+        <w:t xml:space="preserve">event.upcoming_list</w:t>
+      </w:r>
+      <w:r>
+        <w:t xml:space="preserve"> </w:t>
+      </w:r>
+      <w:r>
+        <w:t xml:space="preserve">JSON-RPC method is public:</w:t>
+      </w:r>
+      <w:r>
+        <w:t xml:space="preserve"> </w:t>
+      </w:r>
+      <w:r>
+        <w:rPr>
+          <w:rStyle w:val="VerbatimChar"/>
+        </w:rPr>
+        <w:t xml:space="preserve">POST https://alex.ia.utwente.nl/api/1/</w:t>
+      </w:r>
+      <w:r>
+        <w:t xml:space="preserve"> </w:t>
+      </w:r>
+      <w:r>
+        <w:t xml:space="preserve">with</w:t>
+      </w:r>
+      <w:r>
+        <w:t xml:space="preserve"> </w:t>
+      </w:r>
+      <w:r>
+        <w:rPr>
+          <w:rStyle w:val="VerbatimChar"/>
+        </w:rPr>
+        <w:t xml:space="preserve">{"jsonrpc":"2.0","method":"event.upcoming_list","params":[true],"id":1}</w:t>
+      </w:r>
+      <w:r>
+        <w:t xml:space="preserve">. Events</w:t>
+      </w:r>
+      <w:r>
+        <w:t xml:space="preserve"> </w:t>
+      </w:r>
+      <w:r>
+        <w:t xml:space="preserve">carry</w:t>
+      </w:r>
+      <w:r>
+        <w:t xml:space="preserve"> </w:t>
+      </w:r>
+      <w:r>
+        <w:rPr>
+          <w:rStyle w:val="VerbatimChar"/>
+        </w:rPr>
+        <w:t xml:space="preserve">name</w:t>
+      </w:r>
+      <w:r>
+        <w:t xml:space="preserve">,</w:t>
+      </w:r>
+      <w:r>
+        <w:t xml:space="preserve"> </w:t>
+      </w:r>
+      <w:r>
+        <w:rPr>
+          <w:rStyle w:val="VerbatimChar"/>
+        </w:rPr>
+        <w:t xml:space="preserve">organizer</w:t>
+      </w:r>
+      <w:r>
+        <w:t xml:space="preserve">,</w:t>
+      </w:r>
+      <w:r>
+        <w:t xml:space="preserve"> </w:t>
+      </w:r>
+      <w:r>
+        <w:rPr>
+          <w:rStyle w:val="VerbatimChar"/>
+        </w:rPr>
+        <w:t xml:space="preserve">locations</w:t>
+      </w:r>
+      <w:r>
+        <w:t xml:space="preserve">,</w:t>
+      </w:r>
+      <w:r>
+        <w:t xml:space="preserve"> </w:t>
+      </w:r>
+      <w:r>
+        <w:rPr>
+          <w:rStyle w:val="VerbatimChar"/>
+        </w:rPr>
+        <w:t xml:space="preserve">starts_at</w:t>
+      </w:r>
+      <w:r>
+        <w:t xml:space="preserve">,</w:t>
+      </w:r>
+      <w:r>
+        <w:t xml:space="preserve"> </w:t>
+      </w:r>
+      <w:r>
+        <w:rPr>
+          <w:rStyle w:val="VerbatimChar"/>
+        </w:rPr>
+        <w:t xml:space="preserve">ends_at</w:t>
+      </w:r>
+      <w:r>
+        <w:t xml:space="preserve"> </w:t>
+      </w:r>
+      <w:r>
+        <w:t xml:space="preserve">— but</w:t>
+      </w:r>
+      <w:r>
+        <w:t xml:space="preserve"> </w:t>
+      </w:r>
+      <w:r>
+        <w:rPr>
+          <w:b/>
+          <w:bCs/>
+        </w:rPr>
+        <w:t xml:space="preserve">no id</w:t>
+      </w:r>
+      <w:r>
+        <w:t xml:space="preserve">.</w:t>
       </w:r>
     </w:p>
     <w:p>
@@ -26107,7 +26347,7 @@
         <w:pStyle w:val="Compact"/>
         <w:numPr>
           <w:ilvl w:val="0"/>
-          <w:numId w:val="1050"/>
+          <w:numId w:val="1051"/>
         </w:numPr>
       </w:pPr>
       <w:r>
@@ -26115,6 +26355,189 @@
           <w:b/>
           <w:bCs/>
         </w:rPr>
+        <w:t xml:space="preserve">Auto-sync</w:t>
+      </w:r>
+      <w:r>
+        <w:t xml:space="preserve"> </w:t>
+      </w:r>
+      <w:r>
+        <w:t xml:space="preserve">—</w:t>
+      </w:r>
+      <w:r>
+        <w:t xml:space="preserve"> </w:t>
+      </w:r>
+      <w:r>
+        <w:rPr>
+          <w:rStyle w:val="VerbatimChar"/>
+        </w:rPr>
+        <w:t xml:space="preserve">POST /api/ppp/alexia/sync</w:t>
+      </w:r>
+      <w:r>
+        <w:t xml:space="preserve"> </w:t>
+      </w:r>
+      <w:r>
+        <w:t xml:space="preserve">keeps only</w:t>
+      </w:r>
+      <w:r>
+        <w:t xml:space="preserve"> </w:t>
+      </w:r>
+      <w:r>
+        <w:rPr>
+          <w:rStyle w:val="VerbatimChar"/>
+        </w:rPr>
+        <w:t xml:space="preserve">organizer === "Stress"</w:t>
+      </w:r>
+      <w:r>
+        <w:t xml:space="preserve"> </w:t>
+      </w:r>
+      <w:r>
+        <w:t xml:space="preserve">and</w:t>
+      </w:r>
+      <w:r>
+        <w:t xml:space="preserve"> </w:t>
+      </w:r>
+      <w:r>
+        <w:rPr>
+          <w:b/>
+          <w:bCs/>
+        </w:rPr>
+        <w:t xml:space="preserve">find-or-creates</w:t>
+      </w:r>
+      <w:r>
+        <w:t xml:space="preserve"> </w:t>
+      </w:r>
+      <w:r>
+        <w:t xml:space="preserve">a</w:t>
+      </w:r>
+      <w:r>
+        <w:t xml:space="preserve"> </w:t>
+      </w:r>
+      <w:r>
+        <w:rPr>
+          <w:rStyle w:val="VerbatimChar"/>
+        </w:rPr>
+        <w:t xml:space="preserve">PppActivity</w:t>
+      </w:r>
+      <w:r>
+        <w:t xml:space="preserve"> </w:t>
+      </w:r>
+      <w:r>
+        <w:t xml:space="preserve">for each (date =</w:t>
+      </w:r>
+      <w:r>
+        <w:t xml:space="preserve"> </w:t>
+      </w:r>
+      <w:r>
+        <w:rPr>
+          <w:rStyle w:val="VerbatimChar"/>
+        </w:rPr>
+        <w:t xml:space="preserve">starts_at</w:t>
+      </w:r>
+      <w:r>
+        <w:t xml:space="preserve">), matched by</w:t>
+      </w:r>
+      <w:r>
+        <w:t xml:space="preserve"> </w:t>
+      </w:r>
+      <w:r>
+        <w:rPr>
+          <w:b/>
+          <w:bCs/>
+        </w:rPr>
+        <w:t xml:space="preserve">name + calendar day</w:t>
+      </w:r>
+      <w:r>
+        <w:t xml:space="preserve"> </w:t>
+      </w:r>
+      <w:r>
+        <w:t xml:space="preserve">(no id exists). It runs when a bartender lands on</w:t>
+      </w:r>
+      <w:r>
+        <w:t xml:space="preserve"> </w:t>
+      </w:r>
+      <w:r>
+        <w:rPr>
+          <w:rStyle w:val="VerbatimChar"/>
+        </w:rPr>
+        <w:t xml:space="preserve">/ppp</w:t>
+      </w:r>
+      <w:r>
+        <w:t xml:space="preserve"> </w:t>
+      </w:r>
+      <w:r>
+        <w:rPr>
+          <w:b/>
+          <w:bCs/>
+        </w:rPr>
+        <w:t xml:space="preserve">and</w:t>
+      </w:r>
+      <w:r>
+        <w:t xml:space="preserve"> </w:t>
+      </w:r>
+      <w:r>
+        <w:t xml:space="preserve">when an admin opens</w:t>
+      </w:r>
+      <w:r>
+        <w:t xml:space="preserve"> </w:t>
+      </w:r>
+      <w:r>
+        <w:rPr>
+          <w:b/>
+          <w:bCs/>
+        </w:rPr>
+        <w:t xml:space="preserve">Admin → PPP → Activities</w:t>
+      </w:r>
+      <w:r>
+        <w:t xml:space="preserve">, so new borrels appear</w:t>
+      </w:r>
+      <w:r>
+        <w:t xml:space="preserve"> </w:t>
+      </w:r>
+      <w:r>
+        <w:t xml:space="preserve">automatically and the admin can pre-set specials on future ones.</w:t>
+      </w:r>
+    </w:p>
+    <w:p>
+      <w:pPr>
+        <w:pStyle w:val="Compact"/>
+        <w:numPr>
+          <w:ilvl w:val="0"/>
+          <w:numId w:val="1051"/>
+        </w:numPr>
+      </w:pPr>
+      <w:r>
+        <w:rPr>
+          <w:b/>
+          <w:bCs/>
+        </w:rPr>
+        <w:t xml:space="preserve">Idempotent + fail-soft</w:t>
+      </w:r>
+      <w:r>
+        <w:t xml:space="preserve"> </w:t>
+      </w:r>
+      <w:r>
+        <w:t xml:space="preserve">— re-syncing creates nothing new; any Alexia</w:t>
+      </w:r>
+      <w:r>
+        <w:t xml:space="preserve"> </w:t>
+      </w:r>
+      <w:r>
+        <w:t xml:space="preserve">error/timeout just yields no import and PPP keeps working.</w:t>
+      </w:r>
+    </w:p>
+    <w:p>
+      <w:pPr>
+        <w:pStyle w:val="Compact"/>
+        <w:numPr>
+          <w:ilvl w:val="0"/>
+          <w:numId w:val="1051"/>
+        </w:numPr>
+      </w:pPr>
+      <w:r>
+        <w:rPr>
+          <w:b/>
+          <w:bCs/>
+        </w:rPr>
         <w:t xml:space="preserve">Caveat</w:t>
       </w:r>
       <w:r>
@@ -26202,8 +26625,8 @@
         <w:t xml:space="preserve">).</w:t>
       </w:r>
     </w:p>
-    <w:bookmarkEnd w:id="148"/>
-    <w:bookmarkStart w:id="150" w:name="data-model-ppp"/>
+    <w:bookmarkEnd w:id="149"/>
+    <w:bookmarkStart w:id="151" w:name="data-model-ppp"/>
     <w:p>
       <w:pPr>
         <w:pStyle w:val="Heading2"/>
@@ -26222,7 +26645,7 @@
       <w:r>
         <w:t xml:space="preserve"> </w:t>
       </w:r>
-      <w:hyperlink r:id="rId149">
+      <w:hyperlink r:id="rId150">
         <w:r>
           <w:rPr>
             <w:rStyle w:val="Hyperlink"/>
@@ -26242,7 +26665,7 @@
         <w:pStyle w:val="Compact"/>
         <w:numPr>
           <w:ilvl w:val="0"/>
-          <w:numId w:val="1051"/>
+          <w:numId w:val="1052"/>
         </w:numPr>
       </w:pPr>
       <w:r>
@@ -26252,6 +26675,48 @@
         <w:t xml:space="preserve">PppProductCategory</w:t>
       </w:r>
       <w:r>
+        <w:t xml:space="preserve"> </w:t>
+      </w:r>
+      <w:r>
+        <w:t xml:space="preserve">(</w:t>
+      </w:r>
+      <w:r>
+        <w:rPr>
+          <w:rStyle w:val="VerbatimChar"/>
+        </w:rPr>
+        <w:t xml:space="preserve">bartenderFree</w:t>
+      </w:r>
+      <w:r>
+        <w:t xml:space="preserve"> </w:t>
+      </w:r>
+      <w:r>
+        <w:t xml:space="preserve">→ drinks free for the on-shift bartender),</w:t>
+      </w:r>
+      <w:r>
+        <w:t xml:space="preserve"> </w:t>
+      </w:r>
+      <w:r>
+        <w:rPr>
+          <w:rStyle w:val="VerbatimChar"/>
+        </w:rPr>
+        <w:t xml:space="preserve">PppProduct</w:t>
+      </w:r>
+      <w:r>
+        <w:t xml:space="preserve"> </w:t>
+      </w:r>
+      <w:r>
+        <w:t xml:space="preserve">(price,</w:t>
+      </w:r>
+      <w:r>
+        <w:t xml:space="preserve"> </w:t>
+      </w:r>
+      <w:r>
+        <w:rPr>
+          <w:rStyle w:val="VerbatimChar"/>
+        </w:rPr>
+        <w:t xml:space="preserve">specialPrice?</w:t>
+      </w:r>
+      <w:r>
         <w:t xml:space="preserve">,</w:t>
       </w:r>
       <w:r>
@@ -26261,22 +26726,7 @@
         <w:rPr>
           <w:rStyle w:val="VerbatimChar"/>
         </w:rPr>
-        <w:t xml:space="preserve">PppProduct</w:t>
-      </w:r>
-      <w:r>
-        <w:t xml:space="preserve"> </w:t>
-      </w:r>
-      <w:r>
-        <w:t xml:space="preserve">(price,</w:t>
-      </w:r>
-      <w:r>
-        <w:t xml:space="preserve"> </w:t>
-      </w:r>
-      <w:r>
-        <w:rPr>
-          <w:rStyle w:val="VerbatimChar"/>
-        </w:rPr>
-        <w:t xml:space="preserve">specialPrice?</w:t>
+        <w:t xml:space="preserve">color?</w:t>
       </w:r>
       <w:r>
         <w:t xml:space="preserve">,</w:t>
@@ -26288,7 +26738,31 @@
         <w:rPr>
           <w:rStyle w:val="VerbatimChar"/>
         </w:rPr>
-        <w:t xml:space="preserve">color?</w:t>
+        <w:t xml:space="preserve">vatCategory</w:t>
+      </w:r>
+      <w:r>
+        <w:t xml:space="preserve">, Congressus ids),</w:t>
+      </w:r>
+      <w:r>
+        <w:t xml:space="preserve"> </w:t>
+      </w:r>
+      <w:r>
+        <w:rPr>
+          <w:rStyle w:val="VerbatimChar"/>
+        </w:rPr>
+        <w:t xml:space="preserve">PppActivity</w:t>
+      </w:r>
+      <w:r>
+        <w:t xml:space="preserve"> </w:t>
+      </w:r>
+      <w:r>
+        <w:t xml:space="preserve">(</w:t>
+      </w:r>
+      <w:r>
+        <w:rPr>
+          <w:rStyle w:val="VerbatimChar"/>
+        </w:rPr>
+        <w:t xml:space="preserve">status</w:t>
       </w:r>
       <w:r>
         <w:t xml:space="preserve">,</w:t>
@@ -26300,19 +26774,70 @@
         <w:rPr>
           <w:rStyle w:val="VerbatimChar"/>
         </w:rPr>
-        <w:t xml:space="preserve">vatCategory</w:t>
-      </w:r>
-      <w:r>
-        <w:t xml:space="preserve">, Congressus ids),</w:t>
-      </w:r>
-      <w:r>
-        <w:t xml:space="preserve"> </w:t>
-      </w:r>
-      <w:r>
-        <w:rPr>
-          <w:rStyle w:val="VerbatimChar"/>
-        </w:rPr>
-        <w:t xml:space="preserve">PppActivity</w:t>
+        <w:t xml:space="preserve">discountsActive</w:t>
+      </w:r>
+      <w:r>
+        <w:t xml:space="preserve">),</w:t>
+      </w:r>
+      <w:r>
+        <w:t xml:space="preserve"> </w:t>
+      </w:r>
+      <w:r>
+        <w:rPr>
+          <w:rStyle w:val="VerbatimChar"/>
+        </w:rPr>
+        <w:t xml:space="preserve">PppActivityDiscount</w:t>
+      </w:r>
+      <w:r>
+        <w:t xml:space="preserve"> </w:t>
+      </w:r>
+      <w:r>
+        <w:t xml:space="preserve">(per-activity per-product special price),</w:t>
+      </w:r>
+      <w:r>
+        <w:t xml:space="preserve"> </w:t>
+      </w:r>
+      <w:r>
+        <w:rPr>
+          <w:rStyle w:val="VerbatimChar"/>
+        </w:rPr>
+        <w:t xml:space="preserve">PppInvoice</w:t>
+      </w:r>
+      <w:r>
+        <w:t xml:space="preserve"> </w:t>
+      </w:r>
+      <w:r>
+        <w:t xml:space="preserve">(defaults to CONFIRMED, no CONCEPT;</w:t>
+      </w:r>
+      <w:r>
+        <w:t xml:space="preserve"> </w:t>
+      </w:r>
+      <w:r>
+        <w:rPr>
+          <w:rStyle w:val="VerbatimChar"/>
+        </w:rPr>
+        <w:t xml:space="preserve">createdById?</w:t>
+      </w:r>
+      <w:r>
+        <w:t xml:space="preserve"> </w:t>
+      </w:r>
+      <w:r>
+        <w:t xml:space="preserve">→ the bartender</w:t>
+      </w:r>
+      <w:r>
+        <w:t xml:space="preserve"> </w:t>
+      </w:r>
+      <w:r>
+        <w:t xml:space="preserve">who tapped the order),</w:t>
+      </w:r>
+      <w:r>
+        <w:t xml:space="preserve"> </w:t>
+      </w:r>
+      <w:r>
+        <w:rPr>
+          <w:rStyle w:val="VerbatimChar"/>
+        </w:rPr>
+        <w:t xml:space="preserve">PppInvoiceLine</w:t>
       </w:r>
       <w:r>
         <w:t xml:space="preserve"> </w:t>
@@ -26324,93 +26849,6 @@
         <w:rPr>
           <w:rStyle w:val="VerbatimChar"/>
         </w:rPr>
-        <w:t xml:space="preserve">status</w:t>
-      </w:r>
-      <w:r>
-        <w:t xml:space="preserve">,</w:t>
-      </w:r>
-      <w:r>
-        <w:t xml:space="preserve"> </w:t>
-      </w:r>
-      <w:r>
-        <w:rPr>
-          <w:rStyle w:val="VerbatimChar"/>
-        </w:rPr>
-        <w:t xml:space="preserve">discountsActive</w:t>
-      </w:r>
-      <w:r>
-        <w:t xml:space="preserve">),</w:t>
-      </w:r>
-      <w:r>
-        <w:t xml:space="preserve"> </w:t>
-      </w:r>
-      <w:r>
-        <w:rPr>
-          <w:rStyle w:val="VerbatimChar"/>
-        </w:rPr>
-        <w:t xml:space="preserve">PppActivityDiscount</w:t>
-      </w:r>
-      <w:r>
-        <w:t xml:space="preserve"> </w:t>
-      </w:r>
-      <w:r>
-        <w:t xml:space="preserve">(per-activity per-product special price),</w:t>
-      </w:r>
-      <w:r>
-        <w:t xml:space="preserve"> </w:t>
-      </w:r>
-      <w:r>
-        <w:rPr>
-          <w:rStyle w:val="VerbatimChar"/>
-        </w:rPr>
-        <w:t xml:space="preserve">PppInvoice</w:t>
-      </w:r>
-      <w:r>
-        <w:t xml:space="preserve"> </w:t>
-      </w:r>
-      <w:r>
-        <w:t xml:space="preserve">(defaults to CONFIRMED, no CONCEPT;</w:t>
-      </w:r>
-      <w:r>
-        <w:t xml:space="preserve"> </w:t>
-      </w:r>
-      <w:r>
-        <w:rPr>
-          <w:rStyle w:val="VerbatimChar"/>
-        </w:rPr>
-        <w:t xml:space="preserve">createdById?</w:t>
-      </w:r>
-      <w:r>
-        <w:t xml:space="preserve"> </w:t>
-      </w:r>
-      <w:r>
-        <w:t xml:space="preserve">→ the bartender</w:t>
-      </w:r>
-      <w:r>
-        <w:t xml:space="preserve"> </w:t>
-      </w:r>
-      <w:r>
-        <w:t xml:space="preserve">who tapped the order),</w:t>
-      </w:r>
-      <w:r>
-        <w:t xml:space="preserve"> </w:t>
-      </w:r>
-      <w:r>
-        <w:rPr>
-          <w:rStyle w:val="VerbatimChar"/>
-        </w:rPr>
-        <w:t xml:space="preserve">PppInvoiceLine</w:t>
-      </w:r>
-      <w:r>
-        <w:t xml:space="preserve"> </w:t>
-      </w:r>
-      <w:r>
-        <w:t xml:space="preserve">(</w:t>
-      </w:r>
-      <w:r>
-        <w:rPr>
-          <w:rStyle w:val="VerbatimChar"/>
-        </w:rPr>
         <w:t xml:space="preserve">unitCents</w:t>
       </w:r>
       <w:r>
@@ -26447,7 +26885,28 @@
         <w:t xml:space="preserve"> </w:t>
       </w:r>
       <w:r>
-        <w:t xml:space="preserve">snapshots for discount reporting).</w:t>
+        <w:t xml:space="preserve">snapshots for discount reporting +</w:t>
+      </w:r>
+      <w:r>
+        <w:t xml:space="preserve"> </w:t>
+      </w:r>
+      <w:r>
+        <w:rPr>
+          <w:rStyle w:val="VerbatimChar"/>
+        </w:rPr>
+        <w:t xml:space="preserve">bartenderFree</w:t>
+      </w:r>
+      <w:r>
+        <w:t xml:space="preserve"> </w:t>
+      </w:r>
+      <w:r>
+        <w:t xml:space="preserve">marking a</w:t>
+      </w:r>
+      <w:r>
+        <w:t xml:space="preserve"> </w:t>
+      </w:r>
+      <w:r>
+        <w:t xml:space="preserve">comped bartender line).</w:t>
       </w:r>
     </w:p>
     <w:p>
@@ -26455,7 +26914,7 @@
         <w:pStyle w:val="Compact"/>
         <w:numPr>
           <w:ilvl w:val="0"/>
-          <w:numId w:val="1051"/>
+          <w:numId w:val="1052"/>
         </w:numPr>
       </w:pPr>
       <w:r>
@@ -26512,7 +26971,7 @@
         <w:pStyle w:val="Compact"/>
         <w:numPr>
           <w:ilvl w:val="0"/>
-          <w:numId w:val="1051"/>
+          <w:numId w:val="1052"/>
         </w:numPr>
       </w:pPr>
       <w:r>
@@ -26533,7 +26992,7 @@
         <w:pStyle w:val="Compact"/>
         <w:numPr>
           <w:ilvl w:val="0"/>
-          <w:numId w:val="1051"/>
+          <w:numId w:val="1052"/>
         </w:numPr>
       </w:pPr>
       <w:r>
@@ -26585,8 +27044,8 @@
         <w:t xml:space="preserve">unchanged for identity.</w:t>
       </w:r>
     </w:p>
-    <w:bookmarkEnd w:id="150"/>
-    <w:bookmarkStart w:id="151" w:name="api-reference-ppp"/>
+    <w:bookmarkEnd w:id="151"/>
+    <w:bookmarkStart w:id="152" w:name="api-reference-ppp"/>
     <w:p>
       <w:pPr>
         <w:pStyle w:val="Heading2"/>
@@ -26871,7 +27330,57 @@
               <w:pStyle w:val="Compact"/>
             </w:pPr>
             <w:r>
-              <w:t xml:space="preserve">Published drinks for the POS</w:t>
+              <w:t xml:space="preserve">Published drinks for the POS (incl.</w:t>
+            </w:r>
+            <w:r>
+              <w:t xml:space="preserve"> </w:t>
+            </w:r>
+            <w:r>
+              <w:rPr>
+                <w:rStyle w:val="VerbatimChar"/>
+              </w:rPr>
+              <w:t xml:space="preserve">category.bartenderFree</w:t>
+            </w:r>
+            <w:r>
+              <w:t xml:space="preserve">)</w:t>
+            </w:r>
+          </w:p>
+        </w:tc>
+      </w:tr>
+      <w:tr>
+        <w:tc>
+          <w:tcPr/>
+          <w:p>
+            <w:pPr>
+              <w:pStyle w:val="Compact"/>
+            </w:pPr>
+            <w:r>
+              <w:t xml:space="preserve">GET</w:t>
+            </w:r>
+          </w:p>
+        </w:tc>
+        <w:tc>
+          <w:tcPr/>
+          <w:p>
+            <w:pPr>
+              <w:pStyle w:val="Compact"/>
+            </w:pPr>
+            <w:r>
+              <w:rPr>
+                <w:rStyle w:val="VerbatimChar"/>
+              </w:rPr>
+              <w:t xml:space="preserve">/api/ppp/me</w:t>
+            </w:r>
+          </w:p>
+        </w:tc>
+        <w:tc>
+          <w:tcPr/>
+          <w:p>
+            <w:pPr>
+              <w:pStyle w:val="Compact"/>
+            </w:pPr>
+            <w:r>
+              <w:t xml:space="preserve">The logged-in bartender's own linked member (for the free-drink rule)</w:t>
             </w:r>
           </w:p>
         </w:tc>
@@ -26909,7 +27418,128 @@
               <w:pStyle w:val="Compact"/>
             </w:pPr>
             <w:r>
-              <w:t xml:space="preserve">UID → member (name + roles) for charging</w:t>
+              <w:t xml:space="preserve">UID → member (name + roles); returns</w:t>
+            </w:r>
+            <w:r>
+              <w:t xml:space="preserve"> </w:t>
+            </w:r>
+            <w:r>
+              <w:rPr>
+                <w:rStyle w:val="VerbatimChar"/>
+              </w:rPr>
+              <w:t xml:space="preserve">{ unlinked, uid }</w:t>
+            </w:r>
+            <w:r>
+              <w:t xml:space="preserve"> </w:t>
+            </w:r>
+            <w:r>
+              <w:t xml:space="preserve">if the card isn't linked yet</w:t>
+            </w:r>
+          </w:p>
+        </w:tc>
+      </w:tr>
+      <w:tr>
+        <w:tc>
+          <w:tcPr/>
+          <w:p>
+            <w:pPr>
+              <w:pStyle w:val="Compact"/>
+            </w:pPr>
+            <w:r>
+              <w:t xml:space="preserve">GET</w:t>
+            </w:r>
+          </w:p>
+        </w:tc>
+        <w:tc>
+          <w:tcPr/>
+          <w:p>
+            <w:pPr>
+              <w:pStyle w:val="Compact"/>
+            </w:pPr>
+            <w:r>
+              <w:rPr>
+                <w:rStyle w:val="VerbatimChar"/>
+              </w:rPr>
+              <w:t xml:space="preserve">/api/ppp/members/search?q=</w:t>
+            </w:r>
+          </w:p>
+        </w:tc>
+        <w:tc>
+          <w:tcPr/>
+          <w:p>
+            <w:pPr>
+              <w:pStyle w:val="Compact"/>
+            </w:pPr>
+            <w:r>
+              <w:t xml:space="preserve">Member typeahead for linking an unrecognised card</w:t>
+            </w:r>
+          </w:p>
+        </w:tc>
+      </w:tr>
+      <w:tr>
+        <w:tc>
+          <w:tcPr/>
+          <w:p>
+            <w:pPr>
+              <w:pStyle w:val="Compact"/>
+            </w:pPr>
+            <w:r>
+              <w:t xml:space="preserve">POST</w:t>
+            </w:r>
+          </w:p>
+        </w:tc>
+        <w:tc>
+          <w:tcPr/>
+          <w:p>
+            <w:pPr>
+              <w:pStyle w:val="Compact"/>
+            </w:pPr>
+            <w:r>
+              <w:rPr>
+                <w:rStyle w:val="VerbatimChar"/>
+              </w:rPr>
+              <w:t xml:space="preserve">/api/ppp/card/link</w:t>
+            </w:r>
+          </w:p>
+        </w:tc>
+        <w:tc>
+          <w:tcPr/>
+          <w:p>
+            <w:pPr>
+              <w:pStyle w:val="Compact"/>
+            </w:pPr>
+            <w:r>
+              <w:t xml:space="preserve">Link a scanned card</w:t>
+            </w:r>
+            <w:r>
+              <w:t xml:space="preserve"> </w:t>
+            </w:r>
+            <w:r>
+              <w:rPr>
+                <w:rStyle w:val="VerbatimChar"/>
+              </w:rPr>
+              <w:t xml:space="preserve">{ uid, memberId }</w:t>
+            </w:r>
+            <w:r>
+              <w:t xml:space="preserve"> </w:t>
+            </w:r>
+            <w:r>
+              <w:t xml:space="preserve">→ member (name + roles);</w:t>
+            </w:r>
+            <w:r>
+              <w:t xml:space="preserve"> </w:t>
+            </w:r>
+            <w:r>
+              <w:rPr>
+                <w:rStyle w:val="VerbatimChar"/>
+              </w:rPr>
+              <w:t xml:space="preserve">409</w:t>
+            </w:r>
+            <w:r>
+              <w:t xml:space="preserve"> </w:t>
+            </w:r>
+            <w:r>
+              <w:t xml:space="preserve">if already linked</w:t>
             </w:r>
           </w:p>
         </w:tc>
@@ -27313,8 +27943,8 @@
         <w:t xml:space="preserve">.</w:t>
       </w:r>
     </w:p>
-    <w:bookmarkEnd w:id="151"/>
-    <w:bookmarkStart w:id="152" w:name="environment"/>
+    <w:bookmarkEnd w:id="152"/>
+    <w:bookmarkStart w:id="153" w:name="environment"/>
     <w:p>
       <w:pPr>
         <w:pStyle w:val="Heading2"/>
@@ -27686,9 +28316,9 @@
         <w:br w:type="page"/>
       </w:r>
     </w:p>
-    <w:bookmarkEnd w:id="152"/>
     <w:bookmarkEnd w:id="153"/>
-    <w:bookmarkStart w:id="167" w:name="security-model"/>
+    <w:bookmarkEnd w:id="154"/>
+    <w:bookmarkStart w:id="168" w:name="security-model"/>
     <w:p>
       <w:pPr>
         <w:pStyle w:val="Heading1"/>
@@ -27741,7 +28371,7 @@
         <w:t xml:space="preserve">trade-offs made for a shared, physical kiosk.</w:t>
       </w:r>
     </w:p>
-    <w:bookmarkStart w:id="157" w:name="authentication--authorisation"/>
+    <w:bookmarkStart w:id="158" w:name="authentication--authorisation"/>
     <w:p>
       <w:pPr>
         <w:pStyle w:val="Heading2"/>
@@ -27750,296 +28380,13 @@
         <w:t xml:space="preserve">Authentication &amp; authorisation</w:t>
       </w:r>
     </w:p>
-    <w:bookmarkStart w:id="154" w:name="admin"/>
+    <w:bookmarkStart w:id="155" w:name="admin"/>
     <w:p>
       <w:pPr>
         <w:pStyle w:val="Heading3"/>
       </w:pPr>
       <w:r>
         <w:t xml:space="preserve">Admin</w:t>
-      </w:r>
-    </w:p>
-    <w:p>
-      <w:pPr>
-        <w:pStyle w:val="Compact"/>
-        <w:numPr>
-          <w:ilvl w:val="0"/>
-          <w:numId w:val="1052"/>
-        </w:numPr>
-      </w:pPr>
-      <w:r>
-        <w:t xml:space="preserve">Login (</w:t>
-      </w:r>
-      <w:r>
-        <w:rPr>
-          <w:rStyle w:val="VerbatimChar"/>
-        </w:rPr>
-        <w:t xml:space="preserve">POST /api/auth/login</w:t>
-      </w:r>
-      <w:r>
-        <w:t xml:space="preserve">) verifies a bcrypt password and sets an</w:t>
-      </w:r>
-      <w:r>
-        <w:t xml:space="preserve"> </w:t>
-      </w:r>
-      <w:r>
-        <w:rPr>
-          <w:b/>
-          <w:bCs/>
-        </w:rPr>
-        <w:t xml:space="preserve">httpOnly</w:t>
-      </w:r>
-      <w:r>
-        <w:t xml:space="preserve"> </w:t>
-      </w:r>
-      <w:r>
-        <w:rPr>
-          <w:rStyle w:val="VerbatimChar"/>
-        </w:rPr>
-        <w:t xml:space="preserve">session</w:t>
-      </w:r>
-      <w:r>
-        <w:t xml:space="preserve"> </w:t>
-      </w:r>
-      <w:r>
-        <w:t xml:space="preserve">cookie (7-day</w:t>
-      </w:r>
-      <w:r>
-        <w:t xml:space="preserve"> </w:t>
-      </w:r>
-      <w:r>
-        <w:rPr>
-          <w:rStyle w:val="VerbatimChar"/>
-        </w:rPr>
-        <w:t xml:space="preserve">Session</w:t>
-      </w:r>
-      <w:r>
-        <w:t xml:space="preserve"> </w:t>
-      </w:r>
-      <w:r>
-        <w:t xml:space="preserve">row).</w:t>
-      </w:r>
-    </w:p>
-    <w:p>
-      <w:pPr>
-        <w:pStyle w:val="Compact"/>
-        <w:numPr>
-          <w:ilvl w:val="0"/>
-          <w:numId w:val="1052"/>
-        </w:numPr>
-      </w:pPr>
-      <w:r>
-        <w:rPr>
-          <w:rStyle w:val="VerbatimChar"/>
-        </w:rPr>
-        <w:t xml:space="preserve">requireAdmin()</w:t>
-      </w:r>
-      <w:r>
-        <w:t xml:space="preserve"> </w:t>
-      </w:r>
-      <w:r>
-        <w:t xml:space="preserve">(</w:t>
-      </w:r>
-      <w:r>
-        <w:rPr>
-          <w:rStyle w:val="VerbatimChar"/>
-        </w:rPr>
-        <w:t xml:space="preserve">src/lib/auth.ts</w:t>
-      </w:r>
-      <w:r>
-        <w:t xml:space="preserve">) loads the session, checks it isn't expired,</w:t>
-      </w:r>
-      <w:r>
-        <w:t xml:space="preserve"> </w:t>
-      </w:r>
-      <w:r>
-        <w:t xml:space="preserve">and checks</w:t>
-      </w:r>
-      <w:r>
-        <w:t xml:space="preserve"> </w:t>
-      </w:r>
-      <w:r>
-        <w:rPr>
-          <w:rStyle w:val="VerbatimChar"/>
-        </w:rPr>
-        <w:t xml:space="preserve">role === "ADMIN"</w:t>
-      </w:r>
-      <w:r>
-        <w:t xml:space="preserve">.</w:t>
-      </w:r>
-      <w:r>
-        <w:t xml:space="preserve"> </w:t>
-      </w:r>
-      <w:r>
-        <w:rPr>
-          <w:b/>
-          <w:bCs/>
-        </w:rPr>
-        <w:t xml:space="preserve">Every</w:t>
-      </w:r>
-      <w:r>
-        <w:t xml:space="preserve"> </w:t>
-      </w:r>
-      <w:r>
-        <w:rPr>
-          <w:rStyle w:val="VerbatimChar"/>
-        </w:rPr>
-        <w:t xml:space="preserve">/api/admin/*</w:t>
-      </w:r>
-      <w:r>
-        <w:t xml:space="preserve"> </w:t>
-      </w:r>
-      <w:r>
-        <w:t xml:space="preserve">handler calls it.</w:t>
-      </w:r>
-    </w:p>
-    <w:p>
-      <w:pPr>
-        <w:pStyle w:val="Compact"/>
-        <w:numPr>
-          <w:ilvl w:val="0"/>
-          <w:numId w:val="1052"/>
-        </w:numPr>
-      </w:pPr>
-      <w:r>
-        <w:t xml:space="preserve">The admin pages are gated by a</w:t>
-      </w:r>
-      <w:r>
-        <w:t xml:space="preserve"> </w:t>
-      </w:r>
-      <w:r>
-        <w:rPr>
-          <w:b/>
-          <w:bCs/>
-        </w:rPr>
-        <w:t xml:space="preserve">server-side layout</w:t>
-      </w:r>
-      <w:r>
-        <w:t xml:space="preserve"> </w:t>
-      </w:r>
-      <w:r>
-        <w:t xml:space="preserve">(</w:t>
-      </w:r>
-      <w:r>
-        <w:rPr>
-          <w:rStyle w:val="VerbatimChar"/>
-        </w:rPr>
-        <w:t xml:space="preserve">requireAdmin()</w:t>
-      </w:r>
-      <w:r>
-        <w:t xml:space="preserve"> </w:t>
-      </w:r>
-      <w:r>
-        <w:t xml:space="preserve">→</w:t>
-      </w:r>
-      <w:r>
-        <w:t xml:space="preserve"> </w:t>
-      </w:r>
-      <w:r>
-        <w:rPr>
-          <w:rStyle w:val="VerbatimChar"/>
-        </w:rPr>
-        <w:t xml:space="preserve">redirect("/admin/login")</w:t>
-      </w:r>
-      <w:r>
-        <w:t xml:space="preserve">), so unauthenticated users never receive page HTML</w:t>
-      </w:r>
-      <w:r>
-        <w:t xml:space="preserve"> </w:t>
-      </w:r>
-      <w:r>
-        <w:t xml:space="preserve">or data — only a redirect.</w:t>
-      </w:r>
-    </w:p>
-    <w:p>
-      <w:pPr>
-        <w:pStyle w:val="Compact"/>
-        <w:numPr>
-          <w:ilvl w:val="0"/>
-          <w:numId w:val="1052"/>
-        </w:numPr>
-      </w:pPr>
-      <w:r>
-        <w:t xml:space="preserve">Middleware (</w:t>
-      </w:r>
-      <w:r>
-        <w:rPr>
-          <w:rStyle w:val="VerbatimChar"/>
-        </w:rPr>
-        <w:t xml:space="preserve">src/middleware.ts</w:t>
-      </w:r>
-      <w:r>
-        <w:t xml:space="preserve">) additionally requires the cookie to be present</w:t>
-      </w:r>
-      <w:r>
-        <w:t xml:space="preserve"> </w:t>
-      </w:r>
-      <w:r>
-        <w:t xml:space="preserve">on</w:t>
-      </w:r>
-      <w:r>
-        <w:t xml:space="preserve"> </w:t>
-      </w:r>
-      <w:r>
-        <w:rPr>
-          <w:rStyle w:val="VerbatimChar"/>
-        </w:rPr>
-        <w:t xml:space="preserve">/admin/*</w:t>
-      </w:r>
-      <w:r>
-        <w:t xml:space="preserve"> </w:t>
-      </w:r>
-      <w:r>
-        <w:t xml:space="preserve">and</w:t>
-      </w:r>
-      <w:r>
-        <w:t xml:space="preserve"> </w:t>
-      </w:r>
-      <w:r>
-        <w:rPr>
-          <w:rStyle w:val="VerbatimChar"/>
-        </w:rPr>
-        <w:t xml:space="preserve">/api/admin/*</w:t>
-      </w:r>
-      <w:r>
-        <w:t xml:space="preserve">. This is a fast pre-check; the real validation</w:t>
-      </w:r>
-      <w:r>
-        <w:t xml:space="preserve"> </w:t>
-      </w:r>
-      <w:r>
-        <w:t xml:space="preserve">is</w:t>
-      </w:r>
-      <w:r>
-        <w:t xml:space="preserve"> </w:t>
-      </w:r>
-      <w:r>
-        <w:rPr>
-          <w:rStyle w:val="VerbatimChar"/>
-        </w:rPr>
-        <w:t xml:space="preserve">requireAdmin()</w:t>
-      </w:r>
-      <w:r>
-        <w:t xml:space="preserve"> </w:t>
-      </w:r>
-      <w:r>
-        <w:t xml:space="preserve">(a forged/expired cookie passes middleware but is rejected</w:t>
-      </w:r>
-      <w:r>
-        <w:t xml:space="preserve"> </w:t>
-      </w:r>
-      <w:r>
-        <w:t xml:space="preserve">by the handler).</w:t>
-      </w:r>
-    </w:p>
-    <w:bookmarkEnd w:id="154"/>
-    <w:bookmarkStart w:id="155" w:name="shop-members"/>
-    <w:p>
-      <w:pPr>
-        <w:pStyle w:val="Heading3"/>
-      </w:pPr>
-      <w:r>
-        <w:t xml:space="preserve">Shop (members)</w:t>
       </w:r>
     </w:p>
     <w:p>
@@ -28051,66 +28398,56 @@
         </w:numPr>
       </w:pPr>
       <w:r>
-        <w:t xml:space="preserve">A</w:t>
-      </w:r>
-      <w:r>
-        <w:t xml:space="preserve"> </w:t>
-      </w:r>
-      <w:r>
-        <w:rPr>
-          <w:rStyle w:val="VerbatimChar"/>
-        </w:rPr>
-        <w:t xml:space="preserve">ShopSession</w:t>
-      </w:r>
-      <w:r>
-        <w:t xml:space="preserve"> </w:t>
-      </w:r>
-      <w:r>
-        <w:t xml:space="preserve">token (random cuid) is created only by a</w:t>
-      </w:r>
-      <w:r>
-        <w:t xml:space="preserve"> </w:t>
-      </w:r>
-      <w:r>
-        <w:rPr>
-          <w:b/>
-          <w:bCs/>
-        </w:rPr>
-        <w:t xml:space="preserve">physical card tap</w:t>
-      </w:r>
-      <w:r>
-        <w:t xml:space="preserve"> </w:t>
-      </w:r>
-      <w:r>
-        <w:t xml:space="preserve">or an admin's</w:t>
-      </w:r>
-      <w:r>
-        <w:t xml:space="preserve"> </w:t>
-      </w:r>
-      <w:r>
-        <w:rPr>
-          <w:b/>
-          <w:bCs/>
-        </w:rPr>
-        <w:t xml:space="preserve">Enter store</w:t>
-      </w:r>
-      <w:r>
-        <w:t xml:space="preserve">. It lives in the</w:t>
-      </w:r>
-      <w:r>
-        <w:t xml:space="preserve"> </w:t>
-      </w:r>
-      <w:r>
-        <w:rPr>
-          <w:rStyle w:val="VerbatimChar"/>
-        </w:rPr>
-        <w:t xml:space="preserve">/shop/&lt;token&gt;</w:t>
-      </w:r>
-      <w:r>
-        <w:t xml:space="preserve"> </w:t>
-      </w:r>
-      <w:r>
-        <w:t xml:space="preserve">URL.</w:t>
+        <w:t xml:space="preserve">Login (</w:t>
+      </w:r>
+      <w:r>
+        <w:rPr>
+          <w:rStyle w:val="VerbatimChar"/>
+        </w:rPr>
+        <w:t xml:space="preserve">POST /api/auth/login</w:t>
+      </w:r>
+      <w:r>
+        <w:t xml:space="preserve">) verifies a bcrypt password and sets an</w:t>
+      </w:r>
+      <w:r>
+        <w:t xml:space="preserve"> </w:t>
+      </w:r>
+      <w:r>
+        <w:rPr>
+          <w:b/>
+          <w:bCs/>
+        </w:rPr>
+        <w:t xml:space="preserve">httpOnly</w:t>
+      </w:r>
+      <w:r>
+        <w:t xml:space="preserve"> </w:t>
+      </w:r>
+      <w:r>
+        <w:rPr>
+          <w:rStyle w:val="VerbatimChar"/>
+        </w:rPr>
+        <w:t xml:space="preserve">session</w:t>
+      </w:r>
+      <w:r>
+        <w:t xml:space="preserve"> </w:t>
+      </w:r>
+      <w:r>
+        <w:t xml:space="preserve">cookie (7-day</w:t>
+      </w:r>
+      <w:r>
+        <w:t xml:space="preserve"> </w:t>
+      </w:r>
+      <w:r>
+        <w:rPr>
+          <w:rStyle w:val="VerbatimChar"/>
+        </w:rPr>
+        <w:t xml:space="preserve">Session</w:t>
+      </w:r>
+      <w:r>
+        <w:t xml:space="preserve"> </w:t>
+      </w:r>
+      <w:r>
+        <w:t xml:space="preserve">row).</w:t>
       </w:r>
     </w:p>
     <w:p>
@@ -28125,28 +28462,65 @@
         <w:rPr>
           <w:rStyle w:val="VerbatimChar"/>
         </w:rPr>
-        <w:t xml:space="preserve">/api/cart</w:t>
-      </w:r>
-      <w:r>
-        <w:t xml:space="preserve"> </w:t>
-      </w:r>
-      <w:r>
-        <w:t xml:space="preserve">and</w:t>
-      </w:r>
-      <w:r>
-        <w:t xml:space="preserve"> </w:t>
-      </w:r>
-      <w:r>
-        <w:rPr>
-          <w:rStyle w:val="VerbatimChar"/>
-        </w:rPr>
-        <w:t xml:space="preserve">/api/orders/confirm</w:t>
-      </w:r>
-      <w:r>
-        <w:t xml:space="preserve"> </w:t>
-      </w:r>
-      <w:r>
-        <w:t xml:space="preserve">require a valid, unexpired token.</w:t>
+        <w:t xml:space="preserve">requireAdmin()</w:t>
+      </w:r>
+      <w:r>
+        <w:t xml:space="preserve"> </w:t>
+      </w:r>
+      <w:r>
+        <w:t xml:space="preserve">(</w:t>
+      </w:r>
+      <w:r>
+        <w:rPr>
+          <w:rStyle w:val="VerbatimChar"/>
+        </w:rPr>
+        <w:t xml:space="preserve">src/lib/auth.ts</w:t>
+      </w:r>
+      <w:r>
+        <w:t xml:space="preserve">) loads the session, checks it isn't expired,</w:t>
+      </w:r>
+      <w:r>
+        <w:t xml:space="preserve"> </w:t>
+      </w:r>
+      <w:r>
+        <w:t xml:space="preserve">and checks</w:t>
+      </w:r>
+      <w:r>
+        <w:t xml:space="preserve"> </w:t>
+      </w:r>
+      <w:r>
+        <w:rPr>
+          <w:rStyle w:val="VerbatimChar"/>
+        </w:rPr>
+        <w:t xml:space="preserve">role === "ADMIN"</w:t>
+      </w:r>
+      <w:r>
+        <w:t xml:space="preserve">.</w:t>
+      </w:r>
+      <w:r>
+        <w:t xml:space="preserve"> </w:t>
+      </w:r>
+      <w:r>
+        <w:rPr>
+          <w:b/>
+          <w:bCs/>
+        </w:rPr>
+        <w:t xml:space="preserve">Every</w:t>
+      </w:r>
+      <w:r>
+        <w:t xml:space="preserve"> </w:t>
+      </w:r>
+      <w:r>
+        <w:rPr>
+          <w:rStyle w:val="VerbatimChar"/>
+        </w:rPr>
+        <w:t xml:space="preserve">/api/admin/*</w:t>
+      </w:r>
+      <w:r>
+        <w:t xml:space="preserve"> </w:t>
+      </w:r>
+      <w:r>
+        <w:t xml:space="preserve">handler calls it.</w:t>
       </w:r>
     </w:p>
     <w:p>
@@ -28158,29 +28532,53 @@
         </w:numPr>
       </w:pPr>
       <w:r>
-        <w:t xml:space="preserve">The member's first name is returned</w:t>
-      </w:r>
-      <w:r>
-        <w:t xml:space="preserve"> </w:t>
-      </w:r>
-      <w:r>
-        <w:rPr>
-          <w:b/>
-          <w:bCs/>
-        </w:rPr>
-        <w:t xml:space="preserve">only</w:t>
-      </w:r>
-      <w:r>
-        <w:t xml:space="preserve"> </w:t>
-      </w:r>
-      <w:r>
-        <w:t xml:space="preserve">by the token-scoped cart endpoint —</w:t>
-      </w:r>
-      <w:r>
-        <w:t xml:space="preserve"> </w:t>
-      </w:r>
-      <w:r>
-        <w:t xml:space="preserve">never by the public scan endpoint.</w:t>
+        <w:t xml:space="preserve">The admin pages are gated by a</w:t>
+      </w:r>
+      <w:r>
+        <w:t xml:space="preserve"> </w:t>
+      </w:r>
+      <w:r>
+        <w:rPr>
+          <w:b/>
+          <w:bCs/>
+        </w:rPr>
+        <w:t xml:space="preserve">server-side layout</w:t>
+      </w:r>
+      <w:r>
+        <w:t xml:space="preserve"> </w:t>
+      </w:r>
+      <w:r>
+        <w:t xml:space="preserve">(</w:t>
+      </w:r>
+      <w:r>
+        <w:rPr>
+          <w:rStyle w:val="VerbatimChar"/>
+        </w:rPr>
+        <w:t xml:space="preserve">requireAdmin()</w:t>
+      </w:r>
+      <w:r>
+        <w:t xml:space="preserve"> </w:t>
+      </w:r>
+      <w:r>
+        <w:t xml:space="preserve">→</w:t>
+      </w:r>
+      <w:r>
+        <w:t xml:space="preserve"> </w:t>
+      </w:r>
+      <w:r>
+        <w:rPr>
+          <w:rStyle w:val="VerbatimChar"/>
+        </w:rPr>
+        <w:t xml:space="preserve">redirect("/admin/login")</w:t>
+      </w:r>
+      <w:r>
+        <w:t xml:space="preserve">), so unauthenticated users never receive page HTML</w:t>
+      </w:r>
+      <w:r>
+        <w:t xml:space="preserve"> </w:t>
+      </w:r>
+      <w:r>
+        <w:t xml:space="preserve">or data — only a redirect.</w:t>
       </w:r>
     </w:p>
     <w:p>
@@ -28192,39 +28590,86 @@
         </w:numPr>
       </w:pPr>
       <w:r>
-        <w:rPr>
-          <w:b/>
-          <w:bCs/>
-        </w:rPr>
-        <w:t xml:space="preserve">Idle auto-reset:</w:t>
-      </w:r>
-      <w:r>
-        <w:t xml:space="preserve"> </w:t>
-      </w:r>
-      <w:r>
-        <w:t xml:space="preserve">the shop page deletes the session and returns to the tap</w:t>
-      </w:r>
-      <w:r>
-        <w:t xml:space="preserve"> </w:t>
-      </w:r>
-      <w:r>
-        <w:t xml:space="preserve">screen after ~60 s of inactivity (with a 15 s warning), so a member who walks</w:t>
-      </w:r>
-      <w:r>
-        <w:t xml:space="preserve"> </w:t>
-      </w:r>
-      <w:r>
-        <w:t xml:space="preserve">away can't leave their account open for the next person.</w:t>
+        <w:t xml:space="preserve">Middleware (</w:t>
+      </w:r>
+      <w:r>
+        <w:rPr>
+          <w:rStyle w:val="VerbatimChar"/>
+        </w:rPr>
+        <w:t xml:space="preserve">src/middleware.ts</w:t>
+      </w:r>
+      <w:r>
+        <w:t xml:space="preserve">) additionally requires the cookie to be present</w:t>
+      </w:r>
+      <w:r>
+        <w:t xml:space="preserve"> </w:t>
+      </w:r>
+      <w:r>
+        <w:t xml:space="preserve">on</w:t>
+      </w:r>
+      <w:r>
+        <w:t xml:space="preserve"> </w:t>
+      </w:r>
+      <w:r>
+        <w:rPr>
+          <w:rStyle w:val="VerbatimChar"/>
+        </w:rPr>
+        <w:t xml:space="preserve">/admin/*</w:t>
+      </w:r>
+      <w:r>
+        <w:t xml:space="preserve"> </w:t>
+      </w:r>
+      <w:r>
+        <w:t xml:space="preserve">and</w:t>
+      </w:r>
+      <w:r>
+        <w:t xml:space="preserve"> </w:t>
+      </w:r>
+      <w:r>
+        <w:rPr>
+          <w:rStyle w:val="VerbatimChar"/>
+        </w:rPr>
+        <w:t xml:space="preserve">/api/admin/*</w:t>
+      </w:r>
+      <w:r>
+        <w:t xml:space="preserve">. This is a fast pre-check; the real validation</w:t>
+      </w:r>
+      <w:r>
+        <w:t xml:space="preserve"> </w:t>
+      </w:r>
+      <w:r>
+        <w:t xml:space="preserve">is</w:t>
+      </w:r>
+      <w:r>
+        <w:t xml:space="preserve"> </w:t>
+      </w:r>
+      <w:r>
+        <w:rPr>
+          <w:rStyle w:val="VerbatimChar"/>
+        </w:rPr>
+        <w:t xml:space="preserve">requireAdmin()</w:t>
+      </w:r>
+      <w:r>
+        <w:t xml:space="preserve"> </w:t>
+      </w:r>
+      <w:r>
+        <w:t xml:space="preserve">(a forged/expired cookie passes middleware but is rejected</w:t>
+      </w:r>
+      <w:r>
+        <w:t xml:space="preserve"> </w:t>
+      </w:r>
+      <w:r>
+        <w:t xml:space="preserve">by the handler).</w:t>
       </w:r>
     </w:p>
     <w:bookmarkEnd w:id="155"/>
-    <w:bookmarkStart w:id="156" w:name="card-verification"/>
+    <w:bookmarkStart w:id="156" w:name="shop-members"/>
     <w:p>
       <w:pPr>
         <w:pStyle w:val="Heading3"/>
       </w:pPr>
       <w:r>
-        <w:t xml:space="preserve">Card verification</w:t>
+        <w:t xml:space="preserve">Shop (members)</w:t>
       </w:r>
     </w:p>
     <w:p>
@@ -28236,16 +28681,66 @@
         </w:numPr>
       </w:pPr>
       <w:r>
-        <w:rPr>
-          <w:rStyle w:val="VerbatimChar"/>
-        </w:rPr>
-        <w:t xml:space="preserve">CardRegistration</w:t>
-      </w:r>
-      <w:r>
-        <w:t xml:space="preserve"> </w:t>
-      </w:r>
-      <w:r>
-        <w:t xml:space="preserve">tokens are single-use and expire in 15 minutes.</w:t>
+        <w:t xml:space="preserve">A</w:t>
+      </w:r>
+      <w:r>
+        <w:t xml:space="preserve"> </w:t>
+      </w:r>
+      <w:r>
+        <w:rPr>
+          <w:rStyle w:val="VerbatimChar"/>
+        </w:rPr>
+        <w:t xml:space="preserve">ShopSession</w:t>
+      </w:r>
+      <w:r>
+        <w:t xml:space="preserve"> </w:t>
+      </w:r>
+      <w:r>
+        <w:t xml:space="preserve">token (random cuid) is created only by a</w:t>
+      </w:r>
+      <w:r>
+        <w:t xml:space="preserve"> </w:t>
+      </w:r>
+      <w:r>
+        <w:rPr>
+          <w:b/>
+          <w:bCs/>
+        </w:rPr>
+        <w:t xml:space="preserve">physical card tap</w:t>
+      </w:r>
+      <w:r>
+        <w:t xml:space="preserve"> </w:t>
+      </w:r>
+      <w:r>
+        <w:t xml:space="preserve">or an admin's</w:t>
+      </w:r>
+      <w:r>
+        <w:t xml:space="preserve"> </w:t>
+      </w:r>
+      <w:r>
+        <w:rPr>
+          <w:b/>
+          <w:bCs/>
+        </w:rPr>
+        <w:t xml:space="preserve">Enter store</w:t>
+      </w:r>
+      <w:r>
+        <w:t xml:space="preserve">. It lives in the</w:t>
+      </w:r>
+      <w:r>
+        <w:t xml:space="preserve"> </w:t>
+      </w:r>
+      <w:r>
+        <w:rPr>
+          <w:rStyle w:val="VerbatimChar"/>
+        </w:rPr>
+        <w:t xml:space="preserve">/shop/&lt;token&gt;</w:t>
+      </w:r>
+      <w:r>
+        <w:t xml:space="preserve"> </w:t>
+      </w:r>
+      <w:r>
+        <w:t xml:space="preserve">URL.</w:t>
       </w:r>
     </w:p>
     <w:p>
@@ -28258,6 +28753,141 @@
       </w:pPr>
       <w:r>
         <w:rPr>
+          <w:rStyle w:val="VerbatimChar"/>
+        </w:rPr>
+        <w:t xml:space="preserve">/api/cart</w:t>
+      </w:r>
+      <w:r>
+        <w:t xml:space="preserve"> </w:t>
+      </w:r>
+      <w:r>
+        <w:t xml:space="preserve">and</w:t>
+      </w:r>
+      <w:r>
+        <w:t xml:space="preserve"> </w:t>
+      </w:r>
+      <w:r>
+        <w:rPr>
+          <w:rStyle w:val="VerbatimChar"/>
+        </w:rPr>
+        <w:t xml:space="preserve">/api/orders/confirm</w:t>
+      </w:r>
+      <w:r>
+        <w:t xml:space="preserve"> </w:t>
+      </w:r>
+      <w:r>
+        <w:t xml:space="preserve">require a valid, unexpired token.</w:t>
+      </w:r>
+    </w:p>
+    <w:p>
+      <w:pPr>
+        <w:pStyle w:val="Compact"/>
+        <w:numPr>
+          <w:ilvl w:val="0"/>
+          <w:numId w:val="1054"/>
+        </w:numPr>
+      </w:pPr>
+      <w:r>
+        <w:t xml:space="preserve">The member's first name is returned</w:t>
+      </w:r>
+      <w:r>
+        <w:t xml:space="preserve"> </w:t>
+      </w:r>
+      <w:r>
+        <w:rPr>
+          <w:b/>
+          <w:bCs/>
+        </w:rPr>
+        <w:t xml:space="preserve">only</w:t>
+      </w:r>
+      <w:r>
+        <w:t xml:space="preserve"> </w:t>
+      </w:r>
+      <w:r>
+        <w:t xml:space="preserve">by the token-scoped cart endpoint —</w:t>
+      </w:r>
+      <w:r>
+        <w:t xml:space="preserve"> </w:t>
+      </w:r>
+      <w:r>
+        <w:t xml:space="preserve">never by the public scan endpoint.</w:t>
+      </w:r>
+    </w:p>
+    <w:p>
+      <w:pPr>
+        <w:pStyle w:val="Compact"/>
+        <w:numPr>
+          <w:ilvl w:val="0"/>
+          <w:numId w:val="1054"/>
+        </w:numPr>
+      </w:pPr>
+      <w:r>
+        <w:rPr>
+          <w:b/>
+          <w:bCs/>
+        </w:rPr>
+        <w:t xml:space="preserve">Idle auto-reset:</w:t>
+      </w:r>
+      <w:r>
+        <w:t xml:space="preserve"> </w:t>
+      </w:r>
+      <w:r>
+        <w:t xml:space="preserve">the shop page deletes the session and returns to the tap</w:t>
+      </w:r>
+      <w:r>
+        <w:t xml:space="preserve"> </w:t>
+      </w:r>
+      <w:r>
+        <w:t xml:space="preserve">screen after ~60 s of inactivity (with a 15 s warning), so a member who walks</w:t>
+      </w:r>
+      <w:r>
+        <w:t xml:space="preserve"> </w:t>
+      </w:r>
+      <w:r>
+        <w:t xml:space="preserve">away can't leave their account open for the next person.</w:t>
+      </w:r>
+    </w:p>
+    <w:bookmarkEnd w:id="156"/>
+    <w:bookmarkStart w:id="157" w:name="card-verification"/>
+    <w:p>
+      <w:pPr>
+        <w:pStyle w:val="Heading3"/>
+      </w:pPr>
+      <w:r>
+        <w:t xml:space="preserve">Card verification</w:t>
+      </w:r>
+    </w:p>
+    <w:p>
+      <w:pPr>
+        <w:pStyle w:val="Compact"/>
+        <w:numPr>
+          <w:ilvl w:val="0"/>
+          <w:numId w:val="1055"/>
+        </w:numPr>
+      </w:pPr>
+      <w:r>
+        <w:rPr>
+          <w:rStyle w:val="VerbatimChar"/>
+        </w:rPr>
+        <w:t xml:space="preserve">CardRegistration</w:t>
+      </w:r>
+      <w:r>
+        <w:t xml:space="preserve"> </w:t>
+      </w:r>
+      <w:r>
+        <w:t xml:space="preserve">tokens are single-use and expire in 15 minutes.</w:t>
+      </w:r>
+    </w:p>
+    <w:p>
+      <w:pPr>
+        <w:pStyle w:val="Compact"/>
+        <w:numPr>
+          <w:ilvl w:val="0"/>
+          <w:numId w:val="1055"/>
+        </w:numPr>
+      </w:pPr>
+      <w:r>
+        <w:rPr>
           <w:b/>
           <w:bCs/>
         </w:rPr>
@@ -28304,9 +28934,9 @@
         <w:t xml:space="preserve">member clicked.</w:t>
       </w:r>
     </w:p>
-    <w:bookmarkEnd w:id="156"/>
     <w:bookmarkEnd w:id="157"/>
-    <w:bookmarkStart w:id="158" w:name="X77f42a2852d9dd86410b0545fad3e0fbb180833"/>
+    <w:bookmarkEnd w:id="158"/>
+    <w:bookmarkStart w:id="159" w:name="X77f42a2852d9dd86410b0545fad3e0fbb180833"/>
     <w:p>
       <w:pPr>
         <w:pStyle w:val="Heading2"/>
@@ -28520,8 +29150,8 @@
         </w:tc>
       </w:tr>
     </w:tbl>
-    <w:bookmarkEnd w:id="158"/>
-    <w:bookmarkStart w:id="159" w:name="rate-limiting"/>
+    <w:bookmarkEnd w:id="159"/>
+    <w:bookmarkStart w:id="160" w:name="rate-limiting"/>
     <w:p>
       <w:pPr>
         <w:pStyle w:val="Heading2"/>
@@ -28616,330 +29246,14 @@
         <w:t xml:space="preserve">a shared store (e.g. Redis).</w:t>
       </w:r>
     </w:p>
-    <w:bookmarkEnd w:id="159"/>
-    <w:bookmarkStart w:id="160" w:name="injection--output-safety"/>
+    <w:bookmarkEnd w:id="160"/>
+    <w:bookmarkStart w:id="161" w:name="injection--output-safety"/>
     <w:p>
       <w:pPr>
         <w:pStyle w:val="Heading2"/>
       </w:pPr>
       <w:r>
         <w:t xml:space="preserve">Injection &amp; output safety</w:t>
-      </w:r>
-    </w:p>
-    <w:p>
-      <w:pPr>
-        <w:pStyle w:val="Compact"/>
-        <w:numPr>
-          <w:ilvl w:val="0"/>
-          <w:numId w:val="1055"/>
-        </w:numPr>
-      </w:pPr>
-      <w:r>
-        <w:t xml:space="preserve">React escapes all interpolated values in the kiosk/shop/admin pages.</w:t>
-      </w:r>
-    </w:p>
-    <w:p>
-      <w:pPr>
-        <w:pStyle w:val="Compact"/>
-        <w:numPr>
-          <w:ilvl w:val="0"/>
-          <w:numId w:val="1055"/>
-        </w:numPr>
-      </w:pPr>
-      <w:r>
-        <w:t xml:space="preserve">The card-verify pages are</w:t>
-      </w:r>
-      <w:r>
-        <w:t xml:space="preserve"> </w:t>
-      </w:r>
-      <w:r>
-        <w:rPr>
-          <w:b/>
-          <w:bCs/>
-        </w:rPr>
-        <w:t xml:space="preserve">hand-built HTML</w:t>
-      </w:r>
-      <w:r>
-        <w:t xml:space="preserve">, so member names and tokens are</w:t>
-      </w:r>
-      <w:r>
-        <w:t xml:space="preserve"> </w:t>
-      </w:r>
-      <w:r>
-        <w:t xml:space="preserve">passed through</w:t>
-      </w:r>
-      <w:r>
-        <w:t xml:space="preserve"> </w:t>
-      </w:r>
-      <w:r>
-        <w:rPr>
-          <w:rStyle w:val="VerbatimChar"/>
-        </w:rPr>
-        <w:t xml:space="preserve">escapeHtml()</w:t>
-      </w:r>
-      <w:r>
-        <w:t xml:space="preserve"> </w:t>
-      </w:r>
-      <w:r>
-        <w:t xml:space="preserve">before interpolation (prevents stored XSS from a</w:t>
-      </w:r>
-      <w:r>
-        <w:t xml:space="preserve"> </w:t>
-      </w:r>
-      <w:r>
-        <w:t xml:space="preserve">name synced out of Congressus).</w:t>
-      </w:r>
-    </w:p>
-    <w:p>
-      <w:pPr>
-        <w:pStyle w:val="Compact"/>
-        <w:numPr>
-          <w:ilvl w:val="0"/>
-          <w:numId w:val="1055"/>
-        </w:numPr>
-      </w:pPr>
-      <w:r>
-        <w:t xml:space="preserve">Those pages declare</w:t>
-      </w:r>
-      <w:r>
-        <w:t xml:space="preserve"> </w:t>
-      </w:r>
-      <w:r>
-        <w:rPr>
-          <w:rStyle w:val="VerbatimChar"/>
-        </w:rPr>
-        <w:t xml:space="preserve">charset=utf-8</w:t>
-      </w:r>
-      <w:r>
-        <w:t xml:space="preserve"> </w:t>
-      </w:r>
-      <w:r>
-        <w:t xml:space="preserve">(header + meta) so emoji/diacritics render</w:t>
-      </w:r>
-      <w:r>
-        <w:t xml:space="preserve"> </w:t>
-      </w:r>
-      <w:r>
-        <w:t xml:space="preserve">correctly.</w:t>
-      </w:r>
-    </w:p>
-    <w:bookmarkEnd w:id="160"/>
-    <w:bookmarkStart w:id="164" w:name="deliberate-trade-offs"/>
-    <w:p>
-      <w:pPr>
-        <w:pStyle w:val="Heading2"/>
-      </w:pPr>
-      <w:r>
-        <w:t xml:space="preserve">Deliberate trade-offs</w:t>
-      </w:r>
-    </w:p>
-    <w:bookmarkStart w:id="161" w:name="card-uids-arent-secret"/>
-    <w:p>
-      <w:pPr>
-        <w:pStyle w:val="Heading3"/>
-      </w:pPr>
-      <w:r>
-        <w:t xml:space="preserve">Card UIDs aren't secret</w:t>
-      </w:r>
-    </w:p>
-    <w:p>
-      <w:pPr>
-        <w:pStyle w:val="FirstParagraph"/>
-      </w:pPr>
-      <w:r>
-        <w:t xml:space="preserve">Any NFC reader can read a card UID, and the scan endpoint is necessarily</w:t>
-      </w:r>
-      <w:r>
-        <w:t xml:space="preserve"> </w:t>
-      </w:r>
-      <w:r>
-        <w:t xml:space="preserve">unauthenticated (the kiosk is a public web page). Mitigations: the scan endpoint</w:t>
-      </w:r>
-      <w:r>
-        <w:t xml:space="preserve"> </w:t>
-      </w:r>
-      <w:r>
-        <w:t xml:space="preserve">returns no member data and is rate-limited. For stronger protection, restrict</w:t>
-      </w:r>
-      <w:r>
-        <w:t xml:space="preserve"> </w:t>
-      </w:r>
-      <w:r>
-        <w:rPr>
-          <w:rStyle w:val="VerbatimChar"/>
-        </w:rPr>
-        <w:t xml:space="preserve">/api/card/scan</w:t>
-      </w:r>
-      <w:r>
-        <w:t xml:space="preserve"> </w:t>
-      </w:r>
-      <w:r>
-        <w:t xml:space="preserve">to the kiosk's IP at the network layer.</w:t>
-      </w:r>
-    </w:p>
-    <w:bookmarkEnd w:id="161"/>
-    <w:bookmarkStart w:id="162" w:name="email-not-found-vs-enumeration"/>
-    <w:p>
-      <w:pPr>
-        <w:pStyle w:val="Heading3"/>
-      </w:pPr>
-      <w:r>
-        <w:t xml:space="preserve">"Email not found" vs enumeration</w:t>
-      </w:r>
-    </w:p>
-    <w:p>
-      <w:pPr>
-        <w:pStyle w:val="FirstParagraph"/>
-      </w:pPr>
-      <w:r>
-        <w:t xml:space="preserve">The card-registration flow tells a user when their email matches no member</w:t>
-      </w:r>
-      <w:r>
-        <w:t xml:space="preserve"> </w:t>
-      </w:r>
-      <w:r>
-        <w:t xml:space="preserve">("Email not found"). This</w:t>
-      </w:r>
-      <w:r>
-        <w:t xml:space="preserve"> </w:t>
-      </w:r>
-      <w:r>
-        <w:rPr>
-          <w:b/>
-          <w:bCs/>
-        </w:rPr>
-        <w:t xml:space="preserve">re-introduces some email-enumeration ability</w:t>
-      </w:r>
-      <w:r>
-        <w:t xml:space="preserve"> </w:t>
-      </w:r>
-      <w:r>
-        <w:t xml:space="preserve">that a</w:t>
-      </w:r>
-      <w:r>
-        <w:t xml:space="preserve"> </w:t>
-      </w:r>
-      <w:r>
-        <w:t xml:space="preserve">uniform response would prevent. It was a conscious product choice: confused</w:t>
-      </w:r>
-      <w:r>
-        <w:t xml:space="preserve"> </w:t>
-      </w:r>
-      <w:r>
-        <w:t xml:space="preserve">members not knowing why nothing happened is a real problem at a kiosk, the kiosk</w:t>
-      </w:r>
-      <w:r>
-        <w:t xml:space="preserve"> </w:t>
-      </w:r>
-      <w:r>
-        <w:t xml:space="preserve">is physical, and the endpoint is rate-limited. If enumeration resistance becomes</w:t>
-      </w:r>
-      <w:r>
-        <w:t xml:space="preserve"> </w:t>
-      </w:r>
-      <w:r>
-        <w:t xml:space="preserve">more important than this UX, revert</w:t>
-      </w:r>
-      <w:r>
-        <w:t xml:space="preserve"> </w:t>
-      </w:r>
-      <w:r>
-        <w:rPr>
-          <w:rStyle w:val="VerbatimChar"/>
-        </w:rPr>
-        <w:t xml:space="preserve">card/register</w:t>
-      </w:r>
-      <w:r>
-        <w:t xml:space="preserve"> </w:t>
-      </w:r>
-      <w:r>
-        <w:t xml:space="preserve">to a uniform</w:t>
-      </w:r>
-      <w:r>
-        <w:t xml:space="preserve"> </w:t>
-      </w:r>
-      <w:r>
-        <w:rPr>
-          <w:rStyle w:val="VerbatimChar"/>
-        </w:rPr>
-        <w:t xml:space="preserve">{ ok: true }</w:t>
-      </w:r>
-      <w:r>
-        <w:t xml:space="preserve">.</w:t>
-      </w:r>
-    </w:p>
-    <w:bookmarkEnd w:id="162"/>
-    <w:bookmarkStart w:id="163" w:name="shop-token-is-a-bearer-token-in-the-url"/>
-    <w:p>
-      <w:pPr>
-        <w:pStyle w:val="Heading3"/>
-      </w:pPr>
-      <w:r>
-        <w:t xml:space="preserve">Shop token is a bearer token in the URL</w:t>
-      </w:r>
-    </w:p>
-    <w:p>
-      <w:pPr>
-        <w:pStyle w:val="FirstParagraph"/>
-      </w:pPr>
-      <w:r>
-        <w:t xml:space="preserve">Anyone holding a live</w:t>
-      </w:r>
-      <w:r>
-        <w:t xml:space="preserve"> </w:t>
-      </w:r>
-      <w:r>
-        <w:rPr>
-          <w:rStyle w:val="VerbatimChar"/>
-        </w:rPr>
-        <w:t xml:space="preserve">/shop/&lt;token&gt;</w:t>
-      </w:r>
-      <w:r>
-        <w:t xml:space="preserve"> </w:t>
-      </w:r>
-      <w:r>
-        <w:t xml:space="preserve">URL can act as that member until it expires</w:t>
-      </w:r>
-      <w:r>
-        <w:t xml:space="preserve"> </w:t>
-      </w:r>
-      <w:r>
-        <w:t xml:space="preserve">(10 min) or the order is confirmed. Tokens are random and per-tap (a new one each</w:t>
-      </w:r>
-      <w:r>
-        <w:t xml:space="preserve"> </w:t>
-      </w:r>
-      <w:r>
-        <w:t xml:space="preserve">scan), so they can't be guessed or reused. The idle auto-reset and short lifetime</w:t>
-      </w:r>
-      <w:r>
-        <w:t xml:space="preserve"> </w:t>
-      </w:r>
-      <w:r>
-        <w:t xml:space="preserve">bound the exposure. Stronger options (not currently implemented): move the token</w:t>
-      </w:r>
-      <w:r>
-        <w:t xml:space="preserve"> </w:t>
-      </w:r>
-      <w:r>
-        <w:t xml:space="preserve">into an httpOnly cookie so it can't be shared via URL, or use a crypto-random</w:t>
-      </w:r>
-      <w:r>
-        <w:t xml:space="preserve"> </w:t>
-      </w:r>
-      <w:r>
-        <w:t xml:space="preserve">token instead of a cuid.</w:t>
-      </w:r>
-    </w:p>
-    <w:bookmarkEnd w:id="163"/>
-    <w:bookmarkEnd w:id="164"/>
-    <w:bookmarkStart w:id="165" w:name="prohibited--careful-operations"/>
-    <w:p>
-      <w:pPr>
-        <w:pStyle w:val="Heading2"/>
-      </w:pPr>
-      <w:r>
-        <w:t xml:space="preserve">Prohibited / careful operations</w:t>
       </w:r>
     </w:p>
     <w:p>
@@ -28951,17 +29265,7 @@
         </w:numPr>
       </w:pPr>
       <w:r>
-        <w:rPr>
-          <w:b/>
-          <w:bCs/>
-        </w:rPr>
-        <w:t xml:space="preserve">Member deletion</w:t>
-      </w:r>
-      <w:r>
-        <w:t xml:space="preserve"> </w:t>
-      </w:r>
-      <w:r>
-        <w:t xml:space="preserve">is blocked while invoices exist.</w:t>
+        <w:t xml:space="preserve">React escapes all interpolated values in the kiosk/shop/admin pages.</w:t>
       </w:r>
     </w:p>
     <w:p>
@@ -28973,38 +29277,47 @@
         </w:numPr>
       </w:pPr>
       <w:r>
-        <w:rPr>
-          <w:b/>
-          <w:bCs/>
-        </w:rPr>
-        <w:t xml:space="preserve">Invoice edit/delete</w:t>
-      </w:r>
-      <w:r>
-        <w:t xml:space="preserve"> </w:t>
-      </w:r>
-      <w:r>
-        <w:t xml:space="preserve">is blocked once an invoice is</w:t>
-      </w:r>
-      <w:r>
-        <w:t xml:space="preserve"> </w:t>
-      </w:r>
-      <w:r>
-        <w:rPr>
-          <w:rStyle w:val="VerbatimChar"/>
-        </w:rPr>
-        <w:t xml:space="preserve">EXPORTED</w:t>
-      </w:r>
-      <w:r>
-        <w:t xml:space="preserve"> </w:t>
-      </w:r>
-      <w:r>
-        <w:t xml:space="preserve">(already billed</w:t>
-      </w:r>
-      <w:r>
-        <w:t xml:space="preserve"> </w:t>
-      </w:r>
-      <w:r>
-        <w:t xml:space="preserve">in Congressus).</w:t>
+        <w:t xml:space="preserve">The card-verify pages are</w:t>
+      </w:r>
+      <w:r>
+        <w:t xml:space="preserve"> </w:t>
+      </w:r>
+      <w:r>
+        <w:rPr>
+          <w:b/>
+          <w:bCs/>
+        </w:rPr>
+        <w:t xml:space="preserve">hand-built HTML</w:t>
+      </w:r>
+      <w:r>
+        <w:t xml:space="preserve">, so member names and tokens are</w:t>
+      </w:r>
+      <w:r>
+        <w:t xml:space="preserve"> </w:t>
+      </w:r>
+      <w:r>
+        <w:t xml:space="preserve">passed through</w:t>
+      </w:r>
+      <w:r>
+        <w:t xml:space="preserve"> </w:t>
+      </w:r>
+      <w:r>
+        <w:rPr>
+          <w:rStyle w:val="VerbatimChar"/>
+        </w:rPr>
+        <w:t xml:space="preserve">escapeHtml()</w:t>
+      </w:r>
+      <w:r>
+        <w:t xml:space="preserve"> </w:t>
+      </w:r>
+      <w:r>
+        <w:t xml:space="preserve">before interpolation (prevents stored XSS from a</w:t>
+      </w:r>
+      <w:r>
+        <w:t xml:space="preserve"> </w:t>
+      </w:r>
+      <w:r>
+        <w:t xml:space="preserve">name synced out of Congressus).</w:t>
       </w:r>
     </w:p>
     <w:p>
@@ -29016,67 +29329,358 @@
         </w:numPr>
       </w:pPr>
       <w:r>
-        <w:rPr>
-          <w:b/>
-          <w:bCs/>
-        </w:rPr>
-        <w:t xml:space="preserve">Bulk invoice clearing</w:t>
-      </w:r>
-      <w:r>
-        <w:t xml:space="preserve"> </w:t>
-      </w:r>
-      <w:r>
-        <w:t xml:space="preserve">requires a double confirmation in the UI and is</w:t>
-      </w:r>
-      <w:r>
-        <w:t xml:space="preserve"> </w:t>
-      </w:r>
-      <w:r>
-        <w:t xml:space="preserve">intended for test-data cleanup only.</w:t>
-      </w:r>
-    </w:p>
+        <w:t xml:space="preserve">Those pages declare</w:t>
+      </w:r>
+      <w:r>
+        <w:t xml:space="preserve"> </w:t>
+      </w:r>
+      <w:r>
+        <w:rPr>
+          <w:rStyle w:val="VerbatimChar"/>
+        </w:rPr>
+        <w:t xml:space="preserve">charset=utf-8</w:t>
+      </w:r>
+      <w:r>
+        <w:t xml:space="preserve"> </w:t>
+      </w:r>
+      <w:r>
+        <w:t xml:space="preserve">(header + meta) so emoji/diacritics render</w:t>
+      </w:r>
+      <w:r>
+        <w:t xml:space="preserve"> </w:t>
+      </w:r>
+      <w:r>
+        <w:t xml:space="preserve">correctly.</w:t>
+      </w:r>
+    </w:p>
+    <w:bookmarkEnd w:id="161"/>
+    <w:bookmarkStart w:id="165" w:name="deliberate-trade-offs"/>
+    <w:p>
+      <w:pPr>
+        <w:pStyle w:val="Heading2"/>
+      </w:pPr>
+      <w:r>
+        <w:t xml:space="preserve">Deliberate trade-offs</w:t>
+      </w:r>
+    </w:p>
+    <w:bookmarkStart w:id="162" w:name="card-uids-arent-secret"/>
+    <w:p>
+      <w:pPr>
+        <w:pStyle w:val="Heading3"/>
+      </w:pPr>
+      <w:r>
+        <w:t xml:space="preserve">Card UIDs aren't secret</w:t>
+      </w:r>
+    </w:p>
+    <w:p>
+      <w:pPr>
+        <w:pStyle w:val="FirstParagraph"/>
+      </w:pPr>
+      <w:r>
+        <w:t xml:space="preserve">Any NFC reader can read a card UID, and the scan endpoint is necessarily</w:t>
+      </w:r>
+      <w:r>
+        <w:t xml:space="preserve"> </w:t>
+      </w:r>
+      <w:r>
+        <w:t xml:space="preserve">unauthenticated (the kiosk is a public web page). Mitigations: the scan endpoint</w:t>
+      </w:r>
+      <w:r>
+        <w:t xml:space="preserve"> </w:t>
+      </w:r>
+      <w:r>
+        <w:t xml:space="preserve">returns no member data and is rate-limited. For stronger protection, restrict</w:t>
+      </w:r>
+      <w:r>
+        <w:t xml:space="preserve"> </w:t>
+      </w:r>
+      <w:r>
+        <w:rPr>
+          <w:rStyle w:val="VerbatimChar"/>
+        </w:rPr>
+        <w:t xml:space="preserve">/api/card/scan</w:t>
+      </w:r>
+      <w:r>
+        <w:t xml:space="preserve"> </w:t>
+      </w:r>
+      <w:r>
+        <w:t xml:space="preserve">to the kiosk's IP at the network layer.</w:t>
+      </w:r>
+    </w:p>
+    <w:bookmarkEnd w:id="162"/>
+    <w:bookmarkStart w:id="163" w:name="email-not-found-vs-enumeration"/>
+    <w:p>
+      <w:pPr>
+        <w:pStyle w:val="Heading3"/>
+      </w:pPr>
+      <w:r>
+        <w:t xml:space="preserve">"Email not found" vs enumeration</w:t>
+      </w:r>
+    </w:p>
+    <w:p>
+      <w:pPr>
+        <w:pStyle w:val="FirstParagraph"/>
+      </w:pPr>
+      <w:r>
+        <w:t xml:space="preserve">The card-registration flow tells a user when their email matches no member</w:t>
+      </w:r>
+      <w:r>
+        <w:t xml:space="preserve"> </w:t>
+      </w:r>
+      <w:r>
+        <w:t xml:space="preserve">("Email not found"). This</w:t>
+      </w:r>
+      <w:r>
+        <w:t xml:space="preserve"> </w:t>
+      </w:r>
+      <w:r>
+        <w:rPr>
+          <w:b/>
+          <w:bCs/>
+        </w:rPr>
+        <w:t xml:space="preserve">re-introduces some email-enumeration ability</w:t>
+      </w:r>
+      <w:r>
+        <w:t xml:space="preserve"> </w:t>
+      </w:r>
+      <w:r>
+        <w:t xml:space="preserve">that a</w:t>
+      </w:r>
+      <w:r>
+        <w:t xml:space="preserve"> </w:t>
+      </w:r>
+      <w:r>
+        <w:t xml:space="preserve">uniform response would prevent. It was a conscious product choice: confused</w:t>
+      </w:r>
+      <w:r>
+        <w:t xml:space="preserve"> </w:t>
+      </w:r>
+      <w:r>
+        <w:t xml:space="preserve">members not knowing why nothing happened is a real problem at a kiosk, the kiosk</w:t>
+      </w:r>
+      <w:r>
+        <w:t xml:space="preserve"> </w:t>
+      </w:r>
+      <w:r>
+        <w:t xml:space="preserve">is physical, and the endpoint is rate-limited. If enumeration resistance becomes</w:t>
+      </w:r>
+      <w:r>
+        <w:t xml:space="preserve"> </w:t>
+      </w:r>
+      <w:r>
+        <w:t xml:space="preserve">more important than this UX, revert</w:t>
+      </w:r>
+      <w:r>
+        <w:t xml:space="preserve"> </w:t>
+      </w:r>
+      <w:r>
+        <w:rPr>
+          <w:rStyle w:val="VerbatimChar"/>
+        </w:rPr>
+        <w:t xml:space="preserve">card/register</w:t>
+      </w:r>
+      <w:r>
+        <w:t xml:space="preserve"> </w:t>
+      </w:r>
+      <w:r>
+        <w:t xml:space="preserve">to a uniform</w:t>
+      </w:r>
+      <w:r>
+        <w:t xml:space="preserve"> </w:t>
+      </w:r>
+      <w:r>
+        <w:rPr>
+          <w:rStyle w:val="VerbatimChar"/>
+        </w:rPr>
+        <w:t xml:space="preserve">{ ok: true }</w:t>
+      </w:r>
+      <w:r>
+        <w:t xml:space="preserve">.</w:t>
+      </w:r>
+    </w:p>
+    <w:bookmarkEnd w:id="163"/>
+    <w:bookmarkStart w:id="164" w:name="shop-token-is-a-bearer-token-in-the-url"/>
+    <w:p>
+      <w:pPr>
+        <w:pStyle w:val="Heading3"/>
+      </w:pPr>
+      <w:r>
+        <w:t xml:space="preserve">Shop token is a bearer token in the URL</w:t>
+      </w:r>
+    </w:p>
+    <w:p>
+      <w:pPr>
+        <w:pStyle w:val="FirstParagraph"/>
+      </w:pPr>
+      <w:r>
+        <w:t xml:space="preserve">Anyone holding a live</w:t>
+      </w:r>
+      <w:r>
+        <w:t xml:space="preserve"> </w:t>
+      </w:r>
+      <w:r>
+        <w:rPr>
+          <w:rStyle w:val="VerbatimChar"/>
+        </w:rPr>
+        <w:t xml:space="preserve">/shop/&lt;token&gt;</w:t>
+      </w:r>
+      <w:r>
+        <w:t xml:space="preserve"> </w:t>
+      </w:r>
+      <w:r>
+        <w:t xml:space="preserve">URL can act as that member until it expires</w:t>
+      </w:r>
+      <w:r>
+        <w:t xml:space="preserve"> </w:t>
+      </w:r>
+      <w:r>
+        <w:t xml:space="preserve">(10 min) or the order is confirmed. Tokens are random and per-tap (a new one each</w:t>
+      </w:r>
+      <w:r>
+        <w:t xml:space="preserve"> </w:t>
+      </w:r>
+      <w:r>
+        <w:t xml:space="preserve">scan), so they can't be guessed or reused. The idle auto-reset and short lifetime</w:t>
+      </w:r>
+      <w:r>
+        <w:t xml:space="preserve"> </w:t>
+      </w:r>
+      <w:r>
+        <w:t xml:space="preserve">bound the exposure. Stronger options (not currently implemented): move the token</w:t>
+      </w:r>
+      <w:r>
+        <w:t xml:space="preserve"> </w:t>
+      </w:r>
+      <w:r>
+        <w:t xml:space="preserve">into an httpOnly cookie so it can't be shared via URL, or use a crypto-random</w:t>
+      </w:r>
+      <w:r>
+        <w:t xml:space="preserve"> </w:t>
+      </w:r>
+      <w:r>
+        <w:t xml:space="preserve">token instead of a cuid.</w:t>
+      </w:r>
+    </w:p>
+    <w:bookmarkEnd w:id="164"/>
     <w:bookmarkEnd w:id="165"/>
-    <w:bookmarkStart w:id="166" w:name="audit-checklist"/>
+    <w:bookmarkStart w:id="166" w:name="prohibited--careful-operations"/>
     <w:p>
       <w:pPr>
         <w:pStyle w:val="Heading2"/>
       </w:pPr>
       <w:r>
-        <w:t xml:space="preserve">Audit checklist</w:t>
-      </w:r>
-    </w:p>
-    <w:p>
-      <w:pPr>
-        <w:pStyle w:val="FirstParagraph"/>
-      </w:pPr>
-      <w:r>
-        <w:t xml:space="preserve">When adding a new endpoint:</w:t>
-      </w:r>
-    </w:p>
-    <w:p>
-      <w:pPr>
+        <w:t xml:space="preserve">Prohibited / careful operations</w:t>
+      </w:r>
+    </w:p>
+    <w:p>
+      <w:pPr>
+        <w:pStyle w:val="Compact"/>
         <w:numPr>
           <w:ilvl w:val="0"/>
           <w:numId w:val="1057"/>
         </w:numPr>
       </w:pPr>
       <w:r>
-        <w:t xml:space="preserve">Does it touch member/admin data? → call</w:t>
-      </w:r>
-      <w:r>
-        <w:t xml:space="preserve"> </w:t>
-      </w:r>
-      <w:r>
-        <w:rPr>
-          <w:rStyle w:val="VerbatimChar"/>
-        </w:rPr>
-        <w:t xml:space="preserve">requireAdmin()</w:t>
-      </w:r>
-      <w:r>
-        <w:t xml:space="preserve"> </w:t>
-      </w:r>
-      <w:r>
-        <w:t xml:space="preserve">(admin) or validate a token (shop/registration).</w:t>
+        <w:rPr>
+          <w:b/>
+          <w:bCs/>
+        </w:rPr>
+        <w:t xml:space="preserve">Member deletion</w:t>
+      </w:r>
+      <w:r>
+        <w:t xml:space="preserve"> </w:t>
+      </w:r>
+      <w:r>
+        <w:t xml:space="preserve">is blocked while invoices exist.</w:t>
+      </w:r>
+    </w:p>
+    <w:p>
+      <w:pPr>
+        <w:pStyle w:val="Compact"/>
+        <w:numPr>
+          <w:ilvl w:val="0"/>
+          <w:numId w:val="1057"/>
+        </w:numPr>
+      </w:pPr>
+      <w:r>
+        <w:rPr>
+          <w:b/>
+          <w:bCs/>
+        </w:rPr>
+        <w:t xml:space="preserve">Invoice edit/delete</w:t>
+      </w:r>
+      <w:r>
+        <w:t xml:space="preserve"> </w:t>
+      </w:r>
+      <w:r>
+        <w:t xml:space="preserve">is blocked once an invoice is</w:t>
+      </w:r>
+      <w:r>
+        <w:t xml:space="preserve"> </w:t>
+      </w:r>
+      <w:r>
+        <w:rPr>
+          <w:rStyle w:val="VerbatimChar"/>
+        </w:rPr>
+        <w:t xml:space="preserve">EXPORTED</w:t>
+      </w:r>
+      <w:r>
+        <w:t xml:space="preserve"> </w:t>
+      </w:r>
+      <w:r>
+        <w:t xml:space="preserve">(already billed</w:t>
+      </w:r>
+      <w:r>
+        <w:t xml:space="preserve"> </w:t>
+      </w:r>
+      <w:r>
+        <w:t xml:space="preserve">in Congressus).</w:t>
+      </w:r>
+    </w:p>
+    <w:p>
+      <w:pPr>
+        <w:pStyle w:val="Compact"/>
+        <w:numPr>
+          <w:ilvl w:val="0"/>
+          <w:numId w:val="1057"/>
+        </w:numPr>
+      </w:pPr>
+      <w:r>
+        <w:rPr>
+          <w:b/>
+          <w:bCs/>
+        </w:rPr>
+        <w:t xml:space="preserve">Bulk invoice clearing</w:t>
+      </w:r>
+      <w:r>
+        <w:t xml:space="preserve"> </w:t>
+      </w:r>
+      <w:r>
+        <w:t xml:space="preserve">requires a double confirmation in the UI and is</w:t>
+      </w:r>
+      <w:r>
+        <w:t xml:space="preserve"> </w:t>
+      </w:r>
+      <w:r>
+        <w:t xml:space="preserve">intended for test-data cleanup only.</w:t>
+      </w:r>
+    </w:p>
+    <w:bookmarkEnd w:id="166"/>
+    <w:bookmarkStart w:id="167" w:name="audit-checklist"/>
+    <w:p>
+      <w:pPr>
+        <w:pStyle w:val="Heading2"/>
+      </w:pPr>
+      <w:r>
+        <w:t xml:space="preserve">Audit checklist</w:t>
+      </w:r>
+    </w:p>
+    <w:p>
+      <w:pPr>
+        <w:pStyle w:val="FirstParagraph"/>
+      </w:pPr>
+      <w:r>
+        <w:t xml:space="preserve">When adding a new endpoint:</w:t>
       </w:r>
     </w:p>
     <w:p>
@@ -29087,22 +29691,22 @@
         </w:numPr>
       </w:pPr>
       <w:r>
-        <w:t xml:space="preserve">Does it return more fields than the caller needs? →</w:t>
-      </w:r>
-      <w:r>
-        <w:t xml:space="preserve"> </w:t>
-      </w:r>
-      <w:r>
-        <w:rPr>
-          <w:rStyle w:val="VerbatimChar"/>
-        </w:rPr>
-        <w:t xml:space="preserve">select</w:t>
-      </w:r>
-      <w:r>
-        <w:t xml:space="preserve"> </w:t>
-      </w:r>
-      <w:r>
-        <w:t xml:space="preserve">only what's required.</w:t>
+        <w:t xml:space="preserve">Does it touch member/admin data? → call</w:t>
+      </w:r>
+      <w:r>
+        <w:t xml:space="preserve"> </w:t>
+      </w:r>
+      <w:r>
+        <w:rPr>
+          <w:rStyle w:val="VerbatimChar"/>
+        </w:rPr>
+        <w:t xml:space="preserve">requireAdmin()</w:t>
+      </w:r>
+      <w:r>
+        <w:t xml:space="preserve"> </w:t>
+      </w:r>
+      <w:r>
+        <w:t xml:space="preserve">(admin) or validate a token (shop/registration).</w:t>
       </w:r>
     </w:p>
     <w:p>
@@ -29113,7 +29717,22 @@
         </w:numPr>
       </w:pPr>
       <w:r>
-        <w:t xml:space="preserve">Is it public and write-capable or enumeration-prone? → add rate limiting.</w:t>
+        <w:t xml:space="preserve">Does it return more fields than the caller needs? →</w:t>
+      </w:r>
+      <w:r>
+        <w:t xml:space="preserve"> </w:t>
+      </w:r>
+      <w:r>
+        <w:rPr>
+          <w:rStyle w:val="VerbatimChar"/>
+        </w:rPr>
+        <w:t xml:space="preserve">select</w:t>
+      </w:r>
+      <w:r>
+        <w:t xml:space="preserve"> </w:t>
+      </w:r>
+      <w:r>
+        <w:t xml:space="preserve">only what's required.</w:t>
       </w:r>
     </w:p>
     <w:p>
@@ -29124,7 +29743,7 @@
         </w:numPr>
       </w:pPr>
       <w:r>
-        <w:t xml:space="preserve">Does it render raw HTML with external data? → escape it.</w:t>
+        <w:t xml:space="preserve">Is it public and write-capable or enumeration-prone? → add rate limiting.</w:t>
       </w:r>
     </w:p>
     <w:p>
@@ -29135,6 +29754,17 @@
         </w:numPr>
       </w:pPr>
       <w:r>
+        <w:t xml:space="preserve">Does it render raw HTML with external data? → escape it.</w:t>
+      </w:r>
+    </w:p>
+    <w:p>
+      <w:pPr>
+        <w:numPr>
+          <w:ilvl w:val="0"/>
+          <w:numId w:val="1062"/>
+        </w:numPr>
+      </w:pPr>
+      <w:r>
         <w:t xml:space="preserve">Verify at runtime: unauthenticated</w:t>
       </w:r>
       <w:r>
@@ -29154,8 +29784,8 @@
         <w:t xml:space="preserve">forged-cookie requests both get 401/redirect.</w:t>
       </w:r>
     </w:p>
-    <w:bookmarkEnd w:id="166"/>
     <w:bookmarkEnd w:id="167"/>
+    <w:bookmarkEnd w:id="168"/>
     <w:sectPr>
       <w:footnotePr>
         <w:numRestart w:val="eachSect"/>
@@ -30080,7 +30710,7 @@
     <w:abstractNumId w:val="991"/>
   </w:num>
   <w:num w:numId="1057">
-    <w:abstractNumId w:val="992"/>
+    <w:abstractNumId w:val="991"/>
   </w:num>
   <w:num w:numId="1058">
     <w:abstractNumId w:val="992"/>
@@ -30092,6 +30722,9 @@
     <w:abstractNumId w:val="992"/>
   </w:num>
   <w:num w:numId="1061">
+    <w:abstractNumId w:val="992"/>
+  </w:num>
+  <w:num w:numId="1062">
     <w:abstractNumId w:val="992"/>
   </w:num>
 </w:numbering>

</xml_diff>

<commit_message>
PPP: per-activity profit/loss — SBZ usage cost, SumUp card revenue, discounts
Activity detail now shows a full P/L: revenue = member charges + live SumUp card revenue (fetched per borrel time window via SUMUP_API_KEY); cost of goods from manually-entered SBZ usage (kegs kg / bottles units, priced from src/lib/sbz.ts); net P/L; discounts broken out (specials, per-role Board/PilsCie, bartender comps); per-drink table. Adds PppActivityUsage + activity startsAt/endsAt (from Alexia); migration add_activity_usage_and_times.

Co-Authored-By: Claude Opus 4.8 <noreply@anthropic.com>
</commit_message>
<xml_diff>
--- a/docs/SSS-Documentation.docx
+++ b/docs/SSS-Documentation.docx
@@ -13476,6 +13476,58 @@
               <w:rPr>
                 <w:rStyle w:val="VerbatimChar"/>
               </w:rPr>
+              <w:t xml:space="preserve">SUMUP_API_KEY</w:t>
+            </w:r>
+          </w:p>
+        </w:tc>
+        <w:tc>
+          <w:tcPr/>
+          <w:p>
+            <w:pPr>
+              <w:pStyle w:val="Compact"/>
+            </w:pPr>
+            <w:r>
+              <w:t xml:space="preserve">–</w:t>
+            </w:r>
+          </w:p>
+        </w:tc>
+        <w:tc>
+          <w:tcPr/>
+          <w:p>
+            <w:pPr>
+              <w:pStyle w:val="Compact"/>
+            </w:pPr>
+            <w:r>
+              <w:rPr>
+                <w:rStyle w:val="VerbatimChar"/>
+              </w:rPr>
+              <w:t xml:space="preserve">sup_sk_…</w:t>
+            </w:r>
+          </w:p>
+        </w:tc>
+        <w:tc>
+          <w:tcPr/>
+          <w:p>
+            <w:pPr>
+              <w:pStyle w:val="Compact"/>
+            </w:pPr>
+            <w:r>
+              <w:t xml:space="preserve">SumUp secret API key (Bearer token) for pulling card revenue into a borrel's profit/loss. Fail-soft if unset (card revenue shows "n/a").</w:t>
+            </w:r>
+          </w:p>
+        </w:tc>
+      </w:tr>
+      <w:tr>
+        <w:tc>
+          <w:tcPr/>
+          <w:p>
+            <w:pPr>
+              <w:pStyle w:val="Compact"/>
+            </w:pPr>
+            <w:r>
+              <w:rPr>
+                <w:rStyle w:val="VerbatimChar"/>
+              </w:rPr>
               <w:t xml:space="preserve">UPLOAD_DIR</w:t>
             </w:r>
           </w:p>
@@ -21879,7 +21931,7 @@
     </w:p>
     <w:bookmarkEnd w:id="133"/>
     <w:bookmarkEnd w:id="134"/>
-    <w:bookmarkStart w:id="154" w:name="ppp--bar-pos-drinks-at-activities"/>
+    <w:bookmarkStart w:id="155" w:name="ppp--bar-pos-drinks-at-activities"/>
     <w:p>
       <w:pPr>
         <w:pStyle w:val="Heading1"/>
@@ -25578,10 +25630,23 @@
               <w:t xml:space="preserve">drink specials</w:t>
             </w:r>
             <w:r>
+              <w:t xml:space="preserve">, and see its full</w:t>
+            </w:r>
+            <w:r>
               <w:t xml:space="preserve"> </w:t>
             </w:r>
             <w:r>
-              <w:t xml:space="preserve">(pick a drink, set a special price) — can be done in advance for a future borrel. Shows order count + the two discount totals, and whether specials are active.</w:t>
+              <w:rPr>
+                <w:b/>
+                <w:bCs/>
+              </w:rPr>
+              <w:t xml:space="preserve">profit/loss</w:t>
+            </w:r>
+            <w:r>
+              <w:t xml:space="preserve"> </w:t>
+            </w:r>
+            <w:r>
+              <w:t xml:space="preserve">(see below): revenue, cost of goods, discounts, per-drink. Manage specials as before (also in advance for future borrels).</w:t>
             </w:r>
           </w:p>
         </w:tc>
@@ -25767,7 +25832,380 @@
       </w:r>
     </w:p>
     <w:bookmarkEnd w:id="147"/>
-    <w:bookmarkStart w:id="148" w:name="congressus"/>
+    <w:bookmarkStart w:id="148" w:name="activity-profitloss"/>
+    <w:p>
+      <w:pPr>
+        <w:pStyle w:val="Heading2"/>
+      </w:pPr>
+      <w:r>
+        <w:t xml:space="preserve">Activity profit/loss</w:t>
+      </w:r>
+    </w:p>
+    <w:p>
+      <w:pPr>
+        <w:pStyle w:val="FirstParagraph"/>
+      </w:pPr>
+      <w:r>
+        <w:t xml:space="preserve">The activity detail page shows a full</w:t>
+      </w:r>
+      <w:r>
+        <w:t xml:space="preserve"> </w:t>
+      </w:r>
+      <w:r>
+        <w:rPr>
+          <w:b/>
+          <w:bCs/>
+        </w:rPr>
+        <w:t xml:space="preserve">profit/loss</w:t>
+      </w:r>
+      <w:r>
+        <w:t xml:space="preserve"> </w:t>
+      </w:r>
+      <w:r>
+        <w:t xml:space="preserve">for a borrel:</w:t>
+      </w:r>
+    </w:p>
+    <w:p>
+      <w:pPr>
+        <w:pStyle w:val="Compact"/>
+        <w:numPr>
+          <w:ilvl w:val="0"/>
+          <w:numId w:val="1050"/>
+        </w:numPr>
+      </w:pPr>
+      <w:r>
+        <w:rPr>
+          <w:b/>
+          <w:bCs/>
+        </w:rPr>
+        <w:t xml:space="preserve">Revenue</w:t>
+      </w:r>
+      <w:r>
+        <w:t xml:space="preserve"> </w:t>
+      </w:r>
+      <w:r>
+        <w:t xml:space="preserve">=</w:t>
+      </w:r>
+      <w:r>
+        <w:t xml:space="preserve"> </w:t>
+      </w:r>
+      <w:r>
+        <w:rPr>
+          <w:b/>
+          <w:bCs/>
+        </w:rPr>
+        <w:t xml:space="preserve">member charges</w:t>
+      </w:r>
+      <w:r>
+        <w:t xml:space="preserve"> </w:t>
+      </w:r>
+      <w:r>
+        <w:t xml:space="preserve">(itemised PPP orders, billed via Congressus) +</w:t>
+      </w:r>
+      <w:r>
+        <w:t xml:space="preserve"> </w:t>
+      </w:r>
+      <w:r>
+        <w:rPr>
+          <w:b/>
+          <w:bCs/>
+        </w:rPr>
+        <w:t xml:space="preserve">card revenue from SumUp</w:t>
+      </w:r>
+      <w:r>
+        <w:t xml:space="preserve"> </w:t>
+      </w:r>
+      <w:r>
+        <w:t xml:space="preserve">(fetched live for the borrel's time window). Card/cash</w:t>
+      </w:r>
+      <w:r>
+        <w:t xml:space="preserve"> </w:t>
+      </w:r>
+      <w:r>
+        <w:t xml:space="preserve">sales aren't itemised per drink — only the SumUp total is known.</w:t>
+      </w:r>
+    </w:p>
+    <w:p>
+      <w:pPr>
+        <w:pStyle w:val="Compact"/>
+        <w:numPr>
+          <w:ilvl w:val="0"/>
+          <w:numId w:val="1050"/>
+        </w:numPr>
+      </w:pPr>
+      <w:r>
+        <w:rPr>
+          <w:b/>
+          <w:bCs/>
+        </w:rPr>
+        <w:t xml:space="preserve">Cost of goods</w:t>
+      </w:r>
+      <w:r>
+        <w:t xml:space="preserve"> </w:t>
+      </w:r>
+      <w:r>
+        <w:t xml:space="preserve">= the</w:t>
+      </w:r>
+      <w:r>
+        <w:t xml:space="preserve"> </w:t>
+      </w:r>
+      <w:r>
+        <w:rPr>
+          <w:b/>
+          <w:bCs/>
+        </w:rPr>
+        <w:t xml:space="preserve">SBZ usage</w:t>
+      </w:r>
+      <w:r>
+        <w:t xml:space="preserve"> </w:t>
+      </w:r>
+      <w:r>
+        <w:t xml:space="preserve">the admin enters (Alexia holds this but isn't</w:t>
+      </w:r>
+      <w:r>
+        <w:t xml:space="preserve"> </w:t>
+      </w:r>
+      <w:r>
+        <w:t xml:space="preserve">public, so it's entered manually):</w:t>
+      </w:r>
+      <w:r>
+        <w:t xml:space="preserve"> </w:t>
+      </w:r>
+      <w:r>
+        <w:rPr>
+          <w:b/>
+          <w:bCs/>
+        </w:rPr>
+        <w:t xml:space="preserve">kegs in kg</w:t>
+      </w:r>
+      <w:r>
+        <w:t xml:space="preserve"> </w:t>
+      </w:r>
+      <w:r>
+        <w:t xml:space="preserve">(≈ liters),</w:t>
+      </w:r>
+      <w:r>
+        <w:t xml:space="preserve"> </w:t>
+      </w:r>
+      <w:r>
+        <w:rPr>
+          <w:b/>
+          <w:bCs/>
+        </w:rPr>
+        <w:t xml:space="preserve">bottles/cans/shots</w:t>
+      </w:r>
+      <w:r>
+        <w:rPr>
+          <w:b/>
+          <w:bCs/>
+        </w:rPr>
+        <w:t xml:space="preserve"> </w:t>
+      </w:r>
+      <w:r>
+        <w:rPr>
+          <w:b/>
+          <w:bCs/>
+        </w:rPr>
+        <w:t xml:space="preserve">as units</w:t>
+      </w:r>
+      <w:r>
+        <w:t xml:space="preserve">, priced from the SBZ price list (</w:t>
+      </w:r>
+      <w:r>
+        <w:rPr>
+          <w:rStyle w:val="VerbatimChar"/>
+        </w:rPr>
+        <w:t xml:space="preserve">src/lib/sbz.ts</w:t>
+      </w:r>
+      <w:r>
+        <w:t xml:space="preserve"> </w:t>
+      </w:r>
+      <w:r>
+        <w:t xml:space="preserve">— the fixed cost</w:t>
+      </w:r>
+      <w:r>
+        <w:t xml:space="preserve"> </w:t>
+      </w:r>
+      <w:r>
+        <w:t xml:space="preserve">catalog, incl./excl. BTW per item; update it when SBZ revises prices).</w:t>
+      </w:r>
+    </w:p>
+    <w:p>
+      <w:pPr>
+        <w:pStyle w:val="Compact"/>
+        <w:numPr>
+          <w:ilvl w:val="0"/>
+          <w:numId w:val="1050"/>
+        </w:numPr>
+      </w:pPr>
+      <w:r>
+        <w:rPr>
+          <w:b/>
+          <w:bCs/>
+        </w:rPr>
+        <w:t xml:space="preserve">Net P/L</w:t>
+      </w:r>
+      <w:r>
+        <w:t xml:space="preserve"> </w:t>
+      </w:r>
+      <w:r>
+        <w:t xml:space="preserve">= revenue − cost of goods (incl. BTW).</w:t>
+      </w:r>
+    </w:p>
+    <w:p>
+      <w:pPr>
+        <w:pStyle w:val="Compact"/>
+        <w:numPr>
+          <w:ilvl w:val="0"/>
+          <w:numId w:val="1050"/>
+        </w:numPr>
+      </w:pPr>
+      <w:r>
+        <w:rPr>
+          <w:b/>
+          <w:bCs/>
+        </w:rPr>
+        <w:t xml:space="preserve">Discounts given</w:t>
+      </w:r>
+      <w:r>
+        <w:t xml:space="preserve"> </w:t>
+      </w:r>
+      <w:r>
+        <w:t xml:space="preserve">(the association's cost, already reflected in member charges):</w:t>
+      </w:r>
+      <w:r>
+        <w:t xml:space="preserve"> </w:t>
+      </w:r>
+      <w:r>
+        <w:t xml:space="preserve">drink specials, per-role (Board / PilsCie / …), and bartender free drinks.</w:t>
+      </w:r>
+    </w:p>
+    <w:p>
+      <w:pPr>
+        <w:pStyle w:val="Compact"/>
+        <w:numPr>
+          <w:ilvl w:val="0"/>
+          <w:numId w:val="1050"/>
+        </w:numPr>
+      </w:pPr>
+      <w:r>
+        <w:t xml:space="preserve">A</w:t>
+      </w:r>
+      <w:r>
+        <w:t xml:space="preserve"> </w:t>
+      </w:r>
+      <w:r>
+        <w:rPr>
+          <w:b/>
+          <w:bCs/>
+        </w:rPr>
+        <w:t xml:space="preserve">per-drink table</w:t>
+      </w:r>
+      <w:r>
+        <w:t xml:space="preserve"> </w:t>
+      </w:r>
+      <w:r>
+        <w:t xml:space="preserve">of member-charge sales (quantity, revenue, discount).</w:t>
+      </w:r>
+    </w:p>
+    <w:p>
+      <w:pPr>
+        <w:pStyle w:val="FirstParagraph"/>
+      </w:pPr>
+      <w:r>
+        <w:rPr>
+          <w:b/>
+          <w:bCs/>
+        </w:rPr>
+        <w:t xml:space="preserve">SumUp</w:t>
+      </w:r>
+      <w:r>
+        <w:t xml:space="preserve"> </w:t>
+      </w:r>
+      <w:r>
+        <w:t xml:space="preserve">(</w:t>
+      </w:r>
+      <w:r>
+        <w:rPr>
+          <w:rStyle w:val="VerbatimChar"/>
+        </w:rPr>
+        <w:t xml:space="preserve">src/lib/sumup.ts</w:t>
+      </w:r>
+      <w:r>
+        <w:t xml:space="preserve">): sums SUCCESSFUL card payments (minus refunds) between</w:t>
+      </w:r>
+      <w:r>
+        <w:t xml:space="preserve"> </w:t>
+      </w:r>
+      <w:r>
+        <w:t xml:space="preserve">the borrel's</w:t>
+      </w:r>
+      <w:r>
+        <w:t xml:space="preserve"> </w:t>
+      </w:r>
+      <w:r>
+        <w:rPr>
+          <w:rStyle w:val="VerbatimChar"/>
+        </w:rPr>
+        <w:t xml:space="preserve">startsAt</w:t>
+      </w:r>
+      <w:r>
+        <w:t xml:space="preserve">/</w:t>
+      </w:r>
+      <w:r>
+        <w:rPr>
+          <w:rStyle w:val="VerbatimChar"/>
+        </w:rPr>
+        <w:t xml:space="preserve">endsAt</w:t>
+      </w:r>
+      <w:r>
+        <w:t xml:space="preserve"> </w:t>
+      </w:r>
+      <w:r>
+        <w:t xml:space="preserve">(from Alexia; falls back to the</w:t>
+      </w:r>
+      <w:r>
+        <w:t xml:space="preserve"> </w:t>
+      </w:r>
+      <w:r>
+        <w:rPr>
+          <w:rStyle w:val="VerbatimChar"/>
+        </w:rPr>
+        <w:t xml:space="preserve">date</w:t>
+      </w:r>
+      <w:r>
+        <w:t xml:space="preserve"> </w:t>
+      </w:r>
+      <w:r>
+        <w:t xml:space="preserve">calendar day)</w:t>
+      </w:r>
+      <w:r>
+        <w:t xml:space="preserve"> </w:t>
+      </w:r>
+      <w:r>
+        <w:t xml:space="preserve">via the SumUp transactions API, using</w:t>
+      </w:r>
+      <w:r>
+        <w:t xml:space="preserve"> </w:t>
+      </w:r>
+      <w:r>
+        <w:rPr>
+          <w:rStyle w:val="VerbatimChar"/>
+        </w:rPr>
+        <w:t xml:space="preserve">SUMUP_API_KEY</w:t>
+      </w:r>
+      <w:r>
+        <w:t xml:space="preserve">. Fail-soft — no key or an error</w:t>
+      </w:r>
+      <w:r>
+        <w:t xml:space="preserve"> </w:t>
+      </w:r>
+      <w:r>
+        <w:t xml:space="preserve">shows card revenue as "n/a" and the rest of the P/L still renders.</w:t>
+      </w:r>
+    </w:p>
+    <w:bookmarkEnd w:id="148"/>
+    <w:bookmarkStart w:id="149" w:name="congressus"/>
     <w:p>
       <w:pPr>
         <w:pStyle w:val="Heading2"/>
@@ -25806,7 +26244,7 @@
         <w:pStyle w:val="Compact"/>
         <w:numPr>
           <w:ilvl w:val="0"/>
-          <w:numId w:val="1050"/>
+          <w:numId w:val="1051"/>
         </w:numPr>
       </w:pPr>
       <w:r>
@@ -25878,319 +26316,6 @@
           <w:rStyle w:val="VerbatimChar"/>
         </w:rPr>
         <w:t xml:space="preserve">congressusProductOfferId</w:t>
-      </w:r>
-      <w:r>
-        <w:t xml:space="preserve">.</w:t>
-      </w:r>
-    </w:p>
-    <w:p>
-      <w:pPr>
-        <w:pStyle w:val="Compact"/>
-        <w:numPr>
-          <w:ilvl w:val="0"/>
-          <w:numId w:val="1050"/>
-        </w:numPr>
-      </w:pPr>
-      <w:r>
-        <w:rPr>
-          <w:b/>
-          <w:bCs/>
-        </w:rPr>
-        <w:t xml:space="preserve">VAT cannot be set via the API</w:t>
-      </w:r>
-      <w:r>
-        <w:t xml:space="preserve"> </w:t>
-      </w:r>
-      <w:r>
-        <w:t xml:space="preserve">— every shape (</w:t>
-      </w:r>
-      <w:r>
-        <w:rPr>
-          <w:rStyle w:val="VerbatimChar"/>
-        </w:rPr>
-        <w:t xml:space="preserve">vat_category {…}</w:t>
-      </w:r>
-      <w:r>
-        <w:t xml:space="preserve">,</w:t>
-      </w:r>
-      <w:r>
-        <w:t xml:space="preserve"> </w:t>
-      </w:r>
-      <w:r>
-        <w:rPr>
-          <w:rStyle w:val="VerbatimChar"/>
-        </w:rPr>
-        <w:t xml:space="preserve">vat_percentage</w:t>
-      </w:r>
-      <w:r>
-        <w:t xml:space="preserve">, …) returns HTTP 500 server-side, so PPP products sync</w:t>
-      </w:r>
-      <w:r>
-        <w:t xml:space="preserve"> </w:t>
-      </w:r>
-      <w:r>
-        <w:rPr>
-          <w:b/>
-          <w:bCs/>
-        </w:rPr>
-        <w:t xml:space="preserve">without</w:t>
-      </w:r>
-      <w:r>
-        <w:rPr>
-          <w:b/>
-          <w:bCs/>
-        </w:rPr>
-        <w:t xml:space="preserve"> </w:t>
-      </w:r>
-      <w:r>
-        <w:rPr>
-          <w:b/>
-          <w:bCs/>
-        </w:rPr>
-        <w:t xml:space="preserve">VAT</w:t>
-      </w:r>
-      <w:r>
-        <w:t xml:space="preserve"> </w:t>
-      </w:r>
-      <w:r>
-        <w:t xml:space="preserve">(like SSS products, which are all unset). VAT is kept locally on</w:t>
-      </w:r>
-      <w:r>
-        <w:t xml:space="preserve"> </w:t>
-      </w:r>
-      <w:r>
-        <w:rPr>
-          <w:rStyle w:val="VerbatimChar"/>
-        </w:rPr>
-        <w:t xml:space="preserve">PppProduct.vatCategory</w:t>
-      </w:r>
-      <w:r>
-        <w:t xml:space="preserve">; set it in the Congressus UI if needed.</w:t>
-      </w:r>
-    </w:p>
-    <w:p>
-      <w:pPr>
-        <w:pStyle w:val="Compact"/>
-        <w:numPr>
-          <w:ilvl w:val="0"/>
-          <w:numId w:val="1050"/>
-        </w:numPr>
-      </w:pPr>
-      <w:r>
-        <w:rPr>
-          <w:b/>
-          <w:bCs/>
-        </w:rPr>
-        <w:t xml:space="preserve">Two-invoice export</w:t>
-      </w:r>
-      <w:r>
-        <w:t xml:space="preserve"> </w:t>
-      </w:r>
-      <w:r>
-        <w:t xml:space="preserve">—</w:t>
-      </w:r>
-      <w:r>
-        <w:t xml:space="preserve"> </w:t>
-      </w:r>
-      <w:r>
-        <w:rPr>
-          <w:rStyle w:val="VerbatimChar"/>
-        </w:rPr>
-        <w:t xml:space="preserve">POST /api/admin/invoices/export { scope }</w:t>
-      </w:r>
-      <w:r>
-        <w:t xml:space="preserve"> </w:t>
-      </w:r>
-      <w:r>
-        <w:t xml:space="preserve">(</w:t>
-      </w:r>
-      <w:r>
-        <w:rPr>
-          <w:rStyle w:val="VerbatimChar"/>
-        </w:rPr>
-        <w:t xml:space="preserve">sss</w:t>
-      </w:r>
-      <w:r>
-        <w:t xml:space="preserve"> </w:t>
-      </w:r>
-      <w:r>
-        <w:t xml:space="preserve">|</w:t>
-      </w:r>
-      <w:r>
-        <w:t xml:space="preserve"> </w:t>
-      </w:r>
-      <w:r>
-        <w:rPr>
-          <w:rStyle w:val="VerbatimChar"/>
-        </w:rPr>
-        <w:t xml:space="preserve">ppp</w:t>
-      </w:r>
-      <w:r>
-        <w:t xml:space="preserve"> </w:t>
-      </w:r>
-      <w:r>
-        <w:t xml:space="preserve">|</w:t>
-      </w:r>
-      <w:r>
-        <w:t xml:space="preserve"> </w:t>
-      </w:r>
-      <w:r>
-        <w:rPr>
-          <w:rStyle w:val="VerbatimChar"/>
-        </w:rPr>
-        <w:t xml:space="preserve">all</w:t>
-      </w:r>
-      <w:r>
-        <w:t xml:space="preserve">) creates</w:t>
-      </w:r>
-      <w:r>
-        <w:t xml:space="preserve"> </w:t>
-      </w:r>
-      <w:r>
-        <w:rPr>
-          <w:b/>
-          <w:bCs/>
-        </w:rPr>
-        <w:t xml:space="preserve">separate</w:t>
-      </w:r>
-      <w:r>
-        <w:t xml:space="preserve"> </w:t>
-      </w:r>
-      <w:r>
-        <w:t xml:space="preserve">Congressus invoices per member per month: an</w:t>
-      </w:r>
-      <w:r>
-        <w:t xml:space="preserve"> </w:t>
-      </w:r>
-      <w:r>
-        <w:rPr>
-          <w:rStyle w:val="VerbatimChar"/>
-        </w:rPr>
-        <w:t xml:space="preserve">"SSS &lt;month&gt;"</w:t>
-      </w:r>
-      <w:r>
-        <w:t xml:space="preserve"> </w:t>
-      </w:r>
-      <w:r>
-        <w:t xml:space="preserve">invoice and a</w:t>
-      </w:r>
-      <w:r>
-        <w:t xml:space="preserve"> </w:t>
-      </w:r>
-      <w:r>
-        <w:rPr>
-          <w:rStyle w:val="VerbatimChar"/>
-        </w:rPr>
-        <w:t xml:space="preserve">"PPP &lt;month&gt;"</w:t>
-      </w:r>
-      <w:r>
-        <w:t xml:space="preserve"> </w:t>
-      </w:r>
-      <w:r>
-        <w:t xml:space="preserve">invoice. PPP line descriptions</w:t>
-      </w:r>
-      <w:r>
-        <w:t xml:space="preserve"> </w:t>
-      </w:r>
-      <w:r>
-        <w:t xml:space="preserve">include the activity name (</w:t>
-      </w:r>
-      <w:r>
-        <w:rPr>
-          <w:rStyle w:val="VerbatimChar"/>
-        </w:rPr>
-        <w:t xml:space="preserve">"Pils – Borrel 28 jun"</w:t>
-      </w:r>
-      <w:r>
-        <w:t xml:space="preserve">); same product at different</w:t>
-      </w:r>
-      <w:r>
-        <w:t xml:space="preserve"> </w:t>
-      </w:r>
-      <w:r>
-        <w:t xml:space="preserve">activities/prices stays on separate lines. Both reuse</w:t>
-      </w:r>
-      <w:r>
-        <w:t xml:space="preserve"> </w:t>
-      </w:r>
-      <w:r>
-        <w:rPr>
-          <w:rStyle w:val="VerbatimChar"/>
-        </w:rPr>
-        <w:t xml:space="preserve">createSaleInvoice()</w:t>
-      </w:r>
-      <w:r>
-        <w:t xml:space="preserve"> </w:t>
-      </w:r>
-      <w:r>
-        <w:t xml:space="preserve">and</w:t>
-      </w:r>
-      <w:r>
-        <w:t xml:space="preserve"> </w:t>
-      </w:r>
-      <w:r>
-        <w:t xml:space="preserve">the Mendix fallback for lines without an offer id.</w:t>
-      </w:r>
-    </w:p>
-    <w:bookmarkEnd w:id="148"/>
-    <w:bookmarkStart w:id="149" w:name="alexia-integration-scheduled-borrels"/>
-    <w:p>
-      <w:pPr>
-        <w:pStyle w:val="Heading2"/>
-      </w:pPr>
-      <w:r>
-        <w:t xml:space="preserve">Alexia integration (scheduled borrels)</w:t>
-      </w:r>
-    </w:p>
-    <w:p>
-      <w:pPr>
-        <w:pStyle w:val="FirstParagraph"/>
-      </w:pPr>
-      <w:r>
-        <w:t xml:space="preserve">The drinks committee schedules borrels in</w:t>
-      </w:r>
-      <w:r>
-        <w:t xml:space="preserve"> </w:t>
-      </w:r>
-      <w:r>
-        <w:rPr>
-          <w:b/>
-          <w:bCs/>
-        </w:rPr>
-        <w:t xml:space="preserve">Alexia</w:t>
-      </w:r>
-      <w:r>
-        <w:t xml:space="preserve"> </w:t>
-      </w:r>
-      <w:r>
-        <w:t xml:space="preserve">(Inter-Actief's system,</w:t>
-      </w:r>
-      <w:r>
-        <w:t xml:space="preserve"> </w:t>
-      </w:r>
-      <w:r>
-        <w:rPr>
-          <w:rStyle w:val="VerbatimChar"/>
-        </w:rPr>
-        <w:t xml:space="preserve">alex.ia.utwente.nl</w:t>
-      </w:r>
-      <w:r>
-        <w:t xml:space="preserve">). PPP imports them so bartenders don't retype names and admins</w:t>
-      </w:r>
-      <w:r>
-        <w:t xml:space="preserve"> </w:t>
-      </w:r>
-      <w:r>
-        <w:t xml:space="preserve">can prepare specials in advance. Logic in</w:t>
-      </w:r>
-      <w:r>
-        <w:t xml:space="preserve"> </w:t>
-      </w:r>
-      <w:r>
-        <w:rPr>
-          <w:rStyle w:val="VerbatimChar"/>
-        </w:rPr>
-        <w:t xml:space="preserve">src/lib/alexia.ts</w:t>
       </w:r>
       <w:r>
         <w:t xml:space="preserve">.</w:t>
@@ -26209,70 +26334,19 @@
           <w:b/>
           <w:bCs/>
         </w:rPr>
-        <w:t xml:space="preserve">Public, no auth</w:t>
-      </w:r>
-      <w:r>
-        <w:t xml:space="preserve"> </w:t>
-      </w:r>
-      <w:r>
-        <w:t xml:space="preserve">— Alexia's</w:t>
-      </w:r>
-      <w:r>
-        <w:t xml:space="preserve"> </w:t>
-      </w:r>
-      <w:r>
-        <w:rPr>
-          <w:rStyle w:val="VerbatimChar"/>
-        </w:rPr>
-        <w:t xml:space="preserve">event.upcoming_list</w:t>
-      </w:r>
-      <w:r>
-        <w:t xml:space="preserve"> </w:t>
-      </w:r>
-      <w:r>
-        <w:t xml:space="preserve">JSON-RPC method is public:</w:t>
-      </w:r>
-      <w:r>
-        <w:t xml:space="preserve"> </w:t>
-      </w:r>
-      <w:r>
-        <w:rPr>
-          <w:rStyle w:val="VerbatimChar"/>
-        </w:rPr>
-        <w:t xml:space="preserve">POST https://alex.ia.utwente.nl/api/1/</w:t>
-      </w:r>
-      <w:r>
-        <w:t xml:space="preserve"> </w:t>
-      </w:r>
-      <w:r>
-        <w:t xml:space="preserve">with</w:t>
-      </w:r>
-      <w:r>
-        <w:t xml:space="preserve"> </w:t>
-      </w:r>
-      <w:r>
-        <w:rPr>
-          <w:rStyle w:val="VerbatimChar"/>
-        </w:rPr>
-        <w:t xml:space="preserve">{"jsonrpc":"2.0","method":"event.upcoming_list","params":[true],"id":1}</w:t>
-      </w:r>
-      <w:r>
-        <w:t xml:space="preserve">. Events</w:t>
-      </w:r>
-      <w:r>
-        <w:t xml:space="preserve"> </w:t>
-      </w:r>
-      <w:r>
-        <w:t xml:space="preserve">carry</w:t>
-      </w:r>
-      <w:r>
-        <w:t xml:space="preserve"> </w:t>
-      </w:r>
-      <w:r>
-        <w:rPr>
-          <w:rStyle w:val="VerbatimChar"/>
-        </w:rPr>
-        <w:t xml:space="preserve">name</w:t>
+        <w:t xml:space="preserve">VAT cannot be set via the API</w:t>
+      </w:r>
+      <w:r>
+        <w:t xml:space="preserve"> </w:t>
+      </w:r>
+      <w:r>
+        <w:t xml:space="preserve">— every shape (</w:t>
+      </w:r>
+      <w:r>
+        <w:rPr>
+          <w:rStyle w:val="VerbatimChar"/>
+        </w:rPr>
+        <w:t xml:space="preserve">vat_category {…}</w:t>
       </w:r>
       <w:r>
         <w:t xml:space="preserve">,</w:t>
@@ -26284,62 +26358,52 @@
         <w:rPr>
           <w:rStyle w:val="VerbatimChar"/>
         </w:rPr>
-        <w:t xml:space="preserve">organizer</w:t>
-      </w:r>
-      <w:r>
-        <w:t xml:space="preserve">,</w:t>
-      </w:r>
-      <w:r>
-        <w:t xml:space="preserve"> </w:t>
-      </w:r>
-      <w:r>
-        <w:rPr>
-          <w:rStyle w:val="VerbatimChar"/>
-        </w:rPr>
-        <w:t xml:space="preserve">locations</w:t>
-      </w:r>
-      <w:r>
-        <w:t xml:space="preserve">,</w:t>
-      </w:r>
-      <w:r>
-        <w:t xml:space="preserve"> </w:t>
-      </w:r>
-      <w:r>
-        <w:rPr>
-          <w:rStyle w:val="VerbatimChar"/>
-        </w:rPr>
-        <w:t xml:space="preserve">starts_at</w:t>
-      </w:r>
-      <w:r>
-        <w:t xml:space="preserve">,</w:t>
-      </w:r>
-      <w:r>
-        <w:t xml:space="preserve"> </w:t>
-      </w:r>
-      <w:r>
-        <w:rPr>
-          <w:rStyle w:val="VerbatimChar"/>
-        </w:rPr>
-        <w:t xml:space="preserve">ends_at</w:t>
-      </w:r>
-      <w:r>
-        <w:t xml:space="preserve"> </w:t>
-      </w:r>
-      <w:r>
-        <w:t xml:space="preserve">— but</w:t>
-      </w:r>
-      <w:r>
-        <w:t xml:space="preserve"> </w:t>
-      </w:r>
-      <w:r>
-        <w:rPr>
-          <w:b/>
-          <w:bCs/>
-        </w:rPr>
-        <w:t xml:space="preserve">no id</w:t>
-      </w:r>
-      <w:r>
-        <w:t xml:space="preserve">.</w:t>
+        <w:t xml:space="preserve">vat_percentage</w:t>
+      </w:r>
+      <w:r>
+        <w:t xml:space="preserve">, …) returns HTTP 500 server-side, so PPP products sync</w:t>
+      </w:r>
+      <w:r>
+        <w:t xml:space="preserve"> </w:t>
+      </w:r>
+      <w:r>
+        <w:rPr>
+          <w:b/>
+          <w:bCs/>
+        </w:rPr>
+        <w:t xml:space="preserve">without</w:t>
+      </w:r>
+      <w:r>
+        <w:rPr>
+          <w:b/>
+          <w:bCs/>
+        </w:rPr>
+        <w:t xml:space="preserve"> </w:t>
+      </w:r>
+      <w:r>
+        <w:rPr>
+          <w:b/>
+          <w:bCs/>
+        </w:rPr>
+        <w:t xml:space="preserve">VAT</w:t>
+      </w:r>
+      <w:r>
+        <w:t xml:space="preserve"> </w:t>
+      </w:r>
+      <w:r>
+        <w:t xml:space="preserve">(like SSS products, which are all unset). VAT is kept locally on</w:t>
+      </w:r>
+      <w:r>
+        <w:t xml:space="preserve"> </w:t>
+      </w:r>
+      <w:r>
+        <w:rPr>
+          <w:rStyle w:val="VerbatimChar"/>
+        </w:rPr>
+        <w:t xml:space="preserve">PppProduct.vatCategory</w:t>
+      </w:r>
+      <w:r>
+        <w:t xml:space="preserve">; set it in the Congressus UI if needed.</w:t>
       </w:r>
     </w:p>
     <w:p>
@@ -26355,7 +26419,7 @@
           <w:b/>
           <w:bCs/>
         </w:rPr>
-        <w:t xml:space="preserve">Auto-sync</w:t>
+        <w:t xml:space="preserve">Two-invoice export</w:t>
       </w:r>
       <w:r>
         <w:t xml:space="preserve"> </w:t>
@@ -26370,22 +26434,128 @@
         <w:rPr>
           <w:rStyle w:val="VerbatimChar"/>
         </w:rPr>
-        <w:t xml:space="preserve">POST /api/ppp/alexia/sync</w:t>
-      </w:r>
-      <w:r>
-        <w:t xml:space="preserve"> </w:t>
-      </w:r>
-      <w:r>
-        <w:t xml:space="preserve">keeps only</w:t>
-      </w:r>
-      <w:r>
-        <w:t xml:space="preserve"> </w:t>
-      </w:r>
-      <w:r>
-        <w:rPr>
-          <w:rStyle w:val="VerbatimChar"/>
-        </w:rPr>
-        <w:t xml:space="preserve">organizer === "Stress"</w:t>
+        <w:t xml:space="preserve">POST /api/admin/invoices/export { scope }</w:t>
+      </w:r>
+      <w:r>
+        <w:t xml:space="preserve"> </w:t>
+      </w:r>
+      <w:r>
+        <w:t xml:space="preserve">(</w:t>
+      </w:r>
+      <w:r>
+        <w:rPr>
+          <w:rStyle w:val="VerbatimChar"/>
+        </w:rPr>
+        <w:t xml:space="preserve">sss</w:t>
+      </w:r>
+      <w:r>
+        <w:t xml:space="preserve"> </w:t>
+      </w:r>
+      <w:r>
+        <w:t xml:space="preserve">|</w:t>
+      </w:r>
+      <w:r>
+        <w:t xml:space="preserve"> </w:t>
+      </w:r>
+      <w:r>
+        <w:rPr>
+          <w:rStyle w:val="VerbatimChar"/>
+        </w:rPr>
+        <w:t xml:space="preserve">ppp</w:t>
+      </w:r>
+      <w:r>
+        <w:t xml:space="preserve"> </w:t>
+      </w:r>
+      <w:r>
+        <w:t xml:space="preserve">|</w:t>
+      </w:r>
+      <w:r>
+        <w:t xml:space="preserve"> </w:t>
+      </w:r>
+      <w:r>
+        <w:rPr>
+          <w:rStyle w:val="VerbatimChar"/>
+        </w:rPr>
+        <w:t xml:space="preserve">all</w:t>
+      </w:r>
+      <w:r>
+        <w:t xml:space="preserve">) creates</w:t>
+      </w:r>
+      <w:r>
+        <w:t xml:space="preserve"> </w:t>
+      </w:r>
+      <w:r>
+        <w:rPr>
+          <w:b/>
+          <w:bCs/>
+        </w:rPr>
+        <w:t xml:space="preserve">separate</w:t>
+      </w:r>
+      <w:r>
+        <w:t xml:space="preserve"> </w:t>
+      </w:r>
+      <w:r>
+        <w:t xml:space="preserve">Congressus invoices per member per month: an</w:t>
+      </w:r>
+      <w:r>
+        <w:t xml:space="preserve"> </w:t>
+      </w:r>
+      <w:r>
+        <w:rPr>
+          <w:rStyle w:val="VerbatimChar"/>
+        </w:rPr>
+        <w:t xml:space="preserve">"SSS &lt;month&gt;"</w:t>
+      </w:r>
+      <w:r>
+        <w:t xml:space="preserve"> </w:t>
+      </w:r>
+      <w:r>
+        <w:t xml:space="preserve">invoice and a</w:t>
+      </w:r>
+      <w:r>
+        <w:t xml:space="preserve"> </w:t>
+      </w:r>
+      <w:r>
+        <w:rPr>
+          <w:rStyle w:val="VerbatimChar"/>
+        </w:rPr>
+        <w:t xml:space="preserve">"PPP &lt;month&gt;"</w:t>
+      </w:r>
+      <w:r>
+        <w:t xml:space="preserve"> </w:t>
+      </w:r>
+      <w:r>
+        <w:t xml:space="preserve">invoice. PPP line descriptions</w:t>
+      </w:r>
+      <w:r>
+        <w:t xml:space="preserve"> </w:t>
+      </w:r>
+      <w:r>
+        <w:t xml:space="preserve">include the activity name (</w:t>
+      </w:r>
+      <w:r>
+        <w:rPr>
+          <w:rStyle w:val="VerbatimChar"/>
+        </w:rPr>
+        <w:t xml:space="preserve">"Pils – Borrel 28 jun"</w:t>
+      </w:r>
+      <w:r>
+        <w:t xml:space="preserve">); same product at different</w:t>
+      </w:r>
+      <w:r>
+        <w:t xml:space="preserve"> </w:t>
+      </w:r>
+      <w:r>
+        <w:t xml:space="preserve">activities/prices stays on separate lines. Both reuse</w:t>
+      </w:r>
+      <w:r>
+        <w:t xml:space="preserve"> </w:t>
+      </w:r>
+      <w:r>
+        <w:rPr>
+          <w:rStyle w:val="VerbatimChar"/>
+        </w:rPr>
+        <w:t xml:space="preserve">createSaleInvoice()</w:t>
       </w:r>
       <w:r>
         <w:t xml:space="preserve"> </w:t>
@@ -26397,104 +26567,71 @@
         <w:t xml:space="preserve"> </w:t>
       </w:r>
       <w:r>
-        <w:rPr>
-          <w:b/>
-          <w:bCs/>
-        </w:rPr>
-        <w:t xml:space="preserve">find-or-creates</w:t>
-      </w:r>
-      <w:r>
-        <w:t xml:space="preserve"> </w:t>
-      </w:r>
-      <w:r>
-        <w:t xml:space="preserve">a</w:t>
-      </w:r>
-      <w:r>
-        <w:t xml:space="preserve"> </w:t>
-      </w:r>
-      <w:r>
-        <w:rPr>
-          <w:rStyle w:val="VerbatimChar"/>
-        </w:rPr>
-        <w:t xml:space="preserve">PppActivity</w:t>
-      </w:r>
-      <w:r>
-        <w:t xml:space="preserve"> </w:t>
-      </w:r>
-      <w:r>
-        <w:t xml:space="preserve">for each (date =</w:t>
-      </w:r>
-      <w:r>
-        <w:t xml:space="preserve"> </w:t>
-      </w:r>
-      <w:r>
-        <w:rPr>
-          <w:rStyle w:val="VerbatimChar"/>
-        </w:rPr>
-        <w:t xml:space="preserve">starts_at</w:t>
-      </w:r>
-      <w:r>
-        <w:t xml:space="preserve">), matched by</w:t>
-      </w:r>
-      <w:r>
-        <w:t xml:space="preserve"> </w:t>
-      </w:r>
-      <w:r>
-        <w:rPr>
-          <w:b/>
-          <w:bCs/>
-        </w:rPr>
-        <w:t xml:space="preserve">name + calendar day</w:t>
-      </w:r>
-      <w:r>
-        <w:t xml:space="preserve"> </w:t>
-      </w:r>
-      <w:r>
-        <w:t xml:space="preserve">(no id exists). It runs when a bartender lands on</w:t>
-      </w:r>
-      <w:r>
-        <w:t xml:space="preserve"> </w:t>
-      </w:r>
-      <w:r>
-        <w:rPr>
-          <w:rStyle w:val="VerbatimChar"/>
-        </w:rPr>
-        <w:t xml:space="preserve">/ppp</w:t>
-      </w:r>
-      <w:r>
-        <w:t xml:space="preserve"> </w:t>
-      </w:r>
-      <w:r>
-        <w:rPr>
-          <w:b/>
-          <w:bCs/>
-        </w:rPr>
-        <w:t xml:space="preserve">and</w:t>
-      </w:r>
-      <w:r>
-        <w:t xml:space="preserve"> </w:t>
-      </w:r>
-      <w:r>
-        <w:t xml:space="preserve">when an admin opens</w:t>
-      </w:r>
-      <w:r>
-        <w:t xml:space="preserve"> </w:t>
-      </w:r>
-      <w:r>
-        <w:rPr>
-          <w:b/>
-          <w:bCs/>
-        </w:rPr>
-        <w:t xml:space="preserve">Admin → PPP → Activities</w:t>
-      </w:r>
-      <w:r>
-        <w:t xml:space="preserve">, so new borrels appear</w:t>
-      </w:r>
-      <w:r>
-        <w:t xml:space="preserve"> </w:t>
-      </w:r>
-      <w:r>
-        <w:t xml:space="preserve">automatically and the admin can pre-set specials on future ones.</w:t>
+        <w:t xml:space="preserve">the Mendix fallback for lines without an offer id.</w:t>
+      </w:r>
+    </w:p>
+    <w:bookmarkEnd w:id="149"/>
+    <w:bookmarkStart w:id="150" w:name="alexia-integration-scheduled-borrels"/>
+    <w:p>
+      <w:pPr>
+        <w:pStyle w:val="Heading2"/>
+      </w:pPr>
+      <w:r>
+        <w:t xml:space="preserve">Alexia integration (scheduled borrels)</w:t>
+      </w:r>
+    </w:p>
+    <w:p>
+      <w:pPr>
+        <w:pStyle w:val="FirstParagraph"/>
+      </w:pPr>
+      <w:r>
+        <w:t xml:space="preserve">The drinks committee schedules borrels in</w:t>
+      </w:r>
+      <w:r>
+        <w:t xml:space="preserve"> </w:t>
+      </w:r>
+      <w:r>
+        <w:rPr>
+          <w:b/>
+          <w:bCs/>
+        </w:rPr>
+        <w:t xml:space="preserve">Alexia</w:t>
+      </w:r>
+      <w:r>
+        <w:t xml:space="preserve"> </w:t>
+      </w:r>
+      <w:r>
+        <w:t xml:space="preserve">(Inter-Actief's system,</w:t>
+      </w:r>
+      <w:r>
+        <w:t xml:space="preserve"> </w:t>
+      </w:r>
+      <w:r>
+        <w:rPr>
+          <w:rStyle w:val="VerbatimChar"/>
+        </w:rPr>
+        <w:t xml:space="preserve">alex.ia.utwente.nl</w:t>
+      </w:r>
+      <w:r>
+        <w:t xml:space="preserve">). PPP imports them so bartenders don't retype names and admins</w:t>
+      </w:r>
+      <w:r>
+        <w:t xml:space="preserve"> </w:t>
+      </w:r>
+      <w:r>
+        <w:t xml:space="preserve">can prepare specials in advance. Logic in</w:t>
+      </w:r>
+      <w:r>
+        <w:t xml:space="preserve"> </w:t>
+      </w:r>
+      <w:r>
+        <w:rPr>
+          <w:rStyle w:val="VerbatimChar"/>
+        </w:rPr>
+        <w:t xml:space="preserve">src/lib/alexia.ts</w:t>
+      </w:r>
+      <w:r>
+        <w:t xml:space="preserve">.</w:t>
       </w:r>
     </w:p>
     <w:p>
@@ -26502,7 +26639,7 @@
         <w:pStyle w:val="Compact"/>
         <w:numPr>
           <w:ilvl w:val="0"/>
-          <w:numId w:val="1051"/>
+          <w:numId w:val="1052"/>
         </w:numPr>
       </w:pPr>
       <w:r>
@@ -26510,19 +26647,137 @@
           <w:b/>
           <w:bCs/>
         </w:rPr>
-        <w:t xml:space="preserve">Idempotent + fail-soft</w:t>
-      </w:r>
-      <w:r>
-        <w:t xml:space="preserve"> </w:t>
-      </w:r>
-      <w:r>
-        <w:t xml:space="preserve">— re-syncing creates nothing new; any Alexia</w:t>
-      </w:r>
-      <w:r>
-        <w:t xml:space="preserve"> </w:t>
-      </w:r>
-      <w:r>
-        <w:t xml:space="preserve">error/timeout just yields no import and PPP keeps working.</w:t>
+        <w:t xml:space="preserve">Public, no auth</w:t>
+      </w:r>
+      <w:r>
+        <w:t xml:space="preserve"> </w:t>
+      </w:r>
+      <w:r>
+        <w:t xml:space="preserve">— Alexia's</w:t>
+      </w:r>
+      <w:r>
+        <w:t xml:space="preserve"> </w:t>
+      </w:r>
+      <w:r>
+        <w:rPr>
+          <w:rStyle w:val="VerbatimChar"/>
+        </w:rPr>
+        <w:t xml:space="preserve">event.upcoming_list</w:t>
+      </w:r>
+      <w:r>
+        <w:t xml:space="preserve"> </w:t>
+      </w:r>
+      <w:r>
+        <w:t xml:space="preserve">JSON-RPC method is public:</w:t>
+      </w:r>
+      <w:r>
+        <w:t xml:space="preserve"> </w:t>
+      </w:r>
+      <w:r>
+        <w:rPr>
+          <w:rStyle w:val="VerbatimChar"/>
+        </w:rPr>
+        <w:t xml:space="preserve">POST https://alex.ia.utwente.nl/api/1/</w:t>
+      </w:r>
+      <w:r>
+        <w:t xml:space="preserve"> </w:t>
+      </w:r>
+      <w:r>
+        <w:t xml:space="preserve">with</w:t>
+      </w:r>
+      <w:r>
+        <w:t xml:space="preserve"> </w:t>
+      </w:r>
+      <w:r>
+        <w:rPr>
+          <w:rStyle w:val="VerbatimChar"/>
+        </w:rPr>
+        <w:t xml:space="preserve">{"jsonrpc":"2.0","method":"event.upcoming_list","params":[true],"id":1}</w:t>
+      </w:r>
+      <w:r>
+        <w:t xml:space="preserve">. Events</w:t>
+      </w:r>
+      <w:r>
+        <w:t xml:space="preserve"> </w:t>
+      </w:r>
+      <w:r>
+        <w:t xml:space="preserve">carry</w:t>
+      </w:r>
+      <w:r>
+        <w:t xml:space="preserve"> </w:t>
+      </w:r>
+      <w:r>
+        <w:rPr>
+          <w:rStyle w:val="VerbatimChar"/>
+        </w:rPr>
+        <w:t xml:space="preserve">name</w:t>
+      </w:r>
+      <w:r>
+        <w:t xml:space="preserve">,</w:t>
+      </w:r>
+      <w:r>
+        <w:t xml:space="preserve"> </w:t>
+      </w:r>
+      <w:r>
+        <w:rPr>
+          <w:rStyle w:val="VerbatimChar"/>
+        </w:rPr>
+        <w:t xml:space="preserve">organizer</w:t>
+      </w:r>
+      <w:r>
+        <w:t xml:space="preserve">,</w:t>
+      </w:r>
+      <w:r>
+        <w:t xml:space="preserve"> </w:t>
+      </w:r>
+      <w:r>
+        <w:rPr>
+          <w:rStyle w:val="VerbatimChar"/>
+        </w:rPr>
+        <w:t xml:space="preserve">locations</w:t>
+      </w:r>
+      <w:r>
+        <w:t xml:space="preserve">,</w:t>
+      </w:r>
+      <w:r>
+        <w:t xml:space="preserve"> </w:t>
+      </w:r>
+      <w:r>
+        <w:rPr>
+          <w:rStyle w:val="VerbatimChar"/>
+        </w:rPr>
+        <w:t xml:space="preserve">starts_at</w:t>
+      </w:r>
+      <w:r>
+        <w:t xml:space="preserve">,</w:t>
+      </w:r>
+      <w:r>
+        <w:t xml:space="preserve"> </w:t>
+      </w:r>
+      <w:r>
+        <w:rPr>
+          <w:rStyle w:val="VerbatimChar"/>
+        </w:rPr>
+        <w:t xml:space="preserve">ends_at</w:t>
+      </w:r>
+      <w:r>
+        <w:t xml:space="preserve"> </w:t>
+      </w:r>
+      <w:r>
+        <w:t xml:space="preserve">— but</w:t>
+      </w:r>
+      <w:r>
+        <w:t xml:space="preserve"> </w:t>
+      </w:r>
+      <w:r>
+        <w:rPr>
+          <w:b/>
+          <w:bCs/>
+        </w:rPr>
+        <w:t xml:space="preserve">no id</w:t>
+      </w:r>
+      <w:r>
+        <w:t xml:space="preserve">.</w:t>
       </w:r>
     </w:p>
     <w:p>
@@ -26530,7 +26785,7 @@
         <w:pStyle w:val="Compact"/>
         <w:numPr>
           <w:ilvl w:val="0"/>
-          <w:numId w:val="1051"/>
+          <w:numId w:val="1052"/>
         </w:numPr>
       </w:pPr>
       <w:r>
@@ -26538,6 +26793,189 @@
           <w:b/>
           <w:bCs/>
         </w:rPr>
+        <w:t xml:space="preserve">Auto-sync</w:t>
+      </w:r>
+      <w:r>
+        <w:t xml:space="preserve"> </w:t>
+      </w:r>
+      <w:r>
+        <w:t xml:space="preserve">—</w:t>
+      </w:r>
+      <w:r>
+        <w:t xml:space="preserve"> </w:t>
+      </w:r>
+      <w:r>
+        <w:rPr>
+          <w:rStyle w:val="VerbatimChar"/>
+        </w:rPr>
+        <w:t xml:space="preserve">POST /api/ppp/alexia/sync</w:t>
+      </w:r>
+      <w:r>
+        <w:t xml:space="preserve"> </w:t>
+      </w:r>
+      <w:r>
+        <w:t xml:space="preserve">keeps only</w:t>
+      </w:r>
+      <w:r>
+        <w:t xml:space="preserve"> </w:t>
+      </w:r>
+      <w:r>
+        <w:rPr>
+          <w:rStyle w:val="VerbatimChar"/>
+        </w:rPr>
+        <w:t xml:space="preserve">organizer === "Stress"</w:t>
+      </w:r>
+      <w:r>
+        <w:t xml:space="preserve"> </w:t>
+      </w:r>
+      <w:r>
+        <w:t xml:space="preserve">and</w:t>
+      </w:r>
+      <w:r>
+        <w:t xml:space="preserve"> </w:t>
+      </w:r>
+      <w:r>
+        <w:rPr>
+          <w:b/>
+          <w:bCs/>
+        </w:rPr>
+        <w:t xml:space="preserve">find-or-creates</w:t>
+      </w:r>
+      <w:r>
+        <w:t xml:space="preserve"> </w:t>
+      </w:r>
+      <w:r>
+        <w:t xml:space="preserve">a</w:t>
+      </w:r>
+      <w:r>
+        <w:t xml:space="preserve"> </w:t>
+      </w:r>
+      <w:r>
+        <w:rPr>
+          <w:rStyle w:val="VerbatimChar"/>
+        </w:rPr>
+        <w:t xml:space="preserve">PppActivity</w:t>
+      </w:r>
+      <w:r>
+        <w:t xml:space="preserve"> </w:t>
+      </w:r>
+      <w:r>
+        <w:t xml:space="preserve">for each (date =</w:t>
+      </w:r>
+      <w:r>
+        <w:t xml:space="preserve"> </w:t>
+      </w:r>
+      <w:r>
+        <w:rPr>
+          <w:rStyle w:val="VerbatimChar"/>
+        </w:rPr>
+        <w:t xml:space="preserve">starts_at</w:t>
+      </w:r>
+      <w:r>
+        <w:t xml:space="preserve">), matched by</w:t>
+      </w:r>
+      <w:r>
+        <w:t xml:space="preserve"> </w:t>
+      </w:r>
+      <w:r>
+        <w:rPr>
+          <w:b/>
+          <w:bCs/>
+        </w:rPr>
+        <w:t xml:space="preserve">name + calendar day</w:t>
+      </w:r>
+      <w:r>
+        <w:t xml:space="preserve"> </w:t>
+      </w:r>
+      <w:r>
+        <w:t xml:space="preserve">(no id exists). It runs when a bartender lands on</w:t>
+      </w:r>
+      <w:r>
+        <w:t xml:space="preserve"> </w:t>
+      </w:r>
+      <w:r>
+        <w:rPr>
+          <w:rStyle w:val="VerbatimChar"/>
+        </w:rPr>
+        <w:t xml:space="preserve">/ppp</w:t>
+      </w:r>
+      <w:r>
+        <w:t xml:space="preserve"> </w:t>
+      </w:r>
+      <w:r>
+        <w:rPr>
+          <w:b/>
+          <w:bCs/>
+        </w:rPr>
+        <w:t xml:space="preserve">and</w:t>
+      </w:r>
+      <w:r>
+        <w:t xml:space="preserve"> </w:t>
+      </w:r>
+      <w:r>
+        <w:t xml:space="preserve">when an admin opens</w:t>
+      </w:r>
+      <w:r>
+        <w:t xml:space="preserve"> </w:t>
+      </w:r>
+      <w:r>
+        <w:rPr>
+          <w:b/>
+          <w:bCs/>
+        </w:rPr>
+        <w:t xml:space="preserve">Admin → PPP → Activities</w:t>
+      </w:r>
+      <w:r>
+        <w:t xml:space="preserve">, so new borrels appear</w:t>
+      </w:r>
+      <w:r>
+        <w:t xml:space="preserve"> </w:t>
+      </w:r>
+      <w:r>
+        <w:t xml:space="preserve">automatically and the admin can pre-set specials on future ones.</w:t>
+      </w:r>
+    </w:p>
+    <w:p>
+      <w:pPr>
+        <w:pStyle w:val="Compact"/>
+        <w:numPr>
+          <w:ilvl w:val="0"/>
+          <w:numId w:val="1052"/>
+        </w:numPr>
+      </w:pPr>
+      <w:r>
+        <w:rPr>
+          <w:b/>
+          <w:bCs/>
+        </w:rPr>
+        <w:t xml:space="preserve">Idempotent + fail-soft</w:t>
+      </w:r>
+      <w:r>
+        <w:t xml:space="preserve"> </w:t>
+      </w:r>
+      <w:r>
+        <w:t xml:space="preserve">— re-syncing creates nothing new; any Alexia</w:t>
+      </w:r>
+      <w:r>
+        <w:t xml:space="preserve"> </w:t>
+      </w:r>
+      <w:r>
+        <w:t xml:space="preserve">error/timeout just yields no import and PPP keeps working.</w:t>
+      </w:r>
+    </w:p>
+    <w:p>
+      <w:pPr>
+        <w:pStyle w:val="Compact"/>
+        <w:numPr>
+          <w:ilvl w:val="0"/>
+          <w:numId w:val="1052"/>
+        </w:numPr>
+      </w:pPr>
+      <w:r>
+        <w:rPr>
+          <w:b/>
+          <w:bCs/>
+        </w:rPr>
         <w:t xml:space="preserve">Caveat</w:t>
       </w:r>
       <w:r>
@@ -26625,8 +27063,8 @@
         <w:t xml:space="preserve">).</w:t>
       </w:r>
     </w:p>
-    <w:bookmarkEnd w:id="149"/>
-    <w:bookmarkStart w:id="151" w:name="data-model-ppp"/>
+    <w:bookmarkEnd w:id="150"/>
+    <w:bookmarkStart w:id="152" w:name="data-model-ppp"/>
     <w:p>
       <w:pPr>
         <w:pStyle w:val="Heading2"/>
@@ -26645,7 +27083,7 @@
       <w:r>
         <w:t xml:space="preserve"> </w:t>
       </w:r>
-      <w:hyperlink r:id="rId150">
+      <w:hyperlink r:id="rId151">
         <w:r>
           <w:rPr>
             <w:rStyle w:val="Hyperlink"/>
@@ -26665,7 +27103,7 @@
         <w:pStyle w:val="Compact"/>
         <w:numPr>
           <w:ilvl w:val="0"/>
-          <w:numId w:val="1052"/>
+          <w:numId w:val="1053"/>
         </w:numPr>
       </w:pPr>
       <w:r>
@@ -26777,7 +27215,85 @@
         <w:t xml:space="preserve">discountsActive</w:t>
       </w:r>
       <w:r>
-        <w:t xml:space="preserve">),</w:t>
+        <w:t xml:space="preserve">,</w:t>
+      </w:r>
+      <w:r>
+        <w:t xml:space="preserve"> </w:t>
+      </w:r>
+      <w:r>
+        <w:rPr>
+          <w:rStyle w:val="VerbatimChar"/>
+        </w:rPr>
+        <w:t xml:space="preserve">startsAt?</w:t>
+      </w:r>
+      <w:r>
+        <w:t xml:space="preserve">/</w:t>
+      </w:r>
+      <w:r>
+        <w:rPr>
+          <w:rStyle w:val="VerbatimChar"/>
+        </w:rPr>
+        <w:t xml:space="preserve">endsAt?</w:t>
+      </w:r>
+      <w:r>
+        <w:t xml:space="preserve"> </w:t>
+      </w:r>
+      <w:r>
+        <w:t xml:space="preserve">for the SumUp</w:t>
+      </w:r>
+      <w:r>
+        <w:t xml:space="preserve"> </w:t>
+      </w:r>
+      <w:r>
+        <w:t xml:space="preserve">window),</w:t>
+      </w:r>
+      <w:r>
+        <w:t xml:space="preserve"> </w:t>
+      </w:r>
+      <w:r>
+        <w:rPr>
+          <w:rStyle w:val="VerbatimChar"/>
+        </w:rPr>
+        <w:t xml:space="preserve">PppActivityUsage</w:t>
+      </w:r>
+      <w:r>
+        <w:t xml:space="preserve"> </w:t>
+      </w:r>
+      <w:r>
+        <w:t xml:space="preserve">(per-activity SBZ usage:</w:t>
+      </w:r>
+      <w:r>
+        <w:t xml:space="preserve"> </w:t>
+      </w:r>
+      <w:r>
+        <w:rPr>
+          <w:rStyle w:val="VerbatimChar"/>
+        </w:rPr>
+        <w:t xml:space="preserve">sbzKey</w:t>
+      </w:r>
+      <w:r>
+        <w:t xml:space="preserve"> </w:t>
+      </w:r>
+      <w:r>
+        <w:t xml:space="preserve">+</w:t>
+      </w:r>
+      <w:r>
+        <w:t xml:space="preserve"> </w:t>
+      </w:r>
+      <w:r>
+        <w:rPr>
+          <w:rStyle w:val="VerbatimChar"/>
+        </w:rPr>
+        <w:t xml:space="preserve">quantity</w:t>
+      </w:r>
+      <w:r>
+        <w:t xml:space="preserve">, for</w:t>
+      </w:r>
+      <w:r>
+        <w:t xml:space="preserve"> </w:t>
+      </w:r>
+      <w:r>
+        <w:t xml:space="preserve">the P/L cost of goods),</w:t>
       </w:r>
       <w:r>
         <w:t xml:space="preserve"> </w:t>
@@ -26914,7 +27430,7 @@
         <w:pStyle w:val="Compact"/>
         <w:numPr>
           <w:ilvl w:val="0"/>
-          <w:numId w:val="1052"/>
+          <w:numId w:val="1053"/>
         </w:numPr>
       </w:pPr>
       <w:r>
@@ -26971,7 +27487,7 @@
         <w:pStyle w:val="Compact"/>
         <w:numPr>
           <w:ilvl w:val="0"/>
-          <w:numId w:val="1052"/>
+          <w:numId w:val="1053"/>
         </w:numPr>
       </w:pPr>
       <w:r>
@@ -26992,7 +27508,7 @@
         <w:pStyle w:val="Compact"/>
         <w:numPr>
           <w:ilvl w:val="0"/>
-          <w:numId w:val="1052"/>
+          <w:numId w:val="1053"/>
         </w:numPr>
       </w:pPr>
       <w:r>
@@ -27044,8 +27560,8 @@
         <w:t xml:space="preserve">unchanged for identity.</w:t>
       </w:r>
     </w:p>
-    <w:bookmarkEnd w:id="151"/>
-    <w:bookmarkStart w:id="152" w:name="api-reference-ppp"/>
+    <w:bookmarkEnd w:id="152"/>
+    <w:bookmarkStart w:id="153" w:name="api-reference-ppp"/>
     <w:p>
       <w:pPr>
         <w:pStyle w:val="Heading2"/>
@@ -27859,7 +28375,13 @@
         <w:t xml:space="preserve"> </w:t>
       </w:r>
       <w:r>
-        <w:t xml:space="preserve">(+</w:t>
+        <w:t xml:space="preserve">(GET = detail + P/L,</w:t>
+      </w:r>
+      <w:r>
+        <w:t xml:space="preserve"> </w:t>
+      </w:r>
+      <w:r>
+        <w:t xml:space="preserve">PUT = save SBZ usage; +</w:t>
       </w:r>
       <w:r>
         <w:rPr>
@@ -27868,6 +28390,42 @@
         <w:t xml:space="preserve">/discounts</w:t>
       </w:r>
       <w:r>
+        <w:t xml:space="preserve">, +</w:t>
+      </w:r>
+      <w:r>
+        <w:rPr>
+          <w:rStyle w:val="VerbatimChar"/>
+        </w:rPr>
+        <w:t xml:space="preserve">/sumup</w:t>
+      </w:r>
+      <w:r>
+        <w:t xml:space="preserve"> </w:t>
+      </w:r>
+      <w:r>
+        <w:t xml:space="preserve">= live card revenue),</w:t>
+      </w:r>
+      <w:r>
+        <w:t xml:space="preserve"> </w:t>
+      </w:r>
+      <w:r>
+        <w:rPr>
+          <w:rStyle w:val="VerbatimChar"/>
+        </w:rPr>
+        <w:t xml:space="preserve">…/stats</w:t>
+      </w:r>
+      <w:r>
+        <w:t xml:space="preserve"> </w:t>
+      </w:r>
+      <w:r>
+        <w:t xml:space="preserve">(</w:t>
+      </w:r>
+      <w:r>
+        <w:rPr>
+          <w:rStyle w:val="VerbatimChar"/>
+        </w:rPr>
+        <w:t xml:space="preserve">?range=…|since_export</w:t>
+      </w:r>
+      <w:r>
         <w:t xml:space="preserve">),</w:t>
       </w:r>
       <w:r>
@@ -27877,30 +28435,6 @@
         <w:rPr>
           <w:rStyle w:val="VerbatimChar"/>
         </w:rPr>
-        <w:t xml:space="preserve">…/stats</w:t>
-      </w:r>
-      <w:r>
-        <w:t xml:space="preserve"> </w:t>
-      </w:r>
-      <w:r>
-        <w:t xml:space="preserve">(</w:t>
-      </w:r>
-      <w:r>
-        <w:rPr>
-          <w:rStyle w:val="VerbatimChar"/>
-        </w:rPr>
-        <w:t xml:space="preserve">?range=…|since_export</w:t>
-      </w:r>
-      <w:r>
-        <w:t xml:space="preserve">),</w:t>
-      </w:r>
-      <w:r>
-        <w:t xml:space="preserve"> </w:t>
-      </w:r>
-      <w:r>
-        <w:rPr>
-          <w:rStyle w:val="VerbatimChar"/>
-        </w:rPr>
         <w:t xml:space="preserve">…/invoices</w:t>
       </w:r>
       <w:r>
@@ -27943,8 +28477,8 @@
         <w:t xml:space="preserve">.</w:t>
       </w:r>
     </w:p>
-    <w:bookmarkEnd w:id="152"/>
-    <w:bookmarkStart w:id="153" w:name="environment"/>
+    <w:bookmarkEnd w:id="153"/>
+    <w:bookmarkStart w:id="154" w:name="environment"/>
     <w:p>
       <w:pPr>
         <w:pStyle w:val="Heading2"/>
@@ -28258,6 +28792,53 @@
           </w:p>
         </w:tc>
       </w:tr>
+      <w:tr>
+        <w:tc>
+          <w:tcPr/>
+          <w:p>
+            <w:pPr>
+              <w:pStyle w:val="Compact"/>
+            </w:pPr>
+            <w:r>
+              <w:rPr>
+                <w:rStyle w:val="VerbatimChar"/>
+              </w:rPr>
+              <w:t xml:space="preserve">SUMUP_API_KEY</w:t>
+            </w:r>
+          </w:p>
+        </w:tc>
+        <w:tc>
+          <w:tcPr/>
+          <w:p>
+            <w:pPr>
+              <w:pStyle w:val="Compact"/>
+            </w:pPr>
+            <w:r>
+              <w:t xml:space="preserve">–</w:t>
+            </w:r>
+          </w:p>
+        </w:tc>
+        <w:tc>
+          <w:tcPr/>
+          <w:p>
+            <w:pPr>
+              <w:pStyle w:val="Compact"/>
+            </w:pPr>
+            <w:r>
+              <w:t xml:space="preserve">SumUp secret API key (</w:t>
+            </w:r>
+            <w:r>
+              <w:rPr>
+                <w:rStyle w:val="VerbatimChar"/>
+              </w:rPr>
+              <w:t xml:space="preserve">sup_sk_…</w:t>
+            </w:r>
+            <w:r>
+              <w:t xml:space="preserve">), used as a Bearer token to pull card revenue for the activity P/L. Fail-soft if unset.</w:t>
+            </w:r>
+          </w:p>
+        </w:tc>
+      </w:tr>
     </w:tbl>
     <w:p>
       <w:pPr>
@@ -28316,9 +28897,9 @@
         <w:br w:type="page"/>
       </w:r>
     </w:p>
-    <w:bookmarkEnd w:id="153"/>
     <w:bookmarkEnd w:id="154"/>
-    <w:bookmarkStart w:id="168" w:name="security-model"/>
+    <w:bookmarkEnd w:id="155"/>
+    <w:bookmarkStart w:id="169" w:name="security-model"/>
     <w:p>
       <w:pPr>
         <w:pStyle w:val="Heading1"/>
@@ -28371,7 +28952,7 @@
         <w:t xml:space="preserve">trade-offs made for a shared, physical kiosk.</w:t>
       </w:r>
     </w:p>
-    <w:bookmarkStart w:id="158" w:name="authentication--authorisation"/>
+    <w:bookmarkStart w:id="159" w:name="authentication--authorisation"/>
     <w:p>
       <w:pPr>
         <w:pStyle w:val="Heading2"/>
@@ -28380,296 +28961,13 @@
         <w:t xml:space="preserve">Authentication &amp; authorisation</w:t>
       </w:r>
     </w:p>
-    <w:bookmarkStart w:id="155" w:name="admin"/>
+    <w:bookmarkStart w:id="156" w:name="admin"/>
     <w:p>
       <w:pPr>
         <w:pStyle w:val="Heading3"/>
       </w:pPr>
       <w:r>
         <w:t xml:space="preserve">Admin</w:t>
-      </w:r>
-    </w:p>
-    <w:p>
-      <w:pPr>
-        <w:pStyle w:val="Compact"/>
-        <w:numPr>
-          <w:ilvl w:val="0"/>
-          <w:numId w:val="1053"/>
-        </w:numPr>
-      </w:pPr>
-      <w:r>
-        <w:t xml:space="preserve">Login (</w:t>
-      </w:r>
-      <w:r>
-        <w:rPr>
-          <w:rStyle w:val="VerbatimChar"/>
-        </w:rPr>
-        <w:t xml:space="preserve">POST /api/auth/login</w:t>
-      </w:r>
-      <w:r>
-        <w:t xml:space="preserve">) verifies a bcrypt password and sets an</w:t>
-      </w:r>
-      <w:r>
-        <w:t xml:space="preserve"> </w:t>
-      </w:r>
-      <w:r>
-        <w:rPr>
-          <w:b/>
-          <w:bCs/>
-        </w:rPr>
-        <w:t xml:space="preserve">httpOnly</w:t>
-      </w:r>
-      <w:r>
-        <w:t xml:space="preserve"> </w:t>
-      </w:r>
-      <w:r>
-        <w:rPr>
-          <w:rStyle w:val="VerbatimChar"/>
-        </w:rPr>
-        <w:t xml:space="preserve">session</w:t>
-      </w:r>
-      <w:r>
-        <w:t xml:space="preserve"> </w:t>
-      </w:r>
-      <w:r>
-        <w:t xml:space="preserve">cookie (7-day</w:t>
-      </w:r>
-      <w:r>
-        <w:t xml:space="preserve"> </w:t>
-      </w:r>
-      <w:r>
-        <w:rPr>
-          <w:rStyle w:val="VerbatimChar"/>
-        </w:rPr>
-        <w:t xml:space="preserve">Session</w:t>
-      </w:r>
-      <w:r>
-        <w:t xml:space="preserve"> </w:t>
-      </w:r>
-      <w:r>
-        <w:t xml:space="preserve">row).</w:t>
-      </w:r>
-    </w:p>
-    <w:p>
-      <w:pPr>
-        <w:pStyle w:val="Compact"/>
-        <w:numPr>
-          <w:ilvl w:val="0"/>
-          <w:numId w:val="1053"/>
-        </w:numPr>
-      </w:pPr>
-      <w:r>
-        <w:rPr>
-          <w:rStyle w:val="VerbatimChar"/>
-        </w:rPr>
-        <w:t xml:space="preserve">requireAdmin()</w:t>
-      </w:r>
-      <w:r>
-        <w:t xml:space="preserve"> </w:t>
-      </w:r>
-      <w:r>
-        <w:t xml:space="preserve">(</w:t>
-      </w:r>
-      <w:r>
-        <w:rPr>
-          <w:rStyle w:val="VerbatimChar"/>
-        </w:rPr>
-        <w:t xml:space="preserve">src/lib/auth.ts</w:t>
-      </w:r>
-      <w:r>
-        <w:t xml:space="preserve">) loads the session, checks it isn't expired,</w:t>
-      </w:r>
-      <w:r>
-        <w:t xml:space="preserve"> </w:t>
-      </w:r>
-      <w:r>
-        <w:t xml:space="preserve">and checks</w:t>
-      </w:r>
-      <w:r>
-        <w:t xml:space="preserve"> </w:t>
-      </w:r>
-      <w:r>
-        <w:rPr>
-          <w:rStyle w:val="VerbatimChar"/>
-        </w:rPr>
-        <w:t xml:space="preserve">role === "ADMIN"</w:t>
-      </w:r>
-      <w:r>
-        <w:t xml:space="preserve">.</w:t>
-      </w:r>
-      <w:r>
-        <w:t xml:space="preserve"> </w:t>
-      </w:r>
-      <w:r>
-        <w:rPr>
-          <w:b/>
-          <w:bCs/>
-        </w:rPr>
-        <w:t xml:space="preserve">Every</w:t>
-      </w:r>
-      <w:r>
-        <w:t xml:space="preserve"> </w:t>
-      </w:r>
-      <w:r>
-        <w:rPr>
-          <w:rStyle w:val="VerbatimChar"/>
-        </w:rPr>
-        <w:t xml:space="preserve">/api/admin/*</w:t>
-      </w:r>
-      <w:r>
-        <w:t xml:space="preserve"> </w:t>
-      </w:r>
-      <w:r>
-        <w:t xml:space="preserve">handler calls it.</w:t>
-      </w:r>
-    </w:p>
-    <w:p>
-      <w:pPr>
-        <w:pStyle w:val="Compact"/>
-        <w:numPr>
-          <w:ilvl w:val="0"/>
-          <w:numId w:val="1053"/>
-        </w:numPr>
-      </w:pPr>
-      <w:r>
-        <w:t xml:space="preserve">The admin pages are gated by a</w:t>
-      </w:r>
-      <w:r>
-        <w:t xml:space="preserve"> </w:t>
-      </w:r>
-      <w:r>
-        <w:rPr>
-          <w:b/>
-          <w:bCs/>
-        </w:rPr>
-        <w:t xml:space="preserve">server-side layout</w:t>
-      </w:r>
-      <w:r>
-        <w:t xml:space="preserve"> </w:t>
-      </w:r>
-      <w:r>
-        <w:t xml:space="preserve">(</w:t>
-      </w:r>
-      <w:r>
-        <w:rPr>
-          <w:rStyle w:val="VerbatimChar"/>
-        </w:rPr>
-        <w:t xml:space="preserve">requireAdmin()</w:t>
-      </w:r>
-      <w:r>
-        <w:t xml:space="preserve"> </w:t>
-      </w:r>
-      <w:r>
-        <w:t xml:space="preserve">→</w:t>
-      </w:r>
-      <w:r>
-        <w:t xml:space="preserve"> </w:t>
-      </w:r>
-      <w:r>
-        <w:rPr>
-          <w:rStyle w:val="VerbatimChar"/>
-        </w:rPr>
-        <w:t xml:space="preserve">redirect("/admin/login")</w:t>
-      </w:r>
-      <w:r>
-        <w:t xml:space="preserve">), so unauthenticated users never receive page HTML</w:t>
-      </w:r>
-      <w:r>
-        <w:t xml:space="preserve"> </w:t>
-      </w:r>
-      <w:r>
-        <w:t xml:space="preserve">or data — only a redirect.</w:t>
-      </w:r>
-    </w:p>
-    <w:p>
-      <w:pPr>
-        <w:pStyle w:val="Compact"/>
-        <w:numPr>
-          <w:ilvl w:val="0"/>
-          <w:numId w:val="1053"/>
-        </w:numPr>
-      </w:pPr>
-      <w:r>
-        <w:t xml:space="preserve">Middleware (</w:t>
-      </w:r>
-      <w:r>
-        <w:rPr>
-          <w:rStyle w:val="VerbatimChar"/>
-        </w:rPr>
-        <w:t xml:space="preserve">src/middleware.ts</w:t>
-      </w:r>
-      <w:r>
-        <w:t xml:space="preserve">) additionally requires the cookie to be present</w:t>
-      </w:r>
-      <w:r>
-        <w:t xml:space="preserve"> </w:t>
-      </w:r>
-      <w:r>
-        <w:t xml:space="preserve">on</w:t>
-      </w:r>
-      <w:r>
-        <w:t xml:space="preserve"> </w:t>
-      </w:r>
-      <w:r>
-        <w:rPr>
-          <w:rStyle w:val="VerbatimChar"/>
-        </w:rPr>
-        <w:t xml:space="preserve">/admin/*</w:t>
-      </w:r>
-      <w:r>
-        <w:t xml:space="preserve"> </w:t>
-      </w:r>
-      <w:r>
-        <w:t xml:space="preserve">and</w:t>
-      </w:r>
-      <w:r>
-        <w:t xml:space="preserve"> </w:t>
-      </w:r>
-      <w:r>
-        <w:rPr>
-          <w:rStyle w:val="VerbatimChar"/>
-        </w:rPr>
-        <w:t xml:space="preserve">/api/admin/*</w:t>
-      </w:r>
-      <w:r>
-        <w:t xml:space="preserve">. This is a fast pre-check; the real validation</w:t>
-      </w:r>
-      <w:r>
-        <w:t xml:space="preserve"> </w:t>
-      </w:r>
-      <w:r>
-        <w:t xml:space="preserve">is</w:t>
-      </w:r>
-      <w:r>
-        <w:t xml:space="preserve"> </w:t>
-      </w:r>
-      <w:r>
-        <w:rPr>
-          <w:rStyle w:val="VerbatimChar"/>
-        </w:rPr>
-        <w:t xml:space="preserve">requireAdmin()</w:t>
-      </w:r>
-      <w:r>
-        <w:t xml:space="preserve"> </w:t>
-      </w:r>
-      <w:r>
-        <w:t xml:space="preserve">(a forged/expired cookie passes middleware but is rejected</w:t>
-      </w:r>
-      <w:r>
-        <w:t xml:space="preserve"> </w:t>
-      </w:r>
-      <w:r>
-        <w:t xml:space="preserve">by the handler).</w:t>
-      </w:r>
-    </w:p>
-    <w:bookmarkEnd w:id="155"/>
-    <w:bookmarkStart w:id="156" w:name="shop-members"/>
-    <w:p>
-      <w:pPr>
-        <w:pStyle w:val="Heading3"/>
-      </w:pPr>
-      <w:r>
-        <w:t xml:space="preserve">Shop (members)</w:t>
       </w:r>
     </w:p>
     <w:p>
@@ -28681,66 +28979,56 @@
         </w:numPr>
       </w:pPr>
       <w:r>
-        <w:t xml:space="preserve">A</w:t>
-      </w:r>
-      <w:r>
-        <w:t xml:space="preserve"> </w:t>
-      </w:r>
-      <w:r>
-        <w:rPr>
-          <w:rStyle w:val="VerbatimChar"/>
-        </w:rPr>
-        <w:t xml:space="preserve">ShopSession</w:t>
-      </w:r>
-      <w:r>
-        <w:t xml:space="preserve"> </w:t>
-      </w:r>
-      <w:r>
-        <w:t xml:space="preserve">token (random cuid) is created only by a</w:t>
-      </w:r>
-      <w:r>
-        <w:t xml:space="preserve"> </w:t>
-      </w:r>
-      <w:r>
-        <w:rPr>
-          <w:b/>
-          <w:bCs/>
-        </w:rPr>
-        <w:t xml:space="preserve">physical card tap</w:t>
-      </w:r>
-      <w:r>
-        <w:t xml:space="preserve"> </w:t>
-      </w:r>
-      <w:r>
-        <w:t xml:space="preserve">or an admin's</w:t>
-      </w:r>
-      <w:r>
-        <w:t xml:space="preserve"> </w:t>
-      </w:r>
-      <w:r>
-        <w:rPr>
-          <w:b/>
-          <w:bCs/>
-        </w:rPr>
-        <w:t xml:space="preserve">Enter store</w:t>
-      </w:r>
-      <w:r>
-        <w:t xml:space="preserve">. It lives in the</w:t>
-      </w:r>
-      <w:r>
-        <w:t xml:space="preserve"> </w:t>
-      </w:r>
-      <w:r>
-        <w:rPr>
-          <w:rStyle w:val="VerbatimChar"/>
-        </w:rPr>
-        <w:t xml:space="preserve">/shop/&lt;token&gt;</w:t>
-      </w:r>
-      <w:r>
-        <w:t xml:space="preserve"> </w:t>
-      </w:r>
-      <w:r>
-        <w:t xml:space="preserve">URL.</w:t>
+        <w:t xml:space="preserve">Login (</w:t>
+      </w:r>
+      <w:r>
+        <w:rPr>
+          <w:rStyle w:val="VerbatimChar"/>
+        </w:rPr>
+        <w:t xml:space="preserve">POST /api/auth/login</w:t>
+      </w:r>
+      <w:r>
+        <w:t xml:space="preserve">) verifies a bcrypt password and sets an</w:t>
+      </w:r>
+      <w:r>
+        <w:t xml:space="preserve"> </w:t>
+      </w:r>
+      <w:r>
+        <w:rPr>
+          <w:b/>
+          <w:bCs/>
+        </w:rPr>
+        <w:t xml:space="preserve">httpOnly</w:t>
+      </w:r>
+      <w:r>
+        <w:t xml:space="preserve"> </w:t>
+      </w:r>
+      <w:r>
+        <w:rPr>
+          <w:rStyle w:val="VerbatimChar"/>
+        </w:rPr>
+        <w:t xml:space="preserve">session</w:t>
+      </w:r>
+      <w:r>
+        <w:t xml:space="preserve"> </w:t>
+      </w:r>
+      <w:r>
+        <w:t xml:space="preserve">cookie (7-day</w:t>
+      </w:r>
+      <w:r>
+        <w:t xml:space="preserve"> </w:t>
+      </w:r>
+      <w:r>
+        <w:rPr>
+          <w:rStyle w:val="VerbatimChar"/>
+        </w:rPr>
+        <w:t xml:space="preserve">Session</w:t>
+      </w:r>
+      <w:r>
+        <w:t xml:space="preserve"> </w:t>
+      </w:r>
+      <w:r>
+        <w:t xml:space="preserve">row).</w:t>
       </w:r>
     </w:p>
     <w:p>
@@ -28755,28 +29043,65 @@
         <w:rPr>
           <w:rStyle w:val="VerbatimChar"/>
         </w:rPr>
-        <w:t xml:space="preserve">/api/cart</w:t>
-      </w:r>
-      <w:r>
-        <w:t xml:space="preserve"> </w:t>
-      </w:r>
-      <w:r>
-        <w:t xml:space="preserve">and</w:t>
-      </w:r>
-      <w:r>
-        <w:t xml:space="preserve"> </w:t>
-      </w:r>
-      <w:r>
-        <w:rPr>
-          <w:rStyle w:val="VerbatimChar"/>
-        </w:rPr>
-        <w:t xml:space="preserve">/api/orders/confirm</w:t>
-      </w:r>
-      <w:r>
-        <w:t xml:space="preserve"> </w:t>
-      </w:r>
-      <w:r>
-        <w:t xml:space="preserve">require a valid, unexpired token.</w:t>
+        <w:t xml:space="preserve">requireAdmin()</w:t>
+      </w:r>
+      <w:r>
+        <w:t xml:space="preserve"> </w:t>
+      </w:r>
+      <w:r>
+        <w:t xml:space="preserve">(</w:t>
+      </w:r>
+      <w:r>
+        <w:rPr>
+          <w:rStyle w:val="VerbatimChar"/>
+        </w:rPr>
+        <w:t xml:space="preserve">src/lib/auth.ts</w:t>
+      </w:r>
+      <w:r>
+        <w:t xml:space="preserve">) loads the session, checks it isn't expired,</w:t>
+      </w:r>
+      <w:r>
+        <w:t xml:space="preserve"> </w:t>
+      </w:r>
+      <w:r>
+        <w:t xml:space="preserve">and checks</w:t>
+      </w:r>
+      <w:r>
+        <w:t xml:space="preserve"> </w:t>
+      </w:r>
+      <w:r>
+        <w:rPr>
+          <w:rStyle w:val="VerbatimChar"/>
+        </w:rPr>
+        <w:t xml:space="preserve">role === "ADMIN"</w:t>
+      </w:r>
+      <w:r>
+        <w:t xml:space="preserve">.</w:t>
+      </w:r>
+      <w:r>
+        <w:t xml:space="preserve"> </w:t>
+      </w:r>
+      <w:r>
+        <w:rPr>
+          <w:b/>
+          <w:bCs/>
+        </w:rPr>
+        <w:t xml:space="preserve">Every</w:t>
+      </w:r>
+      <w:r>
+        <w:t xml:space="preserve"> </w:t>
+      </w:r>
+      <w:r>
+        <w:rPr>
+          <w:rStyle w:val="VerbatimChar"/>
+        </w:rPr>
+        <w:t xml:space="preserve">/api/admin/*</w:t>
+      </w:r>
+      <w:r>
+        <w:t xml:space="preserve"> </w:t>
+      </w:r>
+      <w:r>
+        <w:t xml:space="preserve">handler calls it.</w:t>
       </w:r>
     </w:p>
     <w:p>
@@ -28788,29 +29113,53 @@
         </w:numPr>
       </w:pPr>
       <w:r>
-        <w:t xml:space="preserve">The member's first name is returned</w:t>
-      </w:r>
-      <w:r>
-        <w:t xml:space="preserve"> </w:t>
-      </w:r>
-      <w:r>
-        <w:rPr>
-          <w:b/>
-          <w:bCs/>
-        </w:rPr>
-        <w:t xml:space="preserve">only</w:t>
-      </w:r>
-      <w:r>
-        <w:t xml:space="preserve"> </w:t>
-      </w:r>
-      <w:r>
-        <w:t xml:space="preserve">by the token-scoped cart endpoint —</w:t>
-      </w:r>
-      <w:r>
-        <w:t xml:space="preserve"> </w:t>
-      </w:r>
-      <w:r>
-        <w:t xml:space="preserve">never by the public scan endpoint.</w:t>
+        <w:t xml:space="preserve">The admin pages are gated by a</w:t>
+      </w:r>
+      <w:r>
+        <w:t xml:space="preserve"> </w:t>
+      </w:r>
+      <w:r>
+        <w:rPr>
+          <w:b/>
+          <w:bCs/>
+        </w:rPr>
+        <w:t xml:space="preserve">server-side layout</w:t>
+      </w:r>
+      <w:r>
+        <w:t xml:space="preserve"> </w:t>
+      </w:r>
+      <w:r>
+        <w:t xml:space="preserve">(</w:t>
+      </w:r>
+      <w:r>
+        <w:rPr>
+          <w:rStyle w:val="VerbatimChar"/>
+        </w:rPr>
+        <w:t xml:space="preserve">requireAdmin()</w:t>
+      </w:r>
+      <w:r>
+        <w:t xml:space="preserve"> </w:t>
+      </w:r>
+      <w:r>
+        <w:t xml:space="preserve">→</w:t>
+      </w:r>
+      <w:r>
+        <w:t xml:space="preserve"> </w:t>
+      </w:r>
+      <w:r>
+        <w:rPr>
+          <w:rStyle w:val="VerbatimChar"/>
+        </w:rPr>
+        <w:t xml:space="preserve">redirect("/admin/login")</w:t>
+      </w:r>
+      <w:r>
+        <w:t xml:space="preserve">), so unauthenticated users never receive page HTML</w:t>
+      </w:r>
+      <w:r>
+        <w:t xml:space="preserve"> </w:t>
+      </w:r>
+      <w:r>
+        <w:t xml:space="preserve">or data — only a redirect.</w:t>
       </w:r>
     </w:p>
     <w:p>
@@ -28822,39 +29171,86 @@
         </w:numPr>
       </w:pPr>
       <w:r>
-        <w:rPr>
-          <w:b/>
-          <w:bCs/>
-        </w:rPr>
-        <w:t xml:space="preserve">Idle auto-reset:</w:t>
-      </w:r>
-      <w:r>
-        <w:t xml:space="preserve"> </w:t>
-      </w:r>
-      <w:r>
-        <w:t xml:space="preserve">the shop page deletes the session and returns to the tap</w:t>
-      </w:r>
-      <w:r>
-        <w:t xml:space="preserve"> </w:t>
-      </w:r>
-      <w:r>
-        <w:t xml:space="preserve">screen after ~60 s of inactivity (with a 15 s warning), so a member who walks</w:t>
-      </w:r>
-      <w:r>
-        <w:t xml:space="preserve"> </w:t>
-      </w:r>
-      <w:r>
-        <w:t xml:space="preserve">away can't leave their account open for the next person.</w:t>
+        <w:t xml:space="preserve">Middleware (</w:t>
+      </w:r>
+      <w:r>
+        <w:rPr>
+          <w:rStyle w:val="VerbatimChar"/>
+        </w:rPr>
+        <w:t xml:space="preserve">src/middleware.ts</w:t>
+      </w:r>
+      <w:r>
+        <w:t xml:space="preserve">) additionally requires the cookie to be present</w:t>
+      </w:r>
+      <w:r>
+        <w:t xml:space="preserve"> </w:t>
+      </w:r>
+      <w:r>
+        <w:t xml:space="preserve">on</w:t>
+      </w:r>
+      <w:r>
+        <w:t xml:space="preserve"> </w:t>
+      </w:r>
+      <w:r>
+        <w:rPr>
+          <w:rStyle w:val="VerbatimChar"/>
+        </w:rPr>
+        <w:t xml:space="preserve">/admin/*</w:t>
+      </w:r>
+      <w:r>
+        <w:t xml:space="preserve"> </w:t>
+      </w:r>
+      <w:r>
+        <w:t xml:space="preserve">and</w:t>
+      </w:r>
+      <w:r>
+        <w:t xml:space="preserve"> </w:t>
+      </w:r>
+      <w:r>
+        <w:rPr>
+          <w:rStyle w:val="VerbatimChar"/>
+        </w:rPr>
+        <w:t xml:space="preserve">/api/admin/*</w:t>
+      </w:r>
+      <w:r>
+        <w:t xml:space="preserve">. This is a fast pre-check; the real validation</w:t>
+      </w:r>
+      <w:r>
+        <w:t xml:space="preserve"> </w:t>
+      </w:r>
+      <w:r>
+        <w:t xml:space="preserve">is</w:t>
+      </w:r>
+      <w:r>
+        <w:t xml:space="preserve"> </w:t>
+      </w:r>
+      <w:r>
+        <w:rPr>
+          <w:rStyle w:val="VerbatimChar"/>
+        </w:rPr>
+        <w:t xml:space="preserve">requireAdmin()</w:t>
+      </w:r>
+      <w:r>
+        <w:t xml:space="preserve"> </w:t>
+      </w:r>
+      <w:r>
+        <w:t xml:space="preserve">(a forged/expired cookie passes middleware but is rejected</w:t>
+      </w:r>
+      <w:r>
+        <w:t xml:space="preserve"> </w:t>
+      </w:r>
+      <w:r>
+        <w:t xml:space="preserve">by the handler).</w:t>
       </w:r>
     </w:p>
     <w:bookmarkEnd w:id="156"/>
-    <w:bookmarkStart w:id="157" w:name="card-verification"/>
+    <w:bookmarkStart w:id="157" w:name="shop-members"/>
     <w:p>
       <w:pPr>
         <w:pStyle w:val="Heading3"/>
       </w:pPr>
       <w:r>
-        <w:t xml:space="preserve">Card verification</w:t>
+        <w:t xml:space="preserve">Shop (members)</w:t>
       </w:r>
     </w:p>
     <w:p>
@@ -28866,16 +29262,66 @@
         </w:numPr>
       </w:pPr>
       <w:r>
-        <w:rPr>
-          <w:rStyle w:val="VerbatimChar"/>
-        </w:rPr>
-        <w:t xml:space="preserve">CardRegistration</w:t>
-      </w:r>
-      <w:r>
-        <w:t xml:space="preserve"> </w:t>
-      </w:r>
-      <w:r>
-        <w:t xml:space="preserve">tokens are single-use and expire in 15 minutes.</w:t>
+        <w:t xml:space="preserve">A</w:t>
+      </w:r>
+      <w:r>
+        <w:t xml:space="preserve"> </w:t>
+      </w:r>
+      <w:r>
+        <w:rPr>
+          <w:rStyle w:val="VerbatimChar"/>
+        </w:rPr>
+        <w:t xml:space="preserve">ShopSession</w:t>
+      </w:r>
+      <w:r>
+        <w:t xml:space="preserve"> </w:t>
+      </w:r>
+      <w:r>
+        <w:t xml:space="preserve">token (random cuid) is created only by a</w:t>
+      </w:r>
+      <w:r>
+        <w:t xml:space="preserve"> </w:t>
+      </w:r>
+      <w:r>
+        <w:rPr>
+          <w:b/>
+          <w:bCs/>
+        </w:rPr>
+        <w:t xml:space="preserve">physical card tap</w:t>
+      </w:r>
+      <w:r>
+        <w:t xml:space="preserve"> </w:t>
+      </w:r>
+      <w:r>
+        <w:t xml:space="preserve">or an admin's</w:t>
+      </w:r>
+      <w:r>
+        <w:t xml:space="preserve"> </w:t>
+      </w:r>
+      <w:r>
+        <w:rPr>
+          <w:b/>
+          <w:bCs/>
+        </w:rPr>
+        <w:t xml:space="preserve">Enter store</w:t>
+      </w:r>
+      <w:r>
+        <w:t xml:space="preserve">. It lives in the</w:t>
+      </w:r>
+      <w:r>
+        <w:t xml:space="preserve"> </w:t>
+      </w:r>
+      <w:r>
+        <w:rPr>
+          <w:rStyle w:val="VerbatimChar"/>
+        </w:rPr>
+        <w:t xml:space="preserve">/shop/&lt;token&gt;</w:t>
+      </w:r>
+      <w:r>
+        <w:t xml:space="preserve"> </w:t>
+      </w:r>
+      <w:r>
+        <w:t xml:space="preserve">URL.</w:t>
       </w:r>
     </w:p>
     <w:p>
@@ -28888,6 +29334,141 @@
       </w:pPr>
       <w:r>
         <w:rPr>
+          <w:rStyle w:val="VerbatimChar"/>
+        </w:rPr>
+        <w:t xml:space="preserve">/api/cart</w:t>
+      </w:r>
+      <w:r>
+        <w:t xml:space="preserve"> </w:t>
+      </w:r>
+      <w:r>
+        <w:t xml:space="preserve">and</w:t>
+      </w:r>
+      <w:r>
+        <w:t xml:space="preserve"> </w:t>
+      </w:r>
+      <w:r>
+        <w:rPr>
+          <w:rStyle w:val="VerbatimChar"/>
+        </w:rPr>
+        <w:t xml:space="preserve">/api/orders/confirm</w:t>
+      </w:r>
+      <w:r>
+        <w:t xml:space="preserve"> </w:t>
+      </w:r>
+      <w:r>
+        <w:t xml:space="preserve">require a valid, unexpired token.</w:t>
+      </w:r>
+    </w:p>
+    <w:p>
+      <w:pPr>
+        <w:pStyle w:val="Compact"/>
+        <w:numPr>
+          <w:ilvl w:val="0"/>
+          <w:numId w:val="1055"/>
+        </w:numPr>
+      </w:pPr>
+      <w:r>
+        <w:t xml:space="preserve">The member's first name is returned</w:t>
+      </w:r>
+      <w:r>
+        <w:t xml:space="preserve"> </w:t>
+      </w:r>
+      <w:r>
+        <w:rPr>
+          <w:b/>
+          <w:bCs/>
+        </w:rPr>
+        <w:t xml:space="preserve">only</w:t>
+      </w:r>
+      <w:r>
+        <w:t xml:space="preserve"> </w:t>
+      </w:r>
+      <w:r>
+        <w:t xml:space="preserve">by the token-scoped cart endpoint —</w:t>
+      </w:r>
+      <w:r>
+        <w:t xml:space="preserve"> </w:t>
+      </w:r>
+      <w:r>
+        <w:t xml:space="preserve">never by the public scan endpoint.</w:t>
+      </w:r>
+    </w:p>
+    <w:p>
+      <w:pPr>
+        <w:pStyle w:val="Compact"/>
+        <w:numPr>
+          <w:ilvl w:val="0"/>
+          <w:numId w:val="1055"/>
+        </w:numPr>
+      </w:pPr>
+      <w:r>
+        <w:rPr>
+          <w:b/>
+          <w:bCs/>
+        </w:rPr>
+        <w:t xml:space="preserve">Idle auto-reset:</w:t>
+      </w:r>
+      <w:r>
+        <w:t xml:space="preserve"> </w:t>
+      </w:r>
+      <w:r>
+        <w:t xml:space="preserve">the shop page deletes the session and returns to the tap</w:t>
+      </w:r>
+      <w:r>
+        <w:t xml:space="preserve"> </w:t>
+      </w:r>
+      <w:r>
+        <w:t xml:space="preserve">screen after ~60 s of inactivity (with a 15 s warning), so a member who walks</w:t>
+      </w:r>
+      <w:r>
+        <w:t xml:space="preserve"> </w:t>
+      </w:r>
+      <w:r>
+        <w:t xml:space="preserve">away can't leave their account open for the next person.</w:t>
+      </w:r>
+    </w:p>
+    <w:bookmarkEnd w:id="157"/>
+    <w:bookmarkStart w:id="158" w:name="card-verification"/>
+    <w:p>
+      <w:pPr>
+        <w:pStyle w:val="Heading3"/>
+      </w:pPr>
+      <w:r>
+        <w:t xml:space="preserve">Card verification</w:t>
+      </w:r>
+    </w:p>
+    <w:p>
+      <w:pPr>
+        <w:pStyle w:val="Compact"/>
+        <w:numPr>
+          <w:ilvl w:val="0"/>
+          <w:numId w:val="1056"/>
+        </w:numPr>
+      </w:pPr>
+      <w:r>
+        <w:rPr>
+          <w:rStyle w:val="VerbatimChar"/>
+        </w:rPr>
+        <w:t xml:space="preserve">CardRegistration</w:t>
+      </w:r>
+      <w:r>
+        <w:t xml:space="preserve"> </w:t>
+      </w:r>
+      <w:r>
+        <w:t xml:space="preserve">tokens are single-use and expire in 15 minutes.</w:t>
+      </w:r>
+    </w:p>
+    <w:p>
+      <w:pPr>
+        <w:pStyle w:val="Compact"/>
+        <w:numPr>
+          <w:ilvl w:val="0"/>
+          <w:numId w:val="1056"/>
+        </w:numPr>
+      </w:pPr>
+      <w:r>
+        <w:rPr>
           <w:b/>
           <w:bCs/>
         </w:rPr>
@@ -28934,9 +29515,9 @@
         <w:t xml:space="preserve">member clicked.</w:t>
       </w:r>
     </w:p>
-    <w:bookmarkEnd w:id="157"/>
     <w:bookmarkEnd w:id="158"/>
-    <w:bookmarkStart w:id="159" w:name="X77f42a2852d9dd86410b0545fad3e0fbb180833"/>
+    <w:bookmarkEnd w:id="159"/>
+    <w:bookmarkStart w:id="160" w:name="X77f42a2852d9dd86410b0545fad3e0fbb180833"/>
     <w:p>
       <w:pPr>
         <w:pStyle w:val="Heading2"/>
@@ -29150,8 +29731,8 @@
         </w:tc>
       </w:tr>
     </w:tbl>
-    <w:bookmarkEnd w:id="159"/>
-    <w:bookmarkStart w:id="160" w:name="rate-limiting"/>
+    <w:bookmarkEnd w:id="160"/>
+    <w:bookmarkStart w:id="161" w:name="rate-limiting"/>
     <w:p>
       <w:pPr>
         <w:pStyle w:val="Heading2"/>
@@ -29246,330 +29827,14 @@
         <w:t xml:space="preserve">a shared store (e.g. Redis).</w:t>
       </w:r>
     </w:p>
-    <w:bookmarkEnd w:id="160"/>
-    <w:bookmarkStart w:id="161" w:name="injection--output-safety"/>
+    <w:bookmarkEnd w:id="161"/>
+    <w:bookmarkStart w:id="162" w:name="injection--output-safety"/>
     <w:p>
       <w:pPr>
         <w:pStyle w:val="Heading2"/>
       </w:pPr>
       <w:r>
         <w:t xml:space="preserve">Injection &amp; output safety</w:t>
-      </w:r>
-    </w:p>
-    <w:p>
-      <w:pPr>
-        <w:pStyle w:val="Compact"/>
-        <w:numPr>
-          <w:ilvl w:val="0"/>
-          <w:numId w:val="1056"/>
-        </w:numPr>
-      </w:pPr>
-      <w:r>
-        <w:t xml:space="preserve">React escapes all interpolated values in the kiosk/shop/admin pages.</w:t>
-      </w:r>
-    </w:p>
-    <w:p>
-      <w:pPr>
-        <w:pStyle w:val="Compact"/>
-        <w:numPr>
-          <w:ilvl w:val="0"/>
-          <w:numId w:val="1056"/>
-        </w:numPr>
-      </w:pPr>
-      <w:r>
-        <w:t xml:space="preserve">The card-verify pages are</w:t>
-      </w:r>
-      <w:r>
-        <w:t xml:space="preserve"> </w:t>
-      </w:r>
-      <w:r>
-        <w:rPr>
-          <w:b/>
-          <w:bCs/>
-        </w:rPr>
-        <w:t xml:space="preserve">hand-built HTML</w:t>
-      </w:r>
-      <w:r>
-        <w:t xml:space="preserve">, so member names and tokens are</w:t>
-      </w:r>
-      <w:r>
-        <w:t xml:space="preserve"> </w:t>
-      </w:r>
-      <w:r>
-        <w:t xml:space="preserve">passed through</w:t>
-      </w:r>
-      <w:r>
-        <w:t xml:space="preserve"> </w:t>
-      </w:r>
-      <w:r>
-        <w:rPr>
-          <w:rStyle w:val="VerbatimChar"/>
-        </w:rPr>
-        <w:t xml:space="preserve">escapeHtml()</w:t>
-      </w:r>
-      <w:r>
-        <w:t xml:space="preserve"> </w:t>
-      </w:r>
-      <w:r>
-        <w:t xml:space="preserve">before interpolation (prevents stored XSS from a</w:t>
-      </w:r>
-      <w:r>
-        <w:t xml:space="preserve"> </w:t>
-      </w:r>
-      <w:r>
-        <w:t xml:space="preserve">name synced out of Congressus).</w:t>
-      </w:r>
-    </w:p>
-    <w:p>
-      <w:pPr>
-        <w:pStyle w:val="Compact"/>
-        <w:numPr>
-          <w:ilvl w:val="0"/>
-          <w:numId w:val="1056"/>
-        </w:numPr>
-      </w:pPr>
-      <w:r>
-        <w:t xml:space="preserve">Those pages declare</w:t>
-      </w:r>
-      <w:r>
-        <w:t xml:space="preserve"> </w:t>
-      </w:r>
-      <w:r>
-        <w:rPr>
-          <w:rStyle w:val="VerbatimChar"/>
-        </w:rPr>
-        <w:t xml:space="preserve">charset=utf-8</w:t>
-      </w:r>
-      <w:r>
-        <w:t xml:space="preserve"> </w:t>
-      </w:r>
-      <w:r>
-        <w:t xml:space="preserve">(header + meta) so emoji/diacritics render</w:t>
-      </w:r>
-      <w:r>
-        <w:t xml:space="preserve"> </w:t>
-      </w:r>
-      <w:r>
-        <w:t xml:space="preserve">correctly.</w:t>
-      </w:r>
-    </w:p>
-    <w:bookmarkEnd w:id="161"/>
-    <w:bookmarkStart w:id="165" w:name="deliberate-trade-offs"/>
-    <w:p>
-      <w:pPr>
-        <w:pStyle w:val="Heading2"/>
-      </w:pPr>
-      <w:r>
-        <w:t xml:space="preserve">Deliberate trade-offs</w:t>
-      </w:r>
-    </w:p>
-    <w:bookmarkStart w:id="162" w:name="card-uids-arent-secret"/>
-    <w:p>
-      <w:pPr>
-        <w:pStyle w:val="Heading3"/>
-      </w:pPr>
-      <w:r>
-        <w:t xml:space="preserve">Card UIDs aren't secret</w:t>
-      </w:r>
-    </w:p>
-    <w:p>
-      <w:pPr>
-        <w:pStyle w:val="FirstParagraph"/>
-      </w:pPr>
-      <w:r>
-        <w:t xml:space="preserve">Any NFC reader can read a card UID, and the scan endpoint is necessarily</w:t>
-      </w:r>
-      <w:r>
-        <w:t xml:space="preserve"> </w:t>
-      </w:r>
-      <w:r>
-        <w:t xml:space="preserve">unauthenticated (the kiosk is a public web page). Mitigations: the scan endpoint</w:t>
-      </w:r>
-      <w:r>
-        <w:t xml:space="preserve"> </w:t>
-      </w:r>
-      <w:r>
-        <w:t xml:space="preserve">returns no member data and is rate-limited. For stronger protection, restrict</w:t>
-      </w:r>
-      <w:r>
-        <w:t xml:space="preserve"> </w:t>
-      </w:r>
-      <w:r>
-        <w:rPr>
-          <w:rStyle w:val="VerbatimChar"/>
-        </w:rPr>
-        <w:t xml:space="preserve">/api/card/scan</w:t>
-      </w:r>
-      <w:r>
-        <w:t xml:space="preserve"> </w:t>
-      </w:r>
-      <w:r>
-        <w:t xml:space="preserve">to the kiosk's IP at the network layer.</w:t>
-      </w:r>
-    </w:p>
-    <w:bookmarkEnd w:id="162"/>
-    <w:bookmarkStart w:id="163" w:name="email-not-found-vs-enumeration"/>
-    <w:p>
-      <w:pPr>
-        <w:pStyle w:val="Heading3"/>
-      </w:pPr>
-      <w:r>
-        <w:t xml:space="preserve">"Email not found" vs enumeration</w:t>
-      </w:r>
-    </w:p>
-    <w:p>
-      <w:pPr>
-        <w:pStyle w:val="FirstParagraph"/>
-      </w:pPr>
-      <w:r>
-        <w:t xml:space="preserve">The card-registration flow tells a user when their email matches no member</w:t>
-      </w:r>
-      <w:r>
-        <w:t xml:space="preserve"> </w:t>
-      </w:r>
-      <w:r>
-        <w:t xml:space="preserve">("Email not found"). This</w:t>
-      </w:r>
-      <w:r>
-        <w:t xml:space="preserve"> </w:t>
-      </w:r>
-      <w:r>
-        <w:rPr>
-          <w:b/>
-          <w:bCs/>
-        </w:rPr>
-        <w:t xml:space="preserve">re-introduces some email-enumeration ability</w:t>
-      </w:r>
-      <w:r>
-        <w:t xml:space="preserve"> </w:t>
-      </w:r>
-      <w:r>
-        <w:t xml:space="preserve">that a</w:t>
-      </w:r>
-      <w:r>
-        <w:t xml:space="preserve"> </w:t>
-      </w:r>
-      <w:r>
-        <w:t xml:space="preserve">uniform response would prevent. It was a conscious product choice: confused</w:t>
-      </w:r>
-      <w:r>
-        <w:t xml:space="preserve"> </w:t>
-      </w:r>
-      <w:r>
-        <w:t xml:space="preserve">members not knowing why nothing happened is a real problem at a kiosk, the kiosk</w:t>
-      </w:r>
-      <w:r>
-        <w:t xml:space="preserve"> </w:t>
-      </w:r>
-      <w:r>
-        <w:t xml:space="preserve">is physical, and the endpoint is rate-limited. If enumeration resistance becomes</w:t>
-      </w:r>
-      <w:r>
-        <w:t xml:space="preserve"> </w:t>
-      </w:r>
-      <w:r>
-        <w:t xml:space="preserve">more important than this UX, revert</w:t>
-      </w:r>
-      <w:r>
-        <w:t xml:space="preserve"> </w:t>
-      </w:r>
-      <w:r>
-        <w:rPr>
-          <w:rStyle w:val="VerbatimChar"/>
-        </w:rPr>
-        <w:t xml:space="preserve">card/register</w:t>
-      </w:r>
-      <w:r>
-        <w:t xml:space="preserve"> </w:t>
-      </w:r>
-      <w:r>
-        <w:t xml:space="preserve">to a uniform</w:t>
-      </w:r>
-      <w:r>
-        <w:t xml:space="preserve"> </w:t>
-      </w:r>
-      <w:r>
-        <w:rPr>
-          <w:rStyle w:val="VerbatimChar"/>
-        </w:rPr>
-        <w:t xml:space="preserve">{ ok: true }</w:t>
-      </w:r>
-      <w:r>
-        <w:t xml:space="preserve">.</w:t>
-      </w:r>
-    </w:p>
-    <w:bookmarkEnd w:id="163"/>
-    <w:bookmarkStart w:id="164" w:name="shop-token-is-a-bearer-token-in-the-url"/>
-    <w:p>
-      <w:pPr>
-        <w:pStyle w:val="Heading3"/>
-      </w:pPr>
-      <w:r>
-        <w:t xml:space="preserve">Shop token is a bearer token in the URL</w:t>
-      </w:r>
-    </w:p>
-    <w:p>
-      <w:pPr>
-        <w:pStyle w:val="FirstParagraph"/>
-      </w:pPr>
-      <w:r>
-        <w:t xml:space="preserve">Anyone holding a live</w:t>
-      </w:r>
-      <w:r>
-        <w:t xml:space="preserve"> </w:t>
-      </w:r>
-      <w:r>
-        <w:rPr>
-          <w:rStyle w:val="VerbatimChar"/>
-        </w:rPr>
-        <w:t xml:space="preserve">/shop/&lt;token&gt;</w:t>
-      </w:r>
-      <w:r>
-        <w:t xml:space="preserve"> </w:t>
-      </w:r>
-      <w:r>
-        <w:t xml:space="preserve">URL can act as that member until it expires</w:t>
-      </w:r>
-      <w:r>
-        <w:t xml:space="preserve"> </w:t>
-      </w:r>
-      <w:r>
-        <w:t xml:space="preserve">(10 min) or the order is confirmed. Tokens are random and per-tap (a new one each</w:t>
-      </w:r>
-      <w:r>
-        <w:t xml:space="preserve"> </w:t>
-      </w:r>
-      <w:r>
-        <w:t xml:space="preserve">scan), so they can't be guessed or reused. The idle auto-reset and short lifetime</w:t>
-      </w:r>
-      <w:r>
-        <w:t xml:space="preserve"> </w:t>
-      </w:r>
-      <w:r>
-        <w:t xml:space="preserve">bound the exposure. Stronger options (not currently implemented): move the token</w:t>
-      </w:r>
-      <w:r>
-        <w:t xml:space="preserve"> </w:t>
-      </w:r>
-      <w:r>
-        <w:t xml:space="preserve">into an httpOnly cookie so it can't be shared via URL, or use a crypto-random</w:t>
-      </w:r>
-      <w:r>
-        <w:t xml:space="preserve"> </w:t>
-      </w:r>
-      <w:r>
-        <w:t xml:space="preserve">token instead of a cuid.</w:t>
-      </w:r>
-    </w:p>
-    <w:bookmarkEnd w:id="164"/>
-    <w:bookmarkEnd w:id="165"/>
-    <w:bookmarkStart w:id="166" w:name="prohibited--careful-operations"/>
-    <w:p>
-      <w:pPr>
-        <w:pStyle w:val="Heading2"/>
-      </w:pPr>
-      <w:r>
-        <w:t xml:space="preserve">Prohibited / careful operations</w:t>
       </w:r>
     </w:p>
     <w:p>
@@ -29581,17 +29846,7 @@
         </w:numPr>
       </w:pPr>
       <w:r>
-        <w:rPr>
-          <w:b/>
-          <w:bCs/>
-        </w:rPr>
-        <w:t xml:space="preserve">Member deletion</w:t>
-      </w:r>
-      <w:r>
-        <w:t xml:space="preserve"> </w:t>
-      </w:r>
-      <w:r>
-        <w:t xml:space="preserve">is blocked while invoices exist.</w:t>
+        <w:t xml:space="preserve">React escapes all interpolated values in the kiosk/shop/admin pages.</w:t>
       </w:r>
     </w:p>
     <w:p>
@@ -29603,38 +29858,47 @@
         </w:numPr>
       </w:pPr>
       <w:r>
-        <w:rPr>
-          <w:b/>
-          <w:bCs/>
-        </w:rPr>
-        <w:t xml:space="preserve">Invoice edit/delete</w:t>
-      </w:r>
-      <w:r>
-        <w:t xml:space="preserve"> </w:t>
-      </w:r>
-      <w:r>
-        <w:t xml:space="preserve">is blocked once an invoice is</w:t>
-      </w:r>
-      <w:r>
-        <w:t xml:space="preserve"> </w:t>
-      </w:r>
-      <w:r>
-        <w:rPr>
-          <w:rStyle w:val="VerbatimChar"/>
-        </w:rPr>
-        <w:t xml:space="preserve">EXPORTED</w:t>
-      </w:r>
-      <w:r>
-        <w:t xml:space="preserve"> </w:t>
-      </w:r>
-      <w:r>
-        <w:t xml:space="preserve">(already billed</w:t>
-      </w:r>
-      <w:r>
-        <w:t xml:space="preserve"> </w:t>
-      </w:r>
-      <w:r>
-        <w:t xml:space="preserve">in Congressus).</w:t>
+        <w:t xml:space="preserve">The card-verify pages are</w:t>
+      </w:r>
+      <w:r>
+        <w:t xml:space="preserve"> </w:t>
+      </w:r>
+      <w:r>
+        <w:rPr>
+          <w:b/>
+          <w:bCs/>
+        </w:rPr>
+        <w:t xml:space="preserve">hand-built HTML</w:t>
+      </w:r>
+      <w:r>
+        <w:t xml:space="preserve">, so member names and tokens are</w:t>
+      </w:r>
+      <w:r>
+        <w:t xml:space="preserve"> </w:t>
+      </w:r>
+      <w:r>
+        <w:t xml:space="preserve">passed through</w:t>
+      </w:r>
+      <w:r>
+        <w:t xml:space="preserve"> </w:t>
+      </w:r>
+      <w:r>
+        <w:rPr>
+          <w:rStyle w:val="VerbatimChar"/>
+        </w:rPr>
+        <w:t xml:space="preserve">escapeHtml()</w:t>
+      </w:r>
+      <w:r>
+        <w:t xml:space="preserve"> </w:t>
+      </w:r>
+      <w:r>
+        <w:t xml:space="preserve">before interpolation (prevents stored XSS from a</w:t>
+      </w:r>
+      <w:r>
+        <w:t xml:space="preserve"> </w:t>
+      </w:r>
+      <w:r>
+        <w:t xml:space="preserve">name synced out of Congressus).</w:t>
       </w:r>
     </w:p>
     <w:p>
@@ -29646,67 +29910,358 @@
         </w:numPr>
       </w:pPr>
       <w:r>
-        <w:rPr>
-          <w:b/>
-          <w:bCs/>
-        </w:rPr>
-        <w:t xml:space="preserve">Bulk invoice clearing</w:t>
-      </w:r>
-      <w:r>
-        <w:t xml:space="preserve"> </w:t>
-      </w:r>
-      <w:r>
-        <w:t xml:space="preserve">requires a double confirmation in the UI and is</w:t>
-      </w:r>
-      <w:r>
-        <w:t xml:space="preserve"> </w:t>
-      </w:r>
-      <w:r>
-        <w:t xml:space="preserve">intended for test-data cleanup only.</w:t>
-      </w:r>
-    </w:p>
+        <w:t xml:space="preserve">Those pages declare</w:t>
+      </w:r>
+      <w:r>
+        <w:t xml:space="preserve"> </w:t>
+      </w:r>
+      <w:r>
+        <w:rPr>
+          <w:rStyle w:val="VerbatimChar"/>
+        </w:rPr>
+        <w:t xml:space="preserve">charset=utf-8</w:t>
+      </w:r>
+      <w:r>
+        <w:t xml:space="preserve"> </w:t>
+      </w:r>
+      <w:r>
+        <w:t xml:space="preserve">(header + meta) so emoji/diacritics render</w:t>
+      </w:r>
+      <w:r>
+        <w:t xml:space="preserve"> </w:t>
+      </w:r>
+      <w:r>
+        <w:t xml:space="preserve">correctly.</w:t>
+      </w:r>
+    </w:p>
+    <w:bookmarkEnd w:id="162"/>
+    <w:bookmarkStart w:id="166" w:name="deliberate-trade-offs"/>
+    <w:p>
+      <w:pPr>
+        <w:pStyle w:val="Heading2"/>
+      </w:pPr>
+      <w:r>
+        <w:t xml:space="preserve">Deliberate trade-offs</w:t>
+      </w:r>
+    </w:p>
+    <w:bookmarkStart w:id="163" w:name="card-uids-arent-secret"/>
+    <w:p>
+      <w:pPr>
+        <w:pStyle w:val="Heading3"/>
+      </w:pPr>
+      <w:r>
+        <w:t xml:space="preserve">Card UIDs aren't secret</w:t>
+      </w:r>
+    </w:p>
+    <w:p>
+      <w:pPr>
+        <w:pStyle w:val="FirstParagraph"/>
+      </w:pPr>
+      <w:r>
+        <w:t xml:space="preserve">Any NFC reader can read a card UID, and the scan endpoint is necessarily</w:t>
+      </w:r>
+      <w:r>
+        <w:t xml:space="preserve"> </w:t>
+      </w:r>
+      <w:r>
+        <w:t xml:space="preserve">unauthenticated (the kiosk is a public web page). Mitigations: the scan endpoint</w:t>
+      </w:r>
+      <w:r>
+        <w:t xml:space="preserve"> </w:t>
+      </w:r>
+      <w:r>
+        <w:t xml:space="preserve">returns no member data and is rate-limited. For stronger protection, restrict</w:t>
+      </w:r>
+      <w:r>
+        <w:t xml:space="preserve"> </w:t>
+      </w:r>
+      <w:r>
+        <w:rPr>
+          <w:rStyle w:val="VerbatimChar"/>
+        </w:rPr>
+        <w:t xml:space="preserve">/api/card/scan</w:t>
+      </w:r>
+      <w:r>
+        <w:t xml:space="preserve"> </w:t>
+      </w:r>
+      <w:r>
+        <w:t xml:space="preserve">to the kiosk's IP at the network layer.</w:t>
+      </w:r>
+    </w:p>
+    <w:bookmarkEnd w:id="163"/>
+    <w:bookmarkStart w:id="164" w:name="email-not-found-vs-enumeration"/>
+    <w:p>
+      <w:pPr>
+        <w:pStyle w:val="Heading3"/>
+      </w:pPr>
+      <w:r>
+        <w:t xml:space="preserve">"Email not found" vs enumeration</w:t>
+      </w:r>
+    </w:p>
+    <w:p>
+      <w:pPr>
+        <w:pStyle w:val="FirstParagraph"/>
+      </w:pPr>
+      <w:r>
+        <w:t xml:space="preserve">The card-registration flow tells a user when their email matches no member</w:t>
+      </w:r>
+      <w:r>
+        <w:t xml:space="preserve"> </w:t>
+      </w:r>
+      <w:r>
+        <w:t xml:space="preserve">("Email not found"). This</w:t>
+      </w:r>
+      <w:r>
+        <w:t xml:space="preserve"> </w:t>
+      </w:r>
+      <w:r>
+        <w:rPr>
+          <w:b/>
+          <w:bCs/>
+        </w:rPr>
+        <w:t xml:space="preserve">re-introduces some email-enumeration ability</w:t>
+      </w:r>
+      <w:r>
+        <w:t xml:space="preserve"> </w:t>
+      </w:r>
+      <w:r>
+        <w:t xml:space="preserve">that a</w:t>
+      </w:r>
+      <w:r>
+        <w:t xml:space="preserve"> </w:t>
+      </w:r>
+      <w:r>
+        <w:t xml:space="preserve">uniform response would prevent. It was a conscious product choice: confused</w:t>
+      </w:r>
+      <w:r>
+        <w:t xml:space="preserve"> </w:t>
+      </w:r>
+      <w:r>
+        <w:t xml:space="preserve">members not knowing why nothing happened is a real problem at a kiosk, the kiosk</w:t>
+      </w:r>
+      <w:r>
+        <w:t xml:space="preserve"> </w:t>
+      </w:r>
+      <w:r>
+        <w:t xml:space="preserve">is physical, and the endpoint is rate-limited. If enumeration resistance becomes</w:t>
+      </w:r>
+      <w:r>
+        <w:t xml:space="preserve"> </w:t>
+      </w:r>
+      <w:r>
+        <w:t xml:space="preserve">more important than this UX, revert</w:t>
+      </w:r>
+      <w:r>
+        <w:t xml:space="preserve"> </w:t>
+      </w:r>
+      <w:r>
+        <w:rPr>
+          <w:rStyle w:val="VerbatimChar"/>
+        </w:rPr>
+        <w:t xml:space="preserve">card/register</w:t>
+      </w:r>
+      <w:r>
+        <w:t xml:space="preserve"> </w:t>
+      </w:r>
+      <w:r>
+        <w:t xml:space="preserve">to a uniform</w:t>
+      </w:r>
+      <w:r>
+        <w:t xml:space="preserve"> </w:t>
+      </w:r>
+      <w:r>
+        <w:rPr>
+          <w:rStyle w:val="VerbatimChar"/>
+        </w:rPr>
+        <w:t xml:space="preserve">{ ok: true }</w:t>
+      </w:r>
+      <w:r>
+        <w:t xml:space="preserve">.</w:t>
+      </w:r>
+    </w:p>
+    <w:bookmarkEnd w:id="164"/>
+    <w:bookmarkStart w:id="165" w:name="shop-token-is-a-bearer-token-in-the-url"/>
+    <w:p>
+      <w:pPr>
+        <w:pStyle w:val="Heading3"/>
+      </w:pPr>
+      <w:r>
+        <w:t xml:space="preserve">Shop token is a bearer token in the URL</w:t>
+      </w:r>
+    </w:p>
+    <w:p>
+      <w:pPr>
+        <w:pStyle w:val="FirstParagraph"/>
+      </w:pPr>
+      <w:r>
+        <w:t xml:space="preserve">Anyone holding a live</w:t>
+      </w:r>
+      <w:r>
+        <w:t xml:space="preserve"> </w:t>
+      </w:r>
+      <w:r>
+        <w:rPr>
+          <w:rStyle w:val="VerbatimChar"/>
+        </w:rPr>
+        <w:t xml:space="preserve">/shop/&lt;token&gt;</w:t>
+      </w:r>
+      <w:r>
+        <w:t xml:space="preserve"> </w:t>
+      </w:r>
+      <w:r>
+        <w:t xml:space="preserve">URL can act as that member until it expires</w:t>
+      </w:r>
+      <w:r>
+        <w:t xml:space="preserve"> </w:t>
+      </w:r>
+      <w:r>
+        <w:t xml:space="preserve">(10 min) or the order is confirmed. Tokens are random and per-tap (a new one each</w:t>
+      </w:r>
+      <w:r>
+        <w:t xml:space="preserve"> </w:t>
+      </w:r>
+      <w:r>
+        <w:t xml:space="preserve">scan), so they can't be guessed or reused. The idle auto-reset and short lifetime</w:t>
+      </w:r>
+      <w:r>
+        <w:t xml:space="preserve"> </w:t>
+      </w:r>
+      <w:r>
+        <w:t xml:space="preserve">bound the exposure. Stronger options (not currently implemented): move the token</w:t>
+      </w:r>
+      <w:r>
+        <w:t xml:space="preserve"> </w:t>
+      </w:r>
+      <w:r>
+        <w:t xml:space="preserve">into an httpOnly cookie so it can't be shared via URL, or use a crypto-random</w:t>
+      </w:r>
+      <w:r>
+        <w:t xml:space="preserve"> </w:t>
+      </w:r>
+      <w:r>
+        <w:t xml:space="preserve">token instead of a cuid.</w:t>
+      </w:r>
+    </w:p>
+    <w:bookmarkEnd w:id="165"/>
     <w:bookmarkEnd w:id="166"/>
-    <w:bookmarkStart w:id="167" w:name="audit-checklist"/>
+    <w:bookmarkStart w:id="167" w:name="prohibited--careful-operations"/>
     <w:p>
       <w:pPr>
         <w:pStyle w:val="Heading2"/>
       </w:pPr>
       <w:r>
-        <w:t xml:space="preserve">Audit checklist</w:t>
-      </w:r>
-    </w:p>
-    <w:p>
-      <w:pPr>
-        <w:pStyle w:val="FirstParagraph"/>
-      </w:pPr>
-      <w:r>
-        <w:t xml:space="preserve">When adding a new endpoint:</w:t>
-      </w:r>
-    </w:p>
-    <w:p>
-      <w:pPr>
+        <w:t xml:space="preserve">Prohibited / careful operations</w:t>
+      </w:r>
+    </w:p>
+    <w:p>
+      <w:pPr>
+        <w:pStyle w:val="Compact"/>
         <w:numPr>
           <w:ilvl w:val="0"/>
           <w:numId w:val="1058"/>
         </w:numPr>
       </w:pPr>
       <w:r>
-        <w:t xml:space="preserve">Does it touch member/admin data? → call</w:t>
-      </w:r>
-      <w:r>
-        <w:t xml:space="preserve"> </w:t>
-      </w:r>
-      <w:r>
-        <w:rPr>
-          <w:rStyle w:val="VerbatimChar"/>
-        </w:rPr>
-        <w:t xml:space="preserve">requireAdmin()</w:t>
-      </w:r>
-      <w:r>
-        <w:t xml:space="preserve"> </w:t>
-      </w:r>
-      <w:r>
-        <w:t xml:space="preserve">(admin) or validate a token (shop/registration).</w:t>
+        <w:rPr>
+          <w:b/>
+          <w:bCs/>
+        </w:rPr>
+        <w:t xml:space="preserve">Member deletion</w:t>
+      </w:r>
+      <w:r>
+        <w:t xml:space="preserve"> </w:t>
+      </w:r>
+      <w:r>
+        <w:t xml:space="preserve">is blocked while invoices exist.</w:t>
+      </w:r>
+    </w:p>
+    <w:p>
+      <w:pPr>
+        <w:pStyle w:val="Compact"/>
+        <w:numPr>
+          <w:ilvl w:val="0"/>
+          <w:numId w:val="1058"/>
+        </w:numPr>
+      </w:pPr>
+      <w:r>
+        <w:rPr>
+          <w:b/>
+          <w:bCs/>
+        </w:rPr>
+        <w:t xml:space="preserve">Invoice edit/delete</w:t>
+      </w:r>
+      <w:r>
+        <w:t xml:space="preserve"> </w:t>
+      </w:r>
+      <w:r>
+        <w:t xml:space="preserve">is blocked once an invoice is</w:t>
+      </w:r>
+      <w:r>
+        <w:t xml:space="preserve"> </w:t>
+      </w:r>
+      <w:r>
+        <w:rPr>
+          <w:rStyle w:val="VerbatimChar"/>
+        </w:rPr>
+        <w:t xml:space="preserve">EXPORTED</w:t>
+      </w:r>
+      <w:r>
+        <w:t xml:space="preserve"> </w:t>
+      </w:r>
+      <w:r>
+        <w:t xml:space="preserve">(already billed</w:t>
+      </w:r>
+      <w:r>
+        <w:t xml:space="preserve"> </w:t>
+      </w:r>
+      <w:r>
+        <w:t xml:space="preserve">in Congressus).</w:t>
+      </w:r>
+    </w:p>
+    <w:p>
+      <w:pPr>
+        <w:pStyle w:val="Compact"/>
+        <w:numPr>
+          <w:ilvl w:val="0"/>
+          <w:numId w:val="1058"/>
+        </w:numPr>
+      </w:pPr>
+      <w:r>
+        <w:rPr>
+          <w:b/>
+          <w:bCs/>
+        </w:rPr>
+        <w:t xml:space="preserve">Bulk invoice clearing</w:t>
+      </w:r>
+      <w:r>
+        <w:t xml:space="preserve"> </w:t>
+      </w:r>
+      <w:r>
+        <w:t xml:space="preserve">requires a double confirmation in the UI and is</w:t>
+      </w:r>
+      <w:r>
+        <w:t xml:space="preserve"> </w:t>
+      </w:r>
+      <w:r>
+        <w:t xml:space="preserve">intended for test-data cleanup only.</w:t>
+      </w:r>
+    </w:p>
+    <w:bookmarkEnd w:id="167"/>
+    <w:bookmarkStart w:id="168" w:name="audit-checklist"/>
+    <w:p>
+      <w:pPr>
+        <w:pStyle w:val="Heading2"/>
+      </w:pPr>
+      <w:r>
+        <w:t xml:space="preserve">Audit checklist</w:t>
+      </w:r>
+    </w:p>
+    <w:p>
+      <w:pPr>
+        <w:pStyle w:val="FirstParagraph"/>
+      </w:pPr>
+      <w:r>
+        <w:t xml:space="preserve">When adding a new endpoint:</w:t>
       </w:r>
     </w:p>
     <w:p>
@@ -29717,22 +30272,22 @@
         </w:numPr>
       </w:pPr>
       <w:r>
-        <w:t xml:space="preserve">Does it return more fields than the caller needs? →</w:t>
-      </w:r>
-      <w:r>
-        <w:t xml:space="preserve"> </w:t>
-      </w:r>
-      <w:r>
-        <w:rPr>
-          <w:rStyle w:val="VerbatimChar"/>
-        </w:rPr>
-        <w:t xml:space="preserve">select</w:t>
-      </w:r>
-      <w:r>
-        <w:t xml:space="preserve"> </w:t>
-      </w:r>
-      <w:r>
-        <w:t xml:space="preserve">only what's required.</w:t>
+        <w:t xml:space="preserve">Does it touch member/admin data? → call</w:t>
+      </w:r>
+      <w:r>
+        <w:t xml:space="preserve"> </w:t>
+      </w:r>
+      <w:r>
+        <w:rPr>
+          <w:rStyle w:val="VerbatimChar"/>
+        </w:rPr>
+        <w:t xml:space="preserve">requireAdmin()</w:t>
+      </w:r>
+      <w:r>
+        <w:t xml:space="preserve"> </w:t>
+      </w:r>
+      <w:r>
+        <w:t xml:space="preserve">(admin) or validate a token (shop/registration).</w:t>
       </w:r>
     </w:p>
     <w:p>
@@ -29743,7 +30298,22 @@
         </w:numPr>
       </w:pPr>
       <w:r>
-        <w:t xml:space="preserve">Is it public and write-capable or enumeration-prone? → add rate limiting.</w:t>
+        <w:t xml:space="preserve">Does it return more fields than the caller needs? →</w:t>
+      </w:r>
+      <w:r>
+        <w:t xml:space="preserve"> </w:t>
+      </w:r>
+      <w:r>
+        <w:rPr>
+          <w:rStyle w:val="VerbatimChar"/>
+        </w:rPr>
+        <w:t xml:space="preserve">select</w:t>
+      </w:r>
+      <w:r>
+        <w:t xml:space="preserve"> </w:t>
+      </w:r>
+      <w:r>
+        <w:t xml:space="preserve">only what's required.</w:t>
       </w:r>
     </w:p>
     <w:p>
@@ -29754,7 +30324,7 @@
         </w:numPr>
       </w:pPr>
       <w:r>
-        <w:t xml:space="preserve">Does it render raw HTML with external data? → escape it.</w:t>
+        <w:t xml:space="preserve">Is it public and write-capable or enumeration-prone? → add rate limiting.</w:t>
       </w:r>
     </w:p>
     <w:p>
@@ -29765,6 +30335,17 @@
         </w:numPr>
       </w:pPr>
       <w:r>
+        <w:t xml:space="preserve">Does it render raw HTML with external data? → escape it.</w:t>
+      </w:r>
+    </w:p>
+    <w:p>
+      <w:pPr>
+        <w:numPr>
+          <w:ilvl w:val="0"/>
+          <w:numId w:val="1063"/>
+        </w:numPr>
+      </w:pPr>
+      <w:r>
         <w:t xml:space="preserve">Verify at runtime: unauthenticated</w:t>
       </w:r>
       <w:r>
@@ -29784,8 +30365,8 @@
         <w:t xml:space="preserve">forged-cookie requests both get 401/redirect.</w:t>
       </w:r>
     </w:p>
-    <w:bookmarkEnd w:id="167"/>
     <w:bookmarkEnd w:id="168"/>
+    <w:bookmarkEnd w:id="169"/>
     <w:sectPr>
       <w:footnotePr>
         <w:numRestart w:val="eachSect"/>
@@ -30713,7 +31294,7 @@
     <w:abstractNumId w:val="991"/>
   </w:num>
   <w:num w:numId="1058">
-    <w:abstractNumId w:val="992"/>
+    <w:abstractNumId w:val="991"/>
   </w:num>
   <w:num w:numId="1059">
     <w:abstractNumId w:val="992"/>
@@ -30725,6 +31306,9 @@
     <w:abstractNumId w:val="992"/>
   </w:num>
   <w:num w:numId="1062">
+    <w:abstractNumId w:val="992"/>
+  </w:num>
+  <w:num w:numId="1063">
     <w:abstractNumId w:val="992"/>
   </w:num>
 </w:numbering>

</xml_diff>

<commit_message>
PPP P/L: per-drink SumUp card revenue + clearer activity entry point
SumUp records the drink on each card payment, so the P/L now fetches each transaction's line items and aggregates card revenue per drink, merged with member charges in the per-drink table (member/card qty, total revenue, discount). Also relabel the activities-list link from 'Specials' to 'Details / P&L' since it now opens the full P/L page.

Co-Authored-By: Claude Opus 4.8 <noreply@anthropic.com>
</commit_message>
<xml_diff>
--- a/docs/SSS-Documentation.docx
+++ b/docs/SSS-Documentation.docx
@@ -25916,13 +25916,65 @@
         <w:t xml:space="preserve"> </w:t>
       </w:r>
       <w:r>
-        <w:t xml:space="preserve">(fetched live for the borrel's time window). Card/cash</w:t>
-      </w:r>
-      <w:r>
-        <w:t xml:space="preserve"> </w:t>
-      </w:r>
-      <w:r>
-        <w:t xml:space="preserve">sales aren't itemised per drink — only the SumUp total is known.</w:t>
+        <w:t xml:space="preserve">(fetched live for the borrel's time window). SumUp</w:t>
+      </w:r>
+      <w:r>
+        <w:t xml:space="preserve"> </w:t>
+      </w:r>
+      <w:r>
+        <w:t xml:space="preserve">records the</w:t>
+      </w:r>
+      <w:r>
+        <w:t xml:space="preserve"> </w:t>
+      </w:r>
+      <w:r>
+        <w:rPr>
+          <w:b/>
+          <w:bCs/>
+        </w:rPr>
+        <w:t xml:space="preserve">drink</w:t>
+      </w:r>
+      <w:r>
+        <w:t xml:space="preserve"> </w:t>
+      </w:r>
+      <w:r>
+        <w:t xml:space="preserve">on each card payment, so card revenue is attributed</w:t>
+      </w:r>
+      <w:r>
+        <w:t xml:space="preserve"> </w:t>
+      </w:r>
+      <w:r>
+        <w:rPr>
+          <w:b/>
+          <w:bCs/>
+        </w:rPr>
+        <w:t xml:space="preserve">per</w:t>
+      </w:r>
+      <w:r>
+        <w:rPr>
+          <w:b/>
+          <w:bCs/>
+        </w:rPr>
+        <w:t xml:space="preserve"> </w:t>
+      </w:r>
+      <w:r>
+        <w:rPr>
+          <w:b/>
+          <w:bCs/>
+        </w:rPr>
+        <w:t xml:space="preserve">drink</w:t>
+      </w:r>
+      <w:r>
+        <w:t xml:space="preserve"> </w:t>
+      </w:r>
+      <w:r>
+        <w:t xml:space="preserve">and merged with member charges. (Card payments made before SumUp's product</w:t>
+      </w:r>
+      <w:r>
+        <w:t xml:space="preserve"> </w:t>
+      </w:r>
+      <w:r>
+        <w:t xml:space="preserve">catalog was set up have no drink name and show as "Card (unlabelled)".)</w:t>
       </w:r>
     </w:p>
     <w:p>
@@ -26105,7 +26157,13 @@
         <w:t xml:space="preserve"> </w:t>
       </w:r>
       <w:r>
-        <w:t xml:space="preserve">of member-charge sales (quantity, revenue, discount).</w:t>
+        <w:t xml:space="preserve">merging member charges + SumUp card sales (member/card</w:t>
+      </w:r>
+      <w:r>
+        <w:t xml:space="preserve"> </w:t>
+      </w:r>
+      <w:r>
+        <w:t xml:space="preserve">quantities, total revenue, discount) so you can see each drink's profit picture.</w:t>
       </w:r>
     </w:p>
     <w:p>
@@ -26132,7 +26190,7 @@
         <w:t xml:space="preserve">src/lib/sumup.ts</w:t>
       </w:r>
       <w:r>
-        <w:t xml:space="preserve">): sums SUCCESSFUL card payments (minus refunds) between</w:t>
+        <w:t xml:space="preserve">): finds SUCCESSFUL card payments (minus refunds) between</w:t>
       </w:r>
       <w:r>
         <w:t xml:space="preserve"> </w:t>
@@ -26183,7 +26241,26 @@
         <w:t xml:space="preserve"> </w:t>
       </w:r>
       <w:r>
-        <w:t xml:space="preserve">via the SumUp transactions API, using</w:t>
+        <w:t xml:space="preserve">and fetches each transaction's detail for its line items, aggregating</w:t>
+      </w:r>
+      <w:r>
+        <w:t xml:space="preserve"> </w:t>
+      </w:r>
+      <w:r>
+        <w:rPr>
+          <w:b/>
+          <w:bCs/>
+        </w:rPr>
+        <w:t xml:space="preserve">per drink</w:t>
+      </w:r>
+      <w:r>
+        <w:t xml:space="preserve">.</w:t>
+      </w:r>
+      <w:r>
+        <w:t xml:space="preserve"> </w:t>
+      </w:r>
+      <w:r>
+        <w:t xml:space="preserve">Uses</w:t>
       </w:r>
       <w:r>
         <w:t xml:space="preserve"> </w:t>
@@ -26195,13 +26272,13 @@
         <w:t xml:space="preserve">SUMUP_API_KEY</w:t>
       </w:r>
       <w:r>
-        <w:t xml:space="preserve">. Fail-soft — no key or an error</w:t>
-      </w:r>
-      <w:r>
-        <w:t xml:space="preserve"> </w:t>
-      </w:r>
-      <w:r>
-        <w:t xml:space="preserve">shows card revenue as "n/a" and the rest of the P/L still renders.</w:t>
+        <w:t xml:space="preserve">. Fail-soft — no key or an error shows card revenue as "n/a" and</w:t>
+      </w:r>
+      <w:r>
+        <w:t xml:space="preserve"> </w:t>
+      </w:r>
+      <w:r>
+        <w:t xml:space="preserve">the rest of the P/L still renders.</w:t>
       </w:r>
     </w:p>
     <w:bookmarkEnd w:id="148"/>

</xml_diff>

<commit_message>
PPP P/L: import Alexia usage PDF to auto-fill SBZ usage
Upload an Alexia Verbruiksformulier PDF on the activity P/L; it's parsed server-side (unpdf) — Verbruik unit counts + Fustbier keg weights (Totaal Gewicht kg) — mapped to SBZ items and pre-filled into the usage form for review. Unmatched lines are flagged with a per-line product picker. The file is parsed in memory and never stored. Adds src/lib/verbruik.ts + POST /api/admin/ppp/activities/[id]/import; new dep: unpdf.

Co-Authored-By: Claude Opus 4.8 <noreply@anthropic.com>
</commit_message>
<xml_diff>
--- a/docs/SSS-Documentation.docx
+++ b/docs/SSS-Documentation.docx
@@ -26009,16 +26009,7 @@
         <w:t xml:space="preserve">SBZ usage</w:t>
       </w:r>
       <w:r>
-        <w:t xml:space="preserve"> </w:t>
-      </w:r>
-      <w:r>
-        <w:t xml:space="preserve">the admin enters (Alexia holds this but isn't</w:t>
-      </w:r>
-      <w:r>
-        <w:t xml:space="preserve"> </w:t>
-      </w:r>
-      <w:r>
-        <w:t xml:space="preserve">public, so it's entered manually):</w:t>
+        <w:t xml:space="preserve">:</w:t>
       </w:r>
       <w:r>
         <w:t xml:space="preserve"> </w:t>
@@ -26044,21 +26035,21 @@
           <w:b/>
           <w:bCs/>
         </w:rPr>
-        <w:t xml:space="preserve">bottles/cans/shots</w:t>
-      </w:r>
-      <w:r>
-        <w:rPr>
-          <w:b/>
-          <w:bCs/>
-        </w:rPr>
-        <w:t xml:space="preserve"> </w:t>
-      </w:r>
-      <w:r>
-        <w:rPr>
-          <w:b/>
-          <w:bCs/>
-        </w:rPr>
-        <w:t xml:space="preserve">as units</w:t>
+        <w:t xml:space="preserve">bottles/cans/</w:t>
+      </w:r>
+      <w:r>
+        <w:rPr>
+          <w:b/>
+          <w:bCs/>
+        </w:rPr>
+        <w:t xml:space="preserve"> </w:t>
+      </w:r>
+      <w:r>
+        <w:rPr>
+          <w:b/>
+          <w:bCs/>
+        </w:rPr>
+        <w:t xml:space="preserve">shots as units</w:t>
       </w:r>
       <w:r>
         <w:t xml:space="preserve">, priced from the SBZ price list (</w:t>
@@ -26079,7 +26070,93 @@
         <w:t xml:space="preserve"> </w:t>
       </w:r>
       <w:r>
-        <w:t xml:space="preserve">catalog, incl./excl. BTW per item; update it when SBZ revises prices).</w:t>
+        <w:t xml:space="preserve">catalog, incl./excl. BTW per item; update it when SBZ revises prices). Enter it by</w:t>
+      </w:r>
+      <w:r>
+        <w:t xml:space="preserve"> </w:t>
+      </w:r>
+      <w:r>
+        <w:t xml:space="preserve">hand, or</w:t>
+      </w:r>
+      <w:r>
+        <w:t xml:space="preserve"> </w:t>
+      </w:r>
+      <w:r>
+        <w:rPr>
+          <w:b/>
+          <w:bCs/>
+        </w:rPr>
+        <w:t xml:space="preserve">upload the Alexia "Verbruiksformulier" PDF</w:t>
+      </w:r>
+      <w:r>
+        <w:t xml:space="preserve"> </w:t>
+      </w:r>
+      <w:r>
+        <w:t xml:space="preserve">to auto-fill: it's parsed</w:t>
+      </w:r>
+      <w:r>
+        <w:t xml:space="preserve"> </w:t>
+      </w:r>
+      <w:r>
+        <w:t xml:space="preserve">server-side (</w:t>
+      </w:r>
+      <w:r>
+        <w:rPr>
+          <w:rStyle w:val="VerbatimChar"/>
+        </w:rPr>
+        <w:t xml:space="preserve">src/lib/verbruik.ts</w:t>
+      </w:r>
+      <w:r>
+        <w:t xml:space="preserve"> </w:t>
+      </w:r>
+      <w:r>
+        <w:t xml:space="preserve">via</w:t>
+      </w:r>
+      <w:r>
+        <w:t xml:space="preserve"> </w:t>
+      </w:r>
+      <w:r>
+        <w:rPr>
+          <w:rStyle w:val="VerbatimChar"/>
+        </w:rPr>
+        <w:t xml:space="preserve">unpdf</w:t>
+      </w:r>
+      <w:r>
+        <w:t xml:space="preserve">) — the "Verbruik" unit counts and</w:t>
+      </w:r>
+      <w:r>
+        <w:t xml:space="preserve"> </w:t>
+      </w:r>
+      <w:r>
+        <w:t xml:space="preserve">"Fustbier" keg weights (Totaal Gewicht kg) are read and mapped to SBZ items;</w:t>
+      </w:r>
+      <w:r>
+        <w:t xml:space="preserve"> </w:t>
+      </w:r>
+      <w:r>
+        <w:t xml:space="preserve">unmatched lines are flagged so the admin assigns them.</w:t>
+      </w:r>
+      <w:r>
+        <w:t xml:space="preserve"> </w:t>
+      </w:r>
+      <w:r>
+        <w:rPr>
+          <w:b/>
+          <w:bCs/>
+        </w:rPr>
+        <w:t xml:space="preserve">The PDF is not stored</w:t>
+      </w:r>
+      <w:r>
+        <w:t xml:space="preserve"> </w:t>
+      </w:r>
+      <w:r>
+        <w:t xml:space="preserve">—</w:t>
+      </w:r>
+      <w:r>
+        <w:t xml:space="preserve"> </w:t>
+      </w:r>
+      <w:r>
+        <w:t xml:space="preserve">only the extracted numbers pre-fill the form for review before Save.</w:t>
       </w:r>
     </w:p>
     <w:p>
@@ -28479,7 +28556,25 @@
         <w:t xml:space="preserve"> </w:t>
       </w:r>
       <w:r>
-        <w:t xml:space="preserve">= live card revenue),</w:t>
+        <w:t xml:space="preserve">= live card revenue, +</w:t>
+      </w:r>
+      <w:r>
+        <w:rPr>
+          <w:rStyle w:val="VerbatimChar"/>
+        </w:rPr>
+        <w:t xml:space="preserve">/import</w:t>
+      </w:r>
+      <w:r>
+        <w:t xml:space="preserve"> </w:t>
+      </w:r>
+      <w:r>
+        <w:t xml:space="preserve">=</w:t>
+      </w:r>
+      <w:r>
+        <w:t xml:space="preserve"> </w:t>
+      </w:r>
+      <w:r>
+        <w:t xml:space="preserve">extract usage from an uploaded Alexia PDF),</w:t>
       </w:r>
       <w:r>
         <w:t xml:space="preserve"> </w:t>

</xml_diff>

<commit_message>
PPP dashboard: aggregate profit/loss — income split (PPP + SumUp) and cost of goods
Dashboard now shows a Profit/loss block for the selected range: net P/L as one number, income split into PPP member charges + SumUp card revenue, and cost of goods (summed SBZ usage). Stats route returns cogsInclCents; new lightweight /stats/sumup sweeps the range's card total (loaded separately to keep the dashboard snappy).

Co-Authored-By: Claude Opus 4.8 <noreply@anthropic.com>
</commit_message>
<xml_diff>
--- a/docs/SSS-Documentation.docx
+++ b/docs/SSS-Documentation.docx
@@ -25345,7 +25345,71 @@
               <w:pStyle w:val="Compact"/>
             </w:pPr>
             <w:r>
-              <w:t xml:space="preserve">Financials (revenue, drinks sold, orders, borrels, drinkers, avg,</w:t>
+              <w:t xml:space="preserve">A</w:t>
+            </w:r>
+            <w:r>
+              <w:t xml:space="preserve"> </w:t>
+            </w:r>
+            <w:r>
+              <w:rPr>
+                <w:b/>
+                <w:bCs/>
+              </w:rPr>
+              <w:t xml:space="preserve">Profit / loss</w:t>
+            </w:r>
+            <w:r>
+              <w:t xml:space="preserve"> </w:t>
+            </w:r>
+            <w:r>
+              <w:t xml:space="preserve">block for the range —</w:t>
+            </w:r>
+            <w:r>
+              <w:t xml:space="preserve"> </w:t>
+            </w:r>
+            <w:r>
+              <w:rPr>
+                <w:b/>
+                <w:bCs/>
+              </w:rPr>
+              <w:t xml:space="preserve">income split PPP (member) + SumUp (card)</w:t>
+            </w:r>
+            <w:r>
+              <w:t xml:space="preserve"> </w:t>
+            </w:r>
+            <w:r>
+              <w:t xml:space="preserve">minus</w:t>
+            </w:r>
+            <w:r>
+              <w:t xml:space="preserve"> </w:t>
+            </w:r>
+            <w:r>
+              <w:rPr>
+                <w:b/>
+                <w:bCs/>
+              </w:rPr>
+              <w:t xml:space="preserve">cost of goods</w:t>
+            </w:r>
+            <w:r>
+              <w:t xml:space="preserve"> </w:t>
+            </w:r>
+            <w:r>
+              <w:t xml:space="preserve">(summed SBZ usage) = one</w:t>
+            </w:r>
+            <w:r>
+              <w:t xml:space="preserve"> </w:t>
+            </w:r>
+            <w:r>
+              <w:rPr>
+                <w:b/>
+                <w:bCs/>
+              </w:rPr>
+              <w:t xml:space="preserve">net P/L</w:t>
+            </w:r>
+            <w:r>
+              <w:t xml:space="preserve"> </w:t>
+            </w:r>
+            <w:r>
+              <w:t xml:space="preserve">number (SumUp loads separately). Plus financials (revenue, drinks sold, orders, borrels, drinkers, avg,</w:t>
             </w:r>
             <w:r>
               <w:t xml:space="preserve"> </w:t>
@@ -28598,7 +28662,31 @@
         <w:t xml:space="preserve">?range=…|since_export</w:t>
       </w:r>
       <w:r>
-        <w:t xml:space="preserve">),</w:t>
+        <w:t xml:space="preserve">; returns</w:t>
+      </w:r>
+      <w:r>
+        <w:t xml:space="preserve"> </w:t>
+      </w:r>
+      <w:r>
+        <w:rPr>
+          <w:rStyle w:val="VerbatimChar"/>
+        </w:rPr>
+        <w:t xml:space="preserve">cogsInclCents</w:t>
+      </w:r>
+      <w:r>
+        <w:t xml:space="preserve">) +</w:t>
+      </w:r>
+      <w:r>
+        <w:rPr>
+          <w:rStyle w:val="VerbatimChar"/>
+        </w:rPr>
+        <w:t xml:space="preserve">/stats/sumup</w:t>
+      </w:r>
+      <w:r>
+        <w:t xml:space="preserve"> </w:t>
+      </w:r>
+      <w:r>
+        <w:t xml:space="preserve">(range card-income total),</w:t>
       </w:r>
       <w:r>
         <w:t xml:space="preserve"> </w:t>

</xml_diff>

<commit_message>
PPP activities list: show cost of goods per event + larger revenue/cost figures
Co-Authored-By: Claude Opus 4.8 <noreply@anthropic.com>
</commit_message>
<xml_diff>
--- a/docs/SSS-Documentation.docx
+++ b/docs/SSS-Documentation.docx
@@ -25590,7 +25590,23 @@
               <w:pStyle w:val="Compact"/>
             </w:pPr>
             <w:r>
-              <w:t xml:space="preserve">List borrels (auto-synced from Alexia + manual), close/reopen, rename, revenue + order counts +</w:t>
+              <w:t xml:space="preserve">List borrels (auto-synced from Alexia + manual), close/reopen, rename,</w:t>
+            </w:r>
+            <w:r>
+              <w:t xml:space="preserve"> </w:t>
+            </w:r>
+            <w:r>
+              <w:rPr>
+                <w:b/>
+                <w:bCs/>
+              </w:rPr>
+              <w:t xml:space="preserve">revenue + cost of goods</w:t>
+            </w:r>
+            <w:r>
+              <w:t xml:space="preserve"> </w:t>
+            </w:r>
+            <w:r>
+              <w:t xml:space="preserve">(large, per event) + order counts +</w:t>
             </w:r>
             <w:r>
               <w:t xml:space="preserve"> </w:t>

</xml_diff>

<commit_message>
PPP usage import: add extracted numbers onto existing values (accumulate)
Uploading an Alexia usage PDF now adds its numbers onto whatever is already in the form (matched items and manually-assigned unmatched lines), so a second document accumulates instead of overwriting.

Co-Authored-By: Claude Opus 4.8 <noreply@anthropic.com>
</commit_message>
<xml_diff>
--- a/docs/SSS-Documentation.docx
+++ b/docs/SSS-Documentation.docx
@@ -26214,29 +26214,59 @@
         <w:t xml:space="preserve"> </w:t>
       </w:r>
       <w:r>
-        <w:t xml:space="preserve">unmatched lines are flagged so the admin assigns them.</w:t>
-      </w:r>
-      <w:r>
-        <w:t xml:space="preserve"> </w:t>
-      </w:r>
-      <w:r>
-        <w:rPr>
-          <w:b/>
-          <w:bCs/>
-        </w:rPr>
-        <w:t xml:space="preserve">The PDF is not stored</w:t>
-      </w:r>
-      <w:r>
-        <w:t xml:space="preserve"> </w:t>
-      </w:r>
-      <w:r>
-        <w:t xml:space="preserve">—</w:t>
-      </w:r>
-      <w:r>
-        <w:t xml:space="preserve"> </w:t>
-      </w:r>
-      <w:r>
-        <w:t xml:space="preserve">only the extracted numbers pre-fill the form for review before Save.</w:t>
+        <w:t xml:space="preserve">unmatched lines are flagged so the admin assigns them. Numbers</w:t>
+      </w:r>
+      <w:r>
+        <w:t xml:space="preserve"> </w:t>
+      </w:r>
+      <w:r>
+        <w:rPr>
+          <w:b/>
+          <w:bCs/>
+        </w:rPr>
+        <w:t xml:space="preserve">add onto</w:t>
+      </w:r>
+      <w:r>
+        <w:t xml:space="preserve"> </w:t>
+      </w:r>
+      <w:r>
+        <w:t xml:space="preserve">the</w:t>
+      </w:r>
+      <w:r>
+        <w:t xml:space="preserve"> </w:t>
+      </w:r>
+      <w:r>
+        <w:t xml:space="preserve">current form values, so uploading a second document accumulates.</w:t>
+      </w:r>
+      <w:r>
+        <w:t xml:space="preserve"> </w:t>
+      </w:r>
+      <w:r>
+        <w:rPr>
+          <w:b/>
+          <w:bCs/>
+        </w:rPr>
+        <w:t xml:space="preserve">The PDF is not</w:t>
+      </w:r>
+      <w:r>
+        <w:rPr>
+          <w:b/>
+          <w:bCs/>
+        </w:rPr>
+        <w:t xml:space="preserve"> </w:t>
+      </w:r>
+      <w:r>
+        <w:rPr>
+          <w:b/>
+          <w:bCs/>
+        </w:rPr>
+        <w:t xml:space="preserve">stored</w:t>
+      </w:r>
+      <w:r>
+        <w:t xml:space="preserve"> </w:t>
+      </w:r>
+      <w:r>
+        <w:t xml:space="preserve">— only the extracted numbers pre-fill the form for review before Save.</w:t>
       </w:r>
     </w:p>
     <w:p>

</xml_diff>

<commit_message>
Member dashboard, lost-card unlink, costed-borrel P/L with saved SumUp
- Member dashboard (/admin/members/[id]): SSS/PPP spend, open (unexported)
  invoice, purchase history, linked cards with UIDs, role editing
- Unlink a single card (lost card) without touching the member or history
- Member names in dashboards/invoices link to the member dashboard
- PPP dashboard P/L only counts borrels with cost of goods uploaded
- SumUp per borrel fetched live on the day, saved the day after
  (PppActivitySumup) with a manual re-fetch

Co-Authored-By: Claude Opus 5.5 <noreply@anthropic.com>
</commit_message>
<xml_diff>
--- a/docs/SSS-Documentation.docx
+++ b/docs/SSS-Documentation.docx
@@ -7852,7 +7852,7 @@
     </w:p>
     <w:bookmarkEnd w:id="60"/>
     <w:bookmarkEnd w:id="61"/>
-    <w:bookmarkStart w:id="94" w:name="api-reference"/>
+    <w:bookmarkStart w:id="96" w:name="api-reference"/>
     <w:p>
       <w:pPr>
         <w:pStyle w:val="Heading1"/>
@@ -9525,7 +9525,7 @@
     </w:p>
     <w:bookmarkEnd w:id="76"/>
     <w:bookmarkEnd w:id="77"/>
-    <w:bookmarkStart w:id="93" w:name="admin--all-require-an-admin-session"/>
+    <w:bookmarkStart w:id="95" w:name="admin--all-require-an-admin-session"/>
     <w:p>
       <w:pPr>
         <w:pStyle w:val="Heading2"/>
@@ -10937,7 +10937,7 @@
       </w:r>
     </w:p>
     <w:bookmarkEnd w:id="79"/>
-    <w:bookmarkStart w:id="80" w:name="delete-apiadminmembersid"/>
+    <w:bookmarkStart w:id="80" w:name="get-apiadminmembersid"/>
     <w:p>
       <w:pPr>
         <w:pStyle w:val="Heading3"/>
@@ -10946,6 +10946,184 @@
         <w:rPr>
           <w:rStyle w:val="VerbatimChar"/>
         </w:rPr>
+        <w:t xml:space="preserve">GET /api/admin/members/[id]</w:t>
+      </w:r>
+    </w:p>
+    <w:p>
+      <w:pPr>
+        <w:pStyle w:val="FirstParagraph"/>
+      </w:pPr>
+      <w:r>
+        <w:t xml:space="preserve">Member dashboard data: member (roles, cards with UIDs),</w:t>
+      </w:r>
+      <w:r>
+        <w:t xml:space="preserve"> </w:t>
+      </w:r>
+      <w:r>
+        <w:rPr>
+          <w:rStyle w:val="VerbatimChar"/>
+        </w:rPr>
+        <w:t xml:space="preserve">sss</w:t>
+      </w:r>
+      <w:r>
+        <w:t xml:space="preserve">/</w:t>
+      </w:r>
+      <w:r>
+        <w:rPr>
+          <w:rStyle w:val="VerbatimChar"/>
+        </w:rPr>
+        <w:t xml:space="preserve">ppp</w:t>
+      </w:r>
+      <w:r>
+        <w:t xml:space="preserve"> </w:t>
+      </w:r>
+      <w:r>
+        <w:t xml:space="preserve">totals</w:t>
+      </w:r>
+      <w:r>
+        <w:t xml:space="preserve"> </w:t>
+      </w:r>
+      <w:r>
+        <w:t xml:space="preserve">(</w:t>
+      </w:r>
+      <w:r>
+        <w:rPr>
+          <w:rStyle w:val="VerbatimChar"/>
+        </w:rPr>
+        <w:t xml:space="preserve">spentCents</w:t>
+      </w:r>
+      <w:r>
+        <w:t xml:space="preserve">,</w:t>
+      </w:r>
+      <w:r>
+        <w:t xml:space="preserve"> </w:t>
+      </w:r>
+      <w:r>
+        <w:rPr>
+          <w:rStyle w:val="VerbatimChar"/>
+        </w:rPr>
+        <w:t xml:space="preserve">openCents</w:t>
+      </w:r>
+      <w:r>
+        <w:t xml:space="preserve"> </w:t>
+      </w:r>
+      <w:r>
+        <w:t xml:space="preserve">= confirmed but not yet exported,</w:t>
+      </w:r>
+      <w:r>
+        <w:t xml:space="preserve"> </w:t>
+      </w:r>
+      <w:r>
+        <w:rPr>
+          <w:rStyle w:val="VerbatimChar"/>
+        </w:rPr>
+        <w:t xml:space="preserve">orders</w:t>
+      </w:r>
+      <w:r>
+        <w:t xml:space="preserve">) and</w:t>
+      </w:r>
+      <w:r>
+        <w:t xml:space="preserve"> </w:t>
+      </w:r>
+      <w:r>
+        <w:rPr>
+          <w:rStyle w:val="VerbatimChar"/>
+        </w:rPr>
+        <w:t xml:space="preserve">purchases</w:t>
+      </w:r>
+      <w:r>
+        <w:t xml:space="preserve"> </w:t>
+      </w:r>
+      <w:r>
+        <w:t xml:space="preserve">— every confirmed/exported SSS + PPP invoice with lines, newest first.</w:t>
+      </w:r>
+      <w:r>
+        <w:t xml:space="preserve"> </w:t>
+      </w:r>
+      <w:r>
+        <w:t xml:space="preserve">Page:</w:t>
+      </w:r>
+      <w:r>
+        <w:t xml:space="preserve"> </w:t>
+      </w:r>
+      <w:r>
+        <w:rPr>
+          <w:rStyle w:val="VerbatimChar"/>
+        </w:rPr>
+        <w:t xml:space="preserve">/admin/members/[id]</w:t>
+      </w:r>
+      <w:r>
+        <w:t xml:space="preserve"> </w:t>
+      </w:r>
+      <w:r>
+        <w:t xml:space="preserve">(linked from the Members list).</w:t>
+      </w:r>
+    </w:p>
+    <w:bookmarkEnd w:id="80"/>
+    <w:bookmarkStart w:id="81" w:name="delete-apiadminmembersidcardscardid"/>
+    <w:p>
+      <w:pPr>
+        <w:pStyle w:val="Heading3"/>
+      </w:pPr>
+      <w:r>
+        <w:rPr>
+          <w:rStyle w:val="VerbatimChar"/>
+        </w:rPr>
+        <w:t xml:space="preserve">DELETE /api/admin/members/[id]/cards/[cardId]</w:t>
+      </w:r>
+    </w:p>
+    <w:p>
+      <w:pPr>
+        <w:pStyle w:val="FirstParagraph"/>
+      </w:pPr>
+      <w:r>
+        <w:t xml:space="preserve">Unlinks one card (e.g. a</w:t>
+      </w:r>
+      <w:r>
+        <w:t xml:space="preserve"> </w:t>
+      </w:r>
+      <w:r>
+        <w:rPr>
+          <w:b/>
+          <w:bCs/>
+        </w:rPr>
+        <w:t xml:space="preserve">lost card</w:t>
+      </w:r>
+      <w:r>
+        <w:t xml:space="preserve">): deletes only that</w:t>
+      </w:r>
+      <w:r>
+        <w:t xml:space="preserve"> </w:t>
+      </w:r>
+      <w:r>
+        <w:rPr>
+          <w:rStyle w:val="VerbatimChar"/>
+        </w:rPr>
+        <w:t xml:space="preserve">Card</w:t>
+      </w:r>
+      <w:r>
+        <w:t xml:space="preserve"> </w:t>
+      </w:r>
+      <w:r>
+        <w:t xml:space="preserve">row. The member,</w:t>
+      </w:r>
+      <w:r>
+        <w:t xml:space="preserve"> </w:t>
+      </w:r>
+      <w:r>
+        <w:t xml:space="preserve">invoices and history stay; the UID becomes unregistered and can be linked again.</w:t>
+      </w:r>
+    </w:p>
+    <w:bookmarkEnd w:id="81"/>
+    <w:bookmarkStart w:id="82" w:name="delete-apiadminmembersid"/>
+    <w:p>
+      <w:pPr>
+        <w:pStyle w:val="Heading3"/>
+      </w:pPr>
+      <w:r>
+        <w:rPr>
+          <w:rStyle w:val="VerbatimChar"/>
+        </w:rPr>
         <w:t xml:space="preserve">DELETE /api/admin/members/[id]</w:t>
       </w:r>
     </w:p>
@@ -10978,8 +11156,8 @@
         <w:t xml:space="preserve">member has any invoices.</w:t>
       </w:r>
     </w:p>
-    <w:bookmarkEnd w:id="80"/>
-    <w:bookmarkStart w:id="81" w:name="post-apiadminmembersidshop"/>
+    <w:bookmarkEnd w:id="82"/>
+    <w:bookmarkStart w:id="83" w:name="post-apiadminmembersidshop"/>
     <w:p>
       <w:pPr>
         <w:pStyle w:val="Heading3"/>
@@ -11042,8 +11220,8 @@
         <w:t xml:space="preserve">.</w:t>
       </w:r>
     </w:p>
-    <w:bookmarkEnd w:id="81"/>
-    <w:bookmarkStart w:id="82" w:name="post-apiadminmemberssync"/>
+    <w:bookmarkEnd w:id="83"/>
+    <w:bookmarkStart w:id="84" w:name="post-apiadminmemberssync"/>
     <w:p>
       <w:pPr>
         <w:pStyle w:val="Heading3"/>
@@ -11081,8 +11259,8 @@
         <w:t xml:space="preserve">.</w:t>
       </w:r>
     </w:p>
-    <w:bookmarkEnd w:id="82"/>
-    <w:bookmarkStart w:id="83" w:name="get-apiadminproducts"/>
+    <w:bookmarkEnd w:id="84"/>
+    <w:bookmarkStart w:id="85" w:name="get-apiadminproducts"/>
     <w:p>
       <w:pPr>
         <w:pStyle w:val="Heading3"/>
@@ -11102,8 +11280,8 @@
         <w:t xml:space="preserve">All products (incl. archived) with categories.</w:t>
       </w:r>
     </w:p>
-    <w:bookmarkEnd w:id="83"/>
-    <w:bookmarkStart w:id="84" w:name="post-apiadminproducts"/>
+    <w:bookmarkEnd w:id="85"/>
+    <w:bookmarkStart w:id="86" w:name="post-apiadminproducts"/>
     <w:p>
       <w:pPr>
         <w:pStyle w:val="Heading3"/>
@@ -11172,8 +11350,8 @@
         <w:t xml:space="preserve">is returned.</w:t>
       </w:r>
     </w:p>
-    <w:bookmarkEnd w:id="84"/>
-    <w:bookmarkStart w:id="85" w:name="patch-apiadminproductsid"/>
+    <w:bookmarkEnd w:id="86"/>
+    <w:bookmarkStart w:id="87" w:name="patch-apiadminproductsid"/>
     <w:p>
       <w:pPr>
         <w:pStyle w:val="Heading3"/>
@@ -11244,8 +11422,8 @@
         <w:t xml:space="preserve">Name/price changes are synced to Congressus.</w:t>
       </w:r>
     </w:p>
-    <w:bookmarkEnd w:id="85"/>
-    <w:bookmarkStart w:id="86" w:name="post-apiadminproductsidimage"/>
+    <w:bookmarkEnd w:id="87"/>
+    <w:bookmarkStart w:id="88" w:name="post-apiadminproductsidimage"/>
     <w:p>
       <w:pPr>
         <w:pStyle w:val="Heading3"/>
@@ -11298,8 +11476,8 @@
         <w:t xml:space="preserve">. Accepts JPG/PNG/WebP/GIF.</w:t>
       </w:r>
     </w:p>
-    <w:bookmarkEnd w:id="86"/>
-    <w:bookmarkStart w:id="87" w:name="post-apiadminsync-product-offers"/>
+    <w:bookmarkEnd w:id="88"/>
+    <w:bookmarkStart w:id="89" w:name="post-apiadminsync-product-offers"/>
     <w:p>
       <w:pPr>
         <w:pStyle w:val="Heading3"/>
@@ -11346,8 +11524,8 @@
         <w:t xml:space="preserve">folder + local products for debugging.</w:t>
       </w:r>
     </w:p>
-    <w:bookmarkEnd w:id="87"/>
-    <w:bookmarkStart w:id="88" w:name="X6e9001e3427582ce1443020dd7207927e2e4182"/>
+    <w:bookmarkEnd w:id="89"/>
+    <w:bookmarkStart w:id="90" w:name="X6e9001e3427582ce1443020dd7207927e2e4182"/>
     <w:p>
       <w:pPr>
         <w:pStyle w:val="Heading3"/>
@@ -11367,8 +11545,8 @@
         <w:t xml:space="preserve">Invoices of that status with member and lines.</w:t>
       </w:r>
     </w:p>
-    <w:bookmarkEnd w:id="88"/>
-    <w:bookmarkStart w:id="89" w:name="X52dd00b31d6de4d1adea2c3b9fa7443ab4941c1"/>
+    <w:bookmarkEnd w:id="90"/>
+    <w:bookmarkStart w:id="91" w:name="X52dd00b31d6de4d1adea2c3b9fa7443ab4941c1"/>
     <w:p>
       <w:pPr>
         <w:pStyle w:val="Heading3"/>
@@ -11416,8 +11594,8 @@
         <w:t xml:space="preserve">.</w:t>
       </w:r>
     </w:p>
-    <w:bookmarkEnd w:id="89"/>
-    <w:bookmarkStart w:id="90" w:name="patch-apiadmininvoicesid"/>
+    <w:bookmarkEnd w:id="91"/>
+    <w:bookmarkStart w:id="92" w:name="patch-apiadmininvoicesid"/>
     <w:p>
       <w:pPr>
         <w:pStyle w:val="Heading3"/>
@@ -11500,8 +11678,8 @@
         <w:t xml:space="preserve">.</w:t>
       </w:r>
     </w:p>
-    <w:bookmarkEnd w:id="90"/>
-    <w:bookmarkStart w:id="91" w:name="delete-apiadmininvoicesid"/>
+    <w:bookmarkEnd w:id="92"/>
+    <w:bookmarkStart w:id="93" w:name="delete-apiadmininvoicesid"/>
     <w:p>
       <w:pPr>
         <w:pStyle w:val="Heading3"/>
@@ -11548,8 +11726,8 @@
         <w:t xml:space="preserve">.</w:t>
       </w:r>
     </w:p>
-    <w:bookmarkEnd w:id="91"/>
-    <w:bookmarkStart w:id="92" w:name="post-apiadmininvoicesexport"/>
+    <w:bookmarkEnd w:id="93"/>
+    <w:bookmarkStart w:id="94" w:name="post-apiadmininvoicesexport"/>
     <w:p>
       <w:pPr>
         <w:pStyle w:val="Heading3"/>
@@ -11804,10 +11982,10 @@
         <w:br w:type="page"/>
       </w:r>
     </w:p>
-    <w:bookmarkEnd w:id="92"/>
-    <w:bookmarkEnd w:id="93"/>
     <w:bookmarkEnd w:id="94"/>
-    <w:bookmarkStart w:id="106" w:name="deployment"/>
+    <w:bookmarkEnd w:id="95"/>
+    <w:bookmarkEnd w:id="96"/>
+    <w:bookmarkStart w:id="108" w:name="deployment"/>
     <w:p>
       <w:pPr>
         <w:pStyle w:val="Heading1"/>
@@ -11872,7 +12050,7 @@
         <w:t xml:space="preserve">for product images.</w:t>
       </w:r>
     </w:p>
-    <w:bookmarkStart w:id="95" w:name="build--start"/>
+    <w:bookmarkStart w:id="97" w:name="build--start"/>
     <w:p>
       <w:pPr>
         <w:pStyle w:val="Heading2"/>
@@ -12225,8 +12403,8 @@
         <w:t xml:space="preserve">.</w:t>
       </w:r>
     </w:p>
-    <w:bookmarkEnd w:id="95"/>
-    <w:bookmarkStart w:id="99" w:name="environment-variables"/>
+    <w:bookmarkEnd w:id="97"/>
+    <w:bookmarkStart w:id="101" w:name="environment-variables"/>
     <w:p>
       <w:pPr>
         <w:pStyle w:val="Heading2"/>
@@ -13683,7 +13861,7 @@
         </w:tc>
       </w:tr>
     </w:tbl>
-    <w:bookmarkStart w:id="96" w:name="Xcb9fb8e9b51d6756401591e907f7cb6deec43ac"/>
+    <w:bookmarkStart w:id="98" w:name="Xcb9fb8e9b51d6756401591e907f7cb6deec43ac"/>
     <w:p>
       <w:pPr>
         <w:pStyle w:val="Heading3"/>
@@ -13814,8 +13992,8 @@
         <w:t xml:space="preserve">— keep both set and equal.</w:t>
       </w:r>
     </w:p>
-    <w:bookmarkEnd w:id="96"/>
-    <w:bookmarkStart w:id="97" w:name="custom-domain-51vonl"/>
+    <w:bookmarkEnd w:id="98"/>
+    <w:bookmarkStart w:id="99" w:name="custom-domain-51vonl"/>
     <w:p>
       <w:pPr>
         <w:pStyle w:val="Heading3"/>
@@ -14063,8 +14241,8 @@
         <w:t xml:space="preserve">).</w:t>
       </w:r>
     </w:p>
-    <w:bookmarkEnd w:id="97"/>
-    <w:bookmarkStart w:id="98" w:name="bar-pos-vanity-domain-ppp51vonl"/>
+    <w:bookmarkEnd w:id="99"/>
+    <w:bookmarkStart w:id="100" w:name="bar-pos-vanity-domain-ppp51vonl"/>
     <w:p>
       <w:pPr>
         <w:pStyle w:val="Heading3"/>
@@ -14343,9 +14521,9 @@
         <w:t xml:space="preserve">, where cookies, the PWA manifest and the cert all live.</w:t>
       </w:r>
     </w:p>
-    <w:bookmarkEnd w:id="98"/>
-    <w:bookmarkEnd w:id="99"/>
-    <w:bookmarkStart w:id="100" w:name="email-deliverability-verification-emails"/>
+    <w:bookmarkEnd w:id="100"/>
+    <w:bookmarkEnd w:id="101"/>
+    <w:bookmarkStart w:id="102" w:name="email-deliverability-verification-emails"/>
     <w:p>
       <w:pPr>
         <w:pStyle w:val="Heading2"/>
@@ -14751,8 +14929,8 @@
         <w:t xml:space="preserve">.</w:t>
       </w:r>
     </w:p>
-    <w:bookmarkEnd w:id="100"/>
-    <w:bookmarkStart w:id="101" w:name="persistent-volume-product-images"/>
+    <w:bookmarkEnd w:id="102"/>
+    <w:bookmarkStart w:id="103" w:name="persistent-volume-product-images"/>
     <w:p>
       <w:pPr>
         <w:pStyle w:val="Heading2"/>
@@ -14997,8 +15175,8 @@
         <w:t xml:space="preserve">volume — only user-uploaded images do.</w:t>
       </w:r>
     </w:p>
-    <w:bookmarkEnd w:id="101"/>
-    <w:bookmarkStart w:id="102" w:name="first-time-setup"/>
+    <w:bookmarkEnd w:id="103"/>
+    <w:bookmarkStart w:id="104" w:name="first-time-setup"/>
     <w:p>
       <w:pPr>
         <w:pStyle w:val="Heading2"/>
@@ -15121,8 +15299,8 @@
         <w:t xml:space="preserve">— add your snacks (each one also creates a Congressus product).</w:t>
       </w:r>
     </w:p>
-    <w:bookmarkEnd w:id="102"/>
-    <w:bookmarkStart w:id="103" w:name="deploying-changes"/>
+    <w:bookmarkEnd w:id="104"/>
+    <w:bookmarkStart w:id="105" w:name="deploying-changes"/>
     <w:p>
       <w:pPr>
         <w:pStyle w:val="Heading2"/>
@@ -15219,8 +15397,8 @@
         <w:t xml:space="preserve">must pass for the deploy to go live.</w:t>
       </w:r>
     </w:p>
-    <w:bookmarkEnd w:id="103"/>
-    <w:bookmarkStart w:id="105" w:name="local-development"/>
+    <w:bookmarkEnd w:id="105"/>
+    <w:bookmarkStart w:id="107" w:name="local-development"/>
     <w:p>
       <w:pPr>
         <w:pStyle w:val="Heading2"/>
@@ -15361,7 +15539,7 @@
       <w:r>
         <w:t xml:space="preserve"> </w:t>
       </w:r>
-      <w:hyperlink r:id="rId104">
+      <w:hyperlink r:id="rId106">
         <w:r>
           <w:rPr>
             <w:rStyle w:val="Hyperlink"/>
@@ -15378,9 +15556,9 @@
         <w:br w:type="page"/>
       </w:r>
     </w:p>
-    <w:bookmarkEnd w:id="105"/>
-    <w:bookmarkEnd w:id="106"/>
-    <w:bookmarkStart w:id="117" w:name="card-reader--kiosk-setup"/>
+    <w:bookmarkEnd w:id="107"/>
+    <w:bookmarkEnd w:id="108"/>
+    <w:bookmarkStart w:id="119" w:name="card-reader--kiosk-setup"/>
     <w:p>
       <w:pPr>
         <w:pStyle w:val="Heading1"/>
@@ -15915,7 +16093,7 @@
         <w:t xml:space="preserve">. See the Web NFC section below.</w:t>
       </w:r>
     </w:p>
-    <w:bookmarkStart w:id="107" w:name="ipad--tablet-kiosk-hid-keyboard-wedge"/>
+    <w:bookmarkStart w:id="109" w:name="ipad--tablet-kiosk-hid-keyboard-wedge"/>
     <w:p>
       <w:pPr>
         <w:pStyle w:val="Heading2"/>
@@ -16432,8 +16610,8 @@
         <w:t xml:space="preserve">— then every device stays in sync automatically.</w:t>
       </w:r>
     </w:p>
-    <w:bookmarkEnd w:id="107"/>
-    <w:bookmarkStart w:id="109" w:name="android-phone-kiosk-web-nfc--nfc-mode"/>
+    <w:bookmarkEnd w:id="109"/>
+    <w:bookmarkStart w:id="111" w:name="android-phone-kiosk-web-nfc--nfc-mode"/>
     <w:p>
       <w:pPr>
         <w:pStyle w:val="Heading2"/>
@@ -16518,7 +16696,7 @@
       <w:r>
         <w:t xml:space="preserve"> </w:t>
       </w:r>
-      <w:hyperlink r:id="rId108">
+      <w:hyperlink r:id="rId110">
         <w:r>
           <w:rPr>
             <w:rStyle w:val="Hyperlink"/>
@@ -16915,8 +17093,8 @@
         <w:t xml:space="preserve">.</w:t>
       </w:r>
     </w:p>
-    <w:bookmarkEnd w:id="109"/>
-    <w:bookmarkStart w:id="110" w:name="laptop-kiosk-arago-websocket"/>
+    <w:bookmarkEnd w:id="111"/>
+    <w:bookmarkStart w:id="112" w:name="laptop-kiosk-arago-websocket"/>
     <w:p>
       <w:pPr>
         <w:pStyle w:val="Heading2"/>
@@ -16966,8 +17144,8 @@
         <w:t xml:space="preserve">directly.</w:t>
       </w:r>
     </w:p>
-    <w:bookmarkEnd w:id="110"/>
-    <w:bookmarkStart w:id="111" w:name="how-it-works"/>
+    <w:bookmarkEnd w:id="112"/>
+    <w:bookmarkStart w:id="113" w:name="how-it-works"/>
     <w:p>
       <w:pPr>
         <w:pStyle w:val="Heading2"/>
@@ -17254,8 +17432,8 @@
         <w:t xml:space="preserve">, and the page auto-reconnects every 3 seconds.</w:t>
       </w:r>
     </w:p>
-    <w:bookmarkEnd w:id="111"/>
-    <w:bookmarkStart w:id="114" w:name="kiosk-laptop-setup"/>
+    <w:bookmarkEnd w:id="113"/>
+    <w:bookmarkStart w:id="116" w:name="kiosk-laptop-setup"/>
     <w:p>
       <w:pPr>
         <w:pStyle w:val="Heading2"/>
@@ -17400,7 +17578,7 @@
         <w:t xml:space="preserve">right value.</w:t>
       </w:r>
     </w:p>
-    <w:bookmarkStart w:id="112" w:name="port-conflict-warning"/>
+    <w:bookmarkStart w:id="114" w:name="port-conflict-warning"/>
     <w:p>
       <w:pPr>
         <w:pStyle w:val="Heading3"/>
@@ -17502,8 +17680,8 @@
         <w:t xml:space="preserve">free for the reader.</w:t>
       </w:r>
     </w:p>
-    <w:bookmarkEnd w:id="112"/>
-    <w:bookmarkStart w:id="113" w:name="ws-vs-wss"/>
+    <w:bookmarkEnd w:id="114"/>
+    <w:bookmarkStart w:id="115" w:name="ws-vs-wss"/>
     <w:p>
       <w:pPr>
         <w:pStyle w:val="Heading3"/>
@@ -17589,9 +17767,9 @@
         <w:t xml:space="preserve">reader over the network — that would be blocked as mixed content.</w:t>
       </w:r>
     </w:p>
-    <w:bookmarkEnd w:id="113"/>
-    <w:bookmarkEnd w:id="114"/>
-    <w:bookmarkStart w:id="115" w:name="card-uids"/>
+    <w:bookmarkEnd w:id="115"/>
+    <w:bookmarkEnd w:id="116"/>
+    <w:bookmarkStart w:id="117" w:name="card-uids"/>
     <w:p>
       <w:pPr>
         <w:pStyle w:val="Heading2"/>
@@ -17660,8 +17838,8 @@
         <w:t xml:space="preserve">.</w:t>
       </w:r>
     </w:p>
-    <w:bookmarkEnd w:id="115"/>
-    <w:bookmarkStart w:id="116" w:name="testing-without-a-reader"/>
+    <w:bookmarkEnd w:id="117"/>
+    <w:bookmarkStart w:id="118" w:name="testing-without-a-reader"/>
     <w:p>
       <w:pPr>
         <w:pStyle w:val="Heading2"/>
@@ -18179,9 +18357,9 @@
         <w:br w:type="page"/>
       </w:r>
     </w:p>
-    <w:bookmarkEnd w:id="116"/>
-    <w:bookmarkEnd w:id="117"/>
-    <w:bookmarkStart w:id="127" w:name="congressus-integration"/>
+    <w:bookmarkEnd w:id="118"/>
+    <w:bookmarkEnd w:id="119"/>
+    <w:bookmarkStart w:id="129" w:name="congressus-integration"/>
     <w:p>
       <w:pPr>
         <w:pStyle w:val="Heading1"/>
@@ -18491,7 +18669,7 @@
         <w:t xml:space="preserve">) — see below.</w:t>
       </w:r>
     </w:p>
-    <w:bookmarkStart w:id="118" w:name="members-congressus--sss"/>
+    <w:bookmarkStart w:id="120" w:name="members-congressus--sss"/>
     <w:p>
       <w:pPr>
         <w:pStyle w:val="Heading2"/>
@@ -18589,8 +18767,8 @@
         <w:t xml:space="preserve">(email is the unique key used for card linking).</w:t>
       </w:r>
     </w:p>
-    <w:bookmarkEnd w:id="118"/>
-    <w:bookmarkStart w:id="121" w:name="products-sss--congressus"/>
+    <w:bookmarkEnd w:id="120"/>
+    <w:bookmarkStart w:id="123" w:name="products-sss--congressus"/>
     <w:p>
       <w:pPr>
         <w:pStyle w:val="Heading2"/>
@@ -18644,7 +18822,7 @@
         <w:t xml:space="preserve">). Name/price edits sync too.</w:t>
       </w:r>
     </w:p>
-    <w:bookmarkStart w:id="119" w:name="warning-the-product-id-vs-offer-id-quirk"/>
+    <w:bookmarkStart w:id="121" w:name="warning-the-product-id-vs-offer-id-quirk"/>
     <w:p>
       <w:pPr>
         <w:pStyle w:val="Heading3"/>
@@ -18936,8 +19114,8 @@
         <w:t xml:space="preserve">.</w:t>
       </w:r>
     </w:p>
-    <w:bookmarkEnd w:id="119"/>
-    <w:bookmarkStart w:id="120" w:name="backfilling-existing-products"/>
+    <w:bookmarkEnd w:id="121"/>
+    <w:bookmarkStart w:id="122" w:name="backfilling-existing-products"/>
     <w:p>
       <w:pPr>
         <w:pStyle w:val="Heading3"/>
@@ -18972,9 +19150,9 @@
         <w:t xml:space="preserve">.</w:t>
       </w:r>
     </w:p>
-    <w:bookmarkEnd w:id="120"/>
-    <w:bookmarkEnd w:id="121"/>
-    <w:bookmarkStart w:id="123" w:name="sale-invoices-sss--congressus"/>
+    <w:bookmarkEnd w:id="122"/>
+    <w:bookmarkEnd w:id="123"/>
+    <w:bookmarkStart w:id="125" w:name="sale-invoices-sss--congressus"/>
     <w:p>
       <w:pPr>
         <w:pStyle w:val="Heading2"/>
@@ -19252,7 +19430,7 @@
         <w:t xml:space="preserve">.</w:t>
       </w:r>
     </w:p>
-    <w:bookmarkStart w:id="122" w:name="warning-the-500-instead-of-400-quirk"/>
+    <w:bookmarkStart w:id="124" w:name="warning-the-500-instead-of-400-quirk"/>
     <w:p>
       <w:pPr>
         <w:pStyle w:val="Heading3"/>
@@ -19358,9 +19536,9 @@
         <w:t xml:space="preserve">array in the initial create call.</w:t>
       </w:r>
     </w:p>
-    <w:bookmarkEnd w:id="122"/>
-    <w:bookmarkEnd w:id="123"/>
-    <w:bookmarkStart w:id="124" w:name="the-sss-purchases-mendix-fallback"/>
+    <w:bookmarkEnd w:id="124"/>
+    <w:bookmarkEnd w:id="125"/>
+    <w:bookmarkStart w:id="126" w:name="the-sss-purchases-mendix-fallback"/>
     <w:p>
       <w:pPr>
         <w:pStyle w:val="Heading2"/>
@@ -19410,8 +19588,8 @@
         <w:t xml:space="preserve">products have offer ids, invoices show real product line items instead.</w:t>
       </w:r>
     </w:p>
-    <w:bookmarkEnd w:id="124"/>
-    <w:bookmarkStart w:id="125" w:name="Xcbc730bcd032a0e57daa67cba6c562d436e893f"/>
+    <w:bookmarkEnd w:id="126"/>
+    <w:bookmarkStart w:id="127" w:name="Xcbc730bcd032a0e57daa67cba6c562d436e893f"/>
     <w:p>
       <w:pPr>
         <w:pStyle w:val="Heading2"/>
@@ -19976,8 +20154,8 @@
         <w:t xml:space="preserve">with the returned id.</w:t>
       </w:r>
     </w:p>
-    <w:bookmarkEnd w:id="125"/>
-    <w:bookmarkStart w:id="126" w:name="quick-reference-of-quirks"/>
+    <w:bookmarkEnd w:id="127"/>
+    <w:bookmarkStart w:id="128" w:name="quick-reference-of-quirks"/>
     <w:p>
       <w:pPr>
         <w:pStyle w:val="Heading2"/>
@@ -20427,9 +20605,9 @@
         <w:br w:type="page"/>
       </w:r>
     </w:p>
-    <w:bookmarkEnd w:id="126"/>
-    <w:bookmarkEnd w:id="127"/>
-    <w:bookmarkStart w:id="134" w:name="admin-guide-for-the-board"/>
+    <w:bookmarkEnd w:id="128"/>
+    <w:bookmarkEnd w:id="129"/>
+    <w:bookmarkStart w:id="136" w:name="admin-guide-for-the-board"/>
     <w:p>
       <w:pPr>
         <w:pStyle w:val="Heading1"/>
@@ -20469,7 +20647,7 @@
         <w:t xml:space="preserve">and Invoices, plus links back to the Kiosk and Log out.</w:t>
       </w:r>
     </w:p>
-    <w:bookmarkStart w:id="128" w:name="dashboard"/>
+    <w:bookmarkStart w:id="130" w:name="dashboard"/>
     <w:p>
       <w:pPr>
         <w:pStyle w:val="Heading2"/>
@@ -20686,8 +20864,8 @@
         <w:t xml:space="preserve">purchases in the chosen period.</w:t>
       </w:r>
     </w:p>
-    <w:bookmarkEnd w:id="128"/>
-    <w:bookmarkStart w:id="129" w:name="members"/>
+    <w:bookmarkEnd w:id="130"/>
+    <w:bookmarkStart w:id="131" w:name="members"/>
     <w:p>
       <w:pPr>
         <w:pStyle w:val="Heading2"/>
@@ -20765,35 +20943,89 @@
           <w:b/>
           <w:bCs/>
         </w:rPr>
-        <w:t xml:space="preserve">🛒 Enter store</w:t>
-      </w:r>
-      <w:r>
-        <w:t xml:space="preserve"> </w:t>
-      </w:r>
-      <w:r>
-        <w:t xml:space="preserve">— opens the kiosk shop</w:t>
-      </w:r>
-      <w:r>
-        <w:t xml:space="preserve"> </w:t>
-      </w:r>
-      <w:r>
-        <w:rPr>
-          <w:b/>
-          <w:bCs/>
-        </w:rPr>
-        <w:t xml:space="preserve">as that member</w:t>
-      </w:r>
-      <w:r>
-        <w:t xml:space="preserve"> </w:t>
-      </w:r>
-      <w:r>
-        <w:t xml:space="preserve">so you can place an</w:t>
-      </w:r>
-      <w:r>
-        <w:t xml:space="preserve"> </w:t>
-      </w:r>
-      <w:r>
-        <w:t xml:space="preserve">order on their behalf (e.g. manual sale). It behaves exactly like a card tap.</w:t>
+        <w:t xml:space="preserve">📊 Dashboard</w:t>
+      </w:r>
+      <w:r>
+        <w:t xml:space="preserve"> </w:t>
+      </w:r>
+      <w:r>
+        <w:t xml:space="preserve">(or click the name) — the member's page: total spend split</w:t>
+      </w:r>
+      <w:r>
+        <w:t xml:space="preserve"> </w:t>
+      </w:r>
+      <w:r>
+        <w:rPr>
+          <w:b/>
+          <w:bCs/>
+        </w:rPr>
+        <w:t xml:space="preserve">SSS / PPP</w:t>
+      </w:r>
+      <w:r>
+        <w:t xml:space="preserve">, the</w:t>
+      </w:r>
+      <w:r>
+        <w:t xml:space="preserve"> </w:t>
+      </w:r>
+      <w:r>
+        <w:rPr>
+          <w:b/>
+          <w:bCs/>
+        </w:rPr>
+        <w:t xml:space="preserve">open invoice</w:t>
+      </w:r>
+      <w:r>
+        <w:t xml:space="preserve"> </w:t>
+      </w:r>
+      <w:r>
+        <w:t xml:space="preserve">(confirmed but not yet exported to</w:t>
+      </w:r>
+      <w:r>
+        <w:t xml:space="preserve"> </w:t>
+      </w:r>
+      <w:r>
+        <w:t xml:space="preserve">Congressus), every past purchase (filter All / SSS / PPP; each marked Open or</w:t>
+      </w:r>
+      <w:r>
+        <w:t xml:space="preserve"> </w:t>
+      </w:r>
+      <w:r>
+        <w:t xml:space="preserve">Exported), their</w:t>
+      </w:r>
+      <w:r>
+        <w:t xml:space="preserve"> </w:t>
+      </w:r>
+      <w:r>
+        <w:rPr>
+          <w:b/>
+          <w:bCs/>
+        </w:rPr>
+        <w:t xml:space="preserve">linked cards with UIDs</w:t>
+      </w:r>
+      <w:r>
+        <w:t xml:space="preserve">, and</w:t>
+      </w:r>
+      <w:r>
+        <w:t xml:space="preserve"> </w:t>
+      </w:r>
+      <w:r>
+        <w:rPr>
+          <w:b/>
+          <w:bCs/>
+        </w:rPr>
+        <w:t xml:space="preserve">🎟️ Edit roles</w:t>
+      </w:r>
+      <w:r>
+        <w:t xml:space="preserve"> </w:t>
+      </w:r>
+      <w:r>
+        <w:t xml:space="preserve">to add/remove</w:t>
+      </w:r>
+      <w:r>
+        <w:t xml:space="preserve"> </w:t>
+      </w:r>
+      <w:r>
+        <w:t xml:space="preserve">roles (bar drink discounts) — saved immediately.</w:t>
       </w:r>
     </w:p>
     <w:p>
@@ -20809,6 +21041,100 @@
           <w:b/>
           <w:bCs/>
         </w:rPr>
+        <w:t xml:space="preserve">Lost card → Unlink</w:t>
+      </w:r>
+      <w:r>
+        <w:t xml:space="preserve"> </w:t>
+      </w:r>
+      <w:r>
+        <w:t xml:space="preserve">— on the member dashboard,</w:t>
+      </w:r>
+      <w:r>
+        <w:t xml:space="preserve"> </w:t>
+      </w:r>
+      <w:r>
+        <w:rPr>
+          <w:b/>
+          <w:bCs/>
+        </w:rPr>
+        <w:t xml:space="preserve">Unlink</w:t>
+      </w:r>
+      <w:r>
+        <w:t xml:space="preserve"> </w:t>
+      </w:r>
+      <w:r>
+        <w:t xml:space="preserve">removes just that</w:t>
+      </w:r>
+      <w:r>
+        <w:t xml:space="preserve"> </w:t>
+      </w:r>
+      <w:r>
+        <w:t xml:space="preserve">card. It stops working immediately; the member and their history are kept. The</w:t>
+      </w:r>
+      <w:r>
+        <w:t xml:space="preserve"> </w:t>
+      </w:r>
+      <w:r>
+        <w:t xml:space="preserve">member can link a new (or the found) card again via the normal flow.</w:t>
+      </w:r>
+    </w:p>
+    <w:p>
+      <w:pPr>
+        <w:pStyle w:val="Compact"/>
+        <w:numPr>
+          <w:ilvl w:val="0"/>
+          <w:numId w:val="1037"/>
+        </w:numPr>
+      </w:pPr>
+      <w:r>
+        <w:rPr>
+          <w:b/>
+          <w:bCs/>
+        </w:rPr>
+        <w:t xml:space="preserve">🛒 Enter store</w:t>
+      </w:r>
+      <w:r>
+        <w:t xml:space="preserve"> </w:t>
+      </w:r>
+      <w:r>
+        <w:t xml:space="preserve">— opens the kiosk shop</w:t>
+      </w:r>
+      <w:r>
+        <w:t xml:space="preserve"> </w:t>
+      </w:r>
+      <w:r>
+        <w:rPr>
+          <w:b/>
+          <w:bCs/>
+        </w:rPr>
+        <w:t xml:space="preserve">as that member</w:t>
+      </w:r>
+      <w:r>
+        <w:t xml:space="preserve"> </w:t>
+      </w:r>
+      <w:r>
+        <w:t xml:space="preserve">so you can place an</w:t>
+      </w:r>
+      <w:r>
+        <w:t xml:space="preserve"> </w:t>
+      </w:r>
+      <w:r>
+        <w:t xml:space="preserve">order on their behalf (e.g. manual sale). It behaves exactly like a card tap.</w:t>
+      </w:r>
+    </w:p>
+    <w:p>
+      <w:pPr>
+        <w:pStyle w:val="Compact"/>
+        <w:numPr>
+          <w:ilvl w:val="0"/>
+          <w:numId w:val="1037"/>
+        </w:numPr>
+      </w:pPr>
+      <w:r>
+        <w:rPr>
+          <w:b/>
+          <w:bCs/>
+        </w:rPr>
         <w:t xml:space="preserve">Delete</w:t>
       </w:r>
       <w:r>
@@ -20838,8 +21164,8 @@
         <w:t xml:space="preserve">link cards from the admin panel.</w:t>
       </w:r>
     </w:p>
-    <w:bookmarkEnd w:id="129"/>
-    <w:bookmarkStart w:id="130" w:name="products"/>
+    <w:bookmarkEnd w:id="131"/>
+    <w:bookmarkStart w:id="132" w:name="products"/>
     <w:p>
       <w:pPr>
         <w:pStyle w:val="Heading2"/>
@@ -21465,8 +21791,8 @@
         <w:t xml:space="preserve">— hides a product you no longer sell.</w:t>
       </w:r>
     </w:p>
-    <w:bookmarkEnd w:id="130"/>
-    <w:bookmarkStart w:id="131" w:name="invoices"/>
+    <w:bookmarkEnd w:id="132"/>
+    <w:bookmarkStart w:id="133" w:name="invoices"/>
     <w:p>
       <w:pPr>
         <w:pStyle w:val="Heading2"/>
@@ -21698,8 +22024,8 @@
         <w:t xml:space="preserve">corrections after export must be made in Congressus directly.</w:t>
       </w:r>
     </w:p>
-    <w:bookmarkEnd w:id="131"/>
-    <w:bookmarkStart w:id="132" w:name="typical-monthly-routine"/>
+    <w:bookmarkEnd w:id="133"/>
+    <w:bookmarkStart w:id="134" w:name="typical-monthly-routine"/>
     <w:p>
       <w:pPr>
         <w:pStyle w:val="Heading2"/>
@@ -21792,8 +22118,8 @@
         <w:t xml:space="preserve">Verify the new invoices in Congressus.</w:t>
       </w:r>
     </w:p>
-    <w:bookmarkEnd w:id="132"/>
-    <w:bookmarkStart w:id="133" w:name="Xdfdd6fef4644c16841a13fbca3b793942ebb4aa"/>
+    <w:bookmarkEnd w:id="134"/>
+    <w:bookmarkStart w:id="135" w:name="Xdfdd6fef4644c16841a13fbca3b793942ebb4aa"/>
     <w:p>
       <w:pPr>
         <w:pStyle w:val="Heading2"/>
@@ -21929,9 +22255,9 @@
         <w:br w:type="page"/>
       </w:r>
     </w:p>
-    <w:bookmarkEnd w:id="133"/>
-    <w:bookmarkEnd w:id="134"/>
-    <w:bookmarkStart w:id="155" w:name="ppp--bar-pos-drinks-at-activities"/>
+    <w:bookmarkEnd w:id="135"/>
+    <w:bookmarkEnd w:id="136"/>
+    <w:bookmarkStart w:id="157" w:name="ppp--bar-pos-drinks-at-activities"/>
     <w:p>
       <w:pPr>
         <w:pStyle w:val="Heading1"/>
@@ -22106,7 +22432,7 @@
         <w:t xml:space="preserve">  Member card ──tap──▶ Bar POS ──confirm──▶ PppInvoice ──monthly──▶ Congressus ("PPP &lt;month&gt;")</w:t>
       </w:r>
     </w:p>
-    <w:bookmarkStart w:id="135" w:name="surfaces"/>
+    <w:bookmarkStart w:id="137" w:name="surfaces"/>
     <w:p>
       <w:pPr>
         <w:pStyle w:val="Heading2"/>
@@ -22528,8 +22854,8 @@
         <w:t xml:space="preserve">is public).</w:t>
       </w:r>
     </w:p>
-    <w:bookmarkEnd w:id="135"/>
-    <w:bookmarkStart w:id="138" w:name="the-pos-screen-pppactivityid"/>
+    <w:bookmarkEnd w:id="137"/>
+    <w:bookmarkStart w:id="140" w:name="the-pos-screen-pppactivityid"/>
     <w:p>
       <w:pPr>
         <w:pStyle w:val="Heading2"/>
@@ -22949,62 +23275,68 @@
           <w:b/>
           <w:bCs/>
         </w:rPr>
-        <w:t xml:space="preserve">Bottom (left column)</w:t>
-      </w:r>
-      <w:r>
-        <w:t xml:space="preserve"> </w:t>
-      </w:r>
-      <w:r>
-        <w:t xml:space="preserve">—</w:t>
-      </w:r>
-      <w:r>
-        <w:t xml:space="preserve"> </w:t>
-      </w:r>
-      <w:r>
-        <w:rPr>
-          <w:b/>
-          <w:bCs/>
-        </w:rPr>
-        <w:t xml:space="preserve">Regulars</w:t>
-      </w:r>
-      <w:r>
-        <w:t xml:space="preserve">: large circular buttons of members who</w:t>
-      </w:r>
-      <w:r>
-        <w:t xml:space="preserve"> </w:t>
-      </w:r>
-      <w:r>
-        <w:t xml:space="preserve">have ordered at this borrel, most orders first. Tap one to charge them</w:t>
-      </w:r>
-      <w:r>
-        <w:t xml:space="preserve"> </w:t>
-      </w:r>
-      <w:r>
-        <w:rPr>
-          <w:b/>
-          <w:bCs/>
-        </w:rPr>
-        <w:t xml:space="preserve">without</w:t>
-      </w:r>
-      <w:r>
-        <w:rPr>
-          <w:b/>
-          <w:bCs/>
-        </w:rPr>
-        <w:t xml:space="preserve"> </w:t>
-      </w:r>
-      <w:r>
-        <w:rPr>
-          <w:b/>
-          <w:bCs/>
-        </w:rPr>
-        <w:t xml:space="preserve">scanning</w:t>
-      </w:r>
-      <w:r>
-        <w:t xml:space="preserve"> </w:t>
-      </w:r>
-      <w:r>
-        <w:t xml:space="preserve">a card.</w:t>
+        <w:t xml:space="preserve">Idle sign-out</w:t>
+      </w:r>
+      <w:r>
+        <w:t xml:space="preserve"> </w:t>
+      </w:r>
+      <w:r>
+        <w:t xml:space="preserve">— if no order is confirmed on the POS for</w:t>
+      </w:r>
+      <w:r>
+        <w:t xml:space="preserve"> </w:t>
+      </w:r>
+      <w:r>
+        <w:rPr>
+          <w:b/>
+          <w:bCs/>
+        </w:rPr>
+        <w:t xml:space="preserve">1 hour</w:t>
+      </w:r>
+      <w:r>
+        <w:t xml:space="preserve"> </w:t>
+      </w:r>
+      <w:r>
+        <w:t xml:space="preserve">(counted</w:t>
+      </w:r>
+      <w:r>
+        <w:t xml:space="preserve"> </w:t>
+      </w:r>
+      <w:r>
+        <w:t xml:space="preserve">from opening the borrel or the last order), the bartender is signed out (server</w:t>
+      </w:r>
+      <w:r>
+        <w:t xml:space="preserve"> </w:t>
+      </w:r>
+      <w:r>
+        <w:t xml:space="preserve">session deleted) and sent to</w:t>
+      </w:r>
+      <w:r>
+        <w:t xml:space="preserve"> </w:t>
+      </w:r>
+      <w:r>
+        <w:rPr>
+          <w:rStyle w:val="VerbatimChar"/>
+        </w:rPr>
+        <w:t xml:space="preserve">/ppp/login</w:t>
+      </w:r>
+      <w:r>
+        <w:t xml:space="preserve"> </w:t>
+      </w:r>
+      <w:r>
+        <w:t xml:space="preserve">with a notice, ending the borrel on that</w:t>
+      </w:r>
+      <w:r>
+        <w:t xml:space="preserve"> </w:t>
+      </w:r>
+      <w:r>
+        <w:t xml:space="preserve">device. A red banner warns during the last 5 minutes. The clock is wall-time</w:t>
+      </w:r>
+      <w:r>
+        <w:t xml:space="preserve"> </w:t>
+      </w:r>
+      <w:r>
+        <w:t xml:space="preserve">based, so a phone that slept through the hour signs out as soon as it wakes.</w:t>
       </w:r>
     </w:p>
     <w:p>
@@ -23020,6 +23352,77 @@
           <w:b/>
           <w:bCs/>
         </w:rPr>
+        <w:t xml:space="preserve">Bottom (left column)</w:t>
+      </w:r>
+      <w:r>
+        <w:t xml:space="preserve"> </w:t>
+      </w:r>
+      <w:r>
+        <w:t xml:space="preserve">—</w:t>
+      </w:r>
+      <w:r>
+        <w:t xml:space="preserve"> </w:t>
+      </w:r>
+      <w:r>
+        <w:rPr>
+          <w:b/>
+          <w:bCs/>
+        </w:rPr>
+        <w:t xml:space="preserve">Regulars</w:t>
+      </w:r>
+      <w:r>
+        <w:t xml:space="preserve">: large circular buttons of members who</w:t>
+      </w:r>
+      <w:r>
+        <w:t xml:space="preserve"> </w:t>
+      </w:r>
+      <w:r>
+        <w:t xml:space="preserve">have ordered at this borrel, most orders first. Tap one to charge them</w:t>
+      </w:r>
+      <w:r>
+        <w:t xml:space="preserve"> </w:t>
+      </w:r>
+      <w:r>
+        <w:rPr>
+          <w:b/>
+          <w:bCs/>
+        </w:rPr>
+        <w:t xml:space="preserve">without</w:t>
+      </w:r>
+      <w:r>
+        <w:rPr>
+          <w:b/>
+          <w:bCs/>
+        </w:rPr>
+        <w:t xml:space="preserve"> </w:t>
+      </w:r>
+      <w:r>
+        <w:rPr>
+          <w:b/>
+          <w:bCs/>
+        </w:rPr>
+        <w:t xml:space="preserve">scanning</w:t>
+      </w:r>
+      <w:r>
+        <w:t xml:space="preserve"> </w:t>
+      </w:r>
+      <w:r>
+        <w:t xml:space="preserve">a card.</w:t>
+      </w:r>
+    </w:p>
+    <w:p>
+      <w:pPr>
+        <w:pStyle w:val="Compact"/>
+        <w:numPr>
+          <w:ilvl w:val="0"/>
+          <w:numId w:val="1043"/>
+        </w:numPr>
+      </w:pPr>
+      <w:r>
+        <w:rPr>
+          <w:b/>
+          <w:bCs/>
+        </w:rPr>
         <w:t xml:space="preserve">History tab</w:t>
       </w:r>
       <w:r>
@@ -23428,7 +23831,7 @@
         <w:t xml:space="preserve">query, same as the kiosk.</w:t>
       </w:r>
     </w:p>
-    <w:bookmarkStart w:id="137" w:name="android-phone-as-an-nfc-kiosk-modenfc"/>
+    <w:bookmarkStart w:id="139" w:name="android-phone-as-an-nfc-kiosk-modenfc"/>
     <w:p>
       <w:pPr>
         <w:pStyle w:val="Heading3"/>
@@ -23593,7 +23996,7 @@
       <w:r>
         <w:t xml:space="preserve"> </w:t>
       </w:r>
-      <w:hyperlink r:id="rId108">
+      <w:hyperlink r:id="rId110">
         <w:r>
           <w:rPr>
             <w:rStyle w:val="Hyperlink"/>
@@ -24125,7 +24528,7 @@
       <w:r>
         <w:t xml:space="preserve"> </w:t>
       </w:r>
-      <w:hyperlink r:id="rId136">
+      <w:hyperlink r:id="rId138">
         <w:r>
           <w:rPr>
             <w:rStyle w:val="Hyperlink"/>
@@ -24137,9 +24540,9 @@
         <w:t xml:space="preserve">.</w:t>
       </w:r>
     </w:p>
-    <w:bookmarkEnd w:id="137"/>
-    <w:bookmarkEnd w:id="138"/>
-    <w:bookmarkStart w:id="145" w:name="pricing--discounts"/>
+    <w:bookmarkEnd w:id="139"/>
+    <w:bookmarkEnd w:id="140"/>
+    <w:bookmarkStart w:id="147" w:name="pricing--discounts"/>
     <w:p>
       <w:pPr>
         <w:pStyle w:val="Heading2"/>
@@ -24201,7 +24604,7 @@
         <w:t xml:space="preserve">— the client never sets prices.</w:t>
       </w:r>
     </w:p>
-    <w:bookmarkStart w:id="139" w:name="member-roles-memberrole"/>
+    <w:bookmarkStart w:id="141" w:name="member-roles-memberrole"/>
     <w:p>
       <w:pPr>
         <w:pStyle w:val="Heading3"/>
@@ -24299,8 +24702,8 @@
         <w:t xml:space="preserve">footing. Examples: Board = 100 % (free), PilsCie = €0.75 off, Bartenders = 25 %.</w:t>
       </w:r>
     </w:p>
-    <w:bookmarkEnd w:id="139"/>
-    <w:bookmarkStart w:id="140" w:name="Xdc2cc5689f60cdecc95c97ccb849e07d18c3f1b"/>
+    <w:bookmarkEnd w:id="141"/>
+    <w:bookmarkStart w:id="142" w:name="Xdc2cc5689f60cdecc95c97ccb849e07d18c3f1b"/>
     <w:p>
       <w:pPr>
         <w:pStyle w:val="Heading3"/>
@@ -24362,8 +24765,8 @@
         <w:t xml:space="preserve">(so an already-discounted drink doesn't also get €0.75 off).</w:t>
       </w:r>
     </w:p>
-    <w:bookmarkEnd w:id="140"/>
-    <w:bookmarkStart w:id="141" w:name="Xda7dac18422d7a5f8c5c30b94cce3929299f78b"/>
+    <w:bookmarkEnd w:id="142"/>
+    <w:bookmarkStart w:id="143" w:name="Xda7dac18422d7a5f8c5c30b94cce3929299f78b"/>
     <w:p>
       <w:pPr>
         <w:pStyle w:val="Heading3"/>
@@ -24433,8 +24836,8 @@
         <w:t xml:space="preserve">percentage role discounts apply on top.</w:t>
       </w:r>
     </w:p>
-    <w:bookmarkEnd w:id="141"/>
-    <w:bookmarkStart w:id="142" w:name="X52d93846910a4db1f279ccfc2712d1574c029da"/>
+    <w:bookmarkEnd w:id="143"/>
+    <w:bookmarkStart w:id="144" w:name="X52d93846910a4db1f279ccfc2712d1574c029da"/>
     <w:p>
       <w:pPr>
         <w:pStyle w:val="Heading3"/>
@@ -24559,8 +24962,8 @@
         <w:t xml:space="preserve">price  = base − bestRoleDiscount(base, roles, ignoreFixed = isSpecial)   (never &lt; 0)</w:t>
       </w:r>
     </w:p>
-    <w:bookmarkEnd w:id="142"/>
-    <w:bookmarkStart w:id="143" w:name="discount-reporting-budget-per-borrel"/>
+    <w:bookmarkEnd w:id="144"/>
+    <w:bookmarkStart w:id="145" w:name="discount-reporting-budget-per-borrel"/>
     <w:p>
       <w:pPr>
         <w:pStyle w:val="Heading3"/>
@@ -24722,8 +25125,8 @@
         <w:t xml:space="preserve">— everything (specials + roles/free drinks): Σ (list − charged) × qty.</w:t>
       </w:r>
     </w:p>
-    <w:bookmarkEnd w:id="143"/>
-    <w:bookmarkStart w:id="144" w:name="Xf0315f0e6993867b2a2e5e20e7c16d85903a818"/>
+    <w:bookmarkEnd w:id="145"/>
+    <w:bookmarkStart w:id="146" w:name="Xf0315f0e6993867b2a2e5e20e7c16d85903a818"/>
     <w:p>
       <w:pPr>
         <w:pStyle w:val="Heading3"/>
@@ -24979,9 +25382,9 @@
         <w:t xml:space="preserve">of bartender-free lines (with the free-drink count).</w:t>
       </w:r>
     </w:p>
-    <w:bookmarkEnd w:id="144"/>
-    <w:bookmarkEnd w:id="145"/>
-    <w:bookmarkStart w:id="146" w:name="bartender-accounts"/>
+    <w:bookmarkEnd w:id="146"/>
+    <w:bookmarkEnd w:id="147"/>
+    <w:bookmarkStart w:id="148" w:name="bartender-accounts"/>
     <w:p>
       <w:pPr>
         <w:pStyle w:val="Heading2"/>
@@ -25266,8 +25669,8 @@
         <w:t xml:space="preserve">rate-limited (it's a convenience, weaker than the password).</w:t>
       </w:r>
     </w:p>
-    <w:bookmarkEnd w:id="146"/>
-    <w:bookmarkStart w:id="147" w:name="admin-pages-adminppp"/>
+    <w:bookmarkEnd w:id="148"/>
+    <w:bookmarkStart w:id="149" w:name="admin-pages-adminppp"/>
     <w:p>
       <w:pPr>
         <w:pStyle w:val="Heading2"/>
@@ -25361,7 +25764,23 @@
               <w:t xml:space="preserve"> </w:t>
             </w:r>
             <w:r>
-              <w:t xml:space="preserve">block for the range —</w:t>
+              <w:t xml:space="preserve">block for the range covering</w:t>
+            </w:r>
+            <w:r>
+              <w:t xml:space="preserve"> </w:t>
+            </w:r>
+            <w:r>
+              <w:rPr>
+                <w:b/>
+                <w:bCs/>
+              </w:rPr>
+              <w:t xml:space="preserve">only borrels with cost of goods uploaded</w:t>
+            </w:r>
+            <w:r>
+              <w:t xml:space="preserve"> </w:t>
+            </w:r>
+            <w:r>
+              <w:t xml:space="preserve">(so income and costs describe the same borrels) —</w:t>
             </w:r>
             <w:r>
               <w:t xml:space="preserve"> </w:t>
@@ -25409,7 +25828,23 @@
               <w:t xml:space="preserve"> </w:t>
             </w:r>
             <w:r>
-              <w:t xml:space="preserve">number (SumUp loads separately). Plus financials (revenue, drinks sold, orders, borrels, drinkers, avg,</w:t>
+              <w:t xml:space="preserve">number. SumUp loads separately and comes from each borrel's</w:t>
+            </w:r>
+            <w:r>
+              <w:t xml:space="preserve"> </w:t>
+            </w:r>
+            <w:r>
+              <w:rPr>
+                <w:b/>
+                <w:bCs/>
+              </w:rPr>
+              <w:t xml:space="preserve">saved snapshot</w:t>
+            </w:r>
+            <w:r>
+              <w:t xml:space="preserve"> </w:t>
+            </w:r>
+            <w:r>
+              <w:t xml:space="preserve">(see below); only today's borrels hit the SumUp API. The general Revenue KPI still counts all orders. Plus financials (revenue, drinks sold, orders, borrels, drinkers, avg,</w:t>
             </w:r>
             <w:r>
               <w:t xml:space="preserve"> </w:t>
@@ -25911,8 +26346,8 @@
         <w:t xml:space="preserve">a toggle picker per member).</w:t>
       </w:r>
     </w:p>
-    <w:bookmarkEnd w:id="147"/>
-    <w:bookmarkStart w:id="148" w:name="activity-profitloss"/>
+    <w:bookmarkEnd w:id="149"/>
+    <w:bookmarkStart w:id="150" w:name="activity-profitloss"/>
     <w:p>
       <w:pPr>
         <w:pStyle w:val="Heading2"/>
@@ -26468,8 +26903,160 @@
         <w:t xml:space="preserve">the rest of the P/L still renders.</w:t>
       </w:r>
     </w:p>
-    <w:bookmarkEnd w:id="148"/>
-    <w:bookmarkStart w:id="149" w:name="congressus"/>
+    <w:p>
+      <w:pPr>
+        <w:pStyle w:val="BodyText"/>
+      </w:pPr>
+      <w:r>
+        <w:rPr>
+          <w:b/>
+          <w:bCs/>
+        </w:rPr>
+        <w:t xml:space="preserve">Saved SumUp snapshot</w:t>
+      </w:r>
+      <w:r>
+        <w:t xml:space="preserve"> </w:t>
+      </w:r>
+      <w:r>
+        <w:t xml:space="preserve">(</w:t>
+      </w:r>
+      <w:r>
+        <w:rPr>
+          <w:rStyle w:val="VerbatimChar"/>
+        </w:rPr>
+        <w:t xml:space="preserve">PppActivitySumup</w:t>
+      </w:r>
+      <w:r>
+        <w:t xml:space="preserve">,</w:t>
+      </w:r>
+      <w:r>
+        <w:t xml:space="preserve"> </w:t>
+      </w:r>
+      <w:r>
+        <w:rPr>
+          <w:rStyle w:val="VerbatimChar"/>
+        </w:rPr>
+        <w:t xml:space="preserve">src/lib/activity-sumup.ts</w:t>
+      </w:r>
+      <w:r>
+        <w:t xml:space="preserve">): card sales</w:t>
+      </w:r>
+      <w:r>
+        <w:t xml:space="preserve"> </w:t>
+      </w:r>
+      <w:r>
+        <w:t xml:space="preserve">for a past borrel don't change, so they're fetched</w:t>
+      </w:r>
+      <w:r>
+        <w:t xml:space="preserve"> </w:t>
+      </w:r>
+      <w:r>
+        <w:rPr>
+          <w:b/>
+          <w:bCs/>
+        </w:rPr>
+        <w:t xml:space="preserve">live on the day</w:t>
+      </w:r>
+      <w:r>
+        <w:t xml:space="preserve"> </w:t>
+      </w:r>
+      <w:r>
+        <w:t xml:space="preserve">and</w:t>
+      </w:r>
+      <w:r>
+        <w:t xml:space="preserve"> </w:t>
+      </w:r>
+      <w:r>
+        <w:rPr>
+          <w:b/>
+          <w:bCs/>
+        </w:rPr>
+        <w:t xml:space="preserve">saved the</w:t>
+      </w:r>
+      <w:r>
+        <w:rPr>
+          <w:b/>
+          <w:bCs/>
+        </w:rPr>
+        <w:t xml:space="preserve"> </w:t>
+      </w:r>
+      <w:r>
+        <w:rPr>
+          <w:b/>
+          <w:bCs/>
+        </w:rPr>
+        <w:t xml:space="preserve">day after</w:t>
+      </w:r>
+      <w:r>
+        <w:t xml:space="preserve"> </w:t>
+      </w:r>
+      <w:r>
+        <w:t xml:space="preserve">(once both the borrel's end and the midnight after its start have passed,</w:t>
+      </w:r>
+      <w:r>
+        <w:t xml:space="preserve"> </w:t>
+      </w:r>
+      <w:r>
+        <w:t xml:space="preserve">+1 h margin — so a borrel running past midnight is saved after it actually ends).</w:t>
+      </w:r>
+      <w:r>
+        <w:t xml:space="preserve"> </w:t>
+      </w:r>
+      <w:r>
+        <w:t xml:space="preserve">From then on the detail page and dashboard read the stored figures instead of calling</w:t>
+      </w:r>
+      <w:r>
+        <w:t xml:space="preserve"> </w:t>
+      </w:r>
+      <w:r>
+        <w:t xml:space="preserve">SumUp; the hint shows "live" or "saved</w:t>
+      </w:r>
+      <w:r>
+        <w:t xml:space="preserve"> </w:t>
+      </w:r>
+      <w:r>
+        <w:t xml:space="preserve">".</w:t>
+      </w:r>
+      <w:r>
+        <w:t xml:space="preserve"> </w:t>
+      </w:r>
+      <w:r>
+        <w:rPr>
+          <w:b/>
+          <w:bCs/>
+        </w:rPr>
+        <w:t xml:space="preserve">↻ Re-fetch SumUp</w:t>
+      </w:r>
+      <w:r>
+        <w:t xml:space="preserve"> </w:t>
+      </w:r>
+      <w:r>
+        <w:t xml:space="preserve">on the detail</w:t>
+      </w:r>
+      <w:r>
+        <w:t xml:space="preserve"> </w:t>
+      </w:r>
+      <w:r>
+        <w:t xml:space="preserve">page (</w:t>
+      </w:r>
+      <w:r>
+        <w:rPr>
+          <w:rStyle w:val="VerbatimChar"/>
+        </w:rPr>
+        <w:t xml:space="preserve">GET …/sumup?refresh=1</w:t>
+      </w:r>
+      <w:r>
+        <w:t xml:space="preserve">) re-fetches and overwrites the snapshot, e.g. after a</w:t>
+      </w:r>
+      <w:r>
+        <w:t xml:space="preserve"> </w:t>
+      </w:r>
+      <w:r>
+        <w:t xml:space="preserve">late refund.</w:t>
+      </w:r>
+    </w:p>
+    <w:bookmarkEnd w:id="150"/>
+    <w:bookmarkStart w:id="151" w:name="congressus"/>
     <w:p>
       <w:pPr>
         <w:pStyle w:val="Heading2"/>
@@ -26834,8 +27421,8 @@
         <w:t xml:space="preserve">the Mendix fallback for lines without an offer id.</w:t>
       </w:r>
     </w:p>
-    <w:bookmarkEnd w:id="149"/>
-    <w:bookmarkStart w:id="150" w:name="alexia-integration-scheduled-borrels"/>
+    <w:bookmarkEnd w:id="151"/>
+    <w:bookmarkStart w:id="152" w:name="alexia-integration-scheduled-borrels"/>
     <w:p>
       <w:pPr>
         <w:pStyle w:val="Heading2"/>
@@ -27327,8 +27914,8 @@
         <w:t xml:space="preserve">).</w:t>
       </w:r>
     </w:p>
-    <w:bookmarkEnd w:id="150"/>
-    <w:bookmarkStart w:id="152" w:name="data-model-ppp"/>
+    <w:bookmarkEnd w:id="152"/>
+    <w:bookmarkStart w:id="154" w:name="data-model-ppp"/>
     <w:p>
       <w:pPr>
         <w:pStyle w:val="Heading2"/>
@@ -27347,7 +27934,7 @@
       <w:r>
         <w:t xml:space="preserve"> </w:t>
       </w:r>
-      <w:hyperlink r:id="rId151">
+      <w:hyperlink r:id="rId153">
         <w:r>
           <w:rPr>
             <w:rStyle w:val="Hyperlink"/>
@@ -27824,8 +28411,8 @@
         <w:t xml:space="preserve">unchanged for identity.</w:t>
       </w:r>
     </w:p>
-    <w:bookmarkEnd w:id="152"/>
-    <w:bookmarkStart w:id="153" w:name="api-reference-ppp"/>
+    <w:bookmarkEnd w:id="154"/>
+    <w:bookmarkStart w:id="155" w:name="api-reference-ppp"/>
     <w:p>
       <w:pPr>
         <w:pStyle w:val="Heading2"/>
@@ -28783,8 +29370,8 @@
         <w:t xml:space="preserve">.</w:t>
       </w:r>
     </w:p>
-    <w:bookmarkEnd w:id="153"/>
-    <w:bookmarkStart w:id="154" w:name="environment"/>
+    <w:bookmarkEnd w:id="155"/>
+    <w:bookmarkStart w:id="156" w:name="environment"/>
     <w:p>
       <w:pPr>
         <w:pStyle w:val="Heading2"/>
@@ -29203,9 +29790,9 @@
         <w:br w:type="page"/>
       </w:r>
     </w:p>
-    <w:bookmarkEnd w:id="154"/>
-    <w:bookmarkEnd w:id="155"/>
-    <w:bookmarkStart w:id="169" w:name="security-model"/>
+    <w:bookmarkEnd w:id="156"/>
+    <w:bookmarkEnd w:id="157"/>
+    <w:bookmarkStart w:id="171" w:name="security-model"/>
     <w:p>
       <w:pPr>
         <w:pStyle w:val="Heading1"/>
@@ -29258,7 +29845,7 @@
         <w:t xml:space="preserve">trade-offs made for a shared, physical kiosk.</w:t>
       </w:r>
     </w:p>
-    <w:bookmarkStart w:id="159" w:name="authentication--authorisation"/>
+    <w:bookmarkStart w:id="161" w:name="authentication--authorisation"/>
     <w:p>
       <w:pPr>
         <w:pStyle w:val="Heading2"/>
@@ -29267,7 +29854,7 @@
         <w:t xml:space="preserve">Authentication &amp; authorisation</w:t>
       </w:r>
     </w:p>
-    <w:bookmarkStart w:id="156" w:name="admin"/>
+    <w:bookmarkStart w:id="158" w:name="admin"/>
     <w:p>
       <w:pPr>
         <w:pStyle w:val="Heading3"/>
@@ -29549,8 +30136,8 @@
         <w:t xml:space="preserve">by the handler).</w:t>
       </w:r>
     </w:p>
-    <w:bookmarkEnd w:id="156"/>
-    <w:bookmarkStart w:id="157" w:name="shop-members"/>
+    <w:bookmarkEnd w:id="158"/>
+    <w:bookmarkStart w:id="159" w:name="shop-members"/>
     <w:p>
       <w:pPr>
         <w:pStyle w:val="Heading3"/>
@@ -29734,8 +30321,8 @@
         <w:t xml:space="preserve">away can't leave their account open for the next person.</w:t>
       </w:r>
     </w:p>
-    <w:bookmarkEnd w:id="157"/>
-    <w:bookmarkStart w:id="158" w:name="card-verification"/>
+    <w:bookmarkEnd w:id="159"/>
+    <w:bookmarkStart w:id="160" w:name="card-verification"/>
     <w:p>
       <w:pPr>
         <w:pStyle w:val="Heading3"/>
@@ -29821,9 +30408,9 @@
         <w:t xml:space="preserve">member clicked.</w:t>
       </w:r>
     </w:p>
-    <w:bookmarkEnd w:id="158"/>
-    <w:bookmarkEnd w:id="159"/>
-    <w:bookmarkStart w:id="160" w:name="X77f42a2852d9dd86410b0545fad3e0fbb180833"/>
+    <w:bookmarkEnd w:id="160"/>
+    <w:bookmarkEnd w:id="161"/>
+    <w:bookmarkStart w:id="162" w:name="X77f42a2852d9dd86410b0545fad3e0fbb180833"/>
     <w:p>
       <w:pPr>
         <w:pStyle w:val="Heading2"/>
@@ -30037,8 +30624,8 @@
         </w:tc>
       </w:tr>
     </w:tbl>
-    <w:bookmarkEnd w:id="160"/>
-    <w:bookmarkStart w:id="161" w:name="rate-limiting"/>
+    <w:bookmarkEnd w:id="162"/>
+    <w:bookmarkStart w:id="163" w:name="rate-limiting"/>
     <w:p>
       <w:pPr>
         <w:pStyle w:val="Heading2"/>
@@ -30133,8 +30720,8 @@
         <w:t xml:space="preserve">a shared store (e.g. Redis).</w:t>
       </w:r>
     </w:p>
-    <w:bookmarkEnd w:id="161"/>
-    <w:bookmarkStart w:id="162" w:name="injection--output-safety"/>
+    <w:bookmarkEnd w:id="163"/>
+    <w:bookmarkStart w:id="164" w:name="injection--output-safety"/>
     <w:p>
       <w:pPr>
         <w:pStyle w:val="Heading2"/>
@@ -30240,8 +30827,8 @@
         <w:t xml:space="preserve">correctly.</w:t>
       </w:r>
     </w:p>
-    <w:bookmarkEnd w:id="162"/>
-    <w:bookmarkStart w:id="166" w:name="deliberate-trade-offs"/>
+    <w:bookmarkEnd w:id="164"/>
+    <w:bookmarkStart w:id="168" w:name="deliberate-trade-offs"/>
     <w:p>
       <w:pPr>
         <w:pStyle w:val="Heading2"/>
@@ -30250,7 +30837,7 @@
         <w:t xml:space="preserve">Deliberate trade-offs</w:t>
       </w:r>
     </w:p>
-    <w:bookmarkStart w:id="163" w:name="card-uids-arent-secret"/>
+    <w:bookmarkStart w:id="165" w:name="card-uids-arent-secret"/>
     <w:p>
       <w:pPr>
         <w:pStyle w:val="Heading3"/>
@@ -30294,8 +30881,8 @@
         <w:t xml:space="preserve">to the kiosk's IP at the network layer.</w:t>
       </w:r>
     </w:p>
-    <w:bookmarkEnd w:id="163"/>
-    <w:bookmarkStart w:id="164" w:name="email-not-found-vs-enumeration"/>
+    <w:bookmarkEnd w:id="165"/>
+    <w:bookmarkStart w:id="166" w:name="email-not-found-vs-enumeration"/>
     <w:p>
       <w:pPr>
         <w:pStyle w:val="Heading3"/>
@@ -30385,8 +30972,8 @@
         <w:t xml:space="preserve">.</w:t>
       </w:r>
     </w:p>
-    <w:bookmarkEnd w:id="164"/>
-    <w:bookmarkStart w:id="165" w:name="shop-token-is-a-bearer-token-in-the-url"/>
+    <w:bookmarkEnd w:id="166"/>
+    <w:bookmarkStart w:id="167" w:name="shop-token-is-a-bearer-token-in-the-url"/>
     <w:p>
       <w:pPr>
         <w:pStyle w:val="Heading3"/>
@@ -30448,9 +31035,9 @@
         <w:t xml:space="preserve">token instead of a cuid.</w:t>
       </w:r>
     </w:p>
-    <w:bookmarkEnd w:id="165"/>
-    <w:bookmarkEnd w:id="166"/>
-    <w:bookmarkStart w:id="167" w:name="prohibited--careful-operations"/>
+    <w:bookmarkEnd w:id="167"/>
+    <w:bookmarkEnd w:id="168"/>
+    <w:bookmarkStart w:id="169" w:name="prohibited--careful-operations"/>
     <w:p>
       <w:pPr>
         <w:pStyle w:val="Heading2"/>
@@ -30552,8 +31139,8 @@
         <w:t xml:space="preserve">intended for test-data cleanup only.</w:t>
       </w:r>
     </w:p>
-    <w:bookmarkEnd w:id="167"/>
-    <w:bookmarkStart w:id="168" w:name="audit-checklist"/>
+    <w:bookmarkEnd w:id="169"/>
+    <w:bookmarkStart w:id="170" w:name="audit-checklist"/>
     <w:p>
       <w:pPr>
         <w:pStyle w:val="Heading2"/>
@@ -30671,8 +31258,8 @@
         <w:t xml:space="preserve">forged-cookie requests both get 401/redirect.</w:t>
       </w:r>
     </w:p>
-    <w:bookmarkEnd w:id="168"/>
-    <w:bookmarkEnd w:id="169"/>
+    <w:bookmarkEnd w:id="170"/>
+    <w:bookmarkEnd w:id="171"/>
     <w:sectPr>
       <w:footnotePr>
         <w:numRestart w:val="eachSect"/>

</xml_diff>

<commit_message>
Member sync: remove members no longer in Congressus
Members missing from the Congressus list are deleted when they have no
history, otherwise deactivated (purchases blocked, history and open invoice
kept). The sync result lists deactivated members with unexported balances.
Clean-up is skipped when Congressus returns an implausibly small list.

Co-Authored-By: Claude Opus 5.5 <noreply@anthropic.com>
</commit_message>
<xml_diff>
--- a/docs/SSS-Documentation.docx
+++ b/docs/SSS-Documentation.docx
@@ -11238,7 +11238,51 @@
         <w:pStyle w:val="FirstParagraph"/>
       </w:pPr>
       <w:r>
-        <w:t xml:space="preserve">Pulls all Primary + Secondary members from Congressus and upserts them.</w:t>
+        <w:t xml:space="preserve">Pulls all Primary + Secondary members from Congressus and upserts them, then</w:t>
+      </w:r>
+      <w:r>
+        <w:t xml:space="preserve"> </w:t>
+      </w:r>
+      <w:r>
+        <w:t xml:space="preserve">prunes members missing from that list:</w:t>
+      </w:r>
+      <w:r>
+        <w:t xml:space="preserve"> </w:t>
+      </w:r>
+      <w:r>
+        <w:rPr>
+          <w:b/>
+          <w:bCs/>
+        </w:rPr>
+        <w:t xml:space="preserve">deleted</w:t>
+      </w:r>
+      <w:r>
+        <w:t xml:space="preserve"> </w:t>
+      </w:r>
+      <w:r>
+        <w:t xml:space="preserve">if they have no invoices (and no</w:t>
+      </w:r>
+      <w:r>
+        <w:t xml:space="preserve"> </w:t>
+      </w:r>
+      <w:r>
+        <w:t xml:space="preserve">bartender login), otherwise</w:t>
+      </w:r>
+      <w:r>
+        <w:t xml:space="preserve"> </w:t>
+      </w:r>
+      <w:r>
+        <w:rPr>
+          <w:b/>
+          <w:bCs/>
+        </w:rPr>
+        <w:t xml:space="preserve">deactivated</w:t>
+      </w:r>
+      <w:r>
+        <w:t xml:space="preserve"> </w:t>
+      </w:r>
+      <w:r>
+        <w:t xml:space="preserve">(purchases blocked; history kept).</w:t>
       </w:r>
       <w:r>
         <w:t xml:space="preserve"> </w:t>
@@ -11253,10 +11297,76 @@
         <w:rPr>
           <w:rStyle w:val="VerbatimChar"/>
         </w:rPr>
-        <w:t xml:space="preserve">{ created, updated, skipped, total }</w:t>
-      </w:r>
-      <w:r>
-        <w:t xml:space="preserve">.</w:t>
+        <w:t xml:space="preserve">{ created, updated, skipped, total, deleted, deactivated, openInvoices: [{ name, openCents }], pruneSkipped }</w:t>
+      </w:r>
+      <w:r>
+        <w:t xml:space="preserve"> </w:t>
+      </w:r>
+      <w:r>
+        <w:t xml:space="preserve">—</w:t>
+      </w:r>
+      <w:r>
+        <w:t xml:space="preserve"> </w:t>
+      </w:r>
+      <w:r>
+        <w:rPr>
+          <w:rStyle w:val="VerbatimChar"/>
+        </w:rPr>
+        <w:t xml:space="preserve">openInvoices</w:t>
+      </w:r>
+      <w:r>
+        <w:t xml:space="preserve"> </w:t>
+      </w:r>
+      <w:r>
+        <w:t xml:space="preserve">= deactivated members with</w:t>
+      </w:r>
+      <w:r>
+        <w:t xml:space="preserve"> </w:t>
+      </w:r>
+      <w:r>
+        <w:t xml:space="preserve">unexported (CONFIRMED) orders;</w:t>
+      </w:r>
+      <w:r>
+        <w:t xml:space="preserve"> </w:t>
+      </w:r>
+      <w:r>
+        <w:rPr>
+          <w:rStyle w:val="VerbatimChar"/>
+        </w:rPr>
+        <w:t xml:space="preserve">pruneSkipped</w:t>
+      </w:r>
+      <w:r>
+        <w:t xml:space="preserve"> </w:t>
+      </w:r>
+      <w:r>
+        <w:t xml:space="preserve">is a message when the safety guard</w:t>
+      </w:r>
+      <w:r>
+        <w:t xml:space="preserve"> </w:t>
+      </w:r>
+      <w:r>
+        <w:t xml:space="preserve">(empty list or &lt; half the active members) skipped the clean-up.</w:t>
+      </w:r>
+      <w:r>
+        <w:t xml:space="preserve"> </w:t>
+      </w:r>
+      <w:r>
+        <w:rPr>
+          <w:rStyle w:val="VerbatimChar"/>
+        </w:rPr>
+        <w:t xml:space="preserve">502</w:t>
+      </w:r>
+      <w:r>
+        <w:t xml:space="preserve"> </w:t>
+      </w:r>
+      <w:r>
+        <w:t xml:space="preserve">if the</w:t>
+      </w:r>
+      <w:r>
+        <w:t xml:space="preserve"> </w:t>
+      </w:r>
+      <w:r>
+        <w:t xml:space="preserve">Congressus fetch fails (nothing changed).</w:t>
       </w:r>
     </w:p>
     <w:bookmarkEnd w:id="84"/>
@@ -20927,7 +21037,89 @@
         <w:t xml:space="preserve"> </w:t>
       </w:r>
       <w:r>
-        <w:t xml:space="preserve">members are flagged and cannot link cards.</w:t>
+        <w:t xml:space="preserve">members are flagged and cannot link cards. Members</w:t>
+      </w:r>
+      <w:r>
+        <w:t xml:space="preserve"> </w:t>
+      </w:r>
+      <w:r>
+        <w:rPr>
+          <w:b/>
+          <w:bCs/>
+        </w:rPr>
+        <w:t xml:space="preserve">no longer in Congressus</w:t>
+      </w:r>
+      <w:r>
+        <w:t xml:space="preserve"> </w:t>
+      </w:r>
+      <w:r>
+        <w:t xml:space="preserve">(removed there, or no longer a Primary/Secondary member) are cleaned up: those</w:t>
+      </w:r>
+      <w:r>
+        <w:t xml:space="preserve"> </w:t>
+      </w:r>
+      <w:r>
+        <w:t xml:space="preserve">with no purchases are</w:t>
+      </w:r>
+      <w:r>
+        <w:t xml:space="preserve"> </w:t>
+      </w:r>
+      <w:r>
+        <w:rPr>
+          <w:b/>
+          <w:bCs/>
+        </w:rPr>
+        <w:t xml:space="preserve">removed</w:t>
+      </w:r>
+      <w:r>
+        <w:t xml:space="preserve">; those with purchase history are</w:t>
+      </w:r>
+      <w:r>
+        <w:t xml:space="preserve"> </w:t>
+      </w:r>
+      <w:r>
+        <w:rPr>
+          <w:b/>
+          <w:bCs/>
+        </w:rPr>
+        <w:t xml:space="preserve">deactivated</w:t>
+      </w:r>
+      <w:r>
+        <w:t xml:space="preserve"> </w:t>
+      </w:r>
+      <w:r>
+        <w:t xml:space="preserve">— they can't buy anymore, but their history and open invoice are</w:t>
+      </w:r>
+      <w:r>
+        <w:t xml:space="preserve"> </w:t>
+      </w:r>
+      <w:r>
+        <w:t xml:space="preserve">kept. The result lists anyone who still has an</w:t>
+      </w:r>
+      <w:r>
+        <w:t xml:space="preserve"> </w:t>
+      </w:r>
+      <w:r>
+        <w:rPr>
+          <w:b/>
+          <w:bCs/>
+        </w:rPr>
+        <w:t xml:space="preserve">unexported balance</w:t>
+      </w:r>
+      <w:r>
+        <w:t xml:space="preserve">, so you can</w:t>
+      </w:r>
+      <w:r>
+        <w:t xml:space="preserve"> </w:t>
+      </w:r>
+      <w:r>
+        <w:t xml:space="preserve">invoice them. Safety: if Congressus returns nothing or fewer than half the</w:t>
+      </w:r>
+      <w:r>
+        <w:t xml:space="preserve"> </w:t>
+      </w:r>
+      <w:r>
+        <w:t xml:space="preserve">currently active members, the clean-up is skipped (nothing is removed).</w:t>
       </w:r>
     </w:p>
     <w:p>

</xml_diff>

<commit_message>
PPP: delete activities without orders; never re-import them from Alexia
Admins can delete an activity that has no PPP orders (e.g. external
activities or free drinks). The deleted Alexia event's name+day key is
stored in PppDismissedEvent so the Alexia sync skips it.

Co-Authored-By: Claude Opus 5.5 <noreply@anthropic.com>
</commit_message>
<xml_diff>
--- a/docs/SSS-Documentation.docx
+++ b/docs/SSS-Documentation.docx
@@ -26282,6 +26282,106 @@
             </w:r>
             <w:r>
               <w:t xml:space="preserve">shows the discount totals. Each links to its detail page.</w:t>
+            </w:r>
+          </w:p>
+        </w:tc>
+      </w:tr>
+      <w:tr>
+        <w:tc>
+          <w:tcPr/>
+          <w:p>
+            <w:pPr>
+              <w:pStyle w:val="Compact"/>
+            </w:pPr>
+            <w:r>
+              <w:rPr>
+                <w:b/>
+                <w:bCs/>
+              </w:rPr>
+              <w:t xml:space="preserve">Delete activity</w:t>
+            </w:r>
+          </w:p>
+        </w:tc>
+        <w:tc>
+          <w:tcPr/>
+          <w:p>
+            <w:pPr>
+              <w:pStyle w:val="Compact"/>
+            </w:pPr>
+            <w:r>
+              <w:t xml:space="preserve">On the Activities list,</w:t>
+            </w:r>
+            <w:r>
+              <w:t xml:space="preserve"> </w:t>
+            </w:r>
+            <w:r>
+              <w:rPr>
+                <w:b/>
+                <w:bCs/>
+              </w:rPr>
+              <w:t xml:space="preserve">Delete</w:t>
+            </w:r>
+            <w:r>
+              <w:t xml:space="preserve"> </w:t>
+            </w:r>
+            <w:r>
+              <w:t xml:space="preserve">removes an activity that has</w:t>
+            </w:r>
+            <w:r>
+              <w:t xml:space="preserve"> </w:t>
+            </w:r>
+            <w:r>
+              <w:rPr>
+                <w:b/>
+                <w:bCs/>
+              </w:rPr>
+              <w:t xml:space="preserve">no PPP orders</w:t>
+            </w:r>
+            <w:r>
+              <w:t xml:space="preserve"> </w:t>
+            </w:r>
+            <w:r>
+              <w:t xml:space="preserve">— e.g. an external activity or a free drink synced from Alexia. It's disabled (and the API returns</w:t>
+            </w:r>
+            <w:r>
+              <w:t xml:space="preserve"> </w:t>
+            </w:r>
+            <w:r>
+              <w:rPr>
+                <w:rStyle w:val="VerbatimChar"/>
+              </w:rPr>
+              <w:t xml:space="preserve">409</w:t>
+            </w:r>
+            <w:r>
+              <w:t xml:space="preserve">) once an activity has orders. Its specials, usage and saved SumUp go with it. Because Alexia events have no id (matched by name + day), the deleted event's key is stored in</w:t>
+            </w:r>
+            <w:r>
+              <w:t xml:space="preserve"> </w:t>
+            </w:r>
+            <w:r>
+              <w:rPr>
+                <w:rStyle w:val="VerbatimChar"/>
+              </w:rPr>
+              <w:t xml:space="preserve">PppDismissedEvent</w:t>
+            </w:r>
+            <w:r>
+              <w:t xml:space="preserve"> </w:t>
+            </w:r>
+            <w:r>
+              <w:t xml:space="preserve">so the</w:t>
+            </w:r>
+            <w:r>
+              <w:t xml:space="preserve"> </w:t>
+            </w:r>
+            <w:r>
+              <w:rPr>
+                <w:b/>
+                <w:bCs/>
+              </w:rPr>
+              <w:t xml:space="preserve">Alexia sync never re-imports it</w:t>
+            </w:r>
+            <w:r>
+              <w:t xml:space="preserve">.</w:t>
             </w:r>
           </w:p>
         </w:tc>

</xml_diff>

<commit_message>
PPP activities list: total revenue incl. SumUp and a profit/loss badge
Revenue combines PPP member orders and SumUp card sales (saved snapshot,
backfilled in the background for past borrels), cost of goods shown in
white, and a green/red P/L badge when costs are uploaded.

Co-Authored-By: Claude Opus 5.5 <noreply@anthropic.com>
</commit_message>
<xml_diff>
--- a/docs/SSS-Documentation.docx
+++ b/docs/SSS-Documentation.docx
@@ -26227,13 +26227,42 @@
                 <w:b/>
                 <w:bCs/>
               </w:rPr>
-              <w:t xml:space="preserve">revenue + cost of goods</w:t>
+              <w:t xml:space="preserve">total revenue (PPP member orders + SumUp card)</w:t>
             </w:r>
             <w:r>
               <w:t xml:space="preserve"> </w:t>
             </w:r>
             <w:r>
-              <w:t xml:space="preserve">(large, per event) + order counts +</w:t>
+              <w:t xml:space="preserve">with the split underneath,</w:t>
+            </w:r>
+            <w:r>
+              <w:t xml:space="preserve"> </w:t>
+            </w:r>
+            <w:r>
+              <w:rPr>
+                <w:b/>
+                <w:bCs/>
+              </w:rPr>
+              <w:t xml:space="preserve">cost of goods</w:t>
+            </w:r>
+            <w:r>
+              <w:t xml:space="preserve">, and a</w:t>
+            </w:r>
+            <w:r>
+              <w:t xml:space="preserve"> </w:t>
+            </w:r>
+            <w:r>
+              <w:rPr>
+                <w:b/>
+                <w:bCs/>
+              </w:rPr>
+              <w:t xml:space="preserve">green ▲ profit / red ▼ loss</w:t>
+            </w:r>
+            <w:r>
+              <w:t xml:space="preserve"> </w:t>
+            </w:r>
+            <w:r>
+              <w:t xml:space="preserve">badge when costs are uploaded (large, per event). SumUp comes from each borrel's saved snapshot; past borrels not saved yet are fetched once in the background (which saves them) + order counts +</w:t>
             </w:r>
             <w:r>
               <w:t xml:space="preserve"> </w:t>

</xml_diff>

<commit_message>
PPP: own-drink-only role discount (PilsCie: one drink per order)
New MemberRole.ownDrinkOnly: the role's discount applies to one unit per
order (the member's own drink); the rest of a round is charged normally.
Whole orders are priced via priceOrder() on the server and in the POS cart
(split lines), and role-cost reports credit only the discount actually
given. Migration enables it for PilsCie.

Co-Authored-By: Claude Opus 5.5 <noreply@anthropic.com>
</commit_message>
<xml_diff>
--- a/docs/SSS-Documentation.docx
+++ b/docs/SSS-Documentation.docx
@@ -24891,7 +24891,150 @@
         <w:t xml:space="preserve"> </w:t>
       </w:r>
       <w:r>
-        <w:t xml:space="preserve">footing. Examples: Board = 100 % (free), PilsCie = €0.75 off, Bartenders = 25 %.</w:t>
+        <w:t xml:space="preserve">footing. Examples: Board = 100 % (free), PilsCie = €0.72 off, Bartenders = 25 %.</w:t>
+      </w:r>
+    </w:p>
+    <w:p>
+      <w:pPr>
+        <w:pStyle w:val="BodyText"/>
+      </w:pPr>
+      <w:r>
+        <w:rPr>
+          <w:b/>
+          <w:bCs/>
+        </w:rPr>
+        <w:t xml:space="preserve">Own drink only</w:t>
+      </w:r>
+      <w:r>
+        <w:t xml:space="preserve"> </w:t>
+      </w:r>
+      <w:r>
+        <w:t xml:space="preserve">(</w:t>
+      </w:r>
+      <w:r>
+        <w:rPr>
+          <w:rStyle w:val="VerbatimChar"/>
+        </w:rPr>
+        <w:t xml:space="preserve">MemberRole.ownDrinkOnly</w:t>
+      </w:r>
+      <w:r>
+        <w:t xml:space="preserve">, on for PilsCie): the role's discount</w:t>
+      </w:r>
+      <w:r>
+        <w:t xml:space="preserve"> </w:t>
+      </w:r>
+      <w:r>
+        <w:t xml:space="preserve">applies to</w:t>
+      </w:r>
+      <w:r>
+        <w:t xml:space="preserve"> </w:t>
+      </w:r>
+      <w:r>
+        <w:rPr>
+          <w:b/>
+          <w:bCs/>
+        </w:rPr>
+        <w:t xml:space="preserve">one drink per order</w:t>
+      </w:r>
+      <w:r>
+        <w:t xml:space="preserve"> </w:t>
+      </w:r>
+      <w:r>
+        <w:t xml:space="preserve">— the member's own — and the rest of the order is</w:t>
+      </w:r>
+      <w:r>
+        <w:t xml:space="preserve"> </w:t>
+      </w:r>
+      <w:r>
+        <w:t xml:space="preserve">charged at the normal price. So a PilsCie member buying 3 beers (1 for themselves, 2</w:t>
+      </w:r>
+      <w:r>
+        <w:t xml:space="preserve"> </w:t>
+      </w:r>
+      <w:r>
+        <w:t xml:space="preserve">for friends) pays 1 discounted + 2 full price. The discounted unit is the one where</w:t>
+      </w:r>
+      <w:r>
+        <w:t xml:space="preserve"> </w:t>
+      </w:r>
+      <w:r>
+        <w:t xml:space="preserve">they save the most; other roles they hold (every-drink roles) still apply to the</w:t>
+      </w:r>
+      <w:r>
+        <w:t xml:space="preserve"> </w:t>
+      </w:r>
+      <w:r>
+        <w:t xml:space="preserve">rest. Pricing is done for the whole order in</w:t>
+      </w:r>
+      <w:r>
+        <w:t xml:space="preserve"> </w:t>
+      </w:r>
+      <w:r>
+        <w:rPr>
+          <w:rStyle w:val="VerbatimChar"/>
+        </w:rPr>
+        <w:t xml:space="preserve">priceOrder()</w:t>
+      </w:r>
+      <w:r>
+        <w:t xml:space="preserve"> </w:t>
+      </w:r>
+      <w:r>
+        <w:t xml:space="preserve">(</w:t>
+      </w:r>
+      <w:r>
+        <w:rPr>
+          <w:rStyle w:val="VerbatimChar"/>
+        </w:rPr>
+        <w:t xml:space="preserve">src/lib/roles.ts</w:t>
+      </w:r>
+      <w:r>
+        <w:t xml:space="preserve">),</w:t>
+      </w:r>
+      <w:r>
+        <w:t xml:space="preserve"> </w:t>
+      </w:r>
+      <w:r>
+        <w:t xml:space="preserve">server-side at confirm and identically in the POS cart (which shows "1 own drink</w:t>
+      </w:r>
+      <w:r>
+        <w:t xml:space="preserve"> </w:t>
+      </w:r>
+      <w:r>
+        <w:t xml:space="preserve">discounted · 2 full price"); such a line is stored split (1 × discounted + rest ×</w:t>
+      </w:r>
+      <w:r>
+        <w:t xml:space="preserve"> </w:t>
+      </w:r>
+      <w:r>
+        <w:t xml:space="preserve">full). Role-cost reports credit only the discount actually given</w:t>
+      </w:r>
+      <w:r>
+        <w:t xml:space="preserve"> </w:t>
+      </w:r>
+      <w:r>
+        <w:t xml:space="preserve">(</w:t>
+      </w:r>
+      <w:r>
+        <w:rPr>
+          <w:rStyle w:val="VerbatimChar"/>
+        </w:rPr>
+        <w:t xml:space="preserve">attributeRoleDiscount()</w:t>
+      </w:r>
+      <w:r>
+        <w:t xml:space="preserve">). Toggle it per role on</w:t>
+      </w:r>
+      <w:r>
+        <w:t xml:space="preserve"> </w:t>
+      </w:r>
+      <w:r>
+        <w:rPr>
+          <w:b/>
+          <w:bCs/>
+        </w:rPr>
+        <w:t xml:space="preserve">Member roles</w:t>
+      </w:r>
+      <w:r>
+        <w:t xml:space="preserve">.</w:t>
       </w:r>
     </w:p>
     <w:bookmarkEnd w:id="141"/>

</xml_diff>

<commit_message>
PPP: versioned SBZ cost price lists with PDF upload
SBZ prices move from a hard-coded catalog to versioned price lists in the
database (SbzPriceList/SbzPrice), each valid from a date. A borrel's cost of
goods uses the list valid on its date, so new prices never change older
borrels. New admin page (PPP > SBZ prices) to view, edit and delete
versions, and to upload the SBZ price-list PDF (parsed in memory, matched to
existing items, reviewed before saving). The migration seeds the previous
catalog as the base list.

Co-Authored-By: Claude Opus 5.5 <noreply@anthropic.com>
</commit_message>
<xml_diff>
--- a/docs/SSS-Documentation.docx
+++ b/docs/SSS-Documentation.docx
@@ -22449,7 +22449,7 @@
     </w:p>
     <w:bookmarkEnd w:id="135"/>
     <w:bookmarkEnd w:id="136"/>
-    <w:bookmarkStart w:id="157" w:name="ppp--bar-pos-drinks-at-activities"/>
+    <w:bookmarkStart w:id="158" w:name="ppp--bar-pos-drinks-at-activities"/>
     <w:p>
       <w:pPr>
         <w:pStyle w:val="Heading1"/>
@@ -26005,7 +26005,493 @@
       </w:r>
     </w:p>
     <w:bookmarkEnd w:id="148"/>
-    <w:bookmarkStart w:id="149" w:name="admin-pages-adminppp"/>
+    <w:bookmarkStart w:id="149" w:name="sbz-prices-cost-of-goods"/>
+    <w:p>
+      <w:pPr>
+        <w:pStyle w:val="Heading2"/>
+      </w:pPr>
+      <w:r>
+        <w:t xml:space="preserve">SBZ prices (cost of goods)</w:t>
+      </w:r>
+    </w:p>
+    <w:p>
+      <w:pPr>
+        <w:pStyle w:val="FirstParagraph"/>
+      </w:pPr>
+      <w:r>
+        <w:t xml:space="preserve">What the association pays SBZ per drink lives in the database as</w:t>
+      </w:r>
+      <w:r>
+        <w:t xml:space="preserve"> </w:t>
+      </w:r>
+      <w:r>
+        <w:rPr>
+          <w:b/>
+          <w:bCs/>
+        </w:rPr>
+        <w:t xml:space="preserve">versioned price</w:t>
+      </w:r>
+      <w:r>
+        <w:rPr>
+          <w:b/>
+          <w:bCs/>
+        </w:rPr>
+        <w:t xml:space="preserve"> </w:t>
+      </w:r>
+      <w:r>
+        <w:rPr>
+          <w:b/>
+          <w:bCs/>
+        </w:rPr>
+        <w:t xml:space="preserve">lists</w:t>
+      </w:r>
+      <w:r>
+        <w:t xml:space="preserve"> </w:t>
+      </w:r>
+      <w:r>
+        <w:t xml:space="preserve">(</w:t>
+      </w:r>
+      <w:r>
+        <w:rPr>
+          <w:rStyle w:val="VerbatimChar"/>
+        </w:rPr>
+        <w:t xml:space="preserve">SbzPriceList</w:t>
+      </w:r>
+      <w:r>
+        <w:t xml:space="preserve"> </w:t>
+      </w:r>
+      <w:r>
+        <w:t xml:space="preserve">+</w:t>
+      </w:r>
+      <w:r>
+        <w:t xml:space="preserve"> </w:t>
+      </w:r>
+      <w:r>
+        <w:rPr>
+          <w:rStyle w:val="VerbatimChar"/>
+        </w:rPr>
+        <w:t xml:space="preserve">SbzPrice</w:t>
+      </w:r>
+      <w:r>
+        <w:t xml:space="preserve">), managed on</w:t>
+      </w:r>
+      <w:r>
+        <w:t xml:space="preserve"> </w:t>
+      </w:r>
+      <w:r>
+        <w:rPr>
+          <w:b/>
+          <w:bCs/>
+        </w:rPr>
+        <w:t xml:space="preserve">Admin → PPP → SBZ prices</w:t>
+      </w:r>
+      <w:r>
+        <w:t xml:space="preserve"> </w:t>
+      </w:r>
+      <w:r>
+        <w:t xml:space="preserve">(</w:t>
+      </w:r>
+      <w:r>
+        <w:rPr>
+          <w:rStyle w:val="VerbatimChar"/>
+        </w:rPr>
+        <w:t xml:space="preserve">/admin/ppp/sbz</w:t>
+      </w:r>
+      <w:r>
+        <w:t xml:space="preserve">):</w:t>
+      </w:r>
+    </w:p>
+    <w:p>
+      <w:pPr>
+        <w:pStyle w:val="Compact"/>
+        <w:numPr>
+          <w:ilvl w:val="0"/>
+          <w:numId w:val="1049"/>
+        </w:numPr>
+      </w:pPr>
+      <w:r>
+        <w:t xml:space="preserve">Each list is</w:t>
+      </w:r>
+      <w:r>
+        <w:t xml:space="preserve"> </w:t>
+      </w:r>
+      <w:r>
+        <w:rPr>
+          <w:b/>
+          <w:bCs/>
+        </w:rPr>
+        <w:t xml:space="preserve">valid from a date</w:t>
+      </w:r>
+      <w:r>
+        <w:t xml:space="preserve"> </w:t>
+      </w:r>
+      <w:r>
+        <w:t xml:space="preserve">until the next list starts. A borrel's cost of</w:t>
+      </w:r>
+      <w:r>
+        <w:t xml:space="preserve"> </w:t>
+      </w:r>
+      <w:r>
+        <w:t xml:space="preserve">goods always uses the list valid on the</w:t>
+      </w:r>
+      <w:r>
+        <w:t xml:space="preserve"> </w:t>
+      </w:r>
+      <w:r>
+        <w:rPr>
+          <w:b/>
+          <w:bCs/>
+        </w:rPr>
+        <w:t xml:space="preserve">borrel's date</w:t>
+      </w:r>
+      <w:r>
+        <w:t xml:space="preserve"> </w:t>
+      </w:r>
+      <w:r>
+        <w:t xml:space="preserve">— so a new price list</w:t>
+      </w:r>
+      <w:r>
+        <w:t xml:space="preserve"> </w:t>
+      </w:r>
+      <w:r>
+        <w:t xml:space="preserve">never changes the cost of earlier borrels. The base list ("SBZ price list (April</w:t>
+      </w:r>
+      <w:r>
+        <w:t xml:space="preserve"> </w:t>
+      </w:r>
+      <w:r>
+        <w:t xml:space="preserve">2026)", seeded by the migration from the old hard-coded catalog) covers everything</w:t>
+      </w:r>
+      <w:r>
+        <w:t xml:space="preserve"> </w:t>
+      </w:r>
+      <w:r>
+        <w:t xml:space="preserve">before the first newer list and can't be deleted.</w:t>
+      </w:r>
+    </w:p>
+    <w:p>
+      <w:pPr>
+        <w:pStyle w:val="Compact"/>
+        <w:numPr>
+          <w:ilvl w:val="0"/>
+          <w:numId w:val="1049"/>
+        </w:numPr>
+      </w:pPr>
+      <w:r>
+        <w:rPr>
+          <w:b/>
+          <w:bCs/>
+        </w:rPr>
+        <w:t xml:space="preserve">Upload price list PDF</w:t>
+      </w:r>
+      <w:r>
+        <w:t xml:space="preserve"> </w:t>
+      </w:r>
+      <w:r>
+        <w:t xml:space="preserve">— the SBZ PDF (e.g. "SBZ price list effective 01/10/2026</w:t>
+      </w:r>
+      <w:r>
+        <w:t xml:space="preserve"> </w:t>
+      </w:r>
+      <w:r>
+        <w:t xml:space="preserve">(V2)") is parsed in memory (</w:t>
+      </w:r>
+      <w:r>
+        <w:rPr>
+          <w:rStyle w:val="VerbatimChar"/>
+        </w:rPr>
+        <w:t xml:space="preserve">src/lib/sbz-pdf.ts</w:t>
+      </w:r>
+      <w:r>
+        <w:t xml:space="preserve">, file not stored): each row's</w:t>
+      </w:r>
+      <w:r>
+        <w:t xml:space="preserve"> </w:t>
+      </w:r>
+      <w:r>
+        <w:rPr>
+          <w:b/>
+          <w:bCs/>
+        </w:rPr>
+        <w:t xml:space="preserve">New</w:t>
+      </w:r>
+      <w:r>
+        <w:t xml:space="preserve"> </w:t>
+      </w:r>
+      <w:r>
+        <w:t xml:space="preserve">excl./incl. price is matched to an existing item by name (unit-aware; the</w:t>
+      </w:r>
+      <w:r>
+        <w:t xml:space="preserve"> </w:t>
+      </w:r>
+      <w:r>
+        <w:t xml:space="preserve">row's</w:t>
+      </w:r>
+      <w:r>
+        <w:t xml:space="preserve"> </w:t>
+      </w:r>
+      <w:r>
+        <w:rPr>
+          <w:b/>
+          <w:bCs/>
+        </w:rPr>
+        <w:t xml:space="preserve">Old</w:t>
+      </w:r>
+      <w:r>
+        <w:t xml:space="preserve"> </w:t>
+      </w:r>
+      <w:r>
+        <w:t xml:space="preserve">price is used as a tie-breaker), the</w:t>
+      </w:r>
+      <w:r>
+        <w:t xml:space="preserve"> </w:t>
+      </w:r>
+      <w:r>
+        <w:rPr>
+          <w:b/>
+          <w:bCs/>
+        </w:rPr>
+        <w:t xml:space="preserve">valid-from date</w:t>
+      </w:r>
+      <w:r>
+        <w:t xml:space="preserve"> </w:t>
+      </w:r>
+      <w:r>
+        <w:t xml:space="preserve">is read from</w:t>
+      </w:r>
+      <w:r>
+        <w:t xml:space="preserve"> </w:t>
+      </w:r>
+      <w:r>
+        <w:t xml:space="preserve">the "effective dd/mm/yyyy" header. A review screen shows every item as</w:t>
+      </w:r>
+      <w:r>
+        <w:t xml:space="preserve"> </w:t>
+      </w:r>
+      <w:r>
+        <w:rPr>
+          <w:i/>
+          <w:iCs/>
+        </w:rPr>
+        <w:t xml:space="preserve">price</w:t>
+      </w:r>
+      <w:r>
+        <w:rPr>
+          <w:i/>
+          <w:iCs/>
+        </w:rPr>
+        <w:t xml:space="preserve"> </w:t>
+      </w:r>
+      <w:r>
+        <w:rPr>
+          <w:i/>
+          <w:iCs/>
+        </w:rPr>
+        <w:t xml:space="preserve">changed</w:t>
+      </w:r>
+      <w:r>
+        <w:t xml:space="preserve"> </w:t>
+      </w:r>
+      <w:r>
+        <w:t xml:space="preserve">(old → new),</w:t>
+      </w:r>
+      <w:r>
+        <w:t xml:space="preserve"> </w:t>
+      </w:r>
+      <w:r>
+        <w:rPr>
+          <w:i/>
+          <w:iCs/>
+        </w:rPr>
+        <w:t xml:space="preserve">same price</w:t>
+      </w:r>
+      <w:r>
+        <w:t xml:space="preserve">,</w:t>
+      </w:r>
+      <w:r>
+        <w:t xml:space="preserve"> </w:t>
+      </w:r>
+      <w:r>
+        <w:rPr>
+          <w:i/>
+          <w:iCs/>
+        </w:rPr>
+        <w:t xml:space="preserve">new item</w:t>
+      </w:r>
+      <w:r>
+        <w:t xml:space="preserve">, or</w:t>
+      </w:r>
+      <w:r>
+        <w:t xml:space="preserve"> </w:t>
+      </w:r>
+      <w:r>
+        <w:rPr>
+          <w:i/>
+          <w:iCs/>
+        </w:rPr>
+        <w:t xml:space="preserve">not in PDF — kept</w:t>
+      </w:r>
+      <w:r>
+        <w:t xml:space="preserve">; adjust if</w:t>
+      </w:r>
+      <w:r>
+        <w:t xml:space="preserve"> </w:t>
+      </w:r>
+      <w:r>
+        <w:t xml:space="preserve">needed, then save.</w:t>
+      </w:r>
+    </w:p>
+    <w:p>
+      <w:pPr>
+        <w:pStyle w:val="Compact"/>
+        <w:numPr>
+          <w:ilvl w:val="0"/>
+          <w:numId w:val="1049"/>
+        </w:numPr>
+      </w:pPr>
+      <w:r>
+        <w:rPr>
+          <w:b/>
+          <w:bCs/>
+        </w:rPr>
+        <w:t xml:space="preserve">Edit prices</w:t>
+      </w:r>
+      <w:r>
+        <w:t xml:space="preserve"> </w:t>
+      </w:r>
+      <w:r>
+        <w:t xml:space="preserve">— edit any price/VAT/name, add or remove items, and save as a list</w:t>
+      </w:r>
+      <w:r>
+        <w:t xml:space="preserve"> </w:t>
+      </w:r>
+      <w:r>
+        <w:t xml:space="preserve">valid from a chosen date (default today). Saving on a date that already has a list</w:t>
+      </w:r>
+      <w:r>
+        <w:t xml:space="preserve"> </w:t>
+      </w:r>
+      <w:r>
+        <w:rPr>
+          <w:b/>
+          <w:bCs/>
+        </w:rPr>
+        <w:t xml:space="preserve">replaces</w:t>
+      </w:r>
+      <w:r>
+        <w:t xml:space="preserve"> </w:t>
+      </w:r>
+      <w:r>
+        <w:t xml:space="preserve">that list (to correct a mistake); otherwise a new version is added.</w:t>
+      </w:r>
+    </w:p>
+    <w:p>
+      <w:pPr>
+        <w:pStyle w:val="Compact"/>
+        <w:numPr>
+          <w:ilvl w:val="0"/>
+          <w:numId w:val="1049"/>
+        </w:numPr>
+      </w:pPr>
+      <w:r>
+        <w:t xml:space="preserve">Older versions can be viewed and (except the base) deleted — borrels they covered</w:t>
+      </w:r>
+      <w:r>
+        <w:t xml:space="preserve"> </w:t>
+      </w:r>
+      <w:r>
+        <w:t xml:space="preserve">fall back to the previous list.</w:t>
+      </w:r>
+    </w:p>
+    <w:p>
+      <w:pPr>
+        <w:pStyle w:val="Compact"/>
+        <w:numPr>
+          <w:ilvl w:val="0"/>
+          <w:numId w:val="1049"/>
+        </w:numPr>
+      </w:pPr>
+      <w:r>
+        <w:t xml:space="preserve">Item</w:t>
+      </w:r>
+      <w:r>
+        <w:t xml:space="preserve"> </w:t>
+      </w:r>
+      <w:r>
+        <w:rPr>
+          <w:b/>
+          <w:bCs/>
+        </w:rPr>
+        <w:t xml:space="preserve">keys</w:t>
+      </w:r>
+      <w:r>
+        <w:t xml:space="preserve"> </w:t>
+      </w:r>
+      <w:r>
+        <w:t xml:space="preserve">stay the same across versions (usage is stored against them). If an</w:t>
+      </w:r>
+      <w:r>
+        <w:t xml:space="preserve"> </w:t>
+      </w:r>
+      <w:r>
+        <w:t xml:space="preserve">item is dropped from a later list, borrels with usage of it keep its last known</w:t>
+      </w:r>
+      <w:r>
+        <w:t xml:space="preserve"> </w:t>
+      </w:r>
+      <w:r>
+        <w:t xml:space="preserve">price. Kegs are per</w:t>
+      </w:r>
+      <w:r>
+        <w:t xml:space="preserve"> </w:t>
+      </w:r>
+      <w:r>
+        <w:rPr>
+          <w:b/>
+          <w:bCs/>
+        </w:rPr>
+        <w:t xml:space="preserve">liter</w:t>
+      </w:r>
+      <w:r>
+        <w:t xml:space="preserve"> </w:t>
+      </w:r>
+      <w:r>
+        <w:t xml:space="preserve">(usage entered in kg ≈ liters), the rest per</w:t>
+      </w:r>
+      <w:r>
+        <w:t xml:space="preserve"> </w:t>
+      </w:r>
+      <w:r>
+        <w:rPr>
+          <w:b/>
+          <w:bCs/>
+        </w:rPr>
+        <w:t xml:space="preserve">unit</w:t>
+      </w:r>
+      <w:r>
+        <w:t xml:space="preserve">.</w:t>
+      </w:r>
+    </w:p>
+    <w:p>
+      <w:pPr>
+        <w:pStyle w:val="Compact"/>
+        <w:numPr>
+          <w:ilvl w:val="0"/>
+          <w:numId w:val="1049"/>
+        </w:numPr>
+      </w:pPr>
+      <w:r>
+        <w:t xml:space="preserve">The usage form and the Alexia usage-PDF import on a borrel's page use the list</w:t>
+      </w:r>
+      <w:r>
+        <w:t xml:space="preserve"> </w:t>
+      </w:r>
+      <w:r>
+        <w:t xml:space="preserve">valid on that borrel's date; the page names which list applies.</w:t>
+      </w:r>
+    </w:p>
+    <w:bookmarkEnd w:id="149"/>
+    <w:bookmarkStart w:id="150" w:name="admin-pages-adminppp"/>
     <w:p>
       <w:pPr>
         <w:pStyle w:val="Heading2"/>
@@ -26642,6 +27128,48 @@
                 <w:b/>
                 <w:bCs/>
               </w:rPr>
+              <w:t xml:space="preserve">SBZ prices</w:t>
+            </w:r>
+          </w:p>
+        </w:tc>
+        <w:tc>
+          <w:tcPr/>
+          <w:p>
+            <w:pPr>
+              <w:pStyle w:val="Compact"/>
+            </w:pPr>
+            <w:r>
+              <w:t xml:space="preserve">The cost prices paid to SBZ, as versioned price lists — view, edit, upload the SBZ PDF; each list applies from its date onward. See</w:t>
+            </w:r>
+            <w:r>
+              <w:t xml:space="preserve"> </w:t>
+            </w:r>
+            <w:hyperlink w:anchor="sbz-prices-cost-of-goods">
+              <w:r>
+                <w:rPr>
+                  <w:rStyle w:val="Hyperlink"/>
+                </w:rPr>
+                <w:t xml:space="preserve">SBZ prices</w:t>
+              </w:r>
+            </w:hyperlink>
+            <w:r>
+              <w:t xml:space="preserve">.</w:t>
+            </w:r>
+          </w:p>
+        </w:tc>
+      </w:tr>
+      <w:tr>
+        <w:tc>
+          <w:tcPr/>
+          <w:p>
+            <w:pPr>
+              <w:pStyle w:val="Compact"/>
+            </w:pPr>
+            <w:r>
+              <w:rPr>
+                <w:b/>
+                <w:bCs/>
+              </w:rPr>
               <w:t xml:space="preserve">Member roles</w:t>
             </w:r>
           </w:p>
@@ -26803,15 +27331,15 @@
         <w:pStyle w:val="Compact"/>
         <w:numPr>
           <w:ilvl w:val="0"/>
-          <w:numId w:val="1049"/>
+          <w:numId w:val="1050"/>
         </w:numPr>
       </w:pPr>
       <w:r>
         <w:t xml:space="preserve">a toggle picker per member).</w:t>
       </w:r>
     </w:p>
-    <w:bookmarkEnd w:id="149"/>
-    <w:bookmarkStart w:id="150" w:name="activity-profitloss"/>
+    <w:bookmarkEnd w:id="150"/>
+    <w:bookmarkStart w:id="151" w:name="activity-profitloss"/>
     <w:p>
       <w:pPr>
         <w:pStyle w:val="Heading2"/>
@@ -26849,7 +27377,7 @@
         <w:pStyle w:val="Compact"/>
         <w:numPr>
           <w:ilvl w:val="0"/>
-          <w:numId w:val="1050"/>
+          <w:numId w:val="1051"/>
         </w:numPr>
       </w:pPr>
       <w:r>
@@ -26961,7 +27489,7 @@
         <w:pStyle w:val="Compact"/>
         <w:numPr>
           <w:ilvl w:val="0"/>
-          <w:numId w:val="1050"/>
+          <w:numId w:val="1051"/>
         </w:numPr>
       </w:pPr>
       <w:r>
@@ -27031,25 +27559,37 @@
         <w:t xml:space="preserve">shots as units</w:t>
       </w:r>
       <w:r>
-        <w:t xml:space="preserve">, priced from the SBZ price list (</w:t>
-      </w:r>
-      <w:r>
-        <w:rPr>
-          <w:rStyle w:val="VerbatimChar"/>
-        </w:rPr>
-        <w:t xml:space="preserve">src/lib/sbz.ts</w:t>
-      </w:r>
-      <w:r>
-        <w:t xml:space="preserve"> </w:t>
-      </w:r>
-      <w:r>
-        <w:t xml:space="preserve">— the fixed cost</w:t>
-      </w:r>
-      <w:r>
-        <w:t xml:space="preserve"> </w:t>
-      </w:r>
-      <w:r>
-        <w:t xml:space="preserve">catalog, incl./excl. BTW per item; update it when SBZ revises prices). Enter it by</w:t>
+        <w:t xml:space="preserve">, priced from the</w:t>
+      </w:r>
+      <w:r>
+        <w:t xml:space="preserve"> </w:t>
+      </w:r>
+      <w:r>
+        <w:rPr>
+          <w:b/>
+          <w:bCs/>
+        </w:rPr>
+        <w:t xml:space="preserve">SBZ price list valid on the borrel's date</w:t>
+      </w:r>
+      <w:r>
+        <w:t xml:space="preserve"> </w:t>
+      </w:r>
+      <w:r>
+        <w:t xml:space="preserve">(see</w:t>
+      </w:r>
+      <w:r>
+        <w:t xml:space="preserve"> </w:t>
+      </w:r>
+      <w:hyperlink w:anchor="sbz-prices-cost-of-goods">
+        <w:r>
+          <w:rPr>
+            <w:rStyle w:val="Hyperlink"/>
+          </w:rPr>
+          <w:t xml:space="preserve">SBZ prices</w:t>
+        </w:r>
+      </w:hyperlink>
+      <w:r>
+        <w:t xml:space="preserve">), incl./excl. BTW per item. Enter it by</w:t>
       </w:r>
       <w:r>
         <w:t xml:space="preserve"> </w:t>
@@ -27173,7 +27713,7 @@
         <w:pStyle w:val="Compact"/>
         <w:numPr>
           <w:ilvl w:val="0"/>
-          <w:numId w:val="1050"/>
+          <w:numId w:val="1051"/>
         </w:numPr>
       </w:pPr>
       <w:r>
@@ -27195,7 +27735,7 @@
         <w:pStyle w:val="Compact"/>
         <w:numPr>
           <w:ilvl w:val="0"/>
-          <w:numId w:val="1050"/>
+          <w:numId w:val="1051"/>
         </w:numPr>
       </w:pPr>
       <w:r>
@@ -27223,7 +27763,7 @@
         <w:pStyle w:val="Compact"/>
         <w:numPr>
           <w:ilvl w:val="0"/>
-          <w:numId w:val="1050"/>
+          <w:numId w:val="1051"/>
         </w:numPr>
       </w:pPr>
       <w:r>
@@ -27519,8 +28059,8 @@
         <w:t xml:space="preserve">late refund.</w:t>
       </w:r>
     </w:p>
-    <w:bookmarkEnd w:id="150"/>
-    <w:bookmarkStart w:id="151" w:name="congressus"/>
+    <w:bookmarkEnd w:id="151"/>
+    <w:bookmarkStart w:id="152" w:name="congressus"/>
     <w:p>
       <w:pPr>
         <w:pStyle w:val="Heading2"/>
@@ -27559,7 +28099,7 @@
         <w:pStyle w:val="Compact"/>
         <w:numPr>
           <w:ilvl w:val="0"/>
-          <w:numId w:val="1051"/>
+          <w:numId w:val="1052"/>
         </w:numPr>
       </w:pPr>
       <w:r>
@@ -27631,319 +28171,6 @@
           <w:rStyle w:val="VerbatimChar"/>
         </w:rPr>
         <w:t xml:space="preserve">congressusProductOfferId</w:t>
-      </w:r>
-      <w:r>
-        <w:t xml:space="preserve">.</w:t>
-      </w:r>
-    </w:p>
-    <w:p>
-      <w:pPr>
-        <w:pStyle w:val="Compact"/>
-        <w:numPr>
-          <w:ilvl w:val="0"/>
-          <w:numId w:val="1051"/>
-        </w:numPr>
-      </w:pPr>
-      <w:r>
-        <w:rPr>
-          <w:b/>
-          <w:bCs/>
-        </w:rPr>
-        <w:t xml:space="preserve">VAT cannot be set via the API</w:t>
-      </w:r>
-      <w:r>
-        <w:t xml:space="preserve"> </w:t>
-      </w:r>
-      <w:r>
-        <w:t xml:space="preserve">— every shape (</w:t>
-      </w:r>
-      <w:r>
-        <w:rPr>
-          <w:rStyle w:val="VerbatimChar"/>
-        </w:rPr>
-        <w:t xml:space="preserve">vat_category {…}</w:t>
-      </w:r>
-      <w:r>
-        <w:t xml:space="preserve">,</w:t>
-      </w:r>
-      <w:r>
-        <w:t xml:space="preserve"> </w:t>
-      </w:r>
-      <w:r>
-        <w:rPr>
-          <w:rStyle w:val="VerbatimChar"/>
-        </w:rPr>
-        <w:t xml:space="preserve">vat_percentage</w:t>
-      </w:r>
-      <w:r>
-        <w:t xml:space="preserve">, …) returns HTTP 500 server-side, so PPP products sync</w:t>
-      </w:r>
-      <w:r>
-        <w:t xml:space="preserve"> </w:t>
-      </w:r>
-      <w:r>
-        <w:rPr>
-          <w:b/>
-          <w:bCs/>
-        </w:rPr>
-        <w:t xml:space="preserve">without</w:t>
-      </w:r>
-      <w:r>
-        <w:rPr>
-          <w:b/>
-          <w:bCs/>
-        </w:rPr>
-        <w:t xml:space="preserve"> </w:t>
-      </w:r>
-      <w:r>
-        <w:rPr>
-          <w:b/>
-          <w:bCs/>
-        </w:rPr>
-        <w:t xml:space="preserve">VAT</w:t>
-      </w:r>
-      <w:r>
-        <w:t xml:space="preserve"> </w:t>
-      </w:r>
-      <w:r>
-        <w:t xml:space="preserve">(like SSS products, which are all unset). VAT is kept locally on</w:t>
-      </w:r>
-      <w:r>
-        <w:t xml:space="preserve"> </w:t>
-      </w:r>
-      <w:r>
-        <w:rPr>
-          <w:rStyle w:val="VerbatimChar"/>
-        </w:rPr>
-        <w:t xml:space="preserve">PppProduct.vatCategory</w:t>
-      </w:r>
-      <w:r>
-        <w:t xml:space="preserve">; set it in the Congressus UI if needed.</w:t>
-      </w:r>
-    </w:p>
-    <w:p>
-      <w:pPr>
-        <w:pStyle w:val="Compact"/>
-        <w:numPr>
-          <w:ilvl w:val="0"/>
-          <w:numId w:val="1051"/>
-        </w:numPr>
-      </w:pPr>
-      <w:r>
-        <w:rPr>
-          <w:b/>
-          <w:bCs/>
-        </w:rPr>
-        <w:t xml:space="preserve">Two-invoice export</w:t>
-      </w:r>
-      <w:r>
-        <w:t xml:space="preserve"> </w:t>
-      </w:r>
-      <w:r>
-        <w:t xml:space="preserve">—</w:t>
-      </w:r>
-      <w:r>
-        <w:t xml:space="preserve"> </w:t>
-      </w:r>
-      <w:r>
-        <w:rPr>
-          <w:rStyle w:val="VerbatimChar"/>
-        </w:rPr>
-        <w:t xml:space="preserve">POST /api/admin/invoices/export { scope }</w:t>
-      </w:r>
-      <w:r>
-        <w:t xml:space="preserve"> </w:t>
-      </w:r>
-      <w:r>
-        <w:t xml:space="preserve">(</w:t>
-      </w:r>
-      <w:r>
-        <w:rPr>
-          <w:rStyle w:val="VerbatimChar"/>
-        </w:rPr>
-        <w:t xml:space="preserve">sss</w:t>
-      </w:r>
-      <w:r>
-        <w:t xml:space="preserve"> </w:t>
-      </w:r>
-      <w:r>
-        <w:t xml:space="preserve">|</w:t>
-      </w:r>
-      <w:r>
-        <w:t xml:space="preserve"> </w:t>
-      </w:r>
-      <w:r>
-        <w:rPr>
-          <w:rStyle w:val="VerbatimChar"/>
-        </w:rPr>
-        <w:t xml:space="preserve">ppp</w:t>
-      </w:r>
-      <w:r>
-        <w:t xml:space="preserve"> </w:t>
-      </w:r>
-      <w:r>
-        <w:t xml:space="preserve">|</w:t>
-      </w:r>
-      <w:r>
-        <w:t xml:space="preserve"> </w:t>
-      </w:r>
-      <w:r>
-        <w:rPr>
-          <w:rStyle w:val="VerbatimChar"/>
-        </w:rPr>
-        <w:t xml:space="preserve">all</w:t>
-      </w:r>
-      <w:r>
-        <w:t xml:space="preserve">) creates</w:t>
-      </w:r>
-      <w:r>
-        <w:t xml:space="preserve"> </w:t>
-      </w:r>
-      <w:r>
-        <w:rPr>
-          <w:b/>
-          <w:bCs/>
-        </w:rPr>
-        <w:t xml:space="preserve">separate</w:t>
-      </w:r>
-      <w:r>
-        <w:t xml:space="preserve"> </w:t>
-      </w:r>
-      <w:r>
-        <w:t xml:space="preserve">Congressus invoices per member per month: an</w:t>
-      </w:r>
-      <w:r>
-        <w:t xml:space="preserve"> </w:t>
-      </w:r>
-      <w:r>
-        <w:rPr>
-          <w:rStyle w:val="VerbatimChar"/>
-        </w:rPr>
-        <w:t xml:space="preserve">"SSS &lt;month&gt;"</w:t>
-      </w:r>
-      <w:r>
-        <w:t xml:space="preserve"> </w:t>
-      </w:r>
-      <w:r>
-        <w:t xml:space="preserve">invoice and a</w:t>
-      </w:r>
-      <w:r>
-        <w:t xml:space="preserve"> </w:t>
-      </w:r>
-      <w:r>
-        <w:rPr>
-          <w:rStyle w:val="VerbatimChar"/>
-        </w:rPr>
-        <w:t xml:space="preserve">"PPP &lt;month&gt;"</w:t>
-      </w:r>
-      <w:r>
-        <w:t xml:space="preserve"> </w:t>
-      </w:r>
-      <w:r>
-        <w:t xml:space="preserve">invoice. PPP line descriptions</w:t>
-      </w:r>
-      <w:r>
-        <w:t xml:space="preserve"> </w:t>
-      </w:r>
-      <w:r>
-        <w:t xml:space="preserve">include the activity name (</w:t>
-      </w:r>
-      <w:r>
-        <w:rPr>
-          <w:rStyle w:val="VerbatimChar"/>
-        </w:rPr>
-        <w:t xml:space="preserve">"Pils – Borrel 28 jun"</w:t>
-      </w:r>
-      <w:r>
-        <w:t xml:space="preserve">); same product at different</w:t>
-      </w:r>
-      <w:r>
-        <w:t xml:space="preserve"> </w:t>
-      </w:r>
-      <w:r>
-        <w:t xml:space="preserve">activities/prices stays on separate lines. Both reuse</w:t>
-      </w:r>
-      <w:r>
-        <w:t xml:space="preserve"> </w:t>
-      </w:r>
-      <w:r>
-        <w:rPr>
-          <w:rStyle w:val="VerbatimChar"/>
-        </w:rPr>
-        <w:t xml:space="preserve">createSaleInvoice()</w:t>
-      </w:r>
-      <w:r>
-        <w:t xml:space="preserve"> </w:t>
-      </w:r>
-      <w:r>
-        <w:t xml:space="preserve">and</w:t>
-      </w:r>
-      <w:r>
-        <w:t xml:space="preserve"> </w:t>
-      </w:r>
-      <w:r>
-        <w:t xml:space="preserve">the Mendix fallback for lines without an offer id.</w:t>
-      </w:r>
-    </w:p>
-    <w:bookmarkEnd w:id="151"/>
-    <w:bookmarkStart w:id="152" w:name="alexia-integration-scheduled-borrels"/>
-    <w:p>
-      <w:pPr>
-        <w:pStyle w:val="Heading2"/>
-      </w:pPr>
-      <w:r>
-        <w:t xml:space="preserve">Alexia integration (scheduled borrels)</w:t>
-      </w:r>
-    </w:p>
-    <w:p>
-      <w:pPr>
-        <w:pStyle w:val="FirstParagraph"/>
-      </w:pPr>
-      <w:r>
-        <w:t xml:space="preserve">The drinks committee schedules borrels in</w:t>
-      </w:r>
-      <w:r>
-        <w:t xml:space="preserve"> </w:t>
-      </w:r>
-      <w:r>
-        <w:rPr>
-          <w:b/>
-          <w:bCs/>
-        </w:rPr>
-        <w:t xml:space="preserve">Alexia</w:t>
-      </w:r>
-      <w:r>
-        <w:t xml:space="preserve"> </w:t>
-      </w:r>
-      <w:r>
-        <w:t xml:space="preserve">(Inter-Actief's system,</w:t>
-      </w:r>
-      <w:r>
-        <w:t xml:space="preserve"> </w:t>
-      </w:r>
-      <w:r>
-        <w:rPr>
-          <w:rStyle w:val="VerbatimChar"/>
-        </w:rPr>
-        <w:t xml:space="preserve">alex.ia.utwente.nl</w:t>
-      </w:r>
-      <w:r>
-        <w:t xml:space="preserve">). PPP imports them so bartenders don't retype names and admins</w:t>
-      </w:r>
-      <w:r>
-        <w:t xml:space="preserve"> </w:t>
-      </w:r>
-      <w:r>
-        <w:t xml:space="preserve">can prepare specials in advance. Logic in</w:t>
-      </w:r>
-      <w:r>
-        <w:t xml:space="preserve"> </w:t>
-      </w:r>
-      <w:r>
-        <w:rPr>
-          <w:rStyle w:val="VerbatimChar"/>
-        </w:rPr>
-        <w:t xml:space="preserve">src/lib/alexia.ts</w:t>
       </w:r>
       <w:r>
         <w:t xml:space="preserve">.</w:t>
@@ -27962,70 +28189,19 @@
           <w:b/>
           <w:bCs/>
         </w:rPr>
-        <w:t xml:space="preserve">Public, no auth</w:t>
-      </w:r>
-      <w:r>
-        <w:t xml:space="preserve"> </w:t>
-      </w:r>
-      <w:r>
-        <w:t xml:space="preserve">— Alexia's</w:t>
-      </w:r>
-      <w:r>
-        <w:t xml:space="preserve"> </w:t>
-      </w:r>
-      <w:r>
-        <w:rPr>
-          <w:rStyle w:val="VerbatimChar"/>
-        </w:rPr>
-        <w:t xml:space="preserve">event.upcoming_list</w:t>
-      </w:r>
-      <w:r>
-        <w:t xml:space="preserve"> </w:t>
-      </w:r>
-      <w:r>
-        <w:t xml:space="preserve">JSON-RPC method is public:</w:t>
-      </w:r>
-      <w:r>
-        <w:t xml:space="preserve"> </w:t>
-      </w:r>
-      <w:r>
-        <w:rPr>
-          <w:rStyle w:val="VerbatimChar"/>
-        </w:rPr>
-        <w:t xml:space="preserve">POST https://alex.ia.utwente.nl/api/1/</w:t>
-      </w:r>
-      <w:r>
-        <w:t xml:space="preserve"> </w:t>
-      </w:r>
-      <w:r>
-        <w:t xml:space="preserve">with</w:t>
-      </w:r>
-      <w:r>
-        <w:t xml:space="preserve"> </w:t>
-      </w:r>
-      <w:r>
-        <w:rPr>
-          <w:rStyle w:val="VerbatimChar"/>
-        </w:rPr>
-        <w:t xml:space="preserve">{"jsonrpc":"2.0","method":"event.upcoming_list","params":[true],"id":1}</w:t>
-      </w:r>
-      <w:r>
-        <w:t xml:space="preserve">. Events</w:t>
-      </w:r>
-      <w:r>
-        <w:t xml:space="preserve"> </w:t>
-      </w:r>
-      <w:r>
-        <w:t xml:space="preserve">carry</w:t>
-      </w:r>
-      <w:r>
-        <w:t xml:space="preserve"> </w:t>
-      </w:r>
-      <w:r>
-        <w:rPr>
-          <w:rStyle w:val="VerbatimChar"/>
-        </w:rPr>
-        <w:t xml:space="preserve">name</w:t>
+        <w:t xml:space="preserve">VAT cannot be set via the API</w:t>
+      </w:r>
+      <w:r>
+        <w:t xml:space="preserve"> </w:t>
+      </w:r>
+      <w:r>
+        <w:t xml:space="preserve">— every shape (</w:t>
+      </w:r>
+      <w:r>
+        <w:rPr>
+          <w:rStyle w:val="VerbatimChar"/>
+        </w:rPr>
+        <w:t xml:space="preserve">vat_category {…}</w:t>
       </w:r>
       <w:r>
         <w:t xml:space="preserve">,</w:t>
@@ -28037,62 +28213,52 @@
         <w:rPr>
           <w:rStyle w:val="VerbatimChar"/>
         </w:rPr>
-        <w:t xml:space="preserve">organizer</w:t>
-      </w:r>
-      <w:r>
-        <w:t xml:space="preserve">,</w:t>
-      </w:r>
-      <w:r>
-        <w:t xml:space="preserve"> </w:t>
-      </w:r>
-      <w:r>
-        <w:rPr>
-          <w:rStyle w:val="VerbatimChar"/>
-        </w:rPr>
-        <w:t xml:space="preserve">locations</w:t>
-      </w:r>
-      <w:r>
-        <w:t xml:space="preserve">,</w:t>
-      </w:r>
-      <w:r>
-        <w:t xml:space="preserve"> </w:t>
-      </w:r>
-      <w:r>
-        <w:rPr>
-          <w:rStyle w:val="VerbatimChar"/>
-        </w:rPr>
-        <w:t xml:space="preserve">starts_at</w:t>
-      </w:r>
-      <w:r>
-        <w:t xml:space="preserve">,</w:t>
-      </w:r>
-      <w:r>
-        <w:t xml:space="preserve"> </w:t>
-      </w:r>
-      <w:r>
-        <w:rPr>
-          <w:rStyle w:val="VerbatimChar"/>
-        </w:rPr>
-        <w:t xml:space="preserve">ends_at</w:t>
-      </w:r>
-      <w:r>
-        <w:t xml:space="preserve"> </w:t>
-      </w:r>
-      <w:r>
-        <w:t xml:space="preserve">— but</w:t>
-      </w:r>
-      <w:r>
-        <w:t xml:space="preserve"> </w:t>
-      </w:r>
-      <w:r>
-        <w:rPr>
-          <w:b/>
-          <w:bCs/>
-        </w:rPr>
-        <w:t xml:space="preserve">no id</w:t>
-      </w:r>
-      <w:r>
-        <w:t xml:space="preserve">.</w:t>
+        <w:t xml:space="preserve">vat_percentage</w:t>
+      </w:r>
+      <w:r>
+        <w:t xml:space="preserve">, …) returns HTTP 500 server-side, so PPP products sync</w:t>
+      </w:r>
+      <w:r>
+        <w:t xml:space="preserve"> </w:t>
+      </w:r>
+      <w:r>
+        <w:rPr>
+          <w:b/>
+          <w:bCs/>
+        </w:rPr>
+        <w:t xml:space="preserve">without</w:t>
+      </w:r>
+      <w:r>
+        <w:rPr>
+          <w:b/>
+          <w:bCs/>
+        </w:rPr>
+        <w:t xml:space="preserve"> </w:t>
+      </w:r>
+      <w:r>
+        <w:rPr>
+          <w:b/>
+          <w:bCs/>
+        </w:rPr>
+        <w:t xml:space="preserve">VAT</w:t>
+      </w:r>
+      <w:r>
+        <w:t xml:space="preserve"> </w:t>
+      </w:r>
+      <w:r>
+        <w:t xml:space="preserve">(like SSS products, which are all unset). VAT is kept locally on</w:t>
+      </w:r>
+      <w:r>
+        <w:t xml:space="preserve"> </w:t>
+      </w:r>
+      <w:r>
+        <w:rPr>
+          <w:rStyle w:val="VerbatimChar"/>
+        </w:rPr>
+        <w:t xml:space="preserve">PppProduct.vatCategory</w:t>
+      </w:r>
+      <w:r>
+        <w:t xml:space="preserve">; set it in the Congressus UI if needed.</w:t>
       </w:r>
     </w:p>
     <w:p>
@@ -28108,7 +28274,7 @@
           <w:b/>
           <w:bCs/>
         </w:rPr>
-        <w:t xml:space="preserve">Auto-sync</w:t>
+        <w:t xml:space="preserve">Two-invoice export</w:t>
       </w:r>
       <w:r>
         <w:t xml:space="preserve"> </w:t>
@@ -28123,22 +28289,128 @@
         <w:rPr>
           <w:rStyle w:val="VerbatimChar"/>
         </w:rPr>
-        <w:t xml:space="preserve">POST /api/ppp/alexia/sync</w:t>
-      </w:r>
-      <w:r>
-        <w:t xml:space="preserve"> </w:t>
-      </w:r>
-      <w:r>
-        <w:t xml:space="preserve">keeps only</w:t>
-      </w:r>
-      <w:r>
-        <w:t xml:space="preserve"> </w:t>
-      </w:r>
-      <w:r>
-        <w:rPr>
-          <w:rStyle w:val="VerbatimChar"/>
-        </w:rPr>
-        <w:t xml:space="preserve">organizer === "Stress"</w:t>
+        <w:t xml:space="preserve">POST /api/admin/invoices/export { scope }</w:t>
+      </w:r>
+      <w:r>
+        <w:t xml:space="preserve"> </w:t>
+      </w:r>
+      <w:r>
+        <w:t xml:space="preserve">(</w:t>
+      </w:r>
+      <w:r>
+        <w:rPr>
+          <w:rStyle w:val="VerbatimChar"/>
+        </w:rPr>
+        <w:t xml:space="preserve">sss</w:t>
+      </w:r>
+      <w:r>
+        <w:t xml:space="preserve"> </w:t>
+      </w:r>
+      <w:r>
+        <w:t xml:space="preserve">|</w:t>
+      </w:r>
+      <w:r>
+        <w:t xml:space="preserve"> </w:t>
+      </w:r>
+      <w:r>
+        <w:rPr>
+          <w:rStyle w:val="VerbatimChar"/>
+        </w:rPr>
+        <w:t xml:space="preserve">ppp</w:t>
+      </w:r>
+      <w:r>
+        <w:t xml:space="preserve"> </w:t>
+      </w:r>
+      <w:r>
+        <w:t xml:space="preserve">|</w:t>
+      </w:r>
+      <w:r>
+        <w:t xml:space="preserve"> </w:t>
+      </w:r>
+      <w:r>
+        <w:rPr>
+          <w:rStyle w:val="VerbatimChar"/>
+        </w:rPr>
+        <w:t xml:space="preserve">all</w:t>
+      </w:r>
+      <w:r>
+        <w:t xml:space="preserve">) creates</w:t>
+      </w:r>
+      <w:r>
+        <w:t xml:space="preserve"> </w:t>
+      </w:r>
+      <w:r>
+        <w:rPr>
+          <w:b/>
+          <w:bCs/>
+        </w:rPr>
+        <w:t xml:space="preserve">separate</w:t>
+      </w:r>
+      <w:r>
+        <w:t xml:space="preserve"> </w:t>
+      </w:r>
+      <w:r>
+        <w:t xml:space="preserve">Congressus invoices per member per month: an</w:t>
+      </w:r>
+      <w:r>
+        <w:t xml:space="preserve"> </w:t>
+      </w:r>
+      <w:r>
+        <w:rPr>
+          <w:rStyle w:val="VerbatimChar"/>
+        </w:rPr>
+        <w:t xml:space="preserve">"SSS &lt;month&gt;"</w:t>
+      </w:r>
+      <w:r>
+        <w:t xml:space="preserve"> </w:t>
+      </w:r>
+      <w:r>
+        <w:t xml:space="preserve">invoice and a</w:t>
+      </w:r>
+      <w:r>
+        <w:t xml:space="preserve"> </w:t>
+      </w:r>
+      <w:r>
+        <w:rPr>
+          <w:rStyle w:val="VerbatimChar"/>
+        </w:rPr>
+        <w:t xml:space="preserve">"PPP &lt;month&gt;"</w:t>
+      </w:r>
+      <w:r>
+        <w:t xml:space="preserve"> </w:t>
+      </w:r>
+      <w:r>
+        <w:t xml:space="preserve">invoice. PPP line descriptions</w:t>
+      </w:r>
+      <w:r>
+        <w:t xml:space="preserve"> </w:t>
+      </w:r>
+      <w:r>
+        <w:t xml:space="preserve">include the activity name (</w:t>
+      </w:r>
+      <w:r>
+        <w:rPr>
+          <w:rStyle w:val="VerbatimChar"/>
+        </w:rPr>
+        <w:t xml:space="preserve">"Pils – Borrel 28 jun"</w:t>
+      </w:r>
+      <w:r>
+        <w:t xml:space="preserve">); same product at different</w:t>
+      </w:r>
+      <w:r>
+        <w:t xml:space="preserve"> </w:t>
+      </w:r>
+      <w:r>
+        <w:t xml:space="preserve">activities/prices stays on separate lines. Both reuse</w:t>
+      </w:r>
+      <w:r>
+        <w:t xml:space="preserve"> </w:t>
+      </w:r>
+      <w:r>
+        <w:rPr>
+          <w:rStyle w:val="VerbatimChar"/>
+        </w:rPr>
+        <w:t xml:space="preserve">createSaleInvoice()</w:t>
       </w:r>
       <w:r>
         <w:t xml:space="preserve"> </w:t>
@@ -28150,104 +28422,71 @@
         <w:t xml:space="preserve"> </w:t>
       </w:r>
       <w:r>
-        <w:rPr>
-          <w:b/>
-          <w:bCs/>
-        </w:rPr>
-        <w:t xml:space="preserve">find-or-creates</w:t>
-      </w:r>
-      <w:r>
-        <w:t xml:space="preserve"> </w:t>
-      </w:r>
-      <w:r>
-        <w:t xml:space="preserve">a</w:t>
-      </w:r>
-      <w:r>
-        <w:t xml:space="preserve"> </w:t>
-      </w:r>
-      <w:r>
-        <w:rPr>
-          <w:rStyle w:val="VerbatimChar"/>
-        </w:rPr>
-        <w:t xml:space="preserve">PppActivity</w:t>
-      </w:r>
-      <w:r>
-        <w:t xml:space="preserve"> </w:t>
-      </w:r>
-      <w:r>
-        <w:t xml:space="preserve">for each (date =</w:t>
-      </w:r>
-      <w:r>
-        <w:t xml:space="preserve"> </w:t>
-      </w:r>
-      <w:r>
-        <w:rPr>
-          <w:rStyle w:val="VerbatimChar"/>
-        </w:rPr>
-        <w:t xml:space="preserve">starts_at</w:t>
-      </w:r>
-      <w:r>
-        <w:t xml:space="preserve">), matched by</w:t>
-      </w:r>
-      <w:r>
-        <w:t xml:space="preserve"> </w:t>
-      </w:r>
-      <w:r>
-        <w:rPr>
-          <w:b/>
-          <w:bCs/>
-        </w:rPr>
-        <w:t xml:space="preserve">name + calendar day</w:t>
-      </w:r>
-      <w:r>
-        <w:t xml:space="preserve"> </w:t>
-      </w:r>
-      <w:r>
-        <w:t xml:space="preserve">(no id exists). It runs when a bartender lands on</w:t>
-      </w:r>
-      <w:r>
-        <w:t xml:space="preserve"> </w:t>
-      </w:r>
-      <w:r>
-        <w:rPr>
-          <w:rStyle w:val="VerbatimChar"/>
-        </w:rPr>
-        <w:t xml:space="preserve">/ppp</w:t>
-      </w:r>
-      <w:r>
-        <w:t xml:space="preserve"> </w:t>
-      </w:r>
-      <w:r>
-        <w:rPr>
-          <w:b/>
-          <w:bCs/>
-        </w:rPr>
-        <w:t xml:space="preserve">and</w:t>
-      </w:r>
-      <w:r>
-        <w:t xml:space="preserve"> </w:t>
-      </w:r>
-      <w:r>
-        <w:t xml:space="preserve">when an admin opens</w:t>
-      </w:r>
-      <w:r>
-        <w:t xml:space="preserve"> </w:t>
-      </w:r>
-      <w:r>
-        <w:rPr>
-          <w:b/>
-          <w:bCs/>
-        </w:rPr>
-        <w:t xml:space="preserve">Admin → PPP → Activities</w:t>
-      </w:r>
-      <w:r>
-        <w:t xml:space="preserve">, so new borrels appear</w:t>
-      </w:r>
-      <w:r>
-        <w:t xml:space="preserve"> </w:t>
-      </w:r>
-      <w:r>
-        <w:t xml:space="preserve">automatically and the admin can pre-set specials on future ones.</w:t>
+        <w:t xml:space="preserve">the Mendix fallback for lines without an offer id.</w:t>
+      </w:r>
+    </w:p>
+    <w:bookmarkEnd w:id="152"/>
+    <w:bookmarkStart w:id="153" w:name="alexia-integration-scheduled-borrels"/>
+    <w:p>
+      <w:pPr>
+        <w:pStyle w:val="Heading2"/>
+      </w:pPr>
+      <w:r>
+        <w:t xml:space="preserve">Alexia integration (scheduled borrels)</w:t>
+      </w:r>
+    </w:p>
+    <w:p>
+      <w:pPr>
+        <w:pStyle w:val="FirstParagraph"/>
+      </w:pPr>
+      <w:r>
+        <w:t xml:space="preserve">The drinks committee schedules borrels in</w:t>
+      </w:r>
+      <w:r>
+        <w:t xml:space="preserve"> </w:t>
+      </w:r>
+      <w:r>
+        <w:rPr>
+          <w:b/>
+          <w:bCs/>
+        </w:rPr>
+        <w:t xml:space="preserve">Alexia</w:t>
+      </w:r>
+      <w:r>
+        <w:t xml:space="preserve"> </w:t>
+      </w:r>
+      <w:r>
+        <w:t xml:space="preserve">(Inter-Actief's system,</w:t>
+      </w:r>
+      <w:r>
+        <w:t xml:space="preserve"> </w:t>
+      </w:r>
+      <w:r>
+        <w:rPr>
+          <w:rStyle w:val="VerbatimChar"/>
+        </w:rPr>
+        <w:t xml:space="preserve">alex.ia.utwente.nl</w:t>
+      </w:r>
+      <w:r>
+        <w:t xml:space="preserve">). PPP imports them so bartenders don't retype names and admins</w:t>
+      </w:r>
+      <w:r>
+        <w:t xml:space="preserve"> </w:t>
+      </w:r>
+      <w:r>
+        <w:t xml:space="preserve">can prepare specials in advance. Logic in</w:t>
+      </w:r>
+      <w:r>
+        <w:t xml:space="preserve"> </w:t>
+      </w:r>
+      <w:r>
+        <w:rPr>
+          <w:rStyle w:val="VerbatimChar"/>
+        </w:rPr>
+        <w:t xml:space="preserve">src/lib/alexia.ts</w:t>
+      </w:r>
+      <w:r>
+        <w:t xml:space="preserve">.</w:t>
       </w:r>
     </w:p>
     <w:p>
@@ -28255,7 +28494,7 @@
         <w:pStyle w:val="Compact"/>
         <w:numPr>
           <w:ilvl w:val="0"/>
-          <w:numId w:val="1052"/>
+          <w:numId w:val="1053"/>
         </w:numPr>
       </w:pPr>
       <w:r>
@@ -28263,19 +28502,137 @@
           <w:b/>
           <w:bCs/>
         </w:rPr>
-        <w:t xml:space="preserve">Idempotent + fail-soft</w:t>
-      </w:r>
-      <w:r>
-        <w:t xml:space="preserve"> </w:t>
-      </w:r>
-      <w:r>
-        <w:t xml:space="preserve">— re-syncing creates nothing new; any Alexia</w:t>
-      </w:r>
-      <w:r>
-        <w:t xml:space="preserve"> </w:t>
-      </w:r>
-      <w:r>
-        <w:t xml:space="preserve">error/timeout just yields no import and PPP keeps working.</w:t>
+        <w:t xml:space="preserve">Public, no auth</w:t>
+      </w:r>
+      <w:r>
+        <w:t xml:space="preserve"> </w:t>
+      </w:r>
+      <w:r>
+        <w:t xml:space="preserve">— Alexia's</w:t>
+      </w:r>
+      <w:r>
+        <w:t xml:space="preserve"> </w:t>
+      </w:r>
+      <w:r>
+        <w:rPr>
+          <w:rStyle w:val="VerbatimChar"/>
+        </w:rPr>
+        <w:t xml:space="preserve">event.upcoming_list</w:t>
+      </w:r>
+      <w:r>
+        <w:t xml:space="preserve"> </w:t>
+      </w:r>
+      <w:r>
+        <w:t xml:space="preserve">JSON-RPC method is public:</w:t>
+      </w:r>
+      <w:r>
+        <w:t xml:space="preserve"> </w:t>
+      </w:r>
+      <w:r>
+        <w:rPr>
+          <w:rStyle w:val="VerbatimChar"/>
+        </w:rPr>
+        <w:t xml:space="preserve">POST https://alex.ia.utwente.nl/api/1/</w:t>
+      </w:r>
+      <w:r>
+        <w:t xml:space="preserve"> </w:t>
+      </w:r>
+      <w:r>
+        <w:t xml:space="preserve">with</w:t>
+      </w:r>
+      <w:r>
+        <w:t xml:space="preserve"> </w:t>
+      </w:r>
+      <w:r>
+        <w:rPr>
+          <w:rStyle w:val="VerbatimChar"/>
+        </w:rPr>
+        <w:t xml:space="preserve">{"jsonrpc":"2.0","method":"event.upcoming_list","params":[true],"id":1}</w:t>
+      </w:r>
+      <w:r>
+        <w:t xml:space="preserve">. Events</w:t>
+      </w:r>
+      <w:r>
+        <w:t xml:space="preserve"> </w:t>
+      </w:r>
+      <w:r>
+        <w:t xml:space="preserve">carry</w:t>
+      </w:r>
+      <w:r>
+        <w:t xml:space="preserve"> </w:t>
+      </w:r>
+      <w:r>
+        <w:rPr>
+          <w:rStyle w:val="VerbatimChar"/>
+        </w:rPr>
+        <w:t xml:space="preserve">name</w:t>
+      </w:r>
+      <w:r>
+        <w:t xml:space="preserve">,</w:t>
+      </w:r>
+      <w:r>
+        <w:t xml:space="preserve"> </w:t>
+      </w:r>
+      <w:r>
+        <w:rPr>
+          <w:rStyle w:val="VerbatimChar"/>
+        </w:rPr>
+        <w:t xml:space="preserve">organizer</w:t>
+      </w:r>
+      <w:r>
+        <w:t xml:space="preserve">,</w:t>
+      </w:r>
+      <w:r>
+        <w:t xml:space="preserve"> </w:t>
+      </w:r>
+      <w:r>
+        <w:rPr>
+          <w:rStyle w:val="VerbatimChar"/>
+        </w:rPr>
+        <w:t xml:space="preserve">locations</w:t>
+      </w:r>
+      <w:r>
+        <w:t xml:space="preserve">,</w:t>
+      </w:r>
+      <w:r>
+        <w:t xml:space="preserve"> </w:t>
+      </w:r>
+      <w:r>
+        <w:rPr>
+          <w:rStyle w:val="VerbatimChar"/>
+        </w:rPr>
+        <w:t xml:space="preserve">starts_at</w:t>
+      </w:r>
+      <w:r>
+        <w:t xml:space="preserve">,</w:t>
+      </w:r>
+      <w:r>
+        <w:t xml:space="preserve"> </w:t>
+      </w:r>
+      <w:r>
+        <w:rPr>
+          <w:rStyle w:val="VerbatimChar"/>
+        </w:rPr>
+        <w:t xml:space="preserve">ends_at</w:t>
+      </w:r>
+      <w:r>
+        <w:t xml:space="preserve"> </w:t>
+      </w:r>
+      <w:r>
+        <w:t xml:space="preserve">— but</w:t>
+      </w:r>
+      <w:r>
+        <w:t xml:space="preserve"> </w:t>
+      </w:r>
+      <w:r>
+        <w:rPr>
+          <w:b/>
+          <w:bCs/>
+        </w:rPr>
+        <w:t xml:space="preserve">no id</w:t>
+      </w:r>
+      <w:r>
+        <w:t xml:space="preserve">.</w:t>
       </w:r>
     </w:p>
     <w:p>
@@ -28283,7 +28640,7 @@
         <w:pStyle w:val="Compact"/>
         <w:numPr>
           <w:ilvl w:val="0"/>
-          <w:numId w:val="1052"/>
+          <w:numId w:val="1053"/>
         </w:numPr>
       </w:pPr>
       <w:r>
@@ -28291,6 +28648,189 @@
           <w:b/>
           <w:bCs/>
         </w:rPr>
+        <w:t xml:space="preserve">Auto-sync</w:t>
+      </w:r>
+      <w:r>
+        <w:t xml:space="preserve"> </w:t>
+      </w:r>
+      <w:r>
+        <w:t xml:space="preserve">—</w:t>
+      </w:r>
+      <w:r>
+        <w:t xml:space="preserve"> </w:t>
+      </w:r>
+      <w:r>
+        <w:rPr>
+          <w:rStyle w:val="VerbatimChar"/>
+        </w:rPr>
+        <w:t xml:space="preserve">POST /api/ppp/alexia/sync</w:t>
+      </w:r>
+      <w:r>
+        <w:t xml:space="preserve"> </w:t>
+      </w:r>
+      <w:r>
+        <w:t xml:space="preserve">keeps only</w:t>
+      </w:r>
+      <w:r>
+        <w:t xml:space="preserve"> </w:t>
+      </w:r>
+      <w:r>
+        <w:rPr>
+          <w:rStyle w:val="VerbatimChar"/>
+        </w:rPr>
+        <w:t xml:space="preserve">organizer === "Stress"</w:t>
+      </w:r>
+      <w:r>
+        <w:t xml:space="preserve"> </w:t>
+      </w:r>
+      <w:r>
+        <w:t xml:space="preserve">and</w:t>
+      </w:r>
+      <w:r>
+        <w:t xml:space="preserve"> </w:t>
+      </w:r>
+      <w:r>
+        <w:rPr>
+          <w:b/>
+          <w:bCs/>
+        </w:rPr>
+        <w:t xml:space="preserve">find-or-creates</w:t>
+      </w:r>
+      <w:r>
+        <w:t xml:space="preserve"> </w:t>
+      </w:r>
+      <w:r>
+        <w:t xml:space="preserve">a</w:t>
+      </w:r>
+      <w:r>
+        <w:t xml:space="preserve"> </w:t>
+      </w:r>
+      <w:r>
+        <w:rPr>
+          <w:rStyle w:val="VerbatimChar"/>
+        </w:rPr>
+        <w:t xml:space="preserve">PppActivity</w:t>
+      </w:r>
+      <w:r>
+        <w:t xml:space="preserve"> </w:t>
+      </w:r>
+      <w:r>
+        <w:t xml:space="preserve">for each (date =</w:t>
+      </w:r>
+      <w:r>
+        <w:t xml:space="preserve"> </w:t>
+      </w:r>
+      <w:r>
+        <w:rPr>
+          <w:rStyle w:val="VerbatimChar"/>
+        </w:rPr>
+        <w:t xml:space="preserve">starts_at</w:t>
+      </w:r>
+      <w:r>
+        <w:t xml:space="preserve">), matched by</w:t>
+      </w:r>
+      <w:r>
+        <w:t xml:space="preserve"> </w:t>
+      </w:r>
+      <w:r>
+        <w:rPr>
+          <w:b/>
+          <w:bCs/>
+        </w:rPr>
+        <w:t xml:space="preserve">name + calendar day</w:t>
+      </w:r>
+      <w:r>
+        <w:t xml:space="preserve"> </w:t>
+      </w:r>
+      <w:r>
+        <w:t xml:space="preserve">(no id exists). It runs when a bartender lands on</w:t>
+      </w:r>
+      <w:r>
+        <w:t xml:space="preserve"> </w:t>
+      </w:r>
+      <w:r>
+        <w:rPr>
+          <w:rStyle w:val="VerbatimChar"/>
+        </w:rPr>
+        <w:t xml:space="preserve">/ppp</w:t>
+      </w:r>
+      <w:r>
+        <w:t xml:space="preserve"> </w:t>
+      </w:r>
+      <w:r>
+        <w:rPr>
+          <w:b/>
+          <w:bCs/>
+        </w:rPr>
+        <w:t xml:space="preserve">and</w:t>
+      </w:r>
+      <w:r>
+        <w:t xml:space="preserve"> </w:t>
+      </w:r>
+      <w:r>
+        <w:t xml:space="preserve">when an admin opens</w:t>
+      </w:r>
+      <w:r>
+        <w:t xml:space="preserve"> </w:t>
+      </w:r>
+      <w:r>
+        <w:rPr>
+          <w:b/>
+          <w:bCs/>
+        </w:rPr>
+        <w:t xml:space="preserve">Admin → PPP → Activities</w:t>
+      </w:r>
+      <w:r>
+        <w:t xml:space="preserve">, so new borrels appear</w:t>
+      </w:r>
+      <w:r>
+        <w:t xml:space="preserve"> </w:t>
+      </w:r>
+      <w:r>
+        <w:t xml:space="preserve">automatically and the admin can pre-set specials on future ones.</w:t>
+      </w:r>
+    </w:p>
+    <w:p>
+      <w:pPr>
+        <w:pStyle w:val="Compact"/>
+        <w:numPr>
+          <w:ilvl w:val="0"/>
+          <w:numId w:val="1053"/>
+        </w:numPr>
+      </w:pPr>
+      <w:r>
+        <w:rPr>
+          <w:b/>
+          <w:bCs/>
+        </w:rPr>
+        <w:t xml:space="preserve">Idempotent + fail-soft</w:t>
+      </w:r>
+      <w:r>
+        <w:t xml:space="preserve"> </w:t>
+      </w:r>
+      <w:r>
+        <w:t xml:space="preserve">— re-syncing creates nothing new; any Alexia</w:t>
+      </w:r>
+      <w:r>
+        <w:t xml:space="preserve"> </w:t>
+      </w:r>
+      <w:r>
+        <w:t xml:space="preserve">error/timeout just yields no import and PPP keeps working.</w:t>
+      </w:r>
+    </w:p>
+    <w:p>
+      <w:pPr>
+        <w:pStyle w:val="Compact"/>
+        <w:numPr>
+          <w:ilvl w:val="0"/>
+          <w:numId w:val="1053"/>
+        </w:numPr>
+      </w:pPr>
+      <w:r>
+        <w:rPr>
+          <w:b/>
+          <w:bCs/>
+        </w:rPr>
         <w:t xml:space="preserve">Caveat</w:t>
       </w:r>
       <w:r>
@@ -28378,8 +28918,8 @@
         <w:t xml:space="preserve">).</w:t>
       </w:r>
     </w:p>
-    <w:bookmarkEnd w:id="152"/>
-    <w:bookmarkStart w:id="154" w:name="data-model-ppp"/>
+    <w:bookmarkEnd w:id="153"/>
+    <w:bookmarkStart w:id="155" w:name="data-model-ppp"/>
     <w:p>
       <w:pPr>
         <w:pStyle w:val="Heading2"/>
@@ -28398,7 +28938,7 @@
       <w:r>
         <w:t xml:space="preserve"> </w:t>
       </w:r>
-      <w:hyperlink r:id="rId153">
+      <w:hyperlink r:id="rId154">
         <w:r>
           <w:rPr>
             <w:rStyle w:val="Hyperlink"/>
@@ -28418,7 +28958,7 @@
         <w:pStyle w:val="Compact"/>
         <w:numPr>
           <w:ilvl w:val="0"/>
-          <w:numId w:val="1053"/>
+          <w:numId w:val="1054"/>
         </w:numPr>
       </w:pPr>
       <w:r>
@@ -28609,6 +29149,108 @@
       </w:r>
       <w:r>
         <w:t xml:space="preserve">the P/L cost of goods),</w:t>
+      </w:r>
+      <w:r>
+        <w:t xml:space="preserve"> </w:t>
+      </w:r>
+      <w:r>
+        <w:rPr>
+          <w:rStyle w:val="VerbatimChar"/>
+        </w:rPr>
+        <w:t xml:space="preserve">SbzPriceList</w:t>
+      </w:r>
+      <w:r>
+        <w:t xml:space="preserve"> </w:t>
+      </w:r>
+      <w:r>
+        <w:t xml:space="preserve">(</w:t>
+      </w:r>
+      <w:r>
+        <w:rPr>
+          <w:rStyle w:val="VerbatimChar"/>
+        </w:rPr>
+        <w:t xml:space="preserve">validFrom</w:t>
+      </w:r>
+      <w:r>
+        <w:t xml:space="preserve"> </w:t>
+      </w:r>
+      <w:r>
+        <w:t xml:space="preserve">unique,</w:t>
+      </w:r>
+      <w:r>
+        <w:t xml:space="preserve"> </w:t>
+      </w:r>
+      <w:r>
+        <w:rPr>
+          <w:rStyle w:val="VerbatimChar"/>
+        </w:rPr>
+        <w:t xml:space="preserve">label</w:t>
+      </w:r>
+      <w:r>
+        <w:t xml:space="preserve">,</w:t>
+      </w:r>
+      <w:r>
+        <w:t xml:space="preserve"> </w:t>
+      </w:r>
+      <w:r>
+        <w:rPr>
+          <w:rStyle w:val="VerbatimChar"/>
+        </w:rPr>
+        <w:t xml:space="preserve">source</w:t>
+      </w:r>
+      <w:r>
+        <w:t xml:space="preserve">) +</w:t>
+      </w:r>
+      <w:r>
+        <w:t xml:space="preserve"> </w:t>
+      </w:r>
+      <w:r>
+        <w:rPr>
+          <w:rStyle w:val="VerbatimChar"/>
+        </w:rPr>
+        <w:t xml:space="preserve">SbzPrice</w:t>
+      </w:r>
+      <w:r>
+        <w:t xml:space="preserve"> </w:t>
+      </w:r>
+      <w:r>
+        <w:t xml:space="preserve">(</w:t>
+      </w:r>
+      <w:r>
+        <w:rPr>
+          <w:rStyle w:val="VerbatimChar"/>
+        </w:rPr>
+        <w:t xml:space="preserve">key</w:t>
+      </w:r>
+      <w:r>
+        <w:t xml:space="preserve">, name, section,</w:t>
+      </w:r>
+      <w:r>
+        <w:t xml:space="preserve"> </w:t>
+      </w:r>
+      <w:r>
+        <w:rPr>
+          <w:rStyle w:val="VerbatimChar"/>
+        </w:rPr>
+        <w:t xml:space="preserve">unit</w:t>
+      </w:r>
+      <w:r>
+        <w:t xml:space="preserve"> </w:t>
+      </w:r>
+      <w:r>
+        <w:t xml:space="preserve">LITER|UNIT,</w:t>
+      </w:r>
+      <w:r>
+        <w:t xml:space="preserve"> </w:t>
+      </w:r>
+      <w:r>
+        <w:rPr>
+          <w:rStyle w:val="VerbatimChar"/>
+        </w:rPr>
+        <w:t xml:space="preserve">vatRate</w:t>
+      </w:r>
+      <w:r>
+        <w:t xml:space="preserve">, excl./incl. cents),</w:t>
       </w:r>
       <w:r>
         <w:t xml:space="preserve"> </w:t>
@@ -28745,7 +29387,7 @@
         <w:pStyle w:val="Compact"/>
         <w:numPr>
           <w:ilvl w:val="0"/>
-          <w:numId w:val="1053"/>
+          <w:numId w:val="1054"/>
         </w:numPr>
       </w:pPr>
       <w:r>
@@ -28802,7 +29444,7 @@
         <w:pStyle w:val="Compact"/>
         <w:numPr>
           <w:ilvl w:val="0"/>
-          <w:numId w:val="1053"/>
+          <w:numId w:val="1054"/>
         </w:numPr>
       </w:pPr>
       <w:r>
@@ -28823,7 +29465,7 @@
         <w:pStyle w:val="Compact"/>
         <w:numPr>
           <w:ilvl w:val="0"/>
-          <w:numId w:val="1053"/>
+          <w:numId w:val="1054"/>
         </w:numPr>
       </w:pPr>
       <w:r>
@@ -28875,8 +29517,8 @@
         <w:t xml:space="preserve">unchanged for identity.</w:t>
       </w:r>
     </w:p>
-    <w:bookmarkEnd w:id="154"/>
-    <w:bookmarkStart w:id="155" w:name="api-reference-ppp"/>
+    <w:bookmarkEnd w:id="155"/>
+    <w:bookmarkStart w:id="156" w:name="api-reference-ppp"/>
     <w:p>
       <w:pPr>
         <w:pStyle w:val="Heading2"/>
@@ -29744,6 +30386,63 @@
         <w:rPr>
           <w:rStyle w:val="VerbatimChar"/>
         </w:rPr>
+        <w:t xml:space="preserve">…/sbz</w:t>
+      </w:r>
+      <w:r>
+        <w:t xml:space="preserve"> </w:t>
+      </w:r>
+      <w:r>
+        <w:t xml:space="preserve">(GET = all price lists +</w:t>
+      </w:r>
+      <w:r>
+        <w:t xml:space="preserve"> </w:t>
+      </w:r>
+      <w:r>
+        <w:t xml:space="preserve">current; POST = save a list valid from a date, replacing one on the same date),</w:t>
+      </w:r>
+      <w:r>
+        <w:t xml:space="preserve"> </w:t>
+      </w:r>
+      <w:r>
+        <w:rPr>
+          <w:rStyle w:val="VerbatimChar"/>
+        </w:rPr>
+        <w:t xml:space="preserve">…/sbz/[id]</w:t>
+      </w:r>
+      <w:r>
+        <w:t xml:space="preserve"> </w:t>
+      </w:r>
+      <w:r>
+        <w:t xml:space="preserve">(DELETE a version, not the base),</w:t>
+      </w:r>
+      <w:r>
+        <w:t xml:space="preserve"> </w:t>
+      </w:r>
+      <w:r>
+        <w:rPr>
+          <w:rStyle w:val="VerbatimChar"/>
+        </w:rPr>
+        <w:t xml:space="preserve">…/sbz/parse</w:t>
+      </w:r>
+      <w:r>
+        <w:t xml:space="preserve"> </w:t>
+      </w:r>
+      <w:r>
+        <w:t xml:space="preserve">(POST an SBZ PDF →</w:t>
+      </w:r>
+      <w:r>
+        <w:t xml:space="preserve"> </w:t>
+      </w:r>
+      <w:r>
+        <w:t xml:space="preserve">matched rows + valid-from date, nothing saved),</w:t>
+      </w:r>
+      <w:r>
+        <w:t xml:space="preserve"> </w:t>
+      </w:r>
+      <w:r>
+        <w:rPr>
+          <w:rStyle w:val="VerbatimChar"/>
+        </w:rPr>
         <w:t xml:space="preserve">…/stats</w:t>
       </w:r>
       <w:r>
@@ -29834,8 +30533,8 @@
         <w:t xml:space="preserve">.</w:t>
       </w:r>
     </w:p>
-    <w:bookmarkEnd w:id="155"/>
-    <w:bookmarkStart w:id="156" w:name="environment"/>
+    <w:bookmarkEnd w:id="156"/>
+    <w:bookmarkStart w:id="157" w:name="environment"/>
     <w:p>
       <w:pPr>
         <w:pStyle w:val="Heading2"/>
@@ -30254,9 +30953,9 @@
         <w:br w:type="page"/>
       </w:r>
     </w:p>
-    <w:bookmarkEnd w:id="156"/>
     <w:bookmarkEnd w:id="157"/>
-    <w:bookmarkStart w:id="171" w:name="security-model"/>
+    <w:bookmarkEnd w:id="158"/>
+    <w:bookmarkStart w:id="172" w:name="security-model"/>
     <w:p>
       <w:pPr>
         <w:pStyle w:val="Heading1"/>
@@ -30309,7 +31008,7 @@
         <w:t xml:space="preserve">trade-offs made for a shared, physical kiosk.</w:t>
       </w:r>
     </w:p>
-    <w:bookmarkStart w:id="161" w:name="authentication--authorisation"/>
+    <w:bookmarkStart w:id="162" w:name="authentication--authorisation"/>
     <w:p>
       <w:pPr>
         <w:pStyle w:val="Heading2"/>
@@ -30318,296 +31017,13 @@
         <w:t xml:space="preserve">Authentication &amp; authorisation</w:t>
       </w:r>
     </w:p>
-    <w:bookmarkStart w:id="158" w:name="admin"/>
+    <w:bookmarkStart w:id="159" w:name="admin"/>
     <w:p>
       <w:pPr>
         <w:pStyle w:val="Heading3"/>
       </w:pPr>
       <w:r>
         <w:t xml:space="preserve">Admin</w:t>
-      </w:r>
-    </w:p>
-    <w:p>
-      <w:pPr>
-        <w:pStyle w:val="Compact"/>
-        <w:numPr>
-          <w:ilvl w:val="0"/>
-          <w:numId w:val="1054"/>
-        </w:numPr>
-      </w:pPr>
-      <w:r>
-        <w:t xml:space="preserve">Login (</w:t>
-      </w:r>
-      <w:r>
-        <w:rPr>
-          <w:rStyle w:val="VerbatimChar"/>
-        </w:rPr>
-        <w:t xml:space="preserve">POST /api/auth/login</w:t>
-      </w:r>
-      <w:r>
-        <w:t xml:space="preserve">) verifies a bcrypt password and sets an</w:t>
-      </w:r>
-      <w:r>
-        <w:t xml:space="preserve"> </w:t>
-      </w:r>
-      <w:r>
-        <w:rPr>
-          <w:b/>
-          <w:bCs/>
-        </w:rPr>
-        <w:t xml:space="preserve">httpOnly</w:t>
-      </w:r>
-      <w:r>
-        <w:t xml:space="preserve"> </w:t>
-      </w:r>
-      <w:r>
-        <w:rPr>
-          <w:rStyle w:val="VerbatimChar"/>
-        </w:rPr>
-        <w:t xml:space="preserve">session</w:t>
-      </w:r>
-      <w:r>
-        <w:t xml:space="preserve"> </w:t>
-      </w:r>
-      <w:r>
-        <w:t xml:space="preserve">cookie (7-day</w:t>
-      </w:r>
-      <w:r>
-        <w:t xml:space="preserve"> </w:t>
-      </w:r>
-      <w:r>
-        <w:rPr>
-          <w:rStyle w:val="VerbatimChar"/>
-        </w:rPr>
-        <w:t xml:space="preserve">Session</w:t>
-      </w:r>
-      <w:r>
-        <w:t xml:space="preserve"> </w:t>
-      </w:r>
-      <w:r>
-        <w:t xml:space="preserve">row).</w:t>
-      </w:r>
-    </w:p>
-    <w:p>
-      <w:pPr>
-        <w:pStyle w:val="Compact"/>
-        <w:numPr>
-          <w:ilvl w:val="0"/>
-          <w:numId w:val="1054"/>
-        </w:numPr>
-      </w:pPr>
-      <w:r>
-        <w:rPr>
-          <w:rStyle w:val="VerbatimChar"/>
-        </w:rPr>
-        <w:t xml:space="preserve">requireAdmin()</w:t>
-      </w:r>
-      <w:r>
-        <w:t xml:space="preserve"> </w:t>
-      </w:r>
-      <w:r>
-        <w:t xml:space="preserve">(</w:t>
-      </w:r>
-      <w:r>
-        <w:rPr>
-          <w:rStyle w:val="VerbatimChar"/>
-        </w:rPr>
-        <w:t xml:space="preserve">src/lib/auth.ts</w:t>
-      </w:r>
-      <w:r>
-        <w:t xml:space="preserve">) loads the session, checks it isn't expired,</w:t>
-      </w:r>
-      <w:r>
-        <w:t xml:space="preserve"> </w:t>
-      </w:r>
-      <w:r>
-        <w:t xml:space="preserve">and checks</w:t>
-      </w:r>
-      <w:r>
-        <w:t xml:space="preserve"> </w:t>
-      </w:r>
-      <w:r>
-        <w:rPr>
-          <w:rStyle w:val="VerbatimChar"/>
-        </w:rPr>
-        <w:t xml:space="preserve">role === "ADMIN"</w:t>
-      </w:r>
-      <w:r>
-        <w:t xml:space="preserve">.</w:t>
-      </w:r>
-      <w:r>
-        <w:t xml:space="preserve"> </w:t>
-      </w:r>
-      <w:r>
-        <w:rPr>
-          <w:b/>
-          <w:bCs/>
-        </w:rPr>
-        <w:t xml:space="preserve">Every</w:t>
-      </w:r>
-      <w:r>
-        <w:t xml:space="preserve"> </w:t>
-      </w:r>
-      <w:r>
-        <w:rPr>
-          <w:rStyle w:val="VerbatimChar"/>
-        </w:rPr>
-        <w:t xml:space="preserve">/api/admin/*</w:t>
-      </w:r>
-      <w:r>
-        <w:t xml:space="preserve"> </w:t>
-      </w:r>
-      <w:r>
-        <w:t xml:space="preserve">handler calls it.</w:t>
-      </w:r>
-    </w:p>
-    <w:p>
-      <w:pPr>
-        <w:pStyle w:val="Compact"/>
-        <w:numPr>
-          <w:ilvl w:val="0"/>
-          <w:numId w:val="1054"/>
-        </w:numPr>
-      </w:pPr>
-      <w:r>
-        <w:t xml:space="preserve">The admin pages are gated by a</w:t>
-      </w:r>
-      <w:r>
-        <w:t xml:space="preserve"> </w:t>
-      </w:r>
-      <w:r>
-        <w:rPr>
-          <w:b/>
-          <w:bCs/>
-        </w:rPr>
-        <w:t xml:space="preserve">server-side layout</w:t>
-      </w:r>
-      <w:r>
-        <w:t xml:space="preserve"> </w:t>
-      </w:r>
-      <w:r>
-        <w:t xml:space="preserve">(</w:t>
-      </w:r>
-      <w:r>
-        <w:rPr>
-          <w:rStyle w:val="VerbatimChar"/>
-        </w:rPr>
-        <w:t xml:space="preserve">requireAdmin()</w:t>
-      </w:r>
-      <w:r>
-        <w:t xml:space="preserve"> </w:t>
-      </w:r>
-      <w:r>
-        <w:t xml:space="preserve">→</w:t>
-      </w:r>
-      <w:r>
-        <w:t xml:space="preserve"> </w:t>
-      </w:r>
-      <w:r>
-        <w:rPr>
-          <w:rStyle w:val="VerbatimChar"/>
-        </w:rPr>
-        <w:t xml:space="preserve">redirect("/admin/login")</w:t>
-      </w:r>
-      <w:r>
-        <w:t xml:space="preserve">), so unauthenticated users never receive page HTML</w:t>
-      </w:r>
-      <w:r>
-        <w:t xml:space="preserve"> </w:t>
-      </w:r>
-      <w:r>
-        <w:t xml:space="preserve">or data — only a redirect.</w:t>
-      </w:r>
-    </w:p>
-    <w:p>
-      <w:pPr>
-        <w:pStyle w:val="Compact"/>
-        <w:numPr>
-          <w:ilvl w:val="0"/>
-          <w:numId w:val="1054"/>
-        </w:numPr>
-      </w:pPr>
-      <w:r>
-        <w:t xml:space="preserve">Middleware (</w:t>
-      </w:r>
-      <w:r>
-        <w:rPr>
-          <w:rStyle w:val="VerbatimChar"/>
-        </w:rPr>
-        <w:t xml:space="preserve">src/middleware.ts</w:t>
-      </w:r>
-      <w:r>
-        <w:t xml:space="preserve">) additionally requires the cookie to be present</w:t>
-      </w:r>
-      <w:r>
-        <w:t xml:space="preserve"> </w:t>
-      </w:r>
-      <w:r>
-        <w:t xml:space="preserve">on</w:t>
-      </w:r>
-      <w:r>
-        <w:t xml:space="preserve"> </w:t>
-      </w:r>
-      <w:r>
-        <w:rPr>
-          <w:rStyle w:val="VerbatimChar"/>
-        </w:rPr>
-        <w:t xml:space="preserve">/admin/*</w:t>
-      </w:r>
-      <w:r>
-        <w:t xml:space="preserve"> </w:t>
-      </w:r>
-      <w:r>
-        <w:t xml:space="preserve">and</w:t>
-      </w:r>
-      <w:r>
-        <w:t xml:space="preserve"> </w:t>
-      </w:r>
-      <w:r>
-        <w:rPr>
-          <w:rStyle w:val="VerbatimChar"/>
-        </w:rPr>
-        <w:t xml:space="preserve">/api/admin/*</w:t>
-      </w:r>
-      <w:r>
-        <w:t xml:space="preserve">. This is a fast pre-check; the real validation</w:t>
-      </w:r>
-      <w:r>
-        <w:t xml:space="preserve"> </w:t>
-      </w:r>
-      <w:r>
-        <w:t xml:space="preserve">is</w:t>
-      </w:r>
-      <w:r>
-        <w:t xml:space="preserve"> </w:t>
-      </w:r>
-      <w:r>
-        <w:rPr>
-          <w:rStyle w:val="VerbatimChar"/>
-        </w:rPr>
-        <w:t xml:space="preserve">requireAdmin()</w:t>
-      </w:r>
-      <w:r>
-        <w:t xml:space="preserve"> </w:t>
-      </w:r>
-      <w:r>
-        <w:t xml:space="preserve">(a forged/expired cookie passes middleware but is rejected</w:t>
-      </w:r>
-      <w:r>
-        <w:t xml:space="preserve"> </w:t>
-      </w:r>
-      <w:r>
-        <w:t xml:space="preserve">by the handler).</w:t>
-      </w:r>
-    </w:p>
-    <w:bookmarkEnd w:id="158"/>
-    <w:bookmarkStart w:id="159" w:name="shop-members"/>
-    <w:p>
-      <w:pPr>
-        <w:pStyle w:val="Heading3"/>
-      </w:pPr>
-      <w:r>
-        <w:t xml:space="preserve">Shop (members)</w:t>
       </w:r>
     </w:p>
     <w:p>
@@ -30619,66 +31035,56 @@
         </w:numPr>
       </w:pPr>
       <w:r>
-        <w:t xml:space="preserve">A</w:t>
-      </w:r>
-      <w:r>
-        <w:t xml:space="preserve"> </w:t>
-      </w:r>
-      <w:r>
-        <w:rPr>
-          <w:rStyle w:val="VerbatimChar"/>
-        </w:rPr>
-        <w:t xml:space="preserve">ShopSession</w:t>
-      </w:r>
-      <w:r>
-        <w:t xml:space="preserve"> </w:t>
-      </w:r>
-      <w:r>
-        <w:t xml:space="preserve">token (random cuid) is created only by a</w:t>
-      </w:r>
-      <w:r>
-        <w:t xml:space="preserve"> </w:t>
-      </w:r>
-      <w:r>
-        <w:rPr>
-          <w:b/>
-          <w:bCs/>
-        </w:rPr>
-        <w:t xml:space="preserve">physical card tap</w:t>
-      </w:r>
-      <w:r>
-        <w:t xml:space="preserve"> </w:t>
-      </w:r>
-      <w:r>
-        <w:t xml:space="preserve">or an admin's</w:t>
-      </w:r>
-      <w:r>
-        <w:t xml:space="preserve"> </w:t>
-      </w:r>
-      <w:r>
-        <w:rPr>
-          <w:b/>
-          <w:bCs/>
-        </w:rPr>
-        <w:t xml:space="preserve">Enter store</w:t>
-      </w:r>
-      <w:r>
-        <w:t xml:space="preserve">. It lives in the</w:t>
-      </w:r>
-      <w:r>
-        <w:t xml:space="preserve"> </w:t>
-      </w:r>
-      <w:r>
-        <w:rPr>
-          <w:rStyle w:val="VerbatimChar"/>
-        </w:rPr>
-        <w:t xml:space="preserve">/shop/&lt;token&gt;</w:t>
-      </w:r>
-      <w:r>
-        <w:t xml:space="preserve"> </w:t>
-      </w:r>
-      <w:r>
-        <w:t xml:space="preserve">URL.</w:t>
+        <w:t xml:space="preserve">Login (</w:t>
+      </w:r>
+      <w:r>
+        <w:rPr>
+          <w:rStyle w:val="VerbatimChar"/>
+        </w:rPr>
+        <w:t xml:space="preserve">POST /api/auth/login</w:t>
+      </w:r>
+      <w:r>
+        <w:t xml:space="preserve">) verifies a bcrypt password and sets an</w:t>
+      </w:r>
+      <w:r>
+        <w:t xml:space="preserve"> </w:t>
+      </w:r>
+      <w:r>
+        <w:rPr>
+          <w:b/>
+          <w:bCs/>
+        </w:rPr>
+        <w:t xml:space="preserve">httpOnly</w:t>
+      </w:r>
+      <w:r>
+        <w:t xml:space="preserve"> </w:t>
+      </w:r>
+      <w:r>
+        <w:rPr>
+          <w:rStyle w:val="VerbatimChar"/>
+        </w:rPr>
+        <w:t xml:space="preserve">session</w:t>
+      </w:r>
+      <w:r>
+        <w:t xml:space="preserve"> </w:t>
+      </w:r>
+      <w:r>
+        <w:t xml:space="preserve">cookie (7-day</w:t>
+      </w:r>
+      <w:r>
+        <w:t xml:space="preserve"> </w:t>
+      </w:r>
+      <w:r>
+        <w:rPr>
+          <w:rStyle w:val="VerbatimChar"/>
+        </w:rPr>
+        <w:t xml:space="preserve">Session</w:t>
+      </w:r>
+      <w:r>
+        <w:t xml:space="preserve"> </w:t>
+      </w:r>
+      <w:r>
+        <w:t xml:space="preserve">row).</w:t>
       </w:r>
     </w:p>
     <w:p>
@@ -30693,28 +31099,65 @@
         <w:rPr>
           <w:rStyle w:val="VerbatimChar"/>
         </w:rPr>
-        <w:t xml:space="preserve">/api/cart</w:t>
-      </w:r>
-      <w:r>
-        <w:t xml:space="preserve"> </w:t>
-      </w:r>
-      <w:r>
-        <w:t xml:space="preserve">and</w:t>
-      </w:r>
-      <w:r>
-        <w:t xml:space="preserve"> </w:t>
-      </w:r>
-      <w:r>
-        <w:rPr>
-          <w:rStyle w:val="VerbatimChar"/>
-        </w:rPr>
-        <w:t xml:space="preserve">/api/orders/confirm</w:t>
-      </w:r>
-      <w:r>
-        <w:t xml:space="preserve"> </w:t>
-      </w:r>
-      <w:r>
-        <w:t xml:space="preserve">require a valid, unexpired token.</w:t>
+        <w:t xml:space="preserve">requireAdmin()</w:t>
+      </w:r>
+      <w:r>
+        <w:t xml:space="preserve"> </w:t>
+      </w:r>
+      <w:r>
+        <w:t xml:space="preserve">(</w:t>
+      </w:r>
+      <w:r>
+        <w:rPr>
+          <w:rStyle w:val="VerbatimChar"/>
+        </w:rPr>
+        <w:t xml:space="preserve">src/lib/auth.ts</w:t>
+      </w:r>
+      <w:r>
+        <w:t xml:space="preserve">) loads the session, checks it isn't expired,</w:t>
+      </w:r>
+      <w:r>
+        <w:t xml:space="preserve"> </w:t>
+      </w:r>
+      <w:r>
+        <w:t xml:space="preserve">and checks</w:t>
+      </w:r>
+      <w:r>
+        <w:t xml:space="preserve"> </w:t>
+      </w:r>
+      <w:r>
+        <w:rPr>
+          <w:rStyle w:val="VerbatimChar"/>
+        </w:rPr>
+        <w:t xml:space="preserve">role === "ADMIN"</w:t>
+      </w:r>
+      <w:r>
+        <w:t xml:space="preserve">.</w:t>
+      </w:r>
+      <w:r>
+        <w:t xml:space="preserve"> </w:t>
+      </w:r>
+      <w:r>
+        <w:rPr>
+          <w:b/>
+          <w:bCs/>
+        </w:rPr>
+        <w:t xml:space="preserve">Every</w:t>
+      </w:r>
+      <w:r>
+        <w:t xml:space="preserve"> </w:t>
+      </w:r>
+      <w:r>
+        <w:rPr>
+          <w:rStyle w:val="VerbatimChar"/>
+        </w:rPr>
+        <w:t xml:space="preserve">/api/admin/*</w:t>
+      </w:r>
+      <w:r>
+        <w:t xml:space="preserve"> </w:t>
+      </w:r>
+      <w:r>
+        <w:t xml:space="preserve">handler calls it.</w:t>
       </w:r>
     </w:p>
     <w:p>
@@ -30726,29 +31169,53 @@
         </w:numPr>
       </w:pPr>
       <w:r>
-        <w:t xml:space="preserve">The member's first name is returned</w:t>
-      </w:r>
-      <w:r>
-        <w:t xml:space="preserve"> </w:t>
-      </w:r>
-      <w:r>
-        <w:rPr>
-          <w:b/>
-          <w:bCs/>
-        </w:rPr>
-        <w:t xml:space="preserve">only</w:t>
-      </w:r>
-      <w:r>
-        <w:t xml:space="preserve"> </w:t>
-      </w:r>
-      <w:r>
-        <w:t xml:space="preserve">by the token-scoped cart endpoint —</w:t>
-      </w:r>
-      <w:r>
-        <w:t xml:space="preserve"> </w:t>
-      </w:r>
-      <w:r>
-        <w:t xml:space="preserve">never by the public scan endpoint.</w:t>
+        <w:t xml:space="preserve">The admin pages are gated by a</w:t>
+      </w:r>
+      <w:r>
+        <w:t xml:space="preserve"> </w:t>
+      </w:r>
+      <w:r>
+        <w:rPr>
+          <w:b/>
+          <w:bCs/>
+        </w:rPr>
+        <w:t xml:space="preserve">server-side layout</w:t>
+      </w:r>
+      <w:r>
+        <w:t xml:space="preserve"> </w:t>
+      </w:r>
+      <w:r>
+        <w:t xml:space="preserve">(</w:t>
+      </w:r>
+      <w:r>
+        <w:rPr>
+          <w:rStyle w:val="VerbatimChar"/>
+        </w:rPr>
+        <w:t xml:space="preserve">requireAdmin()</w:t>
+      </w:r>
+      <w:r>
+        <w:t xml:space="preserve"> </w:t>
+      </w:r>
+      <w:r>
+        <w:t xml:space="preserve">→</w:t>
+      </w:r>
+      <w:r>
+        <w:t xml:space="preserve"> </w:t>
+      </w:r>
+      <w:r>
+        <w:rPr>
+          <w:rStyle w:val="VerbatimChar"/>
+        </w:rPr>
+        <w:t xml:space="preserve">redirect("/admin/login")</w:t>
+      </w:r>
+      <w:r>
+        <w:t xml:space="preserve">), so unauthenticated users never receive page HTML</w:t>
+      </w:r>
+      <w:r>
+        <w:t xml:space="preserve"> </w:t>
+      </w:r>
+      <w:r>
+        <w:t xml:space="preserve">or data — only a redirect.</w:t>
       </w:r>
     </w:p>
     <w:p>
@@ -30760,39 +31227,86 @@
         </w:numPr>
       </w:pPr>
       <w:r>
-        <w:rPr>
-          <w:b/>
-          <w:bCs/>
-        </w:rPr>
-        <w:t xml:space="preserve">Idle auto-reset:</w:t>
-      </w:r>
-      <w:r>
-        <w:t xml:space="preserve"> </w:t>
-      </w:r>
-      <w:r>
-        <w:t xml:space="preserve">the shop page deletes the session and returns to the tap</w:t>
-      </w:r>
-      <w:r>
-        <w:t xml:space="preserve"> </w:t>
-      </w:r>
-      <w:r>
-        <w:t xml:space="preserve">screen after ~60 s of inactivity (with a 15 s warning), so a member who walks</w:t>
-      </w:r>
-      <w:r>
-        <w:t xml:space="preserve"> </w:t>
-      </w:r>
-      <w:r>
-        <w:t xml:space="preserve">away can't leave their account open for the next person.</w:t>
+        <w:t xml:space="preserve">Middleware (</w:t>
+      </w:r>
+      <w:r>
+        <w:rPr>
+          <w:rStyle w:val="VerbatimChar"/>
+        </w:rPr>
+        <w:t xml:space="preserve">src/middleware.ts</w:t>
+      </w:r>
+      <w:r>
+        <w:t xml:space="preserve">) additionally requires the cookie to be present</w:t>
+      </w:r>
+      <w:r>
+        <w:t xml:space="preserve"> </w:t>
+      </w:r>
+      <w:r>
+        <w:t xml:space="preserve">on</w:t>
+      </w:r>
+      <w:r>
+        <w:t xml:space="preserve"> </w:t>
+      </w:r>
+      <w:r>
+        <w:rPr>
+          <w:rStyle w:val="VerbatimChar"/>
+        </w:rPr>
+        <w:t xml:space="preserve">/admin/*</w:t>
+      </w:r>
+      <w:r>
+        <w:t xml:space="preserve"> </w:t>
+      </w:r>
+      <w:r>
+        <w:t xml:space="preserve">and</w:t>
+      </w:r>
+      <w:r>
+        <w:t xml:space="preserve"> </w:t>
+      </w:r>
+      <w:r>
+        <w:rPr>
+          <w:rStyle w:val="VerbatimChar"/>
+        </w:rPr>
+        <w:t xml:space="preserve">/api/admin/*</w:t>
+      </w:r>
+      <w:r>
+        <w:t xml:space="preserve">. This is a fast pre-check; the real validation</w:t>
+      </w:r>
+      <w:r>
+        <w:t xml:space="preserve"> </w:t>
+      </w:r>
+      <w:r>
+        <w:t xml:space="preserve">is</w:t>
+      </w:r>
+      <w:r>
+        <w:t xml:space="preserve"> </w:t>
+      </w:r>
+      <w:r>
+        <w:rPr>
+          <w:rStyle w:val="VerbatimChar"/>
+        </w:rPr>
+        <w:t xml:space="preserve">requireAdmin()</w:t>
+      </w:r>
+      <w:r>
+        <w:t xml:space="preserve"> </w:t>
+      </w:r>
+      <w:r>
+        <w:t xml:space="preserve">(a forged/expired cookie passes middleware but is rejected</w:t>
+      </w:r>
+      <w:r>
+        <w:t xml:space="preserve"> </w:t>
+      </w:r>
+      <w:r>
+        <w:t xml:space="preserve">by the handler).</w:t>
       </w:r>
     </w:p>
     <w:bookmarkEnd w:id="159"/>
-    <w:bookmarkStart w:id="160" w:name="card-verification"/>
+    <w:bookmarkStart w:id="160" w:name="shop-members"/>
     <w:p>
       <w:pPr>
         <w:pStyle w:val="Heading3"/>
       </w:pPr>
       <w:r>
-        <w:t xml:space="preserve">Card verification</w:t>
+        <w:t xml:space="preserve">Shop (members)</w:t>
       </w:r>
     </w:p>
     <w:p>
@@ -30804,16 +31318,66 @@
         </w:numPr>
       </w:pPr>
       <w:r>
-        <w:rPr>
-          <w:rStyle w:val="VerbatimChar"/>
-        </w:rPr>
-        <w:t xml:space="preserve">CardRegistration</w:t>
-      </w:r>
-      <w:r>
-        <w:t xml:space="preserve"> </w:t>
-      </w:r>
-      <w:r>
-        <w:t xml:space="preserve">tokens are single-use and expire in 15 minutes.</w:t>
+        <w:t xml:space="preserve">A</w:t>
+      </w:r>
+      <w:r>
+        <w:t xml:space="preserve"> </w:t>
+      </w:r>
+      <w:r>
+        <w:rPr>
+          <w:rStyle w:val="VerbatimChar"/>
+        </w:rPr>
+        <w:t xml:space="preserve">ShopSession</w:t>
+      </w:r>
+      <w:r>
+        <w:t xml:space="preserve"> </w:t>
+      </w:r>
+      <w:r>
+        <w:t xml:space="preserve">token (random cuid) is created only by a</w:t>
+      </w:r>
+      <w:r>
+        <w:t xml:space="preserve"> </w:t>
+      </w:r>
+      <w:r>
+        <w:rPr>
+          <w:b/>
+          <w:bCs/>
+        </w:rPr>
+        <w:t xml:space="preserve">physical card tap</w:t>
+      </w:r>
+      <w:r>
+        <w:t xml:space="preserve"> </w:t>
+      </w:r>
+      <w:r>
+        <w:t xml:space="preserve">or an admin's</w:t>
+      </w:r>
+      <w:r>
+        <w:t xml:space="preserve"> </w:t>
+      </w:r>
+      <w:r>
+        <w:rPr>
+          <w:b/>
+          <w:bCs/>
+        </w:rPr>
+        <w:t xml:space="preserve">Enter store</w:t>
+      </w:r>
+      <w:r>
+        <w:t xml:space="preserve">. It lives in the</w:t>
+      </w:r>
+      <w:r>
+        <w:t xml:space="preserve"> </w:t>
+      </w:r>
+      <w:r>
+        <w:rPr>
+          <w:rStyle w:val="VerbatimChar"/>
+        </w:rPr>
+        <w:t xml:space="preserve">/shop/&lt;token&gt;</w:t>
+      </w:r>
+      <w:r>
+        <w:t xml:space="preserve"> </w:t>
+      </w:r>
+      <w:r>
+        <w:t xml:space="preserve">URL.</w:t>
       </w:r>
     </w:p>
     <w:p>
@@ -30826,6 +31390,141 @@
       </w:pPr>
       <w:r>
         <w:rPr>
+          <w:rStyle w:val="VerbatimChar"/>
+        </w:rPr>
+        <w:t xml:space="preserve">/api/cart</w:t>
+      </w:r>
+      <w:r>
+        <w:t xml:space="preserve"> </w:t>
+      </w:r>
+      <w:r>
+        <w:t xml:space="preserve">and</w:t>
+      </w:r>
+      <w:r>
+        <w:t xml:space="preserve"> </w:t>
+      </w:r>
+      <w:r>
+        <w:rPr>
+          <w:rStyle w:val="VerbatimChar"/>
+        </w:rPr>
+        <w:t xml:space="preserve">/api/orders/confirm</w:t>
+      </w:r>
+      <w:r>
+        <w:t xml:space="preserve"> </w:t>
+      </w:r>
+      <w:r>
+        <w:t xml:space="preserve">require a valid, unexpired token.</w:t>
+      </w:r>
+    </w:p>
+    <w:p>
+      <w:pPr>
+        <w:pStyle w:val="Compact"/>
+        <w:numPr>
+          <w:ilvl w:val="0"/>
+          <w:numId w:val="1056"/>
+        </w:numPr>
+      </w:pPr>
+      <w:r>
+        <w:t xml:space="preserve">The member's first name is returned</w:t>
+      </w:r>
+      <w:r>
+        <w:t xml:space="preserve"> </w:t>
+      </w:r>
+      <w:r>
+        <w:rPr>
+          <w:b/>
+          <w:bCs/>
+        </w:rPr>
+        <w:t xml:space="preserve">only</w:t>
+      </w:r>
+      <w:r>
+        <w:t xml:space="preserve"> </w:t>
+      </w:r>
+      <w:r>
+        <w:t xml:space="preserve">by the token-scoped cart endpoint —</w:t>
+      </w:r>
+      <w:r>
+        <w:t xml:space="preserve"> </w:t>
+      </w:r>
+      <w:r>
+        <w:t xml:space="preserve">never by the public scan endpoint.</w:t>
+      </w:r>
+    </w:p>
+    <w:p>
+      <w:pPr>
+        <w:pStyle w:val="Compact"/>
+        <w:numPr>
+          <w:ilvl w:val="0"/>
+          <w:numId w:val="1056"/>
+        </w:numPr>
+      </w:pPr>
+      <w:r>
+        <w:rPr>
+          <w:b/>
+          <w:bCs/>
+        </w:rPr>
+        <w:t xml:space="preserve">Idle auto-reset:</w:t>
+      </w:r>
+      <w:r>
+        <w:t xml:space="preserve"> </w:t>
+      </w:r>
+      <w:r>
+        <w:t xml:space="preserve">the shop page deletes the session and returns to the tap</w:t>
+      </w:r>
+      <w:r>
+        <w:t xml:space="preserve"> </w:t>
+      </w:r>
+      <w:r>
+        <w:t xml:space="preserve">screen after ~60 s of inactivity (with a 15 s warning), so a member who walks</w:t>
+      </w:r>
+      <w:r>
+        <w:t xml:space="preserve"> </w:t>
+      </w:r>
+      <w:r>
+        <w:t xml:space="preserve">away can't leave their account open for the next person.</w:t>
+      </w:r>
+    </w:p>
+    <w:bookmarkEnd w:id="160"/>
+    <w:bookmarkStart w:id="161" w:name="card-verification"/>
+    <w:p>
+      <w:pPr>
+        <w:pStyle w:val="Heading3"/>
+      </w:pPr>
+      <w:r>
+        <w:t xml:space="preserve">Card verification</w:t>
+      </w:r>
+    </w:p>
+    <w:p>
+      <w:pPr>
+        <w:pStyle w:val="Compact"/>
+        <w:numPr>
+          <w:ilvl w:val="0"/>
+          <w:numId w:val="1057"/>
+        </w:numPr>
+      </w:pPr>
+      <w:r>
+        <w:rPr>
+          <w:rStyle w:val="VerbatimChar"/>
+        </w:rPr>
+        <w:t xml:space="preserve">CardRegistration</w:t>
+      </w:r>
+      <w:r>
+        <w:t xml:space="preserve"> </w:t>
+      </w:r>
+      <w:r>
+        <w:t xml:space="preserve">tokens are single-use and expire in 15 minutes.</w:t>
+      </w:r>
+    </w:p>
+    <w:p>
+      <w:pPr>
+        <w:pStyle w:val="Compact"/>
+        <w:numPr>
+          <w:ilvl w:val="0"/>
+          <w:numId w:val="1057"/>
+        </w:numPr>
+      </w:pPr>
+      <w:r>
+        <w:rPr>
           <w:b/>
           <w:bCs/>
         </w:rPr>
@@ -30872,9 +31571,9 @@
         <w:t xml:space="preserve">member clicked.</w:t>
       </w:r>
     </w:p>
-    <w:bookmarkEnd w:id="160"/>
     <w:bookmarkEnd w:id="161"/>
-    <w:bookmarkStart w:id="162" w:name="X77f42a2852d9dd86410b0545fad3e0fbb180833"/>
+    <w:bookmarkEnd w:id="162"/>
+    <w:bookmarkStart w:id="163" w:name="X77f42a2852d9dd86410b0545fad3e0fbb180833"/>
     <w:p>
       <w:pPr>
         <w:pStyle w:val="Heading2"/>
@@ -31088,8 +31787,8 @@
         </w:tc>
       </w:tr>
     </w:tbl>
-    <w:bookmarkEnd w:id="162"/>
-    <w:bookmarkStart w:id="163" w:name="rate-limiting"/>
+    <w:bookmarkEnd w:id="163"/>
+    <w:bookmarkStart w:id="164" w:name="rate-limiting"/>
     <w:p>
       <w:pPr>
         <w:pStyle w:val="Heading2"/>
@@ -31184,330 +31883,14 @@
         <w:t xml:space="preserve">a shared store (e.g. Redis).</w:t>
       </w:r>
     </w:p>
-    <w:bookmarkEnd w:id="163"/>
-    <w:bookmarkStart w:id="164" w:name="injection--output-safety"/>
+    <w:bookmarkEnd w:id="164"/>
+    <w:bookmarkStart w:id="165" w:name="injection--output-safety"/>
     <w:p>
       <w:pPr>
         <w:pStyle w:val="Heading2"/>
       </w:pPr>
       <w:r>
         <w:t xml:space="preserve">Injection &amp; output safety</w:t>
-      </w:r>
-    </w:p>
-    <w:p>
-      <w:pPr>
-        <w:pStyle w:val="Compact"/>
-        <w:numPr>
-          <w:ilvl w:val="0"/>
-          <w:numId w:val="1057"/>
-        </w:numPr>
-      </w:pPr>
-      <w:r>
-        <w:t xml:space="preserve">React escapes all interpolated values in the kiosk/shop/admin pages.</w:t>
-      </w:r>
-    </w:p>
-    <w:p>
-      <w:pPr>
-        <w:pStyle w:val="Compact"/>
-        <w:numPr>
-          <w:ilvl w:val="0"/>
-          <w:numId w:val="1057"/>
-        </w:numPr>
-      </w:pPr>
-      <w:r>
-        <w:t xml:space="preserve">The card-verify pages are</w:t>
-      </w:r>
-      <w:r>
-        <w:t xml:space="preserve"> </w:t>
-      </w:r>
-      <w:r>
-        <w:rPr>
-          <w:b/>
-          <w:bCs/>
-        </w:rPr>
-        <w:t xml:space="preserve">hand-built HTML</w:t>
-      </w:r>
-      <w:r>
-        <w:t xml:space="preserve">, so member names and tokens are</w:t>
-      </w:r>
-      <w:r>
-        <w:t xml:space="preserve"> </w:t>
-      </w:r>
-      <w:r>
-        <w:t xml:space="preserve">passed through</w:t>
-      </w:r>
-      <w:r>
-        <w:t xml:space="preserve"> </w:t>
-      </w:r>
-      <w:r>
-        <w:rPr>
-          <w:rStyle w:val="VerbatimChar"/>
-        </w:rPr>
-        <w:t xml:space="preserve">escapeHtml()</w:t>
-      </w:r>
-      <w:r>
-        <w:t xml:space="preserve"> </w:t>
-      </w:r>
-      <w:r>
-        <w:t xml:space="preserve">before interpolation (prevents stored XSS from a</w:t>
-      </w:r>
-      <w:r>
-        <w:t xml:space="preserve"> </w:t>
-      </w:r>
-      <w:r>
-        <w:t xml:space="preserve">name synced out of Congressus).</w:t>
-      </w:r>
-    </w:p>
-    <w:p>
-      <w:pPr>
-        <w:pStyle w:val="Compact"/>
-        <w:numPr>
-          <w:ilvl w:val="0"/>
-          <w:numId w:val="1057"/>
-        </w:numPr>
-      </w:pPr>
-      <w:r>
-        <w:t xml:space="preserve">Those pages declare</w:t>
-      </w:r>
-      <w:r>
-        <w:t xml:space="preserve"> </w:t>
-      </w:r>
-      <w:r>
-        <w:rPr>
-          <w:rStyle w:val="VerbatimChar"/>
-        </w:rPr>
-        <w:t xml:space="preserve">charset=utf-8</w:t>
-      </w:r>
-      <w:r>
-        <w:t xml:space="preserve"> </w:t>
-      </w:r>
-      <w:r>
-        <w:t xml:space="preserve">(header + meta) so emoji/diacritics render</w:t>
-      </w:r>
-      <w:r>
-        <w:t xml:space="preserve"> </w:t>
-      </w:r>
-      <w:r>
-        <w:t xml:space="preserve">correctly.</w:t>
-      </w:r>
-    </w:p>
-    <w:bookmarkEnd w:id="164"/>
-    <w:bookmarkStart w:id="168" w:name="deliberate-trade-offs"/>
-    <w:p>
-      <w:pPr>
-        <w:pStyle w:val="Heading2"/>
-      </w:pPr>
-      <w:r>
-        <w:t xml:space="preserve">Deliberate trade-offs</w:t>
-      </w:r>
-    </w:p>
-    <w:bookmarkStart w:id="165" w:name="card-uids-arent-secret"/>
-    <w:p>
-      <w:pPr>
-        <w:pStyle w:val="Heading3"/>
-      </w:pPr>
-      <w:r>
-        <w:t xml:space="preserve">Card UIDs aren't secret</w:t>
-      </w:r>
-    </w:p>
-    <w:p>
-      <w:pPr>
-        <w:pStyle w:val="FirstParagraph"/>
-      </w:pPr>
-      <w:r>
-        <w:t xml:space="preserve">Any NFC reader can read a card UID, and the scan endpoint is necessarily</w:t>
-      </w:r>
-      <w:r>
-        <w:t xml:space="preserve"> </w:t>
-      </w:r>
-      <w:r>
-        <w:t xml:space="preserve">unauthenticated (the kiosk is a public web page). Mitigations: the scan endpoint</w:t>
-      </w:r>
-      <w:r>
-        <w:t xml:space="preserve"> </w:t>
-      </w:r>
-      <w:r>
-        <w:t xml:space="preserve">returns no member data and is rate-limited. For stronger protection, restrict</w:t>
-      </w:r>
-      <w:r>
-        <w:t xml:space="preserve"> </w:t>
-      </w:r>
-      <w:r>
-        <w:rPr>
-          <w:rStyle w:val="VerbatimChar"/>
-        </w:rPr>
-        <w:t xml:space="preserve">/api/card/scan</w:t>
-      </w:r>
-      <w:r>
-        <w:t xml:space="preserve"> </w:t>
-      </w:r>
-      <w:r>
-        <w:t xml:space="preserve">to the kiosk's IP at the network layer.</w:t>
-      </w:r>
-    </w:p>
-    <w:bookmarkEnd w:id="165"/>
-    <w:bookmarkStart w:id="166" w:name="email-not-found-vs-enumeration"/>
-    <w:p>
-      <w:pPr>
-        <w:pStyle w:val="Heading3"/>
-      </w:pPr>
-      <w:r>
-        <w:t xml:space="preserve">"Email not found" vs enumeration</w:t>
-      </w:r>
-    </w:p>
-    <w:p>
-      <w:pPr>
-        <w:pStyle w:val="FirstParagraph"/>
-      </w:pPr>
-      <w:r>
-        <w:t xml:space="preserve">The card-registration flow tells a user when their email matches no member</w:t>
-      </w:r>
-      <w:r>
-        <w:t xml:space="preserve"> </w:t>
-      </w:r>
-      <w:r>
-        <w:t xml:space="preserve">("Email not found"). This</w:t>
-      </w:r>
-      <w:r>
-        <w:t xml:space="preserve"> </w:t>
-      </w:r>
-      <w:r>
-        <w:rPr>
-          <w:b/>
-          <w:bCs/>
-        </w:rPr>
-        <w:t xml:space="preserve">re-introduces some email-enumeration ability</w:t>
-      </w:r>
-      <w:r>
-        <w:t xml:space="preserve"> </w:t>
-      </w:r>
-      <w:r>
-        <w:t xml:space="preserve">that a</w:t>
-      </w:r>
-      <w:r>
-        <w:t xml:space="preserve"> </w:t>
-      </w:r>
-      <w:r>
-        <w:t xml:space="preserve">uniform response would prevent. It was a conscious product choice: confused</w:t>
-      </w:r>
-      <w:r>
-        <w:t xml:space="preserve"> </w:t>
-      </w:r>
-      <w:r>
-        <w:t xml:space="preserve">members not knowing why nothing happened is a real problem at a kiosk, the kiosk</w:t>
-      </w:r>
-      <w:r>
-        <w:t xml:space="preserve"> </w:t>
-      </w:r>
-      <w:r>
-        <w:t xml:space="preserve">is physical, and the endpoint is rate-limited. If enumeration resistance becomes</w:t>
-      </w:r>
-      <w:r>
-        <w:t xml:space="preserve"> </w:t>
-      </w:r>
-      <w:r>
-        <w:t xml:space="preserve">more important than this UX, revert</w:t>
-      </w:r>
-      <w:r>
-        <w:t xml:space="preserve"> </w:t>
-      </w:r>
-      <w:r>
-        <w:rPr>
-          <w:rStyle w:val="VerbatimChar"/>
-        </w:rPr>
-        <w:t xml:space="preserve">card/register</w:t>
-      </w:r>
-      <w:r>
-        <w:t xml:space="preserve"> </w:t>
-      </w:r>
-      <w:r>
-        <w:t xml:space="preserve">to a uniform</w:t>
-      </w:r>
-      <w:r>
-        <w:t xml:space="preserve"> </w:t>
-      </w:r>
-      <w:r>
-        <w:rPr>
-          <w:rStyle w:val="VerbatimChar"/>
-        </w:rPr>
-        <w:t xml:space="preserve">{ ok: true }</w:t>
-      </w:r>
-      <w:r>
-        <w:t xml:space="preserve">.</w:t>
-      </w:r>
-    </w:p>
-    <w:bookmarkEnd w:id="166"/>
-    <w:bookmarkStart w:id="167" w:name="shop-token-is-a-bearer-token-in-the-url"/>
-    <w:p>
-      <w:pPr>
-        <w:pStyle w:val="Heading3"/>
-      </w:pPr>
-      <w:r>
-        <w:t xml:space="preserve">Shop token is a bearer token in the URL</w:t>
-      </w:r>
-    </w:p>
-    <w:p>
-      <w:pPr>
-        <w:pStyle w:val="FirstParagraph"/>
-      </w:pPr>
-      <w:r>
-        <w:t xml:space="preserve">Anyone holding a live</w:t>
-      </w:r>
-      <w:r>
-        <w:t xml:space="preserve"> </w:t>
-      </w:r>
-      <w:r>
-        <w:rPr>
-          <w:rStyle w:val="VerbatimChar"/>
-        </w:rPr>
-        <w:t xml:space="preserve">/shop/&lt;token&gt;</w:t>
-      </w:r>
-      <w:r>
-        <w:t xml:space="preserve"> </w:t>
-      </w:r>
-      <w:r>
-        <w:t xml:space="preserve">URL can act as that member until it expires</w:t>
-      </w:r>
-      <w:r>
-        <w:t xml:space="preserve"> </w:t>
-      </w:r>
-      <w:r>
-        <w:t xml:space="preserve">(10 min) or the order is confirmed. Tokens are random and per-tap (a new one each</w:t>
-      </w:r>
-      <w:r>
-        <w:t xml:space="preserve"> </w:t>
-      </w:r>
-      <w:r>
-        <w:t xml:space="preserve">scan), so they can't be guessed or reused. The idle auto-reset and short lifetime</w:t>
-      </w:r>
-      <w:r>
-        <w:t xml:space="preserve"> </w:t>
-      </w:r>
-      <w:r>
-        <w:t xml:space="preserve">bound the exposure. Stronger options (not currently implemented): move the token</w:t>
-      </w:r>
-      <w:r>
-        <w:t xml:space="preserve"> </w:t>
-      </w:r>
-      <w:r>
-        <w:t xml:space="preserve">into an httpOnly cookie so it can't be shared via URL, or use a crypto-random</w:t>
-      </w:r>
-      <w:r>
-        <w:t xml:space="preserve"> </w:t>
-      </w:r>
-      <w:r>
-        <w:t xml:space="preserve">token instead of a cuid.</w:t>
-      </w:r>
-    </w:p>
-    <w:bookmarkEnd w:id="167"/>
-    <w:bookmarkEnd w:id="168"/>
-    <w:bookmarkStart w:id="169" w:name="prohibited--careful-operations"/>
-    <w:p>
-      <w:pPr>
-        <w:pStyle w:val="Heading2"/>
-      </w:pPr>
-      <w:r>
-        <w:t xml:space="preserve">Prohibited / careful operations</w:t>
       </w:r>
     </w:p>
     <w:p>
@@ -31519,17 +31902,7 @@
         </w:numPr>
       </w:pPr>
       <w:r>
-        <w:rPr>
-          <w:b/>
-          <w:bCs/>
-        </w:rPr>
-        <w:t xml:space="preserve">Member deletion</w:t>
-      </w:r>
-      <w:r>
-        <w:t xml:space="preserve"> </w:t>
-      </w:r>
-      <w:r>
-        <w:t xml:space="preserve">is blocked while invoices exist.</w:t>
+        <w:t xml:space="preserve">React escapes all interpolated values in the kiosk/shop/admin pages.</w:t>
       </w:r>
     </w:p>
     <w:p>
@@ -31541,38 +31914,47 @@
         </w:numPr>
       </w:pPr>
       <w:r>
-        <w:rPr>
-          <w:b/>
-          <w:bCs/>
-        </w:rPr>
-        <w:t xml:space="preserve">Invoice edit/delete</w:t>
-      </w:r>
-      <w:r>
-        <w:t xml:space="preserve"> </w:t>
-      </w:r>
-      <w:r>
-        <w:t xml:space="preserve">is blocked once an invoice is</w:t>
-      </w:r>
-      <w:r>
-        <w:t xml:space="preserve"> </w:t>
-      </w:r>
-      <w:r>
-        <w:rPr>
-          <w:rStyle w:val="VerbatimChar"/>
-        </w:rPr>
-        <w:t xml:space="preserve">EXPORTED</w:t>
-      </w:r>
-      <w:r>
-        <w:t xml:space="preserve"> </w:t>
-      </w:r>
-      <w:r>
-        <w:t xml:space="preserve">(already billed</w:t>
-      </w:r>
-      <w:r>
-        <w:t xml:space="preserve"> </w:t>
-      </w:r>
-      <w:r>
-        <w:t xml:space="preserve">in Congressus).</w:t>
+        <w:t xml:space="preserve">The card-verify pages are</w:t>
+      </w:r>
+      <w:r>
+        <w:t xml:space="preserve"> </w:t>
+      </w:r>
+      <w:r>
+        <w:rPr>
+          <w:b/>
+          <w:bCs/>
+        </w:rPr>
+        <w:t xml:space="preserve">hand-built HTML</w:t>
+      </w:r>
+      <w:r>
+        <w:t xml:space="preserve">, so member names and tokens are</w:t>
+      </w:r>
+      <w:r>
+        <w:t xml:space="preserve"> </w:t>
+      </w:r>
+      <w:r>
+        <w:t xml:space="preserve">passed through</w:t>
+      </w:r>
+      <w:r>
+        <w:t xml:space="preserve"> </w:t>
+      </w:r>
+      <w:r>
+        <w:rPr>
+          <w:rStyle w:val="VerbatimChar"/>
+        </w:rPr>
+        <w:t xml:space="preserve">escapeHtml()</w:t>
+      </w:r>
+      <w:r>
+        <w:t xml:space="preserve"> </w:t>
+      </w:r>
+      <w:r>
+        <w:t xml:space="preserve">before interpolation (prevents stored XSS from a</w:t>
+      </w:r>
+      <w:r>
+        <w:t xml:space="preserve"> </w:t>
+      </w:r>
+      <w:r>
+        <w:t xml:space="preserve">name synced out of Congressus).</w:t>
       </w:r>
     </w:p>
     <w:p>
@@ -31584,67 +31966,358 @@
         </w:numPr>
       </w:pPr>
       <w:r>
-        <w:rPr>
-          <w:b/>
-          <w:bCs/>
-        </w:rPr>
-        <w:t xml:space="preserve">Bulk invoice clearing</w:t>
-      </w:r>
-      <w:r>
-        <w:t xml:space="preserve"> </w:t>
-      </w:r>
-      <w:r>
-        <w:t xml:space="preserve">requires a double confirmation in the UI and is</w:t>
-      </w:r>
-      <w:r>
-        <w:t xml:space="preserve"> </w:t>
-      </w:r>
-      <w:r>
-        <w:t xml:space="preserve">intended for test-data cleanup only.</w:t>
-      </w:r>
-    </w:p>
+        <w:t xml:space="preserve">Those pages declare</w:t>
+      </w:r>
+      <w:r>
+        <w:t xml:space="preserve"> </w:t>
+      </w:r>
+      <w:r>
+        <w:rPr>
+          <w:rStyle w:val="VerbatimChar"/>
+        </w:rPr>
+        <w:t xml:space="preserve">charset=utf-8</w:t>
+      </w:r>
+      <w:r>
+        <w:t xml:space="preserve"> </w:t>
+      </w:r>
+      <w:r>
+        <w:t xml:space="preserve">(header + meta) so emoji/diacritics render</w:t>
+      </w:r>
+      <w:r>
+        <w:t xml:space="preserve"> </w:t>
+      </w:r>
+      <w:r>
+        <w:t xml:space="preserve">correctly.</w:t>
+      </w:r>
+    </w:p>
+    <w:bookmarkEnd w:id="165"/>
+    <w:bookmarkStart w:id="169" w:name="deliberate-trade-offs"/>
+    <w:p>
+      <w:pPr>
+        <w:pStyle w:val="Heading2"/>
+      </w:pPr>
+      <w:r>
+        <w:t xml:space="preserve">Deliberate trade-offs</w:t>
+      </w:r>
+    </w:p>
+    <w:bookmarkStart w:id="166" w:name="card-uids-arent-secret"/>
+    <w:p>
+      <w:pPr>
+        <w:pStyle w:val="Heading3"/>
+      </w:pPr>
+      <w:r>
+        <w:t xml:space="preserve">Card UIDs aren't secret</w:t>
+      </w:r>
+    </w:p>
+    <w:p>
+      <w:pPr>
+        <w:pStyle w:val="FirstParagraph"/>
+      </w:pPr>
+      <w:r>
+        <w:t xml:space="preserve">Any NFC reader can read a card UID, and the scan endpoint is necessarily</w:t>
+      </w:r>
+      <w:r>
+        <w:t xml:space="preserve"> </w:t>
+      </w:r>
+      <w:r>
+        <w:t xml:space="preserve">unauthenticated (the kiosk is a public web page). Mitigations: the scan endpoint</w:t>
+      </w:r>
+      <w:r>
+        <w:t xml:space="preserve"> </w:t>
+      </w:r>
+      <w:r>
+        <w:t xml:space="preserve">returns no member data and is rate-limited. For stronger protection, restrict</w:t>
+      </w:r>
+      <w:r>
+        <w:t xml:space="preserve"> </w:t>
+      </w:r>
+      <w:r>
+        <w:rPr>
+          <w:rStyle w:val="VerbatimChar"/>
+        </w:rPr>
+        <w:t xml:space="preserve">/api/card/scan</w:t>
+      </w:r>
+      <w:r>
+        <w:t xml:space="preserve"> </w:t>
+      </w:r>
+      <w:r>
+        <w:t xml:space="preserve">to the kiosk's IP at the network layer.</w:t>
+      </w:r>
+    </w:p>
+    <w:bookmarkEnd w:id="166"/>
+    <w:bookmarkStart w:id="167" w:name="email-not-found-vs-enumeration"/>
+    <w:p>
+      <w:pPr>
+        <w:pStyle w:val="Heading3"/>
+      </w:pPr>
+      <w:r>
+        <w:t xml:space="preserve">"Email not found" vs enumeration</w:t>
+      </w:r>
+    </w:p>
+    <w:p>
+      <w:pPr>
+        <w:pStyle w:val="FirstParagraph"/>
+      </w:pPr>
+      <w:r>
+        <w:t xml:space="preserve">The card-registration flow tells a user when their email matches no member</w:t>
+      </w:r>
+      <w:r>
+        <w:t xml:space="preserve"> </w:t>
+      </w:r>
+      <w:r>
+        <w:t xml:space="preserve">("Email not found"). This</w:t>
+      </w:r>
+      <w:r>
+        <w:t xml:space="preserve"> </w:t>
+      </w:r>
+      <w:r>
+        <w:rPr>
+          <w:b/>
+          <w:bCs/>
+        </w:rPr>
+        <w:t xml:space="preserve">re-introduces some email-enumeration ability</w:t>
+      </w:r>
+      <w:r>
+        <w:t xml:space="preserve"> </w:t>
+      </w:r>
+      <w:r>
+        <w:t xml:space="preserve">that a</w:t>
+      </w:r>
+      <w:r>
+        <w:t xml:space="preserve"> </w:t>
+      </w:r>
+      <w:r>
+        <w:t xml:space="preserve">uniform response would prevent. It was a conscious product choice: confused</w:t>
+      </w:r>
+      <w:r>
+        <w:t xml:space="preserve"> </w:t>
+      </w:r>
+      <w:r>
+        <w:t xml:space="preserve">members not knowing why nothing happened is a real problem at a kiosk, the kiosk</w:t>
+      </w:r>
+      <w:r>
+        <w:t xml:space="preserve"> </w:t>
+      </w:r>
+      <w:r>
+        <w:t xml:space="preserve">is physical, and the endpoint is rate-limited. If enumeration resistance becomes</w:t>
+      </w:r>
+      <w:r>
+        <w:t xml:space="preserve"> </w:t>
+      </w:r>
+      <w:r>
+        <w:t xml:space="preserve">more important than this UX, revert</w:t>
+      </w:r>
+      <w:r>
+        <w:t xml:space="preserve"> </w:t>
+      </w:r>
+      <w:r>
+        <w:rPr>
+          <w:rStyle w:val="VerbatimChar"/>
+        </w:rPr>
+        <w:t xml:space="preserve">card/register</w:t>
+      </w:r>
+      <w:r>
+        <w:t xml:space="preserve"> </w:t>
+      </w:r>
+      <w:r>
+        <w:t xml:space="preserve">to a uniform</w:t>
+      </w:r>
+      <w:r>
+        <w:t xml:space="preserve"> </w:t>
+      </w:r>
+      <w:r>
+        <w:rPr>
+          <w:rStyle w:val="VerbatimChar"/>
+        </w:rPr>
+        <w:t xml:space="preserve">{ ok: true }</w:t>
+      </w:r>
+      <w:r>
+        <w:t xml:space="preserve">.</w:t>
+      </w:r>
+    </w:p>
+    <w:bookmarkEnd w:id="167"/>
+    <w:bookmarkStart w:id="168" w:name="shop-token-is-a-bearer-token-in-the-url"/>
+    <w:p>
+      <w:pPr>
+        <w:pStyle w:val="Heading3"/>
+      </w:pPr>
+      <w:r>
+        <w:t xml:space="preserve">Shop token is a bearer token in the URL</w:t>
+      </w:r>
+    </w:p>
+    <w:p>
+      <w:pPr>
+        <w:pStyle w:val="FirstParagraph"/>
+      </w:pPr>
+      <w:r>
+        <w:t xml:space="preserve">Anyone holding a live</w:t>
+      </w:r>
+      <w:r>
+        <w:t xml:space="preserve"> </w:t>
+      </w:r>
+      <w:r>
+        <w:rPr>
+          <w:rStyle w:val="VerbatimChar"/>
+        </w:rPr>
+        <w:t xml:space="preserve">/shop/&lt;token&gt;</w:t>
+      </w:r>
+      <w:r>
+        <w:t xml:space="preserve"> </w:t>
+      </w:r>
+      <w:r>
+        <w:t xml:space="preserve">URL can act as that member until it expires</w:t>
+      </w:r>
+      <w:r>
+        <w:t xml:space="preserve"> </w:t>
+      </w:r>
+      <w:r>
+        <w:t xml:space="preserve">(10 min) or the order is confirmed. Tokens are random and per-tap (a new one each</w:t>
+      </w:r>
+      <w:r>
+        <w:t xml:space="preserve"> </w:t>
+      </w:r>
+      <w:r>
+        <w:t xml:space="preserve">scan), so they can't be guessed or reused. The idle auto-reset and short lifetime</w:t>
+      </w:r>
+      <w:r>
+        <w:t xml:space="preserve"> </w:t>
+      </w:r>
+      <w:r>
+        <w:t xml:space="preserve">bound the exposure. Stronger options (not currently implemented): move the token</w:t>
+      </w:r>
+      <w:r>
+        <w:t xml:space="preserve"> </w:t>
+      </w:r>
+      <w:r>
+        <w:t xml:space="preserve">into an httpOnly cookie so it can't be shared via URL, or use a crypto-random</w:t>
+      </w:r>
+      <w:r>
+        <w:t xml:space="preserve"> </w:t>
+      </w:r>
+      <w:r>
+        <w:t xml:space="preserve">token instead of a cuid.</w:t>
+      </w:r>
+    </w:p>
+    <w:bookmarkEnd w:id="168"/>
     <w:bookmarkEnd w:id="169"/>
-    <w:bookmarkStart w:id="170" w:name="audit-checklist"/>
+    <w:bookmarkStart w:id="170" w:name="prohibited--careful-operations"/>
     <w:p>
       <w:pPr>
         <w:pStyle w:val="Heading2"/>
       </w:pPr>
       <w:r>
-        <w:t xml:space="preserve">Audit checklist</w:t>
-      </w:r>
-    </w:p>
-    <w:p>
-      <w:pPr>
-        <w:pStyle w:val="FirstParagraph"/>
-      </w:pPr>
-      <w:r>
-        <w:t xml:space="preserve">When adding a new endpoint:</w:t>
-      </w:r>
-    </w:p>
-    <w:p>
-      <w:pPr>
+        <w:t xml:space="preserve">Prohibited / careful operations</w:t>
+      </w:r>
+    </w:p>
+    <w:p>
+      <w:pPr>
+        <w:pStyle w:val="Compact"/>
         <w:numPr>
           <w:ilvl w:val="0"/>
           <w:numId w:val="1059"/>
         </w:numPr>
       </w:pPr>
       <w:r>
-        <w:t xml:space="preserve">Does it touch member/admin data? → call</w:t>
-      </w:r>
-      <w:r>
-        <w:t xml:space="preserve"> </w:t>
-      </w:r>
-      <w:r>
-        <w:rPr>
-          <w:rStyle w:val="VerbatimChar"/>
-        </w:rPr>
-        <w:t xml:space="preserve">requireAdmin()</w:t>
-      </w:r>
-      <w:r>
-        <w:t xml:space="preserve"> </w:t>
-      </w:r>
-      <w:r>
-        <w:t xml:space="preserve">(admin) or validate a token (shop/registration).</w:t>
+        <w:rPr>
+          <w:b/>
+          <w:bCs/>
+        </w:rPr>
+        <w:t xml:space="preserve">Member deletion</w:t>
+      </w:r>
+      <w:r>
+        <w:t xml:space="preserve"> </w:t>
+      </w:r>
+      <w:r>
+        <w:t xml:space="preserve">is blocked while invoices exist.</w:t>
+      </w:r>
+    </w:p>
+    <w:p>
+      <w:pPr>
+        <w:pStyle w:val="Compact"/>
+        <w:numPr>
+          <w:ilvl w:val="0"/>
+          <w:numId w:val="1059"/>
+        </w:numPr>
+      </w:pPr>
+      <w:r>
+        <w:rPr>
+          <w:b/>
+          <w:bCs/>
+        </w:rPr>
+        <w:t xml:space="preserve">Invoice edit/delete</w:t>
+      </w:r>
+      <w:r>
+        <w:t xml:space="preserve"> </w:t>
+      </w:r>
+      <w:r>
+        <w:t xml:space="preserve">is blocked once an invoice is</w:t>
+      </w:r>
+      <w:r>
+        <w:t xml:space="preserve"> </w:t>
+      </w:r>
+      <w:r>
+        <w:rPr>
+          <w:rStyle w:val="VerbatimChar"/>
+        </w:rPr>
+        <w:t xml:space="preserve">EXPORTED</w:t>
+      </w:r>
+      <w:r>
+        <w:t xml:space="preserve"> </w:t>
+      </w:r>
+      <w:r>
+        <w:t xml:space="preserve">(already billed</w:t>
+      </w:r>
+      <w:r>
+        <w:t xml:space="preserve"> </w:t>
+      </w:r>
+      <w:r>
+        <w:t xml:space="preserve">in Congressus).</w:t>
+      </w:r>
+    </w:p>
+    <w:p>
+      <w:pPr>
+        <w:pStyle w:val="Compact"/>
+        <w:numPr>
+          <w:ilvl w:val="0"/>
+          <w:numId w:val="1059"/>
+        </w:numPr>
+      </w:pPr>
+      <w:r>
+        <w:rPr>
+          <w:b/>
+          <w:bCs/>
+        </w:rPr>
+        <w:t xml:space="preserve">Bulk invoice clearing</w:t>
+      </w:r>
+      <w:r>
+        <w:t xml:space="preserve"> </w:t>
+      </w:r>
+      <w:r>
+        <w:t xml:space="preserve">requires a double confirmation in the UI and is</w:t>
+      </w:r>
+      <w:r>
+        <w:t xml:space="preserve"> </w:t>
+      </w:r>
+      <w:r>
+        <w:t xml:space="preserve">intended for test-data cleanup only.</w:t>
+      </w:r>
+    </w:p>
+    <w:bookmarkEnd w:id="170"/>
+    <w:bookmarkStart w:id="171" w:name="audit-checklist"/>
+    <w:p>
+      <w:pPr>
+        <w:pStyle w:val="Heading2"/>
+      </w:pPr>
+      <w:r>
+        <w:t xml:space="preserve">Audit checklist</w:t>
+      </w:r>
+    </w:p>
+    <w:p>
+      <w:pPr>
+        <w:pStyle w:val="FirstParagraph"/>
+      </w:pPr>
+      <w:r>
+        <w:t xml:space="preserve">When adding a new endpoint:</w:t>
       </w:r>
     </w:p>
     <w:p>
@@ -31655,22 +32328,22 @@
         </w:numPr>
       </w:pPr>
       <w:r>
-        <w:t xml:space="preserve">Does it return more fields than the caller needs? →</w:t>
-      </w:r>
-      <w:r>
-        <w:t xml:space="preserve"> </w:t>
-      </w:r>
-      <w:r>
-        <w:rPr>
-          <w:rStyle w:val="VerbatimChar"/>
-        </w:rPr>
-        <w:t xml:space="preserve">select</w:t>
-      </w:r>
-      <w:r>
-        <w:t xml:space="preserve"> </w:t>
-      </w:r>
-      <w:r>
-        <w:t xml:space="preserve">only what's required.</w:t>
+        <w:t xml:space="preserve">Does it touch member/admin data? → call</w:t>
+      </w:r>
+      <w:r>
+        <w:t xml:space="preserve"> </w:t>
+      </w:r>
+      <w:r>
+        <w:rPr>
+          <w:rStyle w:val="VerbatimChar"/>
+        </w:rPr>
+        <w:t xml:space="preserve">requireAdmin()</w:t>
+      </w:r>
+      <w:r>
+        <w:t xml:space="preserve"> </w:t>
+      </w:r>
+      <w:r>
+        <w:t xml:space="preserve">(admin) or validate a token (shop/registration).</w:t>
       </w:r>
     </w:p>
     <w:p>
@@ -31681,7 +32354,22 @@
         </w:numPr>
       </w:pPr>
       <w:r>
-        <w:t xml:space="preserve">Is it public and write-capable or enumeration-prone? → add rate limiting.</w:t>
+        <w:t xml:space="preserve">Does it return more fields than the caller needs? →</w:t>
+      </w:r>
+      <w:r>
+        <w:t xml:space="preserve"> </w:t>
+      </w:r>
+      <w:r>
+        <w:rPr>
+          <w:rStyle w:val="VerbatimChar"/>
+        </w:rPr>
+        <w:t xml:space="preserve">select</w:t>
+      </w:r>
+      <w:r>
+        <w:t xml:space="preserve"> </w:t>
+      </w:r>
+      <w:r>
+        <w:t xml:space="preserve">only what's required.</w:t>
       </w:r>
     </w:p>
     <w:p>
@@ -31692,7 +32380,7 @@
         </w:numPr>
       </w:pPr>
       <w:r>
-        <w:t xml:space="preserve">Does it render raw HTML with external data? → escape it.</w:t>
+        <w:t xml:space="preserve">Is it public and write-capable or enumeration-prone? → add rate limiting.</w:t>
       </w:r>
     </w:p>
     <w:p>
@@ -31703,6 +32391,17 @@
         </w:numPr>
       </w:pPr>
       <w:r>
+        <w:t xml:space="preserve">Does it render raw HTML with external data? → escape it.</w:t>
+      </w:r>
+    </w:p>
+    <w:p>
+      <w:pPr>
+        <w:numPr>
+          <w:ilvl w:val="0"/>
+          <w:numId w:val="1064"/>
+        </w:numPr>
+      </w:pPr>
+      <w:r>
         <w:t xml:space="preserve">Verify at runtime: unauthenticated</w:t>
       </w:r>
       <w:r>
@@ -31722,8 +32421,8 @@
         <w:t xml:space="preserve">forged-cookie requests both get 401/redirect.</w:t>
       </w:r>
     </w:p>
-    <w:bookmarkEnd w:id="170"/>
     <w:bookmarkEnd w:id="171"/>
+    <w:bookmarkEnd w:id="172"/>
     <w:sectPr>
       <w:footnotePr>
         <w:numRestart w:val="eachSect"/>
@@ -32654,7 +33353,7 @@
     <w:abstractNumId w:val="991"/>
   </w:num>
   <w:num w:numId="1059">
-    <w:abstractNumId w:val="992"/>
+    <w:abstractNumId w:val="991"/>
   </w:num>
   <w:num w:numId="1060">
     <w:abstractNumId w:val="992"/>
@@ -32666,6 +33365,9 @@
     <w:abstractNumId w:val="992"/>
   </w:num>
   <w:num w:numId="1063">
+    <w:abstractNumId w:val="992"/>
+  </w:num>
+  <w:num w:numId="1064">
     <w:abstractNumId w:val="992"/>
   </w:num>
 </w:numbering>

</xml_diff>

<commit_message>
PPP: edit pending orders and remove discounts per line
Admins can edit a not-yet-exported PPP order: change quantities, remove
lines (removing all deletes the order), and remove the discount on a line
so it's charged at the drink's list price (drops specials, role discounts
and bartender free drinks; reports treat it as undiscounted). Exported
orders stay locked.

Co-Authored-By: Claude Opus 5.5 <noreply@anthropic.com>
</commit_message>
<xml_diff>
--- a/docs/SSS-Documentation.docx
+++ b/docs/SSS-Documentation.docx
@@ -27281,6 +27281,71 @@
             </w:r>
             <w:r>
               <w:t xml:space="preserve">; delete/clear test data.</w:t>
+            </w:r>
+            <w:r>
+              <w:t xml:space="preserve"> </w:t>
+            </w:r>
+            <w:r>
+              <w:rPr>
+                <w:b/>
+                <w:bCs/>
+              </w:rPr>
+              <w:t xml:space="preserve">Edit</w:t>
+            </w:r>
+            <w:r>
+              <w:t xml:space="preserve"> </w:t>
+            </w:r>
+            <w:r>
+              <w:t xml:space="preserve">a pending (not yet exported) order: change quantities, remove lines (removing all deletes the order), and</w:t>
+            </w:r>
+            <w:r>
+              <w:t xml:space="preserve"> </w:t>
+            </w:r>
+            <w:r>
+              <w:rPr>
+                <w:b/>
+                <w:bCs/>
+              </w:rPr>
+              <w:t xml:space="preserve">Remove discount</w:t>
+            </w:r>
+            <w:r>
+              <w:t xml:space="preserve"> </w:t>
+            </w:r>
+            <w:r>
+              <w:t xml:space="preserve">on a line — it's then charged at the drink's normal list price (drops the borrel special, role discount such as PilsCie/Board, or bartender free drink) and counts as undiscounted in all reports. Each discounted line shows why it was discounted.</w:t>
+            </w:r>
+            <w:r>
+              <w:t xml:space="preserve"> </w:t>
+            </w:r>
+            <w:r>
+              <w:rPr>
+                <w:rStyle w:val="VerbatimChar"/>
+              </w:rPr>
+              <w:t xml:space="preserve">PATCH /api/admin/ppp/invoices/[id]</w:t>
+            </w:r>
+            <w:r>
+              <w:t xml:space="preserve"> </w:t>
+            </w:r>
+            <w:r>
+              <w:rPr>
+                <w:rStyle w:val="VerbatimChar"/>
+              </w:rPr>
+              <w:t xml:space="preserve">{ lines: [{ id, quantity?, removeDiscount? }] }</w:t>
+            </w:r>
+            <w:r>
+              <w:t xml:space="preserve">; exported orders return</w:t>
+            </w:r>
+            <w:r>
+              <w:t xml:space="preserve"> </w:t>
+            </w:r>
+            <w:r>
+              <w:rPr>
+                <w:rStyle w:val="VerbatimChar"/>
+              </w:rPr>
+              <w:t xml:space="preserve">409</w:t>
+            </w:r>
+            <w:r>
+              <w:t xml:space="preserve">.</w:t>
             </w:r>
           </w:p>
         </w:tc>

</xml_diff>

<commit_message>
Security: short card sessions, safe-to-retry export, headers, deps
- Fix bartenders suddenly 'Unauthorized' mid-borrel: card logins were 7-day
  sessions, so last week's login on the bar PC expired during the next weekly
  borrel. Card sessions now slide (2 h after last use, max 16 h) and the POS
  shows a 'Session ended - tap a bartender card' overlay that re-signs in
  place, keeping the cart. Migration ends existing bartender sessions once.
- Export can't bill twice: orders are atomically claimed (CONFIRMED ->
  EXPORTING + run id) before calling Congressus; 4xx returns them to pending,
  unknown outcomes stay EXPORTING and show a 'needs check' panel with
  reconcile actions (POST /api/admin/invoices/reconcile).
- Security headers (HSTS, nosniff, referrer policy, frame protection, CSP
  frame-ancestors), no-store on token routes, Secure session cookie.
- Remove unused next-auth/@auth/prisma-adapter; upgrade next to 16.3.8.

Co-Authored-By: Claude Opus 5.5 <noreply@anthropic.com>
</commit_message>
<xml_diff>
--- a/docs/SSS-Documentation.docx
+++ b/docs/SSS-Documentation.docx
@@ -7852,7 +7852,7 @@
     </w:p>
     <w:bookmarkEnd w:id="60"/>
     <w:bookmarkEnd w:id="61"/>
-    <w:bookmarkStart w:id="96" w:name="api-reference"/>
+    <w:bookmarkStart w:id="97" w:name="api-reference"/>
     <w:p>
       <w:pPr>
         <w:pStyle w:val="Heading1"/>
@@ -9525,7 +9525,7 @@
     </w:p>
     <w:bookmarkEnd w:id="76"/>
     <w:bookmarkEnd w:id="77"/>
-    <w:bookmarkStart w:id="95" w:name="admin--all-require-an-admin-session"/>
+    <w:bookmarkStart w:id="96" w:name="admin--all-require-an-admin-session"/>
     <w:p>
       <w:pPr>
         <w:pStyle w:val="Heading2"/>
@@ -11854,7 +11854,7 @@
         <w:pStyle w:val="FirstParagraph"/>
       </w:pPr>
       <w:r>
-        <w:t xml:space="preserve">Groups</w:t>
+        <w:t xml:space="preserve">Atomically claims all</w:t>
       </w:r>
       <w:r>
         <w:t xml:space="preserve"> </w:t>
@@ -11869,13 +11869,28 @@
         <w:t xml:space="preserve"> </w:t>
       </w:r>
       <w:r>
-        <w:t xml:space="preserve">invoices by member × calendar month and creates one Congressus</w:t>
-      </w:r>
-      <w:r>
-        <w:t xml:space="preserve"> </w:t>
-      </w:r>
-      <w:r>
-        <w:t xml:space="preserve">sale-invoice per group, then marks them</w:t>
+        <w:t xml:space="preserve">invoices of the scope (</w:t>
+      </w:r>
+      <w:r>
+        <w:rPr>
+          <w:rStyle w:val="VerbatimChar"/>
+        </w:rPr>
+        <w:t xml:space="preserve">CONFIRMED → EXPORTING</w:t>
+      </w:r>
+      <w:r>
+        <w:t xml:space="preserve">,</w:t>
+      </w:r>
+      <w:r>
+        <w:t xml:space="preserve"> </w:t>
+      </w:r>
+      <w:r>
+        <w:t xml:space="preserve">tagged with this run's id — a concurrent run gets none), groups them by member ×</w:t>
+      </w:r>
+      <w:r>
+        <w:t xml:space="preserve"> </w:t>
+      </w:r>
+      <w:r>
+        <w:t xml:space="preserve">calendar month and creates one Congressus sale-invoice per group, then marks them</w:t>
       </w:r>
       <w:r>
         <w:t xml:space="preserve"> </w:t>
@@ -11887,6 +11902,57 @@
         <w:t xml:space="preserve">EXPORTED</w:t>
       </w:r>
       <w:r>
+        <w:t xml:space="preserve">. A Congressus 4xx returns that group to</w:t>
+      </w:r>
+      <w:r>
+        <w:t xml:space="preserve"> </w:t>
+      </w:r>
+      <w:r>
+        <w:rPr>
+          <w:rStyle w:val="VerbatimChar"/>
+        </w:rPr>
+        <w:t xml:space="preserve">CONFIRMED</w:t>
+      </w:r>
+      <w:r>
+        <w:t xml:space="preserve">; an unknown outcome</w:t>
+      </w:r>
+      <w:r>
+        <w:t xml:space="preserve"> </w:t>
+      </w:r>
+      <w:r>
+        <w:t xml:space="preserve">(timeout/5xx/network/DB failure after success) leaves it</w:t>
+      </w:r>
+      <w:r>
+        <w:t xml:space="preserve"> </w:t>
+      </w:r>
+      <w:r>
+        <w:rPr>
+          <w:rStyle w:val="VerbatimChar"/>
+        </w:rPr>
+        <w:t xml:space="preserve">EXPORTING</w:t>
+      </w:r>
+      <w:r>
+        <w:t xml:space="preserve"> </w:t>
+      </w:r>
+      <w:r>
+        <w:t xml:space="preserve">and counts it</w:t>
+      </w:r>
+      <w:r>
+        <w:t xml:space="preserve"> </w:t>
+      </w:r>
+      <w:r>
+        <w:t xml:space="preserve">in</w:t>
+      </w:r>
+      <w:r>
+        <w:t xml:space="preserve"> </w:t>
+      </w:r>
+      <w:r>
+        <w:rPr>
+          <w:rStyle w:val="VerbatimChar"/>
+        </w:rPr>
+        <w:t xml:space="preserve">needsCheck</w:t>
+      </w:r>
+      <w:r>
         <w:t xml:space="preserve">.</w:t>
       </w:r>
     </w:p>
@@ -12054,6 +12120,42 @@
         <w:rPr>
           <w:rStyle w:val="DataTypeTok"/>
         </w:rPr>
+        <w:t xml:space="preserve">"needsCheck"</w:t>
+      </w:r>
+      <w:r>
+        <w:rPr>
+          <w:rStyle w:val="FunctionTok"/>
+        </w:rPr>
+        <w:t xml:space="preserve">:</w:t>
+      </w:r>
+      <w:r>
+        <w:rPr>
+          <w:rStyle w:val="NormalTok"/>
+        </w:rPr>
+        <w:t xml:space="preserve"> </w:t>
+      </w:r>
+      <w:r>
+        <w:rPr>
+          <w:rStyle w:val="DecValTok"/>
+        </w:rPr>
+        <w:t xml:space="preserve">0</w:t>
+      </w:r>
+      <w:r>
+        <w:rPr>
+          <w:rStyle w:val="FunctionTok"/>
+        </w:rPr>
+        <w:t xml:space="preserve">,</w:t>
+      </w:r>
+      <w:r>
+        <w:rPr>
+          <w:rStyle w:val="NormalTok"/>
+        </w:rPr>
+        <w:t xml:space="preserve"> </w:t>
+      </w:r>
+      <w:r>
+        <w:rPr>
+          <w:rStyle w:val="DataTypeTok"/>
+        </w:rPr>
         <w:t xml:space="preserve">"errors"</w:t>
       </w:r>
       <w:r>
@@ -12087,15 +12189,105 @@
         <w:t xml:space="preserve">}</w:t>
       </w:r>
     </w:p>
+    <w:bookmarkEnd w:id="94"/>
+    <w:bookmarkStart w:id="95" w:name="post-apiadmininvoicesreconcile"/>
+    <w:p>
+      <w:pPr>
+        <w:pStyle w:val="Heading3"/>
+      </w:pPr>
+      <w:r>
+        <w:rPr>
+          <w:rStyle w:val="VerbatimChar"/>
+        </w:rPr>
+        <w:t xml:space="preserve">POST /api/admin/invoices/reconcile</w:t>
+      </w:r>
+    </w:p>
+    <w:p>
+      <w:pPr>
+        <w:pStyle w:val="FirstParagraph"/>
+      </w:pPr>
+      <w:r>
+        <w:t xml:space="preserve">Resolve orders stuck in</w:t>
+      </w:r>
+      <w:r>
+        <w:t xml:space="preserve"> </w:t>
+      </w:r>
+      <w:r>
+        <w:rPr>
+          <w:rStyle w:val="VerbatimChar"/>
+        </w:rPr>
+        <w:t xml:space="preserve">EXPORTING</w:t>
+      </w:r>
+      <w:r>
+        <w:t xml:space="preserve"> </w:t>
+      </w:r>
+      <w:r>
+        <w:t xml:space="preserve">after checking Congressus.</w:t>
+      </w:r>
+      <w:r>
+        <w:t xml:space="preserve"> </w:t>
+      </w:r>
+      <w:r>
+        <w:t xml:space="preserve">Body</w:t>
+      </w:r>
+      <w:r>
+        <w:t xml:space="preserve"> </w:t>
+      </w:r>
+      <w:r>
+        <w:rPr>
+          <w:rStyle w:val="VerbatimChar"/>
+        </w:rPr>
+        <w:t xml:space="preserve">{ system: "sss"|"ppp", ids: [...], action: "exported"|"pending", congressusInvoiceId? }</w:t>
+      </w:r>
+      <w:r>
+        <w:t xml:space="preserve">.</w:t>
+      </w:r>
+      <w:r>
+        <w:t xml:space="preserve"> </w:t>
+      </w:r>
+      <w:r>
+        <w:t xml:space="preserve">Only claims older than 10 minutes;</w:t>
+      </w:r>
+      <w:r>
+        <w:t xml:space="preserve"> </w:t>
+      </w:r>
+      <w:r>
+        <w:rPr>
+          <w:rStyle w:val="VerbatimChar"/>
+        </w:rPr>
+        <w:t xml:space="preserve">409</w:t>
+      </w:r>
+      <w:r>
+        <w:t xml:space="preserve"> </w:t>
+      </w:r>
+      <w:r>
+        <w:t xml:space="preserve">otherwise. The invoice lists accept</w:t>
+      </w:r>
+      <w:r>
+        <w:t xml:space="preserve"> </w:t>
+      </w:r>
+      <w:r>
+        <w:rPr>
+          <w:rStyle w:val="VerbatimChar"/>
+        </w:rPr>
+        <w:t xml:space="preserve">?status=EXPORTING</w:t>
+      </w:r>
+      <w:r>
+        <w:t xml:space="preserve"> </w:t>
+      </w:r>
+      <w:r>
+        <w:t xml:space="preserve">to list them.</w:t>
+      </w:r>
+    </w:p>
     <w:p>
       <w:r>
         <w:br w:type="page"/>
       </w:r>
     </w:p>
-    <w:bookmarkEnd w:id="94"/>
     <w:bookmarkEnd w:id="95"/>
     <w:bookmarkEnd w:id="96"/>
-    <w:bookmarkStart w:id="108" w:name="deployment"/>
+    <w:bookmarkEnd w:id="97"/>
+    <w:bookmarkStart w:id="109" w:name="deployment"/>
     <w:p>
       <w:pPr>
         <w:pStyle w:val="Heading1"/>
@@ -12160,7 +12352,7 @@
         <w:t xml:space="preserve">for product images.</w:t>
       </w:r>
     </w:p>
-    <w:bookmarkStart w:id="97" w:name="build--start"/>
+    <w:bookmarkStart w:id="98" w:name="build--start"/>
     <w:p>
       <w:pPr>
         <w:pStyle w:val="Heading2"/>
@@ -12513,8 +12705,8 @@
         <w:t xml:space="preserve">.</w:t>
       </w:r>
     </w:p>
-    <w:bookmarkEnd w:id="97"/>
-    <w:bookmarkStart w:id="101" w:name="environment-variables"/>
+    <w:bookmarkEnd w:id="98"/>
+    <w:bookmarkStart w:id="102" w:name="environment-variables"/>
     <w:p>
       <w:pPr>
         <w:pStyle w:val="Heading2"/>
@@ -13971,7 +14163,7 @@
         </w:tc>
       </w:tr>
     </w:tbl>
-    <w:bookmarkStart w:id="98" w:name="Xcb9fb8e9b51d6756401591e907f7cb6deec43ac"/>
+    <w:bookmarkStart w:id="99" w:name="Xcb9fb8e9b51d6756401591e907f7cb6deec43ac"/>
     <w:p>
       <w:pPr>
         <w:pStyle w:val="Heading3"/>
@@ -14102,8 +14294,8 @@
         <w:t xml:space="preserve">— keep both set and equal.</w:t>
       </w:r>
     </w:p>
-    <w:bookmarkEnd w:id="98"/>
-    <w:bookmarkStart w:id="99" w:name="custom-domain-51vonl"/>
+    <w:bookmarkEnd w:id="99"/>
+    <w:bookmarkStart w:id="100" w:name="custom-domain-51vonl"/>
     <w:p>
       <w:pPr>
         <w:pStyle w:val="Heading3"/>
@@ -14351,8 +14543,8 @@
         <w:t xml:space="preserve">).</w:t>
       </w:r>
     </w:p>
-    <w:bookmarkEnd w:id="99"/>
-    <w:bookmarkStart w:id="100" w:name="bar-pos-vanity-domain-ppp51vonl"/>
+    <w:bookmarkEnd w:id="100"/>
+    <w:bookmarkStart w:id="101" w:name="bar-pos-vanity-domain-ppp51vonl"/>
     <w:p>
       <w:pPr>
         <w:pStyle w:val="Heading3"/>
@@ -14631,9 +14823,9 @@
         <w:t xml:space="preserve">, where cookies, the PWA manifest and the cert all live.</w:t>
       </w:r>
     </w:p>
-    <w:bookmarkEnd w:id="100"/>
     <w:bookmarkEnd w:id="101"/>
-    <w:bookmarkStart w:id="102" w:name="email-deliverability-verification-emails"/>
+    <w:bookmarkEnd w:id="102"/>
+    <w:bookmarkStart w:id="103" w:name="email-deliverability-verification-emails"/>
     <w:p>
       <w:pPr>
         <w:pStyle w:val="Heading2"/>
@@ -15039,8 +15231,8 @@
         <w:t xml:space="preserve">.</w:t>
       </w:r>
     </w:p>
-    <w:bookmarkEnd w:id="102"/>
-    <w:bookmarkStart w:id="103" w:name="persistent-volume-product-images"/>
+    <w:bookmarkEnd w:id="103"/>
+    <w:bookmarkStart w:id="104" w:name="persistent-volume-product-images"/>
     <w:p>
       <w:pPr>
         <w:pStyle w:val="Heading2"/>
@@ -15285,8 +15477,8 @@
         <w:t xml:space="preserve">volume — only user-uploaded images do.</w:t>
       </w:r>
     </w:p>
-    <w:bookmarkEnd w:id="103"/>
-    <w:bookmarkStart w:id="104" w:name="first-time-setup"/>
+    <w:bookmarkEnd w:id="104"/>
+    <w:bookmarkStart w:id="105" w:name="first-time-setup"/>
     <w:p>
       <w:pPr>
         <w:pStyle w:val="Heading2"/>
@@ -15409,8 +15601,8 @@
         <w:t xml:space="preserve">— add your snacks (each one also creates a Congressus product).</w:t>
       </w:r>
     </w:p>
-    <w:bookmarkEnd w:id="104"/>
-    <w:bookmarkStart w:id="105" w:name="deploying-changes"/>
+    <w:bookmarkEnd w:id="105"/>
+    <w:bookmarkStart w:id="106" w:name="deploying-changes"/>
     <w:p>
       <w:pPr>
         <w:pStyle w:val="Heading2"/>
@@ -15507,8 +15699,8 @@
         <w:t xml:space="preserve">must pass for the deploy to go live.</w:t>
       </w:r>
     </w:p>
-    <w:bookmarkEnd w:id="105"/>
-    <w:bookmarkStart w:id="107" w:name="local-development"/>
+    <w:bookmarkEnd w:id="106"/>
+    <w:bookmarkStart w:id="108" w:name="local-development"/>
     <w:p>
       <w:pPr>
         <w:pStyle w:val="Heading2"/>
@@ -15649,7 +15841,7 @@
       <w:r>
         <w:t xml:space="preserve"> </w:t>
       </w:r>
-      <w:hyperlink r:id="rId106">
+      <w:hyperlink r:id="rId107">
         <w:r>
           <w:rPr>
             <w:rStyle w:val="Hyperlink"/>
@@ -15666,9 +15858,9 @@
         <w:br w:type="page"/>
       </w:r>
     </w:p>
-    <w:bookmarkEnd w:id="107"/>
     <w:bookmarkEnd w:id="108"/>
-    <w:bookmarkStart w:id="119" w:name="card-reader--kiosk-setup"/>
+    <w:bookmarkEnd w:id="109"/>
+    <w:bookmarkStart w:id="120" w:name="card-reader--kiosk-setup"/>
     <w:p>
       <w:pPr>
         <w:pStyle w:val="Heading1"/>
@@ -16203,7 +16395,7 @@
         <w:t xml:space="preserve">. See the Web NFC section below.</w:t>
       </w:r>
     </w:p>
-    <w:bookmarkStart w:id="109" w:name="ipad--tablet-kiosk-hid-keyboard-wedge"/>
+    <w:bookmarkStart w:id="110" w:name="ipad--tablet-kiosk-hid-keyboard-wedge"/>
     <w:p>
       <w:pPr>
         <w:pStyle w:val="Heading2"/>
@@ -16720,8 +16912,8 @@
         <w:t xml:space="preserve">— then every device stays in sync automatically.</w:t>
       </w:r>
     </w:p>
-    <w:bookmarkEnd w:id="109"/>
-    <w:bookmarkStart w:id="111" w:name="android-phone-kiosk-web-nfc--nfc-mode"/>
+    <w:bookmarkEnd w:id="110"/>
+    <w:bookmarkStart w:id="112" w:name="android-phone-kiosk-web-nfc--nfc-mode"/>
     <w:p>
       <w:pPr>
         <w:pStyle w:val="Heading2"/>
@@ -16806,7 +16998,7 @@
       <w:r>
         <w:t xml:space="preserve"> </w:t>
       </w:r>
-      <w:hyperlink r:id="rId110">
+      <w:hyperlink r:id="rId111">
         <w:r>
           <w:rPr>
             <w:rStyle w:val="Hyperlink"/>
@@ -17203,8 +17395,8 @@
         <w:t xml:space="preserve">.</w:t>
       </w:r>
     </w:p>
-    <w:bookmarkEnd w:id="111"/>
-    <w:bookmarkStart w:id="112" w:name="laptop-kiosk-arago-websocket"/>
+    <w:bookmarkEnd w:id="112"/>
+    <w:bookmarkStart w:id="113" w:name="laptop-kiosk-arago-websocket"/>
     <w:p>
       <w:pPr>
         <w:pStyle w:val="Heading2"/>
@@ -17254,8 +17446,8 @@
         <w:t xml:space="preserve">directly.</w:t>
       </w:r>
     </w:p>
-    <w:bookmarkEnd w:id="112"/>
-    <w:bookmarkStart w:id="113" w:name="how-it-works"/>
+    <w:bookmarkEnd w:id="113"/>
+    <w:bookmarkStart w:id="114" w:name="how-it-works"/>
     <w:p>
       <w:pPr>
         <w:pStyle w:val="Heading2"/>
@@ -17542,8 +17734,8 @@
         <w:t xml:space="preserve">, and the page auto-reconnects every 3 seconds.</w:t>
       </w:r>
     </w:p>
-    <w:bookmarkEnd w:id="113"/>
-    <w:bookmarkStart w:id="116" w:name="kiosk-laptop-setup"/>
+    <w:bookmarkEnd w:id="114"/>
+    <w:bookmarkStart w:id="117" w:name="kiosk-laptop-setup"/>
     <w:p>
       <w:pPr>
         <w:pStyle w:val="Heading2"/>
@@ -17688,7 +17880,7 @@
         <w:t xml:space="preserve">right value.</w:t>
       </w:r>
     </w:p>
-    <w:bookmarkStart w:id="114" w:name="port-conflict-warning"/>
+    <w:bookmarkStart w:id="115" w:name="port-conflict-warning"/>
     <w:p>
       <w:pPr>
         <w:pStyle w:val="Heading3"/>
@@ -17790,8 +17982,8 @@
         <w:t xml:space="preserve">free for the reader.</w:t>
       </w:r>
     </w:p>
-    <w:bookmarkEnd w:id="114"/>
-    <w:bookmarkStart w:id="115" w:name="ws-vs-wss"/>
+    <w:bookmarkEnd w:id="115"/>
+    <w:bookmarkStart w:id="116" w:name="ws-vs-wss"/>
     <w:p>
       <w:pPr>
         <w:pStyle w:val="Heading3"/>
@@ -17877,9 +18069,9 @@
         <w:t xml:space="preserve">reader over the network — that would be blocked as mixed content.</w:t>
       </w:r>
     </w:p>
-    <w:bookmarkEnd w:id="115"/>
     <w:bookmarkEnd w:id="116"/>
-    <w:bookmarkStart w:id="117" w:name="card-uids"/>
+    <w:bookmarkEnd w:id="117"/>
+    <w:bookmarkStart w:id="118" w:name="card-uids"/>
     <w:p>
       <w:pPr>
         <w:pStyle w:val="Heading2"/>
@@ -17948,8 +18140,8 @@
         <w:t xml:space="preserve">.</w:t>
       </w:r>
     </w:p>
-    <w:bookmarkEnd w:id="117"/>
-    <w:bookmarkStart w:id="118" w:name="testing-without-a-reader"/>
+    <w:bookmarkEnd w:id="118"/>
+    <w:bookmarkStart w:id="119" w:name="testing-without-a-reader"/>
     <w:p>
       <w:pPr>
         <w:pStyle w:val="Heading2"/>
@@ -18467,9 +18659,9 @@
         <w:br w:type="page"/>
       </w:r>
     </w:p>
-    <w:bookmarkEnd w:id="118"/>
     <w:bookmarkEnd w:id="119"/>
-    <w:bookmarkStart w:id="129" w:name="congressus-integration"/>
+    <w:bookmarkEnd w:id="120"/>
+    <w:bookmarkStart w:id="130" w:name="congressus-integration"/>
     <w:p>
       <w:pPr>
         <w:pStyle w:val="Heading1"/>
@@ -18779,7 +18971,7 @@
         <w:t xml:space="preserve">) — see below.</w:t>
       </w:r>
     </w:p>
-    <w:bookmarkStart w:id="120" w:name="members-congressus--sss"/>
+    <w:bookmarkStart w:id="121" w:name="members-congressus--sss"/>
     <w:p>
       <w:pPr>
         <w:pStyle w:val="Heading2"/>
@@ -18877,8 +19069,8 @@
         <w:t xml:space="preserve">(email is the unique key used for card linking).</w:t>
       </w:r>
     </w:p>
-    <w:bookmarkEnd w:id="120"/>
-    <w:bookmarkStart w:id="123" w:name="products-sss--congressus"/>
+    <w:bookmarkEnd w:id="121"/>
+    <w:bookmarkStart w:id="124" w:name="products-sss--congressus"/>
     <w:p>
       <w:pPr>
         <w:pStyle w:val="Heading2"/>
@@ -18932,7 +19124,7 @@
         <w:t xml:space="preserve">). Name/price edits sync too.</w:t>
       </w:r>
     </w:p>
-    <w:bookmarkStart w:id="121" w:name="warning-the-product-id-vs-offer-id-quirk"/>
+    <w:bookmarkStart w:id="122" w:name="warning-the-product-id-vs-offer-id-quirk"/>
     <w:p>
       <w:pPr>
         <w:pStyle w:val="Heading3"/>
@@ -19224,8 +19416,8 @@
         <w:t xml:space="preserve">.</w:t>
       </w:r>
     </w:p>
-    <w:bookmarkEnd w:id="121"/>
-    <w:bookmarkStart w:id="122" w:name="backfilling-existing-products"/>
+    <w:bookmarkEnd w:id="122"/>
+    <w:bookmarkStart w:id="123" w:name="backfilling-existing-products"/>
     <w:p>
       <w:pPr>
         <w:pStyle w:val="Heading3"/>
@@ -19260,9 +19452,9 @@
         <w:t xml:space="preserve">.</w:t>
       </w:r>
     </w:p>
-    <w:bookmarkEnd w:id="122"/>
     <w:bookmarkEnd w:id="123"/>
-    <w:bookmarkStart w:id="125" w:name="sale-invoices-sss--congressus"/>
+    <w:bookmarkEnd w:id="124"/>
+    <w:bookmarkStart w:id="126" w:name="sale-invoices-sss--congressus"/>
     <w:p>
       <w:pPr>
         <w:pStyle w:val="Heading2"/>
@@ -19540,7 +19732,7 @@
         <w:t xml:space="preserve">.</w:t>
       </w:r>
     </w:p>
-    <w:bookmarkStart w:id="124" w:name="warning-the-500-instead-of-400-quirk"/>
+    <w:bookmarkStart w:id="125" w:name="warning-the-500-instead-of-400-quirk"/>
     <w:p>
       <w:pPr>
         <w:pStyle w:val="Heading3"/>
@@ -19646,9 +19838,9 @@
         <w:t xml:space="preserve">array in the initial create call.</w:t>
       </w:r>
     </w:p>
-    <w:bookmarkEnd w:id="124"/>
     <w:bookmarkEnd w:id="125"/>
-    <w:bookmarkStart w:id="126" w:name="the-sss-purchases-mendix-fallback"/>
+    <w:bookmarkEnd w:id="126"/>
+    <w:bookmarkStart w:id="127" w:name="the-sss-purchases-mendix-fallback"/>
     <w:p>
       <w:pPr>
         <w:pStyle w:val="Heading2"/>
@@ -19698,8 +19890,8 @@
         <w:t xml:space="preserve">products have offer ids, invoices show real product line items instead.</w:t>
       </w:r>
     </w:p>
-    <w:bookmarkEnd w:id="126"/>
-    <w:bookmarkStart w:id="127" w:name="Xcbc730bcd032a0e57daa67cba6c562d436e893f"/>
+    <w:bookmarkEnd w:id="127"/>
+    <w:bookmarkStart w:id="128" w:name="Xcbc730bcd032a0e57daa67cba6c562d436e893f"/>
     <w:p>
       <w:pPr>
         <w:pStyle w:val="Heading2"/>
@@ -20264,8 +20456,8 @@
         <w:t xml:space="preserve">with the returned id.</w:t>
       </w:r>
     </w:p>
-    <w:bookmarkEnd w:id="127"/>
-    <w:bookmarkStart w:id="128" w:name="quick-reference-of-quirks"/>
+    <w:bookmarkEnd w:id="128"/>
+    <w:bookmarkStart w:id="129" w:name="quick-reference-of-quirks"/>
     <w:p>
       <w:pPr>
         <w:pStyle w:val="Heading2"/>
@@ -20715,9 +20907,9 @@
         <w:br w:type="page"/>
       </w:r>
     </w:p>
-    <w:bookmarkEnd w:id="128"/>
     <w:bookmarkEnd w:id="129"/>
-    <w:bookmarkStart w:id="136" w:name="admin-guide-for-the-board"/>
+    <w:bookmarkEnd w:id="130"/>
+    <w:bookmarkStart w:id="137" w:name="admin-guide-for-the-board"/>
     <w:p>
       <w:pPr>
         <w:pStyle w:val="Heading1"/>
@@ -20757,7 +20949,7 @@
         <w:t xml:space="preserve">and Invoices, plus links back to the Kiosk and Log out.</w:t>
       </w:r>
     </w:p>
-    <w:bookmarkStart w:id="130" w:name="dashboard"/>
+    <w:bookmarkStart w:id="131" w:name="dashboard"/>
     <w:p>
       <w:pPr>
         <w:pStyle w:val="Heading2"/>
@@ -20974,8 +21166,8 @@
         <w:t xml:space="preserve">purchases in the chosen period.</w:t>
       </w:r>
     </w:p>
-    <w:bookmarkEnd w:id="130"/>
-    <w:bookmarkStart w:id="131" w:name="members"/>
+    <w:bookmarkEnd w:id="131"/>
+    <w:bookmarkStart w:id="132" w:name="members"/>
     <w:p>
       <w:pPr>
         <w:pStyle w:val="Heading2"/>
@@ -21356,8 +21548,8 @@
         <w:t xml:space="preserve">link cards from the admin panel.</w:t>
       </w:r>
     </w:p>
-    <w:bookmarkEnd w:id="131"/>
-    <w:bookmarkStart w:id="132" w:name="products"/>
+    <w:bookmarkEnd w:id="132"/>
+    <w:bookmarkStart w:id="133" w:name="products"/>
     <w:p>
       <w:pPr>
         <w:pStyle w:val="Heading2"/>
@@ -21983,8 +22175,8 @@
         <w:t xml:space="preserve">— hides a product you no longer sell.</w:t>
       </w:r>
     </w:p>
-    <w:bookmarkEnd w:id="132"/>
-    <w:bookmarkStart w:id="133" w:name="invoices"/>
+    <w:bookmarkEnd w:id="133"/>
+    <w:bookmarkStart w:id="134" w:name="invoices"/>
     <w:p>
       <w:pPr>
         <w:pStyle w:val="Heading2"/>
@@ -22216,8 +22408,8 @@
         <w:t xml:space="preserve">corrections after export must be made in Congressus directly.</w:t>
       </w:r>
     </w:p>
-    <w:bookmarkEnd w:id="133"/>
-    <w:bookmarkStart w:id="134" w:name="typical-monthly-routine"/>
+    <w:bookmarkEnd w:id="134"/>
+    <w:bookmarkStart w:id="135" w:name="typical-monthly-routine"/>
     <w:p>
       <w:pPr>
         <w:pStyle w:val="Heading2"/>
@@ -22310,8 +22502,8 @@
         <w:t xml:space="preserve">Verify the new invoices in Congressus.</w:t>
       </w:r>
     </w:p>
-    <w:bookmarkEnd w:id="134"/>
-    <w:bookmarkStart w:id="135" w:name="Xdfdd6fef4644c16841a13fbca3b793942ebb4aa"/>
+    <w:bookmarkEnd w:id="135"/>
+    <w:bookmarkStart w:id="136" w:name="Xdfdd6fef4644c16841a13fbca3b793942ebb4aa"/>
     <w:p>
       <w:pPr>
         <w:pStyle w:val="Heading2"/>
@@ -22447,9 +22639,9 @@
         <w:br w:type="page"/>
       </w:r>
     </w:p>
-    <w:bookmarkEnd w:id="135"/>
     <w:bookmarkEnd w:id="136"/>
-    <w:bookmarkStart w:id="158" w:name="ppp--bar-pos-drinks-at-activities"/>
+    <w:bookmarkEnd w:id="137"/>
+    <w:bookmarkStart w:id="159" w:name="ppp--bar-pos-drinks-at-activities"/>
     <w:p>
       <w:pPr>
         <w:pStyle w:val="Heading1"/>
@@ -22624,7 +22816,7 @@
         <w:t xml:space="preserve">  Member card ──tap──▶ Bar POS ──confirm──▶ PppInvoice ──monthly──▶ Congressus ("PPP &lt;month&gt;")</w:t>
       </w:r>
     </w:p>
-    <w:bookmarkStart w:id="137" w:name="surfaces"/>
+    <w:bookmarkStart w:id="138" w:name="surfaces"/>
     <w:p>
       <w:pPr>
         <w:pStyle w:val="Heading2"/>
@@ -23046,8 +23238,8 @@
         <w:t xml:space="preserve">is public).</w:t>
       </w:r>
     </w:p>
-    <w:bookmarkEnd w:id="137"/>
-    <w:bookmarkStart w:id="140" w:name="the-pos-screen-pppactivityid"/>
+    <w:bookmarkEnd w:id="138"/>
+    <w:bookmarkStart w:id="141" w:name="the-pos-screen-pppactivityid"/>
     <w:p>
       <w:pPr>
         <w:pStyle w:val="Heading2"/>
@@ -23544,62 +23736,64 @@
           <w:b/>
           <w:bCs/>
         </w:rPr>
-        <w:t xml:space="preserve">Bottom (left column)</w:t>
-      </w:r>
-      <w:r>
-        <w:t xml:space="preserve"> </w:t>
-      </w:r>
-      <w:r>
-        <w:t xml:space="preserve">—</w:t>
-      </w:r>
-      <w:r>
-        <w:t xml:space="preserve"> </w:t>
-      </w:r>
-      <w:r>
-        <w:rPr>
-          <w:b/>
-          <w:bCs/>
-        </w:rPr>
-        <w:t xml:space="preserve">Regulars</w:t>
-      </w:r>
-      <w:r>
-        <w:t xml:space="preserve">: large circular buttons of members who</w:t>
-      </w:r>
-      <w:r>
-        <w:t xml:space="preserve"> </w:t>
-      </w:r>
-      <w:r>
-        <w:t xml:space="preserve">have ordered at this borrel, most orders first. Tap one to charge them</w:t>
-      </w:r>
-      <w:r>
-        <w:t xml:space="preserve"> </w:t>
-      </w:r>
-      <w:r>
-        <w:rPr>
-          <w:b/>
-          <w:bCs/>
-        </w:rPr>
-        <w:t xml:space="preserve">without</w:t>
-      </w:r>
-      <w:r>
-        <w:rPr>
-          <w:b/>
-          <w:bCs/>
-        </w:rPr>
-        <w:t xml:space="preserve"> </w:t>
-      </w:r>
-      <w:r>
-        <w:rPr>
-          <w:b/>
-          <w:bCs/>
-        </w:rPr>
-        <w:t xml:space="preserve">scanning</w:t>
-      </w:r>
-      <w:r>
-        <w:t xml:space="preserve"> </w:t>
-      </w:r>
-      <w:r>
-        <w:t xml:space="preserve">a card.</w:t>
+        <w:t xml:space="preserve">Session ended overlay</w:t>
+      </w:r>
+      <w:r>
+        <w:t xml:space="preserve"> </w:t>
+      </w:r>
+      <w:r>
+        <w:t xml:space="preserve">— card logins are short server-side sessions (sliding</w:t>
+      </w:r>
+      <w:r>
+        <w:t xml:space="preserve"> </w:t>
+      </w:r>
+      <w:r>
+        <w:t xml:space="preserve">2 h, max 16 h; see SECURITY.md). If the session ends while the POS is open, any</w:t>
+      </w:r>
+      <w:r>
+        <w:t xml:space="preserve"> </w:t>
+      </w:r>
+      <w:r>
+        <w:t xml:space="preserve">request returning 401 (re-checked once, to ignore a stale poll) shows</w:t>
+      </w:r>
+      <w:r>
+        <w:t xml:space="preserve"> </w:t>
+      </w:r>
+      <w:r>
+        <w:rPr>
+          <w:b/>
+          <w:bCs/>
+        </w:rPr>
+        <w:t xml:space="preserve">"Session</w:t>
+      </w:r>
+      <w:r>
+        <w:rPr>
+          <w:b/>
+          <w:bCs/>
+        </w:rPr>
+        <w:t xml:space="preserve"> </w:t>
+      </w:r>
+      <w:r>
+        <w:rPr>
+          <w:b/>
+          <w:bCs/>
+        </w:rPr>
+        <w:t xml:space="preserve">ended — tap a bartender card"</w:t>
+      </w:r>
+      <w:r>
+        <w:t xml:space="preserve">; the next tap signs in again in place and keeps</w:t>
+      </w:r>
+      <w:r>
+        <w:t xml:space="preserve"> </w:t>
+      </w:r>
+      <w:r>
+        <w:t xml:space="preserve">the cart and selected member. A confirm that hit the ended session says "Not</w:t>
+      </w:r>
+      <w:r>
+        <w:t xml:space="preserve"> </w:t>
+      </w:r>
+      <w:r>
+        <w:t xml:space="preserve">charged — please confirm again".</w:t>
       </w:r>
     </w:p>
     <w:p>
@@ -23615,6 +23809,77 @@
           <w:b/>
           <w:bCs/>
         </w:rPr>
+        <w:t xml:space="preserve">Bottom (left column)</w:t>
+      </w:r>
+      <w:r>
+        <w:t xml:space="preserve"> </w:t>
+      </w:r>
+      <w:r>
+        <w:t xml:space="preserve">—</w:t>
+      </w:r>
+      <w:r>
+        <w:t xml:space="preserve"> </w:t>
+      </w:r>
+      <w:r>
+        <w:rPr>
+          <w:b/>
+          <w:bCs/>
+        </w:rPr>
+        <w:t xml:space="preserve">Regulars</w:t>
+      </w:r>
+      <w:r>
+        <w:t xml:space="preserve">: large circular buttons of members who</w:t>
+      </w:r>
+      <w:r>
+        <w:t xml:space="preserve"> </w:t>
+      </w:r>
+      <w:r>
+        <w:t xml:space="preserve">have ordered at this borrel, most orders first. Tap one to charge them</w:t>
+      </w:r>
+      <w:r>
+        <w:t xml:space="preserve"> </w:t>
+      </w:r>
+      <w:r>
+        <w:rPr>
+          <w:b/>
+          <w:bCs/>
+        </w:rPr>
+        <w:t xml:space="preserve">without</w:t>
+      </w:r>
+      <w:r>
+        <w:rPr>
+          <w:b/>
+          <w:bCs/>
+        </w:rPr>
+        <w:t xml:space="preserve"> </w:t>
+      </w:r>
+      <w:r>
+        <w:rPr>
+          <w:b/>
+          <w:bCs/>
+        </w:rPr>
+        <w:t xml:space="preserve">scanning</w:t>
+      </w:r>
+      <w:r>
+        <w:t xml:space="preserve"> </w:t>
+      </w:r>
+      <w:r>
+        <w:t xml:space="preserve">a card.</w:t>
+      </w:r>
+    </w:p>
+    <w:p>
+      <w:pPr>
+        <w:pStyle w:val="Compact"/>
+        <w:numPr>
+          <w:ilvl w:val="0"/>
+          <w:numId w:val="1043"/>
+        </w:numPr>
+      </w:pPr>
+      <w:r>
+        <w:rPr>
+          <w:b/>
+          <w:bCs/>
+        </w:rPr>
         <w:t xml:space="preserve">History tab</w:t>
       </w:r>
       <w:r>
@@ -24023,7 +24288,7 @@
         <w:t xml:space="preserve">query, same as the kiosk.</w:t>
       </w:r>
     </w:p>
-    <w:bookmarkStart w:id="139" w:name="android-phone-as-an-nfc-kiosk-modenfc"/>
+    <w:bookmarkStart w:id="140" w:name="android-phone-as-an-nfc-kiosk-modenfc"/>
     <w:p>
       <w:pPr>
         <w:pStyle w:val="Heading3"/>
@@ -24188,7 +24453,7 @@
       <w:r>
         <w:t xml:space="preserve"> </w:t>
       </w:r>
-      <w:hyperlink r:id="rId110">
+      <w:hyperlink r:id="rId111">
         <w:r>
           <w:rPr>
             <w:rStyle w:val="Hyperlink"/>
@@ -24720,7 +24985,7 @@
       <w:r>
         <w:t xml:space="preserve"> </w:t>
       </w:r>
-      <w:hyperlink r:id="rId138">
+      <w:hyperlink r:id="rId139">
         <w:r>
           <w:rPr>
             <w:rStyle w:val="Hyperlink"/>
@@ -24732,9 +24997,9 @@
         <w:t xml:space="preserve">.</w:t>
       </w:r>
     </w:p>
-    <w:bookmarkEnd w:id="139"/>
     <w:bookmarkEnd w:id="140"/>
-    <w:bookmarkStart w:id="147" w:name="pricing--discounts"/>
+    <w:bookmarkEnd w:id="141"/>
+    <w:bookmarkStart w:id="148" w:name="pricing--discounts"/>
     <w:p>
       <w:pPr>
         <w:pStyle w:val="Heading2"/>
@@ -24796,7 +25061,7 @@
         <w:t xml:space="preserve">— the client never sets prices.</w:t>
       </w:r>
     </w:p>
-    <w:bookmarkStart w:id="141" w:name="member-roles-memberrole"/>
+    <w:bookmarkStart w:id="142" w:name="member-roles-memberrole"/>
     <w:p>
       <w:pPr>
         <w:pStyle w:val="Heading3"/>
@@ -25037,8 +25302,8 @@
         <w:t xml:space="preserve">.</w:t>
       </w:r>
     </w:p>
-    <w:bookmarkEnd w:id="141"/>
-    <w:bookmarkStart w:id="142" w:name="Xdc2cc5689f60cdecc95c97ccb849e07d18c3f1b"/>
+    <w:bookmarkEnd w:id="142"/>
+    <w:bookmarkStart w:id="143" w:name="Xdc2cc5689f60cdecc95c97ccb849e07d18c3f1b"/>
     <w:p>
       <w:pPr>
         <w:pStyle w:val="Heading3"/>
@@ -25100,8 +25365,8 @@
         <w:t xml:space="preserve">(so an already-discounted drink doesn't also get €0.75 off).</w:t>
       </w:r>
     </w:p>
-    <w:bookmarkEnd w:id="142"/>
-    <w:bookmarkStart w:id="143" w:name="Xda7dac18422d7a5f8c5c30b94cce3929299f78b"/>
+    <w:bookmarkEnd w:id="143"/>
+    <w:bookmarkStart w:id="144" w:name="Xda7dac18422d7a5f8c5c30b94cce3929299f78b"/>
     <w:p>
       <w:pPr>
         <w:pStyle w:val="Heading3"/>
@@ -25171,8 +25436,8 @@
         <w:t xml:space="preserve">percentage role discounts apply on top.</w:t>
       </w:r>
     </w:p>
-    <w:bookmarkEnd w:id="143"/>
-    <w:bookmarkStart w:id="144" w:name="X52d93846910a4db1f279ccfc2712d1574c029da"/>
+    <w:bookmarkEnd w:id="144"/>
+    <w:bookmarkStart w:id="145" w:name="X52d93846910a4db1f279ccfc2712d1574c029da"/>
     <w:p>
       <w:pPr>
         <w:pStyle w:val="Heading3"/>
@@ -25297,8 +25562,8 @@
         <w:t xml:space="preserve">price  = base − bestRoleDiscount(base, roles, ignoreFixed = isSpecial)   (never &lt; 0)</w:t>
       </w:r>
     </w:p>
-    <w:bookmarkEnd w:id="144"/>
-    <w:bookmarkStart w:id="145" w:name="discount-reporting-budget-per-borrel"/>
+    <w:bookmarkEnd w:id="145"/>
+    <w:bookmarkStart w:id="146" w:name="discount-reporting-budget-per-borrel"/>
     <w:p>
       <w:pPr>
         <w:pStyle w:val="Heading3"/>
@@ -25460,8 +25725,8 @@
         <w:t xml:space="preserve">— everything (specials + roles/free drinks): Σ (list − charged) × qty.</w:t>
       </w:r>
     </w:p>
-    <w:bookmarkEnd w:id="145"/>
-    <w:bookmarkStart w:id="146" w:name="Xf0315f0e6993867b2a2e5e20e7c16d85903a818"/>
+    <w:bookmarkEnd w:id="146"/>
+    <w:bookmarkStart w:id="147" w:name="Xf0315f0e6993867b2a2e5e20e7c16d85903a818"/>
     <w:p>
       <w:pPr>
         <w:pStyle w:val="Heading3"/>
@@ -25717,9 +25982,9 @@
         <w:t xml:space="preserve">of bartender-free lines (with the free-drink count).</w:t>
       </w:r>
     </w:p>
-    <w:bookmarkEnd w:id="146"/>
     <w:bookmarkEnd w:id="147"/>
-    <w:bookmarkStart w:id="148" w:name="bartender-accounts"/>
+    <w:bookmarkEnd w:id="148"/>
+    <w:bookmarkStart w:id="149" w:name="bartender-accounts"/>
     <w:p>
       <w:pPr>
         <w:pStyle w:val="Heading2"/>
@@ -26004,8 +26269,8 @@
         <w:t xml:space="preserve">rate-limited (it's a convenience, weaker than the password).</w:t>
       </w:r>
     </w:p>
-    <w:bookmarkEnd w:id="148"/>
-    <w:bookmarkStart w:id="149" w:name="sbz-prices-cost-of-goods"/>
+    <w:bookmarkEnd w:id="149"/>
+    <w:bookmarkStart w:id="150" w:name="sbz-prices-cost-of-goods"/>
     <w:p>
       <w:pPr>
         <w:pStyle w:val="Heading2"/>
@@ -26490,8 +26755,8 @@
         <w:t xml:space="preserve">valid on that borrel's date; the page names which list applies.</w:t>
       </w:r>
     </w:p>
-    <w:bookmarkEnd w:id="149"/>
-    <w:bookmarkStart w:id="150" w:name="admin-pages-adminppp"/>
+    <w:bookmarkEnd w:id="150"/>
+    <w:bookmarkStart w:id="151" w:name="admin-pages-adminppp"/>
     <w:p>
       <w:pPr>
         <w:pStyle w:val="Heading2"/>
@@ -27403,8 +27668,8 @@
         <w:t xml:space="preserve">a toggle picker per member).</w:t>
       </w:r>
     </w:p>
-    <w:bookmarkEnd w:id="150"/>
-    <w:bookmarkStart w:id="151" w:name="activity-profitloss"/>
+    <w:bookmarkEnd w:id="151"/>
+    <w:bookmarkStart w:id="152" w:name="activity-profitloss"/>
     <w:p>
       <w:pPr>
         <w:pStyle w:val="Heading2"/>
@@ -28124,8 +28389,8 @@
         <w:t xml:space="preserve">late refund.</w:t>
       </w:r>
     </w:p>
-    <w:bookmarkEnd w:id="151"/>
-    <w:bookmarkStart w:id="152" w:name="congressus"/>
+    <w:bookmarkEnd w:id="152"/>
+    <w:bookmarkStart w:id="153" w:name="congressus"/>
     <w:p>
       <w:pPr>
         <w:pStyle w:val="Heading2"/>
@@ -28490,8 +28755,8 @@
         <w:t xml:space="preserve">the Mendix fallback for lines without an offer id.</w:t>
       </w:r>
     </w:p>
-    <w:bookmarkEnd w:id="152"/>
-    <w:bookmarkStart w:id="153" w:name="alexia-integration-scheduled-borrels"/>
+    <w:bookmarkEnd w:id="153"/>
+    <w:bookmarkStart w:id="154" w:name="alexia-integration-scheduled-borrels"/>
     <w:p>
       <w:pPr>
         <w:pStyle w:val="Heading2"/>
@@ -28983,8 +29248,8 @@
         <w:t xml:space="preserve">).</w:t>
       </w:r>
     </w:p>
-    <w:bookmarkEnd w:id="153"/>
-    <w:bookmarkStart w:id="155" w:name="data-model-ppp"/>
+    <w:bookmarkEnd w:id="154"/>
+    <w:bookmarkStart w:id="156" w:name="data-model-ppp"/>
     <w:p>
       <w:pPr>
         <w:pStyle w:val="Heading2"/>
@@ -29003,7 +29268,7 @@
       <w:r>
         <w:t xml:space="preserve"> </w:t>
       </w:r>
-      <w:hyperlink r:id="rId154">
+      <w:hyperlink r:id="rId155">
         <w:r>
           <w:rPr>
             <w:rStyle w:val="Hyperlink"/>
@@ -29582,8 +29847,8 @@
         <w:t xml:space="preserve">unchanged for identity.</w:t>
       </w:r>
     </w:p>
-    <w:bookmarkEnd w:id="155"/>
-    <w:bookmarkStart w:id="156" w:name="api-reference-ppp"/>
+    <w:bookmarkEnd w:id="156"/>
+    <w:bookmarkStart w:id="157" w:name="api-reference-ppp"/>
     <w:p>
       <w:pPr>
         <w:pStyle w:val="Heading2"/>
@@ -30598,8 +30863,8 @@
         <w:t xml:space="preserve">.</w:t>
       </w:r>
     </w:p>
-    <w:bookmarkEnd w:id="156"/>
-    <w:bookmarkStart w:id="157" w:name="environment"/>
+    <w:bookmarkEnd w:id="157"/>
+    <w:bookmarkStart w:id="158" w:name="environment"/>
     <w:p>
       <w:pPr>
         <w:pStyle w:val="Heading2"/>
@@ -31018,9 +31283,9 @@
         <w:br w:type="page"/>
       </w:r>
     </w:p>
-    <w:bookmarkEnd w:id="157"/>
     <w:bookmarkEnd w:id="158"/>
-    <w:bookmarkStart w:id="172" w:name="security-model"/>
+    <w:bookmarkEnd w:id="159"/>
+    <w:bookmarkStart w:id="175" w:name="security-model"/>
     <w:p>
       <w:pPr>
         <w:pStyle w:val="Heading1"/>
@@ -31073,7 +31338,7 @@
         <w:t xml:space="preserve">trade-offs made for a shared, physical kiosk.</w:t>
       </w:r>
     </w:p>
-    <w:bookmarkStart w:id="162" w:name="authentication--authorisation"/>
+    <w:bookmarkStart w:id="164" w:name="authentication--authorisation"/>
     <w:p>
       <w:pPr>
         <w:pStyle w:val="Heading2"/>
@@ -31082,7 +31347,7 @@
         <w:t xml:space="preserve">Authentication &amp; authorisation</w:t>
       </w:r>
     </w:p>
-    <w:bookmarkStart w:id="159" w:name="admin"/>
+    <w:bookmarkStart w:id="160" w:name="admin"/>
     <w:p>
       <w:pPr>
         <w:pStyle w:val="Heading3"/>
@@ -31122,6 +31387,34 @@
         <w:t xml:space="preserve">httpOnly</w:t>
       </w:r>
       <w:r>
+        <w:t xml:space="preserve">,</w:t>
+      </w:r>
+      <w:r>
+        <w:t xml:space="preserve"> </w:t>
+      </w:r>
+      <w:r>
+        <w:rPr>
+          <w:b/>
+          <w:bCs/>
+        </w:rPr>
+        <w:t xml:space="preserve">Secure</w:t>
+      </w:r>
+      <w:r>
+        <w:t xml:space="preserve"> </w:t>
+      </w:r>
+      <w:r>
+        <w:t xml:space="preserve">(in production),</w:t>
+      </w:r>
+      <w:r>
+        <w:t xml:space="preserve"> </w:t>
+      </w:r>
+      <w:r>
+        <w:rPr>
+          <w:rStyle w:val="VerbatimChar"/>
+        </w:rPr>
+        <w:t xml:space="preserve">SameSite=Lax</w:t>
+      </w:r>
+      <w:r>
         <w:t xml:space="preserve"> </w:t>
       </w:r>
       <w:r>
@@ -31134,7 +31427,13 @@
         <w:t xml:space="preserve"> </w:t>
       </w:r>
       <w:r>
-        <w:t xml:space="preserve">cookie (7-day</w:t>
+        <w:t xml:space="preserve">cookie</w:t>
+      </w:r>
+      <w:r>
+        <w:t xml:space="preserve"> </w:t>
+      </w:r>
+      <w:r>
+        <w:t xml:space="preserve">(7-day</w:t>
       </w:r>
       <w:r>
         <w:t xml:space="preserve"> </w:t>
@@ -31149,7 +31448,61 @@
         <w:t xml:space="preserve"> </w:t>
       </w:r>
       <w:r>
-        <w:t xml:space="preserve">row).</w:t>
+        <w:t xml:space="preserve">row,</w:t>
+      </w:r>
+      <w:r>
+        <w:t xml:space="preserve"> </w:t>
+      </w:r>
+      <w:r>
+        <w:rPr>
+          <w:rStyle w:val="VerbatimChar"/>
+        </w:rPr>
+        <w:t xml:space="preserve">kind: "password"</w:t>
+      </w:r>
+      <w:r>
+        <w:t xml:space="preserve">). All logins go through</w:t>
+      </w:r>
+      <w:r>
+        <w:t xml:space="preserve"> </w:t>
+      </w:r>
+      <w:r>
+        <w:rPr>
+          <w:rStyle w:val="VerbatimChar"/>
+        </w:rPr>
+        <w:t xml:space="preserve">createSession()</w:t>
+      </w:r>
+      <w:r>
+        <w:t xml:space="preserve"> </w:t>
+      </w:r>
+      <w:r>
+        <w:t xml:space="preserve">/</w:t>
+      </w:r>
+      <w:r>
+        <w:t xml:space="preserve"> </w:t>
+      </w:r>
+      <w:r>
+        <w:rPr>
+          <w:rStyle w:val="VerbatimChar"/>
+        </w:rPr>
+        <w:t xml:space="preserve">setSessionCookie()</w:t>
+      </w:r>
+      <w:r>
+        <w:t xml:space="preserve"> </w:t>
+      </w:r>
+      <w:r>
+        <w:t xml:space="preserve">in</w:t>
+      </w:r>
+      <w:r>
+        <w:t xml:space="preserve"> </w:t>
+      </w:r>
+      <w:r>
+        <w:rPr>
+          <w:rStyle w:val="VerbatimChar"/>
+        </w:rPr>
+        <w:t xml:space="preserve">src/lib/auth.ts</w:t>
+      </w:r>
+      <w:r>
+        <w:t xml:space="preserve">.</w:t>
       </w:r>
     </w:p>
     <w:p>
@@ -31364,14 +31717,14 @@
         <w:t xml:space="preserve">by the handler).</w:t>
       </w:r>
     </w:p>
-    <w:bookmarkEnd w:id="159"/>
-    <w:bookmarkStart w:id="160" w:name="shop-members"/>
+    <w:bookmarkEnd w:id="160"/>
+    <w:bookmarkStart w:id="161" w:name="bar-pos-bartenders"/>
     <w:p>
       <w:pPr>
         <w:pStyle w:val="Heading3"/>
       </w:pPr>
       <w:r>
-        <w:t xml:space="preserve">Shop (members)</w:t>
+        <w:t xml:space="preserve">Bar POS (bartenders)</w:t>
       </w:r>
     </w:p>
     <w:p>
@@ -31383,66 +31736,97 @@
         </w:numPr>
       </w:pPr>
       <w:r>
-        <w:t xml:space="preserve">A</w:t>
-      </w:r>
-      <w:r>
-        <w:t xml:space="preserve"> </w:t>
-      </w:r>
-      <w:r>
-        <w:rPr>
-          <w:rStyle w:val="VerbatimChar"/>
-        </w:rPr>
-        <w:t xml:space="preserve">ShopSession</w:t>
-      </w:r>
-      <w:r>
-        <w:t xml:space="preserve"> </w:t>
-      </w:r>
-      <w:r>
-        <w:t xml:space="preserve">token (random cuid) is created only by a</w:t>
-      </w:r>
-      <w:r>
-        <w:t xml:space="preserve"> </w:t>
-      </w:r>
-      <w:r>
-        <w:rPr>
-          <w:b/>
-          <w:bCs/>
-        </w:rPr>
-        <w:t xml:space="preserve">physical card tap</w:t>
-      </w:r>
-      <w:r>
-        <w:t xml:space="preserve"> </w:t>
-      </w:r>
-      <w:r>
-        <w:t xml:space="preserve">or an admin's</w:t>
-      </w:r>
-      <w:r>
-        <w:t xml:space="preserve"> </w:t>
-      </w:r>
-      <w:r>
-        <w:rPr>
-          <w:b/>
-          <w:bCs/>
-        </w:rPr>
-        <w:t xml:space="preserve">Enter store</w:t>
-      </w:r>
-      <w:r>
-        <w:t xml:space="preserve">. It lives in the</w:t>
-      </w:r>
-      <w:r>
-        <w:t xml:space="preserve"> </w:t>
-      </w:r>
-      <w:r>
-        <w:rPr>
-          <w:rStyle w:val="VerbatimChar"/>
-        </w:rPr>
-        <w:t xml:space="preserve">/shop/&lt;token&gt;</w:t>
-      </w:r>
-      <w:r>
-        <w:t xml:space="preserve"> </w:t>
-      </w:r>
-      <w:r>
-        <w:t xml:space="preserve">URL.</w:t>
+        <w:rPr>
+          <w:b/>
+          <w:bCs/>
+        </w:rPr>
+        <w:t xml:space="preserve">Card login</w:t>
+      </w:r>
+      <w:r>
+        <w:t xml:space="preserve"> </w:t>
+      </w:r>
+      <w:r>
+        <w:t xml:space="preserve">(</w:t>
+      </w:r>
+      <w:r>
+        <w:rPr>
+          <w:rStyle w:val="VerbatimChar"/>
+        </w:rPr>
+        <w:t xml:space="preserve">POST /api/auth/card-login</w:t>
+      </w:r>
+      <w:r>
+        <w:t xml:space="preserve">) creates a short</w:t>
+      </w:r>
+      <w:r>
+        <w:t xml:space="preserve"> </w:t>
+      </w:r>
+      <w:r>
+        <w:rPr>
+          <w:rStyle w:val="VerbatimChar"/>
+        </w:rPr>
+        <w:t xml:space="preserve">kind: "card"</w:t>
+      </w:r>
+      <w:r>
+        <w:t xml:space="preserve"> </w:t>
+      </w:r>
+      <w:r>
+        <w:t xml:space="preserve">session:</w:t>
+      </w:r>
+      <w:r>
+        <w:t xml:space="preserve"> </w:t>
+      </w:r>
+      <w:r>
+        <w:rPr>
+          <w:b/>
+          <w:bCs/>
+        </w:rPr>
+        <w:t xml:space="preserve">sliding 2 h</w:t>
+      </w:r>
+      <w:r>
+        <w:t xml:space="preserve"> </w:t>
+      </w:r>
+      <w:r>
+        <w:t xml:space="preserve">— each request extends it (the open POS polls every</w:t>
+      </w:r>
+      <w:r>
+        <w:t xml:space="preserve"> </w:t>
+      </w:r>
+      <w:r>
+        <w:t xml:space="preserve">10 s, so it stays alive while in use) — and</w:t>
+      </w:r>
+      <w:r>
+        <w:t xml:space="preserve"> </w:t>
+      </w:r>
+      <w:r>
+        <w:rPr>
+          <w:b/>
+          <w:bCs/>
+        </w:rPr>
+        <w:t xml:space="preserve">never longer than 16 h</w:t>
+      </w:r>
+      <w:r>
+        <w:t xml:space="preserve"> </w:t>
+      </w:r>
+      <w:r>
+        <w:t xml:space="preserve">after the</w:t>
+      </w:r>
+      <w:r>
+        <w:t xml:space="preserve"> </w:t>
+      </w:r>
+      <w:r>
+        <w:t xml:space="preserve">tap. A card login therefore can't linger on the shared bar PC into the next</w:t>
+      </w:r>
+      <w:r>
+        <w:t xml:space="preserve"> </w:t>
+      </w:r>
+      <w:r>
+        <w:t xml:space="preserve">borrel. (Before this, all sessions lasted 7 days, so last week's login expired</w:t>
+      </w:r>
+      <w:r>
+        <w:t xml:space="preserve"> </w:t>
+      </w:r>
+      <w:r>
+        <w:t xml:space="preserve">in the middle of the next weekly borrel, making charges fail with "Unauthorized".)</w:t>
       </w:r>
     </w:p>
     <w:p>
@@ -31454,31 +31838,40 @@
         </w:numPr>
       </w:pPr>
       <w:r>
-        <w:rPr>
-          <w:rStyle w:val="VerbatimChar"/>
-        </w:rPr>
-        <w:t xml:space="preserve">/api/cart</w:t>
-      </w:r>
-      <w:r>
-        <w:t xml:space="preserve"> </w:t>
-      </w:r>
-      <w:r>
-        <w:t xml:space="preserve">and</w:t>
-      </w:r>
-      <w:r>
-        <w:t xml:space="preserve"> </w:t>
-      </w:r>
-      <w:r>
-        <w:rPr>
-          <w:rStyle w:val="VerbatimChar"/>
-        </w:rPr>
-        <w:t xml:space="preserve">/api/orders/confirm</w:t>
-      </w:r>
-      <w:r>
-        <w:t xml:space="preserve"> </w:t>
-      </w:r>
-      <w:r>
-        <w:t xml:space="preserve">require a valid, unexpired token.</w:t>
+        <w:t xml:space="preserve">When the session ends while the POS is open, the POS shows</w:t>
+      </w:r>
+      <w:r>
+        <w:t xml:space="preserve"> </w:t>
+      </w:r>
+      <w:r>
+        <w:rPr>
+          <w:b/>
+          <w:bCs/>
+        </w:rPr>
+        <w:t xml:space="preserve">"Session ended — tap</w:t>
+      </w:r>
+      <w:r>
+        <w:rPr>
+          <w:b/>
+          <w:bCs/>
+        </w:rPr>
+        <w:t xml:space="preserve"> </w:t>
+      </w:r>
+      <w:r>
+        <w:rPr>
+          <w:b/>
+          <w:bCs/>
+        </w:rPr>
+        <w:t xml:space="preserve">a bartender card"</w:t>
+      </w:r>
+      <w:r>
+        <w:t xml:space="preserve">; the next tap signs in again in place, keeping the cart and</w:t>
+      </w:r>
+      <w:r>
+        <w:t xml:space="preserve"> </w:t>
+      </w:r>
+      <w:r>
+        <w:t xml:space="preserve">selected member. A fresh page load with an ended session redirects to the login.</w:t>
       </w:r>
     </w:p>
     <w:p>
@@ -31490,73 +31883,17 @@
         </w:numPr>
       </w:pPr>
       <w:r>
-        <w:t xml:space="preserve">The member's first name is returned</w:t>
-      </w:r>
-      <w:r>
-        <w:t xml:space="preserve"> </w:t>
-      </w:r>
-      <w:r>
-        <w:rPr>
-          <w:b/>
-          <w:bCs/>
-        </w:rPr>
-        <w:t xml:space="preserve">only</w:t>
-      </w:r>
-      <w:r>
-        <w:t xml:space="preserve"> </w:t>
-      </w:r>
-      <w:r>
-        <w:t xml:space="preserve">by the token-scoped cart endpoint —</w:t>
-      </w:r>
-      <w:r>
-        <w:t xml:space="preserve"> </w:t>
-      </w:r>
-      <w:r>
-        <w:t xml:space="preserve">never by the public scan endpoint.</w:t>
-      </w:r>
-    </w:p>
-    <w:p>
-      <w:pPr>
-        <w:pStyle w:val="Compact"/>
-        <w:numPr>
-          <w:ilvl w:val="0"/>
-          <w:numId w:val="1056"/>
-        </w:numPr>
-      </w:pPr>
-      <w:r>
-        <w:rPr>
-          <w:b/>
-          <w:bCs/>
-        </w:rPr>
-        <w:t xml:space="preserve">Idle auto-reset:</w:t>
-      </w:r>
-      <w:r>
-        <w:t xml:space="preserve"> </w:t>
-      </w:r>
-      <w:r>
-        <w:t xml:space="preserve">the shop page deletes the session and returns to the tap</w:t>
-      </w:r>
-      <w:r>
-        <w:t xml:space="preserve"> </w:t>
-      </w:r>
-      <w:r>
-        <w:t xml:space="preserve">screen after ~60 s of inactivity (with a 15 s warning), so a member who walks</w:t>
-      </w:r>
-      <w:r>
-        <w:t xml:space="preserve"> </w:t>
-      </w:r>
-      <w:r>
-        <w:t xml:space="preserve">away can't leave their account open for the next person.</w:t>
-      </w:r>
-    </w:p>
-    <w:bookmarkEnd w:id="160"/>
-    <w:bookmarkStart w:id="161" w:name="card-verification"/>
+        <w:t xml:space="preserve">Plus the client-side idle sign-out after 1 h without orders (see PPP.md).</w:t>
+      </w:r>
+    </w:p>
+    <w:bookmarkEnd w:id="161"/>
+    <w:bookmarkStart w:id="162" w:name="shop-members"/>
     <w:p>
       <w:pPr>
         <w:pStyle w:val="Heading3"/>
       </w:pPr>
       <w:r>
-        <w:t xml:space="preserve">Card verification</w:t>
+        <w:t xml:space="preserve">Shop (members)</w:t>
       </w:r>
     </w:p>
     <w:p>
@@ -31568,16 +31905,66 @@
         </w:numPr>
       </w:pPr>
       <w:r>
-        <w:rPr>
-          <w:rStyle w:val="VerbatimChar"/>
-        </w:rPr>
-        <w:t xml:space="preserve">CardRegistration</w:t>
-      </w:r>
-      <w:r>
-        <w:t xml:space="preserve"> </w:t>
-      </w:r>
-      <w:r>
-        <w:t xml:space="preserve">tokens are single-use and expire in 15 minutes.</w:t>
+        <w:t xml:space="preserve">A</w:t>
+      </w:r>
+      <w:r>
+        <w:t xml:space="preserve"> </w:t>
+      </w:r>
+      <w:r>
+        <w:rPr>
+          <w:rStyle w:val="VerbatimChar"/>
+        </w:rPr>
+        <w:t xml:space="preserve">ShopSession</w:t>
+      </w:r>
+      <w:r>
+        <w:t xml:space="preserve"> </w:t>
+      </w:r>
+      <w:r>
+        <w:t xml:space="preserve">token (random cuid) is created only by a</w:t>
+      </w:r>
+      <w:r>
+        <w:t xml:space="preserve"> </w:t>
+      </w:r>
+      <w:r>
+        <w:rPr>
+          <w:b/>
+          <w:bCs/>
+        </w:rPr>
+        <w:t xml:space="preserve">physical card tap</w:t>
+      </w:r>
+      <w:r>
+        <w:t xml:space="preserve"> </w:t>
+      </w:r>
+      <w:r>
+        <w:t xml:space="preserve">or an admin's</w:t>
+      </w:r>
+      <w:r>
+        <w:t xml:space="preserve"> </w:t>
+      </w:r>
+      <w:r>
+        <w:rPr>
+          <w:b/>
+          <w:bCs/>
+        </w:rPr>
+        <w:t xml:space="preserve">Enter store</w:t>
+      </w:r>
+      <w:r>
+        <w:t xml:space="preserve">. It lives in the</w:t>
+      </w:r>
+      <w:r>
+        <w:t xml:space="preserve"> </w:t>
+      </w:r>
+      <w:r>
+        <w:rPr>
+          <w:rStyle w:val="VerbatimChar"/>
+        </w:rPr>
+        <w:t xml:space="preserve">/shop/&lt;token&gt;</w:t>
+      </w:r>
+      <w:r>
+        <w:t xml:space="preserve"> </w:t>
+      </w:r>
+      <w:r>
+        <w:t xml:space="preserve">URL.</w:t>
       </w:r>
     </w:p>
     <w:p>
@@ -31590,6 +31977,141 @@
       </w:pPr>
       <w:r>
         <w:rPr>
+          <w:rStyle w:val="VerbatimChar"/>
+        </w:rPr>
+        <w:t xml:space="preserve">/api/cart</w:t>
+      </w:r>
+      <w:r>
+        <w:t xml:space="preserve"> </w:t>
+      </w:r>
+      <w:r>
+        <w:t xml:space="preserve">and</w:t>
+      </w:r>
+      <w:r>
+        <w:t xml:space="preserve"> </w:t>
+      </w:r>
+      <w:r>
+        <w:rPr>
+          <w:rStyle w:val="VerbatimChar"/>
+        </w:rPr>
+        <w:t xml:space="preserve">/api/orders/confirm</w:t>
+      </w:r>
+      <w:r>
+        <w:t xml:space="preserve"> </w:t>
+      </w:r>
+      <w:r>
+        <w:t xml:space="preserve">require a valid, unexpired token.</w:t>
+      </w:r>
+    </w:p>
+    <w:p>
+      <w:pPr>
+        <w:pStyle w:val="Compact"/>
+        <w:numPr>
+          <w:ilvl w:val="0"/>
+          <w:numId w:val="1057"/>
+        </w:numPr>
+      </w:pPr>
+      <w:r>
+        <w:t xml:space="preserve">The member's first name is returned</w:t>
+      </w:r>
+      <w:r>
+        <w:t xml:space="preserve"> </w:t>
+      </w:r>
+      <w:r>
+        <w:rPr>
+          <w:b/>
+          <w:bCs/>
+        </w:rPr>
+        <w:t xml:space="preserve">only</w:t>
+      </w:r>
+      <w:r>
+        <w:t xml:space="preserve"> </w:t>
+      </w:r>
+      <w:r>
+        <w:t xml:space="preserve">by the token-scoped cart endpoint —</w:t>
+      </w:r>
+      <w:r>
+        <w:t xml:space="preserve"> </w:t>
+      </w:r>
+      <w:r>
+        <w:t xml:space="preserve">never by the public scan endpoint.</w:t>
+      </w:r>
+    </w:p>
+    <w:p>
+      <w:pPr>
+        <w:pStyle w:val="Compact"/>
+        <w:numPr>
+          <w:ilvl w:val="0"/>
+          <w:numId w:val="1057"/>
+        </w:numPr>
+      </w:pPr>
+      <w:r>
+        <w:rPr>
+          <w:b/>
+          <w:bCs/>
+        </w:rPr>
+        <w:t xml:space="preserve">Idle auto-reset:</w:t>
+      </w:r>
+      <w:r>
+        <w:t xml:space="preserve"> </w:t>
+      </w:r>
+      <w:r>
+        <w:t xml:space="preserve">the shop page deletes the session and returns to the tap</w:t>
+      </w:r>
+      <w:r>
+        <w:t xml:space="preserve"> </w:t>
+      </w:r>
+      <w:r>
+        <w:t xml:space="preserve">screen after ~60 s of inactivity (with a 15 s warning), so a member who walks</w:t>
+      </w:r>
+      <w:r>
+        <w:t xml:space="preserve"> </w:t>
+      </w:r>
+      <w:r>
+        <w:t xml:space="preserve">away can't leave their account open for the next person.</w:t>
+      </w:r>
+    </w:p>
+    <w:bookmarkEnd w:id="162"/>
+    <w:bookmarkStart w:id="163" w:name="card-verification"/>
+    <w:p>
+      <w:pPr>
+        <w:pStyle w:val="Heading3"/>
+      </w:pPr>
+      <w:r>
+        <w:t xml:space="preserve">Card verification</w:t>
+      </w:r>
+    </w:p>
+    <w:p>
+      <w:pPr>
+        <w:pStyle w:val="Compact"/>
+        <w:numPr>
+          <w:ilvl w:val="0"/>
+          <w:numId w:val="1058"/>
+        </w:numPr>
+      </w:pPr>
+      <w:r>
+        <w:rPr>
+          <w:rStyle w:val="VerbatimChar"/>
+        </w:rPr>
+        <w:t xml:space="preserve">CardRegistration</w:t>
+      </w:r>
+      <w:r>
+        <w:t xml:space="preserve"> </w:t>
+      </w:r>
+      <w:r>
+        <w:t xml:space="preserve">tokens are single-use and expire in 15 minutes.</w:t>
+      </w:r>
+    </w:p>
+    <w:p>
+      <w:pPr>
+        <w:pStyle w:val="Compact"/>
+        <w:numPr>
+          <w:ilvl w:val="0"/>
+          <w:numId w:val="1058"/>
+        </w:numPr>
+      </w:pPr>
+      <w:r>
+        <w:rPr>
           <w:b/>
           <w:bCs/>
         </w:rPr>
@@ -31636,9 +32158,9 @@
         <w:t xml:space="preserve">member clicked.</w:t>
       </w:r>
     </w:p>
-    <w:bookmarkEnd w:id="161"/>
-    <w:bookmarkEnd w:id="162"/>
-    <w:bookmarkStart w:id="163" w:name="X77f42a2852d9dd86410b0545fad3e0fbb180833"/>
+    <w:bookmarkEnd w:id="163"/>
+    <w:bookmarkEnd w:id="164"/>
+    <w:bookmarkStart w:id="165" w:name="X77f42a2852d9dd86410b0545fad3e0fbb180833"/>
     <w:p>
       <w:pPr>
         <w:pStyle w:val="Heading2"/>
@@ -31852,8 +32374,8 @@
         </w:tc>
       </w:tr>
     </w:tbl>
-    <w:bookmarkEnd w:id="163"/>
-    <w:bookmarkStart w:id="164" w:name="rate-limiting"/>
+    <w:bookmarkEnd w:id="165"/>
+    <w:bookmarkStart w:id="166" w:name="rate-limiting"/>
     <w:p>
       <w:pPr>
         <w:pStyle w:val="Heading2"/>
@@ -31948,330 +32470,14 @@
         <w:t xml:space="preserve">a shared store (e.g. Redis).</w:t>
       </w:r>
     </w:p>
-    <w:bookmarkEnd w:id="164"/>
-    <w:bookmarkStart w:id="165" w:name="injection--output-safety"/>
+    <w:bookmarkEnd w:id="166"/>
+    <w:bookmarkStart w:id="167" w:name="injection--output-safety"/>
     <w:p>
       <w:pPr>
         <w:pStyle w:val="Heading2"/>
       </w:pPr>
       <w:r>
         <w:t xml:space="preserve">Injection &amp; output safety</w:t>
-      </w:r>
-    </w:p>
-    <w:p>
-      <w:pPr>
-        <w:pStyle w:val="Compact"/>
-        <w:numPr>
-          <w:ilvl w:val="0"/>
-          <w:numId w:val="1058"/>
-        </w:numPr>
-      </w:pPr>
-      <w:r>
-        <w:t xml:space="preserve">React escapes all interpolated values in the kiosk/shop/admin pages.</w:t>
-      </w:r>
-    </w:p>
-    <w:p>
-      <w:pPr>
-        <w:pStyle w:val="Compact"/>
-        <w:numPr>
-          <w:ilvl w:val="0"/>
-          <w:numId w:val="1058"/>
-        </w:numPr>
-      </w:pPr>
-      <w:r>
-        <w:t xml:space="preserve">The card-verify pages are</w:t>
-      </w:r>
-      <w:r>
-        <w:t xml:space="preserve"> </w:t>
-      </w:r>
-      <w:r>
-        <w:rPr>
-          <w:b/>
-          <w:bCs/>
-        </w:rPr>
-        <w:t xml:space="preserve">hand-built HTML</w:t>
-      </w:r>
-      <w:r>
-        <w:t xml:space="preserve">, so member names and tokens are</w:t>
-      </w:r>
-      <w:r>
-        <w:t xml:space="preserve"> </w:t>
-      </w:r>
-      <w:r>
-        <w:t xml:space="preserve">passed through</w:t>
-      </w:r>
-      <w:r>
-        <w:t xml:space="preserve"> </w:t>
-      </w:r>
-      <w:r>
-        <w:rPr>
-          <w:rStyle w:val="VerbatimChar"/>
-        </w:rPr>
-        <w:t xml:space="preserve">escapeHtml()</w:t>
-      </w:r>
-      <w:r>
-        <w:t xml:space="preserve"> </w:t>
-      </w:r>
-      <w:r>
-        <w:t xml:space="preserve">before interpolation (prevents stored XSS from a</w:t>
-      </w:r>
-      <w:r>
-        <w:t xml:space="preserve"> </w:t>
-      </w:r>
-      <w:r>
-        <w:t xml:space="preserve">name synced out of Congressus).</w:t>
-      </w:r>
-    </w:p>
-    <w:p>
-      <w:pPr>
-        <w:pStyle w:val="Compact"/>
-        <w:numPr>
-          <w:ilvl w:val="0"/>
-          <w:numId w:val="1058"/>
-        </w:numPr>
-      </w:pPr>
-      <w:r>
-        <w:t xml:space="preserve">Those pages declare</w:t>
-      </w:r>
-      <w:r>
-        <w:t xml:space="preserve"> </w:t>
-      </w:r>
-      <w:r>
-        <w:rPr>
-          <w:rStyle w:val="VerbatimChar"/>
-        </w:rPr>
-        <w:t xml:space="preserve">charset=utf-8</w:t>
-      </w:r>
-      <w:r>
-        <w:t xml:space="preserve"> </w:t>
-      </w:r>
-      <w:r>
-        <w:t xml:space="preserve">(header + meta) so emoji/diacritics render</w:t>
-      </w:r>
-      <w:r>
-        <w:t xml:space="preserve"> </w:t>
-      </w:r>
-      <w:r>
-        <w:t xml:space="preserve">correctly.</w:t>
-      </w:r>
-    </w:p>
-    <w:bookmarkEnd w:id="165"/>
-    <w:bookmarkStart w:id="169" w:name="deliberate-trade-offs"/>
-    <w:p>
-      <w:pPr>
-        <w:pStyle w:val="Heading2"/>
-      </w:pPr>
-      <w:r>
-        <w:t xml:space="preserve">Deliberate trade-offs</w:t>
-      </w:r>
-    </w:p>
-    <w:bookmarkStart w:id="166" w:name="card-uids-arent-secret"/>
-    <w:p>
-      <w:pPr>
-        <w:pStyle w:val="Heading3"/>
-      </w:pPr>
-      <w:r>
-        <w:t xml:space="preserve">Card UIDs aren't secret</w:t>
-      </w:r>
-    </w:p>
-    <w:p>
-      <w:pPr>
-        <w:pStyle w:val="FirstParagraph"/>
-      </w:pPr>
-      <w:r>
-        <w:t xml:space="preserve">Any NFC reader can read a card UID, and the scan endpoint is necessarily</w:t>
-      </w:r>
-      <w:r>
-        <w:t xml:space="preserve"> </w:t>
-      </w:r>
-      <w:r>
-        <w:t xml:space="preserve">unauthenticated (the kiosk is a public web page). Mitigations: the scan endpoint</w:t>
-      </w:r>
-      <w:r>
-        <w:t xml:space="preserve"> </w:t>
-      </w:r>
-      <w:r>
-        <w:t xml:space="preserve">returns no member data and is rate-limited. For stronger protection, restrict</w:t>
-      </w:r>
-      <w:r>
-        <w:t xml:space="preserve"> </w:t>
-      </w:r>
-      <w:r>
-        <w:rPr>
-          <w:rStyle w:val="VerbatimChar"/>
-        </w:rPr>
-        <w:t xml:space="preserve">/api/card/scan</w:t>
-      </w:r>
-      <w:r>
-        <w:t xml:space="preserve"> </w:t>
-      </w:r>
-      <w:r>
-        <w:t xml:space="preserve">to the kiosk's IP at the network layer.</w:t>
-      </w:r>
-    </w:p>
-    <w:bookmarkEnd w:id="166"/>
-    <w:bookmarkStart w:id="167" w:name="email-not-found-vs-enumeration"/>
-    <w:p>
-      <w:pPr>
-        <w:pStyle w:val="Heading3"/>
-      </w:pPr>
-      <w:r>
-        <w:t xml:space="preserve">"Email not found" vs enumeration</w:t>
-      </w:r>
-    </w:p>
-    <w:p>
-      <w:pPr>
-        <w:pStyle w:val="FirstParagraph"/>
-      </w:pPr>
-      <w:r>
-        <w:t xml:space="preserve">The card-registration flow tells a user when their email matches no member</w:t>
-      </w:r>
-      <w:r>
-        <w:t xml:space="preserve"> </w:t>
-      </w:r>
-      <w:r>
-        <w:t xml:space="preserve">("Email not found"). This</w:t>
-      </w:r>
-      <w:r>
-        <w:t xml:space="preserve"> </w:t>
-      </w:r>
-      <w:r>
-        <w:rPr>
-          <w:b/>
-          <w:bCs/>
-        </w:rPr>
-        <w:t xml:space="preserve">re-introduces some email-enumeration ability</w:t>
-      </w:r>
-      <w:r>
-        <w:t xml:space="preserve"> </w:t>
-      </w:r>
-      <w:r>
-        <w:t xml:space="preserve">that a</w:t>
-      </w:r>
-      <w:r>
-        <w:t xml:space="preserve"> </w:t>
-      </w:r>
-      <w:r>
-        <w:t xml:space="preserve">uniform response would prevent. It was a conscious product choice: confused</w:t>
-      </w:r>
-      <w:r>
-        <w:t xml:space="preserve"> </w:t>
-      </w:r>
-      <w:r>
-        <w:t xml:space="preserve">members not knowing why nothing happened is a real problem at a kiosk, the kiosk</w:t>
-      </w:r>
-      <w:r>
-        <w:t xml:space="preserve"> </w:t>
-      </w:r>
-      <w:r>
-        <w:t xml:space="preserve">is physical, and the endpoint is rate-limited. If enumeration resistance becomes</w:t>
-      </w:r>
-      <w:r>
-        <w:t xml:space="preserve"> </w:t>
-      </w:r>
-      <w:r>
-        <w:t xml:space="preserve">more important than this UX, revert</w:t>
-      </w:r>
-      <w:r>
-        <w:t xml:space="preserve"> </w:t>
-      </w:r>
-      <w:r>
-        <w:rPr>
-          <w:rStyle w:val="VerbatimChar"/>
-        </w:rPr>
-        <w:t xml:space="preserve">card/register</w:t>
-      </w:r>
-      <w:r>
-        <w:t xml:space="preserve"> </w:t>
-      </w:r>
-      <w:r>
-        <w:t xml:space="preserve">to a uniform</w:t>
-      </w:r>
-      <w:r>
-        <w:t xml:space="preserve"> </w:t>
-      </w:r>
-      <w:r>
-        <w:rPr>
-          <w:rStyle w:val="VerbatimChar"/>
-        </w:rPr>
-        <w:t xml:space="preserve">{ ok: true }</w:t>
-      </w:r>
-      <w:r>
-        <w:t xml:space="preserve">.</w:t>
-      </w:r>
-    </w:p>
-    <w:bookmarkEnd w:id="167"/>
-    <w:bookmarkStart w:id="168" w:name="shop-token-is-a-bearer-token-in-the-url"/>
-    <w:p>
-      <w:pPr>
-        <w:pStyle w:val="Heading3"/>
-      </w:pPr>
-      <w:r>
-        <w:t xml:space="preserve">Shop token is a bearer token in the URL</w:t>
-      </w:r>
-    </w:p>
-    <w:p>
-      <w:pPr>
-        <w:pStyle w:val="FirstParagraph"/>
-      </w:pPr>
-      <w:r>
-        <w:t xml:space="preserve">Anyone holding a live</w:t>
-      </w:r>
-      <w:r>
-        <w:t xml:space="preserve"> </w:t>
-      </w:r>
-      <w:r>
-        <w:rPr>
-          <w:rStyle w:val="VerbatimChar"/>
-        </w:rPr>
-        <w:t xml:space="preserve">/shop/&lt;token&gt;</w:t>
-      </w:r>
-      <w:r>
-        <w:t xml:space="preserve"> </w:t>
-      </w:r>
-      <w:r>
-        <w:t xml:space="preserve">URL can act as that member until it expires</w:t>
-      </w:r>
-      <w:r>
-        <w:t xml:space="preserve"> </w:t>
-      </w:r>
-      <w:r>
-        <w:t xml:space="preserve">(10 min) or the order is confirmed. Tokens are random and per-tap (a new one each</w:t>
-      </w:r>
-      <w:r>
-        <w:t xml:space="preserve"> </w:t>
-      </w:r>
-      <w:r>
-        <w:t xml:space="preserve">scan), so they can't be guessed or reused. The idle auto-reset and short lifetime</w:t>
-      </w:r>
-      <w:r>
-        <w:t xml:space="preserve"> </w:t>
-      </w:r>
-      <w:r>
-        <w:t xml:space="preserve">bound the exposure. Stronger options (not currently implemented): move the token</w:t>
-      </w:r>
-      <w:r>
-        <w:t xml:space="preserve"> </w:t>
-      </w:r>
-      <w:r>
-        <w:t xml:space="preserve">into an httpOnly cookie so it can't be shared via URL, or use a crypto-random</w:t>
-      </w:r>
-      <w:r>
-        <w:t xml:space="preserve"> </w:t>
-      </w:r>
-      <w:r>
-        <w:t xml:space="preserve">token instead of a cuid.</w:t>
-      </w:r>
-    </w:p>
-    <w:bookmarkEnd w:id="168"/>
-    <w:bookmarkEnd w:id="169"/>
-    <w:bookmarkStart w:id="170" w:name="prohibited--careful-operations"/>
-    <w:p>
-      <w:pPr>
-        <w:pStyle w:val="Heading2"/>
-      </w:pPr>
-      <w:r>
-        <w:t xml:space="preserve">Prohibited / careful operations</w:t>
       </w:r>
     </w:p>
     <w:p>
@@ -32283,17 +32489,7 @@
         </w:numPr>
       </w:pPr>
       <w:r>
-        <w:rPr>
-          <w:b/>
-          <w:bCs/>
-        </w:rPr>
-        <w:t xml:space="preserve">Member deletion</w:t>
-      </w:r>
-      <w:r>
-        <w:t xml:space="preserve"> </w:t>
-      </w:r>
-      <w:r>
-        <w:t xml:space="preserve">is blocked while invoices exist.</w:t>
+        <w:t xml:space="preserve">React escapes all interpolated values in the kiosk/shop/admin pages.</w:t>
       </w:r>
     </w:p>
     <w:p>
@@ -32305,38 +32501,47 @@
         </w:numPr>
       </w:pPr>
       <w:r>
-        <w:rPr>
-          <w:b/>
-          <w:bCs/>
-        </w:rPr>
-        <w:t xml:space="preserve">Invoice edit/delete</w:t>
-      </w:r>
-      <w:r>
-        <w:t xml:space="preserve"> </w:t>
-      </w:r>
-      <w:r>
-        <w:t xml:space="preserve">is blocked once an invoice is</w:t>
-      </w:r>
-      <w:r>
-        <w:t xml:space="preserve"> </w:t>
-      </w:r>
-      <w:r>
-        <w:rPr>
-          <w:rStyle w:val="VerbatimChar"/>
-        </w:rPr>
-        <w:t xml:space="preserve">EXPORTED</w:t>
-      </w:r>
-      <w:r>
-        <w:t xml:space="preserve"> </w:t>
-      </w:r>
-      <w:r>
-        <w:t xml:space="preserve">(already billed</w:t>
-      </w:r>
-      <w:r>
-        <w:t xml:space="preserve"> </w:t>
-      </w:r>
-      <w:r>
-        <w:t xml:space="preserve">in Congressus).</w:t>
+        <w:t xml:space="preserve">The card-verify pages are</w:t>
+      </w:r>
+      <w:r>
+        <w:t xml:space="preserve"> </w:t>
+      </w:r>
+      <w:r>
+        <w:rPr>
+          <w:b/>
+          <w:bCs/>
+        </w:rPr>
+        <w:t xml:space="preserve">hand-built HTML</w:t>
+      </w:r>
+      <w:r>
+        <w:t xml:space="preserve">, so member names and tokens are</w:t>
+      </w:r>
+      <w:r>
+        <w:t xml:space="preserve"> </w:t>
+      </w:r>
+      <w:r>
+        <w:t xml:space="preserve">passed through</w:t>
+      </w:r>
+      <w:r>
+        <w:t xml:space="preserve"> </w:t>
+      </w:r>
+      <w:r>
+        <w:rPr>
+          <w:rStyle w:val="VerbatimChar"/>
+        </w:rPr>
+        <w:t xml:space="preserve">escapeHtml()</w:t>
+      </w:r>
+      <w:r>
+        <w:t xml:space="preserve"> </w:t>
+      </w:r>
+      <w:r>
+        <w:t xml:space="preserve">before interpolation (prevents stored XSS from a</w:t>
+      </w:r>
+      <w:r>
+        <w:t xml:space="preserve"> </w:t>
+      </w:r>
+      <w:r>
+        <w:t xml:space="preserve">name synced out of Congressus).</w:t>
       </w:r>
     </w:p>
     <w:p>
@@ -32348,67 +32553,642 @@
         </w:numPr>
       </w:pPr>
       <w:r>
-        <w:rPr>
-          <w:b/>
-          <w:bCs/>
-        </w:rPr>
-        <w:t xml:space="preserve">Bulk invoice clearing</w:t>
-      </w:r>
-      <w:r>
-        <w:t xml:space="preserve"> </w:t>
-      </w:r>
-      <w:r>
-        <w:t xml:space="preserve">requires a double confirmation in the UI and is</w:t>
-      </w:r>
-      <w:r>
-        <w:t xml:space="preserve"> </w:t>
-      </w:r>
-      <w:r>
-        <w:t xml:space="preserve">intended for test-data cleanup only.</w:t>
+        <w:t xml:space="preserve">Those pages declare</w:t>
+      </w:r>
+      <w:r>
+        <w:t xml:space="preserve"> </w:t>
+      </w:r>
+      <w:r>
+        <w:rPr>
+          <w:rStyle w:val="VerbatimChar"/>
+        </w:rPr>
+        <w:t xml:space="preserve">charset=utf-8</w:t>
+      </w:r>
+      <w:r>
+        <w:t xml:space="preserve"> </w:t>
+      </w:r>
+      <w:r>
+        <w:t xml:space="preserve">(header + meta) so emoji/diacritics render</w:t>
+      </w:r>
+      <w:r>
+        <w:t xml:space="preserve"> </w:t>
+      </w:r>
+      <w:r>
+        <w:t xml:space="preserve">correctly.</w:t>
+      </w:r>
+    </w:p>
+    <w:bookmarkEnd w:id="167"/>
+    <w:bookmarkStart w:id="168" w:name="http-security-headers"/>
+    <w:p>
+      <w:pPr>
+        <w:pStyle w:val="Heading2"/>
+      </w:pPr>
+      <w:r>
+        <w:t xml:space="preserve">HTTP security headers</w:t>
+      </w:r>
+    </w:p>
+    <w:p>
+      <w:pPr>
+        <w:pStyle w:val="FirstParagraph"/>
+      </w:pPr>
+      <w:r>
+        <w:t xml:space="preserve">Set for every response in</w:t>
+      </w:r>
+      <w:r>
+        <w:t xml:space="preserve"> </w:t>
+      </w:r>
+      <w:r>
+        <w:rPr>
+          <w:rStyle w:val="VerbatimChar"/>
+        </w:rPr>
+        <w:t xml:space="preserve">next.config.ts</w:t>
+      </w:r>
+      <w:r>
+        <w:t xml:space="preserve">:</w:t>
+      </w:r>
+      <w:r>
+        <w:t xml:space="preserve"> </w:t>
+      </w:r>
+      <w:r>
+        <w:rPr>
+          <w:rStyle w:val="VerbatimChar"/>
+        </w:rPr>
+        <w:t xml:space="preserve">Strict-Transport-Security</w:t>
+      </w:r>
+      <w:r>
+        <w:t xml:space="preserve"> </w:t>
+      </w:r>
+      <w:r>
+        <w:t xml:space="preserve">(1 year, includeSubDomains),</w:t>
+      </w:r>
+      <w:r>
+        <w:t xml:space="preserve"> </w:t>
+      </w:r>
+      <w:r>
+        <w:rPr>
+          <w:rStyle w:val="VerbatimChar"/>
+        </w:rPr>
+        <w:t xml:space="preserve">X-Content-Type-Options: nosniff</w:t>
+      </w:r>
+      <w:r>
+        <w:t xml:space="preserve">,</w:t>
+      </w:r>
+      <w:r>
+        <w:t xml:space="preserve"> </w:t>
+      </w:r>
+      <w:r>
+        <w:rPr>
+          <w:rStyle w:val="VerbatimChar"/>
+        </w:rPr>
+        <w:t xml:space="preserve">Referrer-Policy: strict-origin-when-cross-origin</w:t>
+      </w:r>
+      <w:r>
+        <w:t xml:space="preserve">,</w:t>
+      </w:r>
+      <w:r>
+        <w:t xml:space="preserve"> </w:t>
+      </w:r>
+      <w:r>
+        <w:rPr>
+          <w:rStyle w:val="VerbatimChar"/>
+        </w:rPr>
+        <w:t xml:space="preserve">X-Frame-Options: DENY</w:t>
+      </w:r>
+      <w:r>
+        <w:t xml:space="preserve"> </w:t>
+      </w:r>
+      <w:r>
+        <w:t xml:space="preserve">and a</w:t>
+      </w:r>
+      <w:r>
+        <w:t xml:space="preserve"> </w:t>
+      </w:r>
+      <w:r>
+        <w:t xml:space="preserve">CSP with</w:t>
+      </w:r>
+      <w:r>
+        <w:t xml:space="preserve"> </w:t>
+      </w:r>
+      <w:r>
+        <w:rPr>
+          <w:rStyle w:val="VerbatimChar"/>
+        </w:rPr>
+        <w:t xml:space="preserve">frame-ancestors 'none'; base-uri 'self'; object-src 'none'</w:t>
+      </w:r>
+      <w:r>
+        <w:t xml:space="preserve">. Token-bearing</w:t>
+      </w:r>
+      <w:r>
+        <w:t xml:space="preserve"> </w:t>
+      </w:r>
+      <w:r>
+        <w:t xml:space="preserve">routes (</w:t>
+      </w:r>
+      <w:r>
+        <w:rPr>
+          <w:rStyle w:val="VerbatimChar"/>
+        </w:rPr>
+        <w:t xml:space="preserve">/api/card/verify</w:t>
+      </w:r>
+      <w:r>
+        <w:t xml:space="preserve">,</w:t>
+      </w:r>
+      <w:r>
+        <w:t xml:space="preserve"> </w:t>
+      </w:r>
+      <w:r>
+        <w:rPr>
+          <w:rStyle w:val="VerbatimChar"/>
+        </w:rPr>
+        <w:t xml:space="preserve">/api/auth/*</w:t>
+      </w:r>
+      <w:r>
+        <w:t xml:space="preserve">,</w:t>
+      </w:r>
+      <w:r>
+        <w:t xml:space="preserve"> </w:t>
+      </w:r>
+      <w:r>
+        <w:rPr>
+          <w:rStyle w:val="VerbatimChar"/>
+        </w:rPr>
+        <w:t xml:space="preserve">/set-password</w:t>
+      </w:r>
+      <w:r>
+        <w:t xml:space="preserve">,</w:t>
+      </w:r>
+      <w:r>
+        <w:t xml:space="preserve"> </w:t>
+      </w:r>
+      <w:r>
+        <w:rPr>
+          <w:rStyle w:val="VerbatimChar"/>
+        </w:rPr>
+        <w:t xml:space="preserve">/shop/*</w:t>
+      </w:r>
+      <w:r>
+        <w:t xml:space="preserve">) add</w:t>
+      </w:r>
+      <w:r>
+        <w:t xml:space="preserve"> </w:t>
+      </w:r>
+      <w:r>
+        <w:rPr>
+          <w:rStyle w:val="VerbatimChar"/>
+        </w:rPr>
+        <w:t xml:space="preserve">Cache-Control: no-store</w:t>
+      </w:r>
+      <w:r>
+        <w:t xml:space="preserve">. (A full script CSP needs nonces for Next's inline</w:t>
+      </w:r>
+      <w:r>
+        <w:t xml:space="preserve"> </w:t>
+      </w:r>
+      <w:r>
+        <w:t xml:space="preserve">scripts — not done yet.)</w:t>
+      </w:r>
+    </w:p>
+    <w:bookmarkEnd w:id="168"/>
+    <w:bookmarkStart w:id="172" w:name="deliberate-trade-offs"/>
+    <w:p>
+      <w:pPr>
+        <w:pStyle w:val="Heading2"/>
+      </w:pPr>
+      <w:r>
+        <w:t xml:space="preserve">Deliberate trade-offs</w:t>
+      </w:r>
+    </w:p>
+    <w:bookmarkStart w:id="169" w:name="card-uids-arent-secret"/>
+    <w:p>
+      <w:pPr>
+        <w:pStyle w:val="Heading3"/>
+      </w:pPr>
+      <w:r>
+        <w:t xml:space="preserve">Card UIDs aren't secret</w:t>
+      </w:r>
+    </w:p>
+    <w:p>
+      <w:pPr>
+        <w:pStyle w:val="FirstParagraph"/>
+      </w:pPr>
+      <w:r>
+        <w:t xml:space="preserve">Any NFC reader can read a card UID, and the scan endpoint is necessarily</w:t>
+      </w:r>
+      <w:r>
+        <w:t xml:space="preserve"> </w:t>
+      </w:r>
+      <w:r>
+        <w:t xml:space="preserve">unauthenticated (the kiosk is a public web page). Mitigations: the scan endpoint</w:t>
+      </w:r>
+      <w:r>
+        <w:t xml:space="preserve"> </w:t>
+      </w:r>
+      <w:r>
+        <w:t xml:space="preserve">returns no member data and is rate-limited. For stronger protection, restrict</w:t>
+      </w:r>
+      <w:r>
+        <w:t xml:space="preserve"> </w:t>
+      </w:r>
+      <w:r>
+        <w:rPr>
+          <w:rStyle w:val="VerbatimChar"/>
+        </w:rPr>
+        <w:t xml:space="preserve">/api/card/scan</w:t>
+      </w:r>
+      <w:r>
+        <w:t xml:space="preserve"> </w:t>
+      </w:r>
+      <w:r>
+        <w:t xml:space="preserve">to the kiosk's IP at the network layer.</w:t>
+      </w:r>
+    </w:p>
+    <w:bookmarkEnd w:id="169"/>
+    <w:bookmarkStart w:id="170" w:name="email-not-found-vs-enumeration"/>
+    <w:p>
+      <w:pPr>
+        <w:pStyle w:val="Heading3"/>
+      </w:pPr>
+      <w:r>
+        <w:t xml:space="preserve">"Email not found" vs enumeration</w:t>
+      </w:r>
+    </w:p>
+    <w:p>
+      <w:pPr>
+        <w:pStyle w:val="FirstParagraph"/>
+      </w:pPr>
+      <w:r>
+        <w:t xml:space="preserve">The card-registration flow tells a user when their email matches no member</w:t>
+      </w:r>
+      <w:r>
+        <w:t xml:space="preserve"> </w:t>
+      </w:r>
+      <w:r>
+        <w:t xml:space="preserve">("Email not found"). This</w:t>
+      </w:r>
+      <w:r>
+        <w:t xml:space="preserve"> </w:t>
+      </w:r>
+      <w:r>
+        <w:rPr>
+          <w:b/>
+          <w:bCs/>
+        </w:rPr>
+        <w:t xml:space="preserve">re-introduces some email-enumeration ability</w:t>
+      </w:r>
+      <w:r>
+        <w:t xml:space="preserve"> </w:t>
+      </w:r>
+      <w:r>
+        <w:t xml:space="preserve">that a</w:t>
+      </w:r>
+      <w:r>
+        <w:t xml:space="preserve"> </w:t>
+      </w:r>
+      <w:r>
+        <w:t xml:space="preserve">uniform response would prevent. It was a conscious product choice: confused</w:t>
+      </w:r>
+      <w:r>
+        <w:t xml:space="preserve"> </w:t>
+      </w:r>
+      <w:r>
+        <w:t xml:space="preserve">members not knowing why nothing happened is a real problem at a kiosk, the kiosk</w:t>
+      </w:r>
+      <w:r>
+        <w:t xml:space="preserve"> </w:t>
+      </w:r>
+      <w:r>
+        <w:t xml:space="preserve">is physical, and the endpoint is rate-limited. If enumeration resistance becomes</w:t>
+      </w:r>
+      <w:r>
+        <w:t xml:space="preserve"> </w:t>
+      </w:r>
+      <w:r>
+        <w:t xml:space="preserve">more important than this UX, revert</w:t>
+      </w:r>
+      <w:r>
+        <w:t xml:space="preserve"> </w:t>
+      </w:r>
+      <w:r>
+        <w:rPr>
+          <w:rStyle w:val="VerbatimChar"/>
+        </w:rPr>
+        <w:t xml:space="preserve">card/register</w:t>
+      </w:r>
+      <w:r>
+        <w:t xml:space="preserve"> </w:t>
+      </w:r>
+      <w:r>
+        <w:t xml:space="preserve">to a uniform</w:t>
+      </w:r>
+      <w:r>
+        <w:t xml:space="preserve"> </w:t>
+      </w:r>
+      <w:r>
+        <w:rPr>
+          <w:rStyle w:val="VerbatimChar"/>
+        </w:rPr>
+        <w:t xml:space="preserve">{ ok: true }</w:t>
+      </w:r>
+      <w:r>
+        <w:t xml:space="preserve">.</w:t>
       </w:r>
     </w:p>
     <w:bookmarkEnd w:id="170"/>
-    <w:bookmarkStart w:id="171" w:name="audit-checklist"/>
+    <w:bookmarkStart w:id="171" w:name="shop-token-is-a-bearer-token-in-the-url"/>
+    <w:p>
+      <w:pPr>
+        <w:pStyle w:val="Heading3"/>
+      </w:pPr>
+      <w:r>
+        <w:t xml:space="preserve">Shop token is a bearer token in the URL</w:t>
+      </w:r>
+    </w:p>
+    <w:p>
+      <w:pPr>
+        <w:pStyle w:val="FirstParagraph"/>
+      </w:pPr>
+      <w:r>
+        <w:t xml:space="preserve">Anyone holding a live</w:t>
+      </w:r>
+      <w:r>
+        <w:t xml:space="preserve"> </w:t>
+      </w:r>
+      <w:r>
+        <w:rPr>
+          <w:rStyle w:val="VerbatimChar"/>
+        </w:rPr>
+        <w:t xml:space="preserve">/shop/&lt;token&gt;</w:t>
+      </w:r>
+      <w:r>
+        <w:t xml:space="preserve"> </w:t>
+      </w:r>
+      <w:r>
+        <w:t xml:space="preserve">URL can act as that member until it expires</w:t>
+      </w:r>
+      <w:r>
+        <w:t xml:space="preserve"> </w:t>
+      </w:r>
+      <w:r>
+        <w:t xml:space="preserve">(10 min) or the order is confirmed. Tokens are random and per-tap (a new one each</w:t>
+      </w:r>
+      <w:r>
+        <w:t xml:space="preserve"> </w:t>
+      </w:r>
+      <w:r>
+        <w:t xml:space="preserve">scan), so they can't be guessed or reused. The idle auto-reset and short lifetime</w:t>
+      </w:r>
+      <w:r>
+        <w:t xml:space="preserve"> </w:t>
+      </w:r>
+      <w:r>
+        <w:t xml:space="preserve">bound the exposure. Stronger options (not currently implemented): move the token</w:t>
+      </w:r>
+      <w:r>
+        <w:t xml:space="preserve"> </w:t>
+      </w:r>
+      <w:r>
+        <w:t xml:space="preserve">into an httpOnly cookie so it can't be shared via URL, or use a crypto-random</w:t>
+      </w:r>
+      <w:r>
+        <w:t xml:space="preserve"> </w:t>
+      </w:r>
+      <w:r>
+        <w:t xml:space="preserve">token instead of a cuid.</w:t>
+      </w:r>
+    </w:p>
+    <w:bookmarkEnd w:id="171"/>
+    <w:bookmarkEnd w:id="172"/>
+    <w:bookmarkStart w:id="173" w:name="prohibited--careful-operations"/>
     <w:p>
       <w:pPr>
         <w:pStyle w:val="Heading2"/>
       </w:pPr>
       <w:r>
-        <w:t xml:space="preserve">Audit checklist</w:t>
-      </w:r>
-    </w:p>
-    <w:p>
-      <w:pPr>
-        <w:pStyle w:val="FirstParagraph"/>
-      </w:pPr>
-      <w:r>
-        <w:t xml:space="preserve">When adding a new endpoint:</w:t>
-      </w:r>
-    </w:p>
-    <w:p>
-      <w:pPr>
+        <w:t xml:space="preserve">Prohibited / careful operations</w:t>
+      </w:r>
+    </w:p>
+    <w:p>
+      <w:pPr>
+        <w:pStyle w:val="Compact"/>
         <w:numPr>
           <w:ilvl w:val="0"/>
           <w:numId w:val="1060"/>
         </w:numPr>
       </w:pPr>
       <w:r>
-        <w:t xml:space="preserve">Does it touch member/admin data? → call</w:t>
-      </w:r>
-      <w:r>
-        <w:t xml:space="preserve"> </w:t>
-      </w:r>
-      <w:r>
-        <w:rPr>
-          <w:rStyle w:val="VerbatimChar"/>
-        </w:rPr>
-        <w:t xml:space="preserve">requireAdmin()</w:t>
-      </w:r>
-      <w:r>
-        <w:t xml:space="preserve"> </w:t>
-      </w:r>
-      <w:r>
-        <w:t xml:space="preserve">(admin) or validate a token (shop/registration).</w:t>
+        <w:rPr>
+          <w:b/>
+          <w:bCs/>
+        </w:rPr>
+        <w:t xml:space="preserve">Member deletion</w:t>
+      </w:r>
+      <w:r>
+        <w:t xml:space="preserve"> </w:t>
+      </w:r>
+      <w:r>
+        <w:t xml:space="preserve">is blocked while invoices exist.</w:t>
+      </w:r>
+    </w:p>
+    <w:p>
+      <w:pPr>
+        <w:pStyle w:val="Compact"/>
+        <w:numPr>
+          <w:ilvl w:val="0"/>
+          <w:numId w:val="1060"/>
+        </w:numPr>
+      </w:pPr>
+      <w:r>
+        <w:rPr>
+          <w:b/>
+          <w:bCs/>
+        </w:rPr>
+        <w:t xml:space="preserve">Invoice edit/delete</w:t>
+      </w:r>
+      <w:r>
+        <w:t xml:space="preserve"> </w:t>
+      </w:r>
+      <w:r>
+        <w:t xml:space="preserve">is blocked once an invoice is</w:t>
+      </w:r>
+      <w:r>
+        <w:t xml:space="preserve"> </w:t>
+      </w:r>
+      <w:r>
+        <w:rPr>
+          <w:rStyle w:val="VerbatimChar"/>
+        </w:rPr>
+        <w:t xml:space="preserve">EXPORTED</w:t>
+      </w:r>
+      <w:r>
+        <w:t xml:space="preserve"> </w:t>
+      </w:r>
+      <w:r>
+        <w:t xml:space="preserve">(already billed</w:t>
+      </w:r>
+      <w:r>
+        <w:t xml:space="preserve"> </w:t>
+      </w:r>
+      <w:r>
+        <w:t xml:space="preserve">in Congressus) or</w:t>
+      </w:r>
+      <w:r>
+        <w:t xml:space="preserve"> </w:t>
+      </w:r>
+      <w:r>
+        <w:rPr>
+          <w:rStyle w:val="VerbatimChar"/>
+        </w:rPr>
+        <w:t xml:space="preserve">EXPORTING</w:t>
+      </w:r>
+      <w:r>
+        <w:t xml:space="preserve">.</w:t>
+      </w:r>
+    </w:p>
+    <w:p>
+      <w:pPr>
+        <w:pStyle w:val="Compact"/>
+        <w:numPr>
+          <w:ilvl w:val="0"/>
+          <w:numId w:val="1060"/>
+        </w:numPr>
+      </w:pPr>
+      <w:r>
+        <w:rPr>
+          <w:b/>
+          <w:bCs/>
+        </w:rPr>
+        <w:t xml:space="preserve">Export is never duplicated:</w:t>
+      </w:r>
+      <w:r>
+        <w:t xml:space="preserve"> </w:t>
+      </w:r>
+      <w:r>
+        <w:t xml:space="preserve">each export run atomically claims the orders it</w:t>
+      </w:r>
+      <w:r>
+        <w:t xml:space="preserve"> </w:t>
+      </w:r>
+      <w:r>
+        <w:t xml:space="preserve">exports (</w:t>
+      </w:r>
+      <w:r>
+        <w:rPr>
+          <w:rStyle w:val="VerbatimChar"/>
+        </w:rPr>
+        <w:t xml:space="preserve">CONFIRMED → EXPORTING</w:t>
+      </w:r>
+      <w:r>
+        <w:t xml:space="preserve"> </w:t>
+      </w:r>
+      <w:r>
+        <w:t xml:space="preserve">+ run id) before calling Congressus, so a</w:t>
+      </w:r>
+      <w:r>
+        <w:t xml:space="preserve"> </w:t>
+      </w:r>
+      <w:r>
+        <w:t xml:space="preserve">concurrent run, double-click or retry can't bill them again. If the outcome is</w:t>
+      </w:r>
+      <w:r>
+        <w:t xml:space="preserve"> </w:t>
+      </w:r>
+      <w:r>
+        <w:t xml:space="preserve">unknown (timeout, 5xx, crash, DB write failure after success) the orders stay</w:t>
+      </w:r>
+      <w:r>
+        <w:t xml:space="preserve"> </w:t>
+      </w:r>
+      <w:r>
+        <w:rPr>
+          <w:rStyle w:val="VerbatimChar"/>
+        </w:rPr>
+        <w:t xml:space="preserve">EXPORTING</w:t>
+      </w:r>
+      <w:r>
+        <w:t xml:space="preserve"> </w:t>
+      </w:r>
+      <w:r>
+        <w:t xml:space="preserve">and the invoices pages show a</w:t>
+      </w:r>
+      <w:r>
+        <w:t xml:space="preserve"> </w:t>
+      </w:r>
+      <w:r>
+        <w:rPr>
+          <w:b/>
+          <w:bCs/>
+        </w:rPr>
+        <w:t xml:space="preserve">"needs check"</w:t>
+      </w:r>
+      <w:r>
+        <w:t xml:space="preserve"> </w:t>
+      </w:r>
+      <w:r>
+        <w:t xml:space="preserve">warning; an admin</w:t>
+      </w:r>
+      <w:r>
+        <w:t xml:space="preserve"> </w:t>
+      </w:r>
+      <w:r>
+        <w:t xml:space="preserve">checks Congressus and resolves them (mark exported / back to pending) — allowed</w:t>
+      </w:r>
+      <w:r>
+        <w:t xml:space="preserve"> </w:t>
+      </w:r>
+      <w:r>
+        <w:t xml:space="preserve">only 10+ minutes after the claim. A clear rejection (4xx) returns them to pending</w:t>
+      </w:r>
+      <w:r>
+        <w:t xml:space="preserve"> </w:t>
+      </w:r>
+      <w:r>
+        <w:t xml:space="preserve">automatically.</w:t>
+      </w:r>
+    </w:p>
+    <w:p>
+      <w:pPr>
+        <w:pStyle w:val="Compact"/>
+        <w:numPr>
+          <w:ilvl w:val="0"/>
+          <w:numId w:val="1060"/>
+        </w:numPr>
+      </w:pPr>
+      <w:r>
+        <w:rPr>
+          <w:b/>
+          <w:bCs/>
+        </w:rPr>
+        <w:t xml:space="preserve">Bulk invoice clearing</w:t>
+      </w:r>
+      <w:r>
+        <w:t xml:space="preserve"> </w:t>
+      </w:r>
+      <w:r>
+        <w:t xml:space="preserve">requires a double confirmation in the UI and is</w:t>
+      </w:r>
+      <w:r>
+        <w:t xml:space="preserve"> </w:t>
+      </w:r>
+      <w:r>
+        <w:t xml:space="preserve">intended for test-data cleanup only.</w:t>
+      </w:r>
+    </w:p>
+    <w:bookmarkEnd w:id="173"/>
+    <w:bookmarkStart w:id="174" w:name="audit-checklist"/>
+    <w:p>
+      <w:pPr>
+        <w:pStyle w:val="Heading2"/>
+      </w:pPr>
+      <w:r>
+        <w:t xml:space="preserve">Audit checklist</w:t>
+      </w:r>
+    </w:p>
+    <w:p>
+      <w:pPr>
+        <w:pStyle w:val="FirstParagraph"/>
+      </w:pPr>
+      <w:r>
+        <w:t xml:space="preserve">When adding a new endpoint:</w:t>
       </w:r>
     </w:p>
     <w:p>
@@ -32419,22 +33199,22 @@
         </w:numPr>
       </w:pPr>
       <w:r>
-        <w:t xml:space="preserve">Does it return more fields than the caller needs? →</w:t>
-      </w:r>
-      <w:r>
-        <w:t xml:space="preserve"> </w:t>
-      </w:r>
-      <w:r>
-        <w:rPr>
-          <w:rStyle w:val="VerbatimChar"/>
-        </w:rPr>
-        <w:t xml:space="preserve">select</w:t>
-      </w:r>
-      <w:r>
-        <w:t xml:space="preserve"> </w:t>
-      </w:r>
-      <w:r>
-        <w:t xml:space="preserve">only what's required.</w:t>
+        <w:t xml:space="preserve">Does it touch member/admin data? → call</w:t>
+      </w:r>
+      <w:r>
+        <w:t xml:space="preserve"> </w:t>
+      </w:r>
+      <w:r>
+        <w:rPr>
+          <w:rStyle w:val="VerbatimChar"/>
+        </w:rPr>
+        <w:t xml:space="preserve">requireAdmin()</w:t>
+      </w:r>
+      <w:r>
+        <w:t xml:space="preserve"> </w:t>
+      </w:r>
+      <w:r>
+        <w:t xml:space="preserve">(admin) or validate a token (shop/registration).</w:t>
       </w:r>
     </w:p>
     <w:p>
@@ -32445,7 +33225,22 @@
         </w:numPr>
       </w:pPr>
       <w:r>
-        <w:t xml:space="preserve">Is it public and write-capable or enumeration-prone? → add rate limiting.</w:t>
+        <w:t xml:space="preserve">Does it return more fields than the caller needs? →</w:t>
+      </w:r>
+      <w:r>
+        <w:t xml:space="preserve"> </w:t>
+      </w:r>
+      <w:r>
+        <w:rPr>
+          <w:rStyle w:val="VerbatimChar"/>
+        </w:rPr>
+        <w:t xml:space="preserve">select</w:t>
+      </w:r>
+      <w:r>
+        <w:t xml:space="preserve"> </w:t>
+      </w:r>
+      <w:r>
+        <w:t xml:space="preserve">only what's required.</w:t>
       </w:r>
     </w:p>
     <w:p>
@@ -32456,7 +33251,7 @@
         </w:numPr>
       </w:pPr>
       <w:r>
-        <w:t xml:space="preserve">Does it render raw HTML with external data? → escape it.</w:t>
+        <w:t xml:space="preserve">Is it public and write-capable or enumeration-prone? → add rate limiting.</w:t>
       </w:r>
     </w:p>
     <w:p>
@@ -32467,6 +33262,17 @@
         </w:numPr>
       </w:pPr>
       <w:r>
+        <w:t xml:space="preserve">Does it render raw HTML with external data? → escape it.</w:t>
+      </w:r>
+    </w:p>
+    <w:p>
+      <w:pPr>
+        <w:numPr>
+          <w:ilvl w:val="0"/>
+          <w:numId w:val="1065"/>
+        </w:numPr>
+      </w:pPr>
+      <w:r>
         <w:t xml:space="preserve">Verify at runtime: unauthenticated</w:t>
       </w:r>
       <w:r>
@@ -32486,8 +33292,8 @@
         <w:t xml:space="preserve">forged-cookie requests both get 401/redirect.</w:t>
       </w:r>
     </w:p>
-    <w:bookmarkEnd w:id="171"/>
-    <w:bookmarkEnd w:id="172"/>
+    <w:bookmarkEnd w:id="174"/>
+    <w:bookmarkEnd w:id="175"/>
     <w:sectPr>
       <w:footnotePr>
         <w:numRestart w:val="eachSect"/>
@@ -33421,7 +34227,7 @@
     <w:abstractNumId w:val="991"/>
   </w:num>
   <w:num w:numId="1060">
-    <w:abstractNumId w:val="992"/>
+    <w:abstractNumId w:val="991"/>
   </w:num>
   <w:num w:numId="1061">
     <w:abstractNumId w:val="992"/>
@@ -33433,6 +34239,9 @@
     <w:abstractNumId w:val="992"/>
   </w:num>
   <w:num w:numId="1064">
+    <w:abstractNumId w:val="992"/>
+  </w:num>
+  <w:num w:numId="1065">
     <w:abstractNumId w:val="992"/>
   </w:num>
 </w:numbering>

</xml_diff>

<commit_message>
Export SSS and PPP as one Congressus invoice per member per month
One 'Export SSS + PPP to Congressus' action (on both invoices pages) puts a
member's snacks and drinks of a month on a single invoice ('SSS & PPP
<month>'), so they get one invoice and one direct debit. Lines keep their own
Congressus products. Orders from both tables are claimed by one run; the
needs-check panel and reconcile endpoint resolve a combined invoice's SSS and
PPP orders together.

Co-Authored-By: Claude Opus 5.5 <noreply@anthropic.com>
</commit_message>
<xml_diff>
--- a/docs/SSS-Documentation.docx
+++ b/docs/SSS-Documentation.docx
@@ -3171,7 +3171,7 @@
         <w:rPr>
           <w:rStyle w:val="VerbatimChar"/>
         </w:rPr>
-        <w:t xml:space="preserve">Admin → Invoices → Export to Congressus:</w:t>
+        <w:t xml:space="preserve">Admin → Invoices → Export SSS + PPP to Congressus:</w:t>
       </w:r>
       <w:r>
         <w:br/>
@@ -3180,7 +3180,7 @@
         <w:rPr>
           <w:rStyle w:val="VerbatimChar"/>
         </w:rPr>
-        <w:t xml:space="preserve">  group CONFIRMED invoices by member × calendar month</w:t>
+        <w:t xml:space="preserve">  claim all CONFIRMED SSS + PPP orders (→ EXPORTING), group by member × month</w:t>
       </w:r>
       <w:r>
         <w:br/>
@@ -3189,7 +3189,16 @@
         <w:rPr>
           <w:rStyle w:val="VerbatimChar"/>
         </w:rPr>
-        <w:t xml:space="preserve">  → one Congressus sale-invoice per group (workflow 605, direct debit)</w:t>
+        <w:t xml:space="preserve">  → one Congressus sale-invoice per group, snacks + drinks together</w:t>
+      </w:r>
+      <w:r>
+        <w:br/>
+      </w:r>
+      <w:r>
+        <w:rPr>
+          <w:rStyle w:val="VerbatimChar"/>
+        </w:rPr>
+        <w:t xml:space="preserve">    ("SSS &amp; PPP &lt;month&gt;", workflow 605, direct debit)</w:t>
       </w:r>
       <w:r>
         <w:br/>
@@ -11869,7 +11878,23 @@
         <w:t xml:space="preserve"> </w:t>
       </w:r>
       <w:r>
-        <w:t xml:space="preserve">invoices of the scope (</w:t>
+        <w:t xml:space="preserve">SSS</w:t>
+      </w:r>
+      <w:r>
+        <w:t xml:space="preserve"> </w:t>
+      </w:r>
+      <w:r>
+        <w:rPr>
+          <w:b/>
+          <w:bCs/>
+        </w:rPr>
+        <w:t xml:space="preserve">and</w:t>
+      </w:r>
+      <w:r>
+        <w:t xml:space="preserve"> </w:t>
+      </w:r>
+      <w:r>
+        <w:t xml:space="preserve">PPP orders (</w:t>
       </w:r>
       <w:r>
         <w:rPr>
@@ -11890,7 +11915,38 @@
         <w:t xml:space="preserve"> </w:t>
       </w:r>
       <w:r>
-        <w:t xml:space="preserve">calendar month and creates one Congressus sale-invoice per group, then marks them</w:t>
+        <w:t xml:space="preserve">calendar month and creates</w:t>
+      </w:r>
+      <w:r>
+        <w:t xml:space="preserve"> </w:t>
+      </w:r>
+      <w:r>
+        <w:rPr>
+          <w:b/>
+          <w:bCs/>
+        </w:rPr>
+        <w:t xml:space="preserve">one</w:t>
+      </w:r>
+      <w:r>
+        <w:t xml:space="preserve"> </w:t>
+      </w:r>
+      <w:r>
+        <w:t xml:space="preserve">Congressus sale-invoice per group with both the</w:t>
+      </w:r>
+      <w:r>
+        <w:t xml:space="preserve"> </w:t>
+      </w:r>
+      <w:r>
+        <w:t xml:space="preserve">snack and drink lines (</w:t>
+      </w:r>
+      <w:r>
+        <w:rPr>
+          <w:rStyle w:val="VerbatimChar"/>
+        </w:rPr>
+        <w:t xml:space="preserve">"SSS &amp; PPP &lt;month&gt;"</w:t>
+      </w:r>
+      <w:r>
+        <w:t xml:space="preserve">), then marks them</w:t>
       </w:r>
       <w:r>
         <w:t xml:space="preserve"> </w:t>
@@ -11902,7 +11958,13 @@
         <w:t xml:space="preserve">EXPORTED</w:t>
       </w:r>
       <w:r>
-        <w:t xml:space="preserve">. A Congressus 4xx returns that group to</w:t>
+        <w:t xml:space="preserve">. A</w:t>
+      </w:r>
+      <w:r>
+        <w:t xml:space="preserve"> </w:t>
+      </w:r>
+      <w:r>
+        <w:t xml:space="preserve">Congressus 4xx returns that group to</w:t>
       </w:r>
       <w:r>
         <w:t xml:space="preserve"> </w:t>
@@ -11953,7 +12015,7 @@
         <w:t xml:space="preserve">needsCheck</w:t>
       </w:r>
       <w:r>
-        <w:t xml:space="preserve">.</w:t>
+        <w:t xml:space="preserve">. No body.</w:t>
       </w:r>
     </w:p>
     <w:p>
@@ -12030,6 +12092,78 @@
         <w:rPr>
           <w:rStyle w:val="DecValTok"/>
         </w:rPr>
+        <w:t xml:space="preserve">18</w:t>
+      </w:r>
+      <w:r>
+        <w:rPr>
+          <w:rStyle w:val="FunctionTok"/>
+        </w:rPr>
+        <w:t xml:space="preserve">,</w:t>
+      </w:r>
+      <w:r>
+        <w:rPr>
+          <w:rStyle w:val="NormalTok"/>
+        </w:rPr>
+        <w:t xml:space="preserve"> </w:t>
+      </w:r>
+      <w:r>
+        <w:rPr>
+          <w:rStyle w:val="DataTypeTok"/>
+        </w:rPr>
+        <w:t xml:space="preserve">"sssOrders"</w:t>
+      </w:r>
+      <w:r>
+        <w:rPr>
+          <w:rStyle w:val="FunctionTok"/>
+        </w:rPr>
+        <w:t xml:space="preserve">:</w:t>
+      </w:r>
+      <w:r>
+        <w:rPr>
+          <w:rStyle w:val="NormalTok"/>
+        </w:rPr>
+        <w:t xml:space="preserve"> </w:t>
+      </w:r>
+      <w:r>
+        <w:rPr>
+          <w:rStyle w:val="DecValTok"/>
+        </w:rPr>
+        <w:t xml:space="preserve">6</w:t>
+      </w:r>
+      <w:r>
+        <w:rPr>
+          <w:rStyle w:val="FunctionTok"/>
+        </w:rPr>
+        <w:t xml:space="preserve">,</w:t>
+      </w:r>
+      <w:r>
+        <w:rPr>
+          <w:rStyle w:val="NormalTok"/>
+        </w:rPr>
+        <w:t xml:space="preserve"> </w:t>
+      </w:r>
+      <w:r>
+        <w:rPr>
+          <w:rStyle w:val="DataTypeTok"/>
+        </w:rPr>
+        <w:t xml:space="preserve">"pppOrders"</w:t>
+      </w:r>
+      <w:r>
+        <w:rPr>
+          <w:rStyle w:val="FunctionTok"/>
+        </w:rPr>
+        <w:t xml:space="preserve">:</w:t>
+      </w:r>
+      <w:r>
+        <w:rPr>
+          <w:rStyle w:val="NormalTok"/>
+        </w:rPr>
+        <w:t xml:space="preserve"> </w:t>
+      </w:r>
+      <w:r>
+        <w:rPr>
+          <w:rStyle w:val="DecValTok"/>
+        </w:rPr>
         <w:t xml:space="preserve">12</w:t>
       </w:r>
       <w:r>
@@ -12066,7 +12200,7 @@
         <w:rPr>
           <w:rStyle w:val="DecValTok"/>
         </w:rPr>
-        <w:t xml:space="preserve">3</w:t>
+        <w:t xml:space="preserve">5</w:t>
       </w:r>
       <w:r>
         <w:rPr>
@@ -12237,10 +12371,19 @@
         <w:rPr>
           <w:rStyle w:val="VerbatimChar"/>
         </w:rPr>
-        <w:t xml:space="preserve">{ system: "sss"|"ppp", ids: [...], action: "exported"|"pending", congressusInvoiceId? }</w:t>
-      </w:r>
-      <w:r>
-        <w:t xml:space="preserve">.</w:t>
+        <w:t xml:space="preserve">{ sssIds: [...], pppIds: [...], action: "exported"|"pending", congressusInvoiceId? }</w:t>
+      </w:r>
+      <w:r>
+        <w:t xml:space="preserve"> </w:t>
+      </w:r>
+      <w:r>
+        <w:t xml:space="preserve">—</w:t>
+      </w:r>
+      <w:r>
+        <w:t xml:space="preserve"> </w:t>
+      </w:r>
+      <w:r>
+        <w:t xml:space="preserve">a combined invoice's SSS and PPP orders are resolved together.</w:t>
       </w:r>
       <w:r>
         <w:t xml:space="preserve"> </w:t>
@@ -18943,17 +19086,23 @@
         <w:t xml:space="preserve">webshop/ppp</w:t>
       </w:r>
       <w:r>
-        <w:t xml:space="preserve">), and the export produces a</w:t>
-      </w:r>
-      <w:r>
-        <w:t xml:space="preserve"> </w:t>
-      </w:r>
-      <w:r>
-        <w:rPr>
-          <w:b/>
-          <w:bCs/>
-        </w:rPr>
-        <w:t xml:space="preserve">separate</w:t>
+        <w:t xml:space="preserve">). The export puts a member's</w:t>
+      </w:r>
+      <w:r>
+        <w:t xml:space="preserve"> </w:t>
+      </w:r>
+      <w:r>
+        <w:t xml:space="preserve">snacks AND drinks of a month on</w:t>
+      </w:r>
+      <w:r>
+        <w:t xml:space="preserve"> </w:t>
+      </w:r>
+      <w:r>
+        <w:rPr>
+          <w:b/>
+          <w:bCs/>
+        </w:rPr>
+        <w:t xml:space="preserve">one</w:t>
       </w:r>
       <w:r>
         <w:t xml:space="preserve"> </w:t>
@@ -18965,10 +19114,16 @@
         <w:rPr>
           <w:rStyle w:val="VerbatimChar"/>
         </w:rPr>
-        <w:t xml:space="preserve">"PPP &lt;month&gt;"</w:t>
-      </w:r>
-      <w:r>
-        <w:t xml:space="preserve">) — see below.</w:t>
+        <w:t xml:space="preserve">"SSS &amp; PPP &lt;month&gt;"</w:t>
+      </w:r>
+      <w:r>
+        <w:t xml:space="preserve">)</w:t>
+      </w:r>
+      <w:r>
+        <w:t xml:space="preserve"> </w:t>
+      </w:r>
+      <w:r>
+        <w:t xml:space="preserve">— see below.</w:t>
       </w:r>
     </w:p>
     <w:bookmarkStart w:id="121" w:name="members-congressus--sss"/>
@@ -19471,10 +19626,13 @@
         <w:rPr>
           <w:rStyle w:val="VerbatimChar"/>
         </w:rPr>
-        <w:t xml:space="preserve">Invoices → Export to Congressus</w:t>
-      </w:r>
-      <w:r>
-        <w:t xml:space="preserve">:</w:t>
+        <w:t xml:space="preserve">Invoices → Export SSS + PPP to Congressus</w:t>
+      </w:r>
+      <w:r>
+        <w:t xml:space="preserve"> </w:t>
+      </w:r>
+      <w:r>
+        <w:t xml:space="preserve">(same action on both invoices pages):</w:t>
       </w:r>
     </w:p>
     <w:p>
@@ -19486,7 +19644,7 @@
         </w:numPr>
       </w:pPr>
       <w:r>
-        <w:t xml:space="preserve">Group all</w:t>
+        <w:t xml:space="preserve">Claim and group all</w:t>
       </w:r>
       <w:r>
         <w:t xml:space="preserve"> </w:t>
@@ -19501,20 +19659,53 @@
         <w:t xml:space="preserve"> </w:t>
       </w:r>
       <w:r>
-        <w:t xml:space="preserve">invoices by</w:t>
-      </w:r>
-      <w:r>
-        <w:t xml:space="preserve"> </w:t>
-      </w:r>
-      <w:r>
-        <w:rPr>
-          <w:b/>
-          <w:bCs/>
-        </w:rPr>
-        <w:t xml:space="preserve">member × calendar month</w:t>
-      </w:r>
-      <w:r>
-        <w:t xml:space="preserve">.</w:t>
+        <w:t xml:space="preserve">SSS</w:t>
+      </w:r>
+      <w:r>
+        <w:t xml:space="preserve"> </w:t>
+      </w:r>
+      <w:r>
+        <w:rPr>
+          <w:b/>
+          <w:bCs/>
+        </w:rPr>
+        <w:t xml:space="preserve">and</w:t>
+      </w:r>
+      <w:r>
+        <w:t xml:space="preserve"> </w:t>
+      </w:r>
+      <w:r>
+        <w:t xml:space="preserve">PPP orders by</w:t>
+      </w:r>
+      <w:r>
+        <w:t xml:space="preserve"> </w:t>
+      </w:r>
+      <w:r>
+        <w:rPr>
+          <w:b/>
+          <w:bCs/>
+        </w:rPr>
+        <w:t xml:space="preserve">member × calendar</w:t>
+      </w:r>
+      <w:r>
+        <w:rPr>
+          <w:b/>
+          <w:bCs/>
+        </w:rPr>
+        <w:t xml:space="preserve"> </w:t>
+      </w:r>
+      <w:r>
+        <w:rPr>
+          <w:b/>
+          <w:bCs/>
+        </w:rPr>
+        <w:t xml:space="preserve">month</w:t>
+      </w:r>
+      <w:r>
+        <w:t xml:space="preserve"> </w:t>
+      </w:r>
+      <w:r>
+        <w:t xml:space="preserve">(see SECURITY.md for the duplicate-proof claim).</w:t>
       </w:r>
     </w:p>
     <w:p>
@@ -19580,13 +19771,19 @@
         <w:rPr>
           <w:rStyle w:val="VerbatimChar"/>
         </w:rPr>
-        <w:t xml:space="preserve">invoice_reference: "SSS &lt;month&gt; &lt;year&gt;"</w:t>
-      </w:r>
-      <w:r>
-        <w:t xml:space="preserve"> </w:t>
-      </w:r>
-      <w:r>
-        <w:t xml:space="preserve">(Dutch locale, e.g. "SSS juni 2026")</w:t>
+        <w:t xml:space="preserve">invoice_reference: "SSS &amp; PPP &lt;month&gt; &lt;year&gt;"</w:t>
+      </w:r>
+      <w:r>
+        <w:t xml:space="preserve"> </w:t>
+      </w:r>
+      <w:r>
+        <w:t xml:space="preserve">(Dutch locale, e.g.</w:t>
+      </w:r>
+      <w:r>
+        <w:t xml:space="preserve"> </w:t>
+      </w:r>
+      <w:r>
+        <w:t xml:space="preserve">"SSS &amp; PPP juni 2026") — snack and drink lines on the same invoice</w:t>
       </w:r>
     </w:p>
     <w:p>
@@ -20266,7 +20463,7 @@
           <w:b/>
           <w:bCs/>
         </w:rPr>
-        <w:t xml:space="preserve">Two separate invoices</w:t>
+        <w:t xml:space="preserve">One combined invoice</w:t>
       </w:r>
       <w:r>
         <w:t xml:space="preserve"> </w:t>
@@ -20281,40 +20478,19 @@
         <w:rPr>
           <w:rStyle w:val="VerbatimChar"/>
         </w:rPr>
-        <w:t xml:space="preserve">POST /api/admin/invoices/export { scope }</w:t>
-      </w:r>
-      <w:r>
-        <w:t xml:space="preserve"> </w:t>
-      </w:r>
-      <w:r>
-        <w:t xml:space="preserve">(</w:t>
-      </w:r>
-      <w:r>
-        <w:rPr>
-          <w:rStyle w:val="VerbatimChar"/>
-        </w:rPr>
-        <w:t xml:space="preserve">sss</w:t>
-      </w:r>
-      <w:r>
-        <w:t xml:space="preserve">|</w:t>
-      </w:r>
-      <w:r>
-        <w:rPr>
-          <w:rStyle w:val="VerbatimChar"/>
-        </w:rPr>
-        <w:t xml:space="preserve">ppp</w:t>
-      </w:r>
-      <w:r>
-        <w:t xml:space="preserve">|</w:t>
-      </w:r>
-      <w:r>
-        <w:rPr>
-          <w:rStyle w:val="VerbatimChar"/>
-        </w:rPr>
-        <w:t xml:space="preserve">all</w:t>
-      </w:r>
-      <w:r>
-        <w:t xml:space="preserve">) groups</w:t>
+        <w:t xml:space="preserve">POST /api/admin/invoices/export</w:t>
+      </w:r>
+      <w:r>
+        <w:t xml:space="preserve"> </w:t>
+      </w:r>
+      <w:r>
+        <w:t xml:space="preserve">(from either</w:t>
+      </w:r>
+      <w:r>
+        <w:t xml:space="preserve"> </w:t>
+      </w:r>
+      <w:r>
+        <w:t xml:space="preserve">invoices page, "Export SSS + PPP to Congressus") groups ALL</w:t>
       </w:r>
       <w:r>
         <w:t xml:space="preserve"> </w:t>
@@ -20329,86 +20505,59 @@
         <w:t xml:space="preserve"> </w:t>
       </w:r>
       <w:r>
-        <w:t xml:space="preserve">invoices by member × month and creates one</w:t>
-      </w:r>
-      <w:r>
-        <w:t xml:space="preserve"> </w:t>
-      </w:r>
-      <w:r>
-        <w:t xml:space="preserve">Congressus sale-invoice per group</w:t>
-      </w:r>
-      <w:r>
-        <w:t xml:space="preserve"> </w:t>
-      </w:r>
-      <w:r>
-        <w:rPr>
-          <w:b/>
-          <w:bCs/>
-        </w:rPr>
-        <w:t xml:space="preserve">per system</w:t>
-      </w:r>
-      <w:r>
-        <w:t xml:space="preserve">:</w:t>
-      </w:r>
-      <w:r>
-        <w:t xml:space="preserve"> </w:t>
-      </w:r>
-      <w:r>
-        <w:rPr>
-          <w:rStyle w:val="VerbatimChar"/>
-        </w:rPr>
-        <w:t xml:space="preserve">"SSS &lt;month&gt;"</w:t>
-      </w:r>
-      <w:r>
-        <w:t xml:space="preserve"> </w:t>
-      </w:r>
-      <w:r>
-        <w:t xml:space="preserve">from</w:t>
-      </w:r>
-      <w:r>
-        <w:t xml:space="preserve"> </w:t>
-      </w:r>
-      <w:r>
-        <w:rPr>
-          <w:rStyle w:val="VerbatimChar"/>
-        </w:rPr>
-        <w:t xml:space="preserve">SaleInvoice</w:t>
-      </w:r>
-      <w:r>
-        <w:t xml:space="preserve">,</w:t>
-      </w:r>
-      <w:r>
-        <w:t xml:space="preserve"> </w:t>
-      </w:r>
-      <w:r>
-        <w:rPr>
-          <w:rStyle w:val="VerbatimChar"/>
-        </w:rPr>
-        <w:t xml:space="preserve">"PPP &lt;month&gt;"</w:t>
-      </w:r>
-      <w:r>
-        <w:t xml:space="preserve"> </w:t>
-      </w:r>
-      <w:r>
-        <w:t xml:space="preserve">from</w:t>
-      </w:r>
-      <w:r>
-        <w:t xml:space="preserve"> </w:t>
-      </w:r>
-      <w:r>
-        <w:rPr>
-          <w:rStyle w:val="VerbatimChar"/>
-        </w:rPr>
-        <w:t xml:space="preserve">PppInvoice</w:t>
-      </w:r>
-      <w:r>
-        <w:t xml:space="preserve">. PPP line descriptions append the</w:t>
-      </w:r>
-      <w:r>
-        <w:t xml:space="preserve"> </w:t>
-      </w:r>
-      <w:r>
-        <w:t xml:space="preserve">activity name (</w:t>
+        <w:t xml:space="preserve">SSS and</w:t>
+      </w:r>
+      <w:r>
+        <w:t xml:space="preserve"> </w:t>
+      </w:r>
+      <w:r>
+        <w:t xml:space="preserve">PPP orders by member × month and creates</w:t>
+      </w:r>
+      <w:r>
+        <w:t xml:space="preserve"> </w:t>
+      </w:r>
+      <w:r>
+        <w:rPr>
+          <w:b/>
+          <w:bCs/>
+        </w:rPr>
+        <w:t xml:space="preserve">one</w:t>
+      </w:r>
+      <w:r>
+        <w:t xml:space="preserve"> </w:t>
+      </w:r>
+      <w:r>
+        <w:t xml:space="preserve">Congressus sale-invoice per group,</w:t>
+      </w:r>
+      <w:r>
+        <w:t xml:space="preserve"> </w:t>
+      </w:r>
+      <w:r>
+        <w:t xml:space="preserve">reference</w:t>
+      </w:r>
+      <w:r>
+        <w:t xml:space="preserve"> </w:t>
+      </w:r>
+      <w:r>
+        <w:rPr>
+          <w:rStyle w:val="VerbatimChar"/>
+        </w:rPr>
+        <w:t xml:space="preserve">"SSS &amp; PPP &lt;month&gt;"</w:t>
+      </w:r>
+      <w:r>
+        <w:t xml:space="preserve">, holding both the snack lines and the drink lines —</w:t>
+      </w:r>
+      <w:r>
+        <w:t xml:space="preserve"> </w:t>
+      </w:r>
+      <w:r>
+        <w:t xml:space="preserve">so a member gets one invoice and one direct debit. PPP line descriptions include</w:t>
+      </w:r>
+      <w:r>
+        <w:t xml:space="preserve"> </w:t>
+      </w:r>
+      <w:r>
+        <w:t xml:space="preserve">the activity name (</w:t>
       </w:r>
       <w:r>
         <w:rPr>
@@ -20417,28 +20566,19 @@
         <w:t xml:space="preserve">"Pils – Borrel 28 jun"</w:t>
       </w:r>
       <w:r>
-        <w:t xml:space="preserve">). Both reuse</w:t>
-      </w:r>
-      <w:r>
-        <w:t xml:space="preserve"> </w:t>
-      </w:r>
-      <w:r>
-        <w:rPr>
-          <w:rStyle w:val="VerbatimChar"/>
-        </w:rPr>
-        <w:t xml:space="preserve">createSaleInvoice()</w:t>
-      </w:r>
-      <w:r>
-        <w:t xml:space="preserve"> </w:t>
-      </w:r>
-      <w:r>
-        <w:t xml:space="preserve">and the</w:t>
-      </w:r>
-      <w:r>
-        <w:t xml:space="preserve"> </w:t>
-      </w:r>
-      <w:r>
-        <w:t xml:space="preserve">Mendix fallback. Source rows are marked</w:t>
+        <w:t xml:space="preserve">); the same product at different</w:t>
+      </w:r>
+      <w:r>
+        <w:t xml:space="preserve"> </w:t>
+      </w:r>
+      <w:r>
+        <w:t xml:space="preserve">activities/prices stays on separate lines. Every line keeps its own offer id;</w:t>
+      </w:r>
+      <w:r>
+        <w:t xml:space="preserve"> </w:t>
+      </w:r>
+      <w:r>
+        <w:t xml:space="preserve">lines without one use the Mendix fallback. Source rows (both tables) are marked</w:t>
       </w:r>
       <w:r>
         <w:t xml:space="preserve"> </w:t>
@@ -20453,7 +20593,7 @@
         <w:t xml:space="preserve"> </w:t>
       </w:r>
       <w:r>
-        <w:t xml:space="preserve">with the returned id.</w:t>
+        <w:t xml:space="preserve">with the same Congressus invoice id.</w:t>
       </w:r>
     </w:p>
     <w:bookmarkEnd w:id="128"/>
@@ -22319,35 +22459,67 @@
           <w:b/>
           <w:bCs/>
         </w:rPr>
-        <w:t xml:space="preserve">Export to Congressus</w:t>
-      </w:r>
-      <w:r>
-        <w:t xml:space="preserve"> </w:t>
-      </w:r>
-      <w:r>
-        <w:t xml:space="preserve">— bills all pending invoices. They are grouped into</w:t>
-      </w:r>
-      <w:r>
-        <w:t xml:space="preserve"> </w:t>
-      </w:r>
-      <w:r>
-        <w:rPr>
-          <w:b/>
-          <w:bCs/>
-        </w:rPr>
-        <w:t xml:space="preserve">one Congressus invoice per member per month</w:t>
-      </w:r>
-      <w:r>
-        <w:t xml:space="preserve"> </w:t>
-      </w:r>
-      <w:r>
-        <w:t xml:space="preserve">and then move to the Exported</w:t>
-      </w:r>
-      <w:r>
-        <w:t xml:space="preserve"> </w:t>
-      </w:r>
-      <w:r>
-        <w:t xml:space="preserve">tab. Run this once per billing cycle (e.g. monthly).</w:t>
+        <w:t xml:space="preserve">Export SSS + PPP to Congressus</w:t>
+      </w:r>
+      <w:r>
+        <w:t xml:space="preserve"> </w:t>
+      </w:r>
+      <w:r>
+        <w:t xml:space="preserve">(same button on the SSS and PPP invoices</w:t>
+      </w:r>
+      <w:r>
+        <w:t xml:space="preserve"> </w:t>
+      </w:r>
+      <w:r>
+        <w:t xml:space="preserve">pages) — bills ALL pending snack and drink orders together:</w:t>
+      </w:r>
+      <w:r>
+        <w:t xml:space="preserve"> </w:t>
+      </w:r>
+      <w:r>
+        <w:rPr>
+          <w:b/>
+          <w:bCs/>
+        </w:rPr>
+        <w:t xml:space="preserve">one Congressus</w:t>
+      </w:r>
+      <w:r>
+        <w:rPr>
+          <w:b/>
+          <w:bCs/>
+        </w:rPr>
+        <w:t xml:space="preserve"> </w:t>
+      </w:r>
+      <w:r>
+        <w:rPr>
+          <w:b/>
+          <w:bCs/>
+        </w:rPr>
+        <w:t xml:space="preserve">invoice per member per month</w:t>
+      </w:r>
+      <w:r>
+        <w:t xml:space="preserve"> </w:t>
+      </w:r>
+      <w:r>
+        <w:t xml:space="preserve">("SSS &amp; PPP</w:t>
+      </w:r>
+      <w:r>
+        <w:t xml:space="preserve"> </w:t>
+      </w:r>
+      <w:r>
+        <w:t xml:space="preserve">") with both their snacks and</w:t>
+      </w:r>
+      <w:r>
+        <w:t xml:space="preserve"> </w:t>
+      </w:r>
+      <w:r>
+        <w:t xml:space="preserve">drinks, so each member gets one invoice and one direct debit. The orders then</w:t>
+      </w:r>
+      <w:r>
+        <w:t xml:space="preserve"> </w:t>
+      </w:r>
+      <w:r>
+        <w:t xml:space="preserve">move to the Exported tab. Run this once per billing cycle (e.g. monthly).</w:t>
       </w:r>
     </w:p>
     <w:p>
@@ -22363,6 +22535,83 @@
           <w:b/>
           <w:bCs/>
         </w:rPr>
+        <w:t xml:space="preserve">⚠️ needs a check</w:t>
+      </w:r>
+      <w:r>
+        <w:t xml:space="preserve"> </w:t>
+      </w:r>
+      <w:r>
+        <w:t xml:space="preserve">— if Congressus didn't clearly answer (e.g. a timeout), the</w:t>
+      </w:r>
+      <w:r>
+        <w:t xml:space="preserve"> </w:t>
+      </w:r>
+      <w:r>
+        <w:t xml:space="preserve">affected orders are locked and listed in a warning at the top. Check in Congressus</w:t>
+      </w:r>
+      <w:r>
+        <w:t xml:space="preserve"> </w:t>
+      </w:r>
+      <w:r>
+        <w:t xml:space="preserve">whether that member has the invoice, then click</w:t>
+      </w:r>
+      <w:r>
+        <w:t xml:space="preserve"> </w:t>
+      </w:r>
+      <w:r>
+        <w:rPr>
+          <w:b/>
+          <w:bCs/>
+        </w:rPr>
+        <w:t xml:space="preserve">It's in Congressus → mark</w:t>
+      </w:r>
+      <w:r>
+        <w:rPr>
+          <w:b/>
+          <w:bCs/>
+        </w:rPr>
+        <w:t xml:space="preserve"> </w:t>
+      </w:r>
+      <w:r>
+        <w:rPr>
+          <w:b/>
+          <w:bCs/>
+        </w:rPr>
+        <w:t xml:space="preserve">exported</w:t>
+      </w:r>
+      <w:r>
+        <w:t xml:space="preserve"> </w:t>
+      </w:r>
+      <w:r>
+        <w:t xml:space="preserve">or</w:t>
+      </w:r>
+      <w:r>
+        <w:t xml:space="preserve"> </w:t>
+      </w:r>
+      <w:r>
+        <w:rPr>
+          <w:b/>
+          <w:bCs/>
+        </w:rPr>
+        <w:t xml:space="preserve">Not in Congressus → back to pending</w:t>
+      </w:r>
+      <w:r>
+        <w:t xml:space="preserve">.</w:t>
+      </w:r>
+    </w:p>
+    <w:p>
+      <w:pPr>
+        <w:pStyle w:val="Compact"/>
+        <w:numPr>
+          <w:ilvl w:val="0"/>
+          <w:numId w:val="1040"/>
+        </w:numPr>
+      </w:pPr>
+      <w:r>
+        <w:rPr>
+          <w:b/>
+          <w:bCs/>
+        </w:rPr>
         <w:t xml:space="preserve">Clear all … (test data)</w:t>
       </w:r>
       <w:r>
@@ -22481,13 +22730,13 @@
           <w:b/>
           <w:bCs/>
         </w:rPr>
-        <w:t xml:space="preserve">Invoices → Export to Congressus</w:t>
-      </w:r>
-      <w:r>
-        <w:t xml:space="preserve"> </w:t>
-      </w:r>
-      <w:r>
-        <w:t xml:space="preserve">to bill the month's purchases.</w:t>
+        <w:t xml:space="preserve">Invoices → Export SSS + PPP to Congressus</w:t>
+      </w:r>
+      <w:r>
+        <w:t xml:space="preserve"> </w:t>
+      </w:r>
+      <w:r>
+        <w:t xml:space="preserve">to bill the month's snacks and drinks.</w:t>
       </w:r>
     </w:p>
     <w:p>
@@ -22813,7 +23062,7 @@
         <w:rPr>
           <w:rStyle w:val="VerbatimChar"/>
         </w:rPr>
-        <w:t xml:space="preserve">  Member card ──tap──▶ Bar POS ──confirm──▶ PppInvoice ──monthly──▶ Congressus ("PPP &lt;month&gt;")</w:t>
+        <w:t xml:space="preserve">  Member card ──tap──▶ Bar POS ──confirm──▶ PppInvoice ──monthly──▶ Congressus ("SSS &amp; PPP &lt;month&gt;")</w:t>
       </w:r>
     </w:p>
     <w:bookmarkStart w:id="138" w:name="surfaces"/>
@@ -27542,10 +27791,13 @@
                 <w:b/>
                 <w:bCs/>
               </w:rPr>
-              <w:t xml:space="preserve">Export PPP to Congressus</w:t>
-            </w:r>
-            <w:r>
-              <w:t xml:space="preserve">; delete/clear test data.</w:t>
+              <w:t xml:space="preserve">Export SSS + PPP to Congressus</w:t>
+            </w:r>
+            <w:r>
+              <w:t xml:space="preserve"> </w:t>
+            </w:r>
+            <w:r>
+              <w:t xml:space="preserve">(one combined invoice per member per month — same action as on the SSS page); delete/clear test data.</w:t>
             </w:r>
             <w:r>
               <w:t xml:space="preserve"> </w:t>
@@ -28604,7 +28856,7 @@
           <w:b/>
           <w:bCs/>
         </w:rPr>
-        <w:t xml:space="preserve">Two-invoice export</w:t>
+        <w:t xml:space="preserve">One combined invoice</w:t>
       </w:r>
       <w:r>
         <w:t xml:space="preserve"> </w:t>
@@ -28619,104 +28871,86 @@
         <w:rPr>
           <w:rStyle w:val="VerbatimChar"/>
         </w:rPr>
-        <w:t xml:space="preserve">POST /api/admin/invoices/export { scope }</w:t>
-      </w:r>
-      <w:r>
-        <w:t xml:space="preserve"> </w:t>
-      </w:r>
-      <w:r>
-        <w:t xml:space="preserve">(</w:t>
-      </w:r>
-      <w:r>
-        <w:rPr>
-          <w:rStyle w:val="VerbatimChar"/>
-        </w:rPr>
-        <w:t xml:space="preserve">sss</w:t>
-      </w:r>
-      <w:r>
-        <w:t xml:space="preserve"> </w:t>
-      </w:r>
-      <w:r>
-        <w:t xml:space="preserve">|</w:t>
-      </w:r>
-      <w:r>
-        <w:t xml:space="preserve"> </w:t>
-      </w:r>
-      <w:r>
-        <w:rPr>
-          <w:rStyle w:val="VerbatimChar"/>
-        </w:rPr>
-        <w:t xml:space="preserve">ppp</w:t>
-      </w:r>
-      <w:r>
-        <w:t xml:space="preserve"> </w:t>
-      </w:r>
-      <w:r>
-        <w:t xml:space="preserve">|</w:t>
-      </w:r>
-      <w:r>
-        <w:t xml:space="preserve"> </w:t>
-      </w:r>
-      <w:r>
-        <w:rPr>
-          <w:rStyle w:val="VerbatimChar"/>
-        </w:rPr>
-        <w:t xml:space="preserve">all</w:t>
-      </w:r>
-      <w:r>
-        <w:t xml:space="preserve">) creates</w:t>
-      </w:r>
-      <w:r>
-        <w:t xml:space="preserve"> </w:t>
-      </w:r>
-      <w:r>
-        <w:rPr>
-          <w:b/>
-          <w:bCs/>
-        </w:rPr>
-        <w:t xml:space="preserve">separate</w:t>
-      </w:r>
-      <w:r>
-        <w:t xml:space="preserve"> </w:t>
-      </w:r>
-      <w:r>
-        <w:t xml:space="preserve">Congressus invoices per member per month: an</w:t>
-      </w:r>
-      <w:r>
-        <w:t xml:space="preserve"> </w:t>
-      </w:r>
-      <w:r>
-        <w:rPr>
-          <w:rStyle w:val="VerbatimChar"/>
-        </w:rPr>
-        <w:t xml:space="preserve">"SSS &lt;month&gt;"</w:t>
-      </w:r>
-      <w:r>
-        <w:t xml:space="preserve"> </w:t>
-      </w:r>
-      <w:r>
-        <w:t xml:space="preserve">invoice and a</w:t>
-      </w:r>
-      <w:r>
-        <w:t xml:space="preserve"> </w:t>
-      </w:r>
-      <w:r>
-        <w:rPr>
-          <w:rStyle w:val="VerbatimChar"/>
-        </w:rPr>
-        <w:t xml:space="preserve">"PPP &lt;month&gt;"</w:t>
-      </w:r>
-      <w:r>
-        <w:t xml:space="preserve"> </w:t>
-      </w:r>
-      <w:r>
-        <w:t xml:space="preserve">invoice. PPP line descriptions</w:t>
-      </w:r>
-      <w:r>
-        <w:t xml:space="preserve"> </w:t>
-      </w:r>
-      <w:r>
-        <w:t xml:space="preserve">include the activity name (</w:t>
+        <w:t xml:space="preserve">POST /api/admin/invoices/export</w:t>
+      </w:r>
+      <w:r>
+        <w:t xml:space="preserve"> </w:t>
+      </w:r>
+      <w:r>
+        <w:t xml:space="preserve">(from either</w:t>
+      </w:r>
+      <w:r>
+        <w:t xml:space="preserve"> </w:t>
+      </w:r>
+      <w:r>
+        <w:t xml:space="preserve">invoices page, "Export SSS + PPP to Congressus") groups ALL</w:t>
+      </w:r>
+      <w:r>
+        <w:t xml:space="preserve"> </w:t>
+      </w:r>
+      <w:r>
+        <w:rPr>
+          <w:rStyle w:val="VerbatimChar"/>
+        </w:rPr>
+        <w:t xml:space="preserve">CONFIRMED</w:t>
+      </w:r>
+      <w:r>
+        <w:t xml:space="preserve"> </w:t>
+      </w:r>
+      <w:r>
+        <w:t xml:space="preserve">SSS and</w:t>
+      </w:r>
+      <w:r>
+        <w:t xml:space="preserve"> </w:t>
+      </w:r>
+      <w:r>
+        <w:t xml:space="preserve">PPP orders by member × month and creates</w:t>
+      </w:r>
+      <w:r>
+        <w:t xml:space="preserve"> </w:t>
+      </w:r>
+      <w:r>
+        <w:rPr>
+          <w:b/>
+          <w:bCs/>
+        </w:rPr>
+        <w:t xml:space="preserve">one</w:t>
+      </w:r>
+      <w:r>
+        <w:t xml:space="preserve"> </w:t>
+      </w:r>
+      <w:r>
+        <w:t xml:space="preserve">Congressus sale-invoice per group,</w:t>
+      </w:r>
+      <w:r>
+        <w:t xml:space="preserve"> </w:t>
+      </w:r>
+      <w:r>
+        <w:t xml:space="preserve">reference</w:t>
+      </w:r>
+      <w:r>
+        <w:t xml:space="preserve"> </w:t>
+      </w:r>
+      <w:r>
+        <w:rPr>
+          <w:rStyle w:val="VerbatimChar"/>
+        </w:rPr>
+        <w:t xml:space="preserve">"SSS &amp; PPP &lt;month&gt;"</w:t>
+      </w:r>
+      <w:r>
+        <w:t xml:space="preserve">, holding both the snack lines and the drink lines —</w:t>
+      </w:r>
+      <w:r>
+        <w:t xml:space="preserve"> </w:t>
+      </w:r>
+      <w:r>
+        <w:t xml:space="preserve">so a member gets one invoice and one direct debit. PPP line descriptions include</w:t>
+      </w:r>
+      <w:r>
+        <w:t xml:space="preserve"> </w:t>
+      </w:r>
+      <w:r>
+        <w:t xml:space="preserve">the activity name (</w:t>
       </w:r>
       <w:r>
         <w:rPr>
@@ -28725,34 +28959,34 @@
         <w:t xml:space="preserve">"Pils – Borrel 28 jun"</w:t>
       </w:r>
       <w:r>
-        <w:t xml:space="preserve">); same product at different</w:t>
-      </w:r>
-      <w:r>
-        <w:t xml:space="preserve"> </w:t>
-      </w:r>
-      <w:r>
-        <w:t xml:space="preserve">activities/prices stays on separate lines. Both reuse</w:t>
-      </w:r>
-      <w:r>
-        <w:t xml:space="preserve"> </w:t>
-      </w:r>
-      <w:r>
-        <w:rPr>
-          <w:rStyle w:val="VerbatimChar"/>
-        </w:rPr>
-        <w:t xml:space="preserve">createSaleInvoice()</w:t>
-      </w:r>
-      <w:r>
-        <w:t xml:space="preserve"> </w:t>
-      </w:r>
-      <w:r>
-        <w:t xml:space="preserve">and</w:t>
-      </w:r>
-      <w:r>
-        <w:t xml:space="preserve"> </w:t>
-      </w:r>
-      <w:r>
-        <w:t xml:space="preserve">the Mendix fallback for lines without an offer id.</w:t>
+        <w:t xml:space="preserve">); the same product at different</w:t>
+      </w:r>
+      <w:r>
+        <w:t xml:space="preserve"> </w:t>
+      </w:r>
+      <w:r>
+        <w:t xml:space="preserve">activities/prices stays on separate lines. Every line keeps its own offer id;</w:t>
+      </w:r>
+      <w:r>
+        <w:t xml:space="preserve"> </w:t>
+      </w:r>
+      <w:r>
+        <w:t xml:space="preserve">lines without one use the Mendix fallback. Source rows (both tables) are marked</w:t>
+      </w:r>
+      <w:r>
+        <w:t xml:space="preserve"> </w:t>
+      </w:r>
+      <w:r>
+        <w:rPr>
+          <w:rStyle w:val="VerbatimChar"/>
+        </w:rPr>
+        <w:t xml:space="preserve">EXPORTED</w:t>
+      </w:r>
+      <w:r>
+        <w:t xml:space="preserve"> </w:t>
+      </w:r>
+      <w:r>
+        <w:t xml:space="preserve">with the same Congressus invoice id.</w:t>
       </w:r>
     </w:p>
     <w:bookmarkEnd w:id="153"/>

</xml_diff>

<commit_message>
Members: allow deleting members whose orders are all exported
Deletion is blocked only while SSS or PPP orders are unbilled. Members without
history are removed; members with exported history are anonymised (personal
data, cards, roles and account link removed, detached from Congressus) so past
orders and revenue figures stay correct. Fixes a crash when deleting a member
with PPP orders.

Co-Authored-By: Claude Opus 5.5 <noreply@anthropic.com>
</commit_message>
<xml_diff>
--- a/docs/SSS-Documentation.docx
+++ b/docs/SSS-Documentation.docx
@@ -4150,7 +4150,7 @@
               <w:pStyle w:val="Compact"/>
             </w:pPr>
             <w:r>
-              <w:t xml:space="preserve">Int</w:t>
+              <w:t xml:space="preserve">Int?</w:t>
             </w:r>
           </w:p>
         </w:tc>
@@ -4171,7 +4171,7 @@
               <w:t xml:space="preserve"> </w:t>
             </w:r>
             <w:r>
-              <w:t xml:space="preserve">— the Congressus member id</w:t>
+              <w:t xml:space="preserve">— the Congressus member id; null once deleted (anonymised)</w:t>
             </w:r>
           </w:p>
         </w:tc>
@@ -4305,6 +4305,44 @@
             </w:pPr>
             <w:r>
               <w:t xml:space="preserve">false if deleted/locked/archived/deceased in Congressus</w:t>
+            </w:r>
+          </w:p>
+        </w:tc>
+      </w:tr>
+      <w:tr>
+        <w:tc>
+          <w:tcPr/>
+          <w:p>
+            <w:pPr>
+              <w:pStyle w:val="Compact"/>
+            </w:pPr>
+            <w:r>
+              <w:rPr>
+                <w:rStyle w:val="VerbatimChar"/>
+              </w:rPr>
+              <w:t xml:space="preserve">deletedAt</w:t>
+            </w:r>
+          </w:p>
+        </w:tc>
+        <w:tc>
+          <w:tcPr/>
+          <w:p>
+            <w:pPr>
+              <w:pStyle w:val="Compact"/>
+            </w:pPr>
+            <w:r>
+              <w:t xml:space="preserve">DateTime?</w:t>
+            </w:r>
+          </w:p>
+        </w:tc>
+        <w:tc>
+          <w:tcPr/>
+          <w:p>
+            <w:pPr>
+              <w:pStyle w:val="Compact"/>
+            </w:pPr>
+            <w:r>
+              <w:t xml:space="preserve">set when an admin deletes a member with exported history (row kept, anonymised, hidden from lists)</w:t>
             </w:r>
           </w:p>
         </w:tc>
@@ -7679,7 +7717,49 @@
         <w:t xml:space="preserve"> </w:t>
       </w:r>
       <w:r>
-        <w:t xml:space="preserve">is blocked while they have invoices; otherwise their cards and shop sessions are removed in a transaction.</w:t>
+        <w:t xml:space="preserve">is blocked while they have unbilled (</w:t>
+      </w:r>
+      <w:r>
+        <w:rPr>
+          <w:rStyle w:val="VerbatimChar"/>
+        </w:rPr>
+        <w:t xml:space="preserve">CONFIRMED</w:t>
+      </w:r>
+      <w:r>
+        <w:t xml:space="preserve">/</w:t>
+      </w:r>
+      <w:r>
+        <w:rPr>
+          <w:rStyle w:val="VerbatimChar"/>
+        </w:rPr>
+        <w:t xml:space="preserve">EXPORTING</w:t>
+      </w:r>
+      <w:r>
+        <w:t xml:space="preserve">) SSS or PPP orders. Without history they're removed with their cards, shop sessions and carts; with exported history they're anonymised (</w:t>
+      </w:r>
+      <w:r>
+        <w:rPr>
+          <w:rStyle w:val="VerbatimChar"/>
+        </w:rPr>
+        <w:t xml:space="preserve">deletedAt</w:t>
+      </w:r>
+      <w:r>
+        <w:t xml:space="preserve">,</w:t>
+      </w:r>
+      <w:r>
+        <w:t xml:space="preserve"> </w:t>
+      </w:r>
+      <w:r>
+        <w:rPr>
+          <w:rStyle w:val="VerbatimChar"/>
+        </w:rPr>
+        <w:t xml:space="preserve">congressusId</w:t>
+      </w:r>
+      <w:r>
+        <w:t xml:space="preserve"> </w:t>
+      </w:r>
+      <w:r>
+        <w:t xml:space="preserve">null) so their orders keep counting in reports.</w:t>
       </w:r>
     </w:p>
     <w:p>
@@ -11141,7 +11221,7 @@
         <w:pStyle w:val="FirstParagraph"/>
       </w:pPr>
       <w:r>
-        <w:t xml:space="preserve">Deletes a member plus their cards &amp; shop sessions (transaction).</w:t>
+        <w:t xml:space="preserve">Deletes a member.</w:t>
       </w:r>
       <w:r>
         <w:t xml:space="preserve"> </w:t>
@@ -11156,13 +11236,107 @@
         <w:t xml:space="preserve"> </w:t>
       </w:r>
       <w:r>
-        <w:t xml:space="preserve">if the</w:t>
-      </w:r>
-      <w:r>
-        <w:t xml:space="preserve"> </w:t>
-      </w:r>
-      <w:r>
-        <w:t xml:space="preserve">member has any invoices.</w:t>
+        <w:t xml:space="preserve">while they have unbilled orders (SSS or PPP,</w:t>
+      </w:r>
+      <w:r>
+        <w:t xml:space="preserve"> </w:t>
+      </w:r>
+      <w:r>
+        <w:rPr>
+          <w:rStyle w:val="VerbatimChar"/>
+        </w:rPr>
+        <w:t xml:space="preserve">CONFIRMED</w:t>
+      </w:r>
+      <w:r>
+        <w:t xml:space="preserve">/</w:t>
+      </w:r>
+      <w:r>
+        <w:t xml:space="preserve"> </w:t>
+      </w:r>
+      <w:r>
+        <w:rPr>
+          <w:rStyle w:val="VerbatimChar"/>
+        </w:rPr>
+        <w:t xml:space="preserve">EXPORTING</w:t>
+      </w:r>
+      <w:r>
+        <w:t xml:space="preserve">). With no purchase history the member is removed completely (cards,</w:t>
+      </w:r>
+      <w:r>
+        <w:t xml:space="preserve"> </w:t>
+      </w:r>
+      <w:r>
+        <w:t xml:space="preserve">shop sessions, abandoned carts). With exported history they are</w:t>
+      </w:r>
+      <w:r>
+        <w:t xml:space="preserve"> </w:t>
+      </w:r>
+      <w:r>
+        <w:rPr>
+          <w:b/>
+          <w:bCs/>
+        </w:rPr>
+        <w:t xml:space="preserve">anonymised</w:t>
+      </w:r>
+      <w:r>
+        <w:t xml:space="preserve"> </w:t>
+      </w:r>
+      <w:r>
+        <w:t xml:space="preserve">instead: name → "Deleted member", email erased, cards/sessions/roles/carts and any</w:t>
+      </w:r>
+      <w:r>
+        <w:t xml:space="preserve"> </w:t>
+      </w:r>
+      <w:r>
+        <w:t xml:space="preserve">bartender-account link removed,</w:t>
+      </w:r>
+      <w:r>
+        <w:t xml:space="preserve"> </w:t>
+      </w:r>
+      <w:r>
+        <w:rPr>
+          <w:rStyle w:val="VerbatimChar"/>
+        </w:rPr>
+        <w:t xml:space="preserve">congressusId</w:t>
+      </w:r>
+      <w:r>
+        <w:t xml:space="preserve"> </w:t>
+      </w:r>
+      <w:r>
+        <w:t xml:space="preserve">→ null,</w:t>
+      </w:r>
+      <w:r>
+        <w:t xml:space="preserve"> </w:t>
+      </w:r>
+      <w:r>
+        <w:rPr>
+          <w:rStyle w:val="VerbatimChar"/>
+        </w:rPr>
+        <w:t xml:space="preserve">deletedAt</w:t>
+      </w:r>
+      <w:r>
+        <w:t xml:space="preserve"> </w:t>
+      </w:r>
+      <w:r>
+        <w:t xml:space="preserve">set — so past</w:t>
+      </w:r>
+      <w:r>
+        <w:t xml:space="preserve"> </w:t>
+      </w:r>
+      <w:r>
+        <w:t xml:space="preserve">orders and revenue figures stay correct. Returns</w:t>
+      </w:r>
+      <w:r>
+        <w:t xml:space="preserve"> </w:t>
+      </w:r>
+      <w:r>
+        <w:rPr>
+          <w:rStyle w:val="VerbatimChar"/>
+        </w:rPr>
+        <w:t xml:space="preserve">{ ok, anonymised }</w:t>
+      </w:r>
+      <w:r>
+        <w:t xml:space="preserve">.</w:t>
       </w:r>
     </w:p>
     <w:bookmarkEnd w:id="82"/>
@@ -21665,13 +21839,53 @@
         <w:t xml:space="preserve"> </w:t>
       </w:r>
       <w:r>
-        <w:t xml:space="preserve">— removes a member and their linked cards. Blocked if the member has</w:t>
-      </w:r>
-      <w:r>
-        <w:t xml:space="preserve"> </w:t>
-      </w:r>
-      <w:r>
-        <w:t xml:space="preserve">any invoices (delete/clear those first).</w:t>
+        <w:t xml:space="preserve">— removes a member, their cards and roles. Only possible once nothing</w:t>
+      </w:r>
+      <w:r>
+        <w:t xml:space="preserve"> </w:t>
+      </w:r>
+      <w:r>
+        <w:t xml:space="preserve">is left to bill: unbilled orders must be exported to Congressus (or deleted) first.</w:t>
+      </w:r>
+      <w:r>
+        <w:t xml:space="preserve"> </w:t>
+      </w:r>
+      <w:r>
+        <w:t xml:space="preserve">A member with past (exported) purchases is</w:t>
+      </w:r>
+      <w:r>
+        <w:t xml:space="preserve"> </w:t>
+      </w:r>
+      <w:r>
+        <w:rPr>
+          <w:b/>
+          <w:bCs/>
+        </w:rPr>
+        <w:t xml:space="preserve">anonymised</w:t>
+      </w:r>
+      <w:r>
+        <w:t xml:space="preserve"> </w:t>
+      </w:r>
+      <w:r>
+        <w:t xml:space="preserve">rather than erased:</w:t>
+      </w:r>
+      <w:r>
+        <w:t xml:space="preserve"> </w:t>
+      </w:r>
+      <w:r>
+        <w:t xml:space="preserve">their personal details go, but their old orders stay as "Deleted member" so</w:t>
+      </w:r>
+      <w:r>
+        <w:t xml:space="preserve"> </w:t>
+      </w:r>
+      <w:r>
+        <w:t xml:space="preserve">revenue and P/L figures don't change. If they're still in Congressus, the next</w:t>
+      </w:r>
+      <w:r>
+        <w:t xml:space="preserve"> </w:t>
+      </w:r>
+      <w:r>
+        <w:t xml:space="preserve">sync adds them again as a fresh member (without their old history).</w:t>
       </w:r>
     </w:p>
     <w:p>

</xml_diff>

<commit_message>
Export: one Congressus invoice per member per export, across months
The combined export grouped by member and calendar month, so an export covering
September and October orders gave members two invoices. It now groups by
member only; the reference names the period (e.g. "SSS & PPP september –
oktober 2026").

Co-Authored-By: Claude Opus 5.5 <noreply@anthropic.com>
</commit_message>
<xml_diff>
--- a/docs/SSS-Documentation.docx
+++ b/docs/SSS-Documentation.docx
@@ -12083,13 +12083,13 @@
         <w:t xml:space="preserve"> </w:t>
       </w:r>
       <w:r>
-        <w:t xml:space="preserve">tagged with this run's id — a concurrent run gets none), groups them by member ×</w:t>
-      </w:r>
-      <w:r>
-        <w:t xml:space="preserve"> </w:t>
-      </w:r>
-      <w:r>
-        <w:t xml:space="preserve">calendar month and creates</w:t>
+        <w:t xml:space="preserve">tagged with this run's id — a concurrent run gets none), groups them by member</w:t>
+      </w:r>
+      <w:r>
+        <w:t xml:space="preserve"> </w:t>
+      </w:r>
+      <w:r>
+        <w:t xml:space="preserve">(whatever month) and creates</w:t>
       </w:r>
       <w:r>
         <w:t xml:space="preserve"> </w:t>
@@ -12105,22 +12105,28 @@
         <w:t xml:space="preserve"> </w:t>
       </w:r>
       <w:r>
-        <w:t xml:space="preserve">Congressus sale-invoice per group with both the</w:t>
-      </w:r>
-      <w:r>
-        <w:t xml:space="preserve"> </w:t>
-      </w:r>
-      <w:r>
-        <w:t xml:space="preserve">snack and drink lines (</w:t>
-      </w:r>
-      <w:r>
-        <w:rPr>
-          <w:rStyle w:val="VerbatimChar"/>
-        </w:rPr>
-        <w:t xml:space="preserve">"SSS &amp; PPP &lt;month&gt;"</w:t>
-      </w:r>
-      <w:r>
-        <w:t xml:space="preserve">), then marks them</w:t>
+        <w:t xml:space="preserve">Congressus sale-invoice per member with both</w:t>
+      </w:r>
+      <w:r>
+        <w:t xml:space="preserve"> </w:t>
+      </w:r>
+      <w:r>
+        <w:t xml:space="preserve">the snack and drink lines (</w:t>
+      </w:r>
+      <w:r>
+        <w:rPr>
+          <w:rStyle w:val="VerbatimChar"/>
+        </w:rPr>
+        <w:t xml:space="preserve">"SSS &amp; PPP &lt;period&gt;"</w:t>
+      </w:r>
+      <w:r>
+        <w:t xml:space="preserve">, e.g. "oktober 2026" or</w:t>
+      </w:r>
+      <w:r>
+        <w:t xml:space="preserve"> </w:t>
+      </w:r>
+      <w:r>
+        <w:t xml:space="preserve">"september – oktober 2026"), then marks them</w:t>
       </w:r>
       <w:r>
         <w:t xml:space="preserve"> </w:t>
@@ -19266,7 +19272,7 @@
         <w:t xml:space="preserve"> </w:t>
       </w:r>
       <w:r>
-        <w:t xml:space="preserve">snacks AND drinks of a month on</w:t>
+        <w:t xml:space="preserve">pending snacks AND drinks on</w:t>
       </w:r>
       <w:r>
         <w:t xml:space="preserve"> </w:t>
@@ -19282,13 +19288,13 @@
         <w:t xml:space="preserve"> </w:t>
       </w:r>
       <w:r>
-        <w:t xml:space="preserve">Congressus invoice (</w:t>
-      </w:r>
-      <w:r>
-        <w:rPr>
-          <w:rStyle w:val="VerbatimChar"/>
-        </w:rPr>
-        <w:t xml:space="preserve">"SSS &amp; PPP &lt;month&gt;"</w:t>
+        <w:t xml:space="preserve">Congressus invoice per export (</w:t>
+      </w:r>
+      <w:r>
+        <w:rPr>
+          <w:rStyle w:val="VerbatimChar"/>
+        </w:rPr>
+        <w:t xml:space="preserve">"SSS &amp; PPP &lt;period&gt;"</w:t>
       </w:r>
       <w:r>
         <w:t xml:space="preserve">)</w:t>
@@ -19945,19 +19951,25 @@
         <w:rPr>
           <w:rStyle w:val="VerbatimChar"/>
         </w:rPr>
-        <w:t xml:space="preserve">invoice_reference: "SSS &amp; PPP &lt;month&gt; &lt;year&gt;"</w:t>
-      </w:r>
-      <w:r>
-        <w:t xml:space="preserve"> </w:t>
-      </w:r>
-      <w:r>
-        <w:t xml:space="preserve">(Dutch locale, e.g.</w:t>
-      </w:r>
-      <w:r>
-        <w:t xml:space="preserve"> </w:t>
-      </w:r>
-      <w:r>
-        <w:t xml:space="preserve">"SSS &amp; PPP juni 2026") — snack and drink lines on the same invoice</w:t>
+        <w:t xml:space="preserve">invoice_reference: "SSS &amp; PPP &lt;period&gt;"</w:t>
+      </w:r>
+      <w:r>
+        <w:t xml:space="preserve"> </w:t>
+      </w:r>
+      <w:r>
+        <w:t xml:space="preserve">(Dutch locale: "SSS &amp; PPP juni 2026",</w:t>
+      </w:r>
+      <w:r>
+        <w:t xml:space="preserve"> </w:t>
+      </w:r>
+      <w:r>
+        <w:t xml:space="preserve">or "SSS &amp; PPP mei – juni 2026" when the orders span months) — snack and drink</w:t>
+      </w:r>
+      <w:r>
+        <w:t xml:space="preserve"> </w:t>
+      </w:r>
+      <w:r>
+        <w:t xml:space="preserve">lines on the same invoice</w:t>
       </w:r>
     </w:p>
     <w:p>
@@ -20685,7 +20697,7 @@
         <w:t xml:space="preserve"> </w:t>
       </w:r>
       <w:r>
-        <w:t xml:space="preserve">PPP orders by member × month and creates</w:t>
+        <w:t xml:space="preserve">PPP orders by member (any month) and creates</w:t>
       </w:r>
       <w:r>
         <w:t xml:space="preserve"> </w:t>
@@ -20701,25 +20713,28 @@
         <w:t xml:space="preserve"> </w:t>
       </w:r>
       <w:r>
-        <w:t xml:space="preserve">Congressus sale-invoice per group,</w:t>
-      </w:r>
-      <w:r>
-        <w:t xml:space="preserve"> </w:t>
-      </w:r>
-      <w:r>
-        <w:t xml:space="preserve">reference</w:t>
-      </w:r>
-      <w:r>
-        <w:t xml:space="preserve"> </w:t>
-      </w:r>
-      <w:r>
-        <w:rPr>
-          <w:rStyle w:val="VerbatimChar"/>
-        </w:rPr>
-        <w:t xml:space="preserve">"SSS &amp; PPP &lt;month&gt;"</w:t>
-      </w:r>
-      <w:r>
-        <w:t xml:space="preserve">, holding both the snack lines and the drink lines —</w:t>
+        <w:t xml:space="preserve">Congressus sale-invoice per</w:t>
+      </w:r>
+      <w:r>
+        <w:t xml:space="preserve"> </w:t>
+      </w:r>
+      <w:r>
+        <w:t xml:space="preserve">member, reference</w:t>
+      </w:r>
+      <w:r>
+        <w:t xml:space="preserve"> </w:t>
+      </w:r>
+      <w:r>
+        <w:rPr>
+          <w:rStyle w:val="VerbatimChar"/>
+        </w:rPr>
+        <w:t xml:space="preserve">"SSS &amp; PPP &lt;period&gt;"</w:t>
+      </w:r>
+      <w:r>
+        <w:t xml:space="preserve"> </w:t>
+      </w:r>
+      <w:r>
+        <w:t xml:space="preserve">(e.g. "september – oktober 2026"), holding both the snack lines and the drink lines —</w:t>
       </w:r>
       <w:r>
         <w:t xml:space="preserve"> </w:t>
@@ -22709,25 +22724,25 @@
           <w:b/>
           <w:bCs/>
         </w:rPr>
-        <w:t xml:space="preserve">invoice per member per month</w:t>
-      </w:r>
-      <w:r>
-        <w:t xml:space="preserve"> </w:t>
-      </w:r>
-      <w:r>
-        <w:t xml:space="preserve">("SSS &amp; PPP</w:t>
-      </w:r>
-      <w:r>
-        <w:t xml:space="preserve"> </w:t>
-      </w:r>
-      <w:r>
-        <w:t xml:space="preserve">") with both their snacks and</w:t>
-      </w:r>
-      <w:r>
-        <w:t xml:space="preserve"> </w:t>
-      </w:r>
-      <w:r>
-        <w:t xml:space="preserve">drinks, so each member gets one invoice and one direct debit. The orders then</w:t>
+        <w:t xml:space="preserve">invoice per member</w:t>
+      </w:r>
+      <w:r>
+        <w:t xml:space="preserve"> </w:t>
+      </w:r>
+      <w:r>
+        <w:t xml:space="preserve">with all their snacks and drinks — also when the orders are</w:t>
+      </w:r>
+      <w:r>
+        <w:t xml:space="preserve"> </w:t>
+      </w:r>
+      <w:r>
+        <w:t xml:space="preserve">from several months ("SSS &amp; PPP oktober 2026", or "SSS &amp; PPP september – oktober</w:t>
+      </w:r>
+      <w:r>
+        <w:t xml:space="preserve"> </w:t>
+      </w:r>
+      <w:r>
+        <w:t xml:space="preserve">2026") — so each member gets one invoice and one direct debit. The orders then</w:t>
       </w:r>
       <w:r>
         <w:t xml:space="preserve"> </w:t>
@@ -28618,7 +28633,7 @@
               <w:t xml:space="preserve"> </w:t>
             </w:r>
             <w:r>
-              <w:t xml:space="preserve">(one combined invoice per member per month — same action as on the SSS page); delete/clear test data.</w:t>
+              <w:t xml:space="preserve">(one combined invoice per member per export, whatever months the orders are from — same action as on the SSS page); delete/clear test data.</w:t>
             </w:r>
             <w:r>
               <w:t xml:space="preserve"> </w:t>
@@ -31123,7 +31138,7 @@
         <w:t xml:space="preserve"> </w:t>
       </w:r>
       <w:r>
-        <w:t xml:space="preserve">PPP orders by member × month and creates</w:t>
+        <w:t xml:space="preserve">PPP orders by member (any month) and creates</w:t>
       </w:r>
       <w:r>
         <w:t xml:space="preserve"> </w:t>
@@ -31139,25 +31154,28 @@
         <w:t xml:space="preserve"> </w:t>
       </w:r>
       <w:r>
-        <w:t xml:space="preserve">Congressus sale-invoice per group,</w:t>
-      </w:r>
-      <w:r>
-        <w:t xml:space="preserve"> </w:t>
-      </w:r>
-      <w:r>
-        <w:t xml:space="preserve">reference</w:t>
-      </w:r>
-      <w:r>
-        <w:t xml:space="preserve"> </w:t>
-      </w:r>
-      <w:r>
-        <w:rPr>
-          <w:rStyle w:val="VerbatimChar"/>
-        </w:rPr>
-        <w:t xml:space="preserve">"SSS &amp; PPP &lt;month&gt;"</w:t>
-      </w:r>
-      <w:r>
-        <w:t xml:space="preserve">, holding both the snack lines and the drink lines —</w:t>
+        <w:t xml:space="preserve">Congressus sale-invoice per</w:t>
+      </w:r>
+      <w:r>
+        <w:t xml:space="preserve"> </w:t>
+      </w:r>
+      <w:r>
+        <w:t xml:space="preserve">member, reference</w:t>
+      </w:r>
+      <w:r>
+        <w:t xml:space="preserve"> </w:t>
+      </w:r>
+      <w:r>
+        <w:rPr>
+          <w:rStyle w:val="VerbatimChar"/>
+        </w:rPr>
+        <w:t xml:space="preserve">"SSS &amp; PPP &lt;period&gt;"</w:t>
+      </w:r>
+      <w:r>
+        <w:t xml:space="preserve"> </w:t>
+      </w:r>
+      <w:r>
+        <w:t xml:space="preserve">(e.g. "september – oktober 2026"), holding both the snack lines and the drink lines —</w:t>
       </w:r>
       <w:r>
         <w:t xml:space="preserve"> </w:t>

</xml_diff>

<commit_message>
Export: no Congressus invoice for members with only free (€0) orders
Congressus drops €0 lines, leaving an empty €0.00 invoice. Such orders are now
marked exported without creating an invoice and reported as 'nothing to pay'.

Co-Authored-By: Claude Opus 5.5 <noreply@anthropic.com>
</commit_message>
<xml_diff>
--- a/docs/SSS-Documentation.docx
+++ b/docs/SSS-Documentation.docx
@@ -12138,6 +12138,39 @@
         <w:t xml:space="preserve">EXPORTED</w:t>
       </w:r>
       <w:r>
+        <w:t xml:space="preserve">. A member whose orders are</w:t>
+      </w:r>
+      <w:r>
+        <w:t xml:space="preserve"> </w:t>
+      </w:r>
+      <w:r>
+        <w:t xml:space="preserve">all €0 (free drinks) gets no Congressus invoice — their orders are marked</w:t>
+      </w:r>
+      <w:r>
+        <w:t xml:space="preserve"> </w:t>
+      </w:r>
+      <w:r>
+        <w:rPr>
+          <w:rStyle w:val="VerbatimChar"/>
+        </w:rPr>
+        <w:t xml:space="preserve">EXPORTED</w:t>
+      </w:r>
+      <w:r>
+        <w:t xml:space="preserve"> </w:t>
+      </w:r>
+      <w:r>
+        <w:t xml:space="preserve">without an invoice id and counted in</w:t>
+      </w:r>
+      <w:r>
+        <w:t xml:space="preserve"> </w:t>
+      </w:r>
+      <w:r>
+        <w:rPr>
+          <w:rStyle w:val="VerbatimChar"/>
+        </w:rPr>
+        <w:t xml:space="preserve">nothingToPay</w:t>
+      </w:r>
+      <w:r>
         <w:t xml:space="preserve">. A</w:t>
       </w:r>
       <w:r>
@@ -22742,7 +22775,13 @@
         <w:t xml:space="preserve"> </w:t>
       </w:r>
       <w:r>
-        <w:t xml:space="preserve">2026") — so each member gets one invoice and one direct debit. The orders then</w:t>
+        <w:t xml:space="preserve">2026") — so each member gets one invoice and one direct debit. Members who only</w:t>
+      </w:r>
+      <w:r>
+        <w:t xml:space="preserve"> </w:t>
+      </w:r>
+      <w:r>
+        <w:t xml:space="preserve">had free (€0) orders, e.g. Board or bartender drinks, get no invoice. The orders then</w:t>
       </w:r>
       <w:r>
         <w:t xml:space="preserve"> </w:t>

</xml_diff>

<commit_message>
PPP borrel page: joint toggle on the detail page, collapsible usage and Wall Street
- Joint badge + Make joint / Not joint on the borrel detail page (removed from the list).
- External cards and Wall Street at the bottom, Stress borrels only; Wall Street
  refused on Dimensie borrels server-side. No SumUp on Dimensie borrels.
- Usage (SBZ) and Wall Street collapsed until clicked; Import/Save stay visible.
- SBZ prices page view-only for Dimensie logins.

Co-Authored-By: Claude Opus 5.5 <noreply@anthropic.com>
</commit_message>
<xml_diff>
--- a/docs/SSS-Documentation.docx
+++ b/docs/SSS-Documentation.docx
@@ -22651,13 +22651,19 @@
         <w:t xml:space="preserve"> </w:t>
       </w:r>
       <w:r>
-        <w:t xml:space="preserve">on a Stress borrel</w:t>
-      </w:r>
-      <w:r>
-        <w:t xml:space="preserve"> </w:t>
-      </w:r>
-      <w:r>
-        <w:t xml:space="preserve">if Alexia didn't mark it right.</w:t>
+        <w:t xml:space="preserve">on a Stress</w:t>
+      </w:r>
+      <w:r>
+        <w:t xml:space="preserve"> </w:t>
+      </w:r>
+      <w:r>
+        <w:t xml:space="preserve">borrel's detail page if Alexia didn't mark it right. Wall Street, external cards and</w:t>
+      </w:r>
+      <w:r>
+        <w:t xml:space="preserve"> </w:t>
+      </w:r>
+      <w:r>
+        <w:t xml:space="preserve">SumUp are Stress-only and don't appear on Dimensie borrels.</w:t>
       </w:r>
     </w:p>
     <w:p>
@@ -27792,7 +27798,10 @@
         <w:t xml:space="preserve">Make joint</w:t>
       </w:r>
       <w:r>
-        <w:t xml:space="preserve">),</w:t>
+        <w:t xml:space="preserve"> </w:t>
+      </w:r>
+      <w:r>
+        <w:t xml:space="preserve">on its detail page),</w:t>
       </w:r>
       <w:r>
         <w:t xml:space="preserve"> </w:t>

</xml_diff>

<commit_message>
Phase 4: Dimensie export to Dimensie's own Congressus
- POST /api/admin/invoices/export takes { association }. Dimensie: drinks of
  Dimensie members (Dimensie + joint borrels), one invoice per member per export
  ("Borrels <period>"), workflow 309, direct debit, no VAT. Same claim /
  needs-check / €0 rules; reconcile resolves only your own members' orders.
- PppProductOffer: a drink's product in another association's Congressus,
  created on first export in a "PPP" folder (Association.congressusPppFolderId).
- Migration links the 19 Stress drinks to the products created in Dimensie's
  Congressus (folder 9445).
- PPP invoices page: Export Stress / Export Dimensie per login.
- Mock: MOCK_LENIENT accepts real ids from the production copy on staging.

Co-Authored-By: Claude Opus 5.5 <noreply@anthropic.com>
</commit_message>
<xml_diff>
--- a/docs/SSS-Documentation.docx
+++ b/docs/SSS-Documentation.docx
@@ -19828,7 +19828,7 @@
     </w:p>
     <w:bookmarkEnd w:id="121"/>
     <w:bookmarkEnd w:id="122"/>
-    <w:bookmarkStart w:id="132" w:name="congressus-integration"/>
+    <w:bookmarkStart w:id="133" w:name="congressus-integration"/>
     <w:p>
       <w:pPr>
         <w:pStyle w:val="Heading1"/>
@@ -22031,7 +22031,259 @@
       </w:r>
     </w:p>
     <w:bookmarkEnd w:id="130"/>
-    <w:bookmarkStart w:id="131" w:name="quick-reference-of-quirks"/>
+    <w:bookmarkStart w:id="131" w:name="X0607999254200b1168b2ce653f27beac1c5936f"/>
+    <w:p>
+      <w:pPr>
+        <w:pStyle w:val="Heading2"/>
+      </w:pPr>
+      <w:r>
+        <w:t xml:space="preserve">Dimensie's export (PPP → Dimensie's Congressus)</w:t>
+      </w:r>
+    </w:p>
+    <w:p>
+      <w:pPr>
+        <w:pStyle w:val="FirstParagraph"/>
+      </w:pPr>
+      <w:r>
+        <w:rPr>
+          <w:rStyle w:val="VerbatimChar"/>
+        </w:rPr>
+        <w:t xml:space="preserve">POST /api/admin/invoices/export</w:t>
+      </w:r>
+      <w:r>
+        <w:t xml:space="preserve"> </w:t>
+      </w:r>
+      <w:r>
+        <w:t xml:space="preserve">with</w:t>
+      </w:r>
+      <w:r>
+        <w:t xml:space="preserve"> </w:t>
+      </w:r>
+      <w:r>
+        <w:rPr>
+          <w:rStyle w:val="VerbatimChar"/>
+        </w:rPr>
+        <w:t xml:space="preserve">{ "association": "dimensie" }</w:t>
+      </w:r>
+      <w:r>
+        <w:t xml:space="preserve"> </w:t>
+      </w:r>
+      <w:r>
+        <w:t xml:space="preserve">(PPP admin,</w:t>
+      </w:r>
+      <w:r>
+        <w:t xml:space="preserve"> </w:t>
+      </w:r>
+      <w:r>
+        <w:t xml:space="preserve">Dimensie or overall login) exports the pending drink orders of</w:t>
+      </w:r>
+      <w:r>
+        <w:t xml:space="preserve"> </w:t>
+      </w:r>
+      <w:r>
+        <w:rPr>
+          <w:b/>
+          <w:bCs/>
+        </w:rPr>
+        <w:t xml:space="preserve">Dimensie members</w:t>
+      </w:r>
+      <w:r>
+        <w:t xml:space="preserve"> </w:t>
+      </w:r>
+      <w:r>
+        <w:t xml:space="preserve">— at Dimensie borrels and joint borrels — to Dimensie's Congressus: one invoice per</w:t>
+      </w:r>
+      <w:r>
+        <w:t xml:space="preserve"> </w:t>
+      </w:r>
+      <w:r>
+        <w:t xml:space="preserve">member per export, reference</w:t>
+      </w:r>
+      <w:r>
+        <w:t xml:space="preserve"> </w:t>
+      </w:r>
+      <w:r>
+        <w:rPr>
+          <w:b/>
+          <w:bCs/>
+        </w:rPr>
+        <w:t xml:space="preserve">"Borrels</w:t>
+      </w:r>
+      <w:r>
+        <w:rPr>
+          <w:b/>
+          <w:bCs/>
+        </w:rPr>
+        <w:t xml:space="preserve"> </w:t>
+      </w:r>
+      <w:r>
+        <w:rPr>
+          <w:b/>
+          <w:bCs/>
+        </w:rPr>
+        <w:t xml:space="preserve">"</w:t>
+      </w:r>
+      <w:r>
+        <w:t xml:space="preserve">, workflow</w:t>
+      </w:r>
+      <w:r>
+        <w:t xml:space="preserve"> </w:t>
+      </w:r>
+      <w:r>
+        <w:rPr>
+          <w:rStyle w:val="VerbatimChar"/>
+        </w:rPr>
+        <w:t xml:space="preserve">309</w:t>
+      </w:r>
+      <w:r>
+        <w:t xml:space="preserve">, direct debit,</w:t>
+      </w:r>
+      <w:r>
+        <w:t xml:space="preserve"> </w:t>
+      </w:r>
+      <w:r>
+        <w:rPr>
+          <w:b/>
+          <w:bCs/>
+        </w:rPr>
+        <w:t xml:space="preserve">no VAT</w:t>
+      </w:r>
+      <w:r>
+        <w:t xml:space="preserve">. Same claim / needs-check / €0 rules as the Stress export; the reconcile</w:t>
+      </w:r>
+      <w:r>
+        <w:t xml:space="preserve"> </w:t>
+      </w:r>
+      <w:r>
+        <w:t xml:space="preserve">route lets each side resolve only its own members' orders.</w:t>
+      </w:r>
+    </w:p>
+    <w:p>
+      <w:pPr>
+        <w:pStyle w:val="BodyText"/>
+      </w:pPr>
+      <w:r>
+        <w:t xml:space="preserve">Invoice lines need a product in</w:t>
+      </w:r>
+      <w:r>
+        <w:t xml:space="preserve"> </w:t>
+      </w:r>
+      <w:r>
+        <w:rPr>
+          <w:i/>
+          <w:iCs/>
+        </w:rPr>
+        <w:t xml:space="preserve">Dimensie's</w:t>
+      </w:r>
+      <w:r>
+        <w:t xml:space="preserve"> </w:t>
+      </w:r>
+      <w:r>
+        <w:t xml:space="preserve">Congressus.</w:t>
+      </w:r>
+      <w:r>
+        <w:t xml:space="preserve"> </w:t>
+      </w:r>
+      <w:r>
+        <w:rPr>
+          <w:rStyle w:val="VerbatimChar"/>
+        </w:rPr>
+        <w:t xml:space="preserve">src/lib/export-offers.ts</w:t>
+      </w:r>
+      <w:r>
+        <w:t xml:space="preserve"> </w:t>
+      </w:r>
+      <w:r>
+        <w:t xml:space="preserve">looks it up in</w:t>
+      </w:r>
+      <w:r>
+        <w:t xml:space="preserve"> </w:t>
+      </w:r>
+      <w:r>
+        <w:rPr>
+          <w:rStyle w:val="VerbatimChar"/>
+        </w:rPr>
+        <w:t xml:space="preserve">PppProductOffer</w:t>
+      </w:r>
+      <w:r>
+        <w:t xml:space="preserve"> </w:t>
+      </w:r>
+      <w:r>
+        <w:t xml:space="preserve">(drink × association) and creates missing ones —</w:t>
+      </w:r>
+      <w:r>
+        <w:t xml:space="preserve"> </w:t>
+      </w:r>
+      <w:r>
+        <w:t xml:space="preserve">Dimensie's own drinks and Stress drinks drunk at joint borrels — in a top-level</w:t>
+      </w:r>
+      <w:r>
+        <w:t xml:space="preserve"> </w:t>
+      </w:r>
+      <w:r>
+        <w:rPr>
+          <w:b/>
+          <w:bCs/>
+        </w:rPr>
+        <w:t xml:space="preserve">"PPP"</w:t>
+      </w:r>
+      <w:r>
+        <w:t xml:space="preserve"> </w:t>
+      </w:r>
+      <w:r>
+        <w:t xml:space="preserve">folder, which is created on the first export</w:t>
+      </w:r>
+      <w:r>
+        <w:t xml:space="preserve"> </w:t>
+      </w:r>
+      <w:r>
+        <w:t xml:space="preserve">(</w:t>
+      </w:r>
+      <w:r>
+        <w:rPr>
+          <w:rStyle w:val="VerbatimChar"/>
+        </w:rPr>
+        <w:t xml:space="preserve">POST /product-folders</w:t>
+      </w:r>
+      <w:r>
+        <w:t xml:space="preserve">) and saved on</w:t>
+      </w:r>
+      <w:r>
+        <w:t xml:space="preserve"> </w:t>
+      </w:r>
+      <w:r>
+        <w:rPr>
+          <w:rStyle w:val="VerbatimChar"/>
+        </w:rPr>
+        <w:t xml:space="preserve">Association.congressusPppFolderId</w:t>
+      </w:r>
+      <w:r>
+        <w:t xml:space="preserve"> </w:t>
+      </w:r>
+      <w:r>
+        <w:t xml:space="preserve">(</w:t>
+      </w:r>
+      <w:r>
+        <w:rPr>
+          <w:rStyle w:val="VerbatimChar"/>
+        </w:rPr>
+        <w:t xml:space="preserve">CONGRESSUS_PPP_FOLDER_ID_DIMENSIE</w:t>
+      </w:r>
+      <w:r>
+        <w:t xml:space="preserve"> </w:t>
+      </w:r>
+      <w:r>
+        <w:t xml:space="preserve">overrides). If Congressus refuses, nothing is</w:t>
+      </w:r>
+      <w:r>
+        <w:t xml:space="preserve"> </w:t>
+      </w:r>
+      <w:r>
+        <w:t xml:space="preserve">exported and every claimed order is released.</w:t>
+      </w:r>
+    </w:p>
+    <w:bookmarkEnd w:id="131"/>
+    <w:bookmarkStart w:id="132" w:name="quick-reference-of-quirks"/>
     <w:p>
       <w:pPr>
         <w:pStyle w:val="Heading2"/>
@@ -22481,9 +22733,9 @@
         <w:br w:type="page"/>
       </w:r>
     </w:p>
-    <w:bookmarkEnd w:id="131"/>
     <w:bookmarkEnd w:id="132"/>
-    <w:bookmarkStart w:id="141" w:name="admin-guide-for-the-board"/>
+    <w:bookmarkEnd w:id="133"/>
+    <w:bookmarkStart w:id="142" w:name="admin-guide-for-the-board"/>
     <w:p>
       <w:pPr>
         <w:pStyle w:val="Heading1"/>
@@ -22715,7 +22967,7 @@
         <w:t xml:space="preserve">their site; "Reset link" sends a new one. Dimensie logins can't get SSS access.</w:t>
       </w:r>
     </w:p>
-    <w:bookmarkStart w:id="133" w:name="dashboard"/>
+    <w:bookmarkStart w:id="134" w:name="dashboard"/>
     <w:p>
       <w:pPr>
         <w:pStyle w:val="Heading2"/>
@@ -22932,8 +23184,8 @@
         <w:t xml:space="preserve">purchases in the chosen period.</w:t>
       </w:r>
     </w:p>
-    <w:bookmarkEnd w:id="133"/>
-    <w:bookmarkStart w:id="134" w:name="members"/>
+    <w:bookmarkEnd w:id="134"/>
+    <w:bookmarkStart w:id="135" w:name="members"/>
     <w:p>
       <w:pPr>
         <w:pStyle w:val="Heading2"/>
@@ -23397,8 +23649,8 @@
         <w:t xml:space="preserve">link cards from the admin panel.</w:t>
       </w:r>
     </w:p>
-    <w:bookmarkEnd w:id="134"/>
-    <w:bookmarkStart w:id="135" w:name="products"/>
+    <w:bookmarkEnd w:id="135"/>
+    <w:bookmarkStart w:id="136" w:name="products"/>
     <w:p>
       <w:pPr>
         <w:pStyle w:val="Heading2"/>
@@ -24024,8 +24276,8 @@
         <w:t xml:space="preserve">— hides a product you no longer sell.</w:t>
       </w:r>
     </w:p>
-    <w:bookmarkEnd w:id="135"/>
-    <w:bookmarkStart w:id="136" w:name="invoices"/>
+    <w:bookmarkEnd w:id="136"/>
+    <w:bookmarkStart w:id="137" w:name="invoices"/>
     <w:p>
       <w:pPr>
         <w:pStyle w:val="Heading2"/>
@@ -24168,73 +24420,43 @@
           <w:b/>
           <w:bCs/>
         </w:rPr>
-        <w:t xml:space="preserve">Export SSS + PPP to Congressus</w:t>
-      </w:r>
-      <w:r>
-        <w:t xml:space="preserve"> </w:t>
-      </w:r>
-      <w:r>
-        <w:t xml:space="preserve">(same button on the SSS and PPP invoices</w:t>
-      </w:r>
-      <w:r>
-        <w:t xml:space="preserve"> </w:t>
-      </w:r>
-      <w:r>
-        <w:t xml:space="preserve">pages) — bills ALL pending snack and drink orders together:</w:t>
-      </w:r>
-      <w:r>
-        <w:t xml:space="preserve"> </w:t>
-      </w:r>
-      <w:r>
-        <w:rPr>
-          <w:b/>
-          <w:bCs/>
-        </w:rPr>
-        <w:t xml:space="preserve">one Congressus</w:t>
-      </w:r>
-      <w:r>
-        <w:rPr>
-          <w:b/>
-          <w:bCs/>
-        </w:rPr>
-        <w:t xml:space="preserve"> </w:t>
-      </w:r>
-      <w:r>
-        <w:rPr>
-          <w:b/>
-          <w:bCs/>
-        </w:rPr>
-        <w:t xml:space="preserve">invoice per member</w:t>
-      </w:r>
-      <w:r>
-        <w:t xml:space="preserve"> </w:t>
-      </w:r>
-      <w:r>
-        <w:t xml:space="preserve">with all their snacks and drinks — also when the orders are</w:t>
-      </w:r>
-      <w:r>
-        <w:t xml:space="preserve"> </w:t>
-      </w:r>
-      <w:r>
-        <w:t xml:space="preserve">from several months ("SSS &amp; PPP oktober 2026", or "SSS &amp; PPP september – oktober</w:t>
-      </w:r>
-      <w:r>
-        <w:t xml:space="preserve"> </w:t>
-      </w:r>
-      <w:r>
-        <w:t xml:space="preserve">2026") — so each member gets one invoice and one direct debit. Members who only</w:t>
-      </w:r>
-      <w:r>
-        <w:t xml:space="preserve"> </w:t>
-      </w:r>
-      <w:r>
-        <w:t xml:space="preserve">had free (€0) orders, e.g. Board or bartender drinks, get no invoice. The orders then</w:t>
-      </w:r>
-      <w:r>
-        <w:t xml:space="preserve"> </w:t>
-      </w:r>
-      <w:r>
-        <w:t xml:space="preserve">move to the Exported tab. Run this once per billing cycle (e.g. monthly).</w:t>
+        <w:t xml:space="preserve">Export Dimensie to Congressus</w:t>
+      </w:r>
+      <w:r>
+        <w:t xml:space="preserve"> </w:t>
+      </w:r>
+      <w:r>
+        <w:t xml:space="preserve">(PPP invoices page, Dimensie and overall</w:t>
+      </w:r>
+      <w:r>
+        <w:t xml:space="preserve"> </w:t>
+      </w:r>
+      <w:r>
+        <w:t xml:space="preserve">logins) — bills Dimensie members' pending drinks (Dimensie and joint borrels) in</w:t>
+      </w:r>
+      <w:r>
+        <w:t xml:space="preserve"> </w:t>
+      </w:r>
+      <w:r>
+        <w:t xml:space="preserve">Dimensie's Congressus: one invoice per member ("Borrels</w:t>
+      </w:r>
+      <w:r>
+        <w:t xml:space="preserve"> </w:t>
+      </w:r>
+      <w:r>
+        <w:t xml:space="preserve">"), no VAT, direct</w:t>
+      </w:r>
+      <w:r>
+        <w:t xml:space="preserve"> </w:t>
+      </w:r>
+      <w:r>
+        <w:t xml:space="preserve">debit. Drinks get a product in Dimensie's Congressus the first time they're</w:t>
+      </w:r>
+      <w:r>
+        <w:t xml:space="preserve"> </w:t>
+      </w:r>
+      <w:r>
+        <w:t xml:space="preserve">exported.</w:t>
       </w:r>
     </w:p>
     <w:p>
@@ -24250,68 +24472,73 @@
           <w:b/>
           <w:bCs/>
         </w:rPr>
-        <w:t xml:space="preserve">⚠️ needs a check</w:t>
-      </w:r>
-      <w:r>
-        <w:t xml:space="preserve"> </w:t>
-      </w:r>
-      <w:r>
-        <w:t xml:space="preserve">— if Congressus didn't clearly answer (e.g. a timeout), the</w:t>
-      </w:r>
-      <w:r>
-        <w:t xml:space="preserve"> </w:t>
-      </w:r>
-      <w:r>
-        <w:t xml:space="preserve">affected orders are locked and listed in a warning at the top. Check in Congressus</w:t>
-      </w:r>
-      <w:r>
-        <w:t xml:space="preserve"> </w:t>
-      </w:r>
-      <w:r>
-        <w:t xml:space="preserve">whether that member has the invoice, then click</w:t>
-      </w:r>
-      <w:r>
-        <w:t xml:space="preserve"> </w:t>
-      </w:r>
-      <w:r>
-        <w:rPr>
-          <w:b/>
-          <w:bCs/>
-        </w:rPr>
-        <w:t xml:space="preserve">It's in Congressus → mark</w:t>
-      </w:r>
-      <w:r>
-        <w:rPr>
-          <w:b/>
-          <w:bCs/>
-        </w:rPr>
-        <w:t xml:space="preserve"> </w:t>
-      </w:r>
-      <w:r>
-        <w:rPr>
-          <w:b/>
-          <w:bCs/>
-        </w:rPr>
-        <w:t xml:space="preserve">exported</w:t>
-      </w:r>
-      <w:r>
-        <w:t xml:space="preserve"> </w:t>
-      </w:r>
-      <w:r>
-        <w:t xml:space="preserve">or</w:t>
-      </w:r>
-      <w:r>
-        <w:t xml:space="preserve"> </w:t>
-      </w:r>
-      <w:r>
-        <w:rPr>
-          <w:b/>
-          <w:bCs/>
-        </w:rPr>
-        <w:t xml:space="preserve">Not in Congressus → back to pending</w:t>
-      </w:r>
-      <w:r>
-        <w:t xml:space="preserve">.</w:t>
+        <w:t xml:space="preserve">Export SSS + PPP to Congressus</w:t>
+      </w:r>
+      <w:r>
+        <w:t xml:space="preserve"> </w:t>
+      </w:r>
+      <w:r>
+        <w:t xml:space="preserve">(same button on the SSS and PPP invoices</w:t>
+      </w:r>
+      <w:r>
+        <w:t xml:space="preserve"> </w:t>
+      </w:r>
+      <w:r>
+        <w:t xml:space="preserve">pages; on the PPP page "Export Stress") — bills ALL pending snack and drink orders together:</w:t>
+      </w:r>
+      <w:r>
+        <w:t xml:space="preserve"> </w:t>
+      </w:r>
+      <w:r>
+        <w:rPr>
+          <w:b/>
+          <w:bCs/>
+        </w:rPr>
+        <w:t xml:space="preserve">one Congressus</w:t>
+      </w:r>
+      <w:r>
+        <w:rPr>
+          <w:b/>
+          <w:bCs/>
+        </w:rPr>
+        <w:t xml:space="preserve"> </w:t>
+      </w:r>
+      <w:r>
+        <w:rPr>
+          <w:b/>
+          <w:bCs/>
+        </w:rPr>
+        <w:t xml:space="preserve">invoice per member</w:t>
+      </w:r>
+      <w:r>
+        <w:t xml:space="preserve"> </w:t>
+      </w:r>
+      <w:r>
+        <w:t xml:space="preserve">with all their snacks and drinks — also when the orders are</w:t>
+      </w:r>
+      <w:r>
+        <w:t xml:space="preserve"> </w:t>
+      </w:r>
+      <w:r>
+        <w:t xml:space="preserve">from several months ("SSS &amp; PPP oktober 2026", or "SSS &amp; PPP september – oktober</w:t>
+      </w:r>
+      <w:r>
+        <w:t xml:space="preserve"> </w:t>
+      </w:r>
+      <w:r>
+        <w:t xml:space="preserve">2026") — so each member gets one invoice and one direct debit. Members who only</w:t>
+      </w:r>
+      <w:r>
+        <w:t xml:space="preserve"> </w:t>
+      </w:r>
+      <w:r>
+        <w:t xml:space="preserve">had free (€0) orders, e.g. Board or bartender drinks, get no invoice. The orders then</w:t>
+      </w:r>
+      <w:r>
+        <w:t xml:space="preserve"> </w:t>
+      </w:r>
+      <w:r>
+        <w:t xml:space="preserve">move to the Exported tab. Run this once per billing cycle (e.g. monthly).</w:t>
       </w:r>
     </w:p>
     <w:p>
@@ -24327,6 +24554,83 @@
           <w:b/>
           <w:bCs/>
         </w:rPr>
+        <w:t xml:space="preserve">⚠️ needs a check</w:t>
+      </w:r>
+      <w:r>
+        <w:t xml:space="preserve"> </w:t>
+      </w:r>
+      <w:r>
+        <w:t xml:space="preserve">— if Congressus didn't clearly answer (e.g. a timeout), the</w:t>
+      </w:r>
+      <w:r>
+        <w:t xml:space="preserve"> </w:t>
+      </w:r>
+      <w:r>
+        <w:t xml:space="preserve">affected orders are locked and listed in a warning at the top. Check in Congressus</w:t>
+      </w:r>
+      <w:r>
+        <w:t xml:space="preserve"> </w:t>
+      </w:r>
+      <w:r>
+        <w:t xml:space="preserve">whether that member has the invoice, then click</w:t>
+      </w:r>
+      <w:r>
+        <w:t xml:space="preserve"> </w:t>
+      </w:r>
+      <w:r>
+        <w:rPr>
+          <w:b/>
+          <w:bCs/>
+        </w:rPr>
+        <w:t xml:space="preserve">It's in Congressus → mark</w:t>
+      </w:r>
+      <w:r>
+        <w:rPr>
+          <w:b/>
+          <w:bCs/>
+        </w:rPr>
+        <w:t xml:space="preserve"> </w:t>
+      </w:r>
+      <w:r>
+        <w:rPr>
+          <w:b/>
+          <w:bCs/>
+        </w:rPr>
+        <w:t xml:space="preserve">exported</w:t>
+      </w:r>
+      <w:r>
+        <w:t xml:space="preserve"> </w:t>
+      </w:r>
+      <w:r>
+        <w:t xml:space="preserve">or</w:t>
+      </w:r>
+      <w:r>
+        <w:t xml:space="preserve"> </w:t>
+      </w:r>
+      <w:r>
+        <w:rPr>
+          <w:b/>
+          <w:bCs/>
+        </w:rPr>
+        <w:t xml:space="preserve">Not in Congressus → back to pending</w:t>
+      </w:r>
+      <w:r>
+        <w:t xml:space="preserve">.</w:t>
+      </w:r>
+    </w:p>
+    <w:p>
+      <w:pPr>
+        <w:pStyle w:val="Compact"/>
+        <w:numPr>
+          <w:ilvl w:val="0"/>
+          <w:numId w:val="1041"/>
+        </w:numPr>
+      </w:pPr>
+      <w:r>
+        <w:rPr>
+          <w:b/>
+          <w:bCs/>
+        </w:rPr>
         <w:t xml:space="preserve">Clear all … (test data)</w:t>
       </w:r>
       <w:r>
@@ -24372,8 +24676,8 @@
         <w:t xml:space="preserve">corrections after export must be made in Congressus directly.</w:t>
       </w:r>
     </w:p>
-    <w:bookmarkEnd w:id="136"/>
-    <w:bookmarkStart w:id="137" w:name="wall-street-bar"/>
+    <w:bookmarkEnd w:id="137"/>
+    <w:bookmarkStart w:id="138" w:name="wall-street-bar"/>
     <w:p>
       <w:pPr>
         <w:pStyle w:val="Heading2"/>
@@ -24545,8 +24849,8 @@
         <w:t xml:space="preserve">at the end: normal prices again. (Closing the activity also stops it.)</w:t>
       </w:r>
     </w:p>
-    <w:bookmarkEnd w:id="137"/>
-    <w:bookmarkStart w:id="138" w:name="external-cards-bar"/>
+    <w:bookmarkEnd w:id="138"/>
+    <w:bookmarkStart w:id="139" w:name="external-cards-bar"/>
     <w:p>
       <w:pPr>
         <w:pStyle w:val="Heading2"/>
@@ -24908,8 +25212,8 @@
         <w:t xml:space="preserve">dashboard, never in the P/L.</w:t>
       </w:r>
     </w:p>
-    <w:bookmarkEnd w:id="138"/>
-    <w:bookmarkStart w:id="139" w:name="typical-monthly-routine"/>
+    <w:bookmarkEnd w:id="139"/>
+    <w:bookmarkStart w:id="140" w:name="typical-monthly-routine"/>
     <w:p>
       <w:pPr>
         <w:pStyle w:val="Heading2"/>
@@ -25002,8 +25306,8 @@
         <w:t xml:space="preserve">Verify the new invoices in Congressus.</w:t>
       </w:r>
     </w:p>
-    <w:bookmarkEnd w:id="139"/>
-    <w:bookmarkStart w:id="140" w:name="Xdfdd6fef4644c16841a13fbca3b793942ebb4aa"/>
+    <w:bookmarkEnd w:id="140"/>
+    <w:bookmarkStart w:id="141" w:name="Xdfdd6fef4644c16841a13fbca3b793942ebb4aa"/>
     <w:p>
       <w:pPr>
         <w:pStyle w:val="Heading2"/>
@@ -25139,9 +25443,9 @@
         <w:br w:type="page"/>
       </w:r>
     </w:p>
-    <w:bookmarkEnd w:id="140"/>
     <w:bookmarkEnd w:id="141"/>
-    <w:bookmarkStart w:id="166" w:name="ppp--bar-pos-drinks-at-activities"/>
+    <w:bookmarkEnd w:id="142"/>
+    <w:bookmarkStart w:id="167" w:name="ppp--bar-pos-drinks-at-activities"/>
     <w:p>
       <w:pPr>
         <w:pStyle w:val="Heading1"/>
@@ -25316,7 +25620,7 @@
         <w:t xml:space="preserve">  Member card ──tap──▶ Bar POS ──confirm──▶ PppInvoice ──monthly──▶ Congressus ("SSS &amp; PPP &lt;month&gt;")</w:t>
       </w:r>
     </w:p>
-    <w:bookmarkStart w:id="142" w:name="surfaces"/>
+    <w:bookmarkStart w:id="143" w:name="surfaces"/>
     <w:p>
       <w:pPr>
         <w:pStyle w:val="Heading2"/>
@@ -25753,8 +26057,8 @@
         <w:t xml:space="preserve">is public).</w:t>
       </w:r>
     </w:p>
-    <w:bookmarkEnd w:id="142"/>
-    <w:bookmarkStart w:id="145" w:name="the-pos-screen-pppactivityid"/>
+    <w:bookmarkEnd w:id="143"/>
+    <w:bookmarkStart w:id="146" w:name="the-pos-screen-pppactivityid"/>
     <w:p>
       <w:pPr>
         <w:pStyle w:val="Heading2"/>
@@ -26803,7 +27107,7 @@
         <w:t xml:space="preserve">query, same as the kiosk.</w:t>
       </w:r>
     </w:p>
-    <w:bookmarkStart w:id="144" w:name="android-phone-as-an-nfc-kiosk-modenfc"/>
+    <w:bookmarkStart w:id="145" w:name="android-phone-as-an-nfc-kiosk-modenfc"/>
     <w:p>
       <w:pPr>
         <w:pStyle w:val="Heading3"/>
@@ -27500,7 +27804,7 @@
       <w:r>
         <w:t xml:space="preserve"> </w:t>
       </w:r>
-      <w:hyperlink r:id="rId143">
+      <w:hyperlink r:id="rId144">
         <w:r>
           <w:rPr>
             <w:rStyle w:val="Hyperlink"/>
@@ -27512,9 +27816,9 @@
         <w:t xml:space="preserve">.</w:t>
       </w:r>
     </w:p>
-    <w:bookmarkEnd w:id="144"/>
     <w:bookmarkEnd w:id="145"/>
-    <w:bookmarkStart w:id="146" w:name="X7d5a9b22ff48fb0085a913657aa06a04cfa6a91"/>
+    <w:bookmarkEnd w:id="146"/>
+    <w:bookmarkStart w:id="147" w:name="X7d5a9b22ff48fb0085a913657aa06a04cfa6a91"/>
     <w:p>
       <w:pPr>
         <w:pStyle w:val="Heading2"/>
@@ -28115,8 +28419,8 @@
         <w:t xml:space="preserve">only work at Stress borrels.</w:t>
       </w:r>
     </w:p>
-    <w:bookmarkEnd w:id="146"/>
-    <w:bookmarkStart w:id="153" w:name="pricing--discounts"/>
+    <w:bookmarkEnd w:id="147"/>
+    <w:bookmarkStart w:id="154" w:name="pricing--discounts"/>
     <w:p>
       <w:pPr>
         <w:pStyle w:val="Heading2"/>
@@ -28178,7 +28482,7 @@
         <w:t xml:space="preserve">— the client never sets prices.</w:t>
       </w:r>
     </w:p>
-    <w:bookmarkStart w:id="147" w:name="member-roles-memberrole"/>
+    <w:bookmarkStart w:id="148" w:name="member-roles-memberrole"/>
     <w:p>
       <w:pPr>
         <w:pStyle w:val="Heading3"/>
@@ -28419,8 +28723,8 @@
         <w:t xml:space="preserve">.</w:t>
       </w:r>
     </w:p>
-    <w:bookmarkEnd w:id="147"/>
-    <w:bookmarkStart w:id="148" w:name="Xdc2cc5689f60cdecc95c97ccb849e07d18c3f1b"/>
+    <w:bookmarkEnd w:id="148"/>
+    <w:bookmarkStart w:id="149" w:name="Xdc2cc5689f60cdecc95c97ccb849e07d18c3f1b"/>
     <w:p>
       <w:pPr>
         <w:pStyle w:val="Heading3"/>
@@ -28482,8 +28786,8 @@
         <w:t xml:space="preserve">(so an already-discounted drink doesn't also get €0.75 off).</w:t>
       </w:r>
     </w:p>
-    <w:bookmarkEnd w:id="148"/>
-    <w:bookmarkStart w:id="149" w:name="Xda7dac18422d7a5f8c5c30b94cce3929299f78b"/>
+    <w:bookmarkEnd w:id="149"/>
+    <w:bookmarkStart w:id="150" w:name="Xda7dac18422d7a5f8c5c30b94cce3929299f78b"/>
     <w:p>
       <w:pPr>
         <w:pStyle w:val="Heading3"/>
@@ -28553,8 +28857,8 @@
         <w:t xml:space="preserve">percentage role discounts apply on top.</w:t>
       </w:r>
     </w:p>
-    <w:bookmarkEnd w:id="149"/>
-    <w:bookmarkStart w:id="150" w:name="X52d93846910a4db1f279ccfc2712d1574c029da"/>
+    <w:bookmarkEnd w:id="150"/>
+    <w:bookmarkStart w:id="151" w:name="X52d93846910a4db1f279ccfc2712d1574c029da"/>
     <w:p>
       <w:pPr>
         <w:pStyle w:val="Heading3"/>
@@ -28679,8 +28983,8 @@
         <w:t xml:space="preserve">price  = base − bestRoleDiscount(base, roles, ignoreFixed = isSpecial)   (never &lt; 0)</w:t>
       </w:r>
     </w:p>
-    <w:bookmarkEnd w:id="150"/>
-    <w:bookmarkStart w:id="151" w:name="discount-reporting-budget-per-borrel"/>
+    <w:bookmarkEnd w:id="151"/>
+    <w:bookmarkStart w:id="152" w:name="discount-reporting-budget-per-borrel"/>
     <w:p>
       <w:pPr>
         <w:pStyle w:val="Heading3"/>
@@ -28842,8 +29146,8 @@
         <w:t xml:space="preserve">— everything (specials + roles/free drinks): Σ (list − charged) × qty.</w:t>
       </w:r>
     </w:p>
-    <w:bookmarkEnd w:id="151"/>
-    <w:bookmarkStart w:id="152" w:name="Xf0315f0e6993867b2a2e5e20e7c16d85903a818"/>
+    <w:bookmarkEnd w:id="152"/>
+    <w:bookmarkStart w:id="153" w:name="Xf0315f0e6993867b2a2e5e20e7c16d85903a818"/>
     <w:p>
       <w:pPr>
         <w:pStyle w:val="Heading3"/>
@@ -29099,9 +29403,9 @@
         <w:t xml:space="preserve">of bartender-free lines (with the free-drink count).</w:t>
       </w:r>
     </w:p>
-    <w:bookmarkEnd w:id="152"/>
     <w:bookmarkEnd w:id="153"/>
-    <w:bookmarkStart w:id="154" w:name="bartender-accounts"/>
+    <w:bookmarkEnd w:id="154"/>
+    <w:bookmarkStart w:id="155" w:name="bartender-accounts"/>
     <w:p>
       <w:pPr>
         <w:pStyle w:val="Heading2"/>
@@ -29386,8 +29690,8 @@
         <w:t xml:space="preserve">rate-limited (it's a convenience, weaker than the password).</w:t>
       </w:r>
     </w:p>
-    <w:bookmarkEnd w:id="154"/>
-    <w:bookmarkStart w:id="155" w:name="sbz-prices-cost-of-goods"/>
+    <w:bookmarkEnd w:id="155"/>
+    <w:bookmarkStart w:id="156" w:name="sbz-prices-cost-of-goods"/>
     <w:p>
       <w:pPr>
         <w:pStyle w:val="Heading2"/>
@@ -29872,8 +30176,8 @@
         <w:t xml:space="preserve">valid on that borrel's date; the page names which list applies.</w:t>
       </w:r>
     </w:p>
-    <w:bookmarkEnd w:id="155"/>
-    <w:bookmarkStart w:id="156" w:name="admin-pages-pppadmin"/>
+    <w:bookmarkEnd w:id="156"/>
+    <w:bookmarkStart w:id="157" w:name="admin-pages-pppadmin"/>
     <w:p>
       <w:pPr>
         <w:pStyle w:val="Heading2"/>
@@ -30859,8 +31163,8 @@
         <w:t xml:space="preserve">a toggle picker per member).</w:t>
       </w:r>
     </w:p>
-    <w:bookmarkEnd w:id="156"/>
-    <w:bookmarkStart w:id="157" w:name="wall-street-mode"/>
+    <w:bookmarkEnd w:id="157"/>
+    <w:bookmarkStart w:id="158" w:name="wall-street-mode"/>
     <w:p>
       <w:pPr>
         <w:pStyle w:val="Heading2"/>
@@ -31516,8 +31820,8 @@
         <w:t xml:space="preserve">every 3 s.</w:t>
       </w:r>
     </w:p>
-    <w:bookmarkEnd w:id="157"/>
-    <w:bookmarkStart w:id="158" w:name="external-cards"/>
+    <w:bookmarkEnd w:id="158"/>
+    <w:bookmarkStart w:id="159" w:name="external-cards"/>
     <w:p>
       <w:pPr>
         <w:pStyle w:val="Heading2"/>
@@ -32227,8 +32531,8 @@
         <w:t xml:space="preserve">.</w:t>
       </w:r>
     </w:p>
-    <w:bookmarkEnd w:id="158"/>
-    <w:bookmarkStart w:id="159" w:name="activity-profitloss"/>
+    <w:bookmarkEnd w:id="159"/>
+    <w:bookmarkStart w:id="160" w:name="activity-profitloss"/>
     <w:p>
       <w:pPr>
         <w:pStyle w:val="Heading2"/>
@@ -32978,8 +33282,8 @@
         <w:t xml:space="preserve">late refund.</w:t>
       </w:r>
     </w:p>
-    <w:bookmarkEnd w:id="159"/>
-    <w:bookmarkStart w:id="160" w:name="congressus"/>
+    <w:bookmarkEnd w:id="160"/>
+    <w:bookmarkStart w:id="161" w:name="congressus"/>
     <w:p>
       <w:pPr>
         <w:pStyle w:val="Heading2"/>
@@ -33329,8 +33633,8 @@
         <w:t xml:space="preserve">with the same Congressus invoice id.</w:t>
       </w:r>
     </w:p>
-    <w:bookmarkEnd w:id="160"/>
-    <w:bookmarkStart w:id="161" w:name="alexia-integration-scheduled-borrels"/>
+    <w:bookmarkEnd w:id="161"/>
+    <w:bookmarkStart w:id="162" w:name="alexia-integration-scheduled-borrels"/>
     <w:p>
       <w:pPr>
         <w:pStyle w:val="Heading2"/>
@@ -33894,8 +34198,8 @@
         <w:t xml:space="preserve">).</w:t>
       </w:r>
     </w:p>
-    <w:bookmarkEnd w:id="161"/>
-    <w:bookmarkStart w:id="163" w:name="data-model-ppp"/>
+    <w:bookmarkEnd w:id="162"/>
+    <w:bookmarkStart w:id="164" w:name="data-model-ppp"/>
     <w:p>
       <w:pPr>
         <w:pStyle w:val="Heading2"/>
@@ -33914,7 +34218,7 @@
       <w:r>
         <w:t xml:space="preserve"> </w:t>
       </w:r>
-      <w:hyperlink r:id="rId162">
+      <w:hyperlink r:id="rId163">
         <w:r>
           <w:rPr>
             <w:rStyle w:val="Hyperlink"/>
@@ -34865,8 +35169,8 @@
         <w:t xml:space="preserve">unchanged for identity.</w:t>
       </w:r>
     </w:p>
-    <w:bookmarkEnd w:id="163"/>
-    <w:bookmarkStart w:id="164" w:name="api-reference-ppp"/>
+    <w:bookmarkEnd w:id="164"/>
+    <w:bookmarkStart w:id="165" w:name="api-reference-ppp"/>
     <w:p>
       <w:pPr>
         <w:pStyle w:val="Heading2"/>
@@ -36289,8 +36593,8 @@
         <w:t xml:space="preserve">.</w:t>
       </w:r>
     </w:p>
-    <w:bookmarkEnd w:id="164"/>
-    <w:bookmarkStart w:id="165" w:name="environment"/>
+    <w:bookmarkEnd w:id="165"/>
+    <w:bookmarkStart w:id="166" w:name="environment"/>
     <w:p>
       <w:pPr>
         <w:pStyle w:val="Heading2"/>
@@ -36709,9 +37013,9 @@
         <w:br w:type="page"/>
       </w:r>
     </w:p>
-    <w:bookmarkEnd w:id="165"/>
     <w:bookmarkEnd w:id="166"/>
-    <w:bookmarkStart w:id="183" w:name="security-model"/>
+    <w:bookmarkEnd w:id="167"/>
+    <w:bookmarkStart w:id="184" w:name="security-model"/>
     <w:p>
       <w:pPr>
         <w:pStyle w:val="Heading1"/>
@@ -36764,7 +37068,7 @@
         <w:t xml:space="preserve">trade-offs made for a shared, physical kiosk.</w:t>
       </w:r>
     </w:p>
-    <w:bookmarkStart w:id="172" w:name="authentication--authorisation"/>
+    <w:bookmarkStart w:id="173" w:name="authentication--authorisation"/>
     <w:p>
       <w:pPr>
         <w:pStyle w:val="Heading2"/>
@@ -36773,7 +37077,7 @@
         <w:t xml:space="preserve">Authentication &amp; authorisation</w:t>
       </w:r>
     </w:p>
-    <w:bookmarkStart w:id="167" w:name="two-sites-separate-logins"/>
+    <w:bookmarkStart w:id="168" w:name="two-sites-separate-logins"/>
     <w:p>
       <w:pPr>
         <w:pStyle w:val="Heading3"/>
@@ -37016,8 +37320,8 @@
         <w:t xml:space="preserve">account without access to the site it signs in on.</w:t>
       </w:r>
     </w:p>
-    <w:bookmarkEnd w:id="167"/>
-    <w:bookmarkStart w:id="168" w:name="admin"/>
+    <w:bookmarkEnd w:id="168"/>
+    <w:bookmarkStart w:id="169" w:name="admin"/>
     <w:p>
       <w:pPr>
         <w:pStyle w:val="Heading3"/>
@@ -37533,8 +37837,8 @@
         <w:t xml:space="preserve">is in the handlers (a forged/expired cookie passes middleware but is rejected).</w:t>
       </w:r>
     </w:p>
-    <w:bookmarkEnd w:id="168"/>
-    <w:bookmarkStart w:id="169" w:name="bar-pos-bartenders"/>
+    <w:bookmarkEnd w:id="169"/>
+    <w:bookmarkStart w:id="170" w:name="bar-pos-bartenders"/>
     <w:p>
       <w:pPr>
         <w:pStyle w:val="Heading3"/>
@@ -37702,8 +38006,8 @@
         <w:t xml:space="preserve">Plus the client-side idle sign-out after 1 h without orders (see PPP.md).</w:t>
       </w:r>
     </w:p>
-    <w:bookmarkEnd w:id="169"/>
-    <w:bookmarkStart w:id="170" w:name="shop-members"/>
+    <w:bookmarkEnd w:id="170"/>
+    <w:bookmarkStart w:id="171" w:name="shop-members"/>
     <w:p>
       <w:pPr>
         <w:pStyle w:val="Heading3"/>
@@ -37887,8 +38191,8 @@
         <w:t xml:space="preserve">away can't leave their account open for the next person.</w:t>
       </w:r>
     </w:p>
-    <w:bookmarkEnd w:id="170"/>
-    <w:bookmarkStart w:id="171" w:name="card-verification"/>
+    <w:bookmarkEnd w:id="171"/>
+    <w:bookmarkStart w:id="172" w:name="card-verification"/>
     <w:p>
       <w:pPr>
         <w:pStyle w:val="Heading3"/>
@@ -37974,9 +38278,9 @@
         <w:t xml:space="preserve">member clicked.</w:t>
       </w:r>
     </w:p>
-    <w:bookmarkEnd w:id="171"/>
     <w:bookmarkEnd w:id="172"/>
-    <w:bookmarkStart w:id="173" w:name="X77f42a2852d9dd86410b0545fad3e0fbb180833"/>
+    <w:bookmarkEnd w:id="173"/>
+    <w:bookmarkStart w:id="174" w:name="X77f42a2852d9dd86410b0545fad3e0fbb180833"/>
     <w:p>
       <w:pPr>
         <w:pStyle w:val="Heading2"/>
@@ -38217,8 +38521,8 @@
         </w:tc>
       </w:tr>
     </w:tbl>
-    <w:bookmarkEnd w:id="173"/>
-    <w:bookmarkStart w:id="174" w:name="rate-limiting"/>
+    <w:bookmarkEnd w:id="174"/>
+    <w:bookmarkStart w:id="175" w:name="rate-limiting"/>
     <w:p>
       <w:pPr>
         <w:pStyle w:val="Heading2"/>
@@ -38328,8 +38632,8 @@
         <w:t xml:space="preserve">a shared store (e.g. Redis).</w:t>
       </w:r>
     </w:p>
-    <w:bookmarkEnd w:id="174"/>
-    <w:bookmarkStart w:id="175" w:name="injection--output-safety"/>
+    <w:bookmarkEnd w:id="175"/>
+    <w:bookmarkStart w:id="176" w:name="injection--output-safety"/>
     <w:p>
       <w:pPr>
         <w:pStyle w:val="Heading2"/>
@@ -38435,8 +38739,8 @@
         <w:t xml:space="preserve">correctly.</w:t>
       </w:r>
     </w:p>
-    <w:bookmarkEnd w:id="175"/>
-    <w:bookmarkStart w:id="176" w:name="http-security-headers"/>
+    <w:bookmarkEnd w:id="176"/>
+    <w:bookmarkStart w:id="177" w:name="http-security-headers"/>
     <w:p>
       <w:pPr>
         <w:pStyle w:val="Heading2"/>
@@ -38606,8 +38910,8 @@
         <w:t xml:space="preserve">scripts — not done yet.)</w:t>
       </w:r>
     </w:p>
-    <w:bookmarkEnd w:id="176"/>
-    <w:bookmarkStart w:id="180" w:name="deliberate-trade-offs"/>
+    <w:bookmarkEnd w:id="177"/>
+    <w:bookmarkStart w:id="181" w:name="deliberate-trade-offs"/>
     <w:p>
       <w:pPr>
         <w:pStyle w:val="Heading2"/>
@@ -38616,7 +38920,7 @@
         <w:t xml:space="preserve">Deliberate trade-offs</w:t>
       </w:r>
     </w:p>
-    <w:bookmarkStart w:id="177" w:name="card-uids-arent-secret"/>
+    <w:bookmarkStart w:id="178" w:name="card-uids-arent-secret"/>
     <w:p>
       <w:pPr>
         <w:pStyle w:val="Heading3"/>
@@ -38660,8 +38964,8 @@
         <w:t xml:space="preserve">to the kiosk's IP at the network layer.</w:t>
       </w:r>
     </w:p>
-    <w:bookmarkEnd w:id="177"/>
-    <w:bookmarkStart w:id="178" w:name="email-not-found-vs-enumeration"/>
+    <w:bookmarkEnd w:id="178"/>
+    <w:bookmarkStart w:id="179" w:name="email-not-found-vs-enumeration"/>
     <w:p>
       <w:pPr>
         <w:pStyle w:val="Heading3"/>
@@ -38751,8 +39055,8 @@
         <w:t xml:space="preserve">.</w:t>
       </w:r>
     </w:p>
-    <w:bookmarkEnd w:id="178"/>
-    <w:bookmarkStart w:id="179" w:name="shop-token-is-a-bearer-token-in-the-url"/>
+    <w:bookmarkEnd w:id="179"/>
+    <w:bookmarkStart w:id="180" w:name="shop-token-is-a-bearer-token-in-the-url"/>
     <w:p>
       <w:pPr>
         <w:pStyle w:val="Heading3"/>
@@ -38814,9 +39118,9 @@
         <w:t xml:space="preserve">token instead of a cuid.</w:t>
       </w:r>
     </w:p>
-    <w:bookmarkEnd w:id="179"/>
     <w:bookmarkEnd w:id="180"/>
-    <w:bookmarkStart w:id="181" w:name="prohibited--careful-operations"/>
+    <w:bookmarkEnd w:id="181"/>
+    <w:bookmarkStart w:id="182" w:name="prohibited--careful-operations"/>
     <w:p>
       <w:pPr>
         <w:pStyle w:val="Heading2"/>
@@ -39031,8 +39335,8 @@
         <w:t xml:space="preserve">intended for test-data cleanup only.</w:t>
       </w:r>
     </w:p>
-    <w:bookmarkEnd w:id="181"/>
-    <w:bookmarkStart w:id="182" w:name="audit-checklist"/>
+    <w:bookmarkEnd w:id="182"/>
+    <w:bookmarkStart w:id="183" w:name="audit-checklist"/>
     <w:p>
       <w:pPr>
         <w:pStyle w:val="Heading2"/>
@@ -39162,8 +39466,8 @@
         <w:t xml:space="preserve">forged-cookie requests both get 401/redirect.</w:t>
       </w:r>
     </w:p>
-    <w:bookmarkEnd w:id="182"/>
     <w:bookmarkEnd w:id="183"/>
+    <w:bookmarkEnd w:id="184"/>
     <w:sectPr>
       <w:footnotePr>
         <w:numRestart w:val="eachSect"/>

</xml_diff>

<commit_message>
People in both associations: cards per person, card moves, payer and card-login fixes
- Cards belong to the person: both associations' admins see and can unlink
  them on whichever membership they're stored.
- Member sync moves cards to a new Stress membership, and away from a
  deactivated/removed membership to the person's other active one.
- Joint borrel: an inactive Stress membership falls back to the active
  Dimensie one. Bartender card login finds the account on either membership.
- Deleting a membership keeps the card on the person's other membership.
- POS: no "use as external card" at Dimensie borrels.

Co-Authored-By: Claude Opus 5.5 <noreply@anthropic.com>
</commit_message>
<xml_diff>
--- a/docs/SSS-Documentation.docx
+++ b/docs/SSS-Documentation.docx
@@ -28301,6 +28301,61 @@
       </w:r>
       <w:r>
         <w:t xml:space="preserve">is stored on the Stress membership if there is one (the snack kiosk is Stress's).</w:t>
+      </w:r>
+      <w:r>
+        <w:t xml:space="preserve"> </w:t>
+      </w:r>
+      <w:r>
+        <w:t xml:space="preserve">Cards belong to the</w:t>
+      </w:r>
+      <w:r>
+        <w:t xml:space="preserve"> </w:t>
+      </w:r>
+      <w:r>
+        <w:rPr>
+          <w:b/>
+          <w:bCs/>
+        </w:rPr>
+        <w:t xml:space="preserve">person</w:t>
+      </w:r>
+      <w:r>
+        <w:t xml:space="preserve">: both associations' admins see them (and can</w:t>
+      </w:r>
+      <w:r>
+        <w:t xml:space="preserve"> </w:t>
+      </w:r>
+      <w:r>
+        <w:t xml:space="preserve">unlink a lost one) on whichever membership they're stored. The member sync moves</w:t>
+      </w:r>
+      <w:r>
+        <w:t xml:space="preserve"> </w:t>
+      </w:r>
+      <w:r>
+        <w:t xml:space="preserve">cards when someone joins Stress (to the new Stress membership) and when a</w:t>
+      </w:r>
+      <w:r>
+        <w:t xml:space="preserve"> </w:t>
+      </w:r>
+      <w:r>
+        <w:t xml:space="preserve">membership is deactivated or removed (to their other, active membership);</w:t>
+      </w:r>
+      <w:r>
+        <w:t xml:space="preserve"> </w:t>
+      </w:r>
+      <w:r>
+        <w:t xml:space="preserve">earlier orders stay with the membership that paid. A person whose Stress</w:t>
+      </w:r>
+      <w:r>
+        <w:t xml:space="preserve"> </w:t>
+      </w:r>
+      <w:r>
+        <w:t xml:space="preserve">membership is inactive pays as Dimensie member at a joint borrel. Bartender</w:t>
+      </w:r>
+      <w:r>
+        <w:t xml:space="preserve"> </w:t>
+      </w:r>
+      <w:r>
+        <w:t xml:space="preserve">card login finds the account on either membership.</w:t>
       </w:r>
     </w:p>
     <w:p>

</xml_diff>

<commit_message>
Specifications to Dimensie are created by each Dimensie export
- A Dimensie export creates the specification of the joint-borrel drinks it has
  now billed (EXPORTED, not yet specified); numbered STRESS-DIM-<year>-NNN, period
  from the borrel dates. No month picker / manual finalise; Create now + Undo stay.
- The export never fails on it; the result message names the specification.
- Page: To Dimensie / From Stress, with what's waiting for the next specification.

Co-Authored-By: Claude Opus 5.5 <noreply@anthropic.com>
</commit_message>
<xml_diff>
--- a/docs/SSS-Documentation.docx
+++ b/docs/SSS-Documentation.docx
@@ -24499,7 +24499,7 @@
           <w:b/>
           <w:bCs/>
         </w:rPr>
-        <w:t xml:space="preserve">Dimensie invoices</w:t>
+        <w:t xml:space="preserve">To Dimensie</w:t>
       </w:r>
       <w:r>
         <w:t xml:space="preserve"> </w:t>
@@ -24518,38 +24518,31 @@
         <w:t xml:space="preserve">From Stress</w:t>
       </w:r>
       <w:r>
-        <w:t xml:space="preserve">) — once a month,</w:t>
-      </w:r>
-      <w:r>
-        <w:t xml:space="preserve"> </w:t>
-      </w:r>
-      <w:r>
-        <w:t xml:space="preserve">open the draft for last month, check it and</w:t>
-      </w:r>
-      <w:r>
-        <w:t xml:space="preserve"> </w:t>
-      </w:r>
-      <w:r>
-        <w:rPr>
-          <w:b/>
-          <w:bCs/>
-        </w:rPr>
-        <w:t xml:space="preserve">Finalise</w:t>
-      </w:r>
-      <w:r>
-        <w:t xml:space="preserve">: it freezes what Dimensie</w:t>
-      </w:r>
-      <w:r>
-        <w:t xml:space="preserve"> </w:t>
-      </w:r>
-      <w:r>
-        <w:t xml:space="preserve">members drank at joint borrels (drink prices before Dimensie's own discounts,</w:t>
-      </w:r>
-      <w:r>
-        <w:t xml:space="preserve"> </w:t>
-      </w:r>
-      <w:r>
-        <w:t xml:space="preserve">incl. VAT, without bartender drinks) and locks those orders. Download the</w:t>
+        <w:t xml:space="preserve">) — each time Dimensie</w:t>
+      </w:r>
+      <w:r>
+        <w:t xml:space="preserve"> </w:t>
+      </w:r>
+      <w:r>
+        <w:t xml:space="preserve">exports its invoices, a specification is created of what Dimensie members drank at</w:t>
+      </w:r>
+      <w:r>
+        <w:t xml:space="preserve"> </w:t>
+      </w:r>
+      <w:r>
+        <w:t xml:space="preserve">joint borrels and Dimensie has now billed (drink prices before Dimensie's own</w:t>
+      </w:r>
+      <w:r>
+        <w:t xml:space="preserve"> </w:t>
+      </w:r>
+      <w:r>
+        <w:t xml:space="preserve">discounts, incl. VAT, without bartender drinks); those orders are locked. The</w:t>
+      </w:r>
+      <w:r>
+        <w:t xml:space="preserve"> </w:t>
+      </w:r>
+      <w:r>
+        <w:t xml:space="preserve">treasurer downloads the</w:t>
       </w:r>
       <w:r>
         <w:t xml:space="preserve"> </w:t>
@@ -24565,7 +24558,7 @@
         <w:t xml:space="preserve"> </w:t>
       </w:r>
       <w:r>
-        <w:t xml:space="preserve">and</w:t>
+        <w:t xml:space="preserve">/</w:t>
       </w:r>
       <w:r>
         <w:t xml:space="preserve"> </w:t>
@@ -24578,10 +24571,13 @@
         <w:t xml:space="preserve">CSV</w:t>
       </w:r>
       <w:r>
-        <w:t xml:space="preserve"> </w:t>
-      </w:r>
-      <w:r>
-        <w:t xml:space="preserve">for the treasurer, who books them and sends them to Dimensie; then</w:t>
+        <w:t xml:space="preserve">, attaches it to their own invoice to</w:t>
+      </w:r>
+      <w:r>
+        <w:t xml:space="preserve"> </w:t>
+      </w:r>
+      <w:r>
+        <w:t xml:space="preserve">Dimensie, books and sends it, then clicks</w:t>
       </w:r>
       <w:r>
         <w:t xml:space="preserve"> </w:t>
@@ -24597,13 +24593,13 @@
         <w:t xml:space="preserve"> </w:t>
       </w:r>
       <w:r>
-        <w:t xml:space="preserve">— only from then on does Dimensie see it under "From</w:t>
-      </w:r>
-      <w:r>
-        <w:t xml:space="preserve"> </w:t>
-      </w:r>
-      <w:r>
-        <w:t xml:space="preserve">Stress".</w:t>
+        <w:t xml:space="preserve">— only then does</w:t>
+      </w:r>
+      <w:r>
+        <w:t xml:space="preserve"> </w:t>
+      </w:r>
+      <w:r>
+        <w:t xml:space="preserve">Dimensie see it.</w:t>
       </w:r>
       <w:r>
         <w:t xml:space="preserve"> </w:t>
@@ -24619,7 +24615,23 @@
         <w:t xml:space="preserve"> </w:t>
       </w:r>
       <w:r>
-        <w:t xml:space="preserve">is possible until then. Orders added later go on the next month's invoice.</w:t>
+        <w:t xml:space="preserve">is possible until then;</w:t>
+      </w:r>
+      <w:r>
+        <w:t xml:space="preserve"> </w:t>
+      </w:r>
+      <w:r>
+        <w:rPr>
+          <w:b/>
+          <w:bCs/>
+        </w:rPr>
+        <w:t xml:space="preserve">Create now</w:t>
+      </w:r>
+      <w:r>
+        <w:t xml:space="preserve"> </w:t>
+      </w:r>
+      <w:r>
+        <w:t xml:space="preserve">makes one by hand.</w:t>
       </w:r>
     </w:p>
     <w:p>
@@ -28689,13 +28701,13 @@
         <w:t xml:space="preserve">only work at Stress borrels.</w:t>
       </w:r>
     </w:p>
-    <w:bookmarkStart w:id="147" w:name="Xfdbb38cac67517e57539d642a85885084c855c1"/>
+    <w:bookmarkStart w:id="147" w:name="Xb611bf1bf61a8172541c3bf662d9780a6ab8eba"/>
     <w:p>
       <w:pPr>
         <w:pStyle w:val="Heading3"/>
       </w:pPr>
       <w:r>
-        <w:t xml:space="preserve">Monthly invoice Stress → Dimensie (</w:t>
+        <w:t xml:space="preserve">Specification Stress → Dimensie (</w:t>
       </w:r>
       <w:r>
         <w:rPr>
@@ -28716,7 +28728,7 @@
           <w:b/>
           <w:bCs/>
         </w:rPr>
-        <w:t xml:space="preserve">PPP admin → Dimensie invoices</w:t>
+        <w:t xml:space="preserve">PPP admin → To Dimensie</w:t>
       </w:r>
       <w:r>
         <w:t xml:space="preserve"> </w:t>
@@ -28735,41 +28747,88 @@
         <w:t xml:space="preserve">From Stress</w:t>
       </w:r>
       <w:r>
-        <w:t xml:space="preserve">). Covers every order of</w:t>
-      </w:r>
-      <w:r>
-        <w:t xml:space="preserve"> </w:t>
-      </w:r>
-      <w:r>
-        <w:t xml:space="preserve">a</w:t>
-      </w:r>
-      <w:r>
-        <w:t xml:space="preserve"> </w:t>
-      </w:r>
-      <w:r>
-        <w:rPr>
-          <w:b/>
-          <w:bCs/>
-        </w:rPr>
-        <w:t xml:space="preserve">Dimensie member at a borrel Stress hosts</w:t>
-      </w:r>
-      <w:r>
-        <w:t xml:space="preserve"> </w:t>
-      </w:r>
-      <w:r>
-        <w:t xml:space="preserve">(the joint drink) that isn't on an</w:t>
-      </w:r>
-      <w:r>
-        <w:t xml:space="preserve"> </w:t>
-      </w:r>
-      <w:r>
-        <w:t xml:space="preserve">earlier invoice, with the borrel in or before the month (Amsterdam time) — orders</w:t>
-      </w:r>
-      <w:r>
-        <w:t xml:space="preserve"> </w:t>
-      </w:r>
-      <w:r>
-        <w:t xml:space="preserve">added after a month was invoiced roll onto the next one. Logic in</w:t>
+        <w:t xml:space="preserve">). Created</w:t>
+      </w:r>
+      <w:r>
+        <w:t xml:space="preserve"> </w:t>
+      </w:r>
+      <w:r>
+        <w:rPr>
+          <w:b/>
+          <w:bCs/>
+        </w:rPr>
+        <w:t xml:space="preserve">automatically by</w:t>
+      </w:r>
+      <w:r>
+        <w:rPr>
+          <w:b/>
+          <w:bCs/>
+        </w:rPr>
+        <w:t xml:space="preserve"> </w:t>
+      </w:r>
+      <w:r>
+        <w:rPr>
+          <w:b/>
+          <w:bCs/>
+        </w:rPr>
+        <w:t xml:space="preserve">each Dimensie export</w:t>
+      </w:r>
+      <w:r>
+        <w:t xml:space="preserve">: it covers every order of a</w:t>
+      </w:r>
+      <w:r>
+        <w:t xml:space="preserve"> </w:t>
+      </w:r>
+      <w:r>
+        <w:rPr>
+          <w:b/>
+          <w:bCs/>
+        </w:rPr>
+        <w:t xml:space="preserve">Dimensie member at a borrel</w:t>
+      </w:r>
+      <w:r>
+        <w:rPr>
+          <w:b/>
+          <w:bCs/>
+        </w:rPr>
+        <w:t xml:space="preserve"> </w:t>
+      </w:r>
+      <w:r>
+        <w:rPr>
+          <w:b/>
+          <w:bCs/>
+        </w:rPr>
+        <w:t xml:space="preserve">Stress hosts</w:t>
+      </w:r>
+      <w:r>
+        <w:t xml:space="preserve"> </w:t>
+      </w:r>
+      <w:r>
+        <w:t xml:space="preserve">(the joint drink) that Dimensie has now billed (EXPORTED) and that</w:t>
+      </w:r>
+      <w:r>
+        <w:t xml:space="preserve"> </w:t>
+      </w:r>
+      <w:r>
+        <w:t xml:space="preserve">isn't on an earlier specification — so Stress specifies exactly what Dimensie billed</w:t>
+      </w:r>
+      <w:r>
+        <w:t xml:space="preserve"> </w:t>
+      </w:r>
+      <w:r>
+        <w:t xml:space="preserve">its members; orders Dimensie hasn't exported yet wait for a later one. Numbered</w:t>
+      </w:r>
+      <w:r>
+        <w:t xml:space="preserve"> </w:t>
+      </w:r>
+      <w:r>
+        <w:rPr>
+          <w:rStyle w:val="VerbatimChar"/>
+        </w:rPr>
+        <w:t xml:space="preserve">STRESS-DIM-&lt;year&gt;-001…</w:t>
+      </w:r>
+      <w:r>
+        <w:t xml:space="preserve">; the period is taken from the borrel dates. Logic in</w:t>
       </w:r>
       <w:r>
         <w:t xml:space="preserve"> </w:t>
@@ -28885,39 +28944,7 @@
         </w:numPr>
       </w:pPr>
       <w:r>
-        <w:rPr>
-          <w:b/>
-          <w:bCs/>
-        </w:rPr>
-        <w:t xml:space="preserve">Draft</w:t>
-      </w:r>
-      <w:r>
-        <w:t xml:space="preserve"> </w:t>
-      </w:r>
-      <w:r>
-        <w:t xml:space="preserve">(Stress side) is computed live for a chosen month;</w:t>
-      </w:r>
-      <w:r>
-        <w:t xml:space="preserve"> </w:t>
-      </w:r>
-      <w:r>
-        <w:rPr>
-          <w:b/>
-          <w:bCs/>
-        </w:rPr>
-        <w:t xml:space="preserve">Finalise</w:t>
-      </w:r>
-      <w:r>
-        <w:t xml:space="preserve"> </w:t>
-      </w:r>
-      <w:r>
-        <w:t xml:space="preserve">freezes</w:t>
-      </w:r>
-      <w:r>
-        <w:t xml:space="preserve"> </w:t>
-      </w:r>
-      <w:r>
-        <w:t xml:space="preserve">the figures (</w:t>
+        <w:t xml:space="preserve">Creating it freezes the figures (</w:t>
       </w:r>
       <w:r>
         <w:rPr>
@@ -28926,22 +28953,7 @@
         <w:t xml:space="preserve">snapshot</w:t>
       </w:r>
       <w:r>
-        <w:t xml:space="preserve">) as</w:t>
-      </w:r>
-      <w:r>
-        <w:t xml:space="preserve"> </w:t>
-      </w:r>
-      <w:r>
-        <w:rPr>
-          <w:rStyle w:val="VerbatimChar"/>
-        </w:rPr>
-        <w:t xml:space="preserve">STRESS-DIM-YYYY-MM</w:t>
-      </w:r>
-      <w:r>
-        <w:t xml:space="preserve"> </w:t>
-      </w:r>
-      <w:r>
-        <w:t xml:space="preserve">and locks its orders</w:t>
+        <w:t xml:space="preserve">) and locks its orders</w:t>
       </w:r>
       <w:r>
         <w:t xml:space="preserve"> </w:t>
@@ -28972,7 +28984,29 @@
         <w:t xml:space="preserve"> </w:t>
       </w:r>
       <w:r>
-        <w:t xml:space="preserve">unlocks them while not sent;</w:t>
+        <w:t xml:space="preserve">unlocks them while not sent (they go on the next one;</w:t>
+      </w:r>
+      <w:r>
+        <w:t xml:space="preserve"> </w:t>
+      </w:r>
+      <w:r>
+        <w:rPr>
+          <w:b/>
+          <w:bCs/>
+        </w:rPr>
+        <w:t xml:space="preserve">Create now</w:t>
+      </w:r>
+      <w:r>
+        <w:t xml:space="preserve"> </w:t>
+      </w:r>
+      <w:r>
+        <w:t xml:space="preserve">makes</w:t>
+      </w:r>
+      <w:r>
+        <w:t xml:space="preserve"> </w:t>
+      </w:r>
+      <w:r>
+        <w:t xml:space="preserve">one by hand);</w:t>
       </w:r>
       <w:r>
         <w:t xml:space="preserve"> </w:t>
@@ -29000,84 +29034,7 @@
         </w:numPr>
       </w:pPr>
       <w:r>
-        <w:rPr>
-          <w:b/>
-          <w:bCs/>
-        </w:rPr>
-        <w:t xml:space="preserve">PDF</w:t>
-      </w:r>
-      <w:r>
-        <w:t xml:space="preserve"> </w:t>
-      </w:r>
-      <w:r>
-        <w:t xml:space="preserve">(invoice + per-member + per-borrel specification) and</w:t>
-      </w:r>
-      <w:r>
-        <w:t xml:space="preserve"> </w:t>
-      </w:r>
-      <w:r>
-        <w:rPr>
-          <w:b/>
-          <w:bCs/>
-        </w:rPr>
-        <w:t xml:space="preserve">CSV</w:t>
-      </w:r>
-      <w:r>
-        <w:t xml:space="preserve"> </w:t>
-      </w:r>
-      <w:r>
-        <w:t xml:space="preserve">(per member</w:t>
-      </w:r>
-      <w:r>
-        <w:t xml:space="preserve"> </w:t>
-      </w:r>
-      <w:r>
-        <w:t xml:space="preserve">per drink,</w:t>
-      </w:r>
-      <w:r>
-        <w:t xml:space="preserve"> </w:t>
-      </w:r>
-      <w:r>
-        <w:rPr>
-          <w:rStyle w:val="VerbatimChar"/>
-        </w:rPr>
-        <w:t xml:space="preserve">;</w:t>
-      </w:r>
-      <w:r>
-        <w:t xml:space="preserve">-separated). The system sends nothing: Stress's treasurer downloads,</w:t>
-      </w:r>
-      <w:r>
-        <w:t xml:space="preserve"> </w:t>
-      </w:r>
-      <w:r>
-        <w:t xml:space="preserve">books and sends them, then marks the invoice sent —</w:t>
-      </w:r>
-      <w:r>
-        <w:t xml:space="preserve"> </w:t>
-      </w:r>
-      <w:r>
-        <w:rPr>
-          <w:b/>
-          <w:bCs/>
-        </w:rPr>
-        <w:t xml:space="preserve">Dimensie only sees an invoice</w:t>
-      </w:r>
-      <w:r>
-        <w:rPr>
-          <w:b/>
-          <w:bCs/>
-        </w:rPr>
-        <w:t xml:space="preserve"> </w:t>
-      </w:r>
-      <w:r>
-        <w:rPr>
-          <w:b/>
-          <w:bCs/>
-        </w:rPr>
-        <w:t xml:space="preserve">once it's marked sent</w:t>
-      </w:r>
-      <w:r>
-        <w:t xml:space="preserve">. Not booked in Congressus. The PDF is a</w:t>
+        <w:t xml:space="preserve">The PDF is a</w:t>
       </w:r>
       <w:r>
         <w:t xml:space="preserve"> </w:t>
@@ -29093,25 +29050,50 @@
         <w:t xml:space="preserve"> </w:t>
       </w:r>
       <w:r>
-        <w:t xml:space="preserve">to attach to the treasurer's own invoice:</w:t>
-      </w:r>
-      <w:r>
-        <w:t xml:space="preserve"> </w:t>
-      </w:r>
-      <w:r>
-        <w:t xml:space="preserve">per borrel, each member with the drinks they had there and their subtotal, the</w:t>
-      </w:r>
-      <w:r>
-        <w:t xml:space="preserve"> </w:t>
-      </w:r>
-      <w:r>
-        <w:t xml:space="preserve">borrel subtotal, and at the end the total with VAT per category (always VL 9% and</w:t>
-      </w:r>
-      <w:r>
-        <w:t xml:space="preserve"> </w:t>
-      </w:r>
-      <w:r>
-        <w:t xml:space="preserve">VH 21%); the CSV has one row per purchase. Header lines:</w:t>
+        <w:t xml:space="preserve">to attach to the treasurer's own invoice: per</w:t>
+      </w:r>
+      <w:r>
+        <w:t xml:space="preserve"> </w:t>
+      </w:r>
+      <w:r>
+        <w:t xml:space="preserve">borrel, each member with the drinks they had there and their subtotal, the borrel</w:t>
+      </w:r>
+      <w:r>
+        <w:t xml:space="preserve"> </w:t>
+      </w:r>
+      <w:r>
+        <w:t xml:space="preserve">subtotal, and at the end the total with VAT per category (always VL 9% and VH 21%);</w:t>
+      </w:r>
+      <w:r>
+        <w:t xml:space="preserve"> </w:t>
+      </w:r>
+      <w:r>
+        <w:t xml:space="preserve">the CSV has one row per purchase. The system sends nothing: the treasurer books and</w:t>
+      </w:r>
+      <w:r>
+        <w:t xml:space="preserve"> </w:t>
+      </w:r>
+      <w:r>
+        <w:t xml:space="preserve">sends it, then marks it sent —</w:t>
+      </w:r>
+      <w:r>
+        <w:t xml:space="preserve"> </w:t>
+      </w:r>
+      <w:r>
+        <w:rPr>
+          <w:b/>
+          <w:bCs/>
+        </w:rPr>
+        <w:t xml:space="preserve">Dimensie only sees it once marked sent</w:t>
+      </w:r>
+      <w:r>
+        <w:t xml:space="preserve">. Header</w:t>
+      </w:r>
+      <w:r>
+        <w:t xml:space="preserve"> </w:t>
+      </w:r>
+      <w:r>
+        <w:t xml:space="preserve">lines:</w:t>
       </w:r>
       <w:r>
         <w:t xml:space="preserve"> </w:t>

</xml_diff>

<commit_message>
External cards: optional spending limit per borrel
- ExternalCard.limitCents (internal prices, per borrel tab); set on Admin →
  External cards (when adding, or Set/Change limit).
- The external order route refuses orders over the limit, with the tab row
  locked while checking so simultaneous orders can't both slip under it.
- POS: scanning an external card shows what's left (green/amber bar); over the
  limit or limit reached turns red and blocks confirming.
- Borrel page: "€X of €Y limit used" per tab. Docs updated.

Co-Authored-By: Claude Opus 5.5 <noreply@anthropic.com>
</commit_message>
<xml_diff>
--- a/docs/SSS-Documentation.docx
+++ b/docs/SSS-Documentation.docx
@@ -23157,7 +23157,23 @@
         <w:t xml:space="preserve"> </w:t>
       </w:r>
       <w:r>
-        <w:t xml:space="preserve">tap the card into the UID field, name it,</w:t>
+        <w:t xml:space="preserve">tap the card into the UID field, name it, optionally set a</w:t>
+      </w:r>
+      <w:r>
+        <w:t xml:space="preserve"> </w:t>
+      </w:r>
+      <w:r>
+        <w:rPr>
+          <w:b/>
+          <w:bCs/>
+        </w:rPr>
+        <w:t xml:space="preserve">limit per borrel</w:t>
+      </w:r>
+      <w:r>
+        <w:t xml:space="preserve"> </w:t>
+      </w:r>
+      <w:r>
+        <w:t xml:space="preserve">(e.g. €100 at internal prices),</w:t>
       </w:r>
       <w:r>
         <w:t xml:space="preserve"> </w:t>
@@ -23171,6 +23187,42 @@
       </w:r>
       <w:r>
         <w:t xml:space="preserve">.</w:t>
+      </w:r>
+      <w:r>
+        <w:t xml:space="preserve"> </w:t>
+      </w:r>
+      <w:r>
+        <w:rPr>
+          <w:b/>
+          <w:bCs/>
+        </w:rPr>
+        <w:t xml:space="preserve">Set / Change</w:t>
+      </w:r>
+      <w:r>
+        <w:rPr>
+          <w:b/>
+          <w:bCs/>
+        </w:rPr>
+        <w:t xml:space="preserve"> </w:t>
+      </w:r>
+      <w:r>
+        <w:rPr>
+          <w:b/>
+          <w:bCs/>
+        </w:rPr>
+        <w:t xml:space="preserve">limit</w:t>
+      </w:r>
+      <w:r>
+        <w:t xml:space="preserve"> </w:t>
+      </w:r>
+      <w:r>
+        <w:t xml:space="preserve">on an existing card. At the bar the bartender sees what's left; once the</w:t>
+      </w:r>
+      <w:r>
+        <w:t xml:space="preserve"> </w:t>
+      </w:r>
+      <w:r>
+        <w:t xml:space="preserve">limit is reached the card turns red and no more drinks can be added.</w:t>
       </w:r>
       <w:r>
         <w:t xml:space="preserve"> </w:t>
@@ -29594,6 +29646,118 @@
       </w:r>
       <w:r>
         <w:t xml:space="preserve">(optional name; default "External card N").</w:t>
+      </w:r>
+    </w:p>
+    <w:p>
+      <w:pPr>
+        <w:pStyle w:val="Compact"/>
+        <w:numPr>
+          <w:ilvl w:val="0"/>
+          <w:numId w:val="1054"/>
+        </w:numPr>
+      </w:pPr>
+      <w:r>
+        <w:rPr>
+          <w:b/>
+          <w:bCs/>
+        </w:rPr>
+        <w:t xml:space="preserve">Spending limit (optional):</w:t>
+      </w:r>
+      <w:r>
+        <w:t xml:space="preserve"> </w:t>
+      </w:r>
+      <w:r>
+        <w:rPr>
+          <w:rStyle w:val="VerbatimChar"/>
+        </w:rPr>
+        <w:t xml:space="preserve">ExternalCard.limitCents</w:t>
+      </w:r>
+      <w:r>
+        <w:t xml:space="preserve">, set per card on Admin →</w:t>
+      </w:r>
+      <w:r>
+        <w:t xml:space="preserve"> </w:t>
+      </w:r>
+      <w:r>
+        <w:t xml:space="preserve">External cards ("Set limit", or when adding it). It caps what the card's tab at one</w:t>
+      </w:r>
+      <w:r>
+        <w:t xml:space="preserve"> </w:t>
+      </w:r>
+      <w:r>
+        <w:t xml:space="preserve">borrel may total,</w:t>
+      </w:r>
+      <w:r>
+        <w:t xml:space="preserve"> </w:t>
+      </w:r>
+      <w:r>
+        <w:rPr>
+          <w:b/>
+          <w:bCs/>
+        </w:rPr>
+        <w:t xml:space="preserve">at internal prices</w:t>
+      </w:r>
+      <w:r>
+        <w:t xml:space="preserve"> </w:t>
+      </w:r>
+      <w:r>
+        <w:t xml:space="preserve">(the invoice price level comes on top).</w:t>
+      </w:r>
+      <w:r>
+        <w:t xml:space="preserve"> </w:t>
+      </w:r>
+      <w:r>
+        <w:t xml:space="preserve">The POS shows "€X left on this card" with a bar (amber from 80%), turns red with</w:t>
+      </w:r>
+      <w:r>
+        <w:t xml:space="preserve"> </w:t>
+      </w:r>
+      <w:r>
+        <w:rPr>
+          <w:b/>
+          <w:bCs/>
+        </w:rPr>
+        <w:t xml:space="preserve">"⛔ Limit reached"</w:t>
+      </w:r>
+      <w:r>
+        <w:t xml:space="preserve"> </w:t>
+      </w:r>
+      <w:r>
+        <w:t xml:space="preserve">/</w:t>
+      </w:r>
+      <w:r>
+        <w:t xml:space="preserve"> </w:t>
+      </w:r>
+      <w:r>
+        <w:rPr>
+          <w:b/>
+          <w:bCs/>
+        </w:rPr>
+        <w:t xml:space="preserve">"Over the limit by €X"</w:t>
+      </w:r>
+      <w:r>
+        <w:t xml:space="preserve"> </w:t>
+      </w:r>
+      <w:r>
+        <w:t xml:space="preserve">and blocks confirming; the order</w:t>
+      </w:r>
+      <w:r>
+        <w:t xml:space="preserve"> </w:t>
+      </w:r>
+      <w:r>
+        <w:t xml:space="preserve">route enforces it server-side (the tab row is locked while checking, so</w:t>
+      </w:r>
+      <w:r>
+        <w:t xml:space="preserve"> </w:t>
+      </w:r>
+      <w:r>
+        <w:t xml:space="preserve">simultaneous orders can't both slip under it). The borrel page shows "€X of €Y</w:t>
+      </w:r>
+      <w:r>
+        <w:t xml:space="preserve"> </w:t>
+      </w:r>
+      <w:r>
+        <w:t xml:space="preserve">limit used". Cards registered at the bar start without a limit.</w:t>
       </w:r>
     </w:p>
     <w:p>

</xml_diff>

<commit_message>
External cards: Scan card button reads the UID from the bar's card reader
The bar PC's reader (Arago WebSocket) doesn't type into fields, so tapping a card
on the admin page did nothing. "Scan card" listens with the shared card-reader
hook (WebSocket / keyboard-wedge / phone NFC, same settings as the POS), fills in
the UID and moves to the name field.

Co-Authored-By: Claude Opus 5.5 <noreply@anthropic.com>
</commit_message>
<xml_diff>
--- a/docs/SSS-Documentation.docx
+++ b/docs/SSS-Documentation.docx
@@ -23157,7 +23157,29 @@
         <w:t xml:space="preserve"> </w:t>
       </w:r>
       <w:r>
-        <w:t xml:space="preserve">tap the card into the UID field, name it, optionally set a</w:t>
+        <w:t xml:space="preserve">click</w:t>
+      </w:r>
+      <w:r>
+        <w:t xml:space="preserve"> </w:t>
+      </w:r>
+      <w:r>
+        <w:rPr>
+          <w:b/>
+          <w:bCs/>
+        </w:rPr>
+        <w:t xml:space="preserve">🪪 Scan card</w:t>
+      </w:r>
+      <w:r>
+        <w:t xml:space="preserve"> </w:t>
+      </w:r>
+      <w:r>
+        <w:t xml:space="preserve">and tap the card on the bar's</w:t>
+      </w:r>
+      <w:r>
+        <w:t xml:space="preserve"> </w:t>
+      </w:r>
+      <w:r>
+        <w:t xml:space="preserve">reader (or type/paste the UID), name it, optionally set a</w:t>
       </w:r>
       <w:r>
         <w:t xml:space="preserve"> </w:t>
@@ -29609,13 +29631,32 @@
         <w:t xml:space="preserve"> </w:t>
       </w:r>
       <w:r>
-        <w:t xml:space="preserve">(tap the card into the UID field, give it a</w:t>
-      </w:r>
-      <w:r>
-        <w:t xml:space="preserve"> </w:t>
-      </w:r>
-      <w:r>
-        <w:t xml:space="preserve">name), or at the bar: scan an unknown card →</w:t>
+        <w:t xml:space="preserve">(</w:t>
+      </w:r>
+      <w:r>
+        <w:rPr>
+          <w:b/>
+          <w:bCs/>
+        </w:rPr>
+        <w:t xml:space="preserve">🪪 Scan card</w:t>
+      </w:r>
+      <w:r>
+        <w:t xml:space="preserve"> </w:t>
+      </w:r>
+      <w:r>
+        <w:t xml:space="preserve">listens to the bar's card</w:t>
+      </w:r>
+      <w:r>
+        <w:t xml:space="preserve"> </w:t>
+      </w:r>
+      <w:r>
+        <w:t xml:space="preserve">reader — same reader settings as the POS: WebSocket/Arago, keyboard-wedge or the</w:t>
+      </w:r>
+      <w:r>
+        <w:t xml:space="preserve"> </w:t>
+      </w:r>
+      <w:r>
+        <w:t xml:space="preserve">phone's NFC — and fills in the UID; or type/paste it; then give it a name), or at the bar: scan an unknown card →</w:t>
       </w:r>
       <w:r>
         <w:t xml:space="preserve"> </w:t>

</xml_diff>

<commit_message>
Member sync: also import Honorary members (Congressus status 4119)
Co-Authored-By: Claude Opus 5.5 <noreply@anthropic.com>
</commit_message>
<xml_diff>
--- a/docs/SSS-Documentation.docx
+++ b/docs/SSS-Documentation.docx
@@ -4038,7 +4038,7 @@
         <w:pStyle w:val="FirstParagraph"/>
       </w:pPr>
       <w:r>
-        <w:t xml:space="preserve">A person synced from Congressus. Only Primary and Secondary members are imported.</w:t>
+        <w:t xml:space="preserve">A person synced from Congressus. Only Primary, Secondary and Honorary members are imported.</w:t>
       </w:r>
     </w:p>
     <w:tbl>
@@ -19214,7 +19214,22 @@
         <w:t xml:space="preserve"> </w:t>
       </w:r>
       <w:r>
-        <w:t xml:space="preserve">(Secondary)</w:t>
+        <w:t xml:space="preserve">(Secondary),</w:t>
+      </w:r>
+      <w:r>
+        <w:t xml:space="preserve"> </w:t>
+      </w:r>
+      <w:r>
+        <w:rPr>
+          <w:rStyle w:val="VerbatimChar"/>
+        </w:rPr>
+        <w:t xml:space="preserve">4119</w:t>
+      </w:r>
+      <w:r>
+        <w:t xml:space="preserve"> </w:t>
+      </w:r>
+      <w:r>
+        <w:t xml:space="preserve">(Honorary)</w:t>
       </w:r>
     </w:p>
     <w:p>
@@ -19389,7 +19404,7 @@
         <w:t xml:space="preserve"> </w:t>
       </w:r>
       <w:r>
-        <w:t xml:space="preserve">for the Primary and Secondary statuses and upserts</w:t>
+        <w:t xml:space="preserve">for the Primary, Secondary and Honorary statuses and upserts</w:t>
       </w:r>
       <w:r>
         <w:t xml:space="preserve"> </w:t>
@@ -21579,7 +21594,7 @@
         <w:t xml:space="preserve"> </w:t>
       </w:r>
       <w:r>
-        <w:t xml:space="preserve">— imports/updates all Primary &amp; Secondary members. Run</w:t>
+        <w:t xml:space="preserve">— imports/updates all Primary, Secondary &amp; Honorary members. Run</w:t>
       </w:r>
       <w:r>
         <w:t xml:space="preserve"> </w:t>
@@ -21607,7 +21622,7 @@
         <w:t xml:space="preserve"> </w:t>
       </w:r>
       <w:r>
-        <w:t xml:space="preserve">(removed there, or no longer a Primary/Secondary member) are cleaned up: those</w:t>
+        <w:t xml:space="preserve">(removed there, or no longer a Primary/Secondary/Honorary member) are cleaned up: those</w:t>
       </w:r>
       <w:r>
         <w:t xml:space="preserve"> </w:t>

</xml_diff>